<commit_message>
Workbook v2: welcome letter, tighter session labels, single-page books, aspect-correct + tier-scaled sponsor logos
</commit_message>
<xml_diff>
--- a/deliverables/workbook/Workbook.docx
+++ b/deliverables/workbook/Workbook.docx
@@ -13,7 +13,6 @@
           <w:b/>
           <w:bCs/>
           <w:color w:val="E87722"/>
-          <w:spacing w:val="200"/>
           <w:sz w:val="22"/>
           <w:szCs w:val="22"/>
         </w:rPr>
@@ -179,7 +178,224 @@
     </w:p>
     <w:p>
       <w:pPr>
-        <w:spacing w:after="120"/>
+        <w:spacing w:after="200"/>
+        <w:jc w:val="left"/>
+      </w:pPr>
+      <w:r>
+        <w:rPr>
+          <w:rFonts w:ascii="Calibri" w:cs="Calibri" w:eastAsia="Calibri" w:hAnsi="Calibri"/>
+          <w:b w:val="false"/>
+          <w:bCs w:val="false"/>
+          <w:i w:val="false"/>
+          <w:iCs w:val="false"/>
+          <w:color w:val="1A1A1A"/>
+          <w:sz w:val="22"/>
+          <w:szCs w:val="22"/>
+        </w:rPr>
+        <w:t xml:space="preserve">Welcome to the fifth annual We Run on EOS® North Texas. Today we come together as an EOS community — entrepreneurs, leadership teams, and the certified Implementers who serve them — to sharpen our tools, share what’s working, and get better at running our businesses.</w:t>
+      </w:r>
+    </w:p>
+    <w:p>
+      <w:pPr>
+        <w:spacing w:after="200"/>
+        <w:jc w:val="left"/>
+      </w:pPr>
+      <w:r>
+        <w:rPr>
+          <w:rFonts w:ascii="Calibri" w:cs="Calibri" w:eastAsia="Calibri" w:hAnsi="Calibri"/>
+          <w:b w:val="false"/>
+          <w:bCs w:val="false"/>
+          <w:i w:val="false"/>
+          <w:iCs w:val="false"/>
+          <w:color w:val="1A1A1A"/>
+          <w:sz w:val="22"/>
+          <w:szCs w:val="22"/>
+        </w:rPr>
+        <w:t xml:space="preserve">If you’re running on EOS, this day is designed to make you stronger. World-class speakers. Practical workshops. Books you can actually use on Monday morning. And a room full of North Texas leaders who are on the same journey.</w:t>
+      </w:r>
+    </w:p>
+    <w:p>
+      <w:pPr>
+        <w:spacing w:after="200"/>
+        <w:jc w:val="left"/>
+      </w:pPr>
+      <w:r>
+        <w:rPr>
+          <w:rFonts w:ascii="Calibri" w:cs="Calibri" w:eastAsia="Calibri" w:hAnsi="Calibri"/>
+          <w:b w:val="false"/>
+          <w:bCs w:val="false"/>
+          <w:i w:val="false"/>
+          <w:iCs w:val="false"/>
+          <w:color w:val="1A1A1A"/>
+          <w:sz w:val="22"/>
+          <w:szCs w:val="22"/>
+        </w:rPr>
+        <w:t xml:space="preserve">If you’re just getting started, welcome. You picked a great day to see what happens when a whole community rallies around one operating system. Ask questions. Take notes. Introduce yourself to the person next to you.</w:t>
+      </w:r>
+    </w:p>
+    <w:p>
+      <w:pPr>
+        <w:spacing w:after="200"/>
+        <w:jc w:val="left"/>
+      </w:pPr>
+      <w:r>
+        <w:rPr>
+          <w:rFonts w:ascii="Calibri" w:cs="Calibri" w:eastAsia="Calibri" w:hAnsi="Calibri"/>
+          <w:b w:val="false"/>
+          <w:bCs w:val="false"/>
+          <w:i w:val="false"/>
+          <w:iCs w:val="false"/>
+          <w:color w:val="1A1A1A"/>
+          <w:sz w:val="22"/>
+          <w:szCs w:val="22"/>
+        </w:rPr>
+        <w:t xml:space="preserve">A few suggestions to make the most of the day:</w:t>
+      </w:r>
+    </w:p>
+    <w:p>
+      <w:pPr>
+        <w:pStyle w:val="ListParagraph"/>
+        <w:numPr>
+          <w:ilvl w:val="0"/>
+          <w:numId w:val="2"/>
+        </w:numPr>
+        <w:spacing w:after="100"/>
+      </w:pPr>
+      <w:r>
+        <w:rPr>
+          <w:rFonts w:ascii="Calibri" w:cs="Calibri" w:eastAsia="Calibri" w:hAnsi="Calibri"/>
+          <w:color w:val="1A1A1A"/>
+          <w:sz w:val="22"/>
+          <w:szCs w:val="22"/>
+        </w:rPr>
+        <w:t xml:space="preserve">Use this workbook. Every session has space for the ideas that hit you hardest.</w:t>
+      </w:r>
+    </w:p>
+    <w:p>
+      <w:pPr>
+        <w:pStyle w:val="ListParagraph"/>
+        <w:numPr>
+          <w:ilvl w:val="0"/>
+          <w:numId w:val="2"/>
+        </w:numPr>
+        <w:spacing w:after="100"/>
+      </w:pPr>
+      <w:r>
+        <w:rPr>
+          <w:rFonts w:ascii="Calibri" w:cs="Calibri" w:eastAsia="Calibri" w:hAnsi="Calibri"/>
+          <w:color w:val="1A1A1A"/>
+          <w:sz w:val="22"/>
+          <w:szCs w:val="22"/>
+        </w:rPr>
+        <w:t xml:space="preserve">Talk to the sponsors. They’re here because they believe in EOS and want to help you win.</w:t>
+      </w:r>
+    </w:p>
+    <w:p>
+      <w:pPr>
+        <w:pStyle w:val="ListParagraph"/>
+        <w:numPr>
+          <w:ilvl w:val="0"/>
+          <w:numId w:val="2"/>
+        </w:numPr>
+        <w:spacing w:after="100"/>
+      </w:pPr>
+      <w:r>
+        <w:rPr>
+          <w:rFonts w:ascii="Calibri" w:cs="Calibri" w:eastAsia="Calibri" w:hAnsi="Calibri"/>
+          <w:color w:val="1A1A1A"/>
+          <w:sz w:val="22"/>
+          <w:szCs w:val="22"/>
+        </w:rPr>
+        <w:t xml:space="preserve">Introduce yourself to at least three people you don’t know. Business is a team sport.</w:t>
+      </w:r>
+    </w:p>
+    <w:p>
+      <w:pPr>
+        <w:pStyle w:val="ListParagraph"/>
+        <w:numPr>
+          <w:ilvl w:val="0"/>
+          <w:numId w:val="2"/>
+        </w:numPr>
+        <w:spacing w:after="100"/>
+      </w:pPr>
+      <w:r>
+        <w:rPr>
+          <w:rFonts w:ascii="Calibri" w:cs="Calibri" w:eastAsia="Calibri" w:hAnsi="Calibri"/>
+          <w:color w:val="1A1A1A"/>
+          <w:sz w:val="22"/>
+          <w:szCs w:val="22"/>
+        </w:rPr>
+        <w:t xml:space="preserve">Come back at 6:15 for Happy Hour. Some of the best conversations of the day happen there.</w:t>
+      </w:r>
+    </w:p>
+    <w:p>
+      <w:pPr>
+        <w:spacing w:after="200"/>
+      </w:pPr>
+      <w:r>
+        <w:t xml:space="preserve"/>
+      </w:r>
+    </w:p>
+    <w:p>
+      <w:pPr>
+        <w:spacing w:after="100"/>
+        <w:jc w:val="left"/>
+      </w:pPr>
+      <w:r>
+        <w:rPr>
+          <w:rFonts w:ascii="Calibri" w:cs="Calibri" w:eastAsia="Calibri" w:hAnsi="Calibri"/>
+          <w:b w:val="false"/>
+          <w:bCs w:val="false"/>
+          <w:i w:val="false"/>
+          <w:iCs w:val="false"/>
+          <w:color w:val="1A1A1A"/>
+          <w:sz w:val="22"/>
+          <w:szCs w:val="22"/>
+        </w:rPr>
+        <w:t xml:space="preserve">Here’s to a great day — stronger teams, healthier companies, and clearer visions.</w:t>
+      </w:r>
+    </w:p>
+    <w:p>
+      <w:pPr>
+        <w:spacing w:after="100"/>
+        <w:jc w:val="left"/>
+      </w:pPr>
+      <w:r>
+        <w:rPr>
+          <w:rFonts w:ascii="Calibri" w:cs="Calibri" w:eastAsia="Calibri" w:hAnsi="Calibri"/>
+          <w:b w:val="false"/>
+          <w:bCs w:val="false"/>
+          <w:i w:val="false"/>
+          <w:iCs w:val="false"/>
+          <w:color w:val="1A1A1A"/>
+          <w:sz w:val="22"/>
+          <w:szCs w:val="22"/>
+        </w:rPr>
+        <w:t xml:space="preserve">Let’s get to work.</w:t>
+      </w:r>
+    </w:p>
+    <w:p>
+      <w:pPr>
+        <w:spacing w:after="100"/>
+        <w:jc w:val="left"/>
+      </w:pPr>
+      <w:r>
+        <w:rPr>
+          <w:rFonts w:ascii="Calibri" w:cs="Calibri" w:eastAsia="Calibri" w:hAnsi="Calibri"/>
+          <w:b w:val="false"/>
+          <w:bCs w:val="false"/>
+          <w:i w:val="false"/>
+          <w:iCs w:val="false"/>
+          <w:color w:val="1A1A1A"/>
+          <w:sz w:val="22"/>
+          <w:szCs w:val="22"/>
+        </w:rPr>
+        <w:t xml:space="preserve"/>
+      </w:r>
+    </w:p>
+    <w:p>
+      <w:pPr>
+        <w:spacing w:after="100"/>
         <w:jc w:val="left"/>
       </w:pPr>
       <w:r>
@@ -193,137 +409,7 @@
           <w:sz w:val="22"/>
           <w:szCs w:val="22"/>
         </w:rPr>
-        <w:t xml:space="preserve">[Welcome letter — coming soon]</w:t>
-      </w:r>
-    </w:p>
-    <w:p>
-      <w:pPr>
-        <w:spacing w:after="200"/>
-      </w:pPr>
-      <w:r>
-        <w:t xml:space="preserve"/>
-      </w:r>
-    </w:p>
-    <w:p>
-      <w:pPr>
-        <w:spacing w:after="120"/>
-        <w:jc w:val="left"/>
-      </w:pPr>
-      <w:r>
-        <w:rPr>
-          <w:rFonts w:ascii="Calibri" w:cs="Calibri" w:eastAsia="Calibri" w:hAnsi="Calibri"/>
-          <w:b w:val="false"/>
-          <w:bCs w:val="false"/>
-          <w:i/>
-          <w:iCs/>
-          <w:color w:val="5A6B82"/>
-          <w:sz w:val="22"/>
-          <w:szCs w:val="22"/>
-        </w:rPr>
-        <w:t xml:space="preserve">Placeholder for the opening letter from the North Texas EOS® community.</w:t>
-      </w:r>
-    </w:p>
-    <w:p>
-      <w:pPr>
-        <w:spacing w:after="200"/>
-      </w:pPr>
-      <w:r>
-        <w:t xml:space="preserve"/>
-      </w:r>
-    </w:p>
-    <w:p>
-      <w:pPr>
-        <w:spacing w:after="120"/>
-        <w:jc w:val="left"/>
-      </w:pPr>
-      <w:r>
-        <w:rPr>
-          <w:rFonts w:ascii="Calibri" w:cs="Calibri" w:eastAsia="Calibri" w:hAnsi="Calibri"/>
-          <w:b/>
-          <w:bCs/>
-          <w:i w:val="false"/>
-          <w:iCs w:val="false"/>
-          <w:color w:val="1A1A1A"/>
-          <w:sz w:val="22"/>
-          <w:szCs w:val="22"/>
-        </w:rPr>
-        <w:t xml:space="preserve">Suggested contents:</w:t>
-      </w:r>
-    </w:p>
-    <w:p>
-      <w:pPr>
-        <w:spacing w:after="120"/>
-        <w:jc w:val="left"/>
-      </w:pPr>
-      <w:r>
-        <w:rPr>
-          <w:rFonts w:ascii="Calibri" w:cs="Calibri" w:eastAsia="Calibri" w:hAnsi="Calibri"/>
-          <w:b w:val="false"/>
-          <w:bCs w:val="false"/>
-          <w:i w:val="false"/>
-          <w:iCs w:val="false"/>
-          <w:color w:val="1A1A1A"/>
-          <w:sz w:val="22"/>
-          <w:szCs w:val="22"/>
-        </w:rPr>
-        <w:t xml:space="preserve">• Thanks to attendees, sponsors, and speakers</w:t>
-      </w:r>
-    </w:p>
-    <w:p>
-      <w:pPr>
-        <w:spacing w:after="120"/>
-        <w:jc w:val="left"/>
-      </w:pPr>
-      <w:r>
-        <w:rPr>
-          <w:rFonts w:ascii="Calibri" w:cs="Calibri" w:eastAsia="Calibri" w:hAnsi="Calibri"/>
-          <w:b w:val="false"/>
-          <w:bCs w:val="false"/>
-          <w:i w:val="false"/>
-          <w:iCs w:val="false"/>
-          <w:color w:val="1A1A1A"/>
-          <w:sz w:val="22"/>
-          <w:szCs w:val="22"/>
-        </w:rPr>
-        <w:t xml:space="preserve">• Theme of the day / what to expect</w:t>
-      </w:r>
-    </w:p>
-    <w:p>
-      <w:pPr>
-        <w:spacing w:after="120"/>
-        <w:jc w:val="left"/>
-      </w:pPr>
-      <w:r>
-        <w:rPr>
-          <w:rFonts w:ascii="Calibri" w:cs="Calibri" w:eastAsia="Calibri" w:hAnsi="Calibri"/>
-          <w:b w:val="false"/>
-          <w:bCs w:val="false"/>
-          <w:i w:val="false"/>
-          <w:iCs w:val="false"/>
-          <w:color w:val="1A1A1A"/>
-          <w:sz w:val="22"/>
-          <w:szCs w:val="22"/>
-        </w:rPr>
-        <w:t xml:space="preserve">• How to make the most of the workbook</w:t>
-      </w:r>
-    </w:p>
-    <w:p>
-      <w:pPr>
-        <w:spacing w:after="120"/>
-        <w:jc w:val="left"/>
-      </w:pPr>
-      <w:r>
-        <w:rPr>
-          <w:rFonts w:ascii="Calibri" w:cs="Calibri" w:eastAsia="Calibri" w:hAnsi="Calibri"/>
-          <w:b w:val="false"/>
-          <w:bCs w:val="false"/>
-          <w:i w:val="false"/>
-          <w:iCs w:val="false"/>
-          <w:color w:val="1A1A1A"/>
-          <w:sz w:val="22"/>
-          <w:szCs w:val="22"/>
-        </w:rPr>
-        <w:t xml:space="preserve">• Sign-off from the host committee</w:t>
+        <w:t xml:space="preserve">— The North Texas EOS Community</w:t>
       </w:r>
     </w:p>
     <w:p>
@@ -1771,7 +1857,6 @@
           <w:b/>
           <w:bCs/>
           <w:color w:val="E87722"/>
-          <w:spacing w:val="200"/>
           <w:sz w:val="20"/>
           <w:szCs w:val="20"/>
         </w:rPr>
@@ -1833,7 +1918,6 @@
           <w:b/>
           <w:bCs/>
           <w:color w:val="E87722"/>
-          <w:spacing w:val="200"/>
           <w:sz w:val="18"/>
           <w:szCs w:val="18"/>
         </w:rPr>
@@ -1893,7 +1977,6 @@
           <w:b/>
           <w:bCs/>
           <w:color w:val="E87722"/>
-          <w:spacing w:val="200"/>
           <w:sz w:val="18"/>
           <w:szCs w:val="18"/>
         </w:rPr>
@@ -1933,7 +2016,6 @@
           <w:b/>
           <w:bCs/>
           <w:color w:val="E87722"/>
-          <w:spacing w:val="200"/>
           <w:sz w:val="18"/>
           <w:szCs w:val="18"/>
         </w:rPr>
@@ -1984,7 +2066,6 @@
           <w:b/>
           <w:bCs/>
           <w:color w:val="E87722"/>
-          <w:spacing w:val="200"/>
           <w:sz w:val="18"/>
           <w:szCs w:val="18"/>
         </w:rPr>
@@ -2731,7 +2812,6 @@
           <w:b/>
           <w:bCs/>
           <w:color w:val="E87722"/>
-          <w:spacing w:val="200"/>
           <w:sz w:val="20"/>
           <w:szCs w:val="20"/>
         </w:rPr>
@@ -2793,7 +2873,6 @@
           <w:b/>
           <w:bCs/>
           <w:color w:val="E87722"/>
-          <w:spacing w:val="200"/>
           <w:sz w:val="18"/>
           <w:szCs w:val="18"/>
         </w:rPr>
@@ -2853,7 +2932,6 @@
           <w:b/>
           <w:bCs/>
           <w:color w:val="E87722"/>
-          <w:spacing w:val="200"/>
           <w:sz w:val="18"/>
           <w:szCs w:val="18"/>
         </w:rPr>
@@ -2893,7 +2971,6 @@
           <w:b/>
           <w:bCs/>
           <w:color w:val="E87722"/>
-          <w:spacing w:val="200"/>
           <w:sz w:val="18"/>
           <w:szCs w:val="18"/>
         </w:rPr>
@@ -2944,7 +3021,6 @@
           <w:b/>
           <w:bCs/>
           <w:color w:val="E87722"/>
-          <w:spacing w:val="200"/>
           <w:sz w:val="18"/>
           <w:szCs w:val="18"/>
         </w:rPr>
@@ -3691,7 +3767,6 @@
           <w:b/>
           <w:bCs/>
           <w:color w:val="E87722"/>
-          <w:spacing w:val="200"/>
           <w:sz w:val="20"/>
           <w:szCs w:val="20"/>
         </w:rPr>
@@ -3753,7 +3828,6 @@
           <w:b/>
           <w:bCs/>
           <w:color w:val="E87722"/>
-          <w:spacing w:val="200"/>
           <w:sz w:val="18"/>
           <w:szCs w:val="18"/>
         </w:rPr>
@@ -3813,7 +3887,6 @@
           <w:b/>
           <w:bCs/>
           <w:color w:val="E87722"/>
-          <w:spacing w:val="200"/>
           <w:sz w:val="18"/>
           <w:szCs w:val="18"/>
         </w:rPr>
@@ -3853,7 +3926,6 @@
           <w:b/>
           <w:bCs/>
           <w:color w:val="E87722"/>
-          <w:spacing w:val="200"/>
           <w:sz w:val="18"/>
           <w:szCs w:val="18"/>
         </w:rPr>
@@ -3904,7 +3976,6 @@
           <w:b/>
           <w:bCs/>
           <w:color w:val="E87722"/>
-          <w:spacing w:val="200"/>
           <w:sz w:val="18"/>
           <w:szCs w:val="18"/>
         </w:rPr>
@@ -4651,7 +4722,6 @@
           <w:b/>
           <w:bCs/>
           <w:color w:val="E87722"/>
-          <w:spacing w:val="200"/>
           <w:sz w:val="20"/>
           <w:szCs w:val="20"/>
         </w:rPr>
@@ -4730,7 +4800,6 @@
           <w:b/>
           <w:bCs/>
           <w:color w:val="E87722"/>
-          <w:spacing w:val="200"/>
           <w:sz w:val="18"/>
           <w:szCs w:val="18"/>
         </w:rPr>
@@ -4790,7 +4859,6 @@
           <w:b/>
           <w:bCs/>
           <w:color w:val="E87722"/>
-          <w:spacing w:val="200"/>
           <w:sz w:val="18"/>
           <w:szCs w:val="18"/>
         </w:rPr>
@@ -4830,7 +4898,6 @@
           <w:b/>
           <w:bCs/>
           <w:color w:val="E87722"/>
-          <w:spacing w:val="200"/>
           <w:sz w:val="18"/>
           <w:szCs w:val="18"/>
         </w:rPr>
@@ -4881,7 +4948,6 @@
           <w:b/>
           <w:bCs/>
           <w:color w:val="E87722"/>
-          <w:spacing w:val="200"/>
           <w:sz w:val="18"/>
           <w:szCs w:val="18"/>
         </w:rPr>
@@ -5628,7 +5694,6 @@
           <w:b/>
           <w:bCs/>
           <w:color w:val="E87722"/>
-          <w:spacing w:val="200"/>
           <w:sz w:val="20"/>
           <w:szCs w:val="20"/>
         </w:rPr>
@@ -5690,7 +5755,6 @@
           <w:b/>
           <w:bCs/>
           <w:color w:val="E87722"/>
-          <w:spacing w:val="200"/>
           <w:sz w:val="18"/>
           <w:szCs w:val="18"/>
         </w:rPr>
@@ -5750,7 +5814,6 @@
           <w:b/>
           <w:bCs/>
           <w:color w:val="E87722"/>
-          <w:spacing w:val="200"/>
           <w:sz w:val="18"/>
           <w:szCs w:val="18"/>
         </w:rPr>
@@ -5790,7 +5853,6 @@
           <w:b/>
           <w:bCs/>
           <w:color w:val="E87722"/>
-          <w:spacing w:val="200"/>
           <w:sz w:val="18"/>
           <w:szCs w:val="18"/>
         </w:rPr>
@@ -5841,7 +5903,6 @@
           <w:b/>
           <w:bCs/>
           <w:color w:val="E87722"/>
-          <w:spacing w:val="200"/>
           <w:sz w:val="18"/>
           <w:szCs w:val="18"/>
         </w:rPr>
@@ -6588,7 +6649,6 @@
           <w:b/>
           <w:bCs/>
           <w:color w:val="E87722"/>
-          <w:spacing w:val="200"/>
           <w:sz w:val="20"/>
           <w:szCs w:val="20"/>
         </w:rPr>
@@ -6650,7 +6710,6 @@
           <w:b/>
           <w:bCs/>
           <w:color w:val="E87722"/>
-          <w:spacing w:val="200"/>
           <w:sz w:val="18"/>
           <w:szCs w:val="18"/>
         </w:rPr>
@@ -6710,7 +6769,6 @@
           <w:b/>
           <w:bCs/>
           <w:color w:val="E87722"/>
-          <w:spacing w:val="200"/>
           <w:sz w:val="18"/>
           <w:szCs w:val="18"/>
         </w:rPr>
@@ -6750,7 +6808,6 @@
           <w:b/>
           <w:bCs/>
           <w:color w:val="E87722"/>
-          <w:spacing w:val="200"/>
           <w:sz w:val="18"/>
           <w:szCs w:val="18"/>
         </w:rPr>
@@ -6801,7 +6858,6 @@
           <w:b/>
           <w:bCs/>
           <w:color w:val="E87722"/>
-          <w:spacing w:val="200"/>
           <w:sz w:val="18"/>
           <w:szCs w:val="18"/>
         </w:rPr>
@@ -7548,7 +7604,6 @@
           <w:b/>
           <w:bCs/>
           <w:color w:val="E87722"/>
-          <w:spacing w:val="200"/>
           <w:sz w:val="20"/>
           <w:szCs w:val="20"/>
         </w:rPr>
@@ -7610,7 +7665,6 @@
           <w:b/>
           <w:bCs/>
           <w:color w:val="E87722"/>
-          <w:spacing w:val="200"/>
           <w:sz w:val="18"/>
           <w:szCs w:val="18"/>
         </w:rPr>
@@ -7670,7 +7724,6 @@
           <w:b/>
           <w:bCs/>
           <w:color w:val="E87722"/>
-          <w:spacing w:val="200"/>
           <w:sz w:val="18"/>
           <w:szCs w:val="18"/>
         </w:rPr>
@@ -7710,7 +7763,6 @@
           <w:b/>
           <w:bCs/>
           <w:color w:val="E87722"/>
-          <w:spacing w:val="200"/>
           <w:sz w:val="18"/>
           <w:szCs w:val="18"/>
         </w:rPr>
@@ -7761,7 +7813,6 @@
           <w:b/>
           <w:bCs/>
           <w:color w:val="E87722"/>
-          <w:spacing w:val="200"/>
           <w:sz w:val="18"/>
           <w:szCs w:val="18"/>
         </w:rPr>
@@ -8547,7 +8598,7 @@
     </w:p>
     <w:p>
       <w:pPr>
-        <w:spacing w:after="200"/>
+        <w:spacing w:after="160"/>
       </w:pPr>
       <w:r>
         <w:t xml:space="preserve"/>
@@ -8566,8 +8617,8 @@
         </w:tblBorders>
       </w:tblPr>
       <w:tblGrid>
-        <w:gridCol w:w="2600"/>
-        <w:gridCol w:w="7480"/>
+        <w:gridCol w:w="2000"/>
+        <w:gridCol w:w="8080"/>
       </w:tblGrid>
       <w:tr>
         <w:trPr>
@@ -8575,7 +8626,7 @@
         </w:trPr>
         <w:tc>
           <w:tcPr>
-            <w:tcW w:type="dxa" w:w="2600"/>
+            <w:tcW w:type="dxa" w:w="2000"/>
             <w:tcBorders>
               <w:top w:val="none" w:color="FFFFFF" w:sz="0"/>
               <w:left w:val="none" w:color="FFFFFF" w:sz="0"/>
@@ -8583,21 +8634,22 @@
               <w:right w:val="none" w:color="FFFFFF" w:sz="0"/>
             </w:tcBorders>
             <w:tcMar>
-              <w:top w:type="dxa" w:w="100"/>
+              <w:top w:type="dxa" w:w="80"/>
               <w:left w:type="dxa" w:w="0"/>
-              <w:bottom w:type="dxa" w:w="100"/>
+              <w:bottom w:type="dxa" w:w="80"/>
               <w:right w:type="dxa" w:w="200"/>
             </w:tcMar>
             <w:vAlign w:val="top"/>
           </w:tcPr>
           <w:p>
             <w:pPr>
-              <w:spacing w:after="100"/>
+              <w:spacing w:after="60"/>
+              <w:jc w:val="left"/>
             </w:pPr>
             <w:r>
               <w:drawing>
                 <wp:inline distT="0" distB="0" distL="0" distR="0">
-                  <wp:extent cx="1571625" cy="2333625"/>
+                  <wp:extent cx="1143000" cy="1714500"/>
                   <wp:effectExtent t="0" r="0" b="0" l="0"/>
                   <wp:docPr id="1" name="img" descr="image" title="data_cover.jpg"/>
                   <wp:cNvGraphicFramePr>
@@ -8622,7 +8674,7 @@
                         <pic:spPr bwMode="auto">
                           <a:xfrm>
                             <a:off x="0" y="0"/>
-                            <a:ext cx="1571625" cy="2333625"/>
+                            <a:ext cx="1143000" cy="1714500"/>
                           </a:xfrm>
                           <a:prstGeom prst="rect">
                             <a:avLst/>
@@ -8638,7 +8690,7 @@
         </w:tc>
         <w:tc>
           <w:tcPr>
-            <w:tcW w:type="dxa" w:w="7480"/>
+            <w:tcW w:type="dxa" w:w="8080"/>
             <w:tcBorders>
               <w:top w:val="none" w:color="FFFFFF" w:sz="0"/>
               <w:left w:val="none" w:color="FFFFFF" w:sz="0"/>
@@ -8646,16 +8698,16 @@
               <w:right w:val="none" w:color="FFFFFF" w:sz="0"/>
             </w:tcBorders>
             <w:tcMar>
-              <w:top w:type="dxa" w:w="100"/>
+              <w:top w:type="dxa" w:w="80"/>
               <w:left w:type="dxa" w:w="200"/>
-              <w:bottom w:type="dxa" w:w="100"/>
+              <w:bottom w:type="dxa" w:w="80"/>
               <w:right w:type="dxa" w:w="0"/>
             </w:tcMar>
             <w:vAlign w:val="top"/>
           </w:tcPr>
           <w:p>
             <w:pPr>
-              <w:spacing w:after="80"/>
+              <w:spacing w:after="60"/>
             </w:pPr>
             <w:r>
               <w:rPr>
@@ -8663,15 +8715,15 @@
                 <w:b/>
                 <w:bCs/>
                 <w:color w:val="0B1F3A"/>
-                <w:sz w:val="34"/>
-                <w:szCs w:val="34"/>
+                <w:sz w:val="30"/>
+                <w:szCs w:val="30"/>
               </w:rPr>
               <w:t xml:space="preserve">Data</w:t>
             </w:r>
           </w:p>
           <w:p>
             <w:pPr>
-              <w:spacing w:after="100"/>
+              <w:spacing w:after="80"/>
             </w:pPr>
             <w:r>
               <w:rPr>
@@ -8679,23 +8731,23 @@
                 <w:i/>
                 <w:iCs/>
                 <w:color w:val="5A6B82"/>
+                <w:sz w:val="18"/>
+                <w:szCs w:val="18"/>
+              </w:rPr>
+              <w:t xml:space="preserve">by Mark Stanley  ·  Retail $20.66</w:t>
+            </w:r>
+          </w:p>
+          <w:p>
+            <w:pPr>
+              <w:spacing w:after="60"/>
+            </w:pPr>
+            <w:r>
+              <w:rPr>
+                <w:rFonts w:ascii="Calibri" w:cs="Calibri" w:eastAsia="Calibri" w:hAnsi="Calibri"/>
+                <w:color w:val="1A1A1A"/>
                 <w:sz w:val="20"/>
                 <w:szCs w:val="20"/>
               </w:rPr>
-              <w:t xml:space="preserve">by Mark Stanley  ·  Retail $20.66</w:t>
-            </w:r>
-          </w:p>
-          <w:p>
-            <w:pPr>
-              <w:spacing w:after="100"/>
-            </w:pPr>
-            <w:r>
-              <w:rPr>
-                <w:rFonts w:ascii="Calibri" w:cs="Calibri" w:eastAsia="Calibri" w:hAnsi="Calibri"/>
-                <w:color w:val="1A1A1A"/>
-                <w:sz w:val="22"/>
-                <w:szCs w:val="22"/>
-              </w:rPr>
               <w:t xml:space="preserve">Harness Your Numbers to Go from Uncertain to Unstoppable. A practical playbook for using data to drive decisions and accountability.</w:t>
             </w:r>
           </w:p>
@@ -8704,7 +8756,7 @@
     </w:tbl>
     <w:p>
       <w:pPr>
-        <w:spacing w:after="240"/>
+        <w:spacing w:after="160"/>
       </w:pPr>
       <w:r>
         <w:t xml:space="preserve"/>
@@ -8723,8 +8775,8 @@
         </w:tblBorders>
       </w:tblPr>
       <w:tblGrid>
-        <w:gridCol w:w="2600"/>
-        <w:gridCol w:w="7480"/>
+        <w:gridCol w:w="2000"/>
+        <w:gridCol w:w="8080"/>
       </w:tblGrid>
       <w:tr>
         <w:trPr>
@@ -8732,7 +8784,7 @@
         </w:trPr>
         <w:tc>
           <w:tcPr>
-            <w:tcW w:type="dxa" w:w="2600"/>
+            <w:tcW w:type="dxa" w:w="2000"/>
             <w:tcBorders>
               <w:top w:val="none" w:color="FFFFFF" w:sz="0"/>
               <w:left w:val="none" w:color="FFFFFF" w:sz="0"/>
@@ -8740,21 +8792,22 @@
               <w:right w:val="none" w:color="FFFFFF" w:sz="0"/>
             </w:tcBorders>
             <w:tcMar>
-              <w:top w:type="dxa" w:w="100"/>
+              <w:top w:type="dxa" w:w="80"/>
               <w:left w:type="dxa" w:w="0"/>
-              <w:bottom w:type="dxa" w:w="100"/>
+              <w:bottom w:type="dxa" w:w="80"/>
               <w:right w:type="dxa" w:w="200"/>
             </w:tcMar>
             <w:vAlign w:val="top"/>
           </w:tcPr>
           <w:p>
             <w:pPr>
-              <w:spacing w:after="100"/>
+              <w:spacing w:after="60"/>
+              <w:jc w:val="left"/>
             </w:pPr>
             <w:r>
               <w:drawing>
                 <wp:inline distT="0" distB="0" distL="0" distR="0">
-                  <wp:extent cx="1571625" cy="2333625"/>
+                  <wp:extent cx="1047750" cy="1714500"/>
                   <wp:effectExtent t="0" r="0" b="0" l="0"/>
                   <wp:docPr id="1" name="img" descr="image" title="rollout_cover.jpg"/>
                   <wp:cNvGraphicFramePr>
@@ -8779,7 +8832,7 @@
                         <pic:spPr bwMode="auto">
                           <a:xfrm>
                             <a:off x="0" y="0"/>
-                            <a:ext cx="1571625" cy="2333625"/>
+                            <a:ext cx="1047750" cy="1714500"/>
                           </a:xfrm>
                           <a:prstGeom prst="rect">
                             <a:avLst/>
@@ -8795,7 +8848,7 @@
         </w:tc>
         <w:tc>
           <w:tcPr>
-            <w:tcW w:type="dxa" w:w="7480"/>
+            <w:tcW w:type="dxa" w:w="8080"/>
             <w:tcBorders>
               <w:top w:val="none" w:color="FFFFFF" w:sz="0"/>
               <w:left w:val="none" w:color="FFFFFF" w:sz="0"/>
@@ -8803,16 +8856,16 @@
               <w:right w:val="none" w:color="FFFFFF" w:sz="0"/>
             </w:tcBorders>
             <w:tcMar>
-              <w:top w:type="dxa" w:w="100"/>
+              <w:top w:type="dxa" w:w="80"/>
               <w:left w:type="dxa" w:w="200"/>
-              <w:bottom w:type="dxa" w:w="100"/>
+              <w:bottom w:type="dxa" w:w="80"/>
               <w:right w:type="dxa" w:w="0"/>
             </w:tcMar>
             <w:vAlign w:val="top"/>
           </w:tcPr>
           <w:p>
             <w:pPr>
-              <w:spacing w:after="80"/>
+              <w:spacing w:after="60"/>
             </w:pPr>
             <w:r>
               <w:rPr>
@@ -8820,15 +8873,15 @@
                 <w:b/>
                 <w:bCs/>
                 <w:color w:val="0B1F3A"/>
-                <w:sz w:val="34"/>
-                <w:szCs w:val="34"/>
+                <w:sz w:val="30"/>
+                <w:szCs w:val="30"/>
               </w:rPr>
               <w:t xml:space="preserve">Rollout</w:t>
             </w:r>
           </w:p>
           <w:p>
             <w:pPr>
-              <w:spacing w:after="100"/>
+              <w:spacing w:after="80"/>
             </w:pPr>
             <w:r>
               <w:rPr>
@@ -8836,23 +8889,23 @@
                 <w:i/>
                 <w:iCs/>
                 <w:color w:val="5A6B82"/>
+                <w:sz w:val="18"/>
+                <w:szCs w:val="18"/>
+              </w:rPr>
+              <w:t xml:space="preserve">by Beth Fahey  ·  Retail $29.99</w:t>
+            </w:r>
+          </w:p>
+          <w:p>
+            <w:pPr>
+              <w:spacing w:after="60"/>
+            </w:pPr>
+            <w:r>
+              <w:rPr>
+                <w:rFonts w:ascii="Calibri" w:cs="Calibri" w:eastAsia="Calibri" w:hAnsi="Calibri"/>
+                <w:color w:val="1A1A1A"/>
                 <w:sz w:val="20"/>
                 <w:szCs w:val="20"/>
               </w:rPr>
-              <w:t xml:space="preserve">by Beth Fahey  ·  Retail $29.99</w:t>
-            </w:r>
-          </w:p>
-          <w:p>
-            <w:pPr>
-              <w:spacing w:after="100"/>
-            </w:pPr>
-            <w:r>
-              <w:rPr>
-                <w:rFonts w:ascii="Calibri" w:cs="Calibri" w:eastAsia="Calibri" w:hAnsi="Calibri"/>
-                <w:color w:val="1A1A1A"/>
-                <w:sz w:val="22"/>
-                <w:szCs w:val="22"/>
-              </w:rPr>
               <w:t xml:space="preserve">Get Your Entire Team Running on EOS® to Achieve Your Vision. A field-tested guide for taking EOS deeper across your whole organization.</w:t>
             </w:r>
           </w:p>
@@ -8861,7 +8914,7 @@
     </w:tbl>
     <w:p>
       <w:pPr>
-        <w:spacing w:after="240"/>
+        <w:spacing w:after="160"/>
       </w:pPr>
       <w:r>
         <w:t xml:space="preserve"/>
@@ -8880,8 +8933,8 @@
         </w:tblBorders>
       </w:tblPr>
       <w:tblGrid>
-        <w:gridCol w:w="2600"/>
-        <w:gridCol w:w="7480"/>
+        <w:gridCol w:w="2000"/>
+        <w:gridCol w:w="8080"/>
       </w:tblGrid>
       <w:tr>
         <w:trPr>
@@ -8889,7 +8942,7 @@
         </w:trPr>
         <w:tc>
           <w:tcPr>
-            <w:tcW w:type="dxa" w:w="2600"/>
+            <w:tcW w:type="dxa" w:w="2000"/>
             <w:tcBorders>
               <w:top w:val="none" w:color="FFFFFF" w:sz="0"/>
               <w:left w:val="none" w:color="FFFFFF" w:sz="0"/>
@@ -8897,21 +8950,22 @@
               <w:right w:val="none" w:color="FFFFFF" w:sz="0"/>
             </w:tcBorders>
             <w:tcMar>
-              <w:top w:type="dxa" w:w="100"/>
+              <w:top w:type="dxa" w:w="80"/>
               <w:left w:type="dxa" w:w="0"/>
-              <w:bottom w:type="dxa" w:w="100"/>
+              <w:bottom w:type="dxa" w:w="80"/>
               <w:right w:type="dxa" w:w="200"/>
             </w:tcMar>
             <w:vAlign w:val="top"/>
           </w:tcPr>
           <w:p>
             <w:pPr>
-              <w:spacing w:after="100"/>
+              <w:spacing w:after="60"/>
+              <w:jc w:val="left"/>
             </w:pPr>
             <w:r>
               <w:drawing>
                 <wp:inline distT="0" distB="0" distL="0" distR="0">
-                  <wp:extent cx="1571625" cy="2333625"/>
+                  <wp:extent cx="1143000" cy="1343025"/>
                   <wp:effectExtent t="0" r="0" b="0" l="0"/>
                   <wp:docPr id="1" name="img" descr="image" title="visionary_cover.jpg"/>
                   <wp:cNvGraphicFramePr>
@@ -8936,7 +8990,7 @@
                         <pic:spPr bwMode="auto">
                           <a:xfrm>
                             <a:off x="0" y="0"/>
-                            <a:ext cx="1571625" cy="2333625"/>
+                            <a:ext cx="1143000" cy="1343025"/>
                           </a:xfrm>
                           <a:prstGeom prst="rect">
                             <a:avLst/>
@@ -8952,7 +9006,7 @@
         </w:tc>
         <w:tc>
           <w:tcPr>
-            <w:tcW w:type="dxa" w:w="7480"/>
+            <w:tcW w:type="dxa" w:w="8080"/>
             <w:tcBorders>
               <w:top w:val="none" w:color="FFFFFF" w:sz="0"/>
               <w:left w:val="none" w:color="FFFFFF" w:sz="0"/>
@@ -8960,16 +9014,16 @@
               <w:right w:val="none" w:color="FFFFFF" w:sz="0"/>
             </w:tcBorders>
             <w:tcMar>
-              <w:top w:type="dxa" w:w="100"/>
+              <w:top w:type="dxa" w:w="80"/>
               <w:left w:type="dxa" w:w="200"/>
-              <w:bottom w:type="dxa" w:w="100"/>
+              <w:bottom w:type="dxa" w:w="80"/>
               <w:right w:type="dxa" w:w="0"/>
             </w:tcMar>
             <w:vAlign w:val="top"/>
           </w:tcPr>
           <w:p>
             <w:pPr>
-              <w:spacing w:after="80"/>
+              <w:spacing w:after="60"/>
             </w:pPr>
             <w:r>
               <w:rPr>
@@ -8977,15 +9031,15 @@
                 <w:b/>
                 <w:bCs/>
                 <w:color w:val="0B1F3A"/>
-                <w:sz w:val="34"/>
-                <w:szCs w:val="34"/>
+                <w:sz w:val="30"/>
+                <w:szCs w:val="30"/>
               </w:rPr>
               <w:t xml:space="preserve">Visionary</w:t>
             </w:r>
           </w:p>
           <w:p>
             <w:pPr>
-              <w:spacing w:after="100"/>
+              <w:spacing w:after="80"/>
             </w:pPr>
             <w:r>
               <w:rPr>
@@ -8993,23 +9047,23 @@
                 <w:i/>
                 <w:iCs/>
                 <w:color w:val="5A6B82"/>
+                <w:sz w:val="18"/>
+                <w:szCs w:val="18"/>
+              </w:rPr>
+              <w:t xml:space="preserve">by Mark C. Winters  ·  Retail $29.99</w:t>
+            </w:r>
+          </w:p>
+          <w:p>
+            <w:pPr>
+              <w:spacing w:after="60"/>
+            </w:pPr>
+            <w:r>
+              <w:rPr>
+                <w:rFonts w:ascii="Calibri" w:cs="Calibri" w:eastAsia="Calibri" w:hAnsi="Calibri"/>
+                <w:color w:val="1A1A1A"/>
                 <w:sz w:val="20"/>
                 <w:szCs w:val="20"/>
               </w:rPr>
-              <w:t xml:space="preserve">by Mark C. Winters  ·  Retail $29.99</w:t>
-            </w:r>
-          </w:p>
-          <w:p>
-            <w:pPr>
-              <w:spacing w:after="100"/>
-            </w:pPr>
-            <w:r>
-              <w:rPr>
-                <w:rFonts w:ascii="Calibri" w:cs="Calibri" w:eastAsia="Calibri" w:hAnsi="Calibri"/>
-                <w:color w:val="1A1A1A"/>
-                <w:sz w:val="22"/>
-                <w:szCs w:val="22"/>
-              </w:rPr>
               <w:t xml:space="preserve">How Driven Entrepreneurs Get What They Want Without Doing It All Themselves. The Visionary/Integrator dynamic that powers great companies.</w:t>
             </w:r>
           </w:p>
@@ -9018,7 +9072,7 @@
     </w:tbl>
     <w:p>
       <w:pPr>
-        <w:spacing w:after="240"/>
+        <w:spacing w:after="160"/>
       </w:pPr>
       <w:r>
         <w:t xml:space="preserve"/>
@@ -9075,7 +9129,7 @@
     </w:p>
     <w:p>
       <w:pPr>
-        <w:spacing w:after="200"/>
+        <w:spacing w:after="160"/>
       </w:pPr>
       <w:r>
         <w:t xml:space="preserve"/>
@@ -9111,8 +9165,7 @@
         </w:tblBorders>
       </w:tblPr>
       <w:tblGrid>
-        <w:gridCol w:w="5040"/>
-        <w:gridCol w:w="5040"/>
+        <w:gridCol w:w="10080"/>
       </w:tblGrid>
       <w:tr>
         <w:trPr>
@@ -9120,7 +9173,7 @@
         </w:trPr>
         <w:tc>
           <w:tcPr>
-            <w:tcW w:type="dxa" w:w="5040"/>
+            <w:tcW w:type="dxa" w:w="10080"/>
             <w:tcBorders>
               <w:top w:val="single" w:color="C9D2DE" w:sz="4"/>
               <w:left w:val="single" w:color="C9D2DE" w:sz="4"/>
@@ -9129,22 +9182,22 @@
             </w:tcBorders>
             <w:shd w:fill="FFFFFF" w:val="clear"/>
             <w:tcMar>
-              <w:top w:type="dxa" w:w="200"/>
-              <w:left w:type="dxa" w:w="200"/>
-              <w:bottom w:type="dxa" w:w="200"/>
-              <w:right w:type="dxa" w:w="200"/>
+              <w:top w:type="dxa" w:w="240"/>
+              <w:left w:type="dxa" w:w="160"/>
+              <w:bottom w:type="dxa" w:w="240"/>
+              <w:right w:type="dxa" w:w="160"/>
             </w:tcMar>
             <w:vAlign w:val="center"/>
           </w:tcPr>
           <w:p>
             <w:pPr>
-              <w:spacing w:after="100"/>
+              <w:spacing w:after="80"/>
               <w:jc w:val="center"/>
             </w:pPr>
             <w:r>
               <w:drawing>
                 <wp:inline distT="0" distB="0" distL="0" distR="0">
-                  <wp:extent cx="1905000" cy="857250"/>
+                  <wp:extent cx="5257800" cy="1905000"/>
                   <wp:effectExtent t="0" r="0" b="0" l="0"/>
                   <wp:docPr id="1" name="img" descr="image" title="strety.png"/>
                   <wp:cNvGraphicFramePr>
@@ -9169,7 +9222,7 @@
                         <pic:spPr bwMode="auto">
                           <a:xfrm>
                             <a:off x="0" y="0"/>
-                            <a:ext cx="1905000" cy="857250"/>
+                            <a:ext cx="5257800" cy="1905000"/>
                           </a:xfrm>
                           <a:prstGeom prst="rect">
                             <a:avLst/>
@@ -9184,7 +9237,7 @@
           </w:p>
           <w:p>
             <w:pPr>
-              <w:spacing w:after="40"/>
+              <w:spacing w:after="30"/>
               <w:jc w:val="center"/>
             </w:pPr>
             <w:r>
@@ -9193,34 +9246,63 @@
                 <w:b/>
                 <w:bCs/>
                 <w:color w:val="0B1F3A"/>
-                <w:sz w:val="22"/>
-                <w:szCs w:val="22"/>
+                <w:sz w:val="26"/>
+                <w:szCs w:val="26"/>
               </w:rPr>
               <w:t xml:space="preserve">Strety</w:t>
             </w:r>
           </w:p>
           <w:p>
             <w:pPr>
-              <w:spacing w:after="100"/>
+              <w:spacing w:after="80"/>
               <w:jc w:val="center"/>
             </w:pPr>
-            <w:hyperlink w:history="1" r:id="rIdsj6vgtfjnbml6uqhit0sb">
+            <w:hyperlink w:history="1" r:id="rIdoidva2roex5ivfb09prdn">
               <w:r>
                 <w:rPr>
                   <w:rStyle w:val="Hyperlink"/>
                   <w:rFonts w:ascii="Calibri" w:cs="Calibri" w:eastAsia="Calibri" w:hAnsi="Calibri"/>
                   <w:color w:val="E87722"/>
-                  <w:sz w:val="18"/>
-                  <w:szCs w:val="18"/>
+                  <w:sz w:val="20"/>
+                  <w:szCs w:val="20"/>
                 </w:rPr>
                 <w:t xml:space="preserve">strety.com</w:t>
               </w:r>
             </w:hyperlink>
           </w:p>
         </w:tc>
-        <w:tc>
-          <w:tcPr>
-            <w:tcW w:type="dxa" w:w="5040"/>
+      </w:tr>
+    </w:tbl>
+    <w:p>
+      <w:pPr>
+        <w:spacing w:after="100"/>
+      </w:pPr>
+      <w:r>
+        <w:t xml:space="preserve"/>
+      </w:r>
+    </w:p>
+    <w:tbl>
+      <w:tblPr>
+        <w:tblW w:type="dxa" w:w="10080"/>
+        <w:tblBorders>
+          <w:top w:val="single" w:color="auto" w:sz="4"/>
+          <w:left w:val="single" w:color="auto" w:sz="4"/>
+          <w:bottom w:val="single" w:color="auto" w:sz="4"/>
+          <w:right w:val="single" w:color="auto" w:sz="4"/>
+          <w:insideH w:val="single" w:color="auto" w:sz="4"/>
+          <w:insideV w:val="single" w:color="auto" w:sz="4"/>
+        </w:tblBorders>
+      </w:tblPr>
+      <w:tblGrid>
+        <w:gridCol w:w="10080"/>
+      </w:tblGrid>
+      <w:tr>
+        <w:trPr>
+          <w:cantSplit/>
+        </w:trPr>
+        <w:tc>
+          <w:tcPr>
+            <w:tcW w:type="dxa" w:w="10080"/>
             <w:tcBorders>
               <w:top w:val="single" w:color="C9D2DE" w:sz="4"/>
               <w:left w:val="single" w:color="C9D2DE" w:sz="4"/>
@@ -9229,22 +9311,22 @@
             </w:tcBorders>
             <w:shd w:fill="FFFFFF" w:val="clear"/>
             <w:tcMar>
-              <w:top w:type="dxa" w:w="200"/>
-              <w:left w:type="dxa" w:w="200"/>
-              <w:bottom w:type="dxa" w:w="200"/>
-              <w:right w:type="dxa" w:w="200"/>
+              <w:top w:type="dxa" w:w="240"/>
+              <w:left w:type="dxa" w:w="160"/>
+              <w:bottom w:type="dxa" w:w="240"/>
+              <w:right w:type="dxa" w:w="160"/>
             </w:tcMar>
             <w:vAlign w:val="center"/>
           </w:tcPr>
           <w:p>
             <w:pPr>
-              <w:spacing w:after="100"/>
+              <w:spacing w:after="80"/>
               <w:jc w:val="center"/>
             </w:pPr>
             <w:r>
               <w:drawing>
                 <wp:inline distT="0" distB="0" distL="0" distR="0">
-                  <wp:extent cx="1905000" cy="857250"/>
+                  <wp:extent cx="5962650" cy="1905000"/>
                   <wp:effectExtent t="0" r="0" b="0" l="0"/>
                   <wp:docPr id="1" name="img" descr="image" title="tsos.png"/>
                   <wp:cNvGraphicFramePr>
@@ -9269,7 +9351,7 @@
                         <pic:spPr bwMode="auto">
                           <a:xfrm>
                             <a:off x="0" y="0"/>
-                            <a:ext cx="1905000" cy="857250"/>
+                            <a:ext cx="5962650" cy="1905000"/>
                           </a:xfrm>
                           <a:prstGeom prst="rect">
                             <a:avLst/>
@@ -9284,7 +9366,7 @@
           </w:p>
           <w:p>
             <w:pPr>
-              <w:spacing w:after="40"/>
+              <w:spacing w:after="30"/>
               <w:jc w:val="center"/>
             </w:pPr>
             <w:r>
@@ -9293,25 +9375,25 @@
                 <w:b/>
                 <w:bCs/>
                 <w:color w:val="0B1F3A"/>
-                <w:sz w:val="22"/>
-                <w:szCs w:val="22"/>
+                <w:sz w:val="26"/>
+                <w:szCs w:val="26"/>
               </w:rPr>
               <w:t xml:space="preserve">The System of Selling</w:t>
             </w:r>
           </w:p>
           <w:p>
             <w:pPr>
-              <w:spacing w:after="100"/>
+              <w:spacing w:after="80"/>
               <w:jc w:val="center"/>
             </w:pPr>
-            <w:hyperlink w:history="1" r:id="rIdqqdja3grxlmaahmaq4gtu">
+            <w:hyperlink w:history="1" r:id="rId7nnwf2ijrxgslgjwtdwpr">
               <w:r>
                 <w:rPr>
                   <w:rStyle w:val="Hyperlink"/>
                   <w:rFonts w:ascii="Calibri" w:cs="Calibri" w:eastAsia="Calibri" w:hAnsi="Calibri"/>
                   <w:color w:val="E87722"/>
-                  <w:sz w:val="18"/>
-                  <w:szCs w:val="18"/>
+                  <w:sz w:val="20"/>
+                  <w:szCs w:val="20"/>
                 </w:rPr>
                 <w:t xml:space="preserve">thesystemofselling.com</w:t>
               </w:r>
@@ -9322,7 +9404,7 @@
     </w:tbl>
     <w:p>
       <w:pPr>
-        <w:spacing w:after="120"/>
+        <w:spacing w:after="100"/>
       </w:pPr>
       <w:r>
         <w:t xml:space="preserve"/>
@@ -9330,7 +9412,7 @@
     </w:p>
     <w:p>
       <w:pPr>
-        <w:spacing w:after="200"/>
+        <w:spacing w:after="180"/>
       </w:pPr>
       <w:r>
         <w:t xml:space="preserve"/>
@@ -9384,22 +9466,22 @@
             </w:tcBorders>
             <w:shd w:fill="FFFFFF" w:val="clear"/>
             <w:tcMar>
-              <w:top w:type="dxa" w:w="200"/>
-              <w:left w:type="dxa" w:w="200"/>
-              <w:bottom w:type="dxa" w:w="200"/>
-              <w:right w:type="dxa" w:w="200"/>
+              <w:top w:type="dxa" w:w="160"/>
+              <w:left w:type="dxa" w:w="160"/>
+              <w:bottom w:type="dxa" w:w="160"/>
+              <w:right w:type="dxa" w:w="160"/>
             </w:tcMar>
             <w:vAlign w:val="center"/>
           </w:tcPr>
           <w:p>
             <w:pPr>
-              <w:spacing w:after="100"/>
+              <w:spacing w:after="80"/>
               <w:jc w:val="center"/>
             </w:pPr>
             <w:r>
               <w:drawing>
                 <wp:inline distT="0" distB="0" distL="0" distR="0">
-                  <wp:extent cx="1905000" cy="857250"/>
+                  <wp:extent cx="2895600" cy="723900"/>
                   <wp:effectExtent t="0" r="0" b="0" l="0"/>
                   <wp:docPr id="1" name="img" descr="image" title="procfopartners.png"/>
                   <wp:cNvGraphicFramePr>
@@ -9424,7 +9506,7 @@
                         <pic:spPr bwMode="auto">
                           <a:xfrm>
                             <a:off x="0" y="0"/>
-                            <a:ext cx="1905000" cy="857250"/>
+                            <a:ext cx="2895600" cy="723900"/>
                           </a:xfrm>
                           <a:prstGeom prst="rect">
                             <a:avLst/>
@@ -9439,7 +9521,7 @@
           </w:p>
           <w:p>
             <w:pPr>
-              <w:spacing w:after="40"/>
+              <w:spacing w:after="30"/>
               <w:jc w:val="center"/>
             </w:pPr>
             <w:r>
@@ -9456,17 +9538,17 @@
           </w:p>
           <w:p>
             <w:pPr>
-              <w:spacing w:after="100"/>
+              <w:spacing w:after="80"/>
               <w:jc w:val="center"/>
             </w:pPr>
-            <w:hyperlink w:history="1" r:id="rIdlzkwat8_hxvt4gmn38pzv">
+            <w:hyperlink w:history="1" r:id="rId5jz6itw7g89qpjw8uzkx2">
               <w:r>
                 <w:rPr>
                   <w:rStyle w:val="Hyperlink"/>
                   <w:rFonts w:ascii="Calibri" w:cs="Calibri" w:eastAsia="Calibri" w:hAnsi="Calibri"/>
                   <w:color w:val="E87722"/>
-                  <w:sz w:val="18"/>
-                  <w:szCs w:val="18"/>
+                  <w:sz w:val="14"/>
+                  <w:szCs w:val="14"/>
                 </w:rPr>
                 <w:t xml:space="preserve">procfopartners.com</w:t>
               </w:r>
@@ -9484,22 +9566,22 @@
             </w:tcBorders>
             <w:shd w:fill="FFFFFF" w:val="clear"/>
             <w:tcMar>
-              <w:top w:type="dxa" w:w="200"/>
-              <w:left w:type="dxa" w:w="200"/>
-              <w:bottom w:type="dxa" w:w="200"/>
-              <w:right w:type="dxa" w:w="200"/>
+              <w:top w:type="dxa" w:w="160"/>
+              <w:left w:type="dxa" w:w="160"/>
+              <w:bottom w:type="dxa" w:w="160"/>
+              <w:right w:type="dxa" w:w="160"/>
             </w:tcMar>
             <w:vAlign w:val="center"/>
           </w:tcPr>
           <w:p>
             <w:pPr>
-              <w:spacing w:after="100"/>
+              <w:spacing w:after="80"/>
               <w:jc w:val="center"/>
             </w:pPr>
             <w:r>
               <w:drawing>
                 <wp:inline distT="0" distB="0" distL="0" distR="0">
-                  <wp:extent cx="1905000" cy="857250"/>
+                  <wp:extent cx="2895600" cy="1047750"/>
                   <wp:effectExtent t="0" r="0" b="0" l="0"/>
                   <wp:docPr id="1" name="img" descr="image" title="titustalent.png"/>
                   <wp:cNvGraphicFramePr>
@@ -9524,7 +9606,7 @@
                         <pic:spPr bwMode="auto">
                           <a:xfrm>
                             <a:off x="0" y="0"/>
-                            <a:ext cx="1905000" cy="857250"/>
+                            <a:ext cx="2895600" cy="1047750"/>
                           </a:xfrm>
                           <a:prstGeom prst="rect">
                             <a:avLst/>
@@ -9539,7 +9621,7 @@
           </w:p>
           <w:p>
             <w:pPr>
-              <w:spacing w:after="40"/>
+              <w:spacing w:after="30"/>
               <w:jc w:val="center"/>
             </w:pPr>
             <w:r>
@@ -9556,17 +9638,17 @@
           </w:p>
           <w:p>
             <w:pPr>
-              <w:spacing w:after="100"/>
+              <w:spacing w:after="80"/>
               <w:jc w:val="center"/>
             </w:pPr>
-            <w:hyperlink w:history="1" r:id="rIdxzkww3pgbee1u375rxiia">
+            <w:hyperlink w:history="1" r:id="rIdkckhwdln4fs2hal86vxyb">
               <w:r>
                 <w:rPr>
                   <w:rStyle w:val="Hyperlink"/>
                   <w:rFonts w:ascii="Calibri" w:cs="Calibri" w:eastAsia="Calibri" w:hAnsi="Calibri"/>
                   <w:color w:val="E87722"/>
-                  <w:sz w:val="18"/>
-                  <w:szCs w:val="18"/>
+                  <w:sz w:val="14"/>
+                  <w:szCs w:val="14"/>
                 </w:rPr>
                 <w:t xml:space="preserve">titus-talent.com</w:t>
               </w:r>
@@ -9577,7 +9659,7 @@
     </w:tbl>
     <w:p>
       <w:pPr>
-        <w:spacing w:after="120"/>
+        <w:spacing w:after="100"/>
       </w:pPr>
       <w:r>
         <w:t xml:space="preserve"/>
@@ -9585,7 +9667,7 @@
     </w:p>
     <w:p>
       <w:pPr>
-        <w:spacing w:after="200"/>
+        <w:spacing w:after="180"/>
       </w:pPr>
       <w:r>
         <w:t xml:space="preserve"/>
@@ -9621,8 +9703,7 @@
         </w:tblBorders>
       </w:tblPr>
       <w:tblGrid>
-        <w:gridCol w:w="5040"/>
-        <w:gridCol w:w="5040"/>
+        <w:gridCol w:w="10080"/>
       </w:tblGrid>
       <w:tr>
         <w:trPr>
@@ -9630,7 +9711,7 @@
         </w:trPr>
         <w:tc>
           <w:tcPr>
-            <w:tcW w:type="dxa" w:w="5040"/>
+            <w:tcW w:type="dxa" w:w="10080"/>
             <w:tcBorders>
               <w:top w:val="single" w:color="C9D2DE" w:sz="4"/>
               <w:left w:val="single" w:color="C9D2DE" w:sz="4"/>
@@ -9639,22 +9720,22 @@
             </w:tcBorders>
             <w:shd w:fill="FFFFFF" w:val="clear"/>
             <w:tcMar>
-              <w:top w:type="dxa" w:w="200"/>
-              <w:left w:type="dxa" w:w="200"/>
-              <w:bottom w:type="dxa" w:w="200"/>
-              <w:right w:type="dxa" w:w="200"/>
+              <w:top w:type="dxa" w:w="160"/>
+              <w:left w:type="dxa" w:w="160"/>
+              <w:bottom w:type="dxa" w:w="160"/>
+              <w:right w:type="dxa" w:w="160"/>
             </w:tcMar>
             <w:vAlign w:val="center"/>
           </w:tcPr>
           <w:p>
             <w:pPr>
-              <w:spacing w:after="100"/>
+              <w:spacing w:after="80"/>
               <w:jc w:val="center"/>
             </w:pPr>
             <w:r>
               <w:drawing>
                 <wp:inline distT="0" distB="0" distL="0" distR="0">
-                  <wp:extent cx="1905000" cy="857250"/>
+                  <wp:extent cx="2667000" cy="1333500"/>
                   <wp:effectExtent t="0" r="0" b="0" l="0"/>
                   <wp:docPr id="1" name="img" descr="image" title="ninety.png"/>
                   <wp:cNvGraphicFramePr>
@@ -9679,7 +9760,7 @@
                         <pic:spPr bwMode="auto">
                           <a:xfrm>
                             <a:off x="0" y="0"/>
-                            <a:ext cx="1905000" cy="857250"/>
+                            <a:ext cx="2667000" cy="1333500"/>
                           </a:xfrm>
                           <a:prstGeom prst="rect">
                             <a:avLst/>
@@ -9694,7 +9775,7 @@
           </w:p>
           <w:p>
             <w:pPr>
-              <w:spacing w:after="40"/>
+              <w:spacing w:after="30"/>
               <w:jc w:val="center"/>
             </w:pPr>
             <w:r>
@@ -9711,51 +9792,28 @@
           </w:p>
           <w:p>
             <w:pPr>
-              <w:spacing w:after="100"/>
+              <w:spacing w:after="80"/>
               <w:jc w:val="center"/>
             </w:pPr>
-            <w:hyperlink w:history="1" r:id="rIddbdldkry5jgf8zgnkdmxe">
+            <w:hyperlink w:history="1" r:id="rIdkekyv_dcauh_tfztoxakr">
               <w:r>
                 <w:rPr>
                   <w:rStyle w:val="Hyperlink"/>
                   <w:rFonts w:ascii="Calibri" w:cs="Calibri" w:eastAsia="Calibri" w:hAnsi="Calibri"/>
                   <w:color w:val="E87722"/>
-                  <w:sz w:val="18"/>
-                  <w:szCs w:val="18"/>
+                  <w:sz w:val="14"/>
+                  <w:szCs w:val="14"/>
                 </w:rPr>
                 <w:t xml:space="preserve">ninety.io</w:t>
               </w:r>
             </w:hyperlink>
           </w:p>
         </w:tc>
-        <w:tc>
-          <w:tcPr>
-            <w:tcW w:type="dxa" w:w="5040"/>
-            <w:tcBorders>
-              <w:top w:val="none" w:color="FFFFFF" w:sz="0"/>
-              <w:left w:val="none" w:color="FFFFFF" w:sz="0"/>
-              <w:bottom w:val="none" w:color="FFFFFF" w:sz="0"/>
-              <w:right w:val="none" w:color="FFFFFF" w:sz="0"/>
-            </w:tcBorders>
-            <w:tcMar>
-              <w:top w:type="dxa" w:w="80"/>
-              <w:left w:type="dxa" w:w="120"/>
-              <w:bottom w:type="dxa" w:w="80"/>
-              <w:right w:type="dxa" w:w="120"/>
-            </w:tcMar>
-            <w:vAlign w:val="center"/>
-          </w:tcPr>
-          <w:p>
-            <w:r>
-              <w:t xml:space="preserve"/>
-            </w:r>
-          </w:p>
-        </w:tc>
       </w:tr>
     </w:tbl>
     <w:p>
       <w:pPr>
-        <w:spacing w:after="120"/>
+        <w:spacing w:after="100"/>
       </w:pPr>
       <w:r>
         <w:t xml:space="preserve"/>
@@ -9763,7 +9821,7 @@
     </w:p>
     <w:p>
       <w:pPr>
-        <w:spacing w:after="200"/>
+        <w:spacing w:after="180"/>
       </w:pPr>
       <w:r>
         <w:t xml:space="preserve"/>
@@ -9799,8 +9857,7 @@
         </w:tblBorders>
       </w:tblPr>
       <w:tblGrid>
-        <w:gridCol w:w="5040"/>
-        <w:gridCol w:w="5040"/>
+        <w:gridCol w:w="10080"/>
       </w:tblGrid>
       <w:tr>
         <w:trPr>
@@ -9808,7 +9865,7 @@
         </w:trPr>
         <w:tc>
           <w:tcPr>
-            <w:tcW w:type="dxa" w:w="5040"/>
+            <w:tcW w:type="dxa" w:w="10080"/>
             <w:tcBorders>
               <w:top w:val="single" w:color="C9D2DE" w:sz="4"/>
               <w:left w:val="single" w:color="C9D2DE" w:sz="4"/>
@@ -9817,22 +9874,22 @@
             </w:tcBorders>
             <w:shd w:fill="FFFFFF" w:val="clear"/>
             <w:tcMar>
-              <w:top w:type="dxa" w:w="200"/>
-              <w:left w:type="dxa" w:w="200"/>
-              <w:bottom w:type="dxa" w:w="200"/>
-              <w:right w:type="dxa" w:w="200"/>
+              <w:top w:type="dxa" w:w="160"/>
+              <w:left w:type="dxa" w:w="160"/>
+              <w:bottom w:type="dxa" w:w="160"/>
+              <w:right w:type="dxa" w:w="160"/>
             </w:tcMar>
             <w:vAlign w:val="center"/>
           </w:tcPr>
           <w:p>
             <w:pPr>
-              <w:spacing w:after="100"/>
+              <w:spacing w:after="80"/>
               <w:jc w:val="center"/>
             </w:pPr>
             <w:r>
               <w:drawing>
                 <wp:inline distT="0" distB="0" distL="0" distR="0">
-                  <wp:extent cx="1905000" cy="857250"/>
+                  <wp:extent cx="4591050" cy="1143000"/>
                   <wp:effectExtent t="0" r="0" b="0" l="0"/>
                   <wp:docPr id="1" name="img" descr="image" title="vsimple.png"/>
                   <wp:cNvGraphicFramePr>
@@ -9857,7 +9914,7 @@
                         <pic:spPr bwMode="auto">
                           <a:xfrm>
                             <a:off x="0" y="0"/>
-                            <a:ext cx="1905000" cy="857250"/>
+                            <a:ext cx="4591050" cy="1143000"/>
                           </a:xfrm>
                           <a:prstGeom prst="rect">
                             <a:avLst/>
@@ -9872,7 +9929,7 @@
           </w:p>
           <w:p>
             <w:pPr>
-              <w:spacing w:after="40"/>
+              <w:spacing w:after="30"/>
               <w:jc w:val="center"/>
             </w:pPr>
             <w:r>
@@ -9881,59 +9938,36 @@
                 <w:b/>
                 <w:bCs/>
                 <w:color w:val="0B1F3A"/>
-                <w:sz w:val="22"/>
-                <w:szCs w:val="22"/>
+                <w:sz w:val="18"/>
+                <w:szCs w:val="18"/>
               </w:rPr>
               <w:t xml:space="preserve">Vsimple</w:t>
             </w:r>
           </w:p>
           <w:p>
             <w:pPr>
-              <w:spacing w:after="100"/>
+              <w:spacing w:after="80"/>
               <w:jc w:val="center"/>
             </w:pPr>
-            <w:hyperlink w:history="1" r:id="rIdz7d5ps34choklue92wdur">
+            <w:hyperlink w:history="1" r:id="rIdsx8j9z5ljc6optv0qgse8">
               <w:r>
                 <w:rPr>
                   <w:rStyle w:val="Hyperlink"/>
                   <w:rFonts w:ascii="Calibri" w:cs="Calibri" w:eastAsia="Calibri" w:hAnsi="Calibri"/>
                   <w:color w:val="E87722"/>
-                  <w:sz w:val="18"/>
-                  <w:szCs w:val="18"/>
+                  <w:sz w:val="14"/>
+                  <w:szCs w:val="14"/>
                 </w:rPr>
                 <w:t xml:space="preserve">vsimple.com</w:t>
               </w:r>
             </w:hyperlink>
           </w:p>
         </w:tc>
-        <w:tc>
-          <w:tcPr>
-            <w:tcW w:type="dxa" w:w="5040"/>
-            <w:tcBorders>
-              <w:top w:val="none" w:color="FFFFFF" w:sz="0"/>
-              <w:left w:val="none" w:color="FFFFFF" w:sz="0"/>
-              <w:bottom w:val="none" w:color="FFFFFF" w:sz="0"/>
-              <w:right w:val="none" w:color="FFFFFF" w:sz="0"/>
-            </w:tcBorders>
-            <w:tcMar>
-              <w:top w:type="dxa" w:w="80"/>
-              <w:left w:type="dxa" w:w="120"/>
-              <w:bottom w:type="dxa" w:w="80"/>
-              <w:right w:type="dxa" w:w="120"/>
-            </w:tcMar>
-            <w:vAlign w:val="center"/>
-          </w:tcPr>
-          <w:p>
-            <w:r>
-              <w:t xml:space="preserve"/>
-            </w:r>
-          </w:p>
-        </w:tc>
       </w:tr>
     </w:tbl>
     <w:p>
       <w:pPr>
-        <w:spacing w:after="120"/>
+        <w:spacing w:after="100"/>
       </w:pPr>
       <w:r>
         <w:t xml:space="preserve"/>
@@ -9941,7 +9975,7 @@
     </w:p>
     <w:p>
       <w:pPr>
-        <w:spacing w:after="200"/>
+        <w:spacing w:after="180"/>
       </w:pPr>
       <w:r>
         <w:t xml:space="preserve"/>
@@ -9995,22 +10029,22 @@
             </w:tcBorders>
             <w:shd w:fill="FFFFFF" w:val="clear"/>
             <w:tcMar>
-              <w:top w:type="dxa" w:w="200"/>
-              <w:left w:type="dxa" w:w="200"/>
-              <w:bottom w:type="dxa" w:w="200"/>
-              <w:right w:type="dxa" w:w="200"/>
+              <w:top w:type="dxa" w:w="160"/>
+              <w:left w:type="dxa" w:w="160"/>
+              <w:bottom w:type="dxa" w:w="160"/>
+              <w:right w:type="dxa" w:w="160"/>
             </w:tcMar>
             <w:vAlign w:val="center"/>
           </w:tcPr>
           <w:p>
             <w:pPr>
-              <w:spacing w:after="100"/>
+              <w:spacing w:after="80"/>
               <w:jc w:val="center"/>
             </w:pPr>
             <w:r>
               <w:drawing>
                 <wp:inline distT="0" distB="0" distL="0" distR="0">
-                  <wp:extent cx="1905000" cy="857250"/>
+                  <wp:extent cx="2895600" cy="857250"/>
                   <wp:effectExtent t="0" r="0" b="0" l="0"/>
                   <wp:docPr id="1" name="img" descr="image" title="strata.png"/>
                   <wp:cNvGraphicFramePr>
@@ -10035,7 +10069,7 @@
                         <pic:spPr bwMode="auto">
                           <a:xfrm>
                             <a:off x="0" y="0"/>
-                            <a:ext cx="1905000" cy="857250"/>
+                            <a:ext cx="2895600" cy="857250"/>
                           </a:xfrm>
                           <a:prstGeom prst="rect">
                             <a:avLst/>
@@ -10050,7 +10084,7 @@
           </w:p>
           <w:p>
             <w:pPr>
-              <w:spacing w:after="40"/>
+              <w:spacing w:after="30"/>
               <w:jc w:val="center"/>
             </w:pPr>
             <w:r>
@@ -10059,25 +10093,25 @@
                 <w:b/>
                 <w:bCs/>
                 <w:color w:val="0B1F3A"/>
-                <w:sz w:val="22"/>
-                <w:szCs w:val="22"/>
+                <w:sz w:val="18"/>
+                <w:szCs w:val="18"/>
               </w:rPr>
               <w:t xml:space="preserve">Strata Wealth Advisors</w:t>
             </w:r>
           </w:p>
           <w:p>
             <w:pPr>
-              <w:spacing w:after="100"/>
+              <w:spacing w:after="80"/>
               <w:jc w:val="center"/>
             </w:pPr>
-            <w:hyperlink w:history="1" r:id="rIdire7ueguqgmox5nvfclqq">
+            <w:hyperlink w:history="1" r:id="rIdbowjeiwklcig5earcebpc">
               <w:r>
                 <w:rPr>
                   <w:rStyle w:val="Hyperlink"/>
                   <w:rFonts w:ascii="Calibri" w:cs="Calibri" w:eastAsia="Calibri" w:hAnsi="Calibri"/>
                   <w:color w:val="E87722"/>
-                  <w:sz w:val="18"/>
-                  <w:szCs w:val="18"/>
+                  <w:sz w:val="14"/>
+                  <w:szCs w:val="14"/>
                 </w:rPr>
                 <w:t xml:space="preserve">stratawealth.com</w:t>
               </w:r>
@@ -10095,22 +10129,22 @@
             </w:tcBorders>
             <w:shd w:fill="FFFFFF" w:val="clear"/>
             <w:tcMar>
-              <w:top w:type="dxa" w:w="200"/>
-              <w:left w:type="dxa" w:w="200"/>
-              <w:bottom w:type="dxa" w:w="200"/>
-              <w:right w:type="dxa" w:w="200"/>
+              <w:top w:type="dxa" w:w="160"/>
+              <w:left w:type="dxa" w:w="160"/>
+              <w:bottom w:type="dxa" w:w="160"/>
+              <w:right w:type="dxa" w:w="160"/>
             </w:tcMar>
             <w:vAlign w:val="center"/>
           </w:tcPr>
           <w:p>
             <w:pPr>
-              <w:spacing w:after="100"/>
+              <w:spacing w:after="80"/>
               <w:jc w:val="center"/>
             </w:pPr>
             <w:r>
               <w:drawing>
                 <wp:inline distT="0" distB="0" distL="0" distR="0">
-                  <wp:extent cx="1905000" cy="857250"/>
+                  <wp:extent cx="2895600" cy="685800"/>
                   <wp:effectExtent t="0" r="0" b="0" l="0"/>
                   <wp:docPr id="1" name="img" descr="image" title="successco.png"/>
                   <wp:cNvGraphicFramePr>
@@ -10135,7 +10169,7 @@
                         <pic:spPr bwMode="auto">
                           <a:xfrm>
                             <a:off x="0" y="0"/>
-                            <a:ext cx="1905000" cy="857250"/>
+                            <a:ext cx="2895600" cy="685800"/>
                           </a:xfrm>
                           <a:prstGeom prst="rect">
                             <a:avLst/>
@@ -10150,7 +10184,7 @@
           </w:p>
           <w:p>
             <w:pPr>
-              <w:spacing w:after="40"/>
+              <w:spacing w:after="30"/>
               <w:jc w:val="center"/>
             </w:pPr>
             <w:r>
@@ -10159,25 +10193,25 @@
                 <w:b/>
                 <w:bCs/>
                 <w:color w:val="0B1F3A"/>
-                <w:sz w:val="22"/>
-                <w:szCs w:val="22"/>
+                <w:sz w:val="18"/>
+                <w:szCs w:val="18"/>
               </w:rPr>
               <w:t xml:space="preserve">Success.co</w:t>
             </w:r>
           </w:p>
           <w:p>
             <w:pPr>
-              <w:spacing w:after="100"/>
+              <w:spacing w:after="80"/>
               <w:jc w:val="center"/>
             </w:pPr>
-            <w:hyperlink w:history="1" r:id="rIdwxc9c9igpl02rglbg67gy">
+            <w:hyperlink w:history="1" r:id="rIdqghstrwnmoe0mpmbh0cx0">
               <w:r>
                 <w:rPr>
                   <w:rStyle w:val="Hyperlink"/>
                   <w:rFonts w:ascii="Calibri" w:cs="Calibri" w:eastAsia="Calibri" w:hAnsi="Calibri"/>
                   <w:color w:val="E87722"/>
-                  <w:sz w:val="18"/>
-                  <w:szCs w:val="18"/>
+                  <w:sz w:val="14"/>
+                  <w:szCs w:val="14"/>
                 </w:rPr>
                 <w:t xml:space="preserve">success.co</w:t>
               </w:r>
@@ -10188,7 +10222,7 @@
     </w:tbl>
     <w:p>
       <w:pPr>
-        <w:spacing w:after="120"/>
+        <w:spacing w:after="100"/>
       </w:pPr>
       <w:r>
         <w:t xml:space="preserve"/>
@@ -10196,7 +10230,7 @@
     </w:p>
     <w:p>
       <w:pPr>
-        <w:spacing w:after="200"/>
+        <w:spacing w:after="180"/>
       </w:pPr>
       <w:r>
         <w:t xml:space="preserve"/>
@@ -10232,8 +10266,10 @@
         </w:tblBorders>
       </w:tblPr>
       <w:tblGrid>
-        <w:gridCol w:w="5040"/>
-        <w:gridCol w:w="5040"/>
+        <w:gridCol w:w="2520"/>
+        <w:gridCol w:w="2520"/>
+        <w:gridCol w:w="2520"/>
+        <w:gridCol w:w="2520"/>
       </w:tblGrid>
       <w:tr>
         <w:trPr>
@@ -10241,7 +10277,7 @@
         </w:trPr>
         <w:tc>
           <w:tcPr>
-            <w:tcW w:type="dxa" w:w="5040"/>
+            <w:tcW w:type="dxa" w:w="2520"/>
             <w:tcBorders>
               <w:top w:val="single" w:color="C9D2DE" w:sz="4"/>
               <w:left w:val="single" w:color="C9D2DE" w:sz="4"/>
@@ -10250,22 +10286,22 @@
             </w:tcBorders>
             <w:shd w:fill="FFFFFF" w:val="clear"/>
             <w:tcMar>
-              <w:top w:type="dxa" w:w="200"/>
-              <w:left w:type="dxa" w:w="200"/>
-              <w:bottom w:type="dxa" w:w="200"/>
-              <w:right w:type="dxa" w:w="200"/>
+              <w:top w:type="dxa" w:w="100"/>
+              <w:left w:type="dxa" w:w="160"/>
+              <w:bottom w:type="dxa" w:w="100"/>
+              <w:right w:type="dxa" w:w="160"/>
             </w:tcMar>
             <w:vAlign w:val="center"/>
           </w:tcPr>
           <w:p>
             <w:pPr>
-              <w:spacing w:after="100"/>
+              <w:spacing w:after="80"/>
               <w:jc w:val="center"/>
             </w:pPr>
             <w:r>
               <w:drawing>
                 <wp:inline distT="0" distB="0" distL="0" distR="0">
-                  <wp:extent cx="1905000" cy="857250"/>
+                  <wp:extent cx="1295400" cy="495300"/>
                   <wp:effectExtent t="0" r="0" b="0" l="0"/>
                   <wp:docPr id="1" name="img" descr="image" title="360consultingdfw.png"/>
                   <wp:cNvGraphicFramePr>
@@ -10290,7 +10326,7 @@
                         <pic:spPr bwMode="auto">
                           <a:xfrm>
                             <a:off x="0" y="0"/>
-                            <a:ext cx="1905000" cy="857250"/>
+                            <a:ext cx="1295400" cy="495300"/>
                           </a:xfrm>
                           <a:prstGeom prst="rect">
                             <a:avLst/>
@@ -10305,7 +10341,7 @@
           </w:p>
           <w:p>
             <w:pPr>
-              <w:spacing w:after="40"/>
+              <w:spacing w:after="30"/>
               <w:jc w:val="center"/>
             </w:pPr>
             <w:r>
@@ -10314,25 +10350,25 @@
                 <w:b/>
                 <w:bCs/>
                 <w:color w:val="0B1F3A"/>
-                <w:sz w:val="22"/>
-                <w:szCs w:val="22"/>
+                <w:sz w:val="16"/>
+                <w:szCs w:val="16"/>
               </w:rPr>
               <w:t xml:space="preserve">360 Consulting DFW</w:t>
             </w:r>
           </w:p>
           <w:p>
             <w:pPr>
-              <w:spacing w:after="100"/>
+              <w:spacing w:after="80"/>
               <w:jc w:val="center"/>
             </w:pPr>
-            <w:hyperlink w:history="1" r:id="rId0m6dhyfmue-loa9gryete">
+            <w:hyperlink w:history="1" r:id="rId3byiilio6djcc48rnub3i">
               <w:r>
                 <w:rPr>
                   <w:rStyle w:val="Hyperlink"/>
                   <w:rFonts w:ascii="Calibri" w:cs="Calibri" w:eastAsia="Calibri" w:hAnsi="Calibri"/>
                   <w:color w:val="E87722"/>
-                  <w:sz w:val="18"/>
-                  <w:szCs w:val="18"/>
+                  <w:sz w:val="12"/>
+                  <w:szCs w:val="12"/>
                 </w:rPr>
                 <w:t xml:space="preserve">360consultingdfw.com</w:t>
               </w:r>
@@ -10341,7 +10377,7 @@
         </w:tc>
         <w:tc>
           <w:tcPr>
-            <w:tcW w:type="dxa" w:w="5040"/>
+            <w:tcW w:type="dxa" w:w="2520"/>
             <w:tcBorders>
               <w:top w:val="single" w:color="C9D2DE" w:sz="4"/>
               <w:left w:val="single" w:color="C9D2DE" w:sz="4"/>
@@ -10350,22 +10386,22 @@
             </w:tcBorders>
             <w:shd w:fill="FFFFFF" w:val="clear"/>
             <w:tcMar>
-              <w:top w:type="dxa" w:w="200"/>
-              <w:left w:type="dxa" w:w="200"/>
-              <w:bottom w:type="dxa" w:w="200"/>
-              <w:right w:type="dxa" w:w="200"/>
+              <w:top w:type="dxa" w:w="100"/>
+              <w:left w:type="dxa" w:w="160"/>
+              <w:bottom w:type="dxa" w:w="100"/>
+              <w:right w:type="dxa" w:w="160"/>
             </w:tcMar>
             <w:vAlign w:val="center"/>
           </w:tcPr>
           <w:p>
             <w:pPr>
-              <w:spacing w:after="100"/>
+              <w:spacing w:after="80"/>
               <w:jc w:val="center"/>
             </w:pPr>
             <w:r>
               <w:drawing>
                 <wp:inline distT="0" distB="0" distL="0" distR="0">
-                  <wp:extent cx="1905000" cy="857250"/>
+                  <wp:extent cx="1104900" cy="666750"/>
                   <wp:effectExtent t="0" r="0" b="0" l="0"/>
                   <wp:docPr id="1" name="img" descr="image" title="allinoneaccounting.png"/>
                   <wp:cNvGraphicFramePr>
@@ -10390,7 +10426,7 @@
                         <pic:spPr bwMode="auto">
                           <a:xfrm>
                             <a:off x="0" y="0"/>
-                            <a:ext cx="1905000" cy="857250"/>
+                            <a:ext cx="1104900" cy="666750"/>
                           </a:xfrm>
                           <a:prstGeom prst="rect">
                             <a:avLst/>
@@ -10405,7 +10441,7 @@
           </w:p>
           <w:p>
             <w:pPr>
-              <w:spacing w:after="40"/>
+              <w:spacing w:after="30"/>
               <w:jc w:val="center"/>
             </w:pPr>
             <w:r>
@@ -10414,64 +10450,34 @@
                 <w:b/>
                 <w:bCs/>
                 <w:color w:val="0B1F3A"/>
-                <w:sz w:val="22"/>
-                <w:szCs w:val="22"/>
+                <w:sz w:val="16"/>
+                <w:szCs w:val="16"/>
               </w:rPr>
               <w:t xml:space="preserve">All In One Accounting</w:t>
             </w:r>
           </w:p>
           <w:p>
             <w:pPr>
-              <w:spacing w:after="100"/>
+              <w:spacing w:after="80"/>
               <w:jc w:val="center"/>
             </w:pPr>
-            <w:hyperlink w:history="1" r:id="rIdtkpf5twfoeyhiaenhhmyq">
+            <w:hyperlink w:history="1" r:id="rIdvmaspmerkyn-ji2z2f4i8">
               <w:r>
                 <w:rPr>
                   <w:rStyle w:val="Hyperlink"/>
                   <w:rFonts w:ascii="Calibri" w:cs="Calibri" w:eastAsia="Calibri" w:hAnsi="Calibri"/>
                   <w:color w:val="E87722"/>
-                  <w:sz w:val="18"/>
-                  <w:szCs w:val="18"/>
+                  <w:sz w:val="12"/>
+                  <w:szCs w:val="12"/>
                 </w:rPr>
                 <w:t xml:space="preserve">allinoneaccounting.com</w:t>
               </w:r>
             </w:hyperlink>
           </w:p>
         </w:tc>
-      </w:tr>
-    </w:tbl>
-    <w:p>
-      <w:pPr>
-        <w:spacing w:after="120"/>
-      </w:pPr>
-      <w:r>
-        <w:t xml:space="preserve"/>
-      </w:r>
-    </w:p>
-    <w:tbl>
-      <w:tblPr>
-        <w:tblW w:type="dxa" w:w="10080"/>
-        <w:tblBorders>
-          <w:top w:val="single" w:color="auto" w:sz="4"/>
-          <w:left w:val="single" w:color="auto" w:sz="4"/>
-          <w:bottom w:val="single" w:color="auto" w:sz="4"/>
-          <w:right w:val="single" w:color="auto" w:sz="4"/>
-          <w:insideH w:val="single" w:color="auto" w:sz="4"/>
-          <w:insideV w:val="single" w:color="auto" w:sz="4"/>
-        </w:tblBorders>
-      </w:tblPr>
-      <w:tblGrid>
-        <w:gridCol w:w="5040"/>
-        <w:gridCol w:w="5040"/>
-      </w:tblGrid>
-      <w:tr>
-        <w:trPr>
-          <w:cantSplit/>
-        </w:trPr>
-        <w:tc>
-          <w:tcPr>
-            <w:tcW w:type="dxa" w:w="5040"/>
+        <w:tc>
+          <w:tcPr>
+            <w:tcW w:type="dxa" w:w="2520"/>
             <w:tcBorders>
               <w:top w:val="single" w:color="C9D2DE" w:sz="4"/>
               <w:left w:val="single" w:color="C9D2DE" w:sz="4"/>
@@ -10480,22 +10486,22 @@
             </w:tcBorders>
             <w:shd w:fill="FFFFFF" w:val="clear"/>
             <w:tcMar>
-              <w:top w:type="dxa" w:w="200"/>
-              <w:left w:type="dxa" w:w="200"/>
-              <w:bottom w:type="dxa" w:w="200"/>
-              <w:right w:type="dxa" w:w="200"/>
+              <w:top w:type="dxa" w:w="100"/>
+              <w:left w:type="dxa" w:w="160"/>
+              <w:bottom w:type="dxa" w:w="100"/>
+              <w:right w:type="dxa" w:w="160"/>
             </w:tcMar>
             <w:vAlign w:val="center"/>
           </w:tcPr>
           <w:p>
             <w:pPr>
-              <w:spacing w:after="100"/>
+              <w:spacing w:after="80"/>
               <w:jc w:val="center"/>
             </w:pPr>
             <w:r>
               <w:drawing>
                 <wp:inline distT="0" distB="0" distL="0" distR="0">
-                  <wp:extent cx="1905000" cy="857250"/>
+                  <wp:extent cx="1295400" cy="200025"/>
                   <wp:effectExtent t="0" r="0" b="0" l="0"/>
                   <wp:docPr id="1" name="img" descr="image" title="chiefaiofficer.png"/>
                   <wp:cNvGraphicFramePr>
@@ -10520,7 +10526,7 @@
                         <pic:spPr bwMode="auto">
                           <a:xfrm>
                             <a:off x="0" y="0"/>
-                            <a:ext cx="1905000" cy="857250"/>
+                            <a:ext cx="1295400" cy="200025"/>
                           </a:xfrm>
                           <a:prstGeom prst="rect">
                             <a:avLst/>
@@ -10535,7 +10541,7 @@
           </w:p>
           <w:p>
             <w:pPr>
-              <w:spacing w:after="40"/>
+              <w:spacing w:after="30"/>
               <w:jc w:val="center"/>
             </w:pPr>
             <w:r>
@@ -10544,25 +10550,25 @@
                 <w:b/>
                 <w:bCs/>
                 <w:color w:val="0B1F3A"/>
-                <w:sz w:val="22"/>
-                <w:szCs w:val="22"/>
+                <w:sz w:val="16"/>
+                <w:szCs w:val="16"/>
               </w:rPr>
               <w:t xml:space="preserve">Chief AI Officer</w:t>
             </w:r>
           </w:p>
           <w:p>
             <w:pPr>
-              <w:spacing w:after="100"/>
+              <w:spacing w:after="80"/>
               <w:jc w:val="center"/>
             </w:pPr>
-            <w:hyperlink w:history="1" r:id="rIdbzjyjhq_r2hvbiznkvi1o">
+            <w:hyperlink w:history="1" r:id="rId8mhfqqbroqmv7licjwlg5">
               <w:r>
                 <w:rPr>
                   <w:rStyle w:val="Hyperlink"/>
                   <w:rFonts w:ascii="Calibri" w:cs="Calibri" w:eastAsia="Calibri" w:hAnsi="Calibri"/>
                   <w:color w:val="E87722"/>
-                  <w:sz w:val="18"/>
-                  <w:szCs w:val="18"/>
+                  <w:sz w:val="12"/>
+                  <w:szCs w:val="12"/>
                 </w:rPr>
                 <w:t xml:space="preserve">chiefaiofficer.com</w:t>
               </w:r>
@@ -10571,7 +10577,7 @@
         </w:tc>
         <w:tc>
           <w:tcPr>
-            <w:tcW w:type="dxa" w:w="5040"/>
+            <w:tcW w:type="dxa" w:w="2520"/>
             <w:tcBorders>
               <w:top w:val="single" w:color="C9D2DE" w:sz="4"/>
               <w:left w:val="single" w:color="C9D2DE" w:sz="4"/>
@@ -10580,22 +10586,22 @@
             </w:tcBorders>
             <w:shd w:fill="FFFFFF" w:val="clear"/>
             <w:tcMar>
-              <w:top w:type="dxa" w:w="200"/>
-              <w:left w:type="dxa" w:w="200"/>
-              <w:bottom w:type="dxa" w:w="200"/>
-              <w:right w:type="dxa" w:w="200"/>
+              <w:top w:type="dxa" w:w="100"/>
+              <w:left w:type="dxa" w:w="160"/>
+              <w:bottom w:type="dxa" w:w="100"/>
+              <w:right w:type="dxa" w:w="160"/>
             </w:tcMar>
             <w:vAlign w:val="center"/>
           </w:tcPr>
           <w:p>
             <w:pPr>
-              <w:spacing w:after="100"/>
+              <w:spacing w:after="80"/>
               <w:jc w:val="center"/>
             </w:pPr>
             <w:r>
               <w:drawing>
                 <wp:inline distT="0" distB="0" distL="0" distR="0">
-                  <wp:extent cx="1905000" cy="857250"/>
+                  <wp:extent cx="1295400" cy="609600"/>
                   <wp:effectExtent t="0" r="0" b="0" l="0"/>
                   <wp:docPr id="1" name="img" descr="image" title="hoopshr.png"/>
                   <wp:cNvGraphicFramePr>
@@ -10620,7 +10626,7 @@
                         <pic:spPr bwMode="auto">
                           <a:xfrm>
                             <a:off x="0" y="0"/>
-                            <a:ext cx="1905000" cy="857250"/>
+                            <a:ext cx="1295400" cy="609600"/>
                           </a:xfrm>
                           <a:prstGeom prst="rect">
                             <a:avLst/>
@@ -10635,7 +10641,7 @@
           </w:p>
           <w:p>
             <w:pPr>
-              <w:spacing w:after="40"/>
+              <w:spacing w:after="30"/>
               <w:jc w:val="center"/>
             </w:pPr>
             <w:r>
@@ -10644,25 +10650,25 @@
                 <w:b/>
                 <w:bCs/>
                 <w:color w:val="0B1F3A"/>
-                <w:sz w:val="22"/>
-                <w:szCs w:val="22"/>
+                <w:sz w:val="16"/>
+                <w:szCs w:val="16"/>
               </w:rPr>
               <w:t xml:space="preserve">Hoops HR</w:t>
             </w:r>
           </w:p>
           <w:p>
             <w:pPr>
-              <w:spacing w:after="100"/>
+              <w:spacing w:after="80"/>
               <w:jc w:val="center"/>
             </w:pPr>
-            <w:hyperlink w:history="1" r:id="rIdsb5qcazoyxkevrhybdbhb">
+            <w:hyperlink w:history="1" r:id="rIdfcj_ehecestuie4b3ip09">
               <w:r>
                 <w:rPr>
                   <w:rStyle w:val="Hyperlink"/>
                   <w:rFonts w:ascii="Calibri" w:cs="Calibri" w:eastAsia="Calibri" w:hAnsi="Calibri"/>
                   <w:color w:val="E87722"/>
-                  <w:sz w:val="18"/>
-                  <w:szCs w:val="18"/>
+                  <w:sz w:val="12"/>
+                  <w:szCs w:val="12"/>
                 </w:rPr>
                 <w:t xml:space="preserve">hoopshr.com</w:t>
               </w:r>
@@ -10673,7 +10679,7 @@
     </w:tbl>
     <w:p>
       <w:pPr>
-        <w:spacing w:after="120"/>
+        <w:spacing w:after="100"/>
       </w:pPr>
       <w:r>
         <w:t xml:space="preserve"/>
@@ -10692,8 +10698,10 @@
         </w:tblBorders>
       </w:tblPr>
       <w:tblGrid>
-        <w:gridCol w:w="5040"/>
-        <w:gridCol w:w="5040"/>
+        <w:gridCol w:w="2520"/>
+        <w:gridCol w:w="2520"/>
+        <w:gridCol w:w="2520"/>
+        <w:gridCol w:w="2520"/>
       </w:tblGrid>
       <w:tr>
         <w:trPr>
@@ -10701,7 +10709,7 @@
         </w:trPr>
         <w:tc>
           <w:tcPr>
-            <w:tcW w:type="dxa" w:w="5040"/>
+            <w:tcW w:type="dxa" w:w="2520"/>
             <w:tcBorders>
               <w:top w:val="single" w:color="C9D2DE" w:sz="4"/>
               <w:left w:val="single" w:color="C9D2DE" w:sz="4"/>
@@ -10710,22 +10718,22 @@
             </w:tcBorders>
             <w:shd w:fill="FFFFFF" w:val="clear"/>
             <w:tcMar>
-              <w:top w:type="dxa" w:w="200"/>
-              <w:left w:type="dxa" w:w="200"/>
-              <w:bottom w:type="dxa" w:w="200"/>
-              <w:right w:type="dxa" w:w="200"/>
+              <w:top w:type="dxa" w:w="100"/>
+              <w:left w:type="dxa" w:w="160"/>
+              <w:bottom w:type="dxa" w:w="100"/>
+              <w:right w:type="dxa" w:w="160"/>
             </w:tcMar>
             <w:vAlign w:val="center"/>
           </w:tcPr>
           <w:p>
             <w:pPr>
-              <w:spacing w:after="100"/>
+              <w:spacing w:after="80"/>
               <w:jc w:val="center"/>
             </w:pPr>
             <w:r>
               <w:drawing>
                 <wp:inline distT="0" distB="0" distL="0" distR="0">
-                  <wp:extent cx="1905000" cy="857250"/>
+                  <wp:extent cx="1295400" cy="219075"/>
                   <wp:effectExtent t="0" r="0" b="0" l="0"/>
                   <wp:docPr id="1" name="img" descr="image" title="readyforthenextlevel.png"/>
                   <wp:cNvGraphicFramePr>
@@ -10750,7 +10758,7 @@
                         <pic:spPr bwMode="auto">
                           <a:xfrm>
                             <a:off x="0" y="0"/>
-                            <a:ext cx="1905000" cy="857250"/>
+                            <a:ext cx="1295400" cy="219075"/>
                           </a:xfrm>
                           <a:prstGeom prst="rect">
                             <a:avLst/>
@@ -10765,7 +10773,7 @@
           </w:p>
           <w:p>
             <w:pPr>
-              <w:spacing w:after="40"/>
+              <w:spacing w:after="30"/>
               <w:jc w:val="center"/>
             </w:pPr>
             <w:r>
@@ -10774,25 +10782,25 @@
                 <w:b/>
                 <w:bCs/>
                 <w:color w:val="0B1F3A"/>
-                <w:sz w:val="22"/>
-                <w:szCs w:val="22"/>
+                <w:sz w:val="16"/>
+                <w:szCs w:val="16"/>
               </w:rPr>
               <w:t xml:space="preserve">Next Level Revenue</w:t>
             </w:r>
           </w:p>
           <w:p>
             <w:pPr>
-              <w:spacing w:after="100"/>
+              <w:spacing w:after="80"/>
               <w:jc w:val="center"/>
             </w:pPr>
-            <w:hyperlink w:history="1" r:id="rIdpldzz21kbgiobrx2dkydn">
+            <w:hyperlink w:history="1" r:id="rIdvi_i4a4csh-avoihub8ss">
               <w:r>
                 <w:rPr>
                   <w:rStyle w:val="Hyperlink"/>
                   <w:rFonts w:ascii="Calibri" w:cs="Calibri" w:eastAsia="Calibri" w:hAnsi="Calibri"/>
                   <w:color w:val="E87722"/>
-                  <w:sz w:val="18"/>
-                  <w:szCs w:val="18"/>
+                  <w:sz w:val="12"/>
+                  <w:szCs w:val="12"/>
                 </w:rPr>
                 <w:t xml:space="preserve">readyforthenextlevel.com</w:t>
               </w:r>
@@ -10801,7 +10809,7 @@
         </w:tc>
         <w:tc>
           <w:tcPr>
-            <w:tcW w:type="dxa" w:w="5040"/>
+            <w:tcW w:type="dxa" w:w="2520"/>
             <w:tcBorders>
               <w:top w:val="single" w:color="C9D2DE" w:sz="4"/>
               <w:left w:val="single" w:color="C9D2DE" w:sz="4"/>
@@ -10810,22 +10818,22 @@
             </w:tcBorders>
             <w:shd w:fill="FFFFFF" w:val="clear"/>
             <w:tcMar>
-              <w:top w:type="dxa" w:w="200"/>
-              <w:left w:type="dxa" w:w="200"/>
-              <w:bottom w:type="dxa" w:w="200"/>
-              <w:right w:type="dxa" w:w="200"/>
+              <w:top w:type="dxa" w:w="100"/>
+              <w:left w:type="dxa" w:w="160"/>
+              <w:bottom w:type="dxa" w:w="100"/>
+              <w:right w:type="dxa" w:w="160"/>
             </w:tcMar>
             <w:vAlign w:val="center"/>
           </w:tcPr>
           <w:p>
             <w:pPr>
-              <w:spacing w:after="100"/>
+              <w:spacing w:after="80"/>
               <w:jc w:val="center"/>
             </w:pPr>
             <w:r>
               <w:drawing>
                 <wp:inline distT="0" distB="0" distL="0" distR="0">
-                  <wp:extent cx="1905000" cy="857250"/>
+                  <wp:extent cx="1295400" cy="257175"/>
                   <wp:effectExtent t="0" r="0" b="0" l="0"/>
                   <wp:docPr id="1" name="img" descr="image" title="profitworks.png"/>
                   <wp:cNvGraphicFramePr>
@@ -10850,7 +10858,7 @@
                         <pic:spPr bwMode="auto">
                           <a:xfrm>
                             <a:off x="0" y="0"/>
-                            <a:ext cx="1905000" cy="857250"/>
+                            <a:ext cx="1295400" cy="257175"/>
                           </a:xfrm>
                           <a:prstGeom prst="rect">
                             <a:avLst/>
@@ -10865,7 +10873,7 @@
           </w:p>
           <w:p>
             <w:pPr>
-              <w:spacing w:after="40"/>
+              <w:spacing w:after="30"/>
               <w:jc w:val="center"/>
             </w:pPr>
             <w:r>
@@ -10874,64 +10882,34 @@
                 <w:b/>
                 <w:bCs/>
                 <w:color w:val="0B1F3A"/>
-                <w:sz w:val="22"/>
-                <w:szCs w:val="22"/>
+                <w:sz w:val="16"/>
+                <w:szCs w:val="16"/>
               </w:rPr>
               <w:t xml:space="preserve">Profit Works</w:t>
             </w:r>
           </w:p>
           <w:p>
             <w:pPr>
-              <w:spacing w:after="100"/>
+              <w:spacing w:after="80"/>
               <w:jc w:val="center"/>
             </w:pPr>
-            <w:hyperlink w:history="1" r:id="rId3zbdjnhwjsmh0irfzr8yv">
+            <w:hyperlink w:history="1" r:id="rId51cht2pl7py2qa1mg2vnd">
               <w:r>
                 <w:rPr>
                   <w:rStyle w:val="Hyperlink"/>
                   <w:rFonts w:ascii="Calibri" w:cs="Calibri" w:eastAsia="Calibri" w:hAnsi="Calibri"/>
                   <w:color w:val="E87722"/>
-                  <w:sz w:val="18"/>
-                  <w:szCs w:val="18"/>
+                  <w:sz w:val="12"/>
+                  <w:szCs w:val="12"/>
                 </w:rPr>
                 <w:t xml:space="preserve">profitworksllc.com</w:t>
               </w:r>
             </w:hyperlink>
           </w:p>
         </w:tc>
-      </w:tr>
-    </w:tbl>
-    <w:p>
-      <w:pPr>
-        <w:spacing w:after="120"/>
-      </w:pPr>
-      <w:r>
-        <w:t xml:space="preserve"/>
-      </w:r>
-    </w:p>
-    <w:tbl>
-      <w:tblPr>
-        <w:tblW w:type="dxa" w:w="10080"/>
-        <w:tblBorders>
-          <w:top w:val="single" w:color="auto" w:sz="4"/>
-          <w:left w:val="single" w:color="auto" w:sz="4"/>
-          <w:bottom w:val="single" w:color="auto" w:sz="4"/>
-          <w:right w:val="single" w:color="auto" w:sz="4"/>
-          <w:insideH w:val="single" w:color="auto" w:sz="4"/>
-          <w:insideV w:val="single" w:color="auto" w:sz="4"/>
-        </w:tblBorders>
-      </w:tblPr>
-      <w:tblGrid>
-        <w:gridCol w:w="5040"/>
-        <w:gridCol w:w="5040"/>
-      </w:tblGrid>
-      <w:tr>
-        <w:trPr>
-          <w:cantSplit/>
-        </w:trPr>
-        <w:tc>
-          <w:tcPr>
-            <w:tcW w:type="dxa" w:w="5040"/>
+        <w:tc>
+          <w:tcPr>
+            <w:tcW w:type="dxa" w:w="2520"/>
             <w:tcBorders>
               <w:top w:val="single" w:color="C9D2DE" w:sz="4"/>
               <w:left w:val="single" w:color="C9D2DE" w:sz="4"/>
@@ -10940,22 +10918,22 @@
             </w:tcBorders>
             <w:shd w:fill="FFFFFF" w:val="clear"/>
             <w:tcMar>
-              <w:top w:type="dxa" w:w="200"/>
-              <w:left w:type="dxa" w:w="200"/>
-              <w:bottom w:type="dxa" w:w="200"/>
-              <w:right w:type="dxa" w:w="200"/>
+              <w:top w:type="dxa" w:w="100"/>
+              <w:left w:type="dxa" w:w="160"/>
+              <w:bottom w:type="dxa" w:w="100"/>
+              <w:right w:type="dxa" w:w="160"/>
             </w:tcMar>
             <w:vAlign w:val="center"/>
           </w:tcPr>
           <w:p>
             <w:pPr>
-              <w:spacing w:after="100"/>
+              <w:spacing w:after="80"/>
               <w:jc w:val="center"/>
             </w:pPr>
             <w:r>
               <w:drawing>
                 <wp:inline distT="0" distB="0" distL="0" distR="0">
-                  <wp:extent cx="1905000" cy="857250"/>
+                  <wp:extent cx="1295400" cy="133350"/>
                   <wp:effectExtent t="0" r="0" b="0" l="0"/>
                   <wp:docPr id="1" name="img" descr="image" title="talentharbor.png"/>
                   <wp:cNvGraphicFramePr>
@@ -10980,7 +10958,7 @@
                         <pic:spPr bwMode="auto">
                           <a:xfrm>
                             <a:off x="0" y="0"/>
-                            <a:ext cx="1905000" cy="857250"/>
+                            <a:ext cx="1295400" cy="133350"/>
                           </a:xfrm>
                           <a:prstGeom prst="rect">
                             <a:avLst/>
@@ -10995,7 +10973,7 @@
           </w:p>
           <w:p>
             <w:pPr>
-              <w:spacing w:after="40"/>
+              <w:spacing w:after="30"/>
               <w:jc w:val="center"/>
             </w:pPr>
             <w:r>
@@ -11004,25 +10982,25 @@
                 <w:b/>
                 <w:bCs/>
                 <w:color w:val="0B1F3A"/>
-                <w:sz w:val="22"/>
-                <w:szCs w:val="22"/>
+                <w:sz w:val="16"/>
+                <w:szCs w:val="16"/>
               </w:rPr>
               <w:t xml:space="preserve">Talent Harbor</w:t>
             </w:r>
           </w:p>
           <w:p>
             <w:pPr>
-              <w:spacing w:after="100"/>
+              <w:spacing w:after="80"/>
               <w:jc w:val="center"/>
             </w:pPr>
-            <w:hyperlink w:history="1" r:id="rId87rwgpp-yh2agjz8aj5sh">
+            <w:hyperlink w:history="1" r:id="rIdcflhmqcyoi673gwgw2f0c">
               <w:r>
                 <w:rPr>
                   <w:rStyle w:val="Hyperlink"/>
                   <w:rFonts w:ascii="Calibri" w:cs="Calibri" w:eastAsia="Calibri" w:hAnsi="Calibri"/>
                   <w:color w:val="E87722"/>
-                  <w:sz w:val="18"/>
-                  <w:szCs w:val="18"/>
+                  <w:sz w:val="12"/>
+                  <w:szCs w:val="12"/>
                 </w:rPr>
                 <w:t xml:space="preserve">talentharbor.com</w:t>
               </w:r>
@@ -11031,7 +11009,7 @@
         </w:tc>
         <w:tc>
           <w:tcPr>
-            <w:tcW w:type="dxa" w:w="5040"/>
+            <w:tcW w:type="dxa" w:w="2520"/>
             <w:tcBorders>
               <w:top w:val="single" w:color="C9D2DE" w:sz="4"/>
               <w:left w:val="single" w:color="C9D2DE" w:sz="4"/>
@@ -11040,22 +11018,22 @@
             </w:tcBorders>
             <w:shd w:fill="FFFFFF" w:val="clear"/>
             <w:tcMar>
-              <w:top w:type="dxa" w:w="200"/>
-              <w:left w:type="dxa" w:w="200"/>
-              <w:bottom w:type="dxa" w:w="200"/>
-              <w:right w:type="dxa" w:w="200"/>
+              <w:top w:type="dxa" w:w="100"/>
+              <w:left w:type="dxa" w:w="160"/>
+              <w:bottom w:type="dxa" w:w="100"/>
+              <w:right w:type="dxa" w:w="160"/>
             </w:tcMar>
             <w:vAlign w:val="center"/>
           </w:tcPr>
           <w:p>
             <w:pPr>
-              <w:spacing w:after="100"/>
+              <w:spacing w:after="80"/>
               <w:jc w:val="center"/>
             </w:pPr>
             <w:r>
               <w:drawing>
                 <wp:inline distT="0" distB="0" distL="0" distR="0">
-                  <wp:extent cx="1905000" cy="857250"/>
+                  <wp:extent cx="1295400" cy="361950"/>
                   <wp:effectExtent t="0" r="0" b="0" l="0"/>
                   <wp:docPr id="1" name="img" descr="image" title="wolfsedgeintegrators.png"/>
                   <wp:cNvGraphicFramePr>
@@ -11080,7 +11058,7 @@
                         <pic:spPr bwMode="auto">
                           <a:xfrm>
                             <a:off x="0" y="0"/>
-                            <a:ext cx="1905000" cy="857250"/>
+                            <a:ext cx="1295400" cy="361950"/>
                           </a:xfrm>
                           <a:prstGeom prst="rect">
                             <a:avLst/>
@@ -11095,7 +11073,7 @@
           </w:p>
           <w:p>
             <w:pPr>
-              <w:spacing w:after="40"/>
+              <w:spacing w:after="30"/>
               <w:jc w:val="center"/>
             </w:pPr>
             <w:r>
@@ -11104,25 +11082,25 @@
                 <w:b/>
                 <w:bCs/>
                 <w:color w:val="0B1F3A"/>
-                <w:sz w:val="22"/>
-                <w:szCs w:val="22"/>
+                <w:sz w:val="16"/>
+                <w:szCs w:val="16"/>
               </w:rPr>
               <w:t xml:space="preserve">Wolf's Edge Integrators</w:t>
             </w:r>
           </w:p>
           <w:p>
             <w:pPr>
-              <w:spacing w:after="100"/>
+              <w:spacing w:after="80"/>
               <w:jc w:val="center"/>
             </w:pPr>
-            <w:hyperlink w:history="1" r:id="rIdkimfbqz6ll6-up8mgop9i">
+            <w:hyperlink w:history="1" r:id="rIdcevzm-her2goyvn_3s1nu">
               <w:r>
                 <w:rPr>
                   <w:rStyle w:val="Hyperlink"/>
                   <w:rFonts w:ascii="Calibri" w:cs="Calibri" w:eastAsia="Calibri" w:hAnsi="Calibri"/>
                   <w:color w:val="E87722"/>
-                  <w:sz w:val="18"/>
-                  <w:szCs w:val="18"/>
+                  <w:sz w:val="12"/>
+                  <w:szCs w:val="12"/>
                 </w:rPr>
                 <w:t xml:space="preserve">wolfsedgeintegrators.com</w:t>
               </w:r>
@@ -11133,7 +11111,7 @@
     </w:tbl>
     <w:p>
       <w:pPr>
-        <w:spacing w:after="120"/>
+        <w:spacing w:after="100"/>
       </w:pPr>
       <w:r>
         <w:t xml:space="preserve"/>
@@ -11141,7 +11119,7 @@
     </w:p>
     <w:p>
       <w:pPr>
-        <w:spacing w:after="200"/>
+        <w:spacing w:after="180"/>
       </w:pPr>
       <w:r>
         <w:t xml:space="preserve"/>
@@ -11415,7 +11393,7 @@
                   </w:r>
                 </w:p>
                 <w:p>
-                  <w:hyperlink w:history="1" r:id="rIdhtngdocmytsy2r04czayl">
+                  <w:hyperlink w:history="1" r:id="rIdg4t6-bwnxipk-xilkhxsw">
                     <w:r>
                       <w:rPr>
                         <w:rStyle w:val="Hyperlink"/>
@@ -11624,7 +11602,7 @@
                   </w:r>
                 </w:p>
                 <w:p>
-                  <w:hyperlink w:history="1" r:id="rIddyww5n243svzvof8_ydbk">
+                  <w:hyperlink w:history="1" r:id="rIdr77n038ldvmfx76ckibbm">
                     <w:r>
                       <w:rPr>
                         <w:rStyle w:val="Hyperlink"/>
@@ -11863,7 +11841,7 @@
                   </w:r>
                 </w:p>
                 <w:p>
-                  <w:hyperlink w:history="1" r:id="rId6fiw0uamjisfujiigv-85">
+                  <w:hyperlink w:history="1" r:id="rIdxkii3zkdpatfwv19j_t67">
                     <w:r>
                       <w:rPr>
                         <w:rStyle w:val="Hyperlink"/>
@@ -12072,7 +12050,7 @@
                   </w:r>
                 </w:p>
                 <w:p>
-                  <w:hyperlink w:history="1" r:id="rIdp0yasgkzviu_v2cxozagt">
+                  <w:hyperlink w:history="1" r:id="rIdny5uilavf5guzf5pkxnfk">
                     <w:r>
                       <w:rPr>
                         <w:rStyle w:val="Hyperlink"/>
@@ -12311,7 +12289,7 @@
                   </w:r>
                 </w:p>
                 <w:p>
-                  <w:hyperlink w:history="1" r:id="rIdvs4osmmx7yxohyuya4r5x">
+                  <w:hyperlink w:history="1" r:id="rIdxesk1scpcqctjtjkmw-ff">
                     <w:r>
                       <w:rPr>
                         <w:rStyle w:val="Hyperlink"/>
@@ -12520,7 +12498,7 @@
                   </w:r>
                 </w:p>
                 <w:p>
-                  <w:hyperlink w:history="1" r:id="rIdu96oxpwhwux280cp5jack">
+                  <w:hyperlink w:history="1" r:id="rIdlgp34bcalsapsnqkvqokk">
                     <w:r>
                       <w:rPr>
                         <w:rStyle w:val="Hyperlink"/>
@@ -12925,7 +12903,7 @@
                   </w:r>
                 </w:p>
                 <w:p>
-                  <w:hyperlink w:history="1" r:id="rIdzm8zyvk4r_yablh3cr8h4">
+                  <w:hyperlink w:history="1" r:id="rId2fvbdtdy2toopgehzm4hc">
                     <w:r>
                       <w:rPr>
                         <w:rStyle w:val="Hyperlink"/>
@@ -13164,7 +13142,7 @@
                   </w:r>
                 </w:p>
                 <w:p>
-                  <w:hyperlink w:history="1" r:id="rIdgiwkftfwg-a6vsppjtkmp">
+                  <w:hyperlink w:history="1" r:id="rId-ntjiukcf55gxn7etkone">
                     <w:r>
                       <w:rPr>
                         <w:rStyle w:val="Hyperlink"/>
@@ -13373,7 +13351,7 @@
                   </w:r>
                 </w:p>
                 <w:p>
-                  <w:hyperlink w:history="1" r:id="rIdljjiyibpx1hqxkeaj2vx1">
+                  <w:hyperlink w:history="1" r:id="rIdswzs3kosmyltwcwbunsbd">
                     <w:r>
                       <w:rPr>
                         <w:rStyle w:val="Hyperlink"/>
@@ -13612,7 +13590,7 @@
                   </w:r>
                 </w:p>
                 <w:p>
-                  <w:hyperlink w:history="1" r:id="rIdogwhanyeityjiufy4ru3z">
+                  <w:hyperlink w:history="1" r:id="rIdf7eipjrjk76ofihbwtxxf">
                     <w:r>
                       <w:rPr>
                         <w:rStyle w:val="Hyperlink"/>
@@ -13821,7 +13799,7 @@
                   </w:r>
                 </w:p>
                 <w:p>
-                  <w:hyperlink w:history="1" r:id="rIdoghjafxz3tqaod2iktuk5">
+                  <w:hyperlink w:history="1" r:id="rIdbxywmtxbswbgcgp2uhrcv">
                     <w:r>
                       <w:rPr>
                         <w:rStyle w:val="Hyperlink"/>
@@ -14060,7 +14038,7 @@
                   </w:r>
                 </w:p>
                 <w:p>
-                  <w:hyperlink w:history="1" r:id="rIdbgwdmdkqehdxrnwfmfnpl">
+                  <w:hyperlink w:history="1" r:id="rIdnusvdd0oh4phw--r4y42w">
                     <w:r>
                       <w:rPr>
                         <w:rStyle w:val="Hyperlink"/>
@@ -14269,7 +14247,7 @@
                   </w:r>
                 </w:p>
                 <w:p>
-                  <w:hyperlink w:history="1" r:id="rIdufcgyzbpn4amrj0ibvyz0">
+                  <w:hyperlink w:history="1" r:id="rIdrlmba7dtwfg-9ugvfvzwp">
                     <w:r>
                       <w:rPr>
                         <w:rStyle w:val="Hyperlink"/>
@@ -14533,7 +14511,7 @@
                   </w:r>
                 </w:p>
                 <w:p>
-                  <w:hyperlink w:history="1" r:id="rIdmbtuecrnkrkb7rwrmigjy">
+                  <w:hyperlink w:history="1" r:id="rIdhg8oyvutfotlijrmsnimc">
                     <w:r>
                       <w:rPr>
                         <w:rStyle w:val="Hyperlink"/>
@@ -14767,7 +14745,7 @@
                   </w:r>
                 </w:p>
                 <w:p>
-                  <w:hyperlink w:history="1" r:id="rId0fwj1gaefv9nmbbo0m9f4">
+                  <w:hyperlink w:history="1" r:id="rIdb8xpiy7xueo0pqgns0qgc">
                     <w:r>
                       <w:rPr>
                         <w:rStyle w:val="Hyperlink"/>
@@ -15006,7 +14984,7 @@
                   </w:r>
                 </w:p>
                 <w:p>
-                  <w:hyperlink w:history="1" r:id="rIdagpi9ilcbtpjymvtcx_lc">
+                  <w:hyperlink w:history="1" r:id="rId_e5mwk8qubh_0sic5unf3">
                     <w:r>
                       <w:rPr>
                         <w:rStyle w:val="Hyperlink"/>
@@ -15215,7 +15193,7 @@
                   </w:r>
                 </w:p>
                 <w:p>
-                  <w:hyperlink w:history="1" r:id="rIdnjywnkzmjezpjopbnva58">
+                  <w:hyperlink w:history="1" r:id="rIdjyi2pgottol7t9mnhnmtc">
                     <w:r>
                       <w:rPr>
                         <w:rStyle w:val="Hyperlink"/>
@@ -15454,7 +15432,7 @@
                   </w:r>
                 </w:p>
                 <w:p>
-                  <w:hyperlink w:history="1" r:id="rIdfe-xf6f3ljbc4oa79r815">
+                  <w:hyperlink w:history="1" r:id="rIdo-zrmu2utk5jw_6piqxfk">
                     <w:r>
                       <w:rPr>
                         <w:rStyle w:val="Hyperlink"/>
@@ -15663,7 +15641,7 @@
                   </w:r>
                 </w:p>
                 <w:p>
-                  <w:hyperlink w:history="1" r:id="rIdi8kdrhpu04buoxptbda62">
+                  <w:hyperlink w:history="1" r:id="rIdn_9lfhxqtyx4f6m2zxgss">
                     <w:r>
                       <w:rPr>
                         <w:rStyle w:val="Hyperlink"/>
@@ -15902,7 +15880,7 @@
                   </w:r>
                 </w:p>
                 <w:p>
-                  <w:hyperlink w:history="1" r:id="rId_e_h7amt2gfckvfkmlrmr">
+                  <w:hyperlink w:history="1" r:id="rIddprnwavx5zws-5ubm2ggl">
                     <w:r>
                       <w:rPr>
                         <w:rStyle w:val="Hyperlink"/>
@@ -16111,7 +16089,7 @@
                   </w:r>
                 </w:p>
                 <w:p>
-                  <w:hyperlink w:history="1" r:id="rIdzqtjfabwldptidnd_vmbx">
+                  <w:hyperlink w:history="1" r:id="rIdw5cwruiyfqswypzejuaq4">
                     <w:r>
                       <w:rPr>
                         <w:rStyle w:val="Hyperlink"/>
@@ -16350,7 +16328,7 @@
                   </w:r>
                 </w:p>
                 <w:p>
-                  <w:hyperlink w:history="1" r:id="rIdibida1eutwiwrvjoperho">
+                  <w:hyperlink w:history="1" r:id="rIda-hbjijkynikx3eusnbhd">
                     <w:r>
                       <w:rPr>
                         <w:rStyle w:val="Hyperlink"/>
@@ -16584,7 +16562,7 @@
                   </w:r>
                 </w:p>
                 <w:p>
-                  <w:hyperlink w:history="1" r:id="rIdwk-akodmd40s3jua4apyi">
+                  <w:hyperlink w:history="1" r:id="rIddm7drqoexwisrgqlqiy-h">
                     <w:r>
                       <w:rPr>
                         <w:rStyle w:val="Hyperlink"/>
@@ -16848,7 +16826,7 @@
                   </w:r>
                 </w:p>
                 <w:p>
-                  <w:hyperlink w:history="1" r:id="rId7f86ahofmgu9-oytreygi">
+                  <w:hyperlink w:history="1" r:id="rId6jcxbooolej-fny4lf67u">
                     <w:r>
                       <w:rPr>
                         <w:rStyle w:val="Hyperlink"/>
@@ -17057,7 +17035,7 @@
                   </w:r>
                 </w:p>
                 <w:p>
-                  <w:hyperlink w:history="1" r:id="rIdwtshwcoqo91kssh2_cveo">
+                  <w:hyperlink w:history="1" r:id="rIdwliphmg0vpvu_1nv8yh2x">
                     <w:r>
                       <w:rPr>
                         <w:rStyle w:val="Hyperlink"/>
@@ -17296,7 +17274,7 @@
                   </w:r>
                 </w:p>
                 <w:p>
-                  <w:hyperlink w:history="1" r:id="rIdda_ddhpft0nj0gc2ijucz">
+                  <w:hyperlink w:history="1" r:id="rId88xojzholurovsity0ow7">
                     <w:r>
                       <w:rPr>
                         <w:rStyle w:val="Hyperlink"/>
@@ -17505,7 +17483,7 @@
                   </w:r>
                 </w:p>
                 <w:p>
-                  <w:hyperlink w:history="1" r:id="rIdompt4dmcql0nayyzxqh9u">
+                  <w:hyperlink w:history="1" r:id="rIdhq3mfxg6yrr3wn33tp6qh">
                     <w:r>
                       <w:rPr>
                         <w:rStyle w:val="Hyperlink"/>
@@ -17744,7 +17722,7 @@
                   </w:r>
                 </w:p>
                 <w:p>
-                  <w:hyperlink w:history="1" r:id="rIdsffy18rh_evyrekwwagdr">
+                  <w:hyperlink w:history="1" r:id="rIdt-hayaqb2azfxzgh4ifll">
                     <w:r>
                       <w:rPr>
                         <w:rStyle w:val="Hyperlink"/>
@@ -17953,7 +17931,7 @@
                   </w:r>
                 </w:p>
                 <w:p>
-                  <w:hyperlink w:history="1" r:id="rIdpth8jjf3v_7q54dh8kvkg">
+                  <w:hyperlink w:history="1" r:id="rIdcwvbxmx8h-pnj7dkv3mun">
                     <w:r>
                       <w:rPr>
                         <w:rStyle w:val="Hyperlink"/>
@@ -18192,7 +18170,7 @@
                   </w:r>
                 </w:p>
                 <w:p>
-                  <w:hyperlink w:history="1" r:id="rIdwsrtdfldw2bb38wara9oy">
+                  <w:hyperlink w:history="1" r:id="rIdtwrlelhrahgvb7q-ohclu">
                     <w:r>
                       <w:rPr>
                         <w:rStyle w:val="Hyperlink"/>
@@ -18401,7 +18379,7 @@
                   </w:r>
                 </w:p>
                 <w:p>
-                  <w:hyperlink w:history="1" r:id="rIdol7bsiwiosahzoxcn1rmi">
+                  <w:hyperlink w:history="1" r:id="rIdjoyrahxuw9i_pxhrhl4wn">
                     <w:r>
                       <w:rPr>
                         <w:rStyle w:val="Hyperlink"/>
@@ -18640,7 +18618,7 @@
                   </w:r>
                 </w:p>
                 <w:p>
-                  <w:hyperlink w:history="1" r:id="rIdwf1djkgdypv12qhsuvzh4">
+                  <w:hyperlink w:history="1" r:id="rIdddbxk7cymsa6151vifutt">
                     <w:r>
                       <w:rPr>
                         <w:rStyle w:val="Hyperlink"/>
@@ -18849,7 +18827,7 @@
                   </w:r>
                 </w:p>
                 <w:p>
-                  <w:hyperlink w:history="1" r:id="rIdn720lnhmzc0ho86istjdf">
+                  <w:hyperlink w:history="1" r:id="rIdbg6pxqiy1rga9u3nvsj0z">
                     <w:r>
                       <w:rPr>
                         <w:rStyle w:val="Hyperlink"/>
@@ -19088,7 +19066,7 @@
                   </w:r>
                 </w:p>
                 <w:p>
-                  <w:hyperlink w:history="1" r:id="rId83ukvpom4jxalu1jdaygf">
+                  <w:hyperlink w:history="1" r:id="rId3zi7cl69g8tkctip1emfd">
                     <w:r>
                       <w:rPr>
                         <w:rStyle w:val="Hyperlink"/>
@@ -19322,7 +19300,7 @@
                   </w:r>
                 </w:p>
                 <w:p>
-                  <w:hyperlink w:history="1" r:id="rIdxaf2ma1eve9znpjt0ei45">
+                  <w:hyperlink w:history="1" r:id="rIdtl5vkzpqp0gjpzg4bbd8t">
                     <w:r>
                       <w:rPr>
                         <w:rStyle w:val="Hyperlink"/>
@@ -19561,7 +19539,7 @@
                   </w:r>
                 </w:p>
                 <w:p>
-                  <w:hyperlink w:history="1" r:id="rId3-7amomc5physlp2nmqcm">
+                  <w:hyperlink w:history="1" r:id="rId5eleocml8czzqxvlvsgim">
                     <w:r>
                       <w:rPr>
                         <w:rStyle w:val="Hyperlink"/>
@@ -19770,7 +19748,7 @@
                   </w:r>
                 </w:p>
                 <w:p>
-                  <w:hyperlink w:history="1" r:id="rIdko2ibokqvzzpajvbnm4ai">
+                  <w:hyperlink w:history="1" r:id="rId9olxgszgapjrw3xxwa1hy">
                     <w:r>
                       <w:rPr>
                         <w:rStyle w:val="Hyperlink"/>
@@ -20009,7 +19987,7 @@
                   </w:r>
                 </w:p>
                 <w:p>
-                  <w:hyperlink w:history="1" r:id="rId51_cffcj-i4dyw5uqsr1p">
+                  <w:hyperlink w:history="1" r:id="rIduzbtq0mb8mn1ofs_bhm7-">
                     <w:r>
                       <w:rPr>
                         <w:rStyle w:val="Hyperlink"/>
@@ -20218,7 +20196,7 @@
                   </w:r>
                 </w:p>
                 <w:p>
-                  <w:hyperlink w:history="1" r:id="rId38evlivwtrdojnmlpb4w6">
+                  <w:hyperlink w:history="1" r:id="rIdkuwzlnh2a7x93wj0uqwzn">
                     <w:r>
                       <w:rPr>
                         <w:rStyle w:val="Hyperlink"/>
@@ -20590,8 +20568,26 @@
       </w:pPr>
     </w:lvl>
   </w:abstractNum>
+  <w:abstractNum w:abstractNumId="2" w15:restartNumberingAfterBreak="0">
+    <w:multiLevelType w:val="hybridMultilevel"/>
+    <w:lvl w:ilvl="0" w15:tentative="1">
+      <w:start w:val="1"/>
+      <w:numFmt w:val="bullet"/>
+      <w:lvlText w:val="•"/>
+      <w:lvlJc w:val="left"/>
+      <w:pPr>
+        <w:ind w:left="720" w:hanging="360"/>
+      </w:pPr>
+    </w:lvl>
+  </w:abstractNum>
   <w:num w:numId="1">
     <w:abstractNumId w:val="1"/>
+    <w:lvlOverride w:ilvl="0">
+      <w:startOverride w:val="1"/>
+    </w:lvlOverride>
+  </w:num>
+  <w:num w:numId="2">
+    <w:abstractNumId w:val="2"/>
     <w:lvlOverride w:ilvl="0">
       <w:startOverride w:val="1"/>
     </w:lvlOverride>

</xml_diff>

<commit_message>
Workbook: content/notes page headers use session title instead of speaker name
</commit_message>
<xml_diff>
--- a/deliverables/workbook/Workbook.docx
+++ b/deliverables/workbook/Workbook.docx
@@ -2016,10 +2016,10 @@
           <w:b/>
           <w:bCs/>
           <w:color w:val="E87722"/>
-          <w:sz w:val="18"/>
-          <w:szCs w:val="18"/>
+          <w:sz w:val="16"/>
+          <w:szCs w:val="16"/>
         </w:rPr>
-        <w:t xml:space="preserve">ANN SHEU · CONTENT</w:t>
+        <w:t xml:space="preserve">GET A GRIP ON YOUR BUSINESS WITH EOS · CONTENT</w:t>
       </w:r>
     </w:p>
     <w:p>
@@ -2066,10 +2066,10 @@
           <w:b/>
           <w:bCs/>
           <w:color w:val="E87722"/>
-          <w:sz w:val="18"/>
-          <w:szCs w:val="18"/>
+          <w:sz w:val="16"/>
+          <w:szCs w:val="16"/>
         </w:rPr>
-        <w:t xml:space="preserve">ANN SHEU · MY NOTES</w:t>
+        <w:t xml:space="preserve">GET A GRIP ON YOUR BUSINESS WITH EOS · MY NOTES</w:t>
       </w:r>
     </w:p>
     <w:p>
@@ -2971,10 +2971,10 @@
           <w:b/>
           <w:bCs/>
           <w:color w:val="E87722"/>
-          <w:sz w:val="18"/>
-          <w:szCs w:val="18"/>
+          <w:sz w:val="16"/>
+          <w:szCs w:val="16"/>
         </w:rPr>
-        <w:t xml:space="preserve">STRETY · CONTENT</w:t>
+        <w:t xml:space="preserve">JOURNEY WITH AN EOS IMPLEMENTER · CONTENT</w:t>
       </w:r>
     </w:p>
     <w:p>
@@ -3021,10 +3021,10 @@
           <w:b/>
           <w:bCs/>
           <w:color w:val="E87722"/>
-          <w:sz w:val="18"/>
-          <w:szCs w:val="18"/>
+          <w:sz w:val="16"/>
+          <w:szCs w:val="16"/>
         </w:rPr>
-        <w:t xml:space="preserve">STRETY · MY NOTES</w:t>
+        <w:t xml:space="preserve">JOURNEY WITH AN EOS IMPLEMENTER · MY NOTES</w:t>
       </w:r>
     </w:p>
     <w:p>
@@ -3926,10 +3926,10 @@
           <w:b/>
           <w:bCs/>
           <w:color w:val="E87722"/>
-          <w:sz w:val="18"/>
-          <w:szCs w:val="18"/>
+          <w:sz w:val="16"/>
+          <w:szCs w:val="16"/>
         </w:rPr>
-        <w:t xml:space="preserve">THE SYSTEM OF SELLING · CONTENT</w:t>
+        <w:t xml:space="preserve">YOUR SALES TEAM ISN’T THE PROBLEM. YOUR SYSTEM IS. · CONTENT</w:t>
       </w:r>
     </w:p>
     <w:p>
@@ -3976,10 +3976,10 @@
           <w:b/>
           <w:bCs/>
           <w:color w:val="E87722"/>
-          <w:sz w:val="18"/>
-          <w:szCs w:val="18"/>
+          <w:sz w:val="16"/>
+          <w:szCs w:val="16"/>
         </w:rPr>
-        <w:t xml:space="preserve">THE SYSTEM OF SELLING · MY NOTES</w:t>
+        <w:t xml:space="preserve">YOUR SALES TEAM ISN’T THE PROBLEM. YOUR SYSTEM IS. · MY NOTES</w:t>
       </w:r>
     </w:p>
     <w:p>
@@ -4898,10 +4898,10 @@
           <w:b/>
           <w:bCs/>
           <w:color w:val="E87722"/>
-          <w:sz w:val="18"/>
-          <w:szCs w:val="18"/>
+          <w:sz w:val="16"/>
+          <w:szCs w:val="16"/>
         </w:rPr>
-        <w:t xml:space="preserve">WALT BROWN · CONTENT</w:t>
+        <w:t xml:space="preserve">LUNCH WITH WALT BROWN: HEALTHY MATTERS · CONTENT</w:t>
       </w:r>
     </w:p>
     <w:p>
@@ -4948,10 +4948,10 @@
           <w:b/>
           <w:bCs/>
           <w:color w:val="E87722"/>
-          <w:sz w:val="18"/>
-          <w:szCs w:val="18"/>
+          <w:sz w:val="16"/>
+          <w:szCs w:val="16"/>
         </w:rPr>
-        <w:t xml:space="preserve">WALT BROWN · MY NOTES</w:t>
+        <w:t xml:space="preserve">LUNCH WITH WALT BROWN: HEALTHY MATTERS · MY NOTES</w:t>
       </w:r>
     </w:p>
     <w:p>
@@ -5853,10 +5853,10 @@
           <w:b/>
           <w:bCs/>
           <w:color w:val="E87722"/>
-          <w:sz w:val="18"/>
-          <w:szCs w:val="18"/>
+          <w:sz w:val="16"/>
+          <w:szCs w:val="16"/>
         </w:rPr>
-        <w:t xml:space="preserve">MARK STANLEY · CONTENT</w:t>
+        <w:t xml:space="preserve">PROFIT POWER: STRONGER — OR JUST BIGGER? · CONTENT</w:t>
       </w:r>
     </w:p>
     <w:p>
@@ -5903,10 +5903,10 @@
           <w:b/>
           <w:bCs/>
           <w:color w:val="E87722"/>
-          <w:sz w:val="18"/>
-          <w:szCs w:val="18"/>
+          <w:sz w:val="16"/>
+          <w:szCs w:val="16"/>
         </w:rPr>
-        <w:t xml:space="preserve">MARK STANLEY · MY NOTES</w:t>
+        <w:t xml:space="preserve">PROFIT POWER: STRONGER — OR JUST BIGGER? · MY NOTES</w:t>
       </w:r>
     </w:p>
     <w:p>
@@ -6808,10 +6808,10 @@
           <w:b/>
           <w:bCs/>
           <w:color w:val="E87722"/>
-          <w:sz w:val="18"/>
-          <w:szCs w:val="18"/>
+          <w:sz w:val="16"/>
+          <w:szCs w:val="16"/>
         </w:rPr>
-        <w:t xml:space="preserve">BETH FAHEY · CONTENT</w:t>
+        <w:t xml:space="preserve">ROLLOUT, REWORKED: YOUR PLAN FOR RUNNING EOS® COMPANY-WIDE · CONTENT</w:t>
       </w:r>
     </w:p>
     <w:p>
@@ -6858,10 +6858,10 @@
           <w:b/>
           <w:bCs/>
           <w:color w:val="E87722"/>
-          <w:sz w:val="18"/>
-          <w:szCs w:val="18"/>
+          <w:sz w:val="16"/>
+          <w:szCs w:val="16"/>
         </w:rPr>
-        <w:t xml:space="preserve">BETH FAHEY · MY NOTES</w:t>
+        <w:t xml:space="preserve">ROLLOUT, REWORKED: YOUR PLAN FOR RUNNING EOS® COMPANY-WIDE · MY NOTES</w:t>
       </w:r>
     </w:p>
     <w:p>
@@ -7763,10 +7763,10 @@
           <w:b/>
           <w:bCs/>
           <w:color w:val="E87722"/>
-          <w:sz w:val="18"/>
-          <w:szCs w:val="18"/>
+          <w:sz w:val="16"/>
+          <w:szCs w:val="16"/>
         </w:rPr>
-        <w:t xml:space="preserve">MARK C. WINTERS · CONTENT</w:t>
+        <w:t xml:space="preserve">THE 10 PILLARS OF VISIONARY GREATNESS · CONTENT</w:t>
       </w:r>
     </w:p>
     <w:p>
@@ -7813,10 +7813,10 @@
           <w:b/>
           <w:bCs/>
           <w:color w:val="E87722"/>
-          <w:sz w:val="18"/>
-          <w:szCs w:val="18"/>
+          <w:sz w:val="16"/>
+          <w:szCs w:val="16"/>
         </w:rPr>
-        <w:t xml:space="preserve">MARK C. WINTERS · MY NOTES</w:t>
+        <w:t xml:space="preserve">THE 10 PILLARS OF VISIONARY GREATNESS · MY NOTES</w:t>
       </w:r>
     </w:p>
     <w:p>
@@ -9257,7 +9257,7 @@
               <w:spacing w:after="80"/>
               <w:jc w:val="center"/>
             </w:pPr>
-            <w:hyperlink w:history="1" r:id="rIdoidva2roex5ivfb09prdn">
+            <w:hyperlink w:history="1" r:id="rId6fgic5a8cv4ynmwz7v7lo">
               <w:r>
                 <w:rPr>
                   <w:rStyle w:val="Hyperlink"/>
@@ -9386,7 +9386,7 @@
               <w:spacing w:after="80"/>
               <w:jc w:val="center"/>
             </w:pPr>
-            <w:hyperlink w:history="1" r:id="rId7nnwf2ijrxgslgjwtdwpr">
+            <w:hyperlink w:history="1" r:id="rIdqh2lnimq3v4o--akilqni">
               <w:r>
                 <w:rPr>
                   <w:rStyle w:val="Hyperlink"/>
@@ -9541,7 +9541,7 @@
               <w:spacing w:after="80"/>
               <w:jc w:val="center"/>
             </w:pPr>
-            <w:hyperlink w:history="1" r:id="rId5jz6itw7g89qpjw8uzkx2">
+            <w:hyperlink w:history="1" r:id="rId8h0hmmmrycbco2ffvczar">
               <w:r>
                 <w:rPr>
                   <w:rStyle w:val="Hyperlink"/>
@@ -9641,7 +9641,7 @@
               <w:spacing w:after="80"/>
               <w:jc w:val="center"/>
             </w:pPr>
-            <w:hyperlink w:history="1" r:id="rIdkckhwdln4fs2hal86vxyb">
+            <w:hyperlink w:history="1" r:id="rId7fyt1uhyqj7cii-rtopcy">
               <w:r>
                 <w:rPr>
                   <w:rStyle w:val="Hyperlink"/>
@@ -9795,7 +9795,7 @@
               <w:spacing w:after="80"/>
               <w:jc w:val="center"/>
             </w:pPr>
-            <w:hyperlink w:history="1" r:id="rIdkekyv_dcauh_tfztoxakr">
+            <w:hyperlink w:history="1" r:id="rIdaajumzhjor6zsemsscs19">
               <w:r>
                 <w:rPr>
                   <w:rStyle w:val="Hyperlink"/>
@@ -9949,7 +9949,7 @@
               <w:spacing w:after="80"/>
               <w:jc w:val="center"/>
             </w:pPr>
-            <w:hyperlink w:history="1" r:id="rIdsx8j9z5ljc6optv0qgse8">
+            <w:hyperlink w:history="1" r:id="rIdpdaurhbedjnyj8vx9jp-r">
               <w:r>
                 <w:rPr>
                   <w:rStyle w:val="Hyperlink"/>
@@ -10104,7 +10104,7 @@
               <w:spacing w:after="80"/>
               <w:jc w:val="center"/>
             </w:pPr>
-            <w:hyperlink w:history="1" r:id="rIdbowjeiwklcig5earcebpc">
+            <w:hyperlink w:history="1" r:id="rIdnouqh-z4nsslefzppncm7">
               <w:r>
                 <w:rPr>
                   <w:rStyle w:val="Hyperlink"/>
@@ -10204,7 +10204,7 @@
               <w:spacing w:after="80"/>
               <w:jc w:val="center"/>
             </w:pPr>
-            <w:hyperlink w:history="1" r:id="rIdqghstrwnmoe0mpmbh0cx0">
+            <w:hyperlink w:history="1" r:id="rIdl4ce_reumsev_3n_ezurg">
               <w:r>
                 <w:rPr>
                   <w:rStyle w:val="Hyperlink"/>
@@ -10361,7 +10361,7 @@
               <w:spacing w:after="80"/>
               <w:jc w:val="center"/>
             </w:pPr>
-            <w:hyperlink w:history="1" r:id="rId3byiilio6djcc48rnub3i">
+            <w:hyperlink w:history="1" r:id="rIdwyrgmoly551exnj5m9pe3">
               <w:r>
                 <w:rPr>
                   <w:rStyle w:val="Hyperlink"/>
@@ -10461,7 +10461,7 @@
               <w:spacing w:after="80"/>
               <w:jc w:val="center"/>
             </w:pPr>
-            <w:hyperlink w:history="1" r:id="rIdvmaspmerkyn-ji2z2f4i8">
+            <w:hyperlink w:history="1" r:id="rIdn8ikz17e8zhz2w59fwfqu">
               <w:r>
                 <w:rPr>
                   <w:rStyle w:val="Hyperlink"/>
@@ -10561,7 +10561,7 @@
               <w:spacing w:after="80"/>
               <w:jc w:val="center"/>
             </w:pPr>
-            <w:hyperlink w:history="1" r:id="rId8mhfqqbroqmv7licjwlg5">
+            <w:hyperlink w:history="1" r:id="rIdpuxvvrirvrh-xso7zfpfz">
               <w:r>
                 <w:rPr>
                   <w:rStyle w:val="Hyperlink"/>
@@ -10661,7 +10661,7 @@
               <w:spacing w:after="80"/>
               <w:jc w:val="center"/>
             </w:pPr>
-            <w:hyperlink w:history="1" r:id="rIdfcj_ehecestuie4b3ip09">
+            <w:hyperlink w:history="1" r:id="rIdajdzrwpbvnchitovdnqrb">
               <w:r>
                 <w:rPr>
                   <w:rStyle w:val="Hyperlink"/>
@@ -10793,7 +10793,7 @@
               <w:spacing w:after="80"/>
               <w:jc w:val="center"/>
             </w:pPr>
-            <w:hyperlink w:history="1" r:id="rIdvi_i4a4csh-avoihub8ss">
+            <w:hyperlink w:history="1" r:id="rId0l2zgtpsivw4sdqo5gtmi">
               <w:r>
                 <w:rPr>
                   <w:rStyle w:val="Hyperlink"/>
@@ -10893,7 +10893,7 @@
               <w:spacing w:after="80"/>
               <w:jc w:val="center"/>
             </w:pPr>
-            <w:hyperlink w:history="1" r:id="rId51cht2pl7py2qa1mg2vnd">
+            <w:hyperlink w:history="1" r:id="rIdukyudokt6mh_thusc30hs">
               <w:r>
                 <w:rPr>
                   <w:rStyle w:val="Hyperlink"/>
@@ -10993,7 +10993,7 @@
               <w:spacing w:after="80"/>
               <w:jc w:val="center"/>
             </w:pPr>
-            <w:hyperlink w:history="1" r:id="rIdcflhmqcyoi673gwgw2f0c">
+            <w:hyperlink w:history="1" r:id="rIdshkw9kgftplq9kezr_3et">
               <w:r>
                 <w:rPr>
                   <w:rStyle w:val="Hyperlink"/>
@@ -11093,7 +11093,7 @@
               <w:spacing w:after="80"/>
               <w:jc w:val="center"/>
             </w:pPr>
-            <w:hyperlink w:history="1" r:id="rIdcevzm-her2goyvn_3s1nu">
+            <w:hyperlink w:history="1" r:id="rIdfze7zimcjmax_5eonc4z0">
               <w:r>
                 <w:rPr>
                   <w:rStyle w:val="Hyperlink"/>
@@ -11393,7 +11393,7 @@
                   </w:r>
                 </w:p>
                 <w:p>
-                  <w:hyperlink w:history="1" r:id="rIdg4t6-bwnxipk-xilkhxsw">
+                  <w:hyperlink w:history="1" r:id="rId1nhs5yu5l66jglm5lxybc">
                     <w:r>
                       <w:rPr>
                         <w:rStyle w:val="Hyperlink"/>
@@ -11602,7 +11602,7 @@
                   </w:r>
                 </w:p>
                 <w:p>
-                  <w:hyperlink w:history="1" r:id="rIdr77n038ldvmfx76ckibbm">
+                  <w:hyperlink w:history="1" r:id="rIdi70ifdgfia9mzyk2yhh_l">
                     <w:r>
                       <w:rPr>
                         <w:rStyle w:val="Hyperlink"/>
@@ -11841,7 +11841,7 @@
                   </w:r>
                 </w:p>
                 <w:p>
-                  <w:hyperlink w:history="1" r:id="rIdxkii3zkdpatfwv19j_t67">
+                  <w:hyperlink w:history="1" r:id="rIdn7dcrenzmiktkyalrvff3">
                     <w:r>
                       <w:rPr>
                         <w:rStyle w:val="Hyperlink"/>
@@ -12050,7 +12050,7 @@
                   </w:r>
                 </w:p>
                 <w:p>
-                  <w:hyperlink w:history="1" r:id="rIdny5uilavf5guzf5pkxnfk">
+                  <w:hyperlink w:history="1" r:id="rIdhslza_cvbsfob3pkgnnrs">
                     <w:r>
                       <w:rPr>
                         <w:rStyle w:val="Hyperlink"/>
@@ -12289,7 +12289,7 @@
                   </w:r>
                 </w:p>
                 <w:p>
-                  <w:hyperlink w:history="1" r:id="rIdxesk1scpcqctjtjkmw-ff">
+                  <w:hyperlink w:history="1" r:id="rIdqw2-wxkpko-ffvm_9aehr">
                     <w:r>
                       <w:rPr>
                         <w:rStyle w:val="Hyperlink"/>
@@ -12498,7 +12498,7 @@
                   </w:r>
                 </w:p>
                 <w:p>
-                  <w:hyperlink w:history="1" r:id="rIdlgp34bcalsapsnqkvqokk">
+                  <w:hyperlink w:history="1" r:id="rIdwebx53zdjeid50wpfuipv">
                     <w:r>
                       <w:rPr>
                         <w:rStyle w:val="Hyperlink"/>
@@ -12903,7 +12903,7 @@
                   </w:r>
                 </w:p>
                 <w:p>
-                  <w:hyperlink w:history="1" r:id="rId2fvbdtdy2toopgehzm4hc">
+                  <w:hyperlink w:history="1" r:id="rIdenm0sbwq87zyc4kwoplsg">
                     <w:r>
                       <w:rPr>
                         <w:rStyle w:val="Hyperlink"/>
@@ -13142,7 +13142,7 @@
                   </w:r>
                 </w:p>
                 <w:p>
-                  <w:hyperlink w:history="1" r:id="rId-ntjiukcf55gxn7etkone">
+                  <w:hyperlink w:history="1" r:id="rIdjxi8s7mlz0tjjemm7qyzw">
                     <w:r>
                       <w:rPr>
                         <w:rStyle w:val="Hyperlink"/>
@@ -13351,7 +13351,7 @@
                   </w:r>
                 </w:p>
                 <w:p>
-                  <w:hyperlink w:history="1" r:id="rIdswzs3kosmyltwcwbunsbd">
+                  <w:hyperlink w:history="1" r:id="rIdsqah7f2wp8h6xb1e2zwaq">
                     <w:r>
                       <w:rPr>
                         <w:rStyle w:val="Hyperlink"/>
@@ -13590,7 +13590,7 @@
                   </w:r>
                 </w:p>
                 <w:p>
-                  <w:hyperlink w:history="1" r:id="rIdf7eipjrjk76ofihbwtxxf">
+                  <w:hyperlink w:history="1" r:id="rIdsd58slocj-us4jwtpri46">
                     <w:r>
                       <w:rPr>
                         <w:rStyle w:val="Hyperlink"/>
@@ -13799,7 +13799,7 @@
                   </w:r>
                 </w:p>
                 <w:p>
-                  <w:hyperlink w:history="1" r:id="rIdbxywmtxbswbgcgp2uhrcv">
+                  <w:hyperlink w:history="1" r:id="rIdrvocvyd5zrbltlhain5np">
                     <w:r>
                       <w:rPr>
                         <w:rStyle w:val="Hyperlink"/>
@@ -14038,7 +14038,7 @@
                   </w:r>
                 </w:p>
                 <w:p>
-                  <w:hyperlink w:history="1" r:id="rIdnusvdd0oh4phw--r4y42w">
+                  <w:hyperlink w:history="1" r:id="rIdylbt7jiefeadr0vhczcvc">
                     <w:r>
                       <w:rPr>
                         <w:rStyle w:val="Hyperlink"/>
@@ -14247,7 +14247,7 @@
                   </w:r>
                 </w:p>
                 <w:p>
-                  <w:hyperlink w:history="1" r:id="rIdrlmba7dtwfg-9ugvfvzwp">
+                  <w:hyperlink w:history="1" r:id="rId4t2ix4hirhdf2czrms_9r">
                     <w:r>
                       <w:rPr>
                         <w:rStyle w:val="Hyperlink"/>
@@ -14511,7 +14511,7 @@
                   </w:r>
                 </w:p>
                 <w:p>
-                  <w:hyperlink w:history="1" r:id="rIdhg8oyvutfotlijrmsnimc">
+                  <w:hyperlink w:history="1" r:id="rIdcda-8y1z7nsnphgwem_zq">
                     <w:r>
                       <w:rPr>
                         <w:rStyle w:val="Hyperlink"/>
@@ -14745,7 +14745,7 @@
                   </w:r>
                 </w:p>
                 <w:p>
-                  <w:hyperlink w:history="1" r:id="rIdb8xpiy7xueo0pqgns0qgc">
+                  <w:hyperlink w:history="1" r:id="rId-jdqzr5v-akzmahwrrtnm">
                     <w:r>
                       <w:rPr>
                         <w:rStyle w:val="Hyperlink"/>
@@ -14984,7 +14984,7 @@
                   </w:r>
                 </w:p>
                 <w:p>
-                  <w:hyperlink w:history="1" r:id="rId_e5mwk8qubh_0sic5unf3">
+                  <w:hyperlink w:history="1" r:id="rIdc8rjyszixsazwhzcbjqdr">
                     <w:r>
                       <w:rPr>
                         <w:rStyle w:val="Hyperlink"/>
@@ -15193,7 +15193,7 @@
                   </w:r>
                 </w:p>
                 <w:p>
-                  <w:hyperlink w:history="1" r:id="rIdjyi2pgottol7t9mnhnmtc">
+                  <w:hyperlink w:history="1" r:id="rIdvawmeloqbxp8sjvsvjker">
                     <w:r>
                       <w:rPr>
                         <w:rStyle w:val="Hyperlink"/>
@@ -15432,7 +15432,7 @@
                   </w:r>
                 </w:p>
                 <w:p>
-                  <w:hyperlink w:history="1" r:id="rIdo-zrmu2utk5jw_6piqxfk">
+                  <w:hyperlink w:history="1" r:id="rIdulfmtqfj76s4mhlrk_cpo">
                     <w:r>
                       <w:rPr>
                         <w:rStyle w:val="Hyperlink"/>
@@ -15641,7 +15641,7 @@
                   </w:r>
                 </w:p>
                 <w:p>
-                  <w:hyperlink w:history="1" r:id="rIdn_9lfhxqtyx4f6m2zxgss">
+                  <w:hyperlink w:history="1" r:id="rIdb7xrkz1qqcfrapjc4syjy">
                     <w:r>
                       <w:rPr>
                         <w:rStyle w:val="Hyperlink"/>
@@ -15880,7 +15880,7 @@
                   </w:r>
                 </w:p>
                 <w:p>
-                  <w:hyperlink w:history="1" r:id="rIddprnwavx5zws-5ubm2ggl">
+                  <w:hyperlink w:history="1" r:id="rIdb_iawqk550gmj0tm5rjjr">
                     <w:r>
                       <w:rPr>
                         <w:rStyle w:val="Hyperlink"/>
@@ -16089,7 +16089,7 @@
                   </w:r>
                 </w:p>
                 <w:p>
-                  <w:hyperlink w:history="1" r:id="rIdw5cwruiyfqswypzejuaq4">
+                  <w:hyperlink w:history="1" r:id="rIdj6ix7ni5vxvkckvxc9-zd">
                     <w:r>
                       <w:rPr>
                         <w:rStyle w:val="Hyperlink"/>
@@ -16328,7 +16328,7 @@
                   </w:r>
                 </w:p>
                 <w:p>
-                  <w:hyperlink w:history="1" r:id="rIda-hbjijkynikx3eusnbhd">
+                  <w:hyperlink w:history="1" r:id="rIdgrzqcpwbicfxz79m76zug">
                     <w:r>
                       <w:rPr>
                         <w:rStyle w:val="Hyperlink"/>
@@ -16562,7 +16562,7 @@
                   </w:r>
                 </w:p>
                 <w:p>
-                  <w:hyperlink w:history="1" r:id="rIddm7drqoexwisrgqlqiy-h">
+                  <w:hyperlink w:history="1" r:id="rIdbxwqovd7kw-a-ib-ljfds">
                     <w:r>
                       <w:rPr>
                         <w:rStyle w:val="Hyperlink"/>
@@ -16826,7 +16826,7 @@
                   </w:r>
                 </w:p>
                 <w:p>
-                  <w:hyperlink w:history="1" r:id="rId6jcxbooolej-fny4lf67u">
+                  <w:hyperlink w:history="1" r:id="rIddbtjz3txtovrpsunvn7zt">
                     <w:r>
                       <w:rPr>
                         <w:rStyle w:val="Hyperlink"/>
@@ -17035,7 +17035,7 @@
                   </w:r>
                 </w:p>
                 <w:p>
-                  <w:hyperlink w:history="1" r:id="rIdwliphmg0vpvu_1nv8yh2x">
+                  <w:hyperlink w:history="1" r:id="rIdjfpglgne0btdzn1xbpqp8">
                     <w:r>
                       <w:rPr>
                         <w:rStyle w:val="Hyperlink"/>
@@ -17274,7 +17274,7 @@
                   </w:r>
                 </w:p>
                 <w:p>
-                  <w:hyperlink w:history="1" r:id="rId88xojzholurovsity0ow7">
+                  <w:hyperlink w:history="1" r:id="rIdyyxqqoyyineclqe4-klwd">
                     <w:r>
                       <w:rPr>
                         <w:rStyle w:val="Hyperlink"/>
@@ -17483,7 +17483,7 @@
                   </w:r>
                 </w:p>
                 <w:p>
-                  <w:hyperlink w:history="1" r:id="rIdhq3mfxg6yrr3wn33tp6qh">
+                  <w:hyperlink w:history="1" r:id="rIdkzolgn_nf5ydjmdjj2689">
                     <w:r>
                       <w:rPr>
                         <w:rStyle w:val="Hyperlink"/>
@@ -17722,7 +17722,7 @@
                   </w:r>
                 </w:p>
                 <w:p>
-                  <w:hyperlink w:history="1" r:id="rIdt-hayaqb2azfxzgh4ifll">
+                  <w:hyperlink w:history="1" r:id="rIddcvveivl52wiqsmxh4iuj">
                     <w:r>
                       <w:rPr>
                         <w:rStyle w:val="Hyperlink"/>
@@ -17931,7 +17931,7 @@
                   </w:r>
                 </w:p>
                 <w:p>
-                  <w:hyperlink w:history="1" r:id="rIdcwvbxmx8h-pnj7dkv3mun">
+                  <w:hyperlink w:history="1" r:id="rId9kb5vdoeqc53rungzjteb">
                     <w:r>
                       <w:rPr>
                         <w:rStyle w:val="Hyperlink"/>
@@ -18170,7 +18170,7 @@
                   </w:r>
                 </w:p>
                 <w:p>
-                  <w:hyperlink w:history="1" r:id="rIdtwrlelhrahgvb7q-ohclu">
+                  <w:hyperlink w:history="1" r:id="rIdal2z_wr-tyuo9g2p1hsjy">
                     <w:r>
                       <w:rPr>
                         <w:rStyle w:val="Hyperlink"/>
@@ -18379,7 +18379,7 @@
                   </w:r>
                 </w:p>
                 <w:p>
-                  <w:hyperlink w:history="1" r:id="rIdjoyrahxuw9i_pxhrhl4wn">
+                  <w:hyperlink w:history="1" r:id="rIdcmdqn7wshisa0xm3oufrd">
                     <w:r>
                       <w:rPr>
                         <w:rStyle w:val="Hyperlink"/>
@@ -18618,7 +18618,7 @@
                   </w:r>
                 </w:p>
                 <w:p>
-                  <w:hyperlink w:history="1" r:id="rIdddbxk7cymsa6151vifutt">
+                  <w:hyperlink w:history="1" r:id="rIda9infxjzrfnsdl8gk9_g1">
                     <w:r>
                       <w:rPr>
                         <w:rStyle w:val="Hyperlink"/>
@@ -18827,7 +18827,7 @@
                   </w:r>
                 </w:p>
                 <w:p>
-                  <w:hyperlink w:history="1" r:id="rIdbg6pxqiy1rga9u3nvsj0z">
+                  <w:hyperlink w:history="1" r:id="rIdrnuo_mnh-yl8t1ggz7p71">
                     <w:r>
                       <w:rPr>
                         <w:rStyle w:val="Hyperlink"/>
@@ -19066,7 +19066,7 @@
                   </w:r>
                 </w:p>
                 <w:p>
-                  <w:hyperlink w:history="1" r:id="rId3zi7cl69g8tkctip1emfd">
+                  <w:hyperlink w:history="1" r:id="rIdlqsg8tmzxw4xtbccslymz">
                     <w:r>
                       <w:rPr>
                         <w:rStyle w:val="Hyperlink"/>
@@ -19300,7 +19300,7 @@
                   </w:r>
                 </w:p>
                 <w:p>
-                  <w:hyperlink w:history="1" r:id="rIdtl5vkzpqp0gjpzg4bbd8t">
+                  <w:hyperlink w:history="1" r:id="rIdgew3kwxmod2rx8fak7ozx">
                     <w:r>
                       <w:rPr>
                         <w:rStyle w:val="Hyperlink"/>
@@ -19539,7 +19539,7 @@
                   </w:r>
                 </w:p>
                 <w:p>
-                  <w:hyperlink w:history="1" r:id="rId5eleocml8czzqxvlvsgim">
+                  <w:hyperlink w:history="1" r:id="rIdbntasdemaqipjbxajugfi">
                     <w:r>
                       <w:rPr>
                         <w:rStyle w:val="Hyperlink"/>
@@ -19748,7 +19748,7 @@
                   </w:r>
                 </w:p>
                 <w:p>
-                  <w:hyperlink w:history="1" r:id="rId9olxgszgapjrw3xxwa1hy">
+                  <w:hyperlink w:history="1" r:id="rIdvtjj6rar0ntjwn5djobhj">
                     <w:r>
                       <w:rPr>
                         <w:rStyle w:val="Hyperlink"/>
@@ -19987,7 +19987,7 @@
                   </w:r>
                 </w:p>
                 <w:p>
-                  <w:hyperlink w:history="1" r:id="rIduzbtq0mb8mn1ofs_bhm7-">
+                  <w:hyperlink w:history="1" r:id="rIdmi7wzrdxo0le7769tmlzq">
                     <w:r>
                       <w:rPr>
                         <w:rStyle w:val="Hyperlink"/>
@@ -20196,7 +20196,7 @@
                   </w:r>
                 </w:p>
                 <w:p>
-                  <w:hyperlink w:history="1" r:id="rIdkuwzlnh2a7x93wj0uqwzn">
+                  <w:hyperlink w:history="1" r:id="rIdwm8vf4onagrw8ldesy90l">
                     <w:r>
                       <w:rPr>
                         <w:rStyle w:val="Hyperlink"/>

</xml_diff>

<commit_message>
Workbook: fix orphaned sponsor tier headers with keepNext; recalibrate tier sizes to match actual donation prices
</commit_message>
<xml_diff>
--- a/deliverables/workbook/Workbook.docx
+++ b/deliverables/workbook/Workbook.docx
@@ -9138,6 +9138,8 @@
     <w:p>
       <w:pPr>
         <w:pStyle w:val="Heading3"/>
+        <w:keepNext/>
+        <w:keepLines/>
         <w:spacing w:after="80" w:before="160"/>
       </w:pPr>
       <w:r>
@@ -9197,7 +9199,7 @@
             <w:r>
               <w:drawing>
                 <wp:inline distT="0" distB="0" distL="0" distR="0">
-                  <wp:extent cx="5257800" cy="1905000"/>
+                  <wp:extent cx="4733925" cy="1714500"/>
                   <wp:effectExtent t="0" r="0" b="0" l="0"/>
                   <wp:docPr id="1" name="img" descr="image" title="strety.png"/>
                   <wp:cNvGraphicFramePr>
@@ -9222,7 +9224,7 @@
                         <pic:spPr bwMode="auto">
                           <a:xfrm>
                             <a:off x="0" y="0"/>
-                            <a:ext cx="5257800" cy="1905000"/>
+                            <a:ext cx="4733925" cy="1714500"/>
                           </a:xfrm>
                           <a:prstGeom prst="rect">
                             <a:avLst/>
@@ -9257,7 +9259,7 @@
               <w:spacing w:after="80"/>
               <w:jc w:val="center"/>
             </w:pPr>
-            <w:hyperlink w:history="1" r:id="rId6fgic5a8cv4ynmwz7v7lo">
+            <w:hyperlink w:history="1" r:id="rIdcvrikziq_mxc9ykdybwsh">
               <w:r>
                 <w:rPr>
                   <w:rStyle w:val="Hyperlink"/>
@@ -9326,7 +9328,7 @@
             <w:r>
               <w:drawing>
                 <wp:inline distT="0" distB="0" distL="0" distR="0">
-                  <wp:extent cx="5962650" cy="1905000"/>
+                  <wp:extent cx="5362575" cy="1714500"/>
                   <wp:effectExtent t="0" r="0" b="0" l="0"/>
                   <wp:docPr id="1" name="img" descr="image" title="tsos.png"/>
                   <wp:cNvGraphicFramePr>
@@ -9351,7 +9353,7 @@
                         <pic:spPr bwMode="auto">
                           <a:xfrm>
                             <a:off x="0" y="0"/>
-                            <a:ext cx="5962650" cy="1905000"/>
+                            <a:ext cx="5362575" cy="1714500"/>
                           </a:xfrm>
                           <a:prstGeom prst="rect">
                             <a:avLst/>
@@ -9386,7 +9388,7 @@
               <w:spacing w:after="80"/>
               <w:jc w:val="center"/>
             </w:pPr>
-            <w:hyperlink w:history="1" r:id="rIdqh2lnimq3v4o--akilqni">
+            <w:hyperlink w:history="1" r:id="rId1ysthsgvpownph_jvt4q8">
               <w:r>
                 <w:rPr>
                   <w:rStyle w:val="Hyperlink"/>
@@ -9421,6 +9423,8 @@
     <w:p>
       <w:pPr>
         <w:pStyle w:val="Heading3"/>
+        <w:keepNext/>
+        <w:keepLines/>
         <w:spacing w:after="80" w:before="160"/>
       </w:pPr>
       <w:r>
@@ -9541,7 +9545,7 @@
               <w:spacing w:after="80"/>
               <w:jc w:val="center"/>
             </w:pPr>
-            <w:hyperlink w:history="1" r:id="rId8h0hmmmrycbco2ffvczar">
+            <w:hyperlink w:history="1" r:id="rIdqrdr4ryrydyui3upyfqdf">
               <w:r>
                 <w:rPr>
                   <w:rStyle w:val="Hyperlink"/>
@@ -9641,7 +9645,7 @@
               <w:spacing w:after="80"/>
               <w:jc w:val="center"/>
             </w:pPr>
-            <w:hyperlink w:history="1" r:id="rId7fyt1uhyqj7cii-rtopcy">
+            <w:hyperlink w:history="1" r:id="rId9j46c-vj-jvstx9vi48ip">
               <w:r>
                 <w:rPr>
                   <w:rStyle w:val="Hyperlink"/>
@@ -9676,6 +9680,8 @@
     <w:p>
       <w:pPr>
         <w:pStyle w:val="Heading3"/>
+        <w:keepNext/>
+        <w:keepLines/>
         <w:spacing w:after="80" w:before="160"/>
       </w:pPr>
       <w:r>
@@ -9735,7 +9741,7 @@
             <w:r>
               <w:drawing>
                 <wp:inline distT="0" distB="0" distL="0" distR="0">
-                  <wp:extent cx="2667000" cy="1333500"/>
+                  <wp:extent cx="2095500" cy="1047750"/>
                   <wp:effectExtent t="0" r="0" b="0" l="0"/>
                   <wp:docPr id="1" name="img" descr="image" title="ninety.png"/>
                   <wp:cNvGraphicFramePr>
@@ -9760,7 +9766,7 @@
                         <pic:spPr bwMode="auto">
                           <a:xfrm>
                             <a:off x="0" y="0"/>
-                            <a:ext cx="2667000" cy="1333500"/>
+                            <a:ext cx="2095500" cy="1047750"/>
                           </a:xfrm>
                           <a:prstGeom prst="rect">
                             <a:avLst/>
@@ -9795,7 +9801,7 @@
               <w:spacing w:after="80"/>
               <w:jc w:val="center"/>
             </w:pPr>
-            <w:hyperlink w:history="1" r:id="rIdaajumzhjor6zsemsscs19">
+            <w:hyperlink w:history="1" r:id="rIdavgzmp5gajl-yx5lgi1uu">
               <w:r>
                 <w:rPr>
                   <w:rStyle w:val="Hyperlink"/>
@@ -9830,6 +9836,8 @@
     <w:p>
       <w:pPr>
         <w:pStyle w:val="Heading3"/>
+        <w:keepNext/>
+        <w:keepLines/>
         <w:spacing w:after="80" w:before="160"/>
       </w:pPr>
       <w:r>
@@ -9889,7 +9897,7 @@
             <w:r>
               <w:drawing>
                 <wp:inline distT="0" distB="0" distL="0" distR="0">
-                  <wp:extent cx="4591050" cy="1143000"/>
+                  <wp:extent cx="3448050" cy="857250"/>
                   <wp:effectExtent t="0" r="0" b="0" l="0"/>
                   <wp:docPr id="1" name="img" descr="image" title="vsimple.png"/>
                   <wp:cNvGraphicFramePr>
@@ -9914,7 +9922,7 @@
                         <pic:spPr bwMode="auto">
                           <a:xfrm>
                             <a:off x="0" y="0"/>
-                            <a:ext cx="4591050" cy="1143000"/>
+                            <a:ext cx="3448050" cy="857250"/>
                           </a:xfrm>
                           <a:prstGeom prst="rect">
                             <a:avLst/>
@@ -9949,7 +9957,7 @@
               <w:spacing w:after="80"/>
               <w:jc w:val="center"/>
             </w:pPr>
-            <w:hyperlink w:history="1" r:id="rIdpdaurhbedjnyj8vx9jp-r">
+            <w:hyperlink w:history="1" r:id="rIdnivshzi_dq_n-opqratf-">
               <w:r>
                 <w:rPr>
                   <w:rStyle w:val="Hyperlink"/>
@@ -9984,6 +9992,8 @@
     <w:p>
       <w:pPr>
         <w:pStyle w:val="Heading3"/>
+        <w:keepNext/>
+        <w:keepLines/>
         <w:spacing w:after="80" w:before="160"/>
       </w:pPr>
       <w:r>
@@ -10104,7 +10114,7 @@
               <w:spacing w:after="80"/>
               <w:jc w:val="center"/>
             </w:pPr>
-            <w:hyperlink w:history="1" r:id="rIdnouqh-z4nsslefzppncm7">
+            <w:hyperlink w:history="1" r:id="rIds8tgeaagrhjwi8whxgpdz">
               <w:r>
                 <w:rPr>
                   <w:rStyle w:val="Hyperlink"/>
@@ -10204,7 +10214,7 @@
               <w:spacing w:after="80"/>
               <w:jc w:val="center"/>
             </w:pPr>
-            <w:hyperlink w:history="1" r:id="rIdl4ce_reumsev_3n_ezurg">
+            <w:hyperlink w:history="1" r:id="rIdonzr-tjb-c4k4i5o1kjjs">
               <w:r>
                 <w:rPr>
                   <w:rStyle w:val="Hyperlink"/>
@@ -10239,6 +10249,8 @@
     <w:p>
       <w:pPr>
         <w:pStyle w:val="Heading3"/>
+        <w:keepNext/>
+        <w:keepLines/>
         <w:spacing w:after="80" w:before="160"/>
       </w:pPr>
       <w:r>
@@ -10361,7 +10373,7 @@
               <w:spacing w:after="80"/>
               <w:jc w:val="center"/>
             </w:pPr>
-            <w:hyperlink w:history="1" r:id="rIdwyrgmoly551exnj5m9pe3">
+            <w:hyperlink w:history="1" r:id="rIdbjr9fjmlbeulsvpq9gw62">
               <w:r>
                 <w:rPr>
                   <w:rStyle w:val="Hyperlink"/>
@@ -10401,7 +10413,7 @@
             <w:r>
               <w:drawing>
                 <wp:inline distT="0" distB="0" distL="0" distR="0">
-                  <wp:extent cx="1104900" cy="666750"/>
+                  <wp:extent cx="942975" cy="571500"/>
                   <wp:effectExtent t="0" r="0" b="0" l="0"/>
                   <wp:docPr id="1" name="img" descr="image" title="allinoneaccounting.png"/>
                   <wp:cNvGraphicFramePr>
@@ -10426,7 +10438,7 @@
                         <pic:spPr bwMode="auto">
                           <a:xfrm>
                             <a:off x="0" y="0"/>
-                            <a:ext cx="1104900" cy="666750"/>
+                            <a:ext cx="942975" cy="571500"/>
                           </a:xfrm>
                           <a:prstGeom prst="rect">
                             <a:avLst/>
@@ -10461,7 +10473,7 @@
               <w:spacing w:after="80"/>
               <w:jc w:val="center"/>
             </w:pPr>
-            <w:hyperlink w:history="1" r:id="rIdn8ikz17e8zhz2w59fwfqu">
+            <w:hyperlink w:history="1" r:id="rId5a4ankjfhn-lnjmfgddqa">
               <w:r>
                 <w:rPr>
                   <w:rStyle w:val="Hyperlink"/>
@@ -10561,7 +10573,7 @@
               <w:spacing w:after="80"/>
               <w:jc w:val="center"/>
             </w:pPr>
-            <w:hyperlink w:history="1" r:id="rIdpuxvvrirvrh-xso7zfpfz">
+            <w:hyperlink w:history="1" r:id="rId8rymemdk8pxqcrgwcgcxu">
               <w:r>
                 <w:rPr>
                   <w:rStyle w:val="Hyperlink"/>
@@ -10601,7 +10613,7 @@
             <w:r>
               <w:drawing>
                 <wp:inline distT="0" distB="0" distL="0" distR="0">
-                  <wp:extent cx="1295400" cy="609600"/>
+                  <wp:extent cx="1209675" cy="571500"/>
                   <wp:effectExtent t="0" r="0" b="0" l="0"/>
                   <wp:docPr id="1" name="img" descr="image" title="hoopshr.png"/>
                   <wp:cNvGraphicFramePr>
@@ -10626,7 +10638,7 @@
                         <pic:spPr bwMode="auto">
                           <a:xfrm>
                             <a:off x="0" y="0"/>
-                            <a:ext cx="1295400" cy="609600"/>
+                            <a:ext cx="1209675" cy="571500"/>
                           </a:xfrm>
                           <a:prstGeom prst="rect">
                             <a:avLst/>
@@ -10661,7 +10673,7 @@
               <w:spacing w:after="80"/>
               <w:jc w:val="center"/>
             </w:pPr>
-            <w:hyperlink w:history="1" r:id="rIdajdzrwpbvnchitovdnqrb">
+            <w:hyperlink w:history="1" r:id="rIdybqpxwecbksnw0fsqw6gr">
               <w:r>
                 <w:rPr>
                   <w:rStyle w:val="Hyperlink"/>
@@ -10793,7 +10805,7 @@
               <w:spacing w:after="80"/>
               <w:jc w:val="center"/>
             </w:pPr>
-            <w:hyperlink w:history="1" r:id="rId0l2zgtpsivw4sdqo5gtmi">
+            <w:hyperlink w:history="1" r:id="rId5f33ads0ii74vp_l1ps9y">
               <w:r>
                 <w:rPr>
                   <w:rStyle w:val="Hyperlink"/>
@@ -10893,7 +10905,7 @@
               <w:spacing w:after="80"/>
               <w:jc w:val="center"/>
             </w:pPr>
-            <w:hyperlink w:history="1" r:id="rIdukyudokt6mh_thusc30hs">
+            <w:hyperlink w:history="1" r:id="rIdfwdjqbxupqklkkzq8q8kd">
               <w:r>
                 <w:rPr>
                   <w:rStyle w:val="Hyperlink"/>
@@ -10993,7 +11005,7 @@
               <w:spacing w:after="80"/>
               <w:jc w:val="center"/>
             </w:pPr>
-            <w:hyperlink w:history="1" r:id="rIdshkw9kgftplq9kezr_3et">
+            <w:hyperlink w:history="1" r:id="rIdh9rlca3uajzp70xnzwewu">
               <w:r>
                 <w:rPr>
                   <w:rStyle w:val="Hyperlink"/>
@@ -11093,7 +11105,7 @@
               <w:spacing w:after="80"/>
               <w:jc w:val="center"/>
             </w:pPr>
-            <w:hyperlink w:history="1" r:id="rIdfze7zimcjmax_5eonc4z0">
+            <w:hyperlink w:history="1" r:id="rId7-vhoqkjqe5ndwbvga5iz">
               <w:r>
                 <w:rPr>
                   <w:rStyle w:val="Hyperlink"/>
@@ -11393,7 +11405,7 @@
                   </w:r>
                 </w:p>
                 <w:p>
-                  <w:hyperlink w:history="1" r:id="rId1nhs5yu5l66jglm5lxybc">
+                  <w:hyperlink w:history="1" r:id="rIdb4r5gbfit1hzzpbpojezx">
                     <w:r>
                       <w:rPr>
                         <w:rStyle w:val="Hyperlink"/>
@@ -11602,7 +11614,7 @@
                   </w:r>
                 </w:p>
                 <w:p>
-                  <w:hyperlink w:history="1" r:id="rIdi70ifdgfia9mzyk2yhh_l">
+                  <w:hyperlink w:history="1" r:id="rIdmkoir4gasyjjnab07qv69">
                     <w:r>
                       <w:rPr>
                         <w:rStyle w:val="Hyperlink"/>
@@ -11841,7 +11853,7 @@
                   </w:r>
                 </w:p>
                 <w:p>
-                  <w:hyperlink w:history="1" r:id="rIdn7dcrenzmiktkyalrvff3">
+                  <w:hyperlink w:history="1" r:id="rIdxk4jzqahyrkrxa2ocwgss">
                     <w:r>
                       <w:rPr>
                         <w:rStyle w:val="Hyperlink"/>
@@ -12050,7 +12062,7 @@
                   </w:r>
                 </w:p>
                 <w:p>
-                  <w:hyperlink w:history="1" r:id="rIdhslza_cvbsfob3pkgnnrs">
+                  <w:hyperlink w:history="1" r:id="rId7b_ot9r8lkhowy7tugeua">
                     <w:r>
                       <w:rPr>
                         <w:rStyle w:val="Hyperlink"/>
@@ -12289,7 +12301,7 @@
                   </w:r>
                 </w:p>
                 <w:p>
-                  <w:hyperlink w:history="1" r:id="rIdqw2-wxkpko-ffvm_9aehr">
+                  <w:hyperlink w:history="1" r:id="rIdromedkma0sochk6ehuxil">
                     <w:r>
                       <w:rPr>
                         <w:rStyle w:val="Hyperlink"/>
@@ -12498,7 +12510,7 @@
                   </w:r>
                 </w:p>
                 <w:p>
-                  <w:hyperlink w:history="1" r:id="rIdwebx53zdjeid50wpfuipv">
+                  <w:hyperlink w:history="1" r:id="rIdurigijqu--nx07otrrf2h">
                     <w:r>
                       <w:rPr>
                         <w:rStyle w:val="Hyperlink"/>
@@ -12903,7 +12915,7 @@
                   </w:r>
                 </w:p>
                 <w:p>
-                  <w:hyperlink w:history="1" r:id="rIdenm0sbwq87zyc4kwoplsg">
+                  <w:hyperlink w:history="1" r:id="rIddmpx7skpybt78ybzynt4m">
                     <w:r>
                       <w:rPr>
                         <w:rStyle w:val="Hyperlink"/>
@@ -13142,7 +13154,7 @@
                   </w:r>
                 </w:p>
                 <w:p>
-                  <w:hyperlink w:history="1" r:id="rIdjxi8s7mlz0tjjemm7qyzw">
+                  <w:hyperlink w:history="1" r:id="rIdanmz0td6-sbwetebgc-kj">
                     <w:r>
                       <w:rPr>
                         <w:rStyle w:val="Hyperlink"/>
@@ -13351,7 +13363,7 @@
                   </w:r>
                 </w:p>
                 <w:p>
-                  <w:hyperlink w:history="1" r:id="rIdsqah7f2wp8h6xb1e2zwaq">
+                  <w:hyperlink w:history="1" r:id="rId0mac1caw0amsg0yhbb2aw">
                     <w:r>
                       <w:rPr>
                         <w:rStyle w:val="Hyperlink"/>
@@ -13590,7 +13602,7 @@
                   </w:r>
                 </w:p>
                 <w:p>
-                  <w:hyperlink w:history="1" r:id="rIdsd58slocj-us4jwtpri46">
+                  <w:hyperlink w:history="1" r:id="rIdthwshlhurqynkkn81zuhs">
                     <w:r>
                       <w:rPr>
                         <w:rStyle w:val="Hyperlink"/>
@@ -13799,7 +13811,7 @@
                   </w:r>
                 </w:p>
                 <w:p>
-                  <w:hyperlink w:history="1" r:id="rIdrvocvyd5zrbltlhain5np">
+                  <w:hyperlink w:history="1" r:id="rIdleik_b3m5qfzq5gmhpd1n">
                     <w:r>
                       <w:rPr>
                         <w:rStyle w:val="Hyperlink"/>
@@ -14038,7 +14050,7 @@
                   </w:r>
                 </w:p>
                 <w:p>
-                  <w:hyperlink w:history="1" r:id="rIdylbt7jiefeadr0vhczcvc">
+                  <w:hyperlink w:history="1" r:id="rIdctk4zfok1l1zb13vcyvul">
                     <w:r>
                       <w:rPr>
                         <w:rStyle w:val="Hyperlink"/>
@@ -14247,7 +14259,7 @@
                   </w:r>
                 </w:p>
                 <w:p>
-                  <w:hyperlink w:history="1" r:id="rId4t2ix4hirhdf2czrms_9r">
+                  <w:hyperlink w:history="1" r:id="rIdeaq4qyskkvpj4nn_obdxv">
                     <w:r>
                       <w:rPr>
                         <w:rStyle w:val="Hyperlink"/>
@@ -14511,7 +14523,7 @@
                   </w:r>
                 </w:p>
                 <w:p>
-                  <w:hyperlink w:history="1" r:id="rIdcda-8y1z7nsnphgwem_zq">
+                  <w:hyperlink w:history="1" r:id="rId117np4mwe3mhcrlxm3sp9">
                     <w:r>
                       <w:rPr>
                         <w:rStyle w:val="Hyperlink"/>
@@ -14745,7 +14757,7 @@
                   </w:r>
                 </w:p>
                 <w:p>
-                  <w:hyperlink w:history="1" r:id="rId-jdqzr5v-akzmahwrrtnm">
+                  <w:hyperlink w:history="1" r:id="rIdek85qjc5ftgr69qn8my-s">
                     <w:r>
                       <w:rPr>
                         <w:rStyle w:val="Hyperlink"/>
@@ -14984,7 +14996,7 @@
                   </w:r>
                 </w:p>
                 <w:p>
-                  <w:hyperlink w:history="1" r:id="rIdc8rjyszixsazwhzcbjqdr">
+                  <w:hyperlink w:history="1" r:id="rIdkmtzrmbcmffq2byrmjfza">
                     <w:r>
                       <w:rPr>
                         <w:rStyle w:val="Hyperlink"/>
@@ -15193,7 +15205,7 @@
                   </w:r>
                 </w:p>
                 <w:p>
-                  <w:hyperlink w:history="1" r:id="rIdvawmeloqbxp8sjvsvjker">
+                  <w:hyperlink w:history="1" r:id="rIdd6man66pveorlfhwgzsgb">
                     <w:r>
                       <w:rPr>
                         <w:rStyle w:val="Hyperlink"/>
@@ -15432,7 +15444,7 @@
                   </w:r>
                 </w:p>
                 <w:p>
-                  <w:hyperlink w:history="1" r:id="rIdulfmtqfj76s4mhlrk_cpo">
+                  <w:hyperlink w:history="1" r:id="rId0re70twtriqwnvv4rm_mo">
                     <w:r>
                       <w:rPr>
                         <w:rStyle w:val="Hyperlink"/>
@@ -15641,7 +15653,7 @@
                   </w:r>
                 </w:p>
                 <w:p>
-                  <w:hyperlink w:history="1" r:id="rIdb7xrkz1qqcfrapjc4syjy">
+                  <w:hyperlink w:history="1" r:id="rIdsjflildsye0ieu9yvzepo">
                     <w:r>
                       <w:rPr>
                         <w:rStyle w:val="Hyperlink"/>
@@ -15880,7 +15892,7 @@
                   </w:r>
                 </w:p>
                 <w:p>
-                  <w:hyperlink w:history="1" r:id="rIdb_iawqk550gmj0tm5rjjr">
+                  <w:hyperlink w:history="1" r:id="rIdkc9m0fx1ik7tqowrnumdj">
                     <w:r>
                       <w:rPr>
                         <w:rStyle w:val="Hyperlink"/>
@@ -16089,7 +16101,7 @@
                   </w:r>
                 </w:p>
                 <w:p>
-                  <w:hyperlink w:history="1" r:id="rIdj6ix7ni5vxvkckvxc9-zd">
+                  <w:hyperlink w:history="1" r:id="rIdpm629xcikdciqb0jdunum">
                     <w:r>
                       <w:rPr>
                         <w:rStyle w:val="Hyperlink"/>
@@ -16328,7 +16340,7 @@
                   </w:r>
                 </w:p>
                 <w:p>
-                  <w:hyperlink w:history="1" r:id="rIdgrzqcpwbicfxz79m76zug">
+                  <w:hyperlink w:history="1" r:id="rIdu-igub__qavhx7zsnbifu">
                     <w:r>
                       <w:rPr>
                         <w:rStyle w:val="Hyperlink"/>
@@ -16562,7 +16574,7 @@
                   </w:r>
                 </w:p>
                 <w:p>
-                  <w:hyperlink w:history="1" r:id="rIdbxwqovd7kw-a-ib-ljfds">
+                  <w:hyperlink w:history="1" r:id="rId47wyialtf-s5nsctulihc">
                     <w:r>
                       <w:rPr>
                         <w:rStyle w:val="Hyperlink"/>
@@ -16826,7 +16838,7 @@
                   </w:r>
                 </w:p>
                 <w:p>
-                  <w:hyperlink w:history="1" r:id="rIddbtjz3txtovrpsunvn7zt">
+                  <w:hyperlink w:history="1" r:id="rIdwv6tde_bqlxq8p9d3hykn">
                     <w:r>
                       <w:rPr>
                         <w:rStyle w:val="Hyperlink"/>
@@ -17035,7 +17047,7 @@
                   </w:r>
                 </w:p>
                 <w:p>
-                  <w:hyperlink w:history="1" r:id="rIdjfpglgne0btdzn1xbpqp8">
+                  <w:hyperlink w:history="1" r:id="rId042ibckowywnkut4_4uzw">
                     <w:r>
                       <w:rPr>
                         <w:rStyle w:val="Hyperlink"/>
@@ -17274,7 +17286,7 @@
                   </w:r>
                 </w:p>
                 <w:p>
-                  <w:hyperlink w:history="1" r:id="rIdyyxqqoyyineclqe4-klwd">
+                  <w:hyperlink w:history="1" r:id="rIdt7sq6gz5hg_5gci0-rajp">
                     <w:r>
                       <w:rPr>
                         <w:rStyle w:val="Hyperlink"/>
@@ -17483,7 +17495,7 @@
                   </w:r>
                 </w:p>
                 <w:p>
-                  <w:hyperlink w:history="1" r:id="rIdkzolgn_nf5ydjmdjj2689">
+                  <w:hyperlink w:history="1" r:id="rIdz88zwhrxvdmfl12trzugl">
                     <w:r>
                       <w:rPr>
                         <w:rStyle w:val="Hyperlink"/>
@@ -17722,7 +17734,7 @@
                   </w:r>
                 </w:p>
                 <w:p>
-                  <w:hyperlink w:history="1" r:id="rIddcvveivl52wiqsmxh4iuj">
+                  <w:hyperlink w:history="1" r:id="rIdpf7axjhhofdi61gka0071">
                     <w:r>
                       <w:rPr>
                         <w:rStyle w:val="Hyperlink"/>
@@ -17931,7 +17943,7 @@
                   </w:r>
                 </w:p>
                 <w:p>
-                  <w:hyperlink w:history="1" r:id="rId9kb5vdoeqc53rungzjteb">
+                  <w:hyperlink w:history="1" r:id="rIdqeprprm6we4pf6qktswbr">
                     <w:r>
                       <w:rPr>
                         <w:rStyle w:val="Hyperlink"/>
@@ -18170,7 +18182,7 @@
                   </w:r>
                 </w:p>
                 <w:p>
-                  <w:hyperlink w:history="1" r:id="rIdal2z_wr-tyuo9g2p1hsjy">
+                  <w:hyperlink w:history="1" r:id="rIddumoqdwx5ucdunpbxkfyt">
                     <w:r>
                       <w:rPr>
                         <w:rStyle w:val="Hyperlink"/>
@@ -18379,7 +18391,7 @@
                   </w:r>
                 </w:p>
                 <w:p>
-                  <w:hyperlink w:history="1" r:id="rIdcmdqn7wshisa0xm3oufrd">
+                  <w:hyperlink w:history="1" r:id="rIdqqvbvhm8j_fcjniiwtvwa">
                     <w:r>
                       <w:rPr>
                         <w:rStyle w:val="Hyperlink"/>
@@ -18618,7 +18630,7 @@
                   </w:r>
                 </w:p>
                 <w:p>
-                  <w:hyperlink w:history="1" r:id="rIda9infxjzrfnsdl8gk9_g1">
+                  <w:hyperlink w:history="1" r:id="rIdgpsrxfdtp7l3uijxka9tx">
                     <w:r>
                       <w:rPr>
                         <w:rStyle w:val="Hyperlink"/>
@@ -18827,7 +18839,7 @@
                   </w:r>
                 </w:p>
                 <w:p>
-                  <w:hyperlink w:history="1" r:id="rIdrnuo_mnh-yl8t1ggz7p71">
+                  <w:hyperlink w:history="1" r:id="rId6p5awa8jpohmxn_e6ksx3">
                     <w:r>
                       <w:rPr>
                         <w:rStyle w:val="Hyperlink"/>
@@ -19066,7 +19078,7 @@
                   </w:r>
                 </w:p>
                 <w:p>
-                  <w:hyperlink w:history="1" r:id="rIdlqsg8tmzxw4xtbccslymz">
+                  <w:hyperlink w:history="1" r:id="rIdivhpaugf02-xtywsw-dzw">
                     <w:r>
                       <w:rPr>
                         <w:rStyle w:val="Hyperlink"/>
@@ -19300,7 +19312,7 @@
                   </w:r>
                 </w:p>
                 <w:p>
-                  <w:hyperlink w:history="1" r:id="rIdgew3kwxmod2rx8fak7ozx">
+                  <w:hyperlink w:history="1" r:id="rIdgjx9kwa6py2o_2kuxw8ez">
                     <w:r>
                       <w:rPr>
                         <w:rStyle w:val="Hyperlink"/>
@@ -19539,7 +19551,7 @@
                   </w:r>
                 </w:p>
                 <w:p>
-                  <w:hyperlink w:history="1" r:id="rIdbntasdemaqipjbxajugfi">
+                  <w:hyperlink w:history="1" r:id="rIduvpkq7neotfecd5q1fh1u">
                     <w:r>
                       <w:rPr>
                         <w:rStyle w:val="Hyperlink"/>
@@ -19748,7 +19760,7 @@
                   </w:r>
                 </w:p>
                 <w:p>
-                  <w:hyperlink w:history="1" r:id="rIdvtjj6rar0ntjwn5djobhj">
+                  <w:hyperlink w:history="1" r:id="rIdef3xxs4aog9aexdwednns">
                     <w:r>
                       <w:rPr>
                         <w:rStyle w:val="Hyperlink"/>
@@ -19987,7 +19999,7 @@
                   </w:r>
                 </w:p>
                 <w:p>
-                  <w:hyperlink w:history="1" r:id="rIdmi7wzrdxo0le7769tmlzq">
+                  <w:hyperlink w:history="1" r:id="rIdy9tioduvbcluhmjz7wuvl">
                     <w:r>
                       <w:rPr>
                         <w:rStyle w:val="Hyperlink"/>
@@ -20196,7 +20208,7 @@
                   </w:r>
                 </w:p>
                 <w:p>
-                  <w:hyperlink w:history="1" r:id="rIdwm8vf4onagrw8ldesy90l">
+                  <w:hyperlink w:history="1" r:id="rIdxrorne1suxbme8jn6cjeh">
                     <w:r>
                       <w:rPr>
                         <w:rStyle w:val="Hyperlink"/>

</xml_diff>

<commit_message>
Workbook: face-detected EOSI photo crops; recalibrate sponsor tiers to fit on 2 pages
</commit_message>
<xml_diff>
--- a/deliverables/workbook/Workbook.docx
+++ b/deliverables/workbook/Workbook.docx
@@ -9167,7 +9167,8 @@
         </w:tblBorders>
       </w:tblPr>
       <w:tblGrid>
-        <w:gridCol w:w="10080"/>
+        <w:gridCol w:w="5040"/>
+        <w:gridCol w:w="5040"/>
       </w:tblGrid>
       <w:tr>
         <w:trPr>
@@ -9175,7 +9176,7 @@
         </w:trPr>
         <w:tc>
           <w:tcPr>
-            <w:tcW w:type="dxa" w:w="10080"/>
+            <w:tcW w:type="dxa" w:w="5040"/>
             <w:tcBorders>
               <w:top w:val="single" w:color="C9D2DE" w:sz="4"/>
               <w:left w:val="single" w:color="C9D2DE" w:sz="4"/>
@@ -9184,9 +9185,9 @@
             </w:tcBorders>
             <w:shd w:fill="FFFFFF" w:val="clear"/>
             <w:tcMar>
-              <w:top w:type="dxa" w:w="240"/>
+              <w:top w:type="dxa" w:w="180"/>
               <w:left w:type="dxa" w:w="160"/>
-              <w:bottom w:type="dxa" w:w="240"/>
+              <w:bottom w:type="dxa" w:w="180"/>
               <w:right w:type="dxa" w:w="160"/>
             </w:tcMar>
             <w:vAlign w:val="center"/>
@@ -9199,7 +9200,7 @@
             <w:r>
               <w:drawing>
                 <wp:inline distT="0" distB="0" distL="0" distR="0">
-                  <wp:extent cx="4733925" cy="1714500"/>
+                  <wp:extent cx="2895600" cy="1047750"/>
                   <wp:effectExtent t="0" r="0" b="0" l="0"/>
                   <wp:docPr id="1" name="img" descr="image" title="strety.png"/>
                   <wp:cNvGraphicFramePr>
@@ -9224,7 +9225,7 @@
                         <pic:spPr bwMode="auto">
                           <a:xfrm>
                             <a:off x="0" y="0"/>
-                            <a:ext cx="4733925" cy="1714500"/>
+                            <a:ext cx="2895600" cy="1047750"/>
                           </a:xfrm>
                           <a:prstGeom prst="rect">
                             <a:avLst/>
@@ -9259,7 +9260,7 @@
               <w:spacing w:after="80"/>
               <w:jc w:val="center"/>
             </w:pPr>
-            <w:hyperlink w:history="1" r:id="rIdcvrikziq_mxc9ykdybwsh">
+            <w:hyperlink w:history="1" r:id="rIdchzuwkj3gcic1mbkcphtz">
               <w:r>
                 <w:rPr>
                   <w:rStyle w:val="Hyperlink"/>
@@ -9273,38 +9274,9 @@
             </w:hyperlink>
           </w:p>
         </w:tc>
-      </w:tr>
-    </w:tbl>
-    <w:p>
-      <w:pPr>
-        <w:spacing w:after="100"/>
-      </w:pPr>
-      <w:r>
-        <w:t xml:space="preserve"/>
-      </w:r>
-    </w:p>
-    <w:tbl>
-      <w:tblPr>
-        <w:tblW w:type="dxa" w:w="10080"/>
-        <w:tblBorders>
-          <w:top w:val="single" w:color="auto" w:sz="4"/>
-          <w:left w:val="single" w:color="auto" w:sz="4"/>
-          <w:bottom w:val="single" w:color="auto" w:sz="4"/>
-          <w:right w:val="single" w:color="auto" w:sz="4"/>
-          <w:insideH w:val="single" w:color="auto" w:sz="4"/>
-          <w:insideV w:val="single" w:color="auto" w:sz="4"/>
-        </w:tblBorders>
-      </w:tblPr>
-      <w:tblGrid>
-        <w:gridCol w:w="10080"/>
-      </w:tblGrid>
-      <w:tr>
-        <w:trPr>
-          <w:cantSplit/>
-        </w:trPr>
-        <w:tc>
-          <w:tcPr>
-            <w:tcW w:type="dxa" w:w="10080"/>
+        <w:tc>
+          <w:tcPr>
+            <w:tcW w:type="dxa" w:w="5040"/>
             <w:tcBorders>
               <w:top w:val="single" w:color="C9D2DE" w:sz="4"/>
               <w:left w:val="single" w:color="C9D2DE" w:sz="4"/>
@@ -9313,9 +9285,9 @@
             </w:tcBorders>
             <w:shd w:fill="FFFFFF" w:val="clear"/>
             <w:tcMar>
-              <w:top w:type="dxa" w:w="240"/>
+              <w:top w:type="dxa" w:w="180"/>
               <w:left w:type="dxa" w:w="160"/>
-              <w:bottom w:type="dxa" w:w="240"/>
+              <w:bottom w:type="dxa" w:w="180"/>
               <w:right w:type="dxa" w:w="160"/>
             </w:tcMar>
             <w:vAlign w:val="center"/>
@@ -9328,7 +9300,7 @@
             <w:r>
               <w:drawing>
                 <wp:inline distT="0" distB="0" distL="0" distR="0">
-                  <wp:extent cx="5362575" cy="1714500"/>
+                  <wp:extent cx="2895600" cy="923925"/>
                   <wp:effectExtent t="0" r="0" b="0" l="0"/>
                   <wp:docPr id="1" name="img" descr="image" title="tsos.png"/>
                   <wp:cNvGraphicFramePr>
@@ -9353,7 +9325,7 @@
                         <pic:spPr bwMode="auto">
                           <a:xfrm>
                             <a:off x="0" y="0"/>
-                            <a:ext cx="5362575" cy="1714500"/>
+                            <a:ext cx="2895600" cy="923925"/>
                           </a:xfrm>
                           <a:prstGeom prst="rect">
                             <a:avLst/>
@@ -9388,7 +9360,7 @@
               <w:spacing w:after="80"/>
               <w:jc w:val="center"/>
             </w:pPr>
-            <w:hyperlink w:history="1" r:id="rId1ysthsgvpownph_jvt4q8">
+            <w:hyperlink w:history="1" r:id="rIdcxdea_3pklitrzyykbrxe">
               <w:r>
                 <w:rPr>
                   <w:rStyle w:val="Hyperlink"/>
@@ -9470,9 +9442,9 @@
             </w:tcBorders>
             <w:shd w:fill="FFFFFF" w:val="clear"/>
             <w:tcMar>
-              <w:top w:type="dxa" w:w="160"/>
+              <w:top w:type="dxa" w:w="140"/>
               <w:left w:type="dxa" w:w="160"/>
-              <w:bottom w:type="dxa" w:w="160"/>
+              <w:bottom w:type="dxa" w:w="140"/>
               <w:right w:type="dxa" w:w="160"/>
             </w:tcMar>
             <w:vAlign w:val="center"/>
@@ -9545,7 +9517,7 @@
               <w:spacing w:after="80"/>
               <w:jc w:val="center"/>
             </w:pPr>
-            <w:hyperlink w:history="1" r:id="rIdqrdr4ryrydyui3upyfqdf">
+            <w:hyperlink w:history="1" r:id="rIdrmm7ztms8qsqrof5ipiz0">
               <w:r>
                 <w:rPr>
                   <w:rStyle w:val="Hyperlink"/>
@@ -9570,9 +9542,9 @@
             </w:tcBorders>
             <w:shd w:fill="FFFFFF" w:val="clear"/>
             <w:tcMar>
-              <w:top w:type="dxa" w:w="160"/>
+              <w:top w:type="dxa" w:w="140"/>
               <w:left w:type="dxa" w:w="160"/>
-              <w:bottom w:type="dxa" w:w="160"/>
+              <w:bottom w:type="dxa" w:w="140"/>
               <w:right w:type="dxa" w:w="160"/>
             </w:tcMar>
             <w:vAlign w:val="center"/>
@@ -9645,7 +9617,7 @@
               <w:spacing w:after="80"/>
               <w:jc w:val="center"/>
             </w:pPr>
-            <w:hyperlink w:history="1" r:id="rId9j46c-vj-jvstx9vi48ip">
+            <w:hyperlink w:history="1" r:id="rId_olk4xkobtlqkkt4qpuqm">
               <w:r>
                 <w:rPr>
                   <w:rStyle w:val="Hyperlink"/>
@@ -9726,9 +9698,9 @@
             </w:tcBorders>
             <w:shd w:fill="FFFFFF" w:val="clear"/>
             <w:tcMar>
-              <w:top w:type="dxa" w:w="160"/>
+              <w:top w:type="dxa" w:w="140"/>
               <w:left w:type="dxa" w:w="160"/>
-              <w:bottom w:type="dxa" w:w="160"/>
+              <w:bottom w:type="dxa" w:w="140"/>
               <w:right w:type="dxa" w:w="160"/>
             </w:tcMar>
             <w:vAlign w:val="center"/>
@@ -9741,7 +9713,7 @@
             <w:r>
               <w:drawing>
                 <wp:inline distT="0" distB="0" distL="0" distR="0">
-                  <wp:extent cx="2095500" cy="1047750"/>
+                  <wp:extent cx="1905000" cy="952500"/>
                   <wp:effectExtent t="0" r="0" b="0" l="0"/>
                   <wp:docPr id="1" name="img" descr="image" title="ninety.png"/>
                   <wp:cNvGraphicFramePr>
@@ -9766,7 +9738,7 @@
                         <pic:spPr bwMode="auto">
                           <a:xfrm>
                             <a:off x="0" y="0"/>
-                            <a:ext cx="2095500" cy="1047750"/>
+                            <a:ext cx="1905000" cy="952500"/>
                           </a:xfrm>
                           <a:prstGeom prst="rect">
                             <a:avLst/>
@@ -9801,7 +9773,7 @@
               <w:spacing w:after="80"/>
               <w:jc w:val="center"/>
             </w:pPr>
-            <w:hyperlink w:history="1" r:id="rIdavgzmp5gajl-yx5lgi1uu">
+            <w:hyperlink w:history="1" r:id="rId_vpxfmcf5zd6zc1bx6l3o">
               <w:r>
                 <w:rPr>
                   <w:rStyle w:val="Hyperlink"/>
@@ -9882,9 +9854,9 @@
             </w:tcBorders>
             <w:shd w:fill="FFFFFF" w:val="clear"/>
             <w:tcMar>
-              <w:top w:type="dxa" w:w="160"/>
+              <w:top w:type="dxa" w:w="140"/>
               <w:left w:type="dxa" w:w="160"/>
-              <w:bottom w:type="dxa" w:w="160"/>
+              <w:bottom w:type="dxa" w:w="140"/>
               <w:right w:type="dxa" w:w="160"/>
             </w:tcMar>
             <w:vAlign w:val="center"/>
@@ -9897,7 +9869,7 @@
             <w:r>
               <w:drawing>
                 <wp:inline distT="0" distB="0" distL="0" distR="0">
-                  <wp:extent cx="3448050" cy="857250"/>
+                  <wp:extent cx="3057525" cy="762000"/>
                   <wp:effectExtent t="0" r="0" b="0" l="0"/>
                   <wp:docPr id="1" name="img" descr="image" title="vsimple.png"/>
                   <wp:cNvGraphicFramePr>
@@ -9922,7 +9894,7 @@
                         <pic:spPr bwMode="auto">
                           <a:xfrm>
                             <a:off x="0" y="0"/>
-                            <a:ext cx="3448050" cy="857250"/>
+                            <a:ext cx="3057525" cy="762000"/>
                           </a:xfrm>
                           <a:prstGeom prst="rect">
                             <a:avLst/>
@@ -9957,7 +9929,7 @@
               <w:spacing w:after="80"/>
               <w:jc w:val="center"/>
             </w:pPr>
-            <w:hyperlink w:history="1" r:id="rIdnivshzi_dq_n-opqratf-">
+            <w:hyperlink w:history="1" r:id="rIdac_lgehi4scupvu692asy">
               <w:r>
                 <w:rPr>
                   <w:rStyle w:val="Hyperlink"/>
@@ -10039,9 +10011,9 @@
             </w:tcBorders>
             <w:shd w:fill="FFFFFF" w:val="clear"/>
             <w:tcMar>
-              <w:top w:type="dxa" w:w="160"/>
+              <w:top w:type="dxa" w:w="140"/>
               <w:left w:type="dxa" w:w="160"/>
-              <w:bottom w:type="dxa" w:w="160"/>
+              <w:bottom w:type="dxa" w:w="140"/>
               <w:right w:type="dxa" w:w="160"/>
             </w:tcMar>
             <w:vAlign w:val="center"/>
@@ -10054,7 +10026,7 @@
             <w:r>
               <w:drawing>
                 <wp:inline distT="0" distB="0" distL="0" distR="0">
-                  <wp:extent cx="2895600" cy="857250"/>
+                  <wp:extent cx="2571750" cy="762000"/>
                   <wp:effectExtent t="0" r="0" b="0" l="0"/>
                   <wp:docPr id="1" name="img" descr="image" title="strata.png"/>
                   <wp:cNvGraphicFramePr>
@@ -10079,7 +10051,7 @@
                         <pic:spPr bwMode="auto">
                           <a:xfrm>
                             <a:off x="0" y="0"/>
-                            <a:ext cx="2895600" cy="857250"/>
+                            <a:ext cx="2571750" cy="762000"/>
                           </a:xfrm>
                           <a:prstGeom prst="rect">
                             <a:avLst/>
@@ -10114,7 +10086,7 @@
               <w:spacing w:after="80"/>
               <w:jc w:val="center"/>
             </w:pPr>
-            <w:hyperlink w:history="1" r:id="rIds8tgeaagrhjwi8whxgpdz">
+            <w:hyperlink w:history="1" r:id="rIdkj_-gp91amuwwglqkt1et">
               <w:r>
                 <w:rPr>
                   <w:rStyle w:val="Hyperlink"/>
@@ -10139,9 +10111,9 @@
             </w:tcBorders>
             <w:shd w:fill="FFFFFF" w:val="clear"/>
             <w:tcMar>
-              <w:top w:type="dxa" w:w="160"/>
+              <w:top w:type="dxa" w:w="140"/>
               <w:left w:type="dxa" w:w="160"/>
-              <w:bottom w:type="dxa" w:w="160"/>
+              <w:bottom w:type="dxa" w:w="140"/>
               <w:right w:type="dxa" w:w="160"/>
             </w:tcMar>
             <w:vAlign w:val="center"/>
@@ -10214,7 +10186,7 @@
               <w:spacing w:after="80"/>
               <w:jc w:val="center"/>
             </w:pPr>
-            <w:hyperlink w:history="1" r:id="rIdonzr-tjb-c4k4i5o1kjjs">
+            <w:hyperlink w:history="1" r:id="rIdmglfqmhrhktllukc4dmbf">
               <w:r>
                 <w:rPr>
                   <w:rStyle w:val="Hyperlink"/>
@@ -10298,9 +10270,9 @@
             </w:tcBorders>
             <w:shd w:fill="FFFFFF" w:val="clear"/>
             <w:tcMar>
-              <w:top w:type="dxa" w:w="100"/>
+              <w:top w:type="dxa" w:w="80"/>
               <w:left w:type="dxa" w:w="160"/>
-              <w:bottom w:type="dxa" w:w="100"/>
+              <w:bottom w:type="dxa" w:w="80"/>
               <w:right w:type="dxa" w:w="160"/>
             </w:tcMar>
             <w:vAlign w:val="center"/>
@@ -10373,7 +10345,7 @@
               <w:spacing w:after="80"/>
               <w:jc w:val="center"/>
             </w:pPr>
-            <w:hyperlink w:history="1" r:id="rIdbjr9fjmlbeulsvpq9gw62">
+            <w:hyperlink w:history="1" r:id="rIdnakaarllmaurlutkfzhfe">
               <w:r>
                 <w:rPr>
                   <w:rStyle w:val="Hyperlink"/>
@@ -10398,9 +10370,9 @@
             </w:tcBorders>
             <w:shd w:fill="FFFFFF" w:val="clear"/>
             <w:tcMar>
-              <w:top w:type="dxa" w:w="100"/>
+              <w:top w:type="dxa" w:w="80"/>
               <w:left w:type="dxa" w:w="160"/>
-              <w:bottom w:type="dxa" w:w="100"/>
+              <w:bottom w:type="dxa" w:w="80"/>
               <w:right w:type="dxa" w:w="160"/>
             </w:tcMar>
             <w:vAlign w:val="center"/>
@@ -10413,7 +10385,7 @@
             <w:r>
               <w:drawing>
                 <wp:inline distT="0" distB="0" distL="0" distR="0">
-                  <wp:extent cx="942975" cy="571500"/>
+                  <wp:extent cx="866775" cy="523875"/>
                   <wp:effectExtent t="0" r="0" b="0" l="0"/>
                   <wp:docPr id="1" name="img" descr="image" title="allinoneaccounting.png"/>
                   <wp:cNvGraphicFramePr>
@@ -10438,7 +10410,7 @@
                         <pic:spPr bwMode="auto">
                           <a:xfrm>
                             <a:off x="0" y="0"/>
-                            <a:ext cx="942975" cy="571500"/>
+                            <a:ext cx="866775" cy="523875"/>
                           </a:xfrm>
                           <a:prstGeom prst="rect">
                             <a:avLst/>
@@ -10473,7 +10445,7 @@
               <w:spacing w:after="80"/>
               <w:jc w:val="center"/>
             </w:pPr>
-            <w:hyperlink w:history="1" r:id="rId5a4ankjfhn-lnjmfgddqa">
+            <w:hyperlink w:history="1" r:id="rId8qpjou7wisdjt2b2qu8as">
               <w:r>
                 <w:rPr>
                   <w:rStyle w:val="Hyperlink"/>
@@ -10498,9 +10470,9 @@
             </w:tcBorders>
             <w:shd w:fill="FFFFFF" w:val="clear"/>
             <w:tcMar>
-              <w:top w:type="dxa" w:w="100"/>
+              <w:top w:type="dxa" w:w="80"/>
               <w:left w:type="dxa" w:w="160"/>
-              <w:bottom w:type="dxa" w:w="100"/>
+              <w:bottom w:type="dxa" w:w="80"/>
               <w:right w:type="dxa" w:w="160"/>
             </w:tcMar>
             <w:vAlign w:val="center"/>
@@ -10573,7 +10545,7 @@
               <w:spacing w:after="80"/>
               <w:jc w:val="center"/>
             </w:pPr>
-            <w:hyperlink w:history="1" r:id="rId8rymemdk8pxqcrgwcgcxu">
+            <w:hyperlink w:history="1" r:id="rIdfbjgkpj4yb9hhr7ofliuu">
               <w:r>
                 <w:rPr>
                   <w:rStyle w:val="Hyperlink"/>
@@ -10598,9 +10570,9 @@
             </w:tcBorders>
             <w:shd w:fill="FFFFFF" w:val="clear"/>
             <w:tcMar>
-              <w:top w:type="dxa" w:w="100"/>
+              <w:top w:type="dxa" w:w="80"/>
               <w:left w:type="dxa" w:w="160"/>
-              <w:bottom w:type="dxa" w:w="100"/>
+              <w:bottom w:type="dxa" w:w="80"/>
               <w:right w:type="dxa" w:w="160"/>
             </w:tcMar>
             <w:vAlign w:val="center"/>
@@ -10613,7 +10585,7 @@
             <w:r>
               <w:drawing>
                 <wp:inline distT="0" distB="0" distL="0" distR="0">
-                  <wp:extent cx="1209675" cy="571500"/>
+                  <wp:extent cx="1104900" cy="523875"/>
                   <wp:effectExtent t="0" r="0" b="0" l="0"/>
                   <wp:docPr id="1" name="img" descr="image" title="hoopshr.png"/>
                   <wp:cNvGraphicFramePr>
@@ -10638,7 +10610,7 @@
                         <pic:spPr bwMode="auto">
                           <a:xfrm>
                             <a:off x="0" y="0"/>
-                            <a:ext cx="1209675" cy="571500"/>
+                            <a:ext cx="1104900" cy="523875"/>
                           </a:xfrm>
                           <a:prstGeom prst="rect">
                             <a:avLst/>
@@ -10673,7 +10645,7 @@
               <w:spacing w:after="80"/>
               <w:jc w:val="center"/>
             </w:pPr>
-            <w:hyperlink w:history="1" r:id="rIdybqpxwecbksnw0fsqw6gr">
+            <w:hyperlink w:history="1" r:id="rIdy4zc_ahxxpsdz1t1hvvry">
               <w:r>
                 <w:rPr>
                   <w:rStyle w:val="Hyperlink"/>
@@ -10730,9 +10702,9 @@
             </w:tcBorders>
             <w:shd w:fill="FFFFFF" w:val="clear"/>
             <w:tcMar>
-              <w:top w:type="dxa" w:w="100"/>
+              <w:top w:type="dxa" w:w="80"/>
               <w:left w:type="dxa" w:w="160"/>
-              <w:bottom w:type="dxa" w:w="100"/>
+              <w:bottom w:type="dxa" w:w="80"/>
               <w:right w:type="dxa" w:w="160"/>
             </w:tcMar>
             <w:vAlign w:val="center"/>
@@ -10805,7 +10777,7 @@
               <w:spacing w:after="80"/>
               <w:jc w:val="center"/>
             </w:pPr>
-            <w:hyperlink w:history="1" r:id="rId5f33ads0ii74vp_l1ps9y">
+            <w:hyperlink w:history="1" r:id="rIdlhvb1j_hi4xo9egaerkni">
               <w:r>
                 <w:rPr>
                   <w:rStyle w:val="Hyperlink"/>
@@ -10830,9 +10802,9 @@
             </w:tcBorders>
             <w:shd w:fill="FFFFFF" w:val="clear"/>
             <w:tcMar>
-              <w:top w:type="dxa" w:w="100"/>
+              <w:top w:type="dxa" w:w="80"/>
               <w:left w:type="dxa" w:w="160"/>
-              <w:bottom w:type="dxa" w:w="100"/>
+              <w:bottom w:type="dxa" w:w="80"/>
               <w:right w:type="dxa" w:w="160"/>
             </w:tcMar>
             <w:vAlign w:val="center"/>
@@ -10905,7 +10877,7 @@
               <w:spacing w:after="80"/>
               <w:jc w:val="center"/>
             </w:pPr>
-            <w:hyperlink w:history="1" r:id="rIdfwdjqbxupqklkkzq8q8kd">
+            <w:hyperlink w:history="1" r:id="rId2bcnvmeqnta-p1hubb3xc">
               <w:r>
                 <w:rPr>
                   <w:rStyle w:val="Hyperlink"/>
@@ -10930,9 +10902,9 @@
             </w:tcBorders>
             <w:shd w:fill="FFFFFF" w:val="clear"/>
             <w:tcMar>
-              <w:top w:type="dxa" w:w="100"/>
+              <w:top w:type="dxa" w:w="80"/>
               <w:left w:type="dxa" w:w="160"/>
-              <w:bottom w:type="dxa" w:w="100"/>
+              <w:bottom w:type="dxa" w:w="80"/>
               <w:right w:type="dxa" w:w="160"/>
             </w:tcMar>
             <w:vAlign w:val="center"/>
@@ -11005,7 +10977,7 @@
               <w:spacing w:after="80"/>
               <w:jc w:val="center"/>
             </w:pPr>
-            <w:hyperlink w:history="1" r:id="rIdh9rlca3uajzp70xnzwewu">
+            <w:hyperlink w:history="1" r:id="rIdh_qrub84gfhf0yak9z5xc">
               <w:r>
                 <w:rPr>
                   <w:rStyle w:val="Hyperlink"/>
@@ -11030,9 +11002,9 @@
             </w:tcBorders>
             <w:shd w:fill="FFFFFF" w:val="clear"/>
             <w:tcMar>
-              <w:top w:type="dxa" w:w="100"/>
+              <w:top w:type="dxa" w:w="80"/>
               <w:left w:type="dxa" w:w="160"/>
-              <w:bottom w:type="dxa" w:w="100"/>
+              <w:bottom w:type="dxa" w:w="80"/>
               <w:right w:type="dxa" w:w="160"/>
             </w:tcMar>
             <w:vAlign w:val="center"/>
@@ -11105,7 +11077,7 @@
               <w:spacing w:after="80"/>
               <w:jc w:val="center"/>
             </w:pPr>
-            <w:hyperlink w:history="1" r:id="rId7-vhoqkjqe5ndwbvga5iz">
+            <w:hyperlink w:history="1" r:id="rIdyjgjbb6-od7dwdh3tjatc">
               <w:r>
                 <w:rPr>
                   <w:rStyle w:val="Hyperlink"/>
@@ -11405,7 +11377,7 @@
                   </w:r>
                 </w:p>
                 <w:p>
-                  <w:hyperlink w:history="1" r:id="rIdb4r5gbfit1hzzpbpojezx">
+                  <w:hyperlink w:history="1" r:id="rIdz9c4_d8ueoewvnissyzas">
                     <w:r>
                       <w:rPr>
                         <w:rStyle w:val="Hyperlink"/>
@@ -11614,7 +11586,7 @@
                   </w:r>
                 </w:p>
                 <w:p>
-                  <w:hyperlink w:history="1" r:id="rIdmkoir4gasyjjnab07qv69">
+                  <w:hyperlink w:history="1" r:id="rIdigm3vyvdaljfsh6jpsaqx">
                     <w:r>
                       <w:rPr>
                         <w:rStyle w:val="Hyperlink"/>
@@ -11853,7 +11825,7 @@
                   </w:r>
                 </w:p>
                 <w:p>
-                  <w:hyperlink w:history="1" r:id="rIdxk4jzqahyrkrxa2ocwgss">
+                  <w:hyperlink w:history="1" r:id="rIdealxaj9uq_dalntpul9vs">
                     <w:r>
                       <w:rPr>
                         <w:rStyle w:val="Hyperlink"/>
@@ -12062,7 +12034,7 @@
                   </w:r>
                 </w:p>
                 <w:p>
-                  <w:hyperlink w:history="1" r:id="rId7b_ot9r8lkhowy7tugeua">
+                  <w:hyperlink w:history="1" r:id="rIda5jnme9owzczt4oma6ajj">
                     <w:r>
                       <w:rPr>
                         <w:rStyle w:val="Hyperlink"/>
@@ -12301,7 +12273,7 @@
                   </w:r>
                 </w:p>
                 <w:p>
-                  <w:hyperlink w:history="1" r:id="rIdromedkma0sochk6ehuxil">
+                  <w:hyperlink w:history="1" r:id="rIdhrc0dkp0o3war9relf_hs">
                     <w:r>
                       <w:rPr>
                         <w:rStyle w:val="Hyperlink"/>
@@ -12510,7 +12482,7 @@
                   </w:r>
                 </w:p>
                 <w:p>
-                  <w:hyperlink w:history="1" r:id="rIdurigijqu--nx07otrrf2h">
+                  <w:hyperlink w:history="1" r:id="rIdtkdnyj1gv8mmeky4p24sj">
                     <w:r>
                       <w:rPr>
                         <w:rStyle w:val="Hyperlink"/>
@@ -12915,7 +12887,7 @@
                   </w:r>
                 </w:p>
                 <w:p>
-                  <w:hyperlink w:history="1" r:id="rIddmpx7skpybt78ybzynt4m">
+                  <w:hyperlink w:history="1" r:id="rIdecofepmy2jhdjtc_sr10c">
                     <w:r>
                       <w:rPr>
                         <w:rStyle w:val="Hyperlink"/>
@@ -13154,7 +13126,7 @@
                   </w:r>
                 </w:p>
                 <w:p>
-                  <w:hyperlink w:history="1" r:id="rIdanmz0td6-sbwetebgc-kj">
+                  <w:hyperlink w:history="1" r:id="rId5bnvseikvqmsr3fle3lau">
                     <w:r>
                       <w:rPr>
                         <w:rStyle w:val="Hyperlink"/>
@@ -13363,7 +13335,7 @@
                   </w:r>
                 </w:p>
                 <w:p>
-                  <w:hyperlink w:history="1" r:id="rId0mac1caw0amsg0yhbb2aw">
+                  <w:hyperlink w:history="1" r:id="rIdczej4nlgvsmgerb0z6ozx">
                     <w:r>
                       <w:rPr>
                         <w:rStyle w:val="Hyperlink"/>
@@ -13602,7 +13574,7 @@
                   </w:r>
                 </w:p>
                 <w:p>
-                  <w:hyperlink w:history="1" r:id="rIdthwshlhurqynkkn81zuhs">
+                  <w:hyperlink w:history="1" r:id="rIdu5ijopglcyz2amntb4jnb">
                     <w:r>
                       <w:rPr>
                         <w:rStyle w:val="Hyperlink"/>
@@ -13811,7 +13783,7 @@
                   </w:r>
                 </w:p>
                 <w:p>
-                  <w:hyperlink w:history="1" r:id="rIdleik_b3m5qfzq5gmhpd1n">
+                  <w:hyperlink w:history="1" r:id="rIdl68hqvxal6agdiyxorv1d">
                     <w:r>
                       <w:rPr>
                         <w:rStyle w:val="Hyperlink"/>
@@ -14050,7 +14022,7 @@
                   </w:r>
                 </w:p>
                 <w:p>
-                  <w:hyperlink w:history="1" r:id="rIdctk4zfok1l1zb13vcyvul">
+                  <w:hyperlink w:history="1" r:id="rIdey7fcz3ctrdxzm4tgi2yp">
                     <w:r>
                       <w:rPr>
                         <w:rStyle w:val="Hyperlink"/>
@@ -14259,7 +14231,7 @@
                   </w:r>
                 </w:p>
                 <w:p>
-                  <w:hyperlink w:history="1" r:id="rIdeaq4qyskkvpj4nn_obdxv">
+                  <w:hyperlink w:history="1" r:id="rIdj5vatvtzizjgfn9xqnco3">
                     <w:r>
                       <w:rPr>
                         <w:rStyle w:val="Hyperlink"/>
@@ -14523,7 +14495,7 @@
                   </w:r>
                 </w:p>
                 <w:p>
-                  <w:hyperlink w:history="1" r:id="rId117np4mwe3mhcrlxm3sp9">
+                  <w:hyperlink w:history="1" r:id="rIdxuyrg79spuszbstjgqxkt">
                     <w:r>
                       <w:rPr>
                         <w:rStyle w:val="Hyperlink"/>
@@ -14757,7 +14729,7 @@
                   </w:r>
                 </w:p>
                 <w:p>
-                  <w:hyperlink w:history="1" r:id="rIdek85qjc5ftgr69qn8my-s">
+                  <w:hyperlink w:history="1" r:id="rId-pcdk5qgtd3_n6bfs4iry">
                     <w:r>
                       <w:rPr>
                         <w:rStyle w:val="Hyperlink"/>
@@ -14996,7 +14968,7 @@
                   </w:r>
                 </w:p>
                 <w:p>
-                  <w:hyperlink w:history="1" r:id="rIdkmtzrmbcmffq2byrmjfza">
+                  <w:hyperlink w:history="1" r:id="rIdvg2hon9sllm1jere_4q77">
                     <w:r>
                       <w:rPr>
                         <w:rStyle w:val="Hyperlink"/>
@@ -15205,7 +15177,7 @@
                   </w:r>
                 </w:p>
                 <w:p>
-                  <w:hyperlink w:history="1" r:id="rIdd6man66pveorlfhwgzsgb">
+                  <w:hyperlink w:history="1" r:id="rIdt1n0c0csgazlsvhnouxgw">
                     <w:r>
                       <w:rPr>
                         <w:rStyle w:val="Hyperlink"/>
@@ -15444,7 +15416,7 @@
                   </w:r>
                 </w:p>
                 <w:p>
-                  <w:hyperlink w:history="1" r:id="rId0re70twtriqwnvv4rm_mo">
+                  <w:hyperlink w:history="1" r:id="rId4q_psbbrzncq1qww2sp9u">
                     <w:r>
                       <w:rPr>
                         <w:rStyle w:val="Hyperlink"/>
@@ -15653,7 +15625,7 @@
                   </w:r>
                 </w:p>
                 <w:p>
-                  <w:hyperlink w:history="1" r:id="rIdsjflildsye0ieu9yvzepo">
+                  <w:hyperlink w:history="1" r:id="rIdjnrtgur8jjv4fg88rqbhk">
                     <w:r>
                       <w:rPr>
                         <w:rStyle w:val="Hyperlink"/>
@@ -15892,7 +15864,7 @@
                   </w:r>
                 </w:p>
                 <w:p>
-                  <w:hyperlink w:history="1" r:id="rIdkc9m0fx1ik7tqowrnumdj">
+                  <w:hyperlink w:history="1" r:id="rIdmx9iiaw6qyonjivyqxxfc">
                     <w:r>
                       <w:rPr>
                         <w:rStyle w:val="Hyperlink"/>
@@ -16101,7 +16073,7 @@
                   </w:r>
                 </w:p>
                 <w:p>
-                  <w:hyperlink w:history="1" r:id="rIdpm629xcikdciqb0jdunum">
+                  <w:hyperlink w:history="1" r:id="rIdj3406v7g69ybyyvkwgrdk">
                     <w:r>
                       <w:rPr>
                         <w:rStyle w:val="Hyperlink"/>
@@ -16340,7 +16312,7 @@
                   </w:r>
                 </w:p>
                 <w:p>
-                  <w:hyperlink w:history="1" r:id="rIdu-igub__qavhx7zsnbifu">
+                  <w:hyperlink w:history="1" r:id="rIdglkbigl9fncm_hpamrl8q">
                     <w:r>
                       <w:rPr>
                         <w:rStyle w:val="Hyperlink"/>
@@ -16574,7 +16546,7 @@
                   </w:r>
                 </w:p>
                 <w:p>
-                  <w:hyperlink w:history="1" r:id="rId47wyialtf-s5nsctulihc">
+                  <w:hyperlink w:history="1" r:id="rId4fmwhbe9pmutekcigr2qd">
                     <w:r>
                       <w:rPr>
                         <w:rStyle w:val="Hyperlink"/>
@@ -16838,7 +16810,7 @@
                   </w:r>
                 </w:p>
                 <w:p>
-                  <w:hyperlink w:history="1" r:id="rIdwv6tde_bqlxq8p9d3hykn">
+                  <w:hyperlink w:history="1" r:id="rIdcrwjtnyzzloc_8ucicjnd">
                     <w:r>
                       <w:rPr>
                         <w:rStyle w:val="Hyperlink"/>
@@ -17047,7 +17019,7 @@
                   </w:r>
                 </w:p>
                 <w:p>
-                  <w:hyperlink w:history="1" r:id="rId042ibckowywnkut4_4uzw">
+                  <w:hyperlink w:history="1" r:id="rIdxzy50eprpomvyfjzzhfbe">
                     <w:r>
                       <w:rPr>
                         <w:rStyle w:val="Hyperlink"/>
@@ -17286,7 +17258,7 @@
                   </w:r>
                 </w:p>
                 <w:p>
-                  <w:hyperlink w:history="1" r:id="rIdt7sq6gz5hg_5gci0-rajp">
+                  <w:hyperlink w:history="1" r:id="rIdcp7oje-rmnzhkfwdcxzdr">
                     <w:r>
                       <w:rPr>
                         <w:rStyle w:val="Hyperlink"/>
@@ -17495,7 +17467,7 @@
                   </w:r>
                 </w:p>
                 <w:p>
-                  <w:hyperlink w:history="1" r:id="rIdz88zwhrxvdmfl12trzugl">
+                  <w:hyperlink w:history="1" r:id="rId9n_p5_xrz686aes81fy4y">
                     <w:r>
                       <w:rPr>
                         <w:rStyle w:val="Hyperlink"/>
@@ -17734,7 +17706,7 @@
                   </w:r>
                 </w:p>
                 <w:p>
-                  <w:hyperlink w:history="1" r:id="rIdpf7axjhhofdi61gka0071">
+                  <w:hyperlink w:history="1" r:id="rIduqr4yvjasjkzkz94d9sdk">
                     <w:r>
                       <w:rPr>
                         <w:rStyle w:val="Hyperlink"/>
@@ -17943,7 +17915,7 @@
                   </w:r>
                 </w:p>
                 <w:p>
-                  <w:hyperlink w:history="1" r:id="rIdqeprprm6we4pf6qktswbr">
+                  <w:hyperlink w:history="1" r:id="rIdvoiswaouox5ppwhf57zxw">
                     <w:r>
                       <w:rPr>
                         <w:rStyle w:val="Hyperlink"/>
@@ -18182,7 +18154,7 @@
                   </w:r>
                 </w:p>
                 <w:p>
-                  <w:hyperlink w:history="1" r:id="rIddumoqdwx5ucdunpbxkfyt">
+                  <w:hyperlink w:history="1" r:id="rIdydim4lbfzb7lpzyvg4mrr">
                     <w:r>
                       <w:rPr>
                         <w:rStyle w:val="Hyperlink"/>
@@ -18391,7 +18363,7 @@
                   </w:r>
                 </w:p>
                 <w:p>
-                  <w:hyperlink w:history="1" r:id="rIdqqvbvhm8j_fcjniiwtvwa">
+                  <w:hyperlink w:history="1" r:id="rIdgwnzgwsee7ls-gkcwtd7d">
                     <w:r>
                       <w:rPr>
                         <w:rStyle w:val="Hyperlink"/>
@@ -18630,7 +18602,7 @@
                   </w:r>
                 </w:p>
                 <w:p>
-                  <w:hyperlink w:history="1" r:id="rIdgpsrxfdtp7l3uijxka9tx">
+                  <w:hyperlink w:history="1" r:id="rIdqzkeu5kv-rolnmanlg_qp">
                     <w:r>
                       <w:rPr>
                         <w:rStyle w:val="Hyperlink"/>
@@ -18839,7 +18811,7 @@
                   </w:r>
                 </w:p>
                 <w:p>
-                  <w:hyperlink w:history="1" r:id="rId6p5awa8jpohmxn_e6ksx3">
+                  <w:hyperlink w:history="1" r:id="rIdr24vh2obroddoqhumxypt">
                     <w:r>
                       <w:rPr>
                         <w:rStyle w:val="Hyperlink"/>
@@ -19078,7 +19050,7 @@
                   </w:r>
                 </w:p>
                 <w:p>
-                  <w:hyperlink w:history="1" r:id="rIdivhpaugf02-xtywsw-dzw">
+                  <w:hyperlink w:history="1" r:id="rIda2_ducmx737lmmc9yjtyp">
                     <w:r>
                       <w:rPr>
                         <w:rStyle w:val="Hyperlink"/>
@@ -19312,7 +19284,7 @@
                   </w:r>
                 </w:p>
                 <w:p>
-                  <w:hyperlink w:history="1" r:id="rIdgjx9kwa6py2o_2kuxw8ez">
+                  <w:hyperlink w:history="1" r:id="rIdpgeuh6hsftu-6ae-qwgng">
                     <w:r>
                       <w:rPr>
                         <w:rStyle w:val="Hyperlink"/>
@@ -19551,7 +19523,7 @@
                   </w:r>
                 </w:p>
                 <w:p>
-                  <w:hyperlink w:history="1" r:id="rIduvpkq7neotfecd5q1fh1u">
+                  <w:hyperlink w:history="1" r:id="rIdpnovcjazldgmasn7_obz8">
                     <w:r>
                       <w:rPr>
                         <w:rStyle w:val="Hyperlink"/>
@@ -19760,7 +19732,7 @@
                   </w:r>
                 </w:p>
                 <w:p>
-                  <w:hyperlink w:history="1" r:id="rIdef3xxs4aog9aexdwednns">
+                  <w:hyperlink w:history="1" r:id="rIdqel6v17jj6o64yjaoqkgi">
                     <w:r>
                       <w:rPr>
                         <w:rStyle w:val="Hyperlink"/>
@@ -19999,7 +19971,7 @@
                   </w:r>
                 </w:p>
                 <w:p>
-                  <w:hyperlink w:history="1" r:id="rIdy9tioduvbcluhmjz7wuvl">
+                  <w:hyperlink w:history="1" r:id="rId6tjoc1fkhrkmjv6qpj5qs">
                     <w:r>
                       <w:rPr>
                         <w:rStyle w:val="Hyperlink"/>
@@ -20208,7 +20180,7 @@
                   </w:r>
                 </w:p>
                 <w:p>
-                  <w:hyperlink w:history="1" r:id="rIdxrorne1suxbme8jn6cjeh">
+                  <w:hyperlink w:history="1" r:id="rIdrnqnh6ewlilnmbdkovhuw">
                     <w:r>
                       <w:rPr>
                         <w:rStyle w:val="Hyperlink"/>

</xml_diff>

<commit_message>
Workbook: add Andrea Holmes photo, verify all EOSI photos are 400x400 square (no stretching)
</commit_message>
<xml_diff>
--- a/deliverables/workbook/Workbook.docx
+++ b/deliverables/workbook/Workbook.docx
@@ -9260,7 +9260,7 @@
               <w:spacing w:after="80"/>
               <w:jc w:val="center"/>
             </w:pPr>
-            <w:hyperlink w:history="1" r:id="rIdchzuwkj3gcic1mbkcphtz">
+            <w:hyperlink w:history="1" r:id="rIdobf1rjvsvauarf6mn0l-6">
               <w:r>
                 <w:rPr>
                   <w:rStyle w:val="Hyperlink"/>
@@ -9360,7 +9360,7 @@
               <w:spacing w:after="80"/>
               <w:jc w:val="center"/>
             </w:pPr>
-            <w:hyperlink w:history="1" r:id="rIdcxdea_3pklitrzyykbrxe">
+            <w:hyperlink w:history="1" r:id="rIdfqdcwummbjrrbli3nle3x">
               <w:r>
                 <w:rPr>
                   <w:rStyle w:val="Hyperlink"/>
@@ -9517,7 +9517,7 @@
               <w:spacing w:after="80"/>
               <w:jc w:val="center"/>
             </w:pPr>
-            <w:hyperlink w:history="1" r:id="rIdrmm7ztms8qsqrof5ipiz0">
+            <w:hyperlink w:history="1" r:id="rIddmzjms4pey_vyy0lqbdq-">
               <w:r>
                 <w:rPr>
                   <w:rStyle w:val="Hyperlink"/>
@@ -9617,7 +9617,7 @@
               <w:spacing w:after="80"/>
               <w:jc w:val="center"/>
             </w:pPr>
-            <w:hyperlink w:history="1" r:id="rId_olk4xkobtlqkkt4qpuqm">
+            <w:hyperlink w:history="1" r:id="rIdvaiui3owgeik9lu3ghosz">
               <w:r>
                 <w:rPr>
                   <w:rStyle w:val="Hyperlink"/>
@@ -9773,7 +9773,7 @@
               <w:spacing w:after="80"/>
               <w:jc w:val="center"/>
             </w:pPr>
-            <w:hyperlink w:history="1" r:id="rId_vpxfmcf5zd6zc1bx6l3o">
+            <w:hyperlink w:history="1" r:id="rIdzhczncksjp-eexs2lheyo">
               <w:r>
                 <w:rPr>
                   <w:rStyle w:val="Hyperlink"/>
@@ -9929,7 +9929,7 @@
               <w:spacing w:after="80"/>
               <w:jc w:val="center"/>
             </w:pPr>
-            <w:hyperlink w:history="1" r:id="rIdac_lgehi4scupvu692asy">
+            <w:hyperlink w:history="1" r:id="rIdsjk-9sd99db5rjgoub09n">
               <w:r>
                 <w:rPr>
                   <w:rStyle w:val="Hyperlink"/>
@@ -10086,7 +10086,7 @@
               <w:spacing w:after="80"/>
               <w:jc w:val="center"/>
             </w:pPr>
-            <w:hyperlink w:history="1" r:id="rIdkj_-gp91amuwwglqkt1et">
+            <w:hyperlink w:history="1" r:id="rIdw32elwhpd9qhsxhknngtm">
               <w:r>
                 <w:rPr>
                   <w:rStyle w:val="Hyperlink"/>
@@ -10186,7 +10186,7 @@
               <w:spacing w:after="80"/>
               <w:jc w:val="center"/>
             </w:pPr>
-            <w:hyperlink w:history="1" r:id="rIdmglfqmhrhktllukc4dmbf">
+            <w:hyperlink w:history="1" r:id="rIdt0il_o-t7if_txw_ezn83">
               <w:r>
                 <w:rPr>
                   <w:rStyle w:val="Hyperlink"/>
@@ -10345,7 +10345,7 @@
               <w:spacing w:after="80"/>
               <w:jc w:val="center"/>
             </w:pPr>
-            <w:hyperlink w:history="1" r:id="rIdnakaarllmaurlutkfzhfe">
+            <w:hyperlink w:history="1" r:id="rId4-tg0xkwzpyjyrvuc165n">
               <w:r>
                 <w:rPr>
                   <w:rStyle w:val="Hyperlink"/>
@@ -10445,7 +10445,7 @@
               <w:spacing w:after="80"/>
               <w:jc w:val="center"/>
             </w:pPr>
-            <w:hyperlink w:history="1" r:id="rId8qpjou7wisdjt2b2qu8as">
+            <w:hyperlink w:history="1" r:id="rIdqa4lwbtgksxnhsn_xslqv">
               <w:r>
                 <w:rPr>
                   <w:rStyle w:val="Hyperlink"/>
@@ -10545,7 +10545,7 @@
               <w:spacing w:after="80"/>
               <w:jc w:val="center"/>
             </w:pPr>
-            <w:hyperlink w:history="1" r:id="rIdfbjgkpj4yb9hhr7ofliuu">
+            <w:hyperlink w:history="1" r:id="rIdv2o5kqlogcgfs3thfv0gq">
               <w:r>
                 <w:rPr>
                   <w:rStyle w:val="Hyperlink"/>
@@ -10645,7 +10645,7 @@
               <w:spacing w:after="80"/>
               <w:jc w:val="center"/>
             </w:pPr>
-            <w:hyperlink w:history="1" r:id="rIdy4zc_ahxxpsdz1t1hvvry">
+            <w:hyperlink w:history="1" r:id="rId1wdgpy7sjsjz3tj6iuyy3">
               <w:r>
                 <w:rPr>
                   <w:rStyle w:val="Hyperlink"/>
@@ -10777,7 +10777,7 @@
               <w:spacing w:after="80"/>
               <w:jc w:val="center"/>
             </w:pPr>
-            <w:hyperlink w:history="1" r:id="rIdlhvb1j_hi4xo9egaerkni">
+            <w:hyperlink w:history="1" r:id="rId1r-pqivzcgvbjmuki3i6g">
               <w:r>
                 <w:rPr>
                   <w:rStyle w:val="Hyperlink"/>
@@ -10877,7 +10877,7 @@
               <w:spacing w:after="80"/>
               <w:jc w:val="center"/>
             </w:pPr>
-            <w:hyperlink w:history="1" r:id="rId2bcnvmeqnta-p1hubb3xc">
+            <w:hyperlink w:history="1" r:id="rIdyfs1bdjo4xyro4ti_v3qj">
               <w:r>
                 <w:rPr>
                   <w:rStyle w:val="Hyperlink"/>
@@ -10977,7 +10977,7 @@
               <w:spacing w:after="80"/>
               <w:jc w:val="center"/>
             </w:pPr>
-            <w:hyperlink w:history="1" r:id="rIdh_qrub84gfhf0yak9z5xc">
+            <w:hyperlink w:history="1" r:id="rIdefanbvhmyh-watznjhr2f">
               <w:r>
                 <w:rPr>
                   <w:rStyle w:val="Hyperlink"/>
@@ -11077,7 +11077,7 @@
               <w:spacing w:after="80"/>
               <w:jc w:val="center"/>
             </w:pPr>
-            <w:hyperlink w:history="1" r:id="rIdyjgjbb6-od7dwdh3tjatc">
+            <w:hyperlink w:history="1" r:id="rIdwdqlondzeiv7hugcitfab">
               <w:r>
                 <w:rPr>
                   <w:rStyle w:val="Hyperlink"/>
@@ -11377,7 +11377,7 @@
                   </w:r>
                 </w:p>
                 <w:p>
-                  <w:hyperlink w:history="1" r:id="rIdz9c4_d8ueoewvnissyzas">
+                  <w:hyperlink w:history="1" r:id="rId8ceicem9xqdn9675ww6-g">
                     <w:r>
                       <w:rPr>
                         <w:rStyle w:val="Hyperlink"/>
@@ -11586,7 +11586,7 @@
                   </w:r>
                 </w:p>
                 <w:p>
-                  <w:hyperlink w:history="1" r:id="rIdigm3vyvdaljfsh6jpsaqx">
+                  <w:hyperlink w:history="1" r:id="rId4koi0vqf_ybbg4cmjy4-m">
                     <w:r>
                       <w:rPr>
                         <w:rStyle w:val="Hyperlink"/>
@@ -11825,7 +11825,7 @@
                   </w:r>
                 </w:p>
                 <w:p>
-                  <w:hyperlink w:history="1" r:id="rIdealxaj9uq_dalntpul9vs">
+                  <w:hyperlink w:history="1" r:id="rIdlzylxzu-zh7w4nx8hhey3">
                     <w:r>
                       <w:rPr>
                         <w:rStyle w:val="Hyperlink"/>
@@ -12034,7 +12034,7 @@
                   </w:r>
                 </w:p>
                 <w:p>
-                  <w:hyperlink w:history="1" r:id="rIda5jnme9owzczt4oma6ajj">
+                  <w:hyperlink w:history="1" r:id="rIdhgmsi3bz-sd3wgauk7_iv">
                     <w:r>
                       <w:rPr>
                         <w:rStyle w:val="Hyperlink"/>
@@ -12273,7 +12273,7 @@
                   </w:r>
                 </w:p>
                 <w:p>
-                  <w:hyperlink w:history="1" r:id="rIdhrc0dkp0o3war9relf_hs">
+                  <w:hyperlink w:history="1" r:id="rIdxr2hnvxymjgpn8yfjvczc">
                     <w:r>
                       <w:rPr>
                         <w:rStyle w:val="Hyperlink"/>
@@ -12482,7 +12482,7 @@
                   </w:r>
                 </w:p>
                 <w:p>
-                  <w:hyperlink w:history="1" r:id="rIdtkdnyj1gv8mmeky4p24sj">
+                  <w:hyperlink w:history="1" r:id="rId3hjb9u77ry5yj4wbj6yg7">
                     <w:r>
                       <w:rPr>
                         <w:rStyle w:val="Hyperlink"/>
@@ -12587,19 +12587,48 @@
                 </w:tcPr>
                 <w:p>
                   <w:pPr>
-                    <w:shd w:fill="0B1F3A" w:val="clear"/>
-                    <w:jc w:val="center"/>
+                    <w:spacing w:after="40"/>
+                    <w:jc w:val="left"/>
                   </w:pPr>
                   <w:r>
-                    <w:rPr>
-                      <w:rFonts w:ascii="Calibri" w:cs="Calibri" w:eastAsia="Calibri" w:hAnsi="Calibri"/>
-                      <w:b/>
-                      <w:bCs/>
-                      <w:color w:val="FFFFFF"/>
-                      <w:sz w:val="32"/>
-                      <w:szCs w:val="32"/>
-                    </w:rPr>
-                    <w:t xml:space="preserve">AH</w:t>
+                    <w:drawing>
+                      <wp:inline distT="0" distB="0" distL="0" distR="0">
+                        <wp:extent cx="857250" cy="857250"/>
+                        <wp:effectExtent t="0" r="0" b="0" l="0"/>
+                        <wp:docPr id="1" name="img" descr="image" title="andrea-holmes.jpg"/>
+                        <wp:cNvGraphicFramePr>
+                          <a:graphicFrameLocks xmlns:a="http://schemas.openxmlformats.org/drawingml/2006/main" noChangeAspect="1"/>
+                        </wp:cNvGraphicFramePr>
+                        <a:graphic xmlns:a="http://schemas.openxmlformats.org/drawingml/2006/main">
+                          <a:graphicData uri="http://schemas.openxmlformats.org/drawingml/2006/picture">
+                            <pic:pic xmlns:pic="http://schemas.openxmlformats.org/drawingml/2006/picture">
+                              <pic:nvPicPr>
+                                <pic:cNvPr id="0" name="" descr=""/>
+                                <pic:cNvPicPr>
+                                  <a:picLocks noChangeAspect="1" noChangeArrowheads="1"/>
+                                </pic:cNvPicPr>
+                              </pic:nvPicPr>
+                              <pic:blipFill>
+                                <a:blip r:embed="rId36" cstate="none"/>
+                                <a:srcRect/>
+                                <a:stretch>
+                                  <a:fillRect/>
+                                </a:stretch>
+                              </pic:blipFill>
+                              <pic:spPr bwMode="auto">
+                                <a:xfrm>
+                                  <a:off x="0" y="0"/>
+                                  <a:ext cx="857250" cy="857250"/>
+                                </a:xfrm>
+                                <a:prstGeom prst="rect">
+                                  <a:avLst/>
+                                </a:prstGeom>
+                              </pic:spPr>
+                            </pic:pic>
+                          </a:graphicData>
+                        </a:graphic>
+                      </wp:inline>
+                    </w:drawing>
                   </w:r>
                 </w:p>
               </w:tc>
@@ -12775,7 +12804,7 @@
                                 </pic:cNvPicPr>
                               </pic:nvPicPr>
                               <pic:blipFill>
-                                <a:blip r:embed="rId36" cstate="none"/>
+                                <a:blip r:embed="rId37" cstate="none"/>
                                 <a:srcRect/>
                                 <a:stretch>
                                   <a:fillRect/>
@@ -12887,7 +12916,7 @@
                   </w:r>
                 </w:p>
                 <w:p>
-                  <w:hyperlink w:history="1" r:id="rIdecofepmy2jhdjtc_sr10c">
+                  <w:hyperlink w:history="1" r:id="rIdf2xmss0wsr8hd4feugczv">
                     <w:r>
                       <w:rPr>
                         <w:rStyle w:val="Hyperlink"/>
@@ -13014,7 +13043,7 @@
                                 </pic:cNvPicPr>
                               </pic:nvPicPr>
                               <pic:blipFill>
-                                <a:blip r:embed="rId37" cstate="none"/>
+                                <a:blip r:embed="rId38" cstate="none"/>
                                 <a:srcRect/>
                                 <a:stretch>
                                   <a:fillRect/>
@@ -13126,7 +13155,7 @@
                   </w:r>
                 </w:p>
                 <w:p>
-                  <w:hyperlink w:history="1" r:id="rId5bnvseikvqmsr3fle3lau">
+                  <w:hyperlink w:history="1" r:id="rId9mr6fnom-d4t50lbuythk">
                     <w:r>
                       <w:rPr>
                         <w:rStyle w:val="Hyperlink"/>
@@ -13223,7 +13252,7 @@
                                 </pic:cNvPicPr>
                               </pic:nvPicPr>
                               <pic:blipFill>
-                                <a:blip r:embed="rId38" cstate="none"/>
+                                <a:blip r:embed="rId39" cstate="none"/>
                                 <a:srcRect/>
                                 <a:stretch>
                                   <a:fillRect/>
@@ -13335,7 +13364,7 @@
                   </w:r>
                 </w:p>
                 <w:p>
-                  <w:hyperlink w:history="1" r:id="rIdczej4nlgvsmgerb0z6ozx">
+                  <w:hyperlink w:history="1" r:id="rIdebsvwdtmk6vzwdhxpj85f">
                     <w:r>
                       <w:rPr>
                         <w:rStyle w:val="Hyperlink"/>
@@ -13462,7 +13491,7 @@
                                 </pic:cNvPicPr>
                               </pic:nvPicPr>
                               <pic:blipFill>
-                                <a:blip r:embed="rId39" cstate="none"/>
+                                <a:blip r:embed="rId40" cstate="none"/>
                                 <a:srcRect/>
                                 <a:stretch>
                                   <a:fillRect/>
@@ -13574,7 +13603,7 @@
                   </w:r>
                 </w:p>
                 <w:p>
-                  <w:hyperlink w:history="1" r:id="rIdu5ijopglcyz2amntb4jnb">
+                  <w:hyperlink w:history="1" r:id="rIdrdkrmnvjvzwue8wmboxjq">
                     <w:r>
                       <w:rPr>
                         <w:rStyle w:val="Hyperlink"/>
@@ -13671,7 +13700,7 @@
                                 </pic:cNvPicPr>
                               </pic:nvPicPr>
                               <pic:blipFill>
-                                <a:blip r:embed="rId40" cstate="none"/>
+                                <a:blip r:embed="rId41" cstate="none"/>
                                 <a:srcRect/>
                                 <a:stretch>
                                   <a:fillRect/>
@@ -13783,7 +13812,7 @@
                   </w:r>
                 </w:p>
                 <w:p>
-                  <w:hyperlink w:history="1" r:id="rIdl68hqvxal6agdiyxorv1d">
+                  <w:hyperlink w:history="1" r:id="rIdjucxeh-4kcyhuyiicz_p4">
                     <w:r>
                       <w:rPr>
                         <w:rStyle w:val="Hyperlink"/>
@@ -13910,7 +13939,7 @@
                                 </pic:cNvPicPr>
                               </pic:nvPicPr>
                               <pic:blipFill>
-                                <a:blip r:embed="rId41" cstate="none"/>
+                                <a:blip r:embed="rId42" cstate="none"/>
                                 <a:srcRect/>
                                 <a:stretch>
                                   <a:fillRect/>
@@ -14022,7 +14051,7 @@
                   </w:r>
                 </w:p>
                 <w:p>
-                  <w:hyperlink w:history="1" r:id="rIdey7fcz3ctrdxzm4tgi2yp">
+                  <w:hyperlink w:history="1" r:id="rId4y-zole5ykppsbdpqdrjm">
                     <w:r>
                       <w:rPr>
                         <w:rStyle w:val="Hyperlink"/>
@@ -14119,7 +14148,7 @@
                                 </pic:cNvPicPr>
                               </pic:nvPicPr>
                               <pic:blipFill>
-                                <a:blip r:embed="rId42" cstate="none"/>
+                                <a:blip r:embed="rId43" cstate="none"/>
                                 <a:srcRect/>
                                 <a:stretch>
                                   <a:fillRect/>
@@ -14231,7 +14260,7 @@
                   </w:r>
                 </w:p>
                 <w:p>
-                  <w:hyperlink w:history="1" r:id="rIdj5vatvtzizjgfn9xqnco3">
+                  <w:hyperlink w:history="1" r:id="rId3jllih7cxps0g_ok9cgu2">
                     <w:r>
                       <w:rPr>
                         <w:rStyle w:val="Hyperlink"/>
@@ -14358,7 +14387,7 @@
                                 </pic:cNvPicPr>
                               </pic:nvPicPr>
                               <pic:blipFill>
-                                <a:blip r:embed="rId43" cstate="none"/>
+                                <a:blip r:embed="rId44" cstate="none"/>
                                 <a:srcRect/>
                                 <a:stretch>
                                   <a:fillRect/>
@@ -14495,7 +14524,7 @@
                   </w:r>
                 </w:p>
                 <w:p>
-                  <w:hyperlink w:history="1" r:id="rIdxuyrg79spuszbstjgqxkt">
+                  <w:hyperlink w:history="1" r:id="rIdqqupmicsbl5urprqx5_y2">
                     <w:r>
                       <w:rPr>
                         <w:rStyle w:val="Hyperlink"/>
@@ -14592,7 +14621,7 @@
                                 </pic:cNvPicPr>
                               </pic:nvPicPr>
                               <pic:blipFill>
-                                <a:blip r:embed="rId44" cstate="none"/>
+                                <a:blip r:embed="rId45" cstate="none"/>
                                 <a:srcRect/>
                                 <a:stretch>
                                   <a:fillRect/>
@@ -14729,7 +14758,7 @@
                   </w:r>
                 </w:p>
                 <w:p>
-                  <w:hyperlink w:history="1" r:id="rId-pcdk5qgtd3_n6bfs4iry">
+                  <w:hyperlink w:history="1" r:id="rIdnxd9gg0tkba7wvr4qmcor">
                     <w:r>
                       <w:rPr>
                         <w:rStyle w:val="Hyperlink"/>
@@ -14856,7 +14885,7 @@
                                 </pic:cNvPicPr>
                               </pic:nvPicPr>
                               <pic:blipFill>
-                                <a:blip r:embed="rId45" cstate="none"/>
+                                <a:blip r:embed="rId46" cstate="none"/>
                                 <a:srcRect/>
                                 <a:stretch>
                                   <a:fillRect/>
@@ -14968,7 +14997,7 @@
                   </w:r>
                 </w:p>
                 <w:p>
-                  <w:hyperlink w:history="1" r:id="rIdvg2hon9sllm1jere_4q77">
+                  <w:hyperlink w:history="1" r:id="rIdte9b28t4pqr12ngtmvg7z">
                     <w:r>
                       <w:rPr>
                         <w:rStyle w:val="Hyperlink"/>
@@ -15065,7 +15094,7 @@
                                 </pic:cNvPicPr>
                               </pic:nvPicPr>
                               <pic:blipFill>
-                                <a:blip r:embed="rId46" cstate="none"/>
+                                <a:blip r:embed="rId47" cstate="none"/>
                                 <a:srcRect/>
                                 <a:stretch>
                                   <a:fillRect/>
@@ -15177,7 +15206,7 @@
                   </w:r>
                 </w:p>
                 <w:p>
-                  <w:hyperlink w:history="1" r:id="rIdt1n0c0csgazlsvhnouxgw">
+                  <w:hyperlink w:history="1" r:id="rIdv1zz1djvckrmanswgd3xi">
                     <w:r>
                       <w:rPr>
                         <w:rStyle w:val="Hyperlink"/>
@@ -15304,7 +15333,7 @@
                                 </pic:cNvPicPr>
                               </pic:nvPicPr>
                               <pic:blipFill>
-                                <a:blip r:embed="rId47" cstate="none"/>
+                                <a:blip r:embed="rId48" cstate="none"/>
                                 <a:srcRect/>
                                 <a:stretch>
                                   <a:fillRect/>
@@ -15416,7 +15445,7 @@
                   </w:r>
                 </w:p>
                 <w:p>
-                  <w:hyperlink w:history="1" r:id="rId4q_psbbrzncq1qww2sp9u">
+                  <w:hyperlink w:history="1" r:id="rIdydv2v1rlik-68yh7peebq">
                     <w:r>
                       <w:rPr>
                         <w:rStyle w:val="Hyperlink"/>
@@ -15513,7 +15542,7 @@
                                 </pic:cNvPicPr>
                               </pic:nvPicPr>
                               <pic:blipFill>
-                                <a:blip r:embed="rId48" cstate="none"/>
+                                <a:blip r:embed="rId49" cstate="none"/>
                                 <a:srcRect/>
                                 <a:stretch>
                                   <a:fillRect/>
@@ -15625,7 +15654,7 @@
                   </w:r>
                 </w:p>
                 <w:p>
-                  <w:hyperlink w:history="1" r:id="rIdjnrtgur8jjv4fg88rqbhk">
+                  <w:hyperlink w:history="1" r:id="rIdwzc5ghvcyomd1tjcu8qvc">
                     <w:r>
                       <w:rPr>
                         <w:rStyle w:val="Hyperlink"/>
@@ -15752,7 +15781,7 @@
                                 </pic:cNvPicPr>
                               </pic:nvPicPr>
                               <pic:blipFill>
-                                <a:blip r:embed="rId49" cstate="none"/>
+                                <a:blip r:embed="rId50" cstate="none"/>
                                 <a:srcRect/>
                                 <a:stretch>
                                   <a:fillRect/>
@@ -15864,7 +15893,7 @@
                   </w:r>
                 </w:p>
                 <w:p>
-                  <w:hyperlink w:history="1" r:id="rIdmx9iiaw6qyonjivyqxxfc">
+                  <w:hyperlink w:history="1" r:id="rId_8c6ye_kfysuswdus9f8h">
                     <w:r>
                       <w:rPr>
                         <w:rStyle w:val="Hyperlink"/>
@@ -15961,7 +15990,7 @@
                                 </pic:cNvPicPr>
                               </pic:nvPicPr>
                               <pic:blipFill>
-                                <a:blip r:embed="rId50" cstate="none"/>
+                                <a:blip r:embed="rId51" cstate="none"/>
                                 <a:srcRect/>
                                 <a:stretch>
                                   <a:fillRect/>
@@ -16073,7 +16102,7 @@
                   </w:r>
                 </w:p>
                 <w:p>
-                  <w:hyperlink w:history="1" r:id="rIdj3406v7g69ybyyvkwgrdk">
+                  <w:hyperlink w:history="1" r:id="rIdzau9ng74m2ra4ved5vnxf">
                     <w:r>
                       <w:rPr>
                         <w:rStyle w:val="Hyperlink"/>
@@ -16200,7 +16229,7 @@
                                 </pic:cNvPicPr>
                               </pic:nvPicPr>
                               <pic:blipFill>
-                                <a:blip r:embed="rId51" cstate="none"/>
+                                <a:blip r:embed="rId52" cstate="none"/>
                                 <a:srcRect/>
                                 <a:stretch>
                                   <a:fillRect/>
@@ -16312,7 +16341,7 @@
                   </w:r>
                 </w:p>
                 <w:p>
-                  <w:hyperlink w:history="1" r:id="rIdglkbigl9fncm_hpamrl8q">
+                  <w:hyperlink w:history="1" r:id="rIdun7ib_cnlvkhlgsupsvxy">
                     <w:r>
                       <w:rPr>
                         <w:rStyle w:val="Hyperlink"/>
@@ -16409,7 +16438,7 @@
                                 </pic:cNvPicPr>
                               </pic:nvPicPr>
                               <pic:blipFill>
-                                <a:blip r:embed="rId52" cstate="none"/>
+                                <a:blip r:embed="rId53" cstate="none"/>
                                 <a:srcRect/>
                                 <a:stretch>
                                   <a:fillRect/>
@@ -16546,7 +16575,7 @@
                   </w:r>
                 </w:p>
                 <w:p>
-                  <w:hyperlink w:history="1" r:id="rId4fmwhbe9pmutekcigr2qd">
+                  <w:hyperlink w:history="1" r:id="rIdhbr7nspgydqaep2i0llqu">
                     <w:r>
                       <w:rPr>
                         <w:rStyle w:val="Hyperlink"/>
@@ -16673,7 +16702,7 @@
                                 </pic:cNvPicPr>
                               </pic:nvPicPr>
                               <pic:blipFill>
-                                <a:blip r:embed="rId53" cstate="none"/>
+                                <a:blip r:embed="rId54" cstate="none"/>
                                 <a:srcRect/>
                                 <a:stretch>
                                   <a:fillRect/>
@@ -16810,7 +16839,7 @@
                   </w:r>
                 </w:p>
                 <w:p>
-                  <w:hyperlink w:history="1" r:id="rIdcrwjtnyzzloc_8ucicjnd">
+                  <w:hyperlink w:history="1" r:id="rId8u613bofpqwlsjmjf9eek">
                     <w:r>
                       <w:rPr>
                         <w:rStyle w:val="Hyperlink"/>
@@ -16907,7 +16936,7 @@
                                 </pic:cNvPicPr>
                               </pic:nvPicPr>
                               <pic:blipFill>
-                                <a:blip r:embed="rId54" cstate="none"/>
+                                <a:blip r:embed="rId55" cstate="none"/>
                                 <a:srcRect/>
                                 <a:stretch>
                                   <a:fillRect/>
@@ -17019,7 +17048,7 @@
                   </w:r>
                 </w:p>
                 <w:p>
-                  <w:hyperlink w:history="1" r:id="rIdxzy50eprpomvyfjzzhfbe">
+                  <w:hyperlink w:history="1" r:id="rId5viqcylefjkrvhm0vc7ix">
                     <w:r>
                       <w:rPr>
                         <w:rStyle w:val="Hyperlink"/>
@@ -17146,7 +17175,7 @@
                                 </pic:cNvPicPr>
                               </pic:nvPicPr>
                               <pic:blipFill>
-                                <a:blip r:embed="rId55" cstate="none"/>
+                                <a:blip r:embed="rId56" cstate="none"/>
                                 <a:srcRect/>
                                 <a:stretch>
                                   <a:fillRect/>
@@ -17258,7 +17287,7 @@
                   </w:r>
                 </w:p>
                 <w:p>
-                  <w:hyperlink w:history="1" r:id="rIdcp7oje-rmnzhkfwdcxzdr">
+                  <w:hyperlink w:history="1" r:id="rIdryper2mguhtukpgwcjvru">
                     <w:r>
                       <w:rPr>
                         <w:rStyle w:val="Hyperlink"/>
@@ -17355,7 +17384,7 @@
                                 </pic:cNvPicPr>
                               </pic:nvPicPr>
                               <pic:blipFill>
-                                <a:blip r:embed="rId56" cstate="none"/>
+                                <a:blip r:embed="rId57" cstate="none"/>
                                 <a:srcRect/>
                                 <a:stretch>
                                   <a:fillRect/>
@@ -17467,7 +17496,7 @@
                   </w:r>
                 </w:p>
                 <w:p>
-                  <w:hyperlink w:history="1" r:id="rId9n_p5_xrz686aes81fy4y">
+                  <w:hyperlink w:history="1" r:id="rId-9wyk3oddlyanzit_negw">
                     <w:r>
                       <w:rPr>
                         <w:rStyle w:val="Hyperlink"/>
@@ -17594,7 +17623,7 @@
                                 </pic:cNvPicPr>
                               </pic:nvPicPr>
                               <pic:blipFill>
-                                <a:blip r:embed="rId57" cstate="none"/>
+                                <a:blip r:embed="rId58" cstate="none"/>
                                 <a:srcRect/>
                                 <a:stretch>
                                   <a:fillRect/>
@@ -17706,7 +17735,7 @@
                   </w:r>
                 </w:p>
                 <w:p>
-                  <w:hyperlink w:history="1" r:id="rIduqr4yvjasjkzkz94d9sdk">
+                  <w:hyperlink w:history="1" r:id="rIdgigzninfhqaehcqecovou">
                     <w:r>
                       <w:rPr>
                         <w:rStyle w:val="Hyperlink"/>
@@ -17803,7 +17832,7 @@
                                 </pic:cNvPicPr>
                               </pic:nvPicPr>
                               <pic:blipFill>
-                                <a:blip r:embed="rId58" cstate="none"/>
+                                <a:blip r:embed="rId59" cstate="none"/>
                                 <a:srcRect/>
                                 <a:stretch>
                                   <a:fillRect/>
@@ -17915,7 +17944,7 @@
                   </w:r>
                 </w:p>
                 <w:p>
-                  <w:hyperlink w:history="1" r:id="rIdvoiswaouox5ppwhf57zxw">
+                  <w:hyperlink w:history="1" r:id="rIdok6xf2np3idfjajrymq3l">
                     <w:r>
                       <w:rPr>
                         <w:rStyle w:val="Hyperlink"/>
@@ -18042,7 +18071,7 @@
                                 </pic:cNvPicPr>
                               </pic:nvPicPr>
                               <pic:blipFill>
-                                <a:blip r:embed="rId59" cstate="none"/>
+                                <a:blip r:embed="rId60" cstate="none"/>
                                 <a:srcRect/>
                                 <a:stretch>
                                   <a:fillRect/>
@@ -18154,7 +18183,7 @@
                   </w:r>
                 </w:p>
                 <w:p>
-                  <w:hyperlink w:history="1" r:id="rIdydim4lbfzb7lpzyvg4mrr">
+                  <w:hyperlink w:history="1" r:id="rIdwehujxko5gio9hy1w7d-u">
                     <w:r>
                       <w:rPr>
                         <w:rStyle w:val="Hyperlink"/>
@@ -18251,7 +18280,7 @@
                                 </pic:cNvPicPr>
                               </pic:nvPicPr>
                               <pic:blipFill>
-                                <a:blip r:embed="rId60" cstate="none"/>
+                                <a:blip r:embed="rId61" cstate="none"/>
                                 <a:srcRect/>
                                 <a:stretch>
                                   <a:fillRect/>
@@ -18363,7 +18392,7 @@
                   </w:r>
                 </w:p>
                 <w:p>
-                  <w:hyperlink w:history="1" r:id="rIdgwnzgwsee7ls-gkcwtd7d">
+                  <w:hyperlink w:history="1" r:id="rIdodj4jojl7tdy6y-vnydfz">
                     <w:r>
                       <w:rPr>
                         <w:rStyle w:val="Hyperlink"/>
@@ -18490,7 +18519,7 @@
                                 </pic:cNvPicPr>
                               </pic:nvPicPr>
                               <pic:blipFill>
-                                <a:blip r:embed="rId61" cstate="none"/>
+                                <a:blip r:embed="rId62" cstate="none"/>
                                 <a:srcRect/>
                                 <a:stretch>
                                   <a:fillRect/>
@@ -18602,7 +18631,7 @@
                   </w:r>
                 </w:p>
                 <w:p>
-                  <w:hyperlink w:history="1" r:id="rIdqzkeu5kv-rolnmanlg_qp">
+                  <w:hyperlink w:history="1" r:id="rIdxa9wmxgqyaoj_i9w7qzqv">
                     <w:r>
                       <w:rPr>
                         <w:rStyle w:val="Hyperlink"/>
@@ -18699,7 +18728,7 @@
                                 </pic:cNvPicPr>
                               </pic:nvPicPr>
                               <pic:blipFill>
-                                <a:blip r:embed="rId62" cstate="none"/>
+                                <a:blip r:embed="rId63" cstate="none"/>
                                 <a:srcRect/>
                                 <a:stretch>
                                   <a:fillRect/>
@@ -18811,7 +18840,7 @@
                   </w:r>
                 </w:p>
                 <w:p>
-                  <w:hyperlink w:history="1" r:id="rIdr24vh2obroddoqhumxypt">
+                  <w:hyperlink w:history="1" r:id="rIdagqn3jj5njvftjpdeik0m">
                     <w:r>
                       <w:rPr>
                         <w:rStyle w:val="Hyperlink"/>
@@ -18938,7 +18967,7 @@
                                 </pic:cNvPicPr>
                               </pic:nvPicPr>
                               <pic:blipFill>
-                                <a:blip r:embed="rId63" cstate="none"/>
+                                <a:blip r:embed="rId64" cstate="none"/>
                                 <a:srcRect/>
                                 <a:stretch>
                                   <a:fillRect/>
@@ -19050,7 +19079,7 @@
                   </w:r>
                 </w:p>
                 <w:p>
-                  <w:hyperlink w:history="1" r:id="rIda2_ducmx737lmmc9yjtyp">
+                  <w:hyperlink w:history="1" r:id="rIdqpu3d-lxbhobdh-tcx_qm">
                     <w:r>
                       <w:rPr>
                         <w:rStyle w:val="Hyperlink"/>
@@ -19147,7 +19176,7 @@
                                 </pic:cNvPicPr>
                               </pic:nvPicPr>
                               <pic:blipFill>
-                                <a:blip r:embed="rId64" cstate="none"/>
+                                <a:blip r:embed="rId65" cstate="none"/>
                                 <a:srcRect/>
                                 <a:stretch>
                                   <a:fillRect/>
@@ -19284,7 +19313,7 @@
                   </w:r>
                 </w:p>
                 <w:p>
-                  <w:hyperlink w:history="1" r:id="rIdpgeuh6hsftu-6ae-qwgng">
+                  <w:hyperlink w:history="1" r:id="rId6yxyc0dc9dlqcqwjfhu1y">
                     <w:r>
                       <w:rPr>
                         <w:rStyle w:val="Hyperlink"/>
@@ -19411,7 +19440,7 @@
                                 </pic:cNvPicPr>
                               </pic:nvPicPr>
                               <pic:blipFill>
-                                <a:blip r:embed="rId65" cstate="none"/>
+                                <a:blip r:embed="rId66" cstate="none"/>
                                 <a:srcRect/>
                                 <a:stretch>
                                   <a:fillRect/>
@@ -19523,7 +19552,7 @@
                   </w:r>
                 </w:p>
                 <w:p>
-                  <w:hyperlink w:history="1" r:id="rIdpnovcjazldgmasn7_obz8">
+                  <w:hyperlink w:history="1" r:id="rIdb5xlzep-xfbe6o4ylqibs">
                     <w:r>
                       <w:rPr>
                         <w:rStyle w:val="Hyperlink"/>
@@ -19620,7 +19649,7 @@
                                 </pic:cNvPicPr>
                               </pic:nvPicPr>
                               <pic:blipFill>
-                                <a:blip r:embed="rId66" cstate="none"/>
+                                <a:blip r:embed="rId67" cstate="none"/>
                                 <a:srcRect/>
                                 <a:stretch>
                                   <a:fillRect/>
@@ -19732,7 +19761,7 @@
                   </w:r>
                 </w:p>
                 <w:p>
-                  <w:hyperlink w:history="1" r:id="rIdqel6v17jj6o64yjaoqkgi">
+                  <w:hyperlink w:history="1" r:id="rIdomqjbfvy6wkkdtftrozpe">
                     <w:r>
                       <w:rPr>
                         <w:rStyle w:val="Hyperlink"/>
@@ -19859,7 +19888,7 @@
                                 </pic:cNvPicPr>
                               </pic:nvPicPr>
                               <pic:blipFill>
-                                <a:blip r:embed="rId67" cstate="none"/>
+                                <a:blip r:embed="rId68" cstate="none"/>
                                 <a:srcRect/>
                                 <a:stretch>
                                   <a:fillRect/>
@@ -19971,7 +20000,7 @@
                   </w:r>
                 </w:p>
                 <w:p>
-                  <w:hyperlink w:history="1" r:id="rId6tjoc1fkhrkmjv6qpj5qs">
+                  <w:hyperlink w:history="1" r:id="rIdapwnqfqgvgptldy3-hx2b">
                     <w:r>
                       <w:rPr>
                         <w:rStyle w:val="Hyperlink"/>
@@ -20068,7 +20097,7 @@
                                 </pic:cNvPicPr>
                               </pic:nvPicPr>
                               <pic:blipFill>
-                                <a:blip r:embed="rId68" cstate="none"/>
+                                <a:blip r:embed="rId69" cstate="none"/>
                                 <a:srcRect/>
                                 <a:stretch>
                                   <a:fillRect/>
@@ -20180,7 +20209,7 @@
                   </w:r>
                 </w:p>
                 <w:p>
-                  <w:hyperlink w:history="1" r:id="rIdrnqnh6ewlilnmbdkovhuw">
+                  <w:hyperlink w:history="1" r:id="rIdzdyfhovfmg-iac81sz4bp">
                     <w:r>
                       <w:rPr>
                         <w:rStyle w:val="Hyperlink"/>

</xml_diff>

<commit_message>
workbook: drop placeholder body + HANDOUT lead-in pages; splice on session cover
- Session covers now flow straight into content (handout PDF for Stanley/Winters,
  MY NOTES for Fahey) with no 'Coming soon' body or separate lead-in page
- splice_handouts.py now anchors on 'PRESENTED BY <speaker>' text on the session cover
- Workbook shrinks from 24 to 21 pages
</commit_message>
<xml_diff>
--- a/deliverables/workbook/Workbook.docx
+++ b/deliverables/workbook/Workbook.docx
@@ -2027,98 +2027,6 @@
       </w:r>
     </w:p>
     <w:p>
-      <w:pPr>
-        <w:spacing w:before="800"/>
-      </w:pPr>
-      <w:r>
-        <w:t xml:space="preserve"/>
-      </w:r>
-    </w:p>
-    <w:p>
-      <w:pPr>
-        <w:spacing w:after="100"/>
-        <w:jc w:val="left"/>
-      </w:pPr>
-      <w:r>
-        <w:rPr>
-          <w:rFonts w:ascii="Calibri" w:cs="Calibri" w:eastAsia="Calibri" w:hAnsi="Calibri"/>
-          <w:b/>
-          <w:bCs/>
-          <w:color w:val="E87722"/>
-          <w:sz w:val="18"/>
-          <w:szCs w:val="18"/>
-        </w:rPr>
-        <w:t xml:space="preserve">CONTENT</w:t>
-      </w:r>
-    </w:p>
-    <w:p>
-      <w:pPr>
-        <w:spacing w:after="200"/>
-        <w:jc w:val="left"/>
-      </w:pPr>
-      <w:r>
-        <w:rPr>
-          <w:rFonts w:ascii="Calibri" w:cs="Calibri" w:eastAsia="Calibri" w:hAnsi="Calibri"/>
-          <w:i/>
-          <w:iCs/>
-          <w:color w:val="5A6B82"/>
-          <w:sz w:val="22"/>
-          <w:szCs w:val="22"/>
-        </w:rPr>
-        <w:t xml:space="preserve">Coming soon — the presenter’s slides and key takeaways will be printed here.</w:t>
-      </w:r>
-    </w:p>
-    <w:p>
-      <w:r>
-        <w:br w:type="page"/>
-      </w:r>
-    </w:p>
-    <w:p>
-      <w:pPr>
-        <w:spacing w:after="120"/>
-        <w:jc w:val="left"/>
-      </w:pPr>
-      <w:r>
-        <w:rPr>
-          <w:rFonts w:ascii="Calibri" w:cs="Calibri" w:eastAsia="Calibri" w:hAnsi="Calibri"/>
-          <w:b/>
-          <w:bCs/>
-          <w:color w:val="E87722"/>
-          <w:sz w:val="16"/>
-          <w:szCs w:val="16"/>
-        </w:rPr>
-        <w:t xml:space="preserve">PROFIT POWER: STRONGER — OR JUST BIGGER? · HANDOUT</w:t>
-      </w:r>
-    </w:p>
-    <w:p>
-      <w:pPr>
-        <w:pBdr>
-          <w:bottom w:val="single" w:color="E87722" w:sz="6"/>
-        </w:pBdr>
-        <w:spacing w:after="200"/>
-        <w:jc w:val="left"/>
-      </w:pPr>
-      <w:r>
-        <w:t xml:space="preserve"/>
-      </w:r>
-    </w:p>
-    <w:p>
-      <w:pPr>
-        <w:spacing w:after="200"/>
-      </w:pPr>
-      <w:r>
-        <w:rPr>
-          <w:rFonts w:ascii="Calibri" w:cs="Calibri" w:eastAsia="Calibri" w:hAnsi="Calibri"/>
-          <w:i/>
-          <w:iCs/>
-          <w:color w:val="5A6B82"/>
-          <w:sz w:val="22"/>
-          <w:szCs w:val="22"/>
-        </w:rPr>
-        <w:t xml:space="preserve">[Content placeholder — 1 to 4 pages provided by the presenter.]</w:t>
-      </w:r>
-    </w:p>
-    <w:p>
       <w:r>
         <w:br w:type="page"/>
       </w:r>
@@ -2982,98 +2890,6 @@
       </w:r>
     </w:p>
     <w:p>
-      <w:pPr>
-        <w:spacing w:before="800"/>
-      </w:pPr>
-      <w:r>
-        <w:t xml:space="preserve"/>
-      </w:r>
-    </w:p>
-    <w:p>
-      <w:pPr>
-        <w:spacing w:after="100"/>
-        <w:jc w:val="left"/>
-      </w:pPr>
-      <w:r>
-        <w:rPr>
-          <w:rFonts w:ascii="Calibri" w:cs="Calibri" w:eastAsia="Calibri" w:hAnsi="Calibri"/>
-          <w:b/>
-          <w:bCs/>
-          <w:color w:val="E87722"/>
-          <w:sz w:val="18"/>
-          <w:szCs w:val="18"/>
-        </w:rPr>
-        <w:t xml:space="preserve">CONTENT</w:t>
-      </w:r>
-    </w:p>
-    <w:p>
-      <w:pPr>
-        <w:spacing w:after="200"/>
-        <w:jc w:val="left"/>
-      </w:pPr>
-      <w:r>
-        <w:rPr>
-          <w:rFonts w:ascii="Calibri" w:cs="Calibri" w:eastAsia="Calibri" w:hAnsi="Calibri"/>
-          <w:i/>
-          <w:iCs/>
-          <w:color w:val="5A6B82"/>
-          <w:sz w:val="22"/>
-          <w:szCs w:val="22"/>
-        </w:rPr>
-        <w:t xml:space="preserve">Coming soon — the presenter’s slides and key takeaways will be printed here.</w:t>
-      </w:r>
-    </w:p>
-    <w:p>
-      <w:r>
-        <w:br w:type="page"/>
-      </w:r>
-    </w:p>
-    <w:p>
-      <w:pPr>
-        <w:spacing w:after="120"/>
-        <w:jc w:val="left"/>
-      </w:pPr>
-      <w:r>
-        <w:rPr>
-          <w:rFonts w:ascii="Calibri" w:cs="Calibri" w:eastAsia="Calibri" w:hAnsi="Calibri"/>
-          <w:b/>
-          <w:bCs/>
-          <w:color w:val="E87722"/>
-          <w:sz w:val="16"/>
-          <w:szCs w:val="16"/>
-        </w:rPr>
-        <w:t xml:space="preserve">ROLLOUT, REWORKED: YOUR PLAN FOR RUNNING EOS® COMPANY-WIDE · HANDOUT</w:t>
-      </w:r>
-    </w:p>
-    <w:p>
-      <w:pPr>
-        <w:pBdr>
-          <w:bottom w:val="single" w:color="E87722" w:sz="6"/>
-        </w:pBdr>
-        <w:spacing w:after="200"/>
-        <w:jc w:val="left"/>
-      </w:pPr>
-      <w:r>
-        <w:t xml:space="preserve"/>
-      </w:r>
-    </w:p>
-    <w:p>
-      <w:pPr>
-        <w:spacing w:after="200"/>
-      </w:pPr>
-      <w:r>
-        <w:rPr>
-          <w:rFonts w:ascii="Calibri" w:cs="Calibri" w:eastAsia="Calibri" w:hAnsi="Calibri"/>
-          <w:i/>
-          <w:iCs/>
-          <w:color w:val="5A6B82"/>
-          <w:sz w:val="22"/>
-          <w:szCs w:val="22"/>
-        </w:rPr>
-        <w:t xml:space="preserve">[Content placeholder — 1 to 4 pages provided by the presenter.]</w:t>
-      </w:r>
-    </w:p>
-    <w:p>
       <w:r>
         <w:br w:type="page"/>
       </w:r>
@@ -3934,112 +3750,6 @@
           <w:szCs w:val="22"/>
         </w:rPr>
         <w:t xml:space="preserve">Expert EOS Implementer®</w:t>
-      </w:r>
-    </w:p>
-    <w:p>
-      <w:pPr>
-        <w:spacing w:before="800"/>
-      </w:pPr>
-      <w:r>
-        <w:t xml:space="preserve"/>
-      </w:r>
-    </w:p>
-    <w:p>
-      <w:pPr>
-        <w:spacing w:after="100"/>
-        <w:jc w:val="left"/>
-      </w:pPr>
-      <w:r>
-        <w:rPr>
-          <w:rFonts w:ascii="Calibri" w:cs="Calibri" w:eastAsia="Calibri" w:hAnsi="Calibri"/>
-          <w:b/>
-          <w:bCs/>
-          <w:color w:val="E87722"/>
-          <w:sz w:val="18"/>
-          <w:szCs w:val="18"/>
-        </w:rPr>
-        <w:t xml:space="preserve">CONTENT</w:t>
-      </w:r>
-    </w:p>
-    <w:p>
-      <w:pPr>
-        <w:spacing w:after="200"/>
-        <w:jc w:val="left"/>
-      </w:pPr>
-      <w:r>
-        <w:rPr>
-          <w:rFonts w:ascii="Calibri" w:cs="Calibri" w:eastAsia="Calibri" w:hAnsi="Calibri"/>
-          <w:i/>
-          <w:iCs/>
-          <w:color w:val="5A6B82"/>
-          <w:sz w:val="22"/>
-          <w:szCs w:val="22"/>
-        </w:rPr>
-        <w:t xml:space="preserve">Coming soon — the presenter’s slides and key takeaways will be printed here.</w:t>
-      </w:r>
-    </w:p>
-    <w:p>
-      <w:r>
-        <w:br w:type="page"/>
-      </w:r>
-    </w:p>
-    <w:p>
-      <w:pPr>
-        <w:spacing w:after="120"/>
-        <w:jc w:val="left"/>
-      </w:pPr>
-      <w:r>
-        <w:rPr>
-          <w:rFonts w:ascii="Calibri" w:cs="Calibri" w:eastAsia="Calibri" w:hAnsi="Calibri"/>
-          <w:b/>
-          <w:bCs/>
-          <w:color w:val="E87722"/>
-          <w:sz w:val="16"/>
-          <w:szCs w:val="16"/>
-        </w:rPr>
-        <w:t xml:space="preserve">THE 10 PILLARS OF VISIONARY GREATNESS · HANDOUT</w:t>
-      </w:r>
-    </w:p>
-    <w:p>
-      <w:pPr>
-        <w:pBdr>
-          <w:bottom w:val="single" w:color="E87722" w:sz="6"/>
-        </w:pBdr>
-        <w:spacing w:after="200"/>
-        <w:jc w:val="left"/>
-      </w:pPr>
-      <w:r>
-        <w:t xml:space="preserve"/>
-      </w:r>
-    </w:p>
-    <w:p>
-      <w:pPr>
-        <w:spacing w:after="240"/>
-      </w:pPr>
-      <w:r>
-        <w:rPr>
-          <w:rFonts w:ascii="Calibri" w:cs="Calibri" w:eastAsia="Calibri" w:hAnsi="Calibri"/>
-          <w:color w:val="1A1A1A"/>
-          <w:sz w:val="22"/>
-          <w:szCs w:val="22"/>
-        </w:rPr>
-        <w:t xml:space="preserve">The 10 Pillars of Visionary Greatness — full framework grid and Visionary book overview from Mark C. Winters.</w:t>
-      </w:r>
-    </w:p>
-    <w:p>
-      <w:pPr>
-        <w:spacing w:after="120"/>
-      </w:pPr>
-      <w:r>
-        <w:rPr>
-          <w:rFonts w:ascii="Calibri" w:cs="Calibri" w:eastAsia="Calibri" w:hAnsi="Calibri"/>
-          <w:i/>
-          <w:iCs/>
-          <w:color w:val="5A6B82"/>
-          <w:sz w:val="20"/>
-          <w:szCs w:val="20"/>
-        </w:rPr>
-        <w:t xml:space="preserve">The next 2 pages are the presenter’s handout, printed at full size. Turn the workbook sideways for the framework grid.</w:t>
       </w:r>
     </w:p>
     <w:p>
@@ -5505,7 +5215,7 @@
               <w:spacing w:after="80"/>
               <w:jc w:val="center"/>
             </w:pPr>
-            <w:hyperlink w:history="1" r:id="rIdhzzukkuvnqbj4gknym94y">
+            <w:hyperlink w:history="1" r:id="rIdwppy355fuex8nx96stp_x">
               <w:r>
                 <w:rPr>
                   <w:rStyle w:val="Hyperlink"/>
@@ -5605,7 +5315,7 @@
               <w:spacing w:after="80"/>
               <w:jc w:val="center"/>
             </w:pPr>
-            <w:hyperlink w:history="1" r:id="rIdnkbxq5rons0h16pjwulfv">
+            <w:hyperlink w:history="1" r:id="rIdbf463igtow61nmqftesea">
               <w:r>
                 <w:rPr>
                   <w:rStyle w:val="Hyperlink"/>
@@ -5762,7 +5472,7 @@
               <w:spacing w:after="80"/>
               <w:jc w:val="center"/>
             </w:pPr>
-            <w:hyperlink w:history="1" r:id="rId65-xhukl9pysy29mwjosk">
+            <w:hyperlink w:history="1" r:id="rIdz2g7kkn80rgu2byf92nsa">
               <w:r>
                 <w:rPr>
                   <w:rStyle w:val="Hyperlink"/>
@@ -5862,7 +5572,7 @@
               <w:spacing w:after="80"/>
               <w:jc w:val="center"/>
             </w:pPr>
-            <w:hyperlink w:history="1" r:id="rId-mmusxtrqpczxzqq5s7kj">
+            <w:hyperlink w:history="1" r:id="rId3odrix_7y7x4e1zuxekxf">
               <w:r>
                 <w:rPr>
                   <w:rStyle w:val="Hyperlink"/>
@@ -6018,7 +5728,7 @@
               <w:spacing w:after="80"/>
               <w:jc w:val="center"/>
             </w:pPr>
-            <w:hyperlink w:history="1" r:id="rIdctzmsak5akqb6fw3xoprb">
+            <w:hyperlink w:history="1" r:id="rIdik9brnxka1emqy7jto6ud">
               <w:r>
                 <w:rPr>
                   <w:rStyle w:val="Hyperlink"/>
@@ -6174,7 +5884,7 @@
               <w:spacing w:after="80"/>
               <w:jc w:val="center"/>
             </w:pPr>
-            <w:hyperlink w:history="1" r:id="rIdwima4ksibfnk4ryzisjol">
+            <w:hyperlink w:history="1" r:id="rIdkaqngxquqh_6ar0vlgy9g">
               <w:r>
                 <w:rPr>
                   <w:rStyle w:val="Hyperlink"/>
@@ -6331,7 +6041,7 @@
               <w:spacing w:after="80"/>
               <w:jc w:val="center"/>
             </w:pPr>
-            <w:hyperlink w:history="1" r:id="rIddqcde162pezmgf0oc3nxb">
+            <w:hyperlink w:history="1" r:id="rIdtxqruttkfqv9ijoqrqlez">
               <w:r>
                 <w:rPr>
                   <w:rStyle w:val="Hyperlink"/>
@@ -6431,7 +6141,7 @@
               <w:spacing w:after="80"/>
               <w:jc w:val="center"/>
             </w:pPr>
-            <w:hyperlink w:history="1" r:id="rIdc_hox_1nyyxbllumzoyks">
+            <w:hyperlink w:history="1" r:id="rIdpqklnt_prfn-461k6n5cn">
               <w:r>
                 <w:rPr>
                   <w:rStyle w:val="Hyperlink"/>
@@ -6590,7 +6300,7 @@
               <w:spacing w:after="80"/>
               <w:jc w:val="center"/>
             </w:pPr>
-            <w:hyperlink w:history="1" r:id="rIdftbcc8syr_xbm6kc4qj69">
+            <w:hyperlink w:history="1" r:id="rIduzu6lcbklzxeaflaqpavh">
               <w:r>
                 <w:rPr>
                   <w:rStyle w:val="Hyperlink"/>
@@ -6690,7 +6400,7 @@
               <w:spacing w:after="80"/>
               <w:jc w:val="center"/>
             </w:pPr>
-            <w:hyperlink w:history="1" r:id="rIdsu7abzbu0gtflg9wgks82">
+            <w:hyperlink w:history="1" r:id="rId7d67bg9vqgzb_ozxysugc">
               <w:r>
                 <w:rPr>
                   <w:rStyle w:val="Hyperlink"/>
@@ -6790,7 +6500,7 @@
               <w:spacing w:after="80"/>
               <w:jc w:val="center"/>
             </w:pPr>
-            <w:hyperlink w:history="1" r:id="rIdxfue8qnqofroftuuifvze">
+            <w:hyperlink w:history="1" r:id="rIdleuz3joujjhgz_x0uchzl">
               <w:r>
                 <w:rPr>
                   <w:rStyle w:val="Hyperlink"/>
@@ -6890,7 +6600,7 @@
               <w:spacing w:after="80"/>
               <w:jc w:val="center"/>
             </w:pPr>
-            <w:hyperlink w:history="1" r:id="rIdwsxotl5hqbd03sorduogm">
+            <w:hyperlink w:history="1" r:id="rIdg4qzax_j_wgedeioibn2z">
               <w:r>
                 <w:rPr>
                   <w:rStyle w:val="Hyperlink"/>
@@ -7022,7 +6732,7 @@
               <w:spacing w:after="80"/>
               <w:jc w:val="center"/>
             </w:pPr>
-            <w:hyperlink w:history="1" r:id="rId8p9m0snrhrbdncz_apcwi">
+            <w:hyperlink w:history="1" r:id="rIdrc0opodsl3z0ubkgbjsyr">
               <w:r>
                 <w:rPr>
                   <w:rStyle w:val="Hyperlink"/>
@@ -7122,7 +6832,7 @@
               <w:spacing w:after="80"/>
               <w:jc w:val="center"/>
             </w:pPr>
-            <w:hyperlink w:history="1" r:id="rIdoqoramkcnbyfr0k3zcltr">
+            <w:hyperlink w:history="1" r:id="rIdow6lsljkrhuzukgqhsenp">
               <w:r>
                 <w:rPr>
                   <w:rStyle w:val="Hyperlink"/>
@@ -7222,7 +6932,7 @@
               <w:spacing w:after="80"/>
               <w:jc w:val="center"/>
             </w:pPr>
-            <w:hyperlink w:history="1" r:id="rIdierxxb7gtl75onj5n_hxa">
+            <w:hyperlink w:history="1" r:id="rIdvlc20mklujrei0ot_4dfi">
               <w:r>
                 <w:rPr>
                   <w:rStyle w:val="Hyperlink"/>
@@ -7322,7 +7032,7 @@
               <w:spacing w:after="80"/>
               <w:jc w:val="center"/>
             </w:pPr>
-            <w:hyperlink w:history="1" r:id="rId5sqeuodqblniq9jdlgqlk">
+            <w:hyperlink w:history="1" r:id="rIdwo3gqpmfi1u_5laebekus">
               <w:r>
                 <w:rPr>
                   <w:rStyle w:val="Hyperlink"/>
@@ -7622,7 +7332,7 @@
                   </w:r>
                 </w:p>
                 <w:p>
-                  <w:hyperlink w:history="1" r:id="rIdzg7zeu8ppnf0p4ifcvcab">
+                  <w:hyperlink w:history="1" r:id="rIdrhxzqr9otawvjuhxacw-o">
                     <w:r>
                       <w:rPr>
                         <w:rStyle w:val="Hyperlink"/>
@@ -7831,7 +7541,7 @@
                   </w:r>
                 </w:p>
                 <w:p>
-                  <w:hyperlink w:history="1" r:id="rId44nqvqxt-6wdeofusn62s">
+                  <w:hyperlink w:history="1" r:id="rIdfuw-_q5-gdwhabksg2kol">
                     <w:r>
                       <w:rPr>
                         <w:rStyle w:val="Hyperlink"/>
@@ -8070,7 +7780,7 @@
                   </w:r>
                 </w:p>
                 <w:p>
-                  <w:hyperlink w:history="1" r:id="rIdhodta8odgomadddpcycie">
+                  <w:hyperlink w:history="1" r:id="rIddglnhphfkyqbt2vy-5k1x">
                     <w:r>
                       <w:rPr>
                         <w:rStyle w:val="Hyperlink"/>
@@ -8279,7 +7989,7 @@
                   </w:r>
                 </w:p>
                 <w:p>
-                  <w:hyperlink w:history="1" r:id="rIdoffecglofrqrgc55b54jk">
+                  <w:hyperlink w:history="1" r:id="rIdykccvjlf42mdqtoega7-5">
                     <w:r>
                       <w:rPr>
                         <w:rStyle w:val="Hyperlink"/>
@@ -8518,7 +8228,7 @@
                   </w:r>
                 </w:p>
                 <w:p>
-                  <w:hyperlink w:history="1" r:id="rIdehvs41i5piqvnxfqwxnb9">
+                  <w:hyperlink w:history="1" r:id="rIduauct7hkzog2bdlqskp25">
                     <w:r>
                       <w:rPr>
                         <w:rStyle w:val="Hyperlink"/>
@@ -8727,7 +8437,7 @@
                   </w:r>
                 </w:p>
                 <w:p>
-                  <w:hyperlink w:history="1" r:id="rId7omhzaacwwx0wojdbps4j">
+                  <w:hyperlink w:history="1" r:id="rIdhdvoyf82s0zcofzktmcad">
                     <w:r>
                       <w:rPr>
                         <w:rStyle w:val="Hyperlink"/>
@@ -9161,7 +8871,7 @@
                   </w:r>
                 </w:p>
                 <w:p>
-                  <w:hyperlink w:history="1" r:id="rId_8utlzhulos_xjkdozoyz">
+                  <w:hyperlink w:history="1" r:id="rId9dpkob37zqiphwhshpj1o">
                     <w:r>
                       <w:rPr>
                         <w:rStyle w:val="Hyperlink"/>
@@ -9400,7 +9110,7 @@
                   </w:r>
                 </w:p>
                 <w:p>
-                  <w:hyperlink w:history="1" r:id="rIdmh7omrlgfshw7ugyihmz7">
+                  <w:hyperlink w:history="1" r:id="rId1foxhtbub2llupfsbqdzn">
                     <w:r>
                       <w:rPr>
                         <w:rStyle w:val="Hyperlink"/>
@@ -9609,7 +9319,7 @@
                   </w:r>
                 </w:p>
                 <w:p>
-                  <w:hyperlink w:history="1" r:id="rIdusb58ccmtkp-p619-yyki">
+                  <w:hyperlink w:history="1" r:id="rIdpjnidddkfnfgehkcsx7wm">
                     <w:r>
                       <w:rPr>
                         <w:rStyle w:val="Hyperlink"/>
@@ -9848,7 +9558,7 @@
                   </w:r>
                 </w:p>
                 <w:p>
-                  <w:hyperlink w:history="1" r:id="rId8zittppn-hlp9c0eq9_xe">
+                  <w:hyperlink w:history="1" r:id="rId1hzgrygkuhcy07qbirylj">
                     <w:r>
                       <w:rPr>
                         <w:rStyle w:val="Hyperlink"/>
@@ -10057,7 +9767,7 @@
                   </w:r>
                 </w:p>
                 <w:p>
-                  <w:hyperlink w:history="1" r:id="rIdt9cxwl9cgp80px7dpfpw1">
+                  <w:hyperlink w:history="1" r:id="rId23p6xcpohsfqtdix1jcqi">
                     <w:r>
                       <w:rPr>
                         <w:rStyle w:val="Hyperlink"/>
@@ -10296,7 +10006,7 @@
                   </w:r>
                 </w:p>
                 <w:p>
-                  <w:hyperlink w:history="1" r:id="rId6lrx-lfagho9patd1s64v">
+                  <w:hyperlink w:history="1" r:id="rIdf2fjw1pclyq2ydh1s9zkw">
                     <w:r>
                       <w:rPr>
                         <w:rStyle w:val="Hyperlink"/>
@@ -10505,7 +10215,7 @@
                   </w:r>
                 </w:p>
                 <w:p>
-                  <w:hyperlink w:history="1" r:id="rIdvr3b9bxmrvyqisyyrb_l0">
+                  <w:hyperlink w:history="1" r:id="rIda4ttv87qjdr0bsjtbq7og">
                     <w:r>
                       <w:rPr>
                         <w:rStyle w:val="Hyperlink"/>
@@ -10769,7 +10479,7 @@
                   </w:r>
                 </w:p>
                 <w:p>
-                  <w:hyperlink w:history="1" r:id="rIdtd3cclj7g9myotc2zut2d">
+                  <w:hyperlink w:history="1" r:id="rIdu_bfmy8cxz_opkrvd_7d9">
                     <w:r>
                       <w:rPr>
                         <w:rStyle w:val="Hyperlink"/>
@@ -11003,7 +10713,7 @@
                   </w:r>
                 </w:p>
                 <w:p>
-                  <w:hyperlink w:history="1" r:id="rId2bz46j1cpxilmwosfoif3">
+                  <w:hyperlink w:history="1" r:id="rIdfuvbmfw48izmjunr8z3zu">
                     <w:r>
                       <w:rPr>
                         <w:rStyle w:val="Hyperlink"/>
@@ -11242,7 +10952,7 @@
                   </w:r>
                 </w:p>
                 <w:p>
-                  <w:hyperlink w:history="1" r:id="rIdra4un3cxc5dhuq7jyicwd">
+                  <w:hyperlink w:history="1" r:id="rIdva1r9u9mkk8d6ah7dk8tp">
                     <w:r>
                       <w:rPr>
                         <w:rStyle w:val="Hyperlink"/>
@@ -11451,7 +11161,7 @@
                   </w:r>
                 </w:p>
                 <w:p>
-                  <w:hyperlink w:history="1" r:id="rIdbyt3p5yiznayc7yxe8lna">
+                  <w:hyperlink w:history="1" r:id="rIdxmmu1laoppbykgalybs-y">
                     <w:r>
                       <w:rPr>
                         <w:rStyle w:val="Hyperlink"/>
@@ -11690,7 +11400,7 @@
                   </w:r>
                 </w:p>
                 <w:p>
-                  <w:hyperlink w:history="1" r:id="rIdwfevn3yqor92zizlvhwkv">
+                  <w:hyperlink w:history="1" r:id="rIdcwjoflgcp13gjmh8r96ss">
                     <w:r>
                       <w:rPr>
                         <w:rStyle w:val="Hyperlink"/>
@@ -11899,7 +11609,7 @@
                   </w:r>
                 </w:p>
                 <w:p>
-                  <w:hyperlink w:history="1" r:id="rIds5col1zldzlqjyrtuscyr">
+                  <w:hyperlink w:history="1" r:id="rIdzgew5aoqti7pstuit-alb">
                     <w:r>
                       <w:rPr>
                         <w:rStyle w:val="Hyperlink"/>
@@ -12138,7 +11848,7 @@
                   </w:r>
                 </w:p>
                 <w:p>
-                  <w:hyperlink w:history="1" r:id="rIdezbyv4cf9y5vncaldmyqe">
+                  <w:hyperlink w:history="1" r:id="rIdfsycydthdo4-cxay4e2o-">
                     <w:r>
                       <w:rPr>
                         <w:rStyle w:val="Hyperlink"/>
@@ -12347,7 +12057,7 @@
                   </w:r>
                 </w:p>
                 <w:p>
-                  <w:hyperlink w:history="1" r:id="rIdavax_tiazeaoxzaxvmmnk">
+                  <w:hyperlink w:history="1" r:id="rIdtsvwxjy3z7qhhbnvzp2g8">
                     <w:r>
                       <w:rPr>
                         <w:rStyle w:val="Hyperlink"/>
@@ -12586,7 +12296,7 @@
                   </w:r>
                 </w:p>
                 <w:p>
-                  <w:hyperlink w:history="1" r:id="rId6j-go3yri1wbo3i664bsw">
+                  <w:hyperlink w:history="1" r:id="rIdpd28fhnc7jpfakfkhn1by">
                     <w:r>
                       <w:rPr>
                         <w:rStyle w:val="Hyperlink"/>
@@ -12820,7 +12530,7 @@
                   </w:r>
                 </w:p>
                 <w:p>
-                  <w:hyperlink w:history="1" r:id="rIdbqqcm495spaybqlyjgx-c">
+                  <w:hyperlink w:history="1" r:id="rIdvyyksqaxgvtr9ohh07jfv">
                     <w:r>
                       <w:rPr>
                         <w:rStyle w:val="Hyperlink"/>
@@ -13084,7 +12794,7 @@
                   </w:r>
                 </w:p>
                 <w:p>
-                  <w:hyperlink w:history="1" r:id="rIdsaxcp4vnub727eszwvi5q">
+                  <w:hyperlink w:history="1" r:id="rIdeco1v14t92mt427wbplx7">
                     <w:r>
                       <w:rPr>
                         <w:rStyle w:val="Hyperlink"/>
@@ -13293,7 +13003,7 @@
                   </w:r>
                 </w:p>
                 <w:p>
-                  <w:hyperlink w:history="1" r:id="rIdh5nx5_93ocyv3ag7lqset">
+                  <w:hyperlink w:history="1" r:id="rIdcxmxi5fdi8fnfcuncjkze">
                     <w:r>
                       <w:rPr>
                         <w:rStyle w:val="Hyperlink"/>
@@ -13532,7 +13242,7 @@
                   </w:r>
                 </w:p>
                 <w:p>
-                  <w:hyperlink w:history="1" r:id="rIdlpbmzvg1ayjxvaibifu08">
+                  <w:hyperlink w:history="1" r:id="rIdq1zzyvhiiboefg7iycd6i">
                     <w:r>
                       <w:rPr>
                         <w:rStyle w:val="Hyperlink"/>
@@ -13741,7 +13451,7 @@
                   </w:r>
                 </w:p>
                 <w:p>
-                  <w:hyperlink w:history="1" r:id="rIdrix3wpfixbp2umcyvqarf">
+                  <w:hyperlink w:history="1" r:id="rIdl2rnrzspmxgcllbeqepj5">
                     <w:r>
                       <w:rPr>
                         <w:rStyle w:val="Hyperlink"/>
@@ -13980,7 +13690,7 @@
                   </w:r>
                 </w:p>
                 <w:p>
-                  <w:hyperlink w:history="1" r:id="rIdd1ev0lrvyxwfuzn7jigfg">
+                  <w:hyperlink w:history="1" r:id="rIdv1tfwoxxq_tewhjfkx6zg">
                     <w:r>
                       <w:rPr>
                         <w:rStyle w:val="Hyperlink"/>
@@ -14189,7 +13899,7 @@
                   </w:r>
                 </w:p>
                 <w:p>
-                  <w:hyperlink w:history="1" r:id="rIdqbo7ssmg6whfzf5csqa-a">
+                  <w:hyperlink w:history="1" r:id="rId6wop37h69ns6rblluq4y9">
                     <w:r>
                       <w:rPr>
                         <w:rStyle w:val="Hyperlink"/>
@@ -14428,7 +14138,7 @@
                   </w:r>
                 </w:p>
                 <w:p>
-                  <w:hyperlink w:history="1" r:id="rIddrijq2wmw8sr_m_fogju8">
+                  <w:hyperlink w:history="1" r:id="rIdkz2smcyydiubrhnxddzxf">
                     <w:r>
                       <w:rPr>
                         <w:rStyle w:val="Hyperlink"/>
@@ -14637,7 +14347,7 @@
                   </w:r>
                 </w:p>
                 <w:p>
-                  <w:hyperlink w:history="1" r:id="rIdvwr0rl_g571m_mjyfn6_t">
+                  <w:hyperlink w:history="1" r:id="rIdmvipulkf-hth61qbnev6h">
                     <w:r>
                       <w:rPr>
                         <w:rStyle w:val="Hyperlink"/>
@@ -14876,7 +14586,7 @@
                   </w:r>
                 </w:p>
                 <w:p>
-                  <w:hyperlink w:history="1" r:id="rIdpc5c9rjokgwv6duyzslps">
+                  <w:hyperlink w:history="1" r:id="rId4zxnwyxpbocgwsgvp1wre">
                     <w:r>
                       <w:rPr>
                         <w:rStyle w:val="Hyperlink"/>
@@ -15085,7 +14795,7 @@
                   </w:r>
                 </w:p>
                 <w:p>
-                  <w:hyperlink w:history="1" r:id="rIdut0pvvbkjm968apg1zq5w">
+                  <w:hyperlink w:history="1" r:id="rId3ihrkmar1pdmuy7trdi3z">
                     <w:r>
                       <w:rPr>
                         <w:rStyle w:val="Hyperlink"/>
@@ -15324,7 +15034,7 @@
                   </w:r>
                 </w:p>
                 <w:p>
-                  <w:hyperlink w:history="1" r:id="rIduanee_gbu1efxhyhnjkbk">
+                  <w:hyperlink w:history="1" r:id="rIdifoiop7zv0skcza8swf-0">
                     <w:r>
                       <w:rPr>
                         <w:rStyle w:val="Hyperlink"/>
@@ -15558,7 +15268,7 @@
                   </w:r>
                 </w:p>
                 <w:p>
-                  <w:hyperlink w:history="1" r:id="rIdbginp6gyfle8zkedi0tcf">
+                  <w:hyperlink w:history="1" r:id="rIdfyalsrsc6pbltaih_x6cc">
                     <w:r>
                       <w:rPr>
                         <w:rStyle w:val="Hyperlink"/>
@@ -15797,7 +15507,7 @@
                   </w:r>
                 </w:p>
                 <w:p>
-                  <w:hyperlink w:history="1" r:id="rIdae98lkx4pycivcwqpbrcp">
+                  <w:hyperlink w:history="1" r:id="rIdqyomhx3mmxkda070zfb47">
                     <w:r>
                       <w:rPr>
                         <w:rStyle w:val="Hyperlink"/>
@@ -16006,7 +15716,7 @@
                   </w:r>
                 </w:p>
                 <w:p>
-                  <w:hyperlink w:history="1" r:id="rIdk3oyijs6iopo1uqgdhq0a">
+                  <w:hyperlink w:history="1" r:id="rIdwoolbxeg41d4jnbpnvlwb">
                     <w:r>
                       <w:rPr>
                         <w:rStyle w:val="Hyperlink"/>
@@ -16245,7 +15955,7 @@
                   </w:r>
                 </w:p>
                 <w:p>
-                  <w:hyperlink w:history="1" r:id="rIdzyjbuqhvuwvotm9-tsydb">
+                  <w:hyperlink w:history="1" r:id="rIdk8zwbfopwtwivkh8o9fv8">
                     <w:r>
                       <w:rPr>
                         <w:rStyle w:val="Hyperlink"/>
@@ -16454,7 +16164,7 @@
                   </w:r>
                 </w:p>
                 <w:p>
-                  <w:hyperlink w:history="1" r:id="rId5smqnoju9kt0hibibejui">
+                  <w:hyperlink w:history="1" r:id="rId_pv0-76z9xjwdr6p4qikr">
                     <w:r>
                       <w:rPr>
                         <w:rStyle w:val="Hyperlink"/>
@@ -16613,51 +16323,8 @@
 <file path=word/footer1.xml><?xml version="1.0" encoding="utf-8"?>
 <w:ftr xmlns:wpc="http://schemas.microsoft.com/office/word/2010/wordprocessingCanvas" xmlns:mc="http://schemas.openxmlformats.org/markup-compatibility/2006" xmlns:o="urn:schemas-microsoft-com:office:office" xmlns:r="http://schemas.openxmlformats.org/officeDocument/2006/relationships" xmlns:m="http://schemas.openxmlformats.org/officeDocument/2006/math" xmlns:v="urn:schemas-microsoft-com:vml" xmlns:wp14="http://schemas.microsoft.com/office/word/2010/wordprocessingDrawing" xmlns:wp="http://schemas.openxmlformats.org/drawingml/2006/wordprocessingDrawing" xmlns:w10="urn:schemas-microsoft-com:office:word" xmlns:w="http://schemas.openxmlformats.org/wordprocessingml/2006/main" xmlns:w14="http://schemas.microsoft.com/office/word/2010/wordml" xmlns:w15="http://schemas.microsoft.com/office/word/2012/wordml" xmlns:wpg="http://schemas.microsoft.com/office/word/2010/wordprocessingGroup" xmlns:wpi="http://schemas.microsoft.com/office/word/2010/wordprocessingInk" xmlns:wne="http://schemas.microsoft.com/office/word/2006/wordml" xmlns:wps="http://schemas.microsoft.com/office/word/2010/wordprocessingShape">
   <w:p>
-    <w:pPr>
-      <w:spacing w:before="100"/>
-      <w:jc w:val="center"/>
-    </w:pPr>
     <w:r>
-      <w:rPr>
-        <w:rFonts w:ascii="Calibri" w:cs="Calibri" w:eastAsia="Calibri" w:hAnsi="Calibri"/>
-        <w:color w:val="5A6B82"/>
-        <w:sz w:val="16"/>
-        <w:szCs w:val="16"/>
-      </w:rPr>
-      <w:t xml:space="preserve">Page </w:t>
-    </w:r>
-    <w:r>
-      <w:rPr>
-        <w:rFonts w:ascii="Calibri" w:cs="Calibri" w:eastAsia="Calibri" w:hAnsi="Calibri"/>
-        <w:color w:val="5A6B82"/>
-        <w:sz w:val="16"/>
-        <w:szCs w:val="16"/>
-      </w:rPr>
-      <w:fldChar w:fldCharType="begin"/>
-      <w:instrText xml:space="preserve">PAGE</w:instrText>
-      <w:fldChar w:fldCharType="separate"/>
-      <w:fldChar w:fldCharType="end"/>
-    </w:r>
-    <w:r>
-      <w:rPr>
-        <w:rFonts w:ascii="Calibri" w:cs="Calibri" w:eastAsia="Calibri" w:hAnsi="Calibri"/>
-        <w:color w:val="5A6B82"/>
-        <w:sz w:val="16"/>
-        <w:szCs w:val="16"/>
-      </w:rPr>
-      <w:t xml:space="preserve"> of </w:t>
-    </w:r>
-    <w:r>
-      <w:rPr>
-        <w:rFonts w:ascii="Calibri" w:cs="Calibri" w:eastAsia="Calibri" w:hAnsi="Calibri"/>
-        <w:color w:val="5A6B82"/>
-        <w:sz w:val="16"/>
-        <w:szCs w:val="16"/>
-      </w:rPr>
-      <w:fldChar w:fldCharType="begin"/>
-      <w:instrText xml:space="preserve">NUMPAGES</w:instrText>
-      <w:fldChar w:fldCharType="separate"/>
-      <w:fldChar w:fldCharType="end"/>
+      <w:t xml:space="preserve"/>
     </w:r>
   </w:p>
 </w:ftr>

</xml_diff>

<commit_message>
workbook: add Beth Fahey Rollout handout (3 pages)
Splice Rollout Tips (2 pages) + Rollout Tracker (1 page) after Fahey's
session cover. All portrait, no rotation needed. Workbook now 24 pages.
</commit_message>
<xml_diff>
--- a/deliverables/workbook/Workbook.docx
+++ b/deliverables/workbook/Workbook.docx
@@ -5215,7 +5215,7 @@
               <w:spacing w:after="80"/>
               <w:jc w:val="center"/>
             </w:pPr>
-            <w:hyperlink w:history="1" r:id="rIdwppy355fuex8nx96stp_x">
+            <w:hyperlink w:history="1" r:id="rIdilia6v1gwqb4t-jetiyfv">
               <w:r>
                 <w:rPr>
                   <w:rStyle w:val="Hyperlink"/>
@@ -5315,7 +5315,7 @@
               <w:spacing w:after="80"/>
               <w:jc w:val="center"/>
             </w:pPr>
-            <w:hyperlink w:history="1" r:id="rIdbf463igtow61nmqftesea">
+            <w:hyperlink w:history="1" r:id="rIdjqgcbynulz1ujaq-0m0pd">
               <w:r>
                 <w:rPr>
                   <w:rStyle w:val="Hyperlink"/>
@@ -5472,7 +5472,7 @@
               <w:spacing w:after="80"/>
               <w:jc w:val="center"/>
             </w:pPr>
-            <w:hyperlink w:history="1" r:id="rIdz2g7kkn80rgu2byf92nsa">
+            <w:hyperlink w:history="1" r:id="rIdkamsel7ldt4sfl-rzpsva">
               <w:r>
                 <w:rPr>
                   <w:rStyle w:val="Hyperlink"/>
@@ -5572,7 +5572,7 @@
               <w:spacing w:after="80"/>
               <w:jc w:val="center"/>
             </w:pPr>
-            <w:hyperlink w:history="1" r:id="rId3odrix_7y7x4e1zuxekxf">
+            <w:hyperlink w:history="1" r:id="rIdz-xa78twgurctz0otfeuy">
               <w:r>
                 <w:rPr>
                   <w:rStyle w:val="Hyperlink"/>
@@ -5728,7 +5728,7 @@
               <w:spacing w:after="80"/>
               <w:jc w:val="center"/>
             </w:pPr>
-            <w:hyperlink w:history="1" r:id="rIdik9brnxka1emqy7jto6ud">
+            <w:hyperlink w:history="1" r:id="rIdli9clnbrnsooykhidh4hy">
               <w:r>
                 <w:rPr>
                   <w:rStyle w:val="Hyperlink"/>
@@ -5884,7 +5884,7 @@
               <w:spacing w:after="80"/>
               <w:jc w:val="center"/>
             </w:pPr>
-            <w:hyperlink w:history="1" r:id="rIdkaqngxquqh_6ar0vlgy9g">
+            <w:hyperlink w:history="1" r:id="rIdqxnl6ctpo-mym7qf06nqf">
               <w:r>
                 <w:rPr>
                   <w:rStyle w:val="Hyperlink"/>
@@ -6041,7 +6041,7 @@
               <w:spacing w:after="80"/>
               <w:jc w:val="center"/>
             </w:pPr>
-            <w:hyperlink w:history="1" r:id="rIdtxqruttkfqv9ijoqrqlez">
+            <w:hyperlink w:history="1" r:id="rId15qirmswkhea5fmnp-oq3">
               <w:r>
                 <w:rPr>
                   <w:rStyle w:val="Hyperlink"/>
@@ -6141,7 +6141,7 @@
               <w:spacing w:after="80"/>
               <w:jc w:val="center"/>
             </w:pPr>
-            <w:hyperlink w:history="1" r:id="rIdpqklnt_prfn-461k6n5cn">
+            <w:hyperlink w:history="1" r:id="rIdfqth8wuuynflywqug8brv">
               <w:r>
                 <w:rPr>
                   <w:rStyle w:val="Hyperlink"/>
@@ -6300,7 +6300,7 @@
               <w:spacing w:after="80"/>
               <w:jc w:val="center"/>
             </w:pPr>
-            <w:hyperlink w:history="1" r:id="rIduzu6lcbklzxeaflaqpavh">
+            <w:hyperlink w:history="1" r:id="rIdhzthljnkgmwj3f4nbof1s">
               <w:r>
                 <w:rPr>
                   <w:rStyle w:val="Hyperlink"/>
@@ -6400,7 +6400,7 @@
               <w:spacing w:after="80"/>
               <w:jc w:val="center"/>
             </w:pPr>
-            <w:hyperlink w:history="1" r:id="rId7d67bg9vqgzb_ozxysugc">
+            <w:hyperlink w:history="1" r:id="rIdbg0fragujvsxtmoi8qfpx">
               <w:r>
                 <w:rPr>
                   <w:rStyle w:val="Hyperlink"/>
@@ -6500,7 +6500,7 @@
               <w:spacing w:after="80"/>
               <w:jc w:val="center"/>
             </w:pPr>
-            <w:hyperlink w:history="1" r:id="rIdleuz3joujjhgz_x0uchzl">
+            <w:hyperlink w:history="1" r:id="rIdedljha3jjbhfpsflgps_e">
               <w:r>
                 <w:rPr>
                   <w:rStyle w:val="Hyperlink"/>
@@ -6600,7 +6600,7 @@
               <w:spacing w:after="80"/>
               <w:jc w:val="center"/>
             </w:pPr>
-            <w:hyperlink w:history="1" r:id="rIdg4qzax_j_wgedeioibn2z">
+            <w:hyperlink w:history="1" r:id="rIdy0njxdls4m5tuq3pfh7df">
               <w:r>
                 <w:rPr>
                   <w:rStyle w:val="Hyperlink"/>
@@ -6732,7 +6732,7 @@
               <w:spacing w:after="80"/>
               <w:jc w:val="center"/>
             </w:pPr>
-            <w:hyperlink w:history="1" r:id="rIdrc0opodsl3z0ubkgbjsyr">
+            <w:hyperlink w:history="1" r:id="rIdc8d7isiz8arqse6bxqy3q">
               <w:r>
                 <w:rPr>
                   <w:rStyle w:val="Hyperlink"/>
@@ -6832,7 +6832,7 @@
               <w:spacing w:after="80"/>
               <w:jc w:val="center"/>
             </w:pPr>
-            <w:hyperlink w:history="1" r:id="rIdow6lsljkrhuzukgqhsenp">
+            <w:hyperlink w:history="1" r:id="rId5y6gqftjsbi7a3ke7725a">
               <w:r>
                 <w:rPr>
                   <w:rStyle w:val="Hyperlink"/>
@@ -6932,7 +6932,7 @@
               <w:spacing w:after="80"/>
               <w:jc w:val="center"/>
             </w:pPr>
-            <w:hyperlink w:history="1" r:id="rIdvlc20mklujrei0ot_4dfi">
+            <w:hyperlink w:history="1" r:id="rIdggfecpumk85ety77m144u">
               <w:r>
                 <w:rPr>
                   <w:rStyle w:val="Hyperlink"/>
@@ -7032,7 +7032,7 @@
               <w:spacing w:after="80"/>
               <w:jc w:val="center"/>
             </w:pPr>
-            <w:hyperlink w:history="1" r:id="rIdwo3gqpmfi1u_5laebekus">
+            <w:hyperlink w:history="1" r:id="rIdlgafjw1tftc80o-n0frhd">
               <w:r>
                 <w:rPr>
                   <w:rStyle w:val="Hyperlink"/>
@@ -7332,7 +7332,7 @@
                   </w:r>
                 </w:p>
                 <w:p>
-                  <w:hyperlink w:history="1" r:id="rIdrhxzqr9otawvjuhxacw-o">
+                  <w:hyperlink w:history="1" r:id="rIdnegj5mdqltvm7fl3z3dqa">
                     <w:r>
                       <w:rPr>
                         <w:rStyle w:val="Hyperlink"/>
@@ -7541,7 +7541,7 @@
                   </w:r>
                 </w:p>
                 <w:p>
-                  <w:hyperlink w:history="1" r:id="rIdfuw-_q5-gdwhabksg2kol">
+                  <w:hyperlink w:history="1" r:id="rIduayctqp7iq8bxmqwjthmw">
                     <w:r>
                       <w:rPr>
                         <w:rStyle w:val="Hyperlink"/>
@@ -7780,7 +7780,7 @@
                   </w:r>
                 </w:p>
                 <w:p>
-                  <w:hyperlink w:history="1" r:id="rIddglnhphfkyqbt2vy-5k1x">
+                  <w:hyperlink w:history="1" r:id="rIdqwpjwzorcyt05n_lja_vy">
                     <w:r>
                       <w:rPr>
                         <w:rStyle w:val="Hyperlink"/>
@@ -7989,7 +7989,7 @@
                   </w:r>
                 </w:p>
                 <w:p>
-                  <w:hyperlink w:history="1" r:id="rIdykccvjlf42mdqtoega7-5">
+                  <w:hyperlink w:history="1" r:id="rId8uusals8wcfvugugik0wj">
                     <w:r>
                       <w:rPr>
                         <w:rStyle w:val="Hyperlink"/>
@@ -8228,7 +8228,7 @@
                   </w:r>
                 </w:p>
                 <w:p>
-                  <w:hyperlink w:history="1" r:id="rIduauct7hkzog2bdlqskp25">
+                  <w:hyperlink w:history="1" r:id="rIdcydgqky0diswg9n2pt-ih">
                     <w:r>
                       <w:rPr>
                         <w:rStyle w:val="Hyperlink"/>
@@ -8437,7 +8437,7 @@
                   </w:r>
                 </w:p>
                 <w:p>
-                  <w:hyperlink w:history="1" r:id="rIdhdvoyf82s0zcofzktmcad">
+                  <w:hyperlink w:history="1" r:id="rIdkb-u4vwqppknioiybzdht">
                     <w:r>
                       <w:rPr>
                         <w:rStyle w:val="Hyperlink"/>
@@ -8871,7 +8871,7 @@
                   </w:r>
                 </w:p>
                 <w:p>
-                  <w:hyperlink w:history="1" r:id="rId9dpkob37zqiphwhshpj1o">
+                  <w:hyperlink w:history="1" r:id="rIdctf4fhpzcr2cnuhqlkjv_">
                     <w:r>
                       <w:rPr>
                         <w:rStyle w:val="Hyperlink"/>
@@ -9110,7 +9110,7 @@
                   </w:r>
                 </w:p>
                 <w:p>
-                  <w:hyperlink w:history="1" r:id="rId1foxhtbub2llupfsbqdzn">
+                  <w:hyperlink w:history="1" r:id="rIdjvmdgfhdndt7zq2mvzvsr">
                     <w:r>
                       <w:rPr>
                         <w:rStyle w:val="Hyperlink"/>
@@ -9319,7 +9319,7 @@
                   </w:r>
                 </w:p>
                 <w:p>
-                  <w:hyperlink w:history="1" r:id="rIdpjnidddkfnfgehkcsx7wm">
+                  <w:hyperlink w:history="1" r:id="rIdsr4wix9lnkeg857fkn6rd">
                     <w:r>
                       <w:rPr>
                         <w:rStyle w:val="Hyperlink"/>
@@ -9558,7 +9558,7 @@
                   </w:r>
                 </w:p>
                 <w:p>
-                  <w:hyperlink w:history="1" r:id="rId1hzgrygkuhcy07qbirylj">
+                  <w:hyperlink w:history="1" r:id="rIda-3b2bn1hwuruc4gelriw">
                     <w:r>
                       <w:rPr>
                         <w:rStyle w:val="Hyperlink"/>
@@ -9767,7 +9767,7 @@
                   </w:r>
                 </w:p>
                 <w:p>
-                  <w:hyperlink w:history="1" r:id="rId23p6xcpohsfqtdix1jcqi">
+                  <w:hyperlink w:history="1" r:id="rId5ry6ak8ewqfbyu7xzxuby">
                     <w:r>
                       <w:rPr>
                         <w:rStyle w:val="Hyperlink"/>
@@ -10006,7 +10006,7 @@
                   </w:r>
                 </w:p>
                 <w:p>
-                  <w:hyperlink w:history="1" r:id="rIdf2fjw1pclyq2ydh1s9zkw">
+                  <w:hyperlink w:history="1" r:id="rIdkzfzmt63lds15vygqj_p7">
                     <w:r>
                       <w:rPr>
                         <w:rStyle w:val="Hyperlink"/>
@@ -10215,7 +10215,7 @@
                   </w:r>
                 </w:p>
                 <w:p>
-                  <w:hyperlink w:history="1" r:id="rIda4ttv87qjdr0bsjtbq7og">
+                  <w:hyperlink w:history="1" r:id="rIdmqozu8zj1yzdiyy_idysi">
                     <w:r>
                       <w:rPr>
                         <w:rStyle w:val="Hyperlink"/>
@@ -10479,7 +10479,7 @@
                   </w:r>
                 </w:p>
                 <w:p>
-                  <w:hyperlink w:history="1" r:id="rIdu_bfmy8cxz_opkrvd_7d9">
+                  <w:hyperlink w:history="1" r:id="rId9mycc_lnteoowoawghdfo">
                     <w:r>
                       <w:rPr>
                         <w:rStyle w:val="Hyperlink"/>
@@ -10713,7 +10713,7 @@
                   </w:r>
                 </w:p>
                 <w:p>
-                  <w:hyperlink w:history="1" r:id="rIdfuvbmfw48izmjunr8z3zu">
+                  <w:hyperlink w:history="1" r:id="rId01pyc-psfuqentfqw7qam">
                     <w:r>
                       <w:rPr>
                         <w:rStyle w:val="Hyperlink"/>
@@ -10952,7 +10952,7 @@
                   </w:r>
                 </w:p>
                 <w:p>
-                  <w:hyperlink w:history="1" r:id="rIdva1r9u9mkk8d6ah7dk8tp">
+                  <w:hyperlink w:history="1" r:id="rIdcmqwbi1mmzq8b9wupgb4c">
                     <w:r>
                       <w:rPr>
                         <w:rStyle w:val="Hyperlink"/>
@@ -11161,7 +11161,7 @@
                   </w:r>
                 </w:p>
                 <w:p>
-                  <w:hyperlink w:history="1" r:id="rIdxmmu1laoppbykgalybs-y">
+                  <w:hyperlink w:history="1" r:id="rIdnccncpxb41ky48n-rlhrh">
                     <w:r>
                       <w:rPr>
                         <w:rStyle w:val="Hyperlink"/>
@@ -11400,7 +11400,7 @@
                   </w:r>
                 </w:p>
                 <w:p>
-                  <w:hyperlink w:history="1" r:id="rIdcwjoflgcp13gjmh8r96ss">
+                  <w:hyperlink w:history="1" r:id="rIdzl1swnsn0qldce2y1tsht">
                     <w:r>
                       <w:rPr>
                         <w:rStyle w:val="Hyperlink"/>
@@ -11609,7 +11609,7 @@
                   </w:r>
                 </w:p>
                 <w:p>
-                  <w:hyperlink w:history="1" r:id="rIdzgew5aoqti7pstuit-alb">
+                  <w:hyperlink w:history="1" r:id="rIdhauxprtg4ib7d6nsl3qzs">
                     <w:r>
                       <w:rPr>
                         <w:rStyle w:val="Hyperlink"/>
@@ -11848,7 +11848,7 @@
                   </w:r>
                 </w:p>
                 <w:p>
-                  <w:hyperlink w:history="1" r:id="rIdfsycydthdo4-cxay4e2o-">
+                  <w:hyperlink w:history="1" r:id="rIdb-d5fygym1pklrghsra1c">
                     <w:r>
                       <w:rPr>
                         <w:rStyle w:val="Hyperlink"/>
@@ -12057,7 +12057,7 @@
                   </w:r>
                 </w:p>
                 <w:p>
-                  <w:hyperlink w:history="1" r:id="rIdtsvwxjy3z7qhhbnvzp2g8">
+                  <w:hyperlink w:history="1" r:id="rIdf5rl-par0kq0cn6wsjduu">
                     <w:r>
                       <w:rPr>
                         <w:rStyle w:val="Hyperlink"/>
@@ -12296,7 +12296,7 @@
                   </w:r>
                 </w:p>
                 <w:p>
-                  <w:hyperlink w:history="1" r:id="rIdpd28fhnc7jpfakfkhn1by">
+                  <w:hyperlink w:history="1" r:id="rIdf52sniaxsgaldgzf-xm44">
                     <w:r>
                       <w:rPr>
                         <w:rStyle w:val="Hyperlink"/>
@@ -12530,7 +12530,7 @@
                   </w:r>
                 </w:p>
                 <w:p>
-                  <w:hyperlink w:history="1" r:id="rIdvyyksqaxgvtr9ohh07jfv">
+                  <w:hyperlink w:history="1" r:id="rIdhp3_1jhd__aydvk3ayeu5">
                     <w:r>
                       <w:rPr>
                         <w:rStyle w:val="Hyperlink"/>
@@ -12794,7 +12794,7 @@
                   </w:r>
                 </w:p>
                 <w:p>
-                  <w:hyperlink w:history="1" r:id="rIdeco1v14t92mt427wbplx7">
+                  <w:hyperlink w:history="1" r:id="rIdhhpbf9hx90f3gnjkudnla">
                     <w:r>
                       <w:rPr>
                         <w:rStyle w:val="Hyperlink"/>
@@ -13003,7 +13003,7 @@
                   </w:r>
                 </w:p>
                 <w:p>
-                  <w:hyperlink w:history="1" r:id="rIdcxmxi5fdi8fnfcuncjkze">
+                  <w:hyperlink w:history="1" r:id="rIdjgusvwylaypk59zcx-df2">
                     <w:r>
                       <w:rPr>
                         <w:rStyle w:val="Hyperlink"/>
@@ -13242,7 +13242,7 @@
                   </w:r>
                 </w:p>
                 <w:p>
-                  <w:hyperlink w:history="1" r:id="rIdq1zzyvhiiboefg7iycd6i">
+                  <w:hyperlink w:history="1" r:id="rId4gs9fvf1ipd44rnzqhcmx">
                     <w:r>
                       <w:rPr>
                         <w:rStyle w:val="Hyperlink"/>
@@ -13451,7 +13451,7 @@
                   </w:r>
                 </w:p>
                 <w:p>
-                  <w:hyperlink w:history="1" r:id="rIdl2rnrzspmxgcllbeqepj5">
+                  <w:hyperlink w:history="1" r:id="rIdouk752bd-usdbhtwbnwu1">
                     <w:r>
                       <w:rPr>
                         <w:rStyle w:val="Hyperlink"/>
@@ -13690,7 +13690,7 @@
                   </w:r>
                 </w:p>
                 <w:p>
-                  <w:hyperlink w:history="1" r:id="rIdv1tfwoxxq_tewhjfkx6zg">
+                  <w:hyperlink w:history="1" r:id="rIduddtve-8fa6gpl75mm-ri">
                     <w:r>
                       <w:rPr>
                         <w:rStyle w:val="Hyperlink"/>
@@ -13899,7 +13899,7 @@
                   </w:r>
                 </w:p>
                 <w:p>
-                  <w:hyperlink w:history="1" r:id="rId6wop37h69ns6rblluq4y9">
+                  <w:hyperlink w:history="1" r:id="rId8kbmjg1gm1kuvnwxwwxeb">
                     <w:r>
                       <w:rPr>
                         <w:rStyle w:val="Hyperlink"/>
@@ -14138,7 +14138,7 @@
                   </w:r>
                 </w:p>
                 <w:p>
-                  <w:hyperlink w:history="1" r:id="rIdkz2smcyydiubrhnxddzxf">
+                  <w:hyperlink w:history="1" r:id="rIda0xqbaac8bxjaoi3phtxg">
                     <w:r>
                       <w:rPr>
                         <w:rStyle w:val="Hyperlink"/>
@@ -14347,7 +14347,7 @@
                   </w:r>
                 </w:p>
                 <w:p>
-                  <w:hyperlink w:history="1" r:id="rIdmvipulkf-hth61qbnev6h">
+                  <w:hyperlink w:history="1" r:id="rId1nhegwv72buep8gphen4t">
                     <w:r>
                       <w:rPr>
                         <w:rStyle w:val="Hyperlink"/>
@@ -14586,7 +14586,7 @@
                   </w:r>
                 </w:p>
                 <w:p>
-                  <w:hyperlink w:history="1" r:id="rId4zxnwyxpbocgwsgvp1wre">
+                  <w:hyperlink w:history="1" r:id="rIdhhfiyk_hlr5kxh0epj9q-">
                     <w:r>
                       <w:rPr>
                         <w:rStyle w:val="Hyperlink"/>
@@ -14795,7 +14795,7 @@
                   </w:r>
                 </w:p>
                 <w:p>
-                  <w:hyperlink w:history="1" r:id="rId3ihrkmar1pdmuy7trdi3z">
+                  <w:hyperlink w:history="1" r:id="rIdlnoqlqlznhmevcbjq1oce">
                     <w:r>
                       <w:rPr>
                         <w:rStyle w:val="Hyperlink"/>
@@ -15034,7 +15034,7 @@
                   </w:r>
                 </w:p>
                 <w:p>
-                  <w:hyperlink w:history="1" r:id="rIdifoiop7zv0skcza8swf-0">
+                  <w:hyperlink w:history="1" r:id="rIdsny1hk9zlozcxayq-xn7p">
                     <w:r>
                       <w:rPr>
                         <w:rStyle w:val="Hyperlink"/>
@@ -15268,7 +15268,7 @@
                   </w:r>
                 </w:p>
                 <w:p>
-                  <w:hyperlink w:history="1" r:id="rIdfyalsrsc6pbltaih_x6cc">
+                  <w:hyperlink w:history="1" r:id="rIdscwru05xlvslxjv7_p7dr">
                     <w:r>
                       <w:rPr>
                         <w:rStyle w:val="Hyperlink"/>
@@ -15507,7 +15507,7 @@
                   </w:r>
                 </w:p>
                 <w:p>
-                  <w:hyperlink w:history="1" r:id="rIdqyomhx3mmxkda070zfb47">
+                  <w:hyperlink w:history="1" r:id="rIdiupwd5ra75tk_ssobzyfe">
                     <w:r>
                       <w:rPr>
                         <w:rStyle w:val="Hyperlink"/>
@@ -15716,7 +15716,7 @@
                   </w:r>
                 </w:p>
                 <w:p>
-                  <w:hyperlink w:history="1" r:id="rIdwoolbxeg41d4jnbpnvlwb">
+                  <w:hyperlink w:history="1" r:id="rIdrosu5rrfgdaxptbzjoa79">
                     <w:r>
                       <w:rPr>
                         <w:rStyle w:val="Hyperlink"/>
@@ -15955,7 +15955,7 @@
                   </w:r>
                 </w:p>
                 <w:p>
-                  <w:hyperlink w:history="1" r:id="rIdk8zwbfopwtwivkh8o9fv8">
+                  <w:hyperlink w:history="1" r:id="rIdlhuko82_fxwkestu5ksv7">
                     <w:r>
                       <w:rPr>
                         <w:rStyle w:val="Hyperlink"/>
@@ -16164,7 +16164,7 @@
                   </w:r>
                 </w:p>
                 <w:p>
-                  <w:hyperlink w:history="1" r:id="rId_pv0-76z9xjwdr6p4qikr">
+                  <w:hyperlink w:history="1" r:id="rIdozjrkjwwrl5ryphuaqomi">
                     <w:r>
                       <w:rPr>
                         <w:rStyle w:val="Hyperlink"/>

</xml_diff>

<commit_message>
workbook: update Shane Spillers headshot; drop 'morning sessions' tag on agenda
- Replace shane-spillers.jpg (photo file is gitignored; embedded in docx/pdf)
- Remove 'MORNING SESSIONS — NOT COVERED IN THIS WORKBOOK' agenda callout
</commit_message>
<xml_diff>
--- a/deliverables/workbook/Workbook.docx
+++ b/deliverables/workbook/Workbook.docx
@@ -660,22 +660,6 @@
                 <w:szCs w:val="20"/>
               </w:rPr>
               <w:t xml:space="preserve">Coffee, Snacks &amp; Registration</w:t>
-            </w:r>
-          </w:p>
-          <w:p>
-            <w:pPr>
-              <w:spacing w:before="40"/>
-            </w:pPr>
-            <w:r>
-              <w:rPr>
-                <w:rFonts w:ascii="Calibri" w:cs="Calibri" w:eastAsia="Calibri" w:hAnsi="Calibri"/>
-                <w:b/>
-                <w:bCs/>
-                <w:color w:val="E87722"/>
-                <w:sz w:val="14"/>
-                <w:szCs w:val="14"/>
-              </w:rPr>
-              <w:t xml:space="preserve">MORNING SESSIONS — NOT COVERED IN THIS WORKBOOK</w:t>
             </w:r>
           </w:p>
         </w:tc>
@@ -5215,7 +5199,7 @@
               <w:spacing w:after="80"/>
               <w:jc w:val="center"/>
             </w:pPr>
-            <w:hyperlink w:history="1" r:id="rIdilia6v1gwqb4t-jetiyfv">
+            <w:hyperlink w:history="1" r:id="rIdsxxtoemmpn0ezqvw_0i2n">
               <w:r>
                 <w:rPr>
                   <w:rStyle w:val="Hyperlink"/>
@@ -5315,7 +5299,7 @@
               <w:spacing w:after="80"/>
               <w:jc w:val="center"/>
             </w:pPr>
-            <w:hyperlink w:history="1" r:id="rIdjqgcbynulz1ujaq-0m0pd">
+            <w:hyperlink w:history="1" r:id="rId3grswtbrk5n0o8hspukim">
               <w:r>
                 <w:rPr>
                   <w:rStyle w:val="Hyperlink"/>
@@ -5472,7 +5456,7 @@
               <w:spacing w:after="80"/>
               <w:jc w:val="center"/>
             </w:pPr>
-            <w:hyperlink w:history="1" r:id="rIdkamsel7ldt4sfl-rzpsva">
+            <w:hyperlink w:history="1" r:id="rIdqz0qyrziiaselbebr7ay3">
               <w:r>
                 <w:rPr>
                   <w:rStyle w:val="Hyperlink"/>
@@ -5572,7 +5556,7 @@
               <w:spacing w:after="80"/>
               <w:jc w:val="center"/>
             </w:pPr>
-            <w:hyperlink w:history="1" r:id="rIdz-xa78twgurctz0otfeuy">
+            <w:hyperlink w:history="1" r:id="rIdsimjoxkic5tpamnx5iz24">
               <w:r>
                 <w:rPr>
                   <w:rStyle w:val="Hyperlink"/>
@@ -5728,7 +5712,7 @@
               <w:spacing w:after="80"/>
               <w:jc w:val="center"/>
             </w:pPr>
-            <w:hyperlink w:history="1" r:id="rIdli9clnbrnsooykhidh4hy">
+            <w:hyperlink w:history="1" r:id="rIdtjlainr1jflhhlhyhenqs">
               <w:r>
                 <w:rPr>
                   <w:rStyle w:val="Hyperlink"/>
@@ -5884,7 +5868,7 @@
               <w:spacing w:after="80"/>
               <w:jc w:val="center"/>
             </w:pPr>
-            <w:hyperlink w:history="1" r:id="rIdqxnl6ctpo-mym7qf06nqf">
+            <w:hyperlink w:history="1" r:id="rIdfnkqmibls4_2vf3mez76b">
               <w:r>
                 <w:rPr>
                   <w:rStyle w:val="Hyperlink"/>
@@ -6041,7 +6025,7 @@
               <w:spacing w:after="80"/>
               <w:jc w:val="center"/>
             </w:pPr>
-            <w:hyperlink w:history="1" r:id="rId15qirmswkhea5fmnp-oq3">
+            <w:hyperlink w:history="1" r:id="rIdqtgncpszirq8rlgifbn-d">
               <w:r>
                 <w:rPr>
                   <w:rStyle w:val="Hyperlink"/>
@@ -6141,7 +6125,7 @@
               <w:spacing w:after="80"/>
               <w:jc w:val="center"/>
             </w:pPr>
-            <w:hyperlink w:history="1" r:id="rIdfqth8wuuynflywqug8brv">
+            <w:hyperlink w:history="1" r:id="rIdahnhguk0wwnirpaav0wug">
               <w:r>
                 <w:rPr>
                   <w:rStyle w:val="Hyperlink"/>
@@ -6300,7 +6284,7 @@
               <w:spacing w:after="80"/>
               <w:jc w:val="center"/>
             </w:pPr>
-            <w:hyperlink w:history="1" r:id="rIdhzthljnkgmwj3f4nbof1s">
+            <w:hyperlink w:history="1" r:id="rIdioqjadgmyvtva37606cl_">
               <w:r>
                 <w:rPr>
                   <w:rStyle w:val="Hyperlink"/>
@@ -6400,7 +6384,7 @@
               <w:spacing w:after="80"/>
               <w:jc w:val="center"/>
             </w:pPr>
-            <w:hyperlink w:history="1" r:id="rIdbg0fragujvsxtmoi8qfpx">
+            <w:hyperlink w:history="1" r:id="rIdbuczsq1hzohafeqruhs3u">
               <w:r>
                 <w:rPr>
                   <w:rStyle w:val="Hyperlink"/>
@@ -6500,7 +6484,7 @@
               <w:spacing w:after="80"/>
               <w:jc w:val="center"/>
             </w:pPr>
-            <w:hyperlink w:history="1" r:id="rIdedljha3jjbhfpsflgps_e">
+            <w:hyperlink w:history="1" r:id="rIdfv-akzo5k0ryfzrbg2tp9">
               <w:r>
                 <w:rPr>
                   <w:rStyle w:val="Hyperlink"/>
@@ -6600,7 +6584,7 @@
               <w:spacing w:after="80"/>
               <w:jc w:val="center"/>
             </w:pPr>
-            <w:hyperlink w:history="1" r:id="rIdy0njxdls4m5tuq3pfh7df">
+            <w:hyperlink w:history="1" r:id="rIdrpwsysab7aqnyxawuuj49">
               <w:r>
                 <w:rPr>
                   <w:rStyle w:val="Hyperlink"/>
@@ -6732,7 +6716,7 @@
               <w:spacing w:after="80"/>
               <w:jc w:val="center"/>
             </w:pPr>
-            <w:hyperlink w:history="1" r:id="rIdc8d7isiz8arqse6bxqy3q">
+            <w:hyperlink w:history="1" r:id="rId9p-1ude6zlq4p9jz6aezu">
               <w:r>
                 <w:rPr>
                   <w:rStyle w:val="Hyperlink"/>
@@ -6832,7 +6816,7 @@
               <w:spacing w:after="80"/>
               <w:jc w:val="center"/>
             </w:pPr>
-            <w:hyperlink w:history="1" r:id="rId5y6gqftjsbi7a3ke7725a">
+            <w:hyperlink w:history="1" r:id="rId8u29-h7rkdbxgpm0efhdm">
               <w:r>
                 <w:rPr>
                   <w:rStyle w:val="Hyperlink"/>
@@ -6932,7 +6916,7 @@
               <w:spacing w:after="80"/>
               <w:jc w:val="center"/>
             </w:pPr>
-            <w:hyperlink w:history="1" r:id="rIdggfecpumk85ety77m144u">
+            <w:hyperlink w:history="1" r:id="rIdwyhdszas3xpx8atqpzcxd">
               <w:r>
                 <w:rPr>
                   <w:rStyle w:val="Hyperlink"/>
@@ -7032,7 +7016,7 @@
               <w:spacing w:after="80"/>
               <w:jc w:val="center"/>
             </w:pPr>
-            <w:hyperlink w:history="1" r:id="rIdlgafjw1tftc80o-n0frhd">
+            <w:hyperlink w:history="1" r:id="rIdnwhkqn1ifdtn3mrerrqz4">
               <w:r>
                 <w:rPr>
                   <w:rStyle w:val="Hyperlink"/>
@@ -7332,7 +7316,7 @@
                   </w:r>
                 </w:p>
                 <w:p>
-                  <w:hyperlink w:history="1" r:id="rIdnegj5mdqltvm7fl3z3dqa">
+                  <w:hyperlink w:history="1" r:id="rIdp4oc0gaw2ak8titmdvqmv">
                     <w:r>
                       <w:rPr>
                         <w:rStyle w:val="Hyperlink"/>
@@ -7541,7 +7525,7 @@
                   </w:r>
                 </w:p>
                 <w:p>
-                  <w:hyperlink w:history="1" r:id="rIduayctqp7iq8bxmqwjthmw">
+                  <w:hyperlink w:history="1" r:id="rIdjh2tj-e208k9am0dfjpcq">
                     <w:r>
                       <w:rPr>
                         <w:rStyle w:val="Hyperlink"/>
@@ -7780,7 +7764,7 @@
                   </w:r>
                 </w:p>
                 <w:p>
-                  <w:hyperlink w:history="1" r:id="rIdqwpjwzorcyt05n_lja_vy">
+                  <w:hyperlink w:history="1" r:id="rId2t7_gkgbg11qzskvqbdno">
                     <w:r>
                       <w:rPr>
                         <w:rStyle w:val="Hyperlink"/>
@@ -7989,7 +7973,7 @@
                   </w:r>
                 </w:p>
                 <w:p>
-                  <w:hyperlink w:history="1" r:id="rId8uusals8wcfvugugik0wj">
+                  <w:hyperlink w:history="1" r:id="rId9mg7ywnvu_91kvgv_eyog">
                     <w:r>
                       <w:rPr>
                         <w:rStyle w:val="Hyperlink"/>
@@ -8228,7 +8212,7 @@
                   </w:r>
                 </w:p>
                 <w:p>
-                  <w:hyperlink w:history="1" r:id="rIdcydgqky0diswg9n2pt-ih">
+                  <w:hyperlink w:history="1" r:id="rIdjoxqcjhy9zzxjtkfx4ylw">
                     <w:r>
                       <w:rPr>
                         <w:rStyle w:val="Hyperlink"/>
@@ -8437,7 +8421,7 @@
                   </w:r>
                 </w:p>
                 <w:p>
-                  <w:hyperlink w:history="1" r:id="rIdkb-u4vwqppknioiybzdht">
+                  <w:hyperlink w:history="1" r:id="rIdb1atyso-a6wckcge8ccur">
                     <w:r>
                       <w:rPr>
                         <w:rStyle w:val="Hyperlink"/>
@@ -8871,7 +8855,7 @@
                   </w:r>
                 </w:p>
                 <w:p>
-                  <w:hyperlink w:history="1" r:id="rIdctf4fhpzcr2cnuhqlkjv_">
+                  <w:hyperlink w:history="1" r:id="rIdplcnk4fjw-xgxjwezazje">
                     <w:r>
                       <w:rPr>
                         <w:rStyle w:val="Hyperlink"/>
@@ -9110,7 +9094,7 @@
                   </w:r>
                 </w:p>
                 <w:p>
-                  <w:hyperlink w:history="1" r:id="rIdjvmdgfhdndt7zq2mvzvsr">
+                  <w:hyperlink w:history="1" r:id="rIdeo5gwc46cfvgd9v_ngcaj">
                     <w:r>
                       <w:rPr>
                         <w:rStyle w:val="Hyperlink"/>
@@ -9319,7 +9303,7 @@
                   </w:r>
                 </w:p>
                 <w:p>
-                  <w:hyperlink w:history="1" r:id="rIdsr4wix9lnkeg857fkn6rd">
+                  <w:hyperlink w:history="1" r:id="rIdjruf_l5oe_tnn0h3ue7jk">
                     <w:r>
                       <w:rPr>
                         <w:rStyle w:val="Hyperlink"/>
@@ -9558,7 +9542,7 @@
                   </w:r>
                 </w:p>
                 <w:p>
-                  <w:hyperlink w:history="1" r:id="rIda-3b2bn1hwuruc4gelriw">
+                  <w:hyperlink w:history="1" r:id="rIdkqwcodaidxixxtfqaruze">
                     <w:r>
                       <w:rPr>
                         <w:rStyle w:val="Hyperlink"/>
@@ -9767,7 +9751,7 @@
                   </w:r>
                 </w:p>
                 <w:p>
-                  <w:hyperlink w:history="1" r:id="rId5ry6ak8ewqfbyu7xzxuby">
+                  <w:hyperlink w:history="1" r:id="rIdbajw_wcdpg6ighsmnhx6v">
                     <w:r>
                       <w:rPr>
                         <w:rStyle w:val="Hyperlink"/>
@@ -10006,7 +9990,7 @@
                   </w:r>
                 </w:p>
                 <w:p>
-                  <w:hyperlink w:history="1" r:id="rIdkzfzmt63lds15vygqj_p7">
+                  <w:hyperlink w:history="1" r:id="rIdkguxvf3-c1txpzwmbq1zq">
                     <w:r>
                       <w:rPr>
                         <w:rStyle w:val="Hyperlink"/>
@@ -10215,7 +10199,7 @@
                   </w:r>
                 </w:p>
                 <w:p>
-                  <w:hyperlink w:history="1" r:id="rIdmqozu8zj1yzdiyy_idysi">
+                  <w:hyperlink w:history="1" r:id="rIdbrzqqamuomikwmpss_3u-">
                     <w:r>
                       <w:rPr>
                         <w:rStyle w:val="Hyperlink"/>
@@ -10479,7 +10463,7 @@
                   </w:r>
                 </w:p>
                 <w:p>
-                  <w:hyperlink w:history="1" r:id="rId9mycc_lnteoowoawghdfo">
+                  <w:hyperlink w:history="1" r:id="rIdicevmhge8rm0fvy0xhkbq">
                     <w:r>
                       <w:rPr>
                         <w:rStyle w:val="Hyperlink"/>
@@ -10713,7 +10697,7 @@
                   </w:r>
                 </w:p>
                 <w:p>
-                  <w:hyperlink w:history="1" r:id="rId01pyc-psfuqentfqw7qam">
+                  <w:hyperlink w:history="1" r:id="rIdyc9sq1pjlym2nykmypcx6">
                     <w:r>
                       <w:rPr>
                         <w:rStyle w:val="Hyperlink"/>
@@ -10952,7 +10936,7 @@
                   </w:r>
                 </w:p>
                 <w:p>
-                  <w:hyperlink w:history="1" r:id="rIdcmqwbi1mmzq8b9wupgb4c">
+                  <w:hyperlink w:history="1" r:id="rIdeoagcmiupbms6earsap8y">
                     <w:r>
                       <w:rPr>
                         <w:rStyle w:val="Hyperlink"/>
@@ -11161,7 +11145,7 @@
                   </w:r>
                 </w:p>
                 <w:p>
-                  <w:hyperlink w:history="1" r:id="rIdnccncpxb41ky48n-rlhrh">
+                  <w:hyperlink w:history="1" r:id="rIdrxxuyk2ps9m8i7omvcg-q">
                     <w:r>
                       <w:rPr>
                         <w:rStyle w:val="Hyperlink"/>
@@ -11400,7 +11384,7 @@
                   </w:r>
                 </w:p>
                 <w:p>
-                  <w:hyperlink w:history="1" r:id="rIdzl1swnsn0qldce2y1tsht">
+                  <w:hyperlink w:history="1" r:id="rIdtosuy4sev3fcw-9eic5rn">
                     <w:r>
                       <w:rPr>
                         <w:rStyle w:val="Hyperlink"/>
@@ -11609,7 +11593,7 @@
                   </w:r>
                 </w:p>
                 <w:p>
-                  <w:hyperlink w:history="1" r:id="rIdhauxprtg4ib7d6nsl3qzs">
+                  <w:hyperlink w:history="1" r:id="rIdqjvd4u7-zyewke04d2pip">
                     <w:r>
                       <w:rPr>
                         <w:rStyle w:val="Hyperlink"/>
@@ -11848,7 +11832,7 @@
                   </w:r>
                 </w:p>
                 <w:p>
-                  <w:hyperlink w:history="1" r:id="rIdb-d5fygym1pklrghsra1c">
+                  <w:hyperlink w:history="1" r:id="rIdc2o1nmpiy3svl42lfgatq">
                     <w:r>
                       <w:rPr>
                         <w:rStyle w:val="Hyperlink"/>
@@ -12057,7 +12041,7 @@
                   </w:r>
                 </w:p>
                 <w:p>
-                  <w:hyperlink w:history="1" r:id="rIdf5rl-par0kq0cn6wsjduu">
+                  <w:hyperlink w:history="1" r:id="rId404go7ud4iktlvzif7_e_">
                     <w:r>
                       <w:rPr>
                         <w:rStyle w:val="Hyperlink"/>
@@ -12296,7 +12280,7 @@
                   </w:r>
                 </w:p>
                 <w:p>
-                  <w:hyperlink w:history="1" r:id="rIdf52sniaxsgaldgzf-xm44">
+                  <w:hyperlink w:history="1" r:id="rId9vvhyuo6aqqlapwshyv1k">
                     <w:r>
                       <w:rPr>
                         <w:rStyle w:val="Hyperlink"/>
@@ -12530,7 +12514,7 @@
                   </w:r>
                 </w:p>
                 <w:p>
-                  <w:hyperlink w:history="1" r:id="rIdhp3_1jhd__aydvk3ayeu5">
+                  <w:hyperlink w:history="1" r:id="rIdww4nx3kcgsia2mxbdxnpd">
                     <w:r>
                       <w:rPr>
                         <w:rStyle w:val="Hyperlink"/>
@@ -12794,7 +12778,7 @@
                   </w:r>
                 </w:p>
                 <w:p>
-                  <w:hyperlink w:history="1" r:id="rIdhhpbf9hx90f3gnjkudnla">
+                  <w:hyperlink w:history="1" r:id="rId1pjfbfplgjouhdeixswhh">
                     <w:r>
                       <w:rPr>
                         <w:rStyle w:val="Hyperlink"/>
@@ -13003,7 +12987,7 @@
                   </w:r>
                 </w:p>
                 <w:p>
-                  <w:hyperlink w:history="1" r:id="rIdjgusvwylaypk59zcx-df2">
+                  <w:hyperlink w:history="1" r:id="rIdd0mq_fmqqaxfa6hyjndhu">
                     <w:r>
                       <w:rPr>
                         <w:rStyle w:val="Hyperlink"/>
@@ -13242,7 +13226,7 @@
                   </w:r>
                 </w:p>
                 <w:p>
-                  <w:hyperlink w:history="1" r:id="rId4gs9fvf1ipd44rnzqhcmx">
+                  <w:hyperlink w:history="1" r:id="rIdhkjygula_odng8ueaed4j">
                     <w:r>
                       <w:rPr>
                         <w:rStyle w:val="Hyperlink"/>
@@ -13451,7 +13435,7 @@
                   </w:r>
                 </w:p>
                 <w:p>
-                  <w:hyperlink w:history="1" r:id="rIdouk752bd-usdbhtwbnwu1">
+                  <w:hyperlink w:history="1" r:id="rIdir0ncwvsxynz9z7bsgddu">
                     <w:r>
                       <w:rPr>
                         <w:rStyle w:val="Hyperlink"/>
@@ -13690,7 +13674,7 @@
                   </w:r>
                 </w:p>
                 <w:p>
-                  <w:hyperlink w:history="1" r:id="rIduddtve-8fa6gpl75mm-ri">
+                  <w:hyperlink w:history="1" r:id="rIdwmrpputu9dl6en8vlvjgf">
                     <w:r>
                       <w:rPr>
                         <w:rStyle w:val="Hyperlink"/>
@@ -13899,7 +13883,7 @@
                   </w:r>
                 </w:p>
                 <w:p>
-                  <w:hyperlink w:history="1" r:id="rId8kbmjg1gm1kuvnwxwwxeb">
+                  <w:hyperlink w:history="1" r:id="rIdrwnhavereqbbauqodbi9b">
                     <w:r>
                       <w:rPr>
                         <w:rStyle w:val="Hyperlink"/>
@@ -14138,7 +14122,7 @@
                   </w:r>
                 </w:p>
                 <w:p>
-                  <w:hyperlink w:history="1" r:id="rIda0xqbaac8bxjaoi3phtxg">
+                  <w:hyperlink w:history="1" r:id="rIdw3y5ov3zrvzachekjoxn9">
                     <w:r>
                       <w:rPr>
                         <w:rStyle w:val="Hyperlink"/>
@@ -14347,7 +14331,7 @@
                   </w:r>
                 </w:p>
                 <w:p>
-                  <w:hyperlink w:history="1" r:id="rId1nhegwv72buep8gphen4t">
+                  <w:hyperlink w:history="1" r:id="rId32qd2csz9imxql7pbednv">
                     <w:r>
                       <w:rPr>
                         <w:rStyle w:val="Hyperlink"/>
@@ -14586,7 +14570,7 @@
                   </w:r>
                 </w:p>
                 <w:p>
-                  <w:hyperlink w:history="1" r:id="rIdhhfiyk_hlr5kxh0epj9q-">
+                  <w:hyperlink w:history="1" r:id="rIdjbhrr1wqsfzniipwwnztm">
                     <w:r>
                       <w:rPr>
                         <w:rStyle w:val="Hyperlink"/>
@@ -14795,7 +14779,7 @@
                   </w:r>
                 </w:p>
                 <w:p>
-                  <w:hyperlink w:history="1" r:id="rIdlnoqlqlznhmevcbjq1oce">
+                  <w:hyperlink w:history="1" r:id="rIdko1xk8liyj46yggu0klt_">
                     <w:r>
                       <w:rPr>
                         <w:rStyle w:val="Hyperlink"/>
@@ -15034,7 +15018,7 @@
                   </w:r>
                 </w:p>
                 <w:p>
-                  <w:hyperlink w:history="1" r:id="rIdsny1hk9zlozcxayq-xn7p">
+                  <w:hyperlink w:history="1" r:id="rId92-a3lxttlp8wvbobawo8">
                     <w:r>
                       <w:rPr>
                         <w:rStyle w:val="Hyperlink"/>
@@ -15268,7 +15252,7 @@
                   </w:r>
                 </w:p>
                 <w:p>
-                  <w:hyperlink w:history="1" r:id="rIdscwru05xlvslxjv7_p7dr">
+                  <w:hyperlink w:history="1" r:id="rIdmpeusbqb0uhpembyebzjl">
                     <w:r>
                       <w:rPr>
                         <w:rStyle w:val="Hyperlink"/>
@@ -15507,7 +15491,7 @@
                   </w:r>
                 </w:p>
                 <w:p>
-                  <w:hyperlink w:history="1" r:id="rIdiupwd5ra75tk_ssobzyfe">
+                  <w:hyperlink w:history="1" r:id="rIdnolewlnx_qworezpygvsz">
                     <w:r>
                       <w:rPr>
                         <w:rStyle w:val="Hyperlink"/>
@@ -15716,7 +15700,7 @@
                   </w:r>
                 </w:p>
                 <w:p>
-                  <w:hyperlink w:history="1" r:id="rIdrosu5rrfgdaxptbzjoa79">
+                  <w:hyperlink w:history="1" r:id="rIdc8jodivfvwp2sjynmxzix">
                     <w:r>
                       <w:rPr>
                         <w:rStyle w:val="Hyperlink"/>
@@ -15955,7 +15939,7 @@
                   </w:r>
                 </w:p>
                 <w:p>
-                  <w:hyperlink w:history="1" r:id="rIdlhuko82_fxwkestu5ksv7">
+                  <w:hyperlink w:history="1" r:id="rIdf7djyep3eqvwmlskcelwp">
                     <w:r>
                       <w:rPr>
                         <w:rStyle w:val="Hyperlink"/>
@@ -16164,7 +16148,7 @@
                   </w:r>
                 </w:p>
                 <w:p>
-                  <w:hyperlink w:history="1" r:id="rIdozjrkjwwrl5ryphuaqomi">
+                  <w:hyperlink w:history="1" r:id="rIdt0_-qo0lllvojysu2q-6h">
                     <w:r>
                       <w:rPr>
                         <w:rStyle w:val="Hyperlink"/>

</xml_diff>

<commit_message>
workbook: new two-line header, bottom-right page #, morning notes pages, agenda restyle
- Header: 'We Run ON EOS(R)' bold/large + 'North Texas 2026' smaller
- Page number: bottom-right, just the number (no 'of N')
- Agenda: all session titles bold; no italics; times not bold;
  Walt Brown row prefixed 'EOS Worldwide Head Coach'
- Add 4 MY NOTES pages after agenda for free morning sessions
- Paginator now matches on 'North Texas 2026' (stable second header line)
</commit_message>
<xml_diff>
--- a/deliverables/workbook/Workbook.docx
+++ b/deliverables/workbook/Workbook.docx
@@ -621,7 +621,7 @@
                 <w:rFonts w:ascii="Calibri" w:cs="Calibri" w:eastAsia="Calibri" w:hAnsi="Calibri"/>
                 <w:b w:val="false"/>
                 <w:bCs w:val="false"/>
-                <w:color w:val="5A6B82"/>
+                <w:color w:val="0B1F3A"/>
                 <w:sz w:val="20"/>
                 <w:szCs w:val="20"/>
               </w:rPr>
@@ -653,8 +653,8 @@
                 <w:rFonts w:ascii="Calibri" w:cs="Calibri" w:eastAsia="Calibri" w:hAnsi="Calibri"/>
                 <w:b w:val="false"/>
                 <w:bCs w:val="false"/>
-                <w:i/>
-                <w:iCs/>
+                <w:i w:val="false"/>
+                <w:iCs w:val="false"/>
                 <w:color w:val="5A6B82"/>
                 <w:sz w:val="20"/>
                 <w:szCs w:val="20"/>
@@ -685,8 +685,8 @@
             <w:r>
               <w:rPr>
                 <w:rFonts w:ascii="Calibri" w:cs="Calibri" w:eastAsia="Calibri" w:hAnsi="Calibri"/>
-                <w:i/>
-                <w:iCs/>
+                <w:i w:val="false"/>
+                <w:iCs w:val="false"/>
                 <w:color w:val="5A6B82"/>
                 <w:sz w:val="18"/>
                 <w:szCs w:val="18"/>
@@ -721,7 +721,7 @@
                 <w:rFonts w:ascii="Calibri" w:cs="Calibri" w:eastAsia="Calibri" w:hAnsi="Calibri"/>
                 <w:b w:val="false"/>
                 <w:bCs w:val="false"/>
-                <w:color w:val="5A6B82"/>
+                <w:color w:val="0B1F3A"/>
                 <w:sz w:val="20"/>
                 <w:szCs w:val="20"/>
               </w:rPr>
@@ -751,10 +751,10 @@
             <w:r>
               <w:rPr>
                 <w:rFonts w:ascii="Calibri" w:cs="Calibri" w:eastAsia="Calibri" w:hAnsi="Calibri"/>
-                <w:b w:val="false"/>
-                <w:bCs w:val="false"/>
-                <w:i/>
-                <w:iCs/>
+                <w:b/>
+                <w:bCs/>
+                <w:i w:val="false"/>
+                <w:iCs w:val="false"/>
                 <w:color w:val="5A6B82"/>
                 <w:sz w:val="22"/>
                 <w:szCs w:val="22"/>
@@ -785,8 +785,8 @@
             <w:r>
               <w:rPr>
                 <w:rFonts w:ascii="Calibri" w:cs="Calibri" w:eastAsia="Calibri" w:hAnsi="Calibri"/>
-                <w:i/>
-                <w:iCs/>
+                <w:i w:val="false"/>
+                <w:iCs w:val="false"/>
                 <w:color w:val="5A6B82"/>
                 <w:sz w:val="18"/>
                 <w:szCs w:val="18"/>
@@ -821,7 +821,7 @@
                 <w:rFonts w:ascii="Calibri" w:cs="Calibri" w:eastAsia="Calibri" w:hAnsi="Calibri"/>
                 <w:b w:val="false"/>
                 <w:bCs w:val="false"/>
-                <w:color w:val="5A6B82"/>
+                <w:color w:val="0B1F3A"/>
                 <w:sz w:val="20"/>
                 <w:szCs w:val="20"/>
               </w:rPr>
@@ -853,8 +853,8 @@
                 <w:rFonts w:ascii="Calibri" w:cs="Calibri" w:eastAsia="Calibri" w:hAnsi="Calibri"/>
                 <w:b w:val="false"/>
                 <w:bCs w:val="false"/>
-                <w:i/>
-                <w:iCs/>
+                <w:i w:val="false"/>
+                <w:iCs w:val="false"/>
                 <w:color w:val="5A6B82"/>
                 <w:sz w:val="20"/>
                 <w:szCs w:val="20"/>
@@ -885,8 +885,8 @@
             <w:r>
               <w:rPr>
                 <w:rFonts w:ascii="Calibri" w:cs="Calibri" w:eastAsia="Calibri" w:hAnsi="Calibri"/>
-                <w:i/>
-                <w:iCs/>
+                <w:i w:val="false"/>
+                <w:iCs w:val="false"/>
                 <w:color w:val="5A6B82"/>
                 <w:sz w:val="18"/>
                 <w:szCs w:val="18"/>
@@ -921,7 +921,7 @@
                 <w:rFonts w:ascii="Calibri" w:cs="Calibri" w:eastAsia="Calibri" w:hAnsi="Calibri"/>
                 <w:b w:val="false"/>
                 <w:bCs w:val="false"/>
-                <w:color w:val="5A6B82"/>
+                <w:color w:val="0B1F3A"/>
                 <w:sz w:val="20"/>
                 <w:szCs w:val="20"/>
               </w:rPr>
@@ -951,10 +951,10 @@
             <w:r>
               <w:rPr>
                 <w:rFonts w:ascii="Calibri" w:cs="Calibri" w:eastAsia="Calibri" w:hAnsi="Calibri"/>
-                <w:b w:val="false"/>
-                <w:bCs w:val="false"/>
-                <w:i/>
-                <w:iCs/>
+                <w:b/>
+                <w:bCs/>
+                <w:i w:val="false"/>
+                <w:iCs w:val="false"/>
                 <w:color w:val="5A6B82"/>
                 <w:sz w:val="22"/>
                 <w:szCs w:val="22"/>
@@ -985,8 +985,8 @@
             <w:r>
               <w:rPr>
                 <w:rFonts w:ascii="Calibri" w:cs="Calibri" w:eastAsia="Calibri" w:hAnsi="Calibri"/>
-                <w:i/>
-                <w:iCs/>
+                <w:i w:val="false"/>
+                <w:iCs w:val="false"/>
                 <w:color w:val="5A6B82"/>
                 <w:sz w:val="18"/>
                 <w:szCs w:val="18"/>
@@ -1021,7 +1021,7 @@
                 <w:rFonts w:ascii="Calibri" w:cs="Calibri" w:eastAsia="Calibri" w:hAnsi="Calibri"/>
                 <w:b w:val="false"/>
                 <w:bCs w:val="false"/>
-                <w:color w:val="5A6B82"/>
+                <w:color w:val="0B1F3A"/>
                 <w:sz w:val="20"/>
                 <w:szCs w:val="20"/>
               </w:rPr>
@@ -1053,8 +1053,8 @@
                 <w:rFonts w:ascii="Calibri" w:cs="Calibri" w:eastAsia="Calibri" w:hAnsi="Calibri"/>
                 <w:b w:val="false"/>
                 <w:bCs w:val="false"/>
-                <w:i/>
-                <w:iCs/>
+                <w:i w:val="false"/>
+                <w:iCs w:val="false"/>
                 <w:color w:val="5A6B82"/>
                 <w:sz w:val="20"/>
                 <w:szCs w:val="20"/>
@@ -1085,8 +1085,8 @@
             <w:r>
               <w:rPr>
                 <w:rFonts w:ascii="Calibri" w:cs="Calibri" w:eastAsia="Calibri" w:hAnsi="Calibri"/>
-                <w:i/>
-                <w:iCs/>
+                <w:i w:val="false"/>
+                <w:iCs w:val="false"/>
                 <w:color w:val="5A6B82"/>
                 <w:sz w:val="18"/>
                 <w:szCs w:val="18"/>
@@ -1121,7 +1121,7 @@
                 <w:rFonts w:ascii="Calibri" w:cs="Calibri" w:eastAsia="Calibri" w:hAnsi="Calibri"/>
                 <w:b w:val="false"/>
                 <w:bCs w:val="false"/>
-                <w:color w:val="5A6B82"/>
+                <w:color w:val="0B1F3A"/>
                 <w:sz w:val="20"/>
                 <w:szCs w:val="20"/>
               </w:rPr>
@@ -1151,10 +1151,10 @@
             <w:r>
               <w:rPr>
                 <w:rFonts w:ascii="Calibri" w:cs="Calibri" w:eastAsia="Calibri" w:hAnsi="Calibri"/>
-                <w:b w:val="false"/>
-                <w:bCs w:val="false"/>
-                <w:i/>
-                <w:iCs/>
+                <w:b/>
+                <w:bCs/>
+                <w:i w:val="false"/>
+                <w:iCs w:val="false"/>
                 <w:color w:val="5A6B82"/>
                 <w:sz w:val="22"/>
                 <w:szCs w:val="22"/>
@@ -1185,8 +1185,8 @@
             <w:r>
               <w:rPr>
                 <w:rFonts w:ascii="Calibri" w:cs="Calibri" w:eastAsia="Calibri" w:hAnsi="Calibri"/>
-                <w:i/>
-                <w:iCs/>
+                <w:i w:val="false"/>
+                <w:iCs w:val="false"/>
                 <w:color w:val="5A6B82"/>
                 <w:sz w:val="18"/>
                 <w:szCs w:val="18"/>
@@ -1221,7 +1221,7 @@
                 <w:rFonts w:ascii="Calibri" w:cs="Calibri" w:eastAsia="Calibri" w:hAnsi="Calibri"/>
                 <w:b w:val="false"/>
                 <w:bCs w:val="false"/>
-                <w:color w:val="5A6B82"/>
+                <w:color w:val="0B1F3A"/>
                 <w:sz w:val="20"/>
                 <w:szCs w:val="20"/>
               </w:rPr>
@@ -1251,10 +1251,10 @@
             <w:r>
               <w:rPr>
                 <w:rFonts w:ascii="Calibri" w:cs="Calibri" w:eastAsia="Calibri" w:hAnsi="Calibri"/>
-                <w:b w:val="false"/>
-                <w:bCs w:val="false"/>
-                <w:i/>
-                <w:iCs/>
+                <w:b/>
+                <w:bCs/>
+                <w:i w:val="false"/>
+                <w:iCs w:val="false"/>
                 <w:color w:val="5A6B82"/>
                 <w:sz w:val="22"/>
                 <w:szCs w:val="22"/>
@@ -1285,13 +1285,13 @@
             <w:r>
               <w:rPr>
                 <w:rFonts w:ascii="Calibri" w:cs="Calibri" w:eastAsia="Calibri" w:hAnsi="Calibri"/>
-                <w:i/>
-                <w:iCs/>
+                <w:i w:val="false"/>
+                <w:iCs w:val="false"/>
                 <w:color w:val="5A6B82"/>
                 <w:sz w:val="18"/>
                 <w:szCs w:val="18"/>
               </w:rPr>
-              <w:t xml:space="preserve">Walt Brown</w:t>
+              <w:t xml:space="preserve">EOS Worldwide Head Coach · Walt Brown</w:t>
             </w:r>
           </w:p>
         </w:tc>
@@ -1319,8 +1319,8 @@
             <w:r>
               <w:rPr>
                 <w:rFonts w:ascii="Calibri" w:cs="Calibri" w:eastAsia="Calibri" w:hAnsi="Calibri"/>
-                <w:b/>
-                <w:bCs/>
+                <w:b w:val="false"/>
+                <w:bCs w:val="false"/>
                 <w:color w:val="0B1F3A"/>
                 <w:sz w:val="20"/>
                 <w:szCs w:val="20"/>
@@ -1419,8 +1419,8 @@
             <w:r>
               <w:rPr>
                 <w:rFonts w:ascii="Calibri" w:cs="Calibri" w:eastAsia="Calibri" w:hAnsi="Calibri"/>
-                <w:b/>
-                <w:bCs/>
+                <w:b w:val="false"/>
+                <w:bCs w:val="false"/>
                 <w:color w:val="0B1F3A"/>
                 <w:sz w:val="20"/>
                 <w:szCs w:val="20"/>
@@ -1455,7 +1455,7 @@
                 <w:bCs w:val="false"/>
                 <w:i w:val="false"/>
                 <w:iCs w:val="false"/>
-                <w:color w:val="5A6B82"/>
+                <w:color w:val="1A1A1A"/>
                 <w:sz w:val="20"/>
                 <w:szCs w:val="20"/>
               </w:rPr>
@@ -1519,8 +1519,8 @@
             <w:r>
               <w:rPr>
                 <w:rFonts w:ascii="Calibri" w:cs="Calibri" w:eastAsia="Calibri" w:hAnsi="Calibri"/>
-                <w:b/>
-                <w:bCs/>
+                <w:b w:val="false"/>
+                <w:bCs w:val="false"/>
                 <w:color w:val="0B1F3A"/>
                 <w:sz w:val="20"/>
                 <w:szCs w:val="20"/>
@@ -1619,8 +1619,8 @@
             <w:r>
               <w:rPr>
                 <w:rFonts w:ascii="Calibri" w:cs="Calibri" w:eastAsia="Calibri" w:hAnsi="Calibri"/>
-                <w:b/>
-                <w:bCs/>
+                <w:b w:val="false"/>
+                <w:bCs w:val="false"/>
                 <w:color w:val="0B1F3A"/>
                 <w:sz w:val="20"/>
                 <w:szCs w:val="20"/>
@@ -1655,7 +1655,7 @@
                 <w:bCs w:val="false"/>
                 <w:i w:val="false"/>
                 <w:iCs w:val="false"/>
-                <w:color w:val="5A6B82"/>
+                <w:color w:val="1A1A1A"/>
                 <w:sz w:val="20"/>
                 <w:szCs w:val="20"/>
               </w:rPr>
@@ -1719,8 +1719,8 @@
             <w:r>
               <w:rPr>
                 <w:rFonts w:ascii="Calibri" w:cs="Calibri" w:eastAsia="Calibri" w:hAnsi="Calibri"/>
-                <w:b/>
-                <w:bCs/>
+                <w:b w:val="false"/>
+                <w:bCs w:val="false"/>
                 <w:color w:val="0B1F3A"/>
                 <w:sz w:val="20"/>
                 <w:szCs w:val="20"/>
@@ -1819,8 +1819,8 @@
             <w:r>
               <w:rPr>
                 <w:rFonts w:ascii="Calibri" w:cs="Calibri" w:eastAsia="Calibri" w:hAnsi="Calibri"/>
-                <w:b/>
-                <w:bCs/>
+                <w:b w:val="false"/>
+                <w:bCs w:val="false"/>
                 <w:color w:val="0B1F3A"/>
                 <w:sz w:val="20"/>
                 <w:szCs w:val="20"/>
@@ -1855,7 +1855,7 @@
                 <w:bCs w:val="false"/>
                 <w:i w:val="false"/>
                 <w:iCs w:val="false"/>
-                <w:color w:val="5A6B82"/>
+                <w:color w:val="1A1A1A"/>
                 <w:sz w:val="20"/>
                 <w:szCs w:val="20"/>
               </w:rPr>
@@ -1892,6 +1892,3310 @@
                 <w:szCs w:val="18"/>
               </w:rPr>
               <w:t xml:space="preserve">Celebrate wins. Connect. Go home fired up.</w:t>
+            </w:r>
+          </w:p>
+        </w:tc>
+      </w:tr>
+    </w:tbl>
+    <w:p>
+      <w:r>
+        <w:br w:type="page"/>
+      </w:r>
+    </w:p>
+    <w:p>
+      <w:pPr>
+        <w:spacing w:after="60"/>
+        <w:jc w:val="left"/>
+      </w:pPr>
+      <w:r>
+        <w:rPr>
+          <w:rFonts w:ascii="Calibri" w:cs="Calibri" w:eastAsia="Calibri" w:hAnsi="Calibri"/>
+          <w:b/>
+          <w:bCs/>
+          <w:color w:val="E87722"/>
+          <w:sz w:val="16"/>
+          <w:szCs w:val="16"/>
+        </w:rPr>
+        <w:t xml:space="preserve">GET A GRIP ON YOUR BUSINESS WITH EOS · MY NOTES</w:t>
+      </w:r>
+    </w:p>
+    <w:p>
+      <w:pPr>
+        <w:pBdr>
+          <w:bottom w:val="single" w:color="E87722" w:sz="6"/>
+        </w:pBdr>
+        <w:spacing w:after="300"/>
+        <w:jc w:val="left"/>
+      </w:pPr>
+      <w:r>
+        <w:rPr>
+          <w:rFonts w:ascii="Calibri" w:cs="Calibri" w:eastAsia="Calibri" w:hAnsi="Calibri"/>
+          <w:color w:val="5A6B82"/>
+          <w:sz w:val="18"/>
+          <w:szCs w:val="18"/>
+        </w:rPr>
+        <w:t xml:space="preserve">8:00 – 9:35 AM · Ann Sheu</w:t>
+      </w:r>
+    </w:p>
+    <w:tbl>
+      <w:tblPr>
+        <w:tblW w:type="dxa" w:w="10080"/>
+        <w:tblBorders>
+          <w:top w:val="single" w:color="auto" w:sz="4"/>
+          <w:left w:val="single" w:color="auto" w:sz="4"/>
+          <w:bottom w:val="single" w:color="auto" w:sz="4"/>
+          <w:right w:val="single" w:color="auto" w:sz="4"/>
+          <w:insideH w:val="single" w:color="auto" w:sz="4"/>
+          <w:insideV w:val="single" w:color="auto" w:sz="4"/>
+        </w:tblBorders>
+      </w:tblPr>
+      <w:tblGrid>
+        <w:gridCol w:w="10080"/>
+      </w:tblGrid>
+      <w:tr>
+        <w:trPr>
+          <w:trHeight w:val="460" w:hRule="exact"/>
+        </w:trPr>
+        <w:tc>
+          <w:tcPr>
+            <w:tcW w:type="dxa" w:w="10080"/>
+            <w:tcBorders>
+              <w:top w:val="none" w:color="FFFFFF" w:sz="0"/>
+              <w:left w:val="none" w:color="FFFFFF" w:sz="0"/>
+              <w:bottom w:val="single" w:color="C9D2DE" w:sz="4"/>
+              <w:right w:val="none" w:color="FFFFFF" w:sz="0"/>
+            </w:tcBorders>
+            <w:tcMar>
+              <w:top w:type="dxa" w:w="0"/>
+              <w:left w:type="dxa" w:w="0"/>
+              <w:bottom w:type="dxa" w:w="0"/>
+              <w:right w:type="dxa" w:w="0"/>
+            </w:tcMar>
+          </w:tcPr>
+          <w:p>
+            <w:pPr>
+              <w:spacing w:after="0" w:before="0"/>
+            </w:pPr>
+            <w:r>
+              <w:rPr>
+                <w:rFonts w:ascii="Calibri" w:cs="Calibri" w:eastAsia="Calibri" w:hAnsi="Calibri"/>
+                <w:sz w:val="22"/>
+                <w:szCs w:val="22"/>
+              </w:rPr>
+              <w:t xml:space="preserve"> </w:t>
+            </w:r>
+          </w:p>
+        </w:tc>
+      </w:tr>
+      <w:tr>
+        <w:trPr>
+          <w:trHeight w:val="460" w:hRule="exact"/>
+        </w:trPr>
+        <w:tc>
+          <w:tcPr>
+            <w:tcW w:type="dxa" w:w="10080"/>
+            <w:tcBorders>
+              <w:top w:val="none" w:color="FFFFFF" w:sz="0"/>
+              <w:left w:val="none" w:color="FFFFFF" w:sz="0"/>
+              <w:bottom w:val="single" w:color="C9D2DE" w:sz="4"/>
+              <w:right w:val="none" w:color="FFFFFF" w:sz="0"/>
+            </w:tcBorders>
+            <w:tcMar>
+              <w:top w:type="dxa" w:w="0"/>
+              <w:left w:type="dxa" w:w="0"/>
+              <w:bottom w:type="dxa" w:w="0"/>
+              <w:right w:type="dxa" w:w="0"/>
+            </w:tcMar>
+          </w:tcPr>
+          <w:p>
+            <w:pPr>
+              <w:spacing w:after="0" w:before="0"/>
+            </w:pPr>
+            <w:r>
+              <w:rPr>
+                <w:rFonts w:ascii="Calibri" w:cs="Calibri" w:eastAsia="Calibri" w:hAnsi="Calibri"/>
+                <w:sz w:val="22"/>
+                <w:szCs w:val="22"/>
+              </w:rPr>
+              <w:t xml:space="preserve"> </w:t>
+            </w:r>
+          </w:p>
+        </w:tc>
+      </w:tr>
+      <w:tr>
+        <w:trPr>
+          <w:trHeight w:val="460" w:hRule="exact"/>
+        </w:trPr>
+        <w:tc>
+          <w:tcPr>
+            <w:tcW w:type="dxa" w:w="10080"/>
+            <w:tcBorders>
+              <w:top w:val="none" w:color="FFFFFF" w:sz="0"/>
+              <w:left w:val="none" w:color="FFFFFF" w:sz="0"/>
+              <w:bottom w:val="single" w:color="C9D2DE" w:sz="4"/>
+              <w:right w:val="none" w:color="FFFFFF" w:sz="0"/>
+            </w:tcBorders>
+            <w:tcMar>
+              <w:top w:type="dxa" w:w="0"/>
+              <w:left w:type="dxa" w:w="0"/>
+              <w:bottom w:type="dxa" w:w="0"/>
+              <w:right w:type="dxa" w:w="0"/>
+            </w:tcMar>
+          </w:tcPr>
+          <w:p>
+            <w:pPr>
+              <w:spacing w:after="0" w:before="0"/>
+            </w:pPr>
+            <w:r>
+              <w:rPr>
+                <w:rFonts w:ascii="Calibri" w:cs="Calibri" w:eastAsia="Calibri" w:hAnsi="Calibri"/>
+                <w:sz w:val="22"/>
+                <w:szCs w:val="22"/>
+              </w:rPr>
+              <w:t xml:space="preserve"> </w:t>
+            </w:r>
+          </w:p>
+        </w:tc>
+      </w:tr>
+      <w:tr>
+        <w:trPr>
+          <w:trHeight w:val="460" w:hRule="exact"/>
+        </w:trPr>
+        <w:tc>
+          <w:tcPr>
+            <w:tcW w:type="dxa" w:w="10080"/>
+            <w:tcBorders>
+              <w:top w:val="none" w:color="FFFFFF" w:sz="0"/>
+              <w:left w:val="none" w:color="FFFFFF" w:sz="0"/>
+              <w:bottom w:val="single" w:color="C9D2DE" w:sz="4"/>
+              <w:right w:val="none" w:color="FFFFFF" w:sz="0"/>
+            </w:tcBorders>
+            <w:tcMar>
+              <w:top w:type="dxa" w:w="0"/>
+              <w:left w:type="dxa" w:w="0"/>
+              <w:bottom w:type="dxa" w:w="0"/>
+              <w:right w:type="dxa" w:w="0"/>
+            </w:tcMar>
+          </w:tcPr>
+          <w:p>
+            <w:pPr>
+              <w:spacing w:after="0" w:before="0"/>
+            </w:pPr>
+            <w:r>
+              <w:rPr>
+                <w:rFonts w:ascii="Calibri" w:cs="Calibri" w:eastAsia="Calibri" w:hAnsi="Calibri"/>
+                <w:sz w:val="22"/>
+                <w:szCs w:val="22"/>
+              </w:rPr>
+              <w:t xml:space="preserve"> </w:t>
+            </w:r>
+          </w:p>
+        </w:tc>
+      </w:tr>
+      <w:tr>
+        <w:trPr>
+          <w:trHeight w:val="460" w:hRule="exact"/>
+        </w:trPr>
+        <w:tc>
+          <w:tcPr>
+            <w:tcW w:type="dxa" w:w="10080"/>
+            <w:tcBorders>
+              <w:top w:val="none" w:color="FFFFFF" w:sz="0"/>
+              <w:left w:val="none" w:color="FFFFFF" w:sz="0"/>
+              <w:bottom w:val="single" w:color="C9D2DE" w:sz="4"/>
+              <w:right w:val="none" w:color="FFFFFF" w:sz="0"/>
+            </w:tcBorders>
+            <w:tcMar>
+              <w:top w:type="dxa" w:w="0"/>
+              <w:left w:type="dxa" w:w="0"/>
+              <w:bottom w:type="dxa" w:w="0"/>
+              <w:right w:type="dxa" w:w="0"/>
+            </w:tcMar>
+          </w:tcPr>
+          <w:p>
+            <w:pPr>
+              <w:spacing w:after="0" w:before="0"/>
+            </w:pPr>
+            <w:r>
+              <w:rPr>
+                <w:rFonts w:ascii="Calibri" w:cs="Calibri" w:eastAsia="Calibri" w:hAnsi="Calibri"/>
+                <w:sz w:val="22"/>
+                <w:szCs w:val="22"/>
+              </w:rPr>
+              <w:t xml:space="preserve"> </w:t>
+            </w:r>
+          </w:p>
+        </w:tc>
+      </w:tr>
+      <w:tr>
+        <w:trPr>
+          <w:trHeight w:val="460" w:hRule="exact"/>
+        </w:trPr>
+        <w:tc>
+          <w:tcPr>
+            <w:tcW w:type="dxa" w:w="10080"/>
+            <w:tcBorders>
+              <w:top w:val="none" w:color="FFFFFF" w:sz="0"/>
+              <w:left w:val="none" w:color="FFFFFF" w:sz="0"/>
+              <w:bottom w:val="single" w:color="C9D2DE" w:sz="4"/>
+              <w:right w:val="none" w:color="FFFFFF" w:sz="0"/>
+            </w:tcBorders>
+            <w:tcMar>
+              <w:top w:type="dxa" w:w="0"/>
+              <w:left w:type="dxa" w:w="0"/>
+              <w:bottom w:type="dxa" w:w="0"/>
+              <w:right w:type="dxa" w:w="0"/>
+            </w:tcMar>
+          </w:tcPr>
+          <w:p>
+            <w:pPr>
+              <w:spacing w:after="0" w:before="0"/>
+            </w:pPr>
+            <w:r>
+              <w:rPr>
+                <w:rFonts w:ascii="Calibri" w:cs="Calibri" w:eastAsia="Calibri" w:hAnsi="Calibri"/>
+                <w:sz w:val="22"/>
+                <w:szCs w:val="22"/>
+              </w:rPr>
+              <w:t xml:space="preserve"> </w:t>
+            </w:r>
+          </w:p>
+        </w:tc>
+      </w:tr>
+      <w:tr>
+        <w:trPr>
+          <w:trHeight w:val="460" w:hRule="exact"/>
+        </w:trPr>
+        <w:tc>
+          <w:tcPr>
+            <w:tcW w:type="dxa" w:w="10080"/>
+            <w:tcBorders>
+              <w:top w:val="none" w:color="FFFFFF" w:sz="0"/>
+              <w:left w:val="none" w:color="FFFFFF" w:sz="0"/>
+              <w:bottom w:val="single" w:color="C9D2DE" w:sz="4"/>
+              <w:right w:val="none" w:color="FFFFFF" w:sz="0"/>
+            </w:tcBorders>
+            <w:tcMar>
+              <w:top w:type="dxa" w:w="0"/>
+              <w:left w:type="dxa" w:w="0"/>
+              <w:bottom w:type="dxa" w:w="0"/>
+              <w:right w:type="dxa" w:w="0"/>
+            </w:tcMar>
+          </w:tcPr>
+          <w:p>
+            <w:pPr>
+              <w:spacing w:after="0" w:before="0"/>
+            </w:pPr>
+            <w:r>
+              <w:rPr>
+                <w:rFonts w:ascii="Calibri" w:cs="Calibri" w:eastAsia="Calibri" w:hAnsi="Calibri"/>
+                <w:sz w:val="22"/>
+                <w:szCs w:val="22"/>
+              </w:rPr>
+              <w:t xml:space="preserve"> </w:t>
+            </w:r>
+          </w:p>
+        </w:tc>
+      </w:tr>
+      <w:tr>
+        <w:trPr>
+          <w:trHeight w:val="460" w:hRule="exact"/>
+        </w:trPr>
+        <w:tc>
+          <w:tcPr>
+            <w:tcW w:type="dxa" w:w="10080"/>
+            <w:tcBorders>
+              <w:top w:val="none" w:color="FFFFFF" w:sz="0"/>
+              <w:left w:val="none" w:color="FFFFFF" w:sz="0"/>
+              <w:bottom w:val="single" w:color="C9D2DE" w:sz="4"/>
+              <w:right w:val="none" w:color="FFFFFF" w:sz="0"/>
+            </w:tcBorders>
+            <w:tcMar>
+              <w:top w:type="dxa" w:w="0"/>
+              <w:left w:type="dxa" w:w="0"/>
+              <w:bottom w:type="dxa" w:w="0"/>
+              <w:right w:type="dxa" w:w="0"/>
+            </w:tcMar>
+          </w:tcPr>
+          <w:p>
+            <w:pPr>
+              <w:spacing w:after="0" w:before="0"/>
+            </w:pPr>
+            <w:r>
+              <w:rPr>
+                <w:rFonts w:ascii="Calibri" w:cs="Calibri" w:eastAsia="Calibri" w:hAnsi="Calibri"/>
+                <w:sz w:val="22"/>
+                <w:szCs w:val="22"/>
+              </w:rPr>
+              <w:t xml:space="preserve"> </w:t>
+            </w:r>
+          </w:p>
+        </w:tc>
+      </w:tr>
+      <w:tr>
+        <w:trPr>
+          <w:trHeight w:val="460" w:hRule="exact"/>
+        </w:trPr>
+        <w:tc>
+          <w:tcPr>
+            <w:tcW w:type="dxa" w:w="10080"/>
+            <w:tcBorders>
+              <w:top w:val="none" w:color="FFFFFF" w:sz="0"/>
+              <w:left w:val="none" w:color="FFFFFF" w:sz="0"/>
+              <w:bottom w:val="single" w:color="C9D2DE" w:sz="4"/>
+              <w:right w:val="none" w:color="FFFFFF" w:sz="0"/>
+            </w:tcBorders>
+            <w:tcMar>
+              <w:top w:type="dxa" w:w="0"/>
+              <w:left w:type="dxa" w:w="0"/>
+              <w:bottom w:type="dxa" w:w="0"/>
+              <w:right w:type="dxa" w:w="0"/>
+            </w:tcMar>
+          </w:tcPr>
+          <w:p>
+            <w:pPr>
+              <w:spacing w:after="0" w:before="0"/>
+            </w:pPr>
+            <w:r>
+              <w:rPr>
+                <w:rFonts w:ascii="Calibri" w:cs="Calibri" w:eastAsia="Calibri" w:hAnsi="Calibri"/>
+                <w:sz w:val="22"/>
+                <w:szCs w:val="22"/>
+              </w:rPr>
+              <w:t xml:space="preserve"> </w:t>
+            </w:r>
+          </w:p>
+        </w:tc>
+      </w:tr>
+      <w:tr>
+        <w:trPr>
+          <w:trHeight w:val="460" w:hRule="exact"/>
+        </w:trPr>
+        <w:tc>
+          <w:tcPr>
+            <w:tcW w:type="dxa" w:w="10080"/>
+            <w:tcBorders>
+              <w:top w:val="none" w:color="FFFFFF" w:sz="0"/>
+              <w:left w:val="none" w:color="FFFFFF" w:sz="0"/>
+              <w:bottom w:val="single" w:color="C9D2DE" w:sz="4"/>
+              <w:right w:val="none" w:color="FFFFFF" w:sz="0"/>
+            </w:tcBorders>
+            <w:tcMar>
+              <w:top w:type="dxa" w:w="0"/>
+              <w:left w:type="dxa" w:w="0"/>
+              <w:bottom w:type="dxa" w:w="0"/>
+              <w:right w:type="dxa" w:w="0"/>
+            </w:tcMar>
+          </w:tcPr>
+          <w:p>
+            <w:pPr>
+              <w:spacing w:after="0" w:before="0"/>
+            </w:pPr>
+            <w:r>
+              <w:rPr>
+                <w:rFonts w:ascii="Calibri" w:cs="Calibri" w:eastAsia="Calibri" w:hAnsi="Calibri"/>
+                <w:sz w:val="22"/>
+                <w:szCs w:val="22"/>
+              </w:rPr>
+              <w:t xml:space="preserve"> </w:t>
+            </w:r>
+          </w:p>
+        </w:tc>
+      </w:tr>
+      <w:tr>
+        <w:trPr>
+          <w:trHeight w:val="460" w:hRule="exact"/>
+        </w:trPr>
+        <w:tc>
+          <w:tcPr>
+            <w:tcW w:type="dxa" w:w="10080"/>
+            <w:tcBorders>
+              <w:top w:val="none" w:color="FFFFFF" w:sz="0"/>
+              <w:left w:val="none" w:color="FFFFFF" w:sz="0"/>
+              <w:bottom w:val="single" w:color="C9D2DE" w:sz="4"/>
+              <w:right w:val="none" w:color="FFFFFF" w:sz="0"/>
+            </w:tcBorders>
+            <w:tcMar>
+              <w:top w:type="dxa" w:w="0"/>
+              <w:left w:type="dxa" w:w="0"/>
+              <w:bottom w:type="dxa" w:w="0"/>
+              <w:right w:type="dxa" w:w="0"/>
+            </w:tcMar>
+          </w:tcPr>
+          <w:p>
+            <w:pPr>
+              <w:spacing w:after="0" w:before="0"/>
+            </w:pPr>
+            <w:r>
+              <w:rPr>
+                <w:rFonts w:ascii="Calibri" w:cs="Calibri" w:eastAsia="Calibri" w:hAnsi="Calibri"/>
+                <w:sz w:val="22"/>
+                <w:szCs w:val="22"/>
+              </w:rPr>
+              <w:t xml:space="preserve"> </w:t>
+            </w:r>
+          </w:p>
+        </w:tc>
+      </w:tr>
+      <w:tr>
+        <w:trPr>
+          <w:trHeight w:val="460" w:hRule="exact"/>
+        </w:trPr>
+        <w:tc>
+          <w:tcPr>
+            <w:tcW w:type="dxa" w:w="10080"/>
+            <w:tcBorders>
+              <w:top w:val="none" w:color="FFFFFF" w:sz="0"/>
+              <w:left w:val="none" w:color="FFFFFF" w:sz="0"/>
+              <w:bottom w:val="single" w:color="C9D2DE" w:sz="4"/>
+              <w:right w:val="none" w:color="FFFFFF" w:sz="0"/>
+            </w:tcBorders>
+            <w:tcMar>
+              <w:top w:type="dxa" w:w="0"/>
+              <w:left w:type="dxa" w:w="0"/>
+              <w:bottom w:type="dxa" w:w="0"/>
+              <w:right w:type="dxa" w:w="0"/>
+            </w:tcMar>
+          </w:tcPr>
+          <w:p>
+            <w:pPr>
+              <w:spacing w:after="0" w:before="0"/>
+            </w:pPr>
+            <w:r>
+              <w:rPr>
+                <w:rFonts w:ascii="Calibri" w:cs="Calibri" w:eastAsia="Calibri" w:hAnsi="Calibri"/>
+                <w:sz w:val="22"/>
+                <w:szCs w:val="22"/>
+              </w:rPr>
+              <w:t xml:space="preserve"> </w:t>
+            </w:r>
+          </w:p>
+        </w:tc>
+      </w:tr>
+      <w:tr>
+        <w:trPr>
+          <w:trHeight w:val="460" w:hRule="exact"/>
+        </w:trPr>
+        <w:tc>
+          <w:tcPr>
+            <w:tcW w:type="dxa" w:w="10080"/>
+            <w:tcBorders>
+              <w:top w:val="none" w:color="FFFFFF" w:sz="0"/>
+              <w:left w:val="none" w:color="FFFFFF" w:sz="0"/>
+              <w:bottom w:val="single" w:color="C9D2DE" w:sz="4"/>
+              <w:right w:val="none" w:color="FFFFFF" w:sz="0"/>
+            </w:tcBorders>
+            <w:tcMar>
+              <w:top w:type="dxa" w:w="0"/>
+              <w:left w:type="dxa" w:w="0"/>
+              <w:bottom w:type="dxa" w:w="0"/>
+              <w:right w:type="dxa" w:w="0"/>
+            </w:tcMar>
+          </w:tcPr>
+          <w:p>
+            <w:pPr>
+              <w:spacing w:after="0" w:before="0"/>
+            </w:pPr>
+            <w:r>
+              <w:rPr>
+                <w:rFonts w:ascii="Calibri" w:cs="Calibri" w:eastAsia="Calibri" w:hAnsi="Calibri"/>
+                <w:sz w:val="22"/>
+                <w:szCs w:val="22"/>
+              </w:rPr>
+              <w:t xml:space="preserve"> </w:t>
+            </w:r>
+          </w:p>
+        </w:tc>
+      </w:tr>
+      <w:tr>
+        <w:trPr>
+          <w:trHeight w:val="460" w:hRule="exact"/>
+        </w:trPr>
+        <w:tc>
+          <w:tcPr>
+            <w:tcW w:type="dxa" w:w="10080"/>
+            <w:tcBorders>
+              <w:top w:val="none" w:color="FFFFFF" w:sz="0"/>
+              <w:left w:val="none" w:color="FFFFFF" w:sz="0"/>
+              <w:bottom w:val="single" w:color="C9D2DE" w:sz="4"/>
+              <w:right w:val="none" w:color="FFFFFF" w:sz="0"/>
+            </w:tcBorders>
+            <w:tcMar>
+              <w:top w:type="dxa" w:w="0"/>
+              <w:left w:type="dxa" w:w="0"/>
+              <w:bottom w:type="dxa" w:w="0"/>
+              <w:right w:type="dxa" w:w="0"/>
+            </w:tcMar>
+          </w:tcPr>
+          <w:p>
+            <w:pPr>
+              <w:spacing w:after="0" w:before="0"/>
+            </w:pPr>
+            <w:r>
+              <w:rPr>
+                <w:rFonts w:ascii="Calibri" w:cs="Calibri" w:eastAsia="Calibri" w:hAnsi="Calibri"/>
+                <w:sz w:val="22"/>
+                <w:szCs w:val="22"/>
+              </w:rPr>
+              <w:t xml:space="preserve"> </w:t>
+            </w:r>
+          </w:p>
+        </w:tc>
+      </w:tr>
+      <w:tr>
+        <w:trPr>
+          <w:trHeight w:val="460" w:hRule="exact"/>
+        </w:trPr>
+        <w:tc>
+          <w:tcPr>
+            <w:tcW w:type="dxa" w:w="10080"/>
+            <w:tcBorders>
+              <w:top w:val="none" w:color="FFFFFF" w:sz="0"/>
+              <w:left w:val="none" w:color="FFFFFF" w:sz="0"/>
+              <w:bottom w:val="single" w:color="C9D2DE" w:sz="4"/>
+              <w:right w:val="none" w:color="FFFFFF" w:sz="0"/>
+            </w:tcBorders>
+            <w:tcMar>
+              <w:top w:type="dxa" w:w="0"/>
+              <w:left w:type="dxa" w:w="0"/>
+              <w:bottom w:type="dxa" w:w="0"/>
+              <w:right w:type="dxa" w:w="0"/>
+            </w:tcMar>
+          </w:tcPr>
+          <w:p>
+            <w:pPr>
+              <w:spacing w:after="0" w:before="0"/>
+            </w:pPr>
+            <w:r>
+              <w:rPr>
+                <w:rFonts w:ascii="Calibri" w:cs="Calibri" w:eastAsia="Calibri" w:hAnsi="Calibri"/>
+                <w:sz w:val="22"/>
+                <w:szCs w:val="22"/>
+              </w:rPr>
+              <w:t xml:space="preserve"> </w:t>
+            </w:r>
+          </w:p>
+        </w:tc>
+      </w:tr>
+      <w:tr>
+        <w:trPr>
+          <w:trHeight w:val="460" w:hRule="exact"/>
+        </w:trPr>
+        <w:tc>
+          <w:tcPr>
+            <w:tcW w:type="dxa" w:w="10080"/>
+            <w:tcBorders>
+              <w:top w:val="none" w:color="FFFFFF" w:sz="0"/>
+              <w:left w:val="none" w:color="FFFFFF" w:sz="0"/>
+              <w:bottom w:val="single" w:color="C9D2DE" w:sz="4"/>
+              <w:right w:val="none" w:color="FFFFFF" w:sz="0"/>
+            </w:tcBorders>
+            <w:tcMar>
+              <w:top w:type="dxa" w:w="0"/>
+              <w:left w:type="dxa" w:w="0"/>
+              <w:bottom w:type="dxa" w:w="0"/>
+              <w:right w:type="dxa" w:w="0"/>
+            </w:tcMar>
+          </w:tcPr>
+          <w:p>
+            <w:pPr>
+              <w:spacing w:after="0" w:before="0"/>
+            </w:pPr>
+            <w:r>
+              <w:rPr>
+                <w:rFonts w:ascii="Calibri" w:cs="Calibri" w:eastAsia="Calibri" w:hAnsi="Calibri"/>
+                <w:sz w:val="22"/>
+                <w:szCs w:val="22"/>
+              </w:rPr>
+              <w:t xml:space="preserve"> </w:t>
+            </w:r>
+          </w:p>
+        </w:tc>
+      </w:tr>
+      <w:tr>
+        <w:trPr>
+          <w:trHeight w:val="460" w:hRule="exact"/>
+        </w:trPr>
+        <w:tc>
+          <w:tcPr>
+            <w:tcW w:type="dxa" w:w="10080"/>
+            <w:tcBorders>
+              <w:top w:val="none" w:color="FFFFFF" w:sz="0"/>
+              <w:left w:val="none" w:color="FFFFFF" w:sz="0"/>
+              <w:bottom w:val="single" w:color="C9D2DE" w:sz="4"/>
+              <w:right w:val="none" w:color="FFFFFF" w:sz="0"/>
+            </w:tcBorders>
+            <w:tcMar>
+              <w:top w:type="dxa" w:w="0"/>
+              <w:left w:type="dxa" w:w="0"/>
+              <w:bottom w:type="dxa" w:w="0"/>
+              <w:right w:type="dxa" w:w="0"/>
+            </w:tcMar>
+          </w:tcPr>
+          <w:p>
+            <w:pPr>
+              <w:spacing w:after="0" w:before="0"/>
+            </w:pPr>
+            <w:r>
+              <w:rPr>
+                <w:rFonts w:ascii="Calibri" w:cs="Calibri" w:eastAsia="Calibri" w:hAnsi="Calibri"/>
+                <w:sz w:val="22"/>
+                <w:szCs w:val="22"/>
+              </w:rPr>
+              <w:t xml:space="preserve"> </w:t>
+            </w:r>
+          </w:p>
+        </w:tc>
+      </w:tr>
+      <w:tr>
+        <w:trPr>
+          <w:trHeight w:val="460" w:hRule="exact"/>
+        </w:trPr>
+        <w:tc>
+          <w:tcPr>
+            <w:tcW w:type="dxa" w:w="10080"/>
+            <w:tcBorders>
+              <w:top w:val="none" w:color="FFFFFF" w:sz="0"/>
+              <w:left w:val="none" w:color="FFFFFF" w:sz="0"/>
+              <w:bottom w:val="single" w:color="C9D2DE" w:sz="4"/>
+              <w:right w:val="none" w:color="FFFFFF" w:sz="0"/>
+            </w:tcBorders>
+            <w:tcMar>
+              <w:top w:type="dxa" w:w="0"/>
+              <w:left w:type="dxa" w:w="0"/>
+              <w:bottom w:type="dxa" w:w="0"/>
+              <w:right w:type="dxa" w:w="0"/>
+            </w:tcMar>
+          </w:tcPr>
+          <w:p>
+            <w:pPr>
+              <w:spacing w:after="0" w:before="0"/>
+            </w:pPr>
+            <w:r>
+              <w:rPr>
+                <w:rFonts w:ascii="Calibri" w:cs="Calibri" w:eastAsia="Calibri" w:hAnsi="Calibri"/>
+                <w:sz w:val="22"/>
+                <w:szCs w:val="22"/>
+              </w:rPr>
+              <w:t xml:space="preserve"> </w:t>
+            </w:r>
+          </w:p>
+        </w:tc>
+      </w:tr>
+      <w:tr>
+        <w:trPr>
+          <w:trHeight w:val="460" w:hRule="exact"/>
+        </w:trPr>
+        <w:tc>
+          <w:tcPr>
+            <w:tcW w:type="dxa" w:w="10080"/>
+            <w:tcBorders>
+              <w:top w:val="none" w:color="FFFFFF" w:sz="0"/>
+              <w:left w:val="none" w:color="FFFFFF" w:sz="0"/>
+              <w:bottom w:val="single" w:color="C9D2DE" w:sz="4"/>
+              <w:right w:val="none" w:color="FFFFFF" w:sz="0"/>
+            </w:tcBorders>
+            <w:tcMar>
+              <w:top w:type="dxa" w:w="0"/>
+              <w:left w:type="dxa" w:w="0"/>
+              <w:bottom w:type="dxa" w:w="0"/>
+              <w:right w:type="dxa" w:w="0"/>
+            </w:tcMar>
+          </w:tcPr>
+          <w:p>
+            <w:pPr>
+              <w:spacing w:after="0" w:before="0"/>
+            </w:pPr>
+            <w:r>
+              <w:rPr>
+                <w:rFonts w:ascii="Calibri" w:cs="Calibri" w:eastAsia="Calibri" w:hAnsi="Calibri"/>
+                <w:sz w:val="22"/>
+                <w:szCs w:val="22"/>
+              </w:rPr>
+              <w:t xml:space="preserve"> </w:t>
+            </w:r>
+          </w:p>
+        </w:tc>
+      </w:tr>
+      <w:tr>
+        <w:trPr>
+          <w:trHeight w:val="460" w:hRule="exact"/>
+        </w:trPr>
+        <w:tc>
+          <w:tcPr>
+            <w:tcW w:type="dxa" w:w="10080"/>
+            <w:tcBorders>
+              <w:top w:val="none" w:color="FFFFFF" w:sz="0"/>
+              <w:left w:val="none" w:color="FFFFFF" w:sz="0"/>
+              <w:bottom w:val="single" w:color="C9D2DE" w:sz="4"/>
+              <w:right w:val="none" w:color="FFFFFF" w:sz="0"/>
+            </w:tcBorders>
+            <w:tcMar>
+              <w:top w:type="dxa" w:w="0"/>
+              <w:left w:type="dxa" w:w="0"/>
+              <w:bottom w:type="dxa" w:w="0"/>
+              <w:right w:type="dxa" w:w="0"/>
+            </w:tcMar>
+          </w:tcPr>
+          <w:p>
+            <w:pPr>
+              <w:spacing w:after="0" w:before="0"/>
+            </w:pPr>
+            <w:r>
+              <w:rPr>
+                <w:rFonts w:ascii="Calibri" w:cs="Calibri" w:eastAsia="Calibri" w:hAnsi="Calibri"/>
+                <w:sz w:val="22"/>
+                <w:szCs w:val="22"/>
+              </w:rPr>
+              <w:t xml:space="preserve"> </w:t>
+            </w:r>
+          </w:p>
+        </w:tc>
+      </w:tr>
+      <w:tr>
+        <w:trPr>
+          <w:trHeight w:val="460" w:hRule="exact"/>
+        </w:trPr>
+        <w:tc>
+          <w:tcPr>
+            <w:tcW w:type="dxa" w:w="10080"/>
+            <w:tcBorders>
+              <w:top w:val="none" w:color="FFFFFF" w:sz="0"/>
+              <w:left w:val="none" w:color="FFFFFF" w:sz="0"/>
+              <w:bottom w:val="single" w:color="C9D2DE" w:sz="4"/>
+              <w:right w:val="none" w:color="FFFFFF" w:sz="0"/>
+            </w:tcBorders>
+            <w:tcMar>
+              <w:top w:type="dxa" w:w="0"/>
+              <w:left w:type="dxa" w:w="0"/>
+              <w:bottom w:type="dxa" w:w="0"/>
+              <w:right w:type="dxa" w:w="0"/>
+            </w:tcMar>
+          </w:tcPr>
+          <w:p>
+            <w:pPr>
+              <w:spacing w:after="0" w:before="0"/>
+            </w:pPr>
+            <w:r>
+              <w:rPr>
+                <w:rFonts w:ascii="Calibri" w:cs="Calibri" w:eastAsia="Calibri" w:hAnsi="Calibri"/>
+                <w:sz w:val="22"/>
+                <w:szCs w:val="22"/>
+              </w:rPr>
+              <w:t xml:space="preserve"> </w:t>
+            </w:r>
+          </w:p>
+        </w:tc>
+      </w:tr>
+      <w:tr>
+        <w:trPr>
+          <w:trHeight w:val="460" w:hRule="exact"/>
+        </w:trPr>
+        <w:tc>
+          <w:tcPr>
+            <w:tcW w:type="dxa" w:w="10080"/>
+            <w:tcBorders>
+              <w:top w:val="none" w:color="FFFFFF" w:sz="0"/>
+              <w:left w:val="none" w:color="FFFFFF" w:sz="0"/>
+              <w:bottom w:val="single" w:color="C9D2DE" w:sz="4"/>
+              <w:right w:val="none" w:color="FFFFFF" w:sz="0"/>
+            </w:tcBorders>
+            <w:tcMar>
+              <w:top w:type="dxa" w:w="0"/>
+              <w:left w:type="dxa" w:w="0"/>
+              <w:bottom w:type="dxa" w:w="0"/>
+              <w:right w:type="dxa" w:w="0"/>
+            </w:tcMar>
+          </w:tcPr>
+          <w:p>
+            <w:pPr>
+              <w:spacing w:after="0" w:before="0"/>
+            </w:pPr>
+            <w:r>
+              <w:rPr>
+                <w:rFonts w:ascii="Calibri" w:cs="Calibri" w:eastAsia="Calibri" w:hAnsi="Calibri"/>
+                <w:sz w:val="22"/>
+                <w:szCs w:val="22"/>
+              </w:rPr>
+              <w:t xml:space="preserve"> </w:t>
+            </w:r>
+          </w:p>
+        </w:tc>
+      </w:tr>
+    </w:tbl>
+    <w:p>
+      <w:r>
+        <w:br w:type="page"/>
+      </w:r>
+    </w:p>
+    <w:p>
+      <w:pPr>
+        <w:spacing w:after="60"/>
+        <w:jc w:val="left"/>
+      </w:pPr>
+      <w:r>
+        <w:rPr>
+          <w:rFonts w:ascii="Calibri" w:cs="Calibri" w:eastAsia="Calibri" w:hAnsi="Calibri"/>
+          <w:b/>
+          <w:bCs/>
+          <w:color w:val="E87722"/>
+          <w:sz w:val="16"/>
+          <w:szCs w:val="16"/>
+        </w:rPr>
+        <w:t xml:space="preserve">JOURNEY WITH AN EOS IMPLEMENTER · MY NOTES</w:t>
+      </w:r>
+    </w:p>
+    <w:p>
+      <w:pPr>
+        <w:pBdr>
+          <w:bottom w:val="single" w:color="E87722" w:sz="6"/>
+        </w:pBdr>
+        <w:spacing w:after="300"/>
+        <w:jc w:val="left"/>
+      </w:pPr>
+      <w:r>
+        <w:rPr>
+          <w:rFonts w:ascii="Calibri" w:cs="Calibri" w:eastAsia="Calibri" w:hAnsi="Calibri"/>
+          <w:color w:val="5A6B82"/>
+          <w:sz w:val="18"/>
+          <w:szCs w:val="18"/>
+        </w:rPr>
+        <w:t xml:space="preserve">9:55 – 10:45 AM · Strety</w:t>
+      </w:r>
+    </w:p>
+    <w:tbl>
+      <w:tblPr>
+        <w:tblW w:type="dxa" w:w="10080"/>
+        <w:tblBorders>
+          <w:top w:val="single" w:color="auto" w:sz="4"/>
+          <w:left w:val="single" w:color="auto" w:sz="4"/>
+          <w:bottom w:val="single" w:color="auto" w:sz="4"/>
+          <w:right w:val="single" w:color="auto" w:sz="4"/>
+          <w:insideH w:val="single" w:color="auto" w:sz="4"/>
+          <w:insideV w:val="single" w:color="auto" w:sz="4"/>
+        </w:tblBorders>
+      </w:tblPr>
+      <w:tblGrid>
+        <w:gridCol w:w="10080"/>
+      </w:tblGrid>
+      <w:tr>
+        <w:trPr>
+          <w:trHeight w:val="460" w:hRule="exact"/>
+        </w:trPr>
+        <w:tc>
+          <w:tcPr>
+            <w:tcW w:type="dxa" w:w="10080"/>
+            <w:tcBorders>
+              <w:top w:val="none" w:color="FFFFFF" w:sz="0"/>
+              <w:left w:val="none" w:color="FFFFFF" w:sz="0"/>
+              <w:bottom w:val="single" w:color="C9D2DE" w:sz="4"/>
+              <w:right w:val="none" w:color="FFFFFF" w:sz="0"/>
+            </w:tcBorders>
+            <w:tcMar>
+              <w:top w:type="dxa" w:w="0"/>
+              <w:left w:type="dxa" w:w="0"/>
+              <w:bottom w:type="dxa" w:w="0"/>
+              <w:right w:type="dxa" w:w="0"/>
+            </w:tcMar>
+          </w:tcPr>
+          <w:p>
+            <w:pPr>
+              <w:spacing w:after="0" w:before="0"/>
+            </w:pPr>
+            <w:r>
+              <w:rPr>
+                <w:rFonts w:ascii="Calibri" w:cs="Calibri" w:eastAsia="Calibri" w:hAnsi="Calibri"/>
+                <w:sz w:val="22"/>
+                <w:szCs w:val="22"/>
+              </w:rPr>
+              <w:t xml:space="preserve"> </w:t>
+            </w:r>
+          </w:p>
+        </w:tc>
+      </w:tr>
+      <w:tr>
+        <w:trPr>
+          <w:trHeight w:val="460" w:hRule="exact"/>
+        </w:trPr>
+        <w:tc>
+          <w:tcPr>
+            <w:tcW w:type="dxa" w:w="10080"/>
+            <w:tcBorders>
+              <w:top w:val="none" w:color="FFFFFF" w:sz="0"/>
+              <w:left w:val="none" w:color="FFFFFF" w:sz="0"/>
+              <w:bottom w:val="single" w:color="C9D2DE" w:sz="4"/>
+              <w:right w:val="none" w:color="FFFFFF" w:sz="0"/>
+            </w:tcBorders>
+            <w:tcMar>
+              <w:top w:type="dxa" w:w="0"/>
+              <w:left w:type="dxa" w:w="0"/>
+              <w:bottom w:type="dxa" w:w="0"/>
+              <w:right w:type="dxa" w:w="0"/>
+            </w:tcMar>
+          </w:tcPr>
+          <w:p>
+            <w:pPr>
+              <w:spacing w:after="0" w:before="0"/>
+            </w:pPr>
+            <w:r>
+              <w:rPr>
+                <w:rFonts w:ascii="Calibri" w:cs="Calibri" w:eastAsia="Calibri" w:hAnsi="Calibri"/>
+                <w:sz w:val="22"/>
+                <w:szCs w:val="22"/>
+              </w:rPr>
+              <w:t xml:space="preserve"> </w:t>
+            </w:r>
+          </w:p>
+        </w:tc>
+      </w:tr>
+      <w:tr>
+        <w:trPr>
+          <w:trHeight w:val="460" w:hRule="exact"/>
+        </w:trPr>
+        <w:tc>
+          <w:tcPr>
+            <w:tcW w:type="dxa" w:w="10080"/>
+            <w:tcBorders>
+              <w:top w:val="none" w:color="FFFFFF" w:sz="0"/>
+              <w:left w:val="none" w:color="FFFFFF" w:sz="0"/>
+              <w:bottom w:val="single" w:color="C9D2DE" w:sz="4"/>
+              <w:right w:val="none" w:color="FFFFFF" w:sz="0"/>
+            </w:tcBorders>
+            <w:tcMar>
+              <w:top w:type="dxa" w:w="0"/>
+              <w:left w:type="dxa" w:w="0"/>
+              <w:bottom w:type="dxa" w:w="0"/>
+              <w:right w:type="dxa" w:w="0"/>
+            </w:tcMar>
+          </w:tcPr>
+          <w:p>
+            <w:pPr>
+              <w:spacing w:after="0" w:before="0"/>
+            </w:pPr>
+            <w:r>
+              <w:rPr>
+                <w:rFonts w:ascii="Calibri" w:cs="Calibri" w:eastAsia="Calibri" w:hAnsi="Calibri"/>
+                <w:sz w:val="22"/>
+                <w:szCs w:val="22"/>
+              </w:rPr>
+              <w:t xml:space="preserve"> </w:t>
+            </w:r>
+          </w:p>
+        </w:tc>
+      </w:tr>
+      <w:tr>
+        <w:trPr>
+          <w:trHeight w:val="460" w:hRule="exact"/>
+        </w:trPr>
+        <w:tc>
+          <w:tcPr>
+            <w:tcW w:type="dxa" w:w="10080"/>
+            <w:tcBorders>
+              <w:top w:val="none" w:color="FFFFFF" w:sz="0"/>
+              <w:left w:val="none" w:color="FFFFFF" w:sz="0"/>
+              <w:bottom w:val="single" w:color="C9D2DE" w:sz="4"/>
+              <w:right w:val="none" w:color="FFFFFF" w:sz="0"/>
+            </w:tcBorders>
+            <w:tcMar>
+              <w:top w:type="dxa" w:w="0"/>
+              <w:left w:type="dxa" w:w="0"/>
+              <w:bottom w:type="dxa" w:w="0"/>
+              <w:right w:type="dxa" w:w="0"/>
+            </w:tcMar>
+          </w:tcPr>
+          <w:p>
+            <w:pPr>
+              <w:spacing w:after="0" w:before="0"/>
+            </w:pPr>
+            <w:r>
+              <w:rPr>
+                <w:rFonts w:ascii="Calibri" w:cs="Calibri" w:eastAsia="Calibri" w:hAnsi="Calibri"/>
+                <w:sz w:val="22"/>
+                <w:szCs w:val="22"/>
+              </w:rPr>
+              <w:t xml:space="preserve"> </w:t>
+            </w:r>
+          </w:p>
+        </w:tc>
+      </w:tr>
+      <w:tr>
+        <w:trPr>
+          <w:trHeight w:val="460" w:hRule="exact"/>
+        </w:trPr>
+        <w:tc>
+          <w:tcPr>
+            <w:tcW w:type="dxa" w:w="10080"/>
+            <w:tcBorders>
+              <w:top w:val="none" w:color="FFFFFF" w:sz="0"/>
+              <w:left w:val="none" w:color="FFFFFF" w:sz="0"/>
+              <w:bottom w:val="single" w:color="C9D2DE" w:sz="4"/>
+              <w:right w:val="none" w:color="FFFFFF" w:sz="0"/>
+            </w:tcBorders>
+            <w:tcMar>
+              <w:top w:type="dxa" w:w="0"/>
+              <w:left w:type="dxa" w:w="0"/>
+              <w:bottom w:type="dxa" w:w="0"/>
+              <w:right w:type="dxa" w:w="0"/>
+            </w:tcMar>
+          </w:tcPr>
+          <w:p>
+            <w:pPr>
+              <w:spacing w:after="0" w:before="0"/>
+            </w:pPr>
+            <w:r>
+              <w:rPr>
+                <w:rFonts w:ascii="Calibri" w:cs="Calibri" w:eastAsia="Calibri" w:hAnsi="Calibri"/>
+                <w:sz w:val="22"/>
+                <w:szCs w:val="22"/>
+              </w:rPr>
+              <w:t xml:space="preserve"> </w:t>
+            </w:r>
+          </w:p>
+        </w:tc>
+      </w:tr>
+      <w:tr>
+        <w:trPr>
+          <w:trHeight w:val="460" w:hRule="exact"/>
+        </w:trPr>
+        <w:tc>
+          <w:tcPr>
+            <w:tcW w:type="dxa" w:w="10080"/>
+            <w:tcBorders>
+              <w:top w:val="none" w:color="FFFFFF" w:sz="0"/>
+              <w:left w:val="none" w:color="FFFFFF" w:sz="0"/>
+              <w:bottom w:val="single" w:color="C9D2DE" w:sz="4"/>
+              <w:right w:val="none" w:color="FFFFFF" w:sz="0"/>
+            </w:tcBorders>
+            <w:tcMar>
+              <w:top w:type="dxa" w:w="0"/>
+              <w:left w:type="dxa" w:w="0"/>
+              <w:bottom w:type="dxa" w:w="0"/>
+              <w:right w:type="dxa" w:w="0"/>
+            </w:tcMar>
+          </w:tcPr>
+          <w:p>
+            <w:pPr>
+              <w:spacing w:after="0" w:before="0"/>
+            </w:pPr>
+            <w:r>
+              <w:rPr>
+                <w:rFonts w:ascii="Calibri" w:cs="Calibri" w:eastAsia="Calibri" w:hAnsi="Calibri"/>
+                <w:sz w:val="22"/>
+                <w:szCs w:val="22"/>
+              </w:rPr>
+              <w:t xml:space="preserve"> </w:t>
+            </w:r>
+          </w:p>
+        </w:tc>
+      </w:tr>
+      <w:tr>
+        <w:trPr>
+          <w:trHeight w:val="460" w:hRule="exact"/>
+        </w:trPr>
+        <w:tc>
+          <w:tcPr>
+            <w:tcW w:type="dxa" w:w="10080"/>
+            <w:tcBorders>
+              <w:top w:val="none" w:color="FFFFFF" w:sz="0"/>
+              <w:left w:val="none" w:color="FFFFFF" w:sz="0"/>
+              <w:bottom w:val="single" w:color="C9D2DE" w:sz="4"/>
+              <w:right w:val="none" w:color="FFFFFF" w:sz="0"/>
+            </w:tcBorders>
+            <w:tcMar>
+              <w:top w:type="dxa" w:w="0"/>
+              <w:left w:type="dxa" w:w="0"/>
+              <w:bottom w:type="dxa" w:w="0"/>
+              <w:right w:type="dxa" w:w="0"/>
+            </w:tcMar>
+          </w:tcPr>
+          <w:p>
+            <w:pPr>
+              <w:spacing w:after="0" w:before="0"/>
+            </w:pPr>
+            <w:r>
+              <w:rPr>
+                <w:rFonts w:ascii="Calibri" w:cs="Calibri" w:eastAsia="Calibri" w:hAnsi="Calibri"/>
+                <w:sz w:val="22"/>
+                <w:szCs w:val="22"/>
+              </w:rPr>
+              <w:t xml:space="preserve"> </w:t>
+            </w:r>
+          </w:p>
+        </w:tc>
+      </w:tr>
+      <w:tr>
+        <w:trPr>
+          <w:trHeight w:val="460" w:hRule="exact"/>
+        </w:trPr>
+        <w:tc>
+          <w:tcPr>
+            <w:tcW w:type="dxa" w:w="10080"/>
+            <w:tcBorders>
+              <w:top w:val="none" w:color="FFFFFF" w:sz="0"/>
+              <w:left w:val="none" w:color="FFFFFF" w:sz="0"/>
+              <w:bottom w:val="single" w:color="C9D2DE" w:sz="4"/>
+              <w:right w:val="none" w:color="FFFFFF" w:sz="0"/>
+            </w:tcBorders>
+            <w:tcMar>
+              <w:top w:type="dxa" w:w="0"/>
+              <w:left w:type="dxa" w:w="0"/>
+              <w:bottom w:type="dxa" w:w="0"/>
+              <w:right w:type="dxa" w:w="0"/>
+            </w:tcMar>
+          </w:tcPr>
+          <w:p>
+            <w:pPr>
+              <w:spacing w:after="0" w:before="0"/>
+            </w:pPr>
+            <w:r>
+              <w:rPr>
+                <w:rFonts w:ascii="Calibri" w:cs="Calibri" w:eastAsia="Calibri" w:hAnsi="Calibri"/>
+                <w:sz w:val="22"/>
+                <w:szCs w:val="22"/>
+              </w:rPr>
+              <w:t xml:space="preserve"> </w:t>
+            </w:r>
+          </w:p>
+        </w:tc>
+      </w:tr>
+      <w:tr>
+        <w:trPr>
+          <w:trHeight w:val="460" w:hRule="exact"/>
+        </w:trPr>
+        <w:tc>
+          <w:tcPr>
+            <w:tcW w:type="dxa" w:w="10080"/>
+            <w:tcBorders>
+              <w:top w:val="none" w:color="FFFFFF" w:sz="0"/>
+              <w:left w:val="none" w:color="FFFFFF" w:sz="0"/>
+              <w:bottom w:val="single" w:color="C9D2DE" w:sz="4"/>
+              <w:right w:val="none" w:color="FFFFFF" w:sz="0"/>
+            </w:tcBorders>
+            <w:tcMar>
+              <w:top w:type="dxa" w:w="0"/>
+              <w:left w:type="dxa" w:w="0"/>
+              <w:bottom w:type="dxa" w:w="0"/>
+              <w:right w:type="dxa" w:w="0"/>
+            </w:tcMar>
+          </w:tcPr>
+          <w:p>
+            <w:pPr>
+              <w:spacing w:after="0" w:before="0"/>
+            </w:pPr>
+            <w:r>
+              <w:rPr>
+                <w:rFonts w:ascii="Calibri" w:cs="Calibri" w:eastAsia="Calibri" w:hAnsi="Calibri"/>
+                <w:sz w:val="22"/>
+                <w:szCs w:val="22"/>
+              </w:rPr>
+              <w:t xml:space="preserve"> </w:t>
+            </w:r>
+          </w:p>
+        </w:tc>
+      </w:tr>
+      <w:tr>
+        <w:trPr>
+          <w:trHeight w:val="460" w:hRule="exact"/>
+        </w:trPr>
+        <w:tc>
+          <w:tcPr>
+            <w:tcW w:type="dxa" w:w="10080"/>
+            <w:tcBorders>
+              <w:top w:val="none" w:color="FFFFFF" w:sz="0"/>
+              <w:left w:val="none" w:color="FFFFFF" w:sz="0"/>
+              <w:bottom w:val="single" w:color="C9D2DE" w:sz="4"/>
+              <w:right w:val="none" w:color="FFFFFF" w:sz="0"/>
+            </w:tcBorders>
+            <w:tcMar>
+              <w:top w:type="dxa" w:w="0"/>
+              <w:left w:type="dxa" w:w="0"/>
+              <w:bottom w:type="dxa" w:w="0"/>
+              <w:right w:type="dxa" w:w="0"/>
+            </w:tcMar>
+          </w:tcPr>
+          <w:p>
+            <w:pPr>
+              <w:spacing w:after="0" w:before="0"/>
+            </w:pPr>
+            <w:r>
+              <w:rPr>
+                <w:rFonts w:ascii="Calibri" w:cs="Calibri" w:eastAsia="Calibri" w:hAnsi="Calibri"/>
+                <w:sz w:val="22"/>
+                <w:szCs w:val="22"/>
+              </w:rPr>
+              <w:t xml:space="preserve"> </w:t>
+            </w:r>
+          </w:p>
+        </w:tc>
+      </w:tr>
+      <w:tr>
+        <w:trPr>
+          <w:trHeight w:val="460" w:hRule="exact"/>
+        </w:trPr>
+        <w:tc>
+          <w:tcPr>
+            <w:tcW w:type="dxa" w:w="10080"/>
+            <w:tcBorders>
+              <w:top w:val="none" w:color="FFFFFF" w:sz="0"/>
+              <w:left w:val="none" w:color="FFFFFF" w:sz="0"/>
+              <w:bottom w:val="single" w:color="C9D2DE" w:sz="4"/>
+              <w:right w:val="none" w:color="FFFFFF" w:sz="0"/>
+            </w:tcBorders>
+            <w:tcMar>
+              <w:top w:type="dxa" w:w="0"/>
+              <w:left w:type="dxa" w:w="0"/>
+              <w:bottom w:type="dxa" w:w="0"/>
+              <w:right w:type="dxa" w:w="0"/>
+            </w:tcMar>
+          </w:tcPr>
+          <w:p>
+            <w:pPr>
+              <w:spacing w:after="0" w:before="0"/>
+            </w:pPr>
+            <w:r>
+              <w:rPr>
+                <w:rFonts w:ascii="Calibri" w:cs="Calibri" w:eastAsia="Calibri" w:hAnsi="Calibri"/>
+                <w:sz w:val="22"/>
+                <w:szCs w:val="22"/>
+              </w:rPr>
+              <w:t xml:space="preserve"> </w:t>
+            </w:r>
+          </w:p>
+        </w:tc>
+      </w:tr>
+      <w:tr>
+        <w:trPr>
+          <w:trHeight w:val="460" w:hRule="exact"/>
+        </w:trPr>
+        <w:tc>
+          <w:tcPr>
+            <w:tcW w:type="dxa" w:w="10080"/>
+            <w:tcBorders>
+              <w:top w:val="none" w:color="FFFFFF" w:sz="0"/>
+              <w:left w:val="none" w:color="FFFFFF" w:sz="0"/>
+              <w:bottom w:val="single" w:color="C9D2DE" w:sz="4"/>
+              <w:right w:val="none" w:color="FFFFFF" w:sz="0"/>
+            </w:tcBorders>
+            <w:tcMar>
+              <w:top w:type="dxa" w:w="0"/>
+              <w:left w:type="dxa" w:w="0"/>
+              <w:bottom w:type="dxa" w:w="0"/>
+              <w:right w:type="dxa" w:w="0"/>
+            </w:tcMar>
+          </w:tcPr>
+          <w:p>
+            <w:pPr>
+              <w:spacing w:after="0" w:before="0"/>
+            </w:pPr>
+            <w:r>
+              <w:rPr>
+                <w:rFonts w:ascii="Calibri" w:cs="Calibri" w:eastAsia="Calibri" w:hAnsi="Calibri"/>
+                <w:sz w:val="22"/>
+                <w:szCs w:val="22"/>
+              </w:rPr>
+              <w:t xml:space="preserve"> </w:t>
+            </w:r>
+          </w:p>
+        </w:tc>
+      </w:tr>
+      <w:tr>
+        <w:trPr>
+          <w:trHeight w:val="460" w:hRule="exact"/>
+        </w:trPr>
+        <w:tc>
+          <w:tcPr>
+            <w:tcW w:type="dxa" w:w="10080"/>
+            <w:tcBorders>
+              <w:top w:val="none" w:color="FFFFFF" w:sz="0"/>
+              <w:left w:val="none" w:color="FFFFFF" w:sz="0"/>
+              <w:bottom w:val="single" w:color="C9D2DE" w:sz="4"/>
+              <w:right w:val="none" w:color="FFFFFF" w:sz="0"/>
+            </w:tcBorders>
+            <w:tcMar>
+              <w:top w:type="dxa" w:w="0"/>
+              <w:left w:type="dxa" w:w="0"/>
+              <w:bottom w:type="dxa" w:w="0"/>
+              <w:right w:type="dxa" w:w="0"/>
+            </w:tcMar>
+          </w:tcPr>
+          <w:p>
+            <w:pPr>
+              <w:spacing w:after="0" w:before="0"/>
+            </w:pPr>
+            <w:r>
+              <w:rPr>
+                <w:rFonts w:ascii="Calibri" w:cs="Calibri" w:eastAsia="Calibri" w:hAnsi="Calibri"/>
+                <w:sz w:val="22"/>
+                <w:szCs w:val="22"/>
+              </w:rPr>
+              <w:t xml:space="preserve"> </w:t>
+            </w:r>
+          </w:p>
+        </w:tc>
+      </w:tr>
+      <w:tr>
+        <w:trPr>
+          <w:trHeight w:val="460" w:hRule="exact"/>
+        </w:trPr>
+        <w:tc>
+          <w:tcPr>
+            <w:tcW w:type="dxa" w:w="10080"/>
+            <w:tcBorders>
+              <w:top w:val="none" w:color="FFFFFF" w:sz="0"/>
+              <w:left w:val="none" w:color="FFFFFF" w:sz="0"/>
+              <w:bottom w:val="single" w:color="C9D2DE" w:sz="4"/>
+              <w:right w:val="none" w:color="FFFFFF" w:sz="0"/>
+            </w:tcBorders>
+            <w:tcMar>
+              <w:top w:type="dxa" w:w="0"/>
+              <w:left w:type="dxa" w:w="0"/>
+              <w:bottom w:type="dxa" w:w="0"/>
+              <w:right w:type="dxa" w:w="0"/>
+            </w:tcMar>
+          </w:tcPr>
+          <w:p>
+            <w:pPr>
+              <w:spacing w:after="0" w:before="0"/>
+            </w:pPr>
+            <w:r>
+              <w:rPr>
+                <w:rFonts w:ascii="Calibri" w:cs="Calibri" w:eastAsia="Calibri" w:hAnsi="Calibri"/>
+                <w:sz w:val="22"/>
+                <w:szCs w:val="22"/>
+              </w:rPr>
+              <w:t xml:space="preserve"> </w:t>
+            </w:r>
+          </w:p>
+        </w:tc>
+      </w:tr>
+      <w:tr>
+        <w:trPr>
+          <w:trHeight w:val="460" w:hRule="exact"/>
+        </w:trPr>
+        <w:tc>
+          <w:tcPr>
+            <w:tcW w:type="dxa" w:w="10080"/>
+            <w:tcBorders>
+              <w:top w:val="none" w:color="FFFFFF" w:sz="0"/>
+              <w:left w:val="none" w:color="FFFFFF" w:sz="0"/>
+              <w:bottom w:val="single" w:color="C9D2DE" w:sz="4"/>
+              <w:right w:val="none" w:color="FFFFFF" w:sz="0"/>
+            </w:tcBorders>
+            <w:tcMar>
+              <w:top w:type="dxa" w:w="0"/>
+              <w:left w:type="dxa" w:w="0"/>
+              <w:bottom w:type="dxa" w:w="0"/>
+              <w:right w:type="dxa" w:w="0"/>
+            </w:tcMar>
+          </w:tcPr>
+          <w:p>
+            <w:pPr>
+              <w:spacing w:after="0" w:before="0"/>
+            </w:pPr>
+            <w:r>
+              <w:rPr>
+                <w:rFonts w:ascii="Calibri" w:cs="Calibri" w:eastAsia="Calibri" w:hAnsi="Calibri"/>
+                <w:sz w:val="22"/>
+                <w:szCs w:val="22"/>
+              </w:rPr>
+              <w:t xml:space="preserve"> </w:t>
+            </w:r>
+          </w:p>
+        </w:tc>
+      </w:tr>
+      <w:tr>
+        <w:trPr>
+          <w:trHeight w:val="460" w:hRule="exact"/>
+        </w:trPr>
+        <w:tc>
+          <w:tcPr>
+            <w:tcW w:type="dxa" w:w="10080"/>
+            <w:tcBorders>
+              <w:top w:val="none" w:color="FFFFFF" w:sz="0"/>
+              <w:left w:val="none" w:color="FFFFFF" w:sz="0"/>
+              <w:bottom w:val="single" w:color="C9D2DE" w:sz="4"/>
+              <w:right w:val="none" w:color="FFFFFF" w:sz="0"/>
+            </w:tcBorders>
+            <w:tcMar>
+              <w:top w:type="dxa" w:w="0"/>
+              <w:left w:type="dxa" w:w="0"/>
+              <w:bottom w:type="dxa" w:w="0"/>
+              <w:right w:type="dxa" w:w="0"/>
+            </w:tcMar>
+          </w:tcPr>
+          <w:p>
+            <w:pPr>
+              <w:spacing w:after="0" w:before="0"/>
+            </w:pPr>
+            <w:r>
+              <w:rPr>
+                <w:rFonts w:ascii="Calibri" w:cs="Calibri" w:eastAsia="Calibri" w:hAnsi="Calibri"/>
+                <w:sz w:val="22"/>
+                <w:szCs w:val="22"/>
+              </w:rPr>
+              <w:t xml:space="preserve"> </w:t>
+            </w:r>
+          </w:p>
+        </w:tc>
+      </w:tr>
+      <w:tr>
+        <w:trPr>
+          <w:trHeight w:val="460" w:hRule="exact"/>
+        </w:trPr>
+        <w:tc>
+          <w:tcPr>
+            <w:tcW w:type="dxa" w:w="10080"/>
+            <w:tcBorders>
+              <w:top w:val="none" w:color="FFFFFF" w:sz="0"/>
+              <w:left w:val="none" w:color="FFFFFF" w:sz="0"/>
+              <w:bottom w:val="single" w:color="C9D2DE" w:sz="4"/>
+              <w:right w:val="none" w:color="FFFFFF" w:sz="0"/>
+            </w:tcBorders>
+            <w:tcMar>
+              <w:top w:type="dxa" w:w="0"/>
+              <w:left w:type="dxa" w:w="0"/>
+              <w:bottom w:type="dxa" w:w="0"/>
+              <w:right w:type="dxa" w:w="0"/>
+            </w:tcMar>
+          </w:tcPr>
+          <w:p>
+            <w:pPr>
+              <w:spacing w:after="0" w:before="0"/>
+            </w:pPr>
+            <w:r>
+              <w:rPr>
+                <w:rFonts w:ascii="Calibri" w:cs="Calibri" w:eastAsia="Calibri" w:hAnsi="Calibri"/>
+                <w:sz w:val="22"/>
+                <w:szCs w:val="22"/>
+              </w:rPr>
+              <w:t xml:space="preserve"> </w:t>
+            </w:r>
+          </w:p>
+        </w:tc>
+      </w:tr>
+      <w:tr>
+        <w:trPr>
+          <w:trHeight w:val="460" w:hRule="exact"/>
+        </w:trPr>
+        <w:tc>
+          <w:tcPr>
+            <w:tcW w:type="dxa" w:w="10080"/>
+            <w:tcBorders>
+              <w:top w:val="none" w:color="FFFFFF" w:sz="0"/>
+              <w:left w:val="none" w:color="FFFFFF" w:sz="0"/>
+              <w:bottom w:val="single" w:color="C9D2DE" w:sz="4"/>
+              <w:right w:val="none" w:color="FFFFFF" w:sz="0"/>
+            </w:tcBorders>
+            <w:tcMar>
+              <w:top w:type="dxa" w:w="0"/>
+              <w:left w:type="dxa" w:w="0"/>
+              <w:bottom w:type="dxa" w:w="0"/>
+              <w:right w:type="dxa" w:w="0"/>
+            </w:tcMar>
+          </w:tcPr>
+          <w:p>
+            <w:pPr>
+              <w:spacing w:after="0" w:before="0"/>
+            </w:pPr>
+            <w:r>
+              <w:rPr>
+                <w:rFonts w:ascii="Calibri" w:cs="Calibri" w:eastAsia="Calibri" w:hAnsi="Calibri"/>
+                <w:sz w:val="22"/>
+                <w:szCs w:val="22"/>
+              </w:rPr>
+              <w:t xml:space="preserve"> </w:t>
+            </w:r>
+          </w:p>
+        </w:tc>
+      </w:tr>
+      <w:tr>
+        <w:trPr>
+          <w:trHeight w:val="460" w:hRule="exact"/>
+        </w:trPr>
+        <w:tc>
+          <w:tcPr>
+            <w:tcW w:type="dxa" w:w="10080"/>
+            <w:tcBorders>
+              <w:top w:val="none" w:color="FFFFFF" w:sz="0"/>
+              <w:left w:val="none" w:color="FFFFFF" w:sz="0"/>
+              <w:bottom w:val="single" w:color="C9D2DE" w:sz="4"/>
+              <w:right w:val="none" w:color="FFFFFF" w:sz="0"/>
+            </w:tcBorders>
+            <w:tcMar>
+              <w:top w:type="dxa" w:w="0"/>
+              <w:left w:type="dxa" w:w="0"/>
+              <w:bottom w:type="dxa" w:w="0"/>
+              <w:right w:type="dxa" w:w="0"/>
+            </w:tcMar>
+          </w:tcPr>
+          <w:p>
+            <w:pPr>
+              <w:spacing w:after="0" w:before="0"/>
+            </w:pPr>
+            <w:r>
+              <w:rPr>
+                <w:rFonts w:ascii="Calibri" w:cs="Calibri" w:eastAsia="Calibri" w:hAnsi="Calibri"/>
+                <w:sz w:val="22"/>
+                <w:szCs w:val="22"/>
+              </w:rPr>
+              <w:t xml:space="preserve"> </w:t>
+            </w:r>
+          </w:p>
+        </w:tc>
+      </w:tr>
+      <w:tr>
+        <w:trPr>
+          <w:trHeight w:val="460" w:hRule="exact"/>
+        </w:trPr>
+        <w:tc>
+          <w:tcPr>
+            <w:tcW w:type="dxa" w:w="10080"/>
+            <w:tcBorders>
+              <w:top w:val="none" w:color="FFFFFF" w:sz="0"/>
+              <w:left w:val="none" w:color="FFFFFF" w:sz="0"/>
+              <w:bottom w:val="single" w:color="C9D2DE" w:sz="4"/>
+              <w:right w:val="none" w:color="FFFFFF" w:sz="0"/>
+            </w:tcBorders>
+            <w:tcMar>
+              <w:top w:type="dxa" w:w="0"/>
+              <w:left w:type="dxa" w:w="0"/>
+              <w:bottom w:type="dxa" w:w="0"/>
+              <w:right w:type="dxa" w:w="0"/>
+            </w:tcMar>
+          </w:tcPr>
+          <w:p>
+            <w:pPr>
+              <w:spacing w:after="0" w:before="0"/>
+            </w:pPr>
+            <w:r>
+              <w:rPr>
+                <w:rFonts w:ascii="Calibri" w:cs="Calibri" w:eastAsia="Calibri" w:hAnsi="Calibri"/>
+                <w:sz w:val="22"/>
+                <w:szCs w:val="22"/>
+              </w:rPr>
+              <w:t xml:space="preserve"> </w:t>
+            </w:r>
+          </w:p>
+        </w:tc>
+      </w:tr>
+      <w:tr>
+        <w:trPr>
+          <w:trHeight w:val="460" w:hRule="exact"/>
+        </w:trPr>
+        <w:tc>
+          <w:tcPr>
+            <w:tcW w:type="dxa" w:w="10080"/>
+            <w:tcBorders>
+              <w:top w:val="none" w:color="FFFFFF" w:sz="0"/>
+              <w:left w:val="none" w:color="FFFFFF" w:sz="0"/>
+              <w:bottom w:val="single" w:color="C9D2DE" w:sz="4"/>
+              <w:right w:val="none" w:color="FFFFFF" w:sz="0"/>
+            </w:tcBorders>
+            <w:tcMar>
+              <w:top w:type="dxa" w:w="0"/>
+              <w:left w:type="dxa" w:w="0"/>
+              <w:bottom w:type="dxa" w:w="0"/>
+              <w:right w:type="dxa" w:w="0"/>
+            </w:tcMar>
+          </w:tcPr>
+          <w:p>
+            <w:pPr>
+              <w:spacing w:after="0" w:before="0"/>
+            </w:pPr>
+            <w:r>
+              <w:rPr>
+                <w:rFonts w:ascii="Calibri" w:cs="Calibri" w:eastAsia="Calibri" w:hAnsi="Calibri"/>
+                <w:sz w:val="22"/>
+                <w:szCs w:val="22"/>
+              </w:rPr>
+              <w:t xml:space="preserve"> </w:t>
+            </w:r>
+          </w:p>
+        </w:tc>
+      </w:tr>
+      <w:tr>
+        <w:trPr>
+          <w:trHeight w:val="460" w:hRule="exact"/>
+        </w:trPr>
+        <w:tc>
+          <w:tcPr>
+            <w:tcW w:type="dxa" w:w="10080"/>
+            <w:tcBorders>
+              <w:top w:val="none" w:color="FFFFFF" w:sz="0"/>
+              <w:left w:val="none" w:color="FFFFFF" w:sz="0"/>
+              <w:bottom w:val="single" w:color="C9D2DE" w:sz="4"/>
+              <w:right w:val="none" w:color="FFFFFF" w:sz="0"/>
+            </w:tcBorders>
+            <w:tcMar>
+              <w:top w:type="dxa" w:w="0"/>
+              <w:left w:type="dxa" w:w="0"/>
+              <w:bottom w:type="dxa" w:w="0"/>
+              <w:right w:type="dxa" w:w="0"/>
+            </w:tcMar>
+          </w:tcPr>
+          <w:p>
+            <w:pPr>
+              <w:spacing w:after="0" w:before="0"/>
+            </w:pPr>
+            <w:r>
+              <w:rPr>
+                <w:rFonts w:ascii="Calibri" w:cs="Calibri" w:eastAsia="Calibri" w:hAnsi="Calibri"/>
+                <w:sz w:val="22"/>
+                <w:szCs w:val="22"/>
+              </w:rPr>
+              <w:t xml:space="preserve"> </w:t>
+            </w:r>
+          </w:p>
+        </w:tc>
+      </w:tr>
+    </w:tbl>
+    <w:p>
+      <w:r>
+        <w:br w:type="page"/>
+      </w:r>
+    </w:p>
+    <w:p>
+      <w:pPr>
+        <w:spacing w:after="60"/>
+        <w:jc w:val="left"/>
+      </w:pPr>
+      <w:r>
+        <w:rPr>
+          <w:rFonts w:ascii="Calibri" w:cs="Calibri" w:eastAsia="Calibri" w:hAnsi="Calibri"/>
+          <w:b/>
+          <w:bCs/>
+          <w:color w:val="E87722"/>
+          <w:sz w:val="16"/>
+          <w:szCs w:val="16"/>
+        </w:rPr>
+        <w:t xml:space="preserve">YOUR SALES TEAM ISN’T THE PROBLEM. YOUR SYSTEM IS. · MY NOTES</w:t>
+      </w:r>
+    </w:p>
+    <w:p>
+      <w:pPr>
+        <w:pBdr>
+          <w:bottom w:val="single" w:color="E87722" w:sz="6"/>
+        </w:pBdr>
+        <w:spacing w:after="300"/>
+        <w:jc w:val="left"/>
+      </w:pPr>
+      <w:r>
+        <w:rPr>
+          <w:rFonts w:ascii="Calibri" w:cs="Calibri" w:eastAsia="Calibri" w:hAnsi="Calibri"/>
+          <w:color w:val="5A6B82"/>
+          <w:sz w:val="18"/>
+          <w:szCs w:val="18"/>
+        </w:rPr>
+        <w:t xml:space="preserve">11:00 AM – 12:00 PM · The System of Selling</w:t>
+      </w:r>
+    </w:p>
+    <w:tbl>
+      <w:tblPr>
+        <w:tblW w:type="dxa" w:w="10080"/>
+        <w:tblBorders>
+          <w:top w:val="single" w:color="auto" w:sz="4"/>
+          <w:left w:val="single" w:color="auto" w:sz="4"/>
+          <w:bottom w:val="single" w:color="auto" w:sz="4"/>
+          <w:right w:val="single" w:color="auto" w:sz="4"/>
+          <w:insideH w:val="single" w:color="auto" w:sz="4"/>
+          <w:insideV w:val="single" w:color="auto" w:sz="4"/>
+        </w:tblBorders>
+      </w:tblPr>
+      <w:tblGrid>
+        <w:gridCol w:w="10080"/>
+      </w:tblGrid>
+      <w:tr>
+        <w:trPr>
+          <w:trHeight w:val="460" w:hRule="exact"/>
+        </w:trPr>
+        <w:tc>
+          <w:tcPr>
+            <w:tcW w:type="dxa" w:w="10080"/>
+            <w:tcBorders>
+              <w:top w:val="none" w:color="FFFFFF" w:sz="0"/>
+              <w:left w:val="none" w:color="FFFFFF" w:sz="0"/>
+              <w:bottom w:val="single" w:color="C9D2DE" w:sz="4"/>
+              <w:right w:val="none" w:color="FFFFFF" w:sz="0"/>
+            </w:tcBorders>
+            <w:tcMar>
+              <w:top w:type="dxa" w:w="0"/>
+              <w:left w:type="dxa" w:w="0"/>
+              <w:bottom w:type="dxa" w:w="0"/>
+              <w:right w:type="dxa" w:w="0"/>
+            </w:tcMar>
+          </w:tcPr>
+          <w:p>
+            <w:pPr>
+              <w:spacing w:after="0" w:before="0"/>
+            </w:pPr>
+            <w:r>
+              <w:rPr>
+                <w:rFonts w:ascii="Calibri" w:cs="Calibri" w:eastAsia="Calibri" w:hAnsi="Calibri"/>
+                <w:sz w:val="22"/>
+                <w:szCs w:val="22"/>
+              </w:rPr>
+              <w:t xml:space="preserve"> </w:t>
+            </w:r>
+          </w:p>
+        </w:tc>
+      </w:tr>
+      <w:tr>
+        <w:trPr>
+          <w:trHeight w:val="460" w:hRule="exact"/>
+        </w:trPr>
+        <w:tc>
+          <w:tcPr>
+            <w:tcW w:type="dxa" w:w="10080"/>
+            <w:tcBorders>
+              <w:top w:val="none" w:color="FFFFFF" w:sz="0"/>
+              <w:left w:val="none" w:color="FFFFFF" w:sz="0"/>
+              <w:bottom w:val="single" w:color="C9D2DE" w:sz="4"/>
+              <w:right w:val="none" w:color="FFFFFF" w:sz="0"/>
+            </w:tcBorders>
+            <w:tcMar>
+              <w:top w:type="dxa" w:w="0"/>
+              <w:left w:type="dxa" w:w="0"/>
+              <w:bottom w:type="dxa" w:w="0"/>
+              <w:right w:type="dxa" w:w="0"/>
+            </w:tcMar>
+          </w:tcPr>
+          <w:p>
+            <w:pPr>
+              <w:spacing w:after="0" w:before="0"/>
+            </w:pPr>
+            <w:r>
+              <w:rPr>
+                <w:rFonts w:ascii="Calibri" w:cs="Calibri" w:eastAsia="Calibri" w:hAnsi="Calibri"/>
+                <w:sz w:val="22"/>
+                <w:szCs w:val="22"/>
+              </w:rPr>
+              <w:t xml:space="preserve"> </w:t>
+            </w:r>
+          </w:p>
+        </w:tc>
+      </w:tr>
+      <w:tr>
+        <w:trPr>
+          <w:trHeight w:val="460" w:hRule="exact"/>
+        </w:trPr>
+        <w:tc>
+          <w:tcPr>
+            <w:tcW w:type="dxa" w:w="10080"/>
+            <w:tcBorders>
+              <w:top w:val="none" w:color="FFFFFF" w:sz="0"/>
+              <w:left w:val="none" w:color="FFFFFF" w:sz="0"/>
+              <w:bottom w:val="single" w:color="C9D2DE" w:sz="4"/>
+              <w:right w:val="none" w:color="FFFFFF" w:sz="0"/>
+            </w:tcBorders>
+            <w:tcMar>
+              <w:top w:type="dxa" w:w="0"/>
+              <w:left w:type="dxa" w:w="0"/>
+              <w:bottom w:type="dxa" w:w="0"/>
+              <w:right w:type="dxa" w:w="0"/>
+            </w:tcMar>
+          </w:tcPr>
+          <w:p>
+            <w:pPr>
+              <w:spacing w:after="0" w:before="0"/>
+            </w:pPr>
+            <w:r>
+              <w:rPr>
+                <w:rFonts w:ascii="Calibri" w:cs="Calibri" w:eastAsia="Calibri" w:hAnsi="Calibri"/>
+                <w:sz w:val="22"/>
+                <w:szCs w:val="22"/>
+              </w:rPr>
+              <w:t xml:space="preserve"> </w:t>
+            </w:r>
+          </w:p>
+        </w:tc>
+      </w:tr>
+      <w:tr>
+        <w:trPr>
+          <w:trHeight w:val="460" w:hRule="exact"/>
+        </w:trPr>
+        <w:tc>
+          <w:tcPr>
+            <w:tcW w:type="dxa" w:w="10080"/>
+            <w:tcBorders>
+              <w:top w:val="none" w:color="FFFFFF" w:sz="0"/>
+              <w:left w:val="none" w:color="FFFFFF" w:sz="0"/>
+              <w:bottom w:val="single" w:color="C9D2DE" w:sz="4"/>
+              <w:right w:val="none" w:color="FFFFFF" w:sz="0"/>
+            </w:tcBorders>
+            <w:tcMar>
+              <w:top w:type="dxa" w:w="0"/>
+              <w:left w:type="dxa" w:w="0"/>
+              <w:bottom w:type="dxa" w:w="0"/>
+              <w:right w:type="dxa" w:w="0"/>
+            </w:tcMar>
+          </w:tcPr>
+          <w:p>
+            <w:pPr>
+              <w:spacing w:after="0" w:before="0"/>
+            </w:pPr>
+            <w:r>
+              <w:rPr>
+                <w:rFonts w:ascii="Calibri" w:cs="Calibri" w:eastAsia="Calibri" w:hAnsi="Calibri"/>
+                <w:sz w:val="22"/>
+                <w:szCs w:val="22"/>
+              </w:rPr>
+              <w:t xml:space="preserve"> </w:t>
+            </w:r>
+          </w:p>
+        </w:tc>
+      </w:tr>
+      <w:tr>
+        <w:trPr>
+          <w:trHeight w:val="460" w:hRule="exact"/>
+        </w:trPr>
+        <w:tc>
+          <w:tcPr>
+            <w:tcW w:type="dxa" w:w="10080"/>
+            <w:tcBorders>
+              <w:top w:val="none" w:color="FFFFFF" w:sz="0"/>
+              <w:left w:val="none" w:color="FFFFFF" w:sz="0"/>
+              <w:bottom w:val="single" w:color="C9D2DE" w:sz="4"/>
+              <w:right w:val="none" w:color="FFFFFF" w:sz="0"/>
+            </w:tcBorders>
+            <w:tcMar>
+              <w:top w:type="dxa" w:w="0"/>
+              <w:left w:type="dxa" w:w="0"/>
+              <w:bottom w:type="dxa" w:w="0"/>
+              <w:right w:type="dxa" w:w="0"/>
+            </w:tcMar>
+          </w:tcPr>
+          <w:p>
+            <w:pPr>
+              <w:spacing w:after="0" w:before="0"/>
+            </w:pPr>
+            <w:r>
+              <w:rPr>
+                <w:rFonts w:ascii="Calibri" w:cs="Calibri" w:eastAsia="Calibri" w:hAnsi="Calibri"/>
+                <w:sz w:val="22"/>
+                <w:szCs w:val="22"/>
+              </w:rPr>
+              <w:t xml:space="preserve"> </w:t>
+            </w:r>
+          </w:p>
+        </w:tc>
+      </w:tr>
+      <w:tr>
+        <w:trPr>
+          <w:trHeight w:val="460" w:hRule="exact"/>
+        </w:trPr>
+        <w:tc>
+          <w:tcPr>
+            <w:tcW w:type="dxa" w:w="10080"/>
+            <w:tcBorders>
+              <w:top w:val="none" w:color="FFFFFF" w:sz="0"/>
+              <w:left w:val="none" w:color="FFFFFF" w:sz="0"/>
+              <w:bottom w:val="single" w:color="C9D2DE" w:sz="4"/>
+              <w:right w:val="none" w:color="FFFFFF" w:sz="0"/>
+            </w:tcBorders>
+            <w:tcMar>
+              <w:top w:type="dxa" w:w="0"/>
+              <w:left w:type="dxa" w:w="0"/>
+              <w:bottom w:type="dxa" w:w="0"/>
+              <w:right w:type="dxa" w:w="0"/>
+            </w:tcMar>
+          </w:tcPr>
+          <w:p>
+            <w:pPr>
+              <w:spacing w:after="0" w:before="0"/>
+            </w:pPr>
+            <w:r>
+              <w:rPr>
+                <w:rFonts w:ascii="Calibri" w:cs="Calibri" w:eastAsia="Calibri" w:hAnsi="Calibri"/>
+                <w:sz w:val="22"/>
+                <w:szCs w:val="22"/>
+              </w:rPr>
+              <w:t xml:space="preserve"> </w:t>
+            </w:r>
+          </w:p>
+        </w:tc>
+      </w:tr>
+      <w:tr>
+        <w:trPr>
+          <w:trHeight w:val="460" w:hRule="exact"/>
+        </w:trPr>
+        <w:tc>
+          <w:tcPr>
+            <w:tcW w:type="dxa" w:w="10080"/>
+            <w:tcBorders>
+              <w:top w:val="none" w:color="FFFFFF" w:sz="0"/>
+              <w:left w:val="none" w:color="FFFFFF" w:sz="0"/>
+              <w:bottom w:val="single" w:color="C9D2DE" w:sz="4"/>
+              <w:right w:val="none" w:color="FFFFFF" w:sz="0"/>
+            </w:tcBorders>
+            <w:tcMar>
+              <w:top w:type="dxa" w:w="0"/>
+              <w:left w:type="dxa" w:w="0"/>
+              <w:bottom w:type="dxa" w:w="0"/>
+              <w:right w:type="dxa" w:w="0"/>
+            </w:tcMar>
+          </w:tcPr>
+          <w:p>
+            <w:pPr>
+              <w:spacing w:after="0" w:before="0"/>
+            </w:pPr>
+            <w:r>
+              <w:rPr>
+                <w:rFonts w:ascii="Calibri" w:cs="Calibri" w:eastAsia="Calibri" w:hAnsi="Calibri"/>
+                <w:sz w:val="22"/>
+                <w:szCs w:val="22"/>
+              </w:rPr>
+              <w:t xml:space="preserve"> </w:t>
+            </w:r>
+          </w:p>
+        </w:tc>
+      </w:tr>
+      <w:tr>
+        <w:trPr>
+          <w:trHeight w:val="460" w:hRule="exact"/>
+        </w:trPr>
+        <w:tc>
+          <w:tcPr>
+            <w:tcW w:type="dxa" w:w="10080"/>
+            <w:tcBorders>
+              <w:top w:val="none" w:color="FFFFFF" w:sz="0"/>
+              <w:left w:val="none" w:color="FFFFFF" w:sz="0"/>
+              <w:bottom w:val="single" w:color="C9D2DE" w:sz="4"/>
+              <w:right w:val="none" w:color="FFFFFF" w:sz="0"/>
+            </w:tcBorders>
+            <w:tcMar>
+              <w:top w:type="dxa" w:w="0"/>
+              <w:left w:type="dxa" w:w="0"/>
+              <w:bottom w:type="dxa" w:w="0"/>
+              <w:right w:type="dxa" w:w="0"/>
+            </w:tcMar>
+          </w:tcPr>
+          <w:p>
+            <w:pPr>
+              <w:spacing w:after="0" w:before="0"/>
+            </w:pPr>
+            <w:r>
+              <w:rPr>
+                <w:rFonts w:ascii="Calibri" w:cs="Calibri" w:eastAsia="Calibri" w:hAnsi="Calibri"/>
+                <w:sz w:val="22"/>
+                <w:szCs w:val="22"/>
+              </w:rPr>
+              <w:t xml:space="preserve"> </w:t>
+            </w:r>
+          </w:p>
+        </w:tc>
+      </w:tr>
+      <w:tr>
+        <w:trPr>
+          <w:trHeight w:val="460" w:hRule="exact"/>
+        </w:trPr>
+        <w:tc>
+          <w:tcPr>
+            <w:tcW w:type="dxa" w:w="10080"/>
+            <w:tcBorders>
+              <w:top w:val="none" w:color="FFFFFF" w:sz="0"/>
+              <w:left w:val="none" w:color="FFFFFF" w:sz="0"/>
+              <w:bottom w:val="single" w:color="C9D2DE" w:sz="4"/>
+              <w:right w:val="none" w:color="FFFFFF" w:sz="0"/>
+            </w:tcBorders>
+            <w:tcMar>
+              <w:top w:type="dxa" w:w="0"/>
+              <w:left w:type="dxa" w:w="0"/>
+              <w:bottom w:type="dxa" w:w="0"/>
+              <w:right w:type="dxa" w:w="0"/>
+            </w:tcMar>
+          </w:tcPr>
+          <w:p>
+            <w:pPr>
+              <w:spacing w:after="0" w:before="0"/>
+            </w:pPr>
+            <w:r>
+              <w:rPr>
+                <w:rFonts w:ascii="Calibri" w:cs="Calibri" w:eastAsia="Calibri" w:hAnsi="Calibri"/>
+                <w:sz w:val="22"/>
+                <w:szCs w:val="22"/>
+              </w:rPr>
+              <w:t xml:space="preserve"> </w:t>
+            </w:r>
+          </w:p>
+        </w:tc>
+      </w:tr>
+      <w:tr>
+        <w:trPr>
+          <w:trHeight w:val="460" w:hRule="exact"/>
+        </w:trPr>
+        <w:tc>
+          <w:tcPr>
+            <w:tcW w:type="dxa" w:w="10080"/>
+            <w:tcBorders>
+              <w:top w:val="none" w:color="FFFFFF" w:sz="0"/>
+              <w:left w:val="none" w:color="FFFFFF" w:sz="0"/>
+              <w:bottom w:val="single" w:color="C9D2DE" w:sz="4"/>
+              <w:right w:val="none" w:color="FFFFFF" w:sz="0"/>
+            </w:tcBorders>
+            <w:tcMar>
+              <w:top w:type="dxa" w:w="0"/>
+              <w:left w:type="dxa" w:w="0"/>
+              <w:bottom w:type="dxa" w:w="0"/>
+              <w:right w:type="dxa" w:w="0"/>
+            </w:tcMar>
+          </w:tcPr>
+          <w:p>
+            <w:pPr>
+              <w:spacing w:after="0" w:before="0"/>
+            </w:pPr>
+            <w:r>
+              <w:rPr>
+                <w:rFonts w:ascii="Calibri" w:cs="Calibri" w:eastAsia="Calibri" w:hAnsi="Calibri"/>
+                <w:sz w:val="22"/>
+                <w:szCs w:val="22"/>
+              </w:rPr>
+              <w:t xml:space="preserve"> </w:t>
+            </w:r>
+          </w:p>
+        </w:tc>
+      </w:tr>
+      <w:tr>
+        <w:trPr>
+          <w:trHeight w:val="460" w:hRule="exact"/>
+        </w:trPr>
+        <w:tc>
+          <w:tcPr>
+            <w:tcW w:type="dxa" w:w="10080"/>
+            <w:tcBorders>
+              <w:top w:val="none" w:color="FFFFFF" w:sz="0"/>
+              <w:left w:val="none" w:color="FFFFFF" w:sz="0"/>
+              <w:bottom w:val="single" w:color="C9D2DE" w:sz="4"/>
+              <w:right w:val="none" w:color="FFFFFF" w:sz="0"/>
+            </w:tcBorders>
+            <w:tcMar>
+              <w:top w:type="dxa" w:w="0"/>
+              <w:left w:type="dxa" w:w="0"/>
+              <w:bottom w:type="dxa" w:w="0"/>
+              <w:right w:type="dxa" w:w="0"/>
+            </w:tcMar>
+          </w:tcPr>
+          <w:p>
+            <w:pPr>
+              <w:spacing w:after="0" w:before="0"/>
+            </w:pPr>
+            <w:r>
+              <w:rPr>
+                <w:rFonts w:ascii="Calibri" w:cs="Calibri" w:eastAsia="Calibri" w:hAnsi="Calibri"/>
+                <w:sz w:val="22"/>
+                <w:szCs w:val="22"/>
+              </w:rPr>
+              <w:t xml:space="preserve"> </w:t>
+            </w:r>
+          </w:p>
+        </w:tc>
+      </w:tr>
+      <w:tr>
+        <w:trPr>
+          <w:trHeight w:val="460" w:hRule="exact"/>
+        </w:trPr>
+        <w:tc>
+          <w:tcPr>
+            <w:tcW w:type="dxa" w:w="10080"/>
+            <w:tcBorders>
+              <w:top w:val="none" w:color="FFFFFF" w:sz="0"/>
+              <w:left w:val="none" w:color="FFFFFF" w:sz="0"/>
+              <w:bottom w:val="single" w:color="C9D2DE" w:sz="4"/>
+              <w:right w:val="none" w:color="FFFFFF" w:sz="0"/>
+            </w:tcBorders>
+            <w:tcMar>
+              <w:top w:type="dxa" w:w="0"/>
+              <w:left w:type="dxa" w:w="0"/>
+              <w:bottom w:type="dxa" w:w="0"/>
+              <w:right w:type="dxa" w:w="0"/>
+            </w:tcMar>
+          </w:tcPr>
+          <w:p>
+            <w:pPr>
+              <w:spacing w:after="0" w:before="0"/>
+            </w:pPr>
+            <w:r>
+              <w:rPr>
+                <w:rFonts w:ascii="Calibri" w:cs="Calibri" w:eastAsia="Calibri" w:hAnsi="Calibri"/>
+                <w:sz w:val="22"/>
+                <w:szCs w:val="22"/>
+              </w:rPr>
+              <w:t xml:space="preserve"> </w:t>
+            </w:r>
+          </w:p>
+        </w:tc>
+      </w:tr>
+      <w:tr>
+        <w:trPr>
+          <w:trHeight w:val="460" w:hRule="exact"/>
+        </w:trPr>
+        <w:tc>
+          <w:tcPr>
+            <w:tcW w:type="dxa" w:w="10080"/>
+            <w:tcBorders>
+              <w:top w:val="none" w:color="FFFFFF" w:sz="0"/>
+              <w:left w:val="none" w:color="FFFFFF" w:sz="0"/>
+              <w:bottom w:val="single" w:color="C9D2DE" w:sz="4"/>
+              <w:right w:val="none" w:color="FFFFFF" w:sz="0"/>
+            </w:tcBorders>
+            <w:tcMar>
+              <w:top w:type="dxa" w:w="0"/>
+              <w:left w:type="dxa" w:w="0"/>
+              <w:bottom w:type="dxa" w:w="0"/>
+              <w:right w:type="dxa" w:w="0"/>
+            </w:tcMar>
+          </w:tcPr>
+          <w:p>
+            <w:pPr>
+              <w:spacing w:after="0" w:before="0"/>
+            </w:pPr>
+            <w:r>
+              <w:rPr>
+                <w:rFonts w:ascii="Calibri" w:cs="Calibri" w:eastAsia="Calibri" w:hAnsi="Calibri"/>
+                <w:sz w:val="22"/>
+                <w:szCs w:val="22"/>
+              </w:rPr>
+              <w:t xml:space="preserve"> </w:t>
+            </w:r>
+          </w:p>
+        </w:tc>
+      </w:tr>
+      <w:tr>
+        <w:trPr>
+          <w:trHeight w:val="460" w:hRule="exact"/>
+        </w:trPr>
+        <w:tc>
+          <w:tcPr>
+            <w:tcW w:type="dxa" w:w="10080"/>
+            <w:tcBorders>
+              <w:top w:val="none" w:color="FFFFFF" w:sz="0"/>
+              <w:left w:val="none" w:color="FFFFFF" w:sz="0"/>
+              <w:bottom w:val="single" w:color="C9D2DE" w:sz="4"/>
+              <w:right w:val="none" w:color="FFFFFF" w:sz="0"/>
+            </w:tcBorders>
+            <w:tcMar>
+              <w:top w:type="dxa" w:w="0"/>
+              <w:left w:type="dxa" w:w="0"/>
+              <w:bottom w:type="dxa" w:w="0"/>
+              <w:right w:type="dxa" w:w="0"/>
+            </w:tcMar>
+          </w:tcPr>
+          <w:p>
+            <w:pPr>
+              <w:spacing w:after="0" w:before="0"/>
+            </w:pPr>
+            <w:r>
+              <w:rPr>
+                <w:rFonts w:ascii="Calibri" w:cs="Calibri" w:eastAsia="Calibri" w:hAnsi="Calibri"/>
+                <w:sz w:val="22"/>
+                <w:szCs w:val="22"/>
+              </w:rPr>
+              <w:t xml:space="preserve"> </w:t>
+            </w:r>
+          </w:p>
+        </w:tc>
+      </w:tr>
+      <w:tr>
+        <w:trPr>
+          <w:trHeight w:val="460" w:hRule="exact"/>
+        </w:trPr>
+        <w:tc>
+          <w:tcPr>
+            <w:tcW w:type="dxa" w:w="10080"/>
+            <w:tcBorders>
+              <w:top w:val="none" w:color="FFFFFF" w:sz="0"/>
+              <w:left w:val="none" w:color="FFFFFF" w:sz="0"/>
+              <w:bottom w:val="single" w:color="C9D2DE" w:sz="4"/>
+              <w:right w:val="none" w:color="FFFFFF" w:sz="0"/>
+            </w:tcBorders>
+            <w:tcMar>
+              <w:top w:type="dxa" w:w="0"/>
+              <w:left w:type="dxa" w:w="0"/>
+              <w:bottom w:type="dxa" w:w="0"/>
+              <w:right w:type="dxa" w:w="0"/>
+            </w:tcMar>
+          </w:tcPr>
+          <w:p>
+            <w:pPr>
+              <w:spacing w:after="0" w:before="0"/>
+            </w:pPr>
+            <w:r>
+              <w:rPr>
+                <w:rFonts w:ascii="Calibri" w:cs="Calibri" w:eastAsia="Calibri" w:hAnsi="Calibri"/>
+                <w:sz w:val="22"/>
+                <w:szCs w:val="22"/>
+              </w:rPr>
+              <w:t xml:space="preserve"> </w:t>
+            </w:r>
+          </w:p>
+        </w:tc>
+      </w:tr>
+      <w:tr>
+        <w:trPr>
+          <w:trHeight w:val="460" w:hRule="exact"/>
+        </w:trPr>
+        <w:tc>
+          <w:tcPr>
+            <w:tcW w:type="dxa" w:w="10080"/>
+            <w:tcBorders>
+              <w:top w:val="none" w:color="FFFFFF" w:sz="0"/>
+              <w:left w:val="none" w:color="FFFFFF" w:sz="0"/>
+              <w:bottom w:val="single" w:color="C9D2DE" w:sz="4"/>
+              <w:right w:val="none" w:color="FFFFFF" w:sz="0"/>
+            </w:tcBorders>
+            <w:tcMar>
+              <w:top w:type="dxa" w:w="0"/>
+              <w:left w:type="dxa" w:w="0"/>
+              <w:bottom w:type="dxa" w:w="0"/>
+              <w:right w:type="dxa" w:w="0"/>
+            </w:tcMar>
+          </w:tcPr>
+          <w:p>
+            <w:pPr>
+              <w:spacing w:after="0" w:before="0"/>
+            </w:pPr>
+            <w:r>
+              <w:rPr>
+                <w:rFonts w:ascii="Calibri" w:cs="Calibri" w:eastAsia="Calibri" w:hAnsi="Calibri"/>
+                <w:sz w:val="22"/>
+                <w:szCs w:val="22"/>
+              </w:rPr>
+              <w:t xml:space="preserve"> </w:t>
+            </w:r>
+          </w:p>
+        </w:tc>
+      </w:tr>
+      <w:tr>
+        <w:trPr>
+          <w:trHeight w:val="460" w:hRule="exact"/>
+        </w:trPr>
+        <w:tc>
+          <w:tcPr>
+            <w:tcW w:type="dxa" w:w="10080"/>
+            <w:tcBorders>
+              <w:top w:val="none" w:color="FFFFFF" w:sz="0"/>
+              <w:left w:val="none" w:color="FFFFFF" w:sz="0"/>
+              <w:bottom w:val="single" w:color="C9D2DE" w:sz="4"/>
+              <w:right w:val="none" w:color="FFFFFF" w:sz="0"/>
+            </w:tcBorders>
+            <w:tcMar>
+              <w:top w:type="dxa" w:w="0"/>
+              <w:left w:type="dxa" w:w="0"/>
+              <w:bottom w:type="dxa" w:w="0"/>
+              <w:right w:type="dxa" w:w="0"/>
+            </w:tcMar>
+          </w:tcPr>
+          <w:p>
+            <w:pPr>
+              <w:spacing w:after="0" w:before="0"/>
+            </w:pPr>
+            <w:r>
+              <w:rPr>
+                <w:rFonts w:ascii="Calibri" w:cs="Calibri" w:eastAsia="Calibri" w:hAnsi="Calibri"/>
+                <w:sz w:val="22"/>
+                <w:szCs w:val="22"/>
+              </w:rPr>
+              <w:t xml:space="preserve"> </w:t>
+            </w:r>
+          </w:p>
+        </w:tc>
+      </w:tr>
+      <w:tr>
+        <w:trPr>
+          <w:trHeight w:val="460" w:hRule="exact"/>
+        </w:trPr>
+        <w:tc>
+          <w:tcPr>
+            <w:tcW w:type="dxa" w:w="10080"/>
+            <w:tcBorders>
+              <w:top w:val="none" w:color="FFFFFF" w:sz="0"/>
+              <w:left w:val="none" w:color="FFFFFF" w:sz="0"/>
+              <w:bottom w:val="single" w:color="C9D2DE" w:sz="4"/>
+              <w:right w:val="none" w:color="FFFFFF" w:sz="0"/>
+            </w:tcBorders>
+            <w:tcMar>
+              <w:top w:type="dxa" w:w="0"/>
+              <w:left w:type="dxa" w:w="0"/>
+              <w:bottom w:type="dxa" w:w="0"/>
+              <w:right w:type="dxa" w:w="0"/>
+            </w:tcMar>
+          </w:tcPr>
+          <w:p>
+            <w:pPr>
+              <w:spacing w:after="0" w:before="0"/>
+            </w:pPr>
+            <w:r>
+              <w:rPr>
+                <w:rFonts w:ascii="Calibri" w:cs="Calibri" w:eastAsia="Calibri" w:hAnsi="Calibri"/>
+                <w:sz w:val="22"/>
+                <w:szCs w:val="22"/>
+              </w:rPr>
+              <w:t xml:space="preserve"> </w:t>
+            </w:r>
+          </w:p>
+        </w:tc>
+      </w:tr>
+      <w:tr>
+        <w:trPr>
+          <w:trHeight w:val="460" w:hRule="exact"/>
+        </w:trPr>
+        <w:tc>
+          <w:tcPr>
+            <w:tcW w:type="dxa" w:w="10080"/>
+            <w:tcBorders>
+              <w:top w:val="none" w:color="FFFFFF" w:sz="0"/>
+              <w:left w:val="none" w:color="FFFFFF" w:sz="0"/>
+              <w:bottom w:val="single" w:color="C9D2DE" w:sz="4"/>
+              <w:right w:val="none" w:color="FFFFFF" w:sz="0"/>
+            </w:tcBorders>
+            <w:tcMar>
+              <w:top w:type="dxa" w:w="0"/>
+              <w:left w:type="dxa" w:w="0"/>
+              <w:bottom w:type="dxa" w:w="0"/>
+              <w:right w:type="dxa" w:w="0"/>
+            </w:tcMar>
+          </w:tcPr>
+          <w:p>
+            <w:pPr>
+              <w:spacing w:after="0" w:before="0"/>
+            </w:pPr>
+            <w:r>
+              <w:rPr>
+                <w:rFonts w:ascii="Calibri" w:cs="Calibri" w:eastAsia="Calibri" w:hAnsi="Calibri"/>
+                <w:sz w:val="22"/>
+                <w:szCs w:val="22"/>
+              </w:rPr>
+              <w:t xml:space="preserve"> </w:t>
+            </w:r>
+          </w:p>
+        </w:tc>
+      </w:tr>
+      <w:tr>
+        <w:trPr>
+          <w:trHeight w:val="460" w:hRule="exact"/>
+        </w:trPr>
+        <w:tc>
+          <w:tcPr>
+            <w:tcW w:type="dxa" w:w="10080"/>
+            <w:tcBorders>
+              <w:top w:val="none" w:color="FFFFFF" w:sz="0"/>
+              <w:left w:val="none" w:color="FFFFFF" w:sz="0"/>
+              <w:bottom w:val="single" w:color="C9D2DE" w:sz="4"/>
+              <w:right w:val="none" w:color="FFFFFF" w:sz="0"/>
+            </w:tcBorders>
+            <w:tcMar>
+              <w:top w:type="dxa" w:w="0"/>
+              <w:left w:type="dxa" w:w="0"/>
+              <w:bottom w:type="dxa" w:w="0"/>
+              <w:right w:type="dxa" w:w="0"/>
+            </w:tcMar>
+          </w:tcPr>
+          <w:p>
+            <w:pPr>
+              <w:spacing w:after="0" w:before="0"/>
+            </w:pPr>
+            <w:r>
+              <w:rPr>
+                <w:rFonts w:ascii="Calibri" w:cs="Calibri" w:eastAsia="Calibri" w:hAnsi="Calibri"/>
+                <w:sz w:val="22"/>
+                <w:szCs w:val="22"/>
+              </w:rPr>
+              <w:t xml:space="preserve"> </w:t>
+            </w:r>
+          </w:p>
+        </w:tc>
+      </w:tr>
+      <w:tr>
+        <w:trPr>
+          <w:trHeight w:val="460" w:hRule="exact"/>
+        </w:trPr>
+        <w:tc>
+          <w:tcPr>
+            <w:tcW w:type="dxa" w:w="10080"/>
+            <w:tcBorders>
+              <w:top w:val="none" w:color="FFFFFF" w:sz="0"/>
+              <w:left w:val="none" w:color="FFFFFF" w:sz="0"/>
+              <w:bottom w:val="single" w:color="C9D2DE" w:sz="4"/>
+              <w:right w:val="none" w:color="FFFFFF" w:sz="0"/>
+            </w:tcBorders>
+            <w:tcMar>
+              <w:top w:type="dxa" w:w="0"/>
+              <w:left w:type="dxa" w:w="0"/>
+              <w:bottom w:type="dxa" w:w="0"/>
+              <w:right w:type="dxa" w:w="0"/>
+            </w:tcMar>
+          </w:tcPr>
+          <w:p>
+            <w:pPr>
+              <w:spacing w:after="0" w:before="0"/>
+            </w:pPr>
+            <w:r>
+              <w:rPr>
+                <w:rFonts w:ascii="Calibri" w:cs="Calibri" w:eastAsia="Calibri" w:hAnsi="Calibri"/>
+                <w:sz w:val="22"/>
+                <w:szCs w:val="22"/>
+              </w:rPr>
+              <w:t xml:space="preserve"> </w:t>
+            </w:r>
+          </w:p>
+        </w:tc>
+      </w:tr>
+      <w:tr>
+        <w:trPr>
+          <w:trHeight w:val="460" w:hRule="exact"/>
+        </w:trPr>
+        <w:tc>
+          <w:tcPr>
+            <w:tcW w:type="dxa" w:w="10080"/>
+            <w:tcBorders>
+              <w:top w:val="none" w:color="FFFFFF" w:sz="0"/>
+              <w:left w:val="none" w:color="FFFFFF" w:sz="0"/>
+              <w:bottom w:val="single" w:color="C9D2DE" w:sz="4"/>
+              <w:right w:val="none" w:color="FFFFFF" w:sz="0"/>
+            </w:tcBorders>
+            <w:tcMar>
+              <w:top w:type="dxa" w:w="0"/>
+              <w:left w:type="dxa" w:w="0"/>
+              <w:bottom w:type="dxa" w:w="0"/>
+              <w:right w:type="dxa" w:w="0"/>
+            </w:tcMar>
+          </w:tcPr>
+          <w:p>
+            <w:pPr>
+              <w:spacing w:after="0" w:before="0"/>
+            </w:pPr>
+            <w:r>
+              <w:rPr>
+                <w:rFonts w:ascii="Calibri" w:cs="Calibri" w:eastAsia="Calibri" w:hAnsi="Calibri"/>
+                <w:sz w:val="22"/>
+                <w:szCs w:val="22"/>
+              </w:rPr>
+              <w:t xml:space="preserve"> </w:t>
+            </w:r>
+          </w:p>
+        </w:tc>
+      </w:tr>
+    </w:tbl>
+    <w:p>
+      <w:r>
+        <w:br w:type="page"/>
+      </w:r>
+    </w:p>
+    <w:p>
+      <w:pPr>
+        <w:spacing w:after="60"/>
+        <w:jc w:val="left"/>
+      </w:pPr>
+      <w:r>
+        <w:rPr>
+          <w:rFonts w:ascii="Calibri" w:cs="Calibri" w:eastAsia="Calibri" w:hAnsi="Calibri"/>
+          <w:b/>
+          <w:bCs/>
+          <w:color w:val="E87722"/>
+          <w:sz w:val="16"/>
+          <w:szCs w:val="16"/>
+        </w:rPr>
+        <w:t xml:space="preserve">LUNCH WITH WALT BROWN: HEALTHY MATTERS · MY NOTES</w:t>
+      </w:r>
+    </w:p>
+    <w:p>
+      <w:pPr>
+        <w:pBdr>
+          <w:bottom w:val="single" w:color="E87722" w:sz="6"/>
+        </w:pBdr>
+        <w:spacing w:after="300"/>
+        <w:jc w:val="left"/>
+      </w:pPr>
+      <w:r>
+        <w:rPr>
+          <w:rFonts w:ascii="Calibri" w:cs="Calibri" w:eastAsia="Calibri" w:hAnsi="Calibri"/>
+          <w:color w:val="5A6B82"/>
+          <w:sz w:val="18"/>
+          <w:szCs w:val="18"/>
+        </w:rPr>
+        <w:t xml:space="preserve">12:00 – 1:00 PM · Walt Brown</w:t>
+      </w:r>
+    </w:p>
+    <w:tbl>
+      <w:tblPr>
+        <w:tblW w:type="dxa" w:w="10080"/>
+        <w:tblBorders>
+          <w:top w:val="single" w:color="auto" w:sz="4"/>
+          <w:left w:val="single" w:color="auto" w:sz="4"/>
+          <w:bottom w:val="single" w:color="auto" w:sz="4"/>
+          <w:right w:val="single" w:color="auto" w:sz="4"/>
+          <w:insideH w:val="single" w:color="auto" w:sz="4"/>
+          <w:insideV w:val="single" w:color="auto" w:sz="4"/>
+        </w:tblBorders>
+      </w:tblPr>
+      <w:tblGrid>
+        <w:gridCol w:w="10080"/>
+      </w:tblGrid>
+      <w:tr>
+        <w:trPr>
+          <w:trHeight w:val="460" w:hRule="exact"/>
+        </w:trPr>
+        <w:tc>
+          <w:tcPr>
+            <w:tcW w:type="dxa" w:w="10080"/>
+            <w:tcBorders>
+              <w:top w:val="none" w:color="FFFFFF" w:sz="0"/>
+              <w:left w:val="none" w:color="FFFFFF" w:sz="0"/>
+              <w:bottom w:val="single" w:color="C9D2DE" w:sz="4"/>
+              <w:right w:val="none" w:color="FFFFFF" w:sz="0"/>
+            </w:tcBorders>
+            <w:tcMar>
+              <w:top w:type="dxa" w:w="0"/>
+              <w:left w:type="dxa" w:w="0"/>
+              <w:bottom w:type="dxa" w:w="0"/>
+              <w:right w:type="dxa" w:w="0"/>
+            </w:tcMar>
+          </w:tcPr>
+          <w:p>
+            <w:pPr>
+              <w:spacing w:after="0" w:before="0"/>
+            </w:pPr>
+            <w:r>
+              <w:rPr>
+                <w:rFonts w:ascii="Calibri" w:cs="Calibri" w:eastAsia="Calibri" w:hAnsi="Calibri"/>
+                <w:sz w:val="22"/>
+                <w:szCs w:val="22"/>
+              </w:rPr>
+              <w:t xml:space="preserve"> </w:t>
+            </w:r>
+          </w:p>
+        </w:tc>
+      </w:tr>
+      <w:tr>
+        <w:trPr>
+          <w:trHeight w:val="460" w:hRule="exact"/>
+        </w:trPr>
+        <w:tc>
+          <w:tcPr>
+            <w:tcW w:type="dxa" w:w="10080"/>
+            <w:tcBorders>
+              <w:top w:val="none" w:color="FFFFFF" w:sz="0"/>
+              <w:left w:val="none" w:color="FFFFFF" w:sz="0"/>
+              <w:bottom w:val="single" w:color="C9D2DE" w:sz="4"/>
+              <w:right w:val="none" w:color="FFFFFF" w:sz="0"/>
+            </w:tcBorders>
+            <w:tcMar>
+              <w:top w:type="dxa" w:w="0"/>
+              <w:left w:type="dxa" w:w="0"/>
+              <w:bottom w:type="dxa" w:w="0"/>
+              <w:right w:type="dxa" w:w="0"/>
+            </w:tcMar>
+          </w:tcPr>
+          <w:p>
+            <w:pPr>
+              <w:spacing w:after="0" w:before="0"/>
+            </w:pPr>
+            <w:r>
+              <w:rPr>
+                <w:rFonts w:ascii="Calibri" w:cs="Calibri" w:eastAsia="Calibri" w:hAnsi="Calibri"/>
+                <w:sz w:val="22"/>
+                <w:szCs w:val="22"/>
+              </w:rPr>
+              <w:t xml:space="preserve"> </w:t>
+            </w:r>
+          </w:p>
+        </w:tc>
+      </w:tr>
+      <w:tr>
+        <w:trPr>
+          <w:trHeight w:val="460" w:hRule="exact"/>
+        </w:trPr>
+        <w:tc>
+          <w:tcPr>
+            <w:tcW w:type="dxa" w:w="10080"/>
+            <w:tcBorders>
+              <w:top w:val="none" w:color="FFFFFF" w:sz="0"/>
+              <w:left w:val="none" w:color="FFFFFF" w:sz="0"/>
+              <w:bottom w:val="single" w:color="C9D2DE" w:sz="4"/>
+              <w:right w:val="none" w:color="FFFFFF" w:sz="0"/>
+            </w:tcBorders>
+            <w:tcMar>
+              <w:top w:type="dxa" w:w="0"/>
+              <w:left w:type="dxa" w:w="0"/>
+              <w:bottom w:type="dxa" w:w="0"/>
+              <w:right w:type="dxa" w:w="0"/>
+            </w:tcMar>
+          </w:tcPr>
+          <w:p>
+            <w:pPr>
+              <w:spacing w:after="0" w:before="0"/>
+            </w:pPr>
+            <w:r>
+              <w:rPr>
+                <w:rFonts w:ascii="Calibri" w:cs="Calibri" w:eastAsia="Calibri" w:hAnsi="Calibri"/>
+                <w:sz w:val="22"/>
+                <w:szCs w:val="22"/>
+              </w:rPr>
+              <w:t xml:space="preserve"> </w:t>
+            </w:r>
+          </w:p>
+        </w:tc>
+      </w:tr>
+      <w:tr>
+        <w:trPr>
+          <w:trHeight w:val="460" w:hRule="exact"/>
+        </w:trPr>
+        <w:tc>
+          <w:tcPr>
+            <w:tcW w:type="dxa" w:w="10080"/>
+            <w:tcBorders>
+              <w:top w:val="none" w:color="FFFFFF" w:sz="0"/>
+              <w:left w:val="none" w:color="FFFFFF" w:sz="0"/>
+              <w:bottom w:val="single" w:color="C9D2DE" w:sz="4"/>
+              <w:right w:val="none" w:color="FFFFFF" w:sz="0"/>
+            </w:tcBorders>
+            <w:tcMar>
+              <w:top w:type="dxa" w:w="0"/>
+              <w:left w:type="dxa" w:w="0"/>
+              <w:bottom w:type="dxa" w:w="0"/>
+              <w:right w:type="dxa" w:w="0"/>
+            </w:tcMar>
+          </w:tcPr>
+          <w:p>
+            <w:pPr>
+              <w:spacing w:after="0" w:before="0"/>
+            </w:pPr>
+            <w:r>
+              <w:rPr>
+                <w:rFonts w:ascii="Calibri" w:cs="Calibri" w:eastAsia="Calibri" w:hAnsi="Calibri"/>
+                <w:sz w:val="22"/>
+                <w:szCs w:val="22"/>
+              </w:rPr>
+              <w:t xml:space="preserve"> </w:t>
+            </w:r>
+          </w:p>
+        </w:tc>
+      </w:tr>
+      <w:tr>
+        <w:trPr>
+          <w:trHeight w:val="460" w:hRule="exact"/>
+        </w:trPr>
+        <w:tc>
+          <w:tcPr>
+            <w:tcW w:type="dxa" w:w="10080"/>
+            <w:tcBorders>
+              <w:top w:val="none" w:color="FFFFFF" w:sz="0"/>
+              <w:left w:val="none" w:color="FFFFFF" w:sz="0"/>
+              <w:bottom w:val="single" w:color="C9D2DE" w:sz="4"/>
+              <w:right w:val="none" w:color="FFFFFF" w:sz="0"/>
+            </w:tcBorders>
+            <w:tcMar>
+              <w:top w:type="dxa" w:w="0"/>
+              <w:left w:type="dxa" w:w="0"/>
+              <w:bottom w:type="dxa" w:w="0"/>
+              <w:right w:type="dxa" w:w="0"/>
+            </w:tcMar>
+          </w:tcPr>
+          <w:p>
+            <w:pPr>
+              <w:spacing w:after="0" w:before="0"/>
+            </w:pPr>
+            <w:r>
+              <w:rPr>
+                <w:rFonts w:ascii="Calibri" w:cs="Calibri" w:eastAsia="Calibri" w:hAnsi="Calibri"/>
+                <w:sz w:val="22"/>
+                <w:szCs w:val="22"/>
+              </w:rPr>
+              <w:t xml:space="preserve"> </w:t>
+            </w:r>
+          </w:p>
+        </w:tc>
+      </w:tr>
+      <w:tr>
+        <w:trPr>
+          <w:trHeight w:val="460" w:hRule="exact"/>
+        </w:trPr>
+        <w:tc>
+          <w:tcPr>
+            <w:tcW w:type="dxa" w:w="10080"/>
+            <w:tcBorders>
+              <w:top w:val="none" w:color="FFFFFF" w:sz="0"/>
+              <w:left w:val="none" w:color="FFFFFF" w:sz="0"/>
+              <w:bottom w:val="single" w:color="C9D2DE" w:sz="4"/>
+              <w:right w:val="none" w:color="FFFFFF" w:sz="0"/>
+            </w:tcBorders>
+            <w:tcMar>
+              <w:top w:type="dxa" w:w="0"/>
+              <w:left w:type="dxa" w:w="0"/>
+              <w:bottom w:type="dxa" w:w="0"/>
+              <w:right w:type="dxa" w:w="0"/>
+            </w:tcMar>
+          </w:tcPr>
+          <w:p>
+            <w:pPr>
+              <w:spacing w:after="0" w:before="0"/>
+            </w:pPr>
+            <w:r>
+              <w:rPr>
+                <w:rFonts w:ascii="Calibri" w:cs="Calibri" w:eastAsia="Calibri" w:hAnsi="Calibri"/>
+                <w:sz w:val="22"/>
+                <w:szCs w:val="22"/>
+              </w:rPr>
+              <w:t xml:space="preserve"> </w:t>
+            </w:r>
+          </w:p>
+        </w:tc>
+      </w:tr>
+      <w:tr>
+        <w:trPr>
+          <w:trHeight w:val="460" w:hRule="exact"/>
+        </w:trPr>
+        <w:tc>
+          <w:tcPr>
+            <w:tcW w:type="dxa" w:w="10080"/>
+            <w:tcBorders>
+              <w:top w:val="none" w:color="FFFFFF" w:sz="0"/>
+              <w:left w:val="none" w:color="FFFFFF" w:sz="0"/>
+              <w:bottom w:val="single" w:color="C9D2DE" w:sz="4"/>
+              <w:right w:val="none" w:color="FFFFFF" w:sz="0"/>
+            </w:tcBorders>
+            <w:tcMar>
+              <w:top w:type="dxa" w:w="0"/>
+              <w:left w:type="dxa" w:w="0"/>
+              <w:bottom w:type="dxa" w:w="0"/>
+              <w:right w:type="dxa" w:w="0"/>
+            </w:tcMar>
+          </w:tcPr>
+          <w:p>
+            <w:pPr>
+              <w:spacing w:after="0" w:before="0"/>
+            </w:pPr>
+            <w:r>
+              <w:rPr>
+                <w:rFonts w:ascii="Calibri" w:cs="Calibri" w:eastAsia="Calibri" w:hAnsi="Calibri"/>
+                <w:sz w:val="22"/>
+                <w:szCs w:val="22"/>
+              </w:rPr>
+              <w:t xml:space="preserve"> </w:t>
+            </w:r>
+          </w:p>
+        </w:tc>
+      </w:tr>
+      <w:tr>
+        <w:trPr>
+          <w:trHeight w:val="460" w:hRule="exact"/>
+        </w:trPr>
+        <w:tc>
+          <w:tcPr>
+            <w:tcW w:type="dxa" w:w="10080"/>
+            <w:tcBorders>
+              <w:top w:val="none" w:color="FFFFFF" w:sz="0"/>
+              <w:left w:val="none" w:color="FFFFFF" w:sz="0"/>
+              <w:bottom w:val="single" w:color="C9D2DE" w:sz="4"/>
+              <w:right w:val="none" w:color="FFFFFF" w:sz="0"/>
+            </w:tcBorders>
+            <w:tcMar>
+              <w:top w:type="dxa" w:w="0"/>
+              <w:left w:type="dxa" w:w="0"/>
+              <w:bottom w:type="dxa" w:w="0"/>
+              <w:right w:type="dxa" w:w="0"/>
+            </w:tcMar>
+          </w:tcPr>
+          <w:p>
+            <w:pPr>
+              <w:spacing w:after="0" w:before="0"/>
+            </w:pPr>
+            <w:r>
+              <w:rPr>
+                <w:rFonts w:ascii="Calibri" w:cs="Calibri" w:eastAsia="Calibri" w:hAnsi="Calibri"/>
+                <w:sz w:val="22"/>
+                <w:szCs w:val="22"/>
+              </w:rPr>
+              <w:t xml:space="preserve"> </w:t>
+            </w:r>
+          </w:p>
+        </w:tc>
+      </w:tr>
+      <w:tr>
+        <w:trPr>
+          <w:trHeight w:val="460" w:hRule="exact"/>
+        </w:trPr>
+        <w:tc>
+          <w:tcPr>
+            <w:tcW w:type="dxa" w:w="10080"/>
+            <w:tcBorders>
+              <w:top w:val="none" w:color="FFFFFF" w:sz="0"/>
+              <w:left w:val="none" w:color="FFFFFF" w:sz="0"/>
+              <w:bottom w:val="single" w:color="C9D2DE" w:sz="4"/>
+              <w:right w:val="none" w:color="FFFFFF" w:sz="0"/>
+            </w:tcBorders>
+            <w:tcMar>
+              <w:top w:type="dxa" w:w="0"/>
+              <w:left w:type="dxa" w:w="0"/>
+              <w:bottom w:type="dxa" w:w="0"/>
+              <w:right w:type="dxa" w:w="0"/>
+            </w:tcMar>
+          </w:tcPr>
+          <w:p>
+            <w:pPr>
+              <w:spacing w:after="0" w:before="0"/>
+            </w:pPr>
+            <w:r>
+              <w:rPr>
+                <w:rFonts w:ascii="Calibri" w:cs="Calibri" w:eastAsia="Calibri" w:hAnsi="Calibri"/>
+                <w:sz w:val="22"/>
+                <w:szCs w:val="22"/>
+              </w:rPr>
+              <w:t xml:space="preserve"> </w:t>
+            </w:r>
+          </w:p>
+        </w:tc>
+      </w:tr>
+      <w:tr>
+        <w:trPr>
+          <w:trHeight w:val="460" w:hRule="exact"/>
+        </w:trPr>
+        <w:tc>
+          <w:tcPr>
+            <w:tcW w:type="dxa" w:w="10080"/>
+            <w:tcBorders>
+              <w:top w:val="none" w:color="FFFFFF" w:sz="0"/>
+              <w:left w:val="none" w:color="FFFFFF" w:sz="0"/>
+              <w:bottom w:val="single" w:color="C9D2DE" w:sz="4"/>
+              <w:right w:val="none" w:color="FFFFFF" w:sz="0"/>
+            </w:tcBorders>
+            <w:tcMar>
+              <w:top w:type="dxa" w:w="0"/>
+              <w:left w:type="dxa" w:w="0"/>
+              <w:bottom w:type="dxa" w:w="0"/>
+              <w:right w:type="dxa" w:w="0"/>
+            </w:tcMar>
+          </w:tcPr>
+          <w:p>
+            <w:pPr>
+              <w:spacing w:after="0" w:before="0"/>
+            </w:pPr>
+            <w:r>
+              <w:rPr>
+                <w:rFonts w:ascii="Calibri" w:cs="Calibri" w:eastAsia="Calibri" w:hAnsi="Calibri"/>
+                <w:sz w:val="22"/>
+                <w:szCs w:val="22"/>
+              </w:rPr>
+              <w:t xml:space="preserve"> </w:t>
+            </w:r>
+          </w:p>
+        </w:tc>
+      </w:tr>
+      <w:tr>
+        <w:trPr>
+          <w:trHeight w:val="460" w:hRule="exact"/>
+        </w:trPr>
+        <w:tc>
+          <w:tcPr>
+            <w:tcW w:type="dxa" w:w="10080"/>
+            <w:tcBorders>
+              <w:top w:val="none" w:color="FFFFFF" w:sz="0"/>
+              <w:left w:val="none" w:color="FFFFFF" w:sz="0"/>
+              <w:bottom w:val="single" w:color="C9D2DE" w:sz="4"/>
+              <w:right w:val="none" w:color="FFFFFF" w:sz="0"/>
+            </w:tcBorders>
+            <w:tcMar>
+              <w:top w:type="dxa" w:w="0"/>
+              <w:left w:type="dxa" w:w="0"/>
+              <w:bottom w:type="dxa" w:w="0"/>
+              <w:right w:type="dxa" w:w="0"/>
+            </w:tcMar>
+          </w:tcPr>
+          <w:p>
+            <w:pPr>
+              <w:spacing w:after="0" w:before="0"/>
+            </w:pPr>
+            <w:r>
+              <w:rPr>
+                <w:rFonts w:ascii="Calibri" w:cs="Calibri" w:eastAsia="Calibri" w:hAnsi="Calibri"/>
+                <w:sz w:val="22"/>
+                <w:szCs w:val="22"/>
+              </w:rPr>
+              <w:t xml:space="preserve"> </w:t>
+            </w:r>
+          </w:p>
+        </w:tc>
+      </w:tr>
+      <w:tr>
+        <w:trPr>
+          <w:trHeight w:val="460" w:hRule="exact"/>
+        </w:trPr>
+        <w:tc>
+          <w:tcPr>
+            <w:tcW w:type="dxa" w:w="10080"/>
+            <w:tcBorders>
+              <w:top w:val="none" w:color="FFFFFF" w:sz="0"/>
+              <w:left w:val="none" w:color="FFFFFF" w:sz="0"/>
+              <w:bottom w:val="single" w:color="C9D2DE" w:sz="4"/>
+              <w:right w:val="none" w:color="FFFFFF" w:sz="0"/>
+            </w:tcBorders>
+            <w:tcMar>
+              <w:top w:type="dxa" w:w="0"/>
+              <w:left w:type="dxa" w:w="0"/>
+              <w:bottom w:type="dxa" w:w="0"/>
+              <w:right w:type="dxa" w:w="0"/>
+            </w:tcMar>
+          </w:tcPr>
+          <w:p>
+            <w:pPr>
+              <w:spacing w:after="0" w:before="0"/>
+            </w:pPr>
+            <w:r>
+              <w:rPr>
+                <w:rFonts w:ascii="Calibri" w:cs="Calibri" w:eastAsia="Calibri" w:hAnsi="Calibri"/>
+                <w:sz w:val="22"/>
+                <w:szCs w:val="22"/>
+              </w:rPr>
+              <w:t xml:space="preserve"> </w:t>
+            </w:r>
+          </w:p>
+        </w:tc>
+      </w:tr>
+      <w:tr>
+        <w:trPr>
+          <w:trHeight w:val="460" w:hRule="exact"/>
+        </w:trPr>
+        <w:tc>
+          <w:tcPr>
+            <w:tcW w:type="dxa" w:w="10080"/>
+            <w:tcBorders>
+              <w:top w:val="none" w:color="FFFFFF" w:sz="0"/>
+              <w:left w:val="none" w:color="FFFFFF" w:sz="0"/>
+              <w:bottom w:val="single" w:color="C9D2DE" w:sz="4"/>
+              <w:right w:val="none" w:color="FFFFFF" w:sz="0"/>
+            </w:tcBorders>
+            <w:tcMar>
+              <w:top w:type="dxa" w:w="0"/>
+              <w:left w:type="dxa" w:w="0"/>
+              <w:bottom w:type="dxa" w:w="0"/>
+              <w:right w:type="dxa" w:w="0"/>
+            </w:tcMar>
+          </w:tcPr>
+          <w:p>
+            <w:pPr>
+              <w:spacing w:after="0" w:before="0"/>
+            </w:pPr>
+            <w:r>
+              <w:rPr>
+                <w:rFonts w:ascii="Calibri" w:cs="Calibri" w:eastAsia="Calibri" w:hAnsi="Calibri"/>
+                <w:sz w:val="22"/>
+                <w:szCs w:val="22"/>
+              </w:rPr>
+              <w:t xml:space="preserve"> </w:t>
+            </w:r>
+          </w:p>
+        </w:tc>
+      </w:tr>
+      <w:tr>
+        <w:trPr>
+          <w:trHeight w:val="460" w:hRule="exact"/>
+        </w:trPr>
+        <w:tc>
+          <w:tcPr>
+            <w:tcW w:type="dxa" w:w="10080"/>
+            <w:tcBorders>
+              <w:top w:val="none" w:color="FFFFFF" w:sz="0"/>
+              <w:left w:val="none" w:color="FFFFFF" w:sz="0"/>
+              <w:bottom w:val="single" w:color="C9D2DE" w:sz="4"/>
+              <w:right w:val="none" w:color="FFFFFF" w:sz="0"/>
+            </w:tcBorders>
+            <w:tcMar>
+              <w:top w:type="dxa" w:w="0"/>
+              <w:left w:type="dxa" w:w="0"/>
+              <w:bottom w:type="dxa" w:w="0"/>
+              <w:right w:type="dxa" w:w="0"/>
+            </w:tcMar>
+          </w:tcPr>
+          <w:p>
+            <w:pPr>
+              <w:spacing w:after="0" w:before="0"/>
+            </w:pPr>
+            <w:r>
+              <w:rPr>
+                <w:rFonts w:ascii="Calibri" w:cs="Calibri" w:eastAsia="Calibri" w:hAnsi="Calibri"/>
+                <w:sz w:val="22"/>
+                <w:szCs w:val="22"/>
+              </w:rPr>
+              <w:t xml:space="preserve"> </w:t>
+            </w:r>
+          </w:p>
+        </w:tc>
+      </w:tr>
+      <w:tr>
+        <w:trPr>
+          <w:trHeight w:val="460" w:hRule="exact"/>
+        </w:trPr>
+        <w:tc>
+          <w:tcPr>
+            <w:tcW w:type="dxa" w:w="10080"/>
+            <w:tcBorders>
+              <w:top w:val="none" w:color="FFFFFF" w:sz="0"/>
+              <w:left w:val="none" w:color="FFFFFF" w:sz="0"/>
+              <w:bottom w:val="single" w:color="C9D2DE" w:sz="4"/>
+              <w:right w:val="none" w:color="FFFFFF" w:sz="0"/>
+            </w:tcBorders>
+            <w:tcMar>
+              <w:top w:type="dxa" w:w="0"/>
+              <w:left w:type="dxa" w:w="0"/>
+              <w:bottom w:type="dxa" w:w="0"/>
+              <w:right w:type="dxa" w:w="0"/>
+            </w:tcMar>
+          </w:tcPr>
+          <w:p>
+            <w:pPr>
+              <w:spacing w:after="0" w:before="0"/>
+            </w:pPr>
+            <w:r>
+              <w:rPr>
+                <w:rFonts w:ascii="Calibri" w:cs="Calibri" w:eastAsia="Calibri" w:hAnsi="Calibri"/>
+                <w:sz w:val="22"/>
+                <w:szCs w:val="22"/>
+              </w:rPr>
+              <w:t xml:space="preserve"> </w:t>
+            </w:r>
+          </w:p>
+        </w:tc>
+      </w:tr>
+      <w:tr>
+        <w:trPr>
+          <w:trHeight w:val="460" w:hRule="exact"/>
+        </w:trPr>
+        <w:tc>
+          <w:tcPr>
+            <w:tcW w:type="dxa" w:w="10080"/>
+            <w:tcBorders>
+              <w:top w:val="none" w:color="FFFFFF" w:sz="0"/>
+              <w:left w:val="none" w:color="FFFFFF" w:sz="0"/>
+              <w:bottom w:val="single" w:color="C9D2DE" w:sz="4"/>
+              <w:right w:val="none" w:color="FFFFFF" w:sz="0"/>
+            </w:tcBorders>
+            <w:tcMar>
+              <w:top w:type="dxa" w:w="0"/>
+              <w:left w:type="dxa" w:w="0"/>
+              <w:bottom w:type="dxa" w:w="0"/>
+              <w:right w:type="dxa" w:w="0"/>
+            </w:tcMar>
+          </w:tcPr>
+          <w:p>
+            <w:pPr>
+              <w:spacing w:after="0" w:before="0"/>
+            </w:pPr>
+            <w:r>
+              <w:rPr>
+                <w:rFonts w:ascii="Calibri" w:cs="Calibri" w:eastAsia="Calibri" w:hAnsi="Calibri"/>
+                <w:sz w:val="22"/>
+                <w:szCs w:val="22"/>
+              </w:rPr>
+              <w:t xml:space="preserve"> </w:t>
+            </w:r>
+          </w:p>
+        </w:tc>
+      </w:tr>
+      <w:tr>
+        <w:trPr>
+          <w:trHeight w:val="460" w:hRule="exact"/>
+        </w:trPr>
+        <w:tc>
+          <w:tcPr>
+            <w:tcW w:type="dxa" w:w="10080"/>
+            <w:tcBorders>
+              <w:top w:val="none" w:color="FFFFFF" w:sz="0"/>
+              <w:left w:val="none" w:color="FFFFFF" w:sz="0"/>
+              <w:bottom w:val="single" w:color="C9D2DE" w:sz="4"/>
+              <w:right w:val="none" w:color="FFFFFF" w:sz="0"/>
+            </w:tcBorders>
+            <w:tcMar>
+              <w:top w:type="dxa" w:w="0"/>
+              <w:left w:type="dxa" w:w="0"/>
+              <w:bottom w:type="dxa" w:w="0"/>
+              <w:right w:type="dxa" w:w="0"/>
+            </w:tcMar>
+          </w:tcPr>
+          <w:p>
+            <w:pPr>
+              <w:spacing w:after="0" w:before="0"/>
+            </w:pPr>
+            <w:r>
+              <w:rPr>
+                <w:rFonts w:ascii="Calibri" w:cs="Calibri" w:eastAsia="Calibri" w:hAnsi="Calibri"/>
+                <w:sz w:val="22"/>
+                <w:szCs w:val="22"/>
+              </w:rPr>
+              <w:t xml:space="preserve"> </w:t>
+            </w:r>
+          </w:p>
+        </w:tc>
+      </w:tr>
+      <w:tr>
+        <w:trPr>
+          <w:trHeight w:val="460" w:hRule="exact"/>
+        </w:trPr>
+        <w:tc>
+          <w:tcPr>
+            <w:tcW w:type="dxa" w:w="10080"/>
+            <w:tcBorders>
+              <w:top w:val="none" w:color="FFFFFF" w:sz="0"/>
+              <w:left w:val="none" w:color="FFFFFF" w:sz="0"/>
+              <w:bottom w:val="single" w:color="C9D2DE" w:sz="4"/>
+              <w:right w:val="none" w:color="FFFFFF" w:sz="0"/>
+            </w:tcBorders>
+            <w:tcMar>
+              <w:top w:type="dxa" w:w="0"/>
+              <w:left w:type="dxa" w:w="0"/>
+              <w:bottom w:type="dxa" w:w="0"/>
+              <w:right w:type="dxa" w:w="0"/>
+            </w:tcMar>
+          </w:tcPr>
+          <w:p>
+            <w:pPr>
+              <w:spacing w:after="0" w:before="0"/>
+            </w:pPr>
+            <w:r>
+              <w:rPr>
+                <w:rFonts w:ascii="Calibri" w:cs="Calibri" w:eastAsia="Calibri" w:hAnsi="Calibri"/>
+                <w:sz w:val="22"/>
+                <w:szCs w:val="22"/>
+              </w:rPr>
+              <w:t xml:space="preserve"> </w:t>
+            </w:r>
+          </w:p>
+        </w:tc>
+      </w:tr>
+      <w:tr>
+        <w:trPr>
+          <w:trHeight w:val="460" w:hRule="exact"/>
+        </w:trPr>
+        <w:tc>
+          <w:tcPr>
+            <w:tcW w:type="dxa" w:w="10080"/>
+            <w:tcBorders>
+              <w:top w:val="none" w:color="FFFFFF" w:sz="0"/>
+              <w:left w:val="none" w:color="FFFFFF" w:sz="0"/>
+              <w:bottom w:val="single" w:color="C9D2DE" w:sz="4"/>
+              <w:right w:val="none" w:color="FFFFFF" w:sz="0"/>
+            </w:tcBorders>
+            <w:tcMar>
+              <w:top w:type="dxa" w:w="0"/>
+              <w:left w:type="dxa" w:w="0"/>
+              <w:bottom w:type="dxa" w:w="0"/>
+              <w:right w:type="dxa" w:w="0"/>
+            </w:tcMar>
+          </w:tcPr>
+          <w:p>
+            <w:pPr>
+              <w:spacing w:after="0" w:before="0"/>
+            </w:pPr>
+            <w:r>
+              <w:rPr>
+                <w:rFonts w:ascii="Calibri" w:cs="Calibri" w:eastAsia="Calibri" w:hAnsi="Calibri"/>
+                <w:sz w:val="22"/>
+                <w:szCs w:val="22"/>
+              </w:rPr>
+              <w:t xml:space="preserve"> </w:t>
+            </w:r>
+          </w:p>
+        </w:tc>
+      </w:tr>
+      <w:tr>
+        <w:trPr>
+          <w:trHeight w:val="460" w:hRule="exact"/>
+        </w:trPr>
+        <w:tc>
+          <w:tcPr>
+            <w:tcW w:type="dxa" w:w="10080"/>
+            <w:tcBorders>
+              <w:top w:val="none" w:color="FFFFFF" w:sz="0"/>
+              <w:left w:val="none" w:color="FFFFFF" w:sz="0"/>
+              <w:bottom w:val="single" w:color="C9D2DE" w:sz="4"/>
+              <w:right w:val="none" w:color="FFFFFF" w:sz="0"/>
+            </w:tcBorders>
+            <w:tcMar>
+              <w:top w:type="dxa" w:w="0"/>
+              <w:left w:type="dxa" w:w="0"/>
+              <w:bottom w:type="dxa" w:w="0"/>
+              <w:right w:type="dxa" w:w="0"/>
+            </w:tcMar>
+          </w:tcPr>
+          <w:p>
+            <w:pPr>
+              <w:spacing w:after="0" w:before="0"/>
+            </w:pPr>
+            <w:r>
+              <w:rPr>
+                <w:rFonts w:ascii="Calibri" w:cs="Calibri" w:eastAsia="Calibri" w:hAnsi="Calibri"/>
+                <w:sz w:val="22"/>
+                <w:szCs w:val="22"/>
+              </w:rPr>
+              <w:t xml:space="preserve"> </w:t>
+            </w:r>
+          </w:p>
+        </w:tc>
+      </w:tr>
+      <w:tr>
+        <w:trPr>
+          <w:trHeight w:val="460" w:hRule="exact"/>
+        </w:trPr>
+        <w:tc>
+          <w:tcPr>
+            <w:tcW w:type="dxa" w:w="10080"/>
+            <w:tcBorders>
+              <w:top w:val="none" w:color="FFFFFF" w:sz="0"/>
+              <w:left w:val="none" w:color="FFFFFF" w:sz="0"/>
+              <w:bottom w:val="single" w:color="C9D2DE" w:sz="4"/>
+              <w:right w:val="none" w:color="FFFFFF" w:sz="0"/>
+            </w:tcBorders>
+            <w:tcMar>
+              <w:top w:type="dxa" w:w="0"/>
+              <w:left w:type="dxa" w:w="0"/>
+              <w:bottom w:type="dxa" w:w="0"/>
+              <w:right w:type="dxa" w:w="0"/>
+            </w:tcMar>
+          </w:tcPr>
+          <w:p>
+            <w:pPr>
+              <w:spacing w:after="0" w:before="0"/>
+            </w:pPr>
+            <w:r>
+              <w:rPr>
+                <w:rFonts w:ascii="Calibri" w:cs="Calibri" w:eastAsia="Calibri" w:hAnsi="Calibri"/>
+                <w:sz w:val="22"/>
+                <w:szCs w:val="22"/>
+              </w:rPr>
+              <w:t xml:space="preserve"> </w:t>
+            </w:r>
+          </w:p>
+        </w:tc>
+      </w:tr>
+      <w:tr>
+        <w:trPr>
+          <w:trHeight w:val="460" w:hRule="exact"/>
+        </w:trPr>
+        <w:tc>
+          <w:tcPr>
+            <w:tcW w:type="dxa" w:w="10080"/>
+            <w:tcBorders>
+              <w:top w:val="none" w:color="FFFFFF" w:sz="0"/>
+              <w:left w:val="none" w:color="FFFFFF" w:sz="0"/>
+              <w:bottom w:val="single" w:color="C9D2DE" w:sz="4"/>
+              <w:right w:val="none" w:color="FFFFFF" w:sz="0"/>
+            </w:tcBorders>
+            <w:tcMar>
+              <w:top w:type="dxa" w:w="0"/>
+              <w:left w:type="dxa" w:w="0"/>
+              <w:bottom w:type="dxa" w:w="0"/>
+              <w:right w:type="dxa" w:w="0"/>
+            </w:tcMar>
+          </w:tcPr>
+          <w:p>
+            <w:pPr>
+              <w:spacing w:after="0" w:before="0"/>
+            </w:pPr>
+            <w:r>
+              <w:rPr>
+                <w:rFonts w:ascii="Calibri" w:cs="Calibri" w:eastAsia="Calibri" w:hAnsi="Calibri"/>
+                <w:sz w:val="22"/>
+                <w:szCs w:val="22"/>
+              </w:rPr>
+              <w:t xml:space="preserve"> </w:t>
             </w:r>
           </w:p>
         </w:tc>
@@ -5199,7 +8503,7 @@
               <w:spacing w:after="80"/>
               <w:jc w:val="center"/>
             </w:pPr>
-            <w:hyperlink w:history="1" r:id="rIdsxxtoemmpn0ezqvw_0i2n">
+            <w:hyperlink w:history="1" r:id="rIddrosdes88ledaujq1ess9">
               <w:r>
                 <w:rPr>
                   <w:rStyle w:val="Hyperlink"/>
@@ -5299,7 +8603,7 @@
               <w:spacing w:after="80"/>
               <w:jc w:val="center"/>
             </w:pPr>
-            <w:hyperlink w:history="1" r:id="rId3grswtbrk5n0o8hspukim">
+            <w:hyperlink w:history="1" r:id="rIdnfqb90zmxqfbjsgr24mnw">
               <w:r>
                 <w:rPr>
                   <w:rStyle w:val="Hyperlink"/>
@@ -5456,7 +8760,7 @@
               <w:spacing w:after="80"/>
               <w:jc w:val="center"/>
             </w:pPr>
-            <w:hyperlink w:history="1" r:id="rIdqz0qyrziiaselbebr7ay3">
+            <w:hyperlink w:history="1" r:id="rIddho4xzplzbkpns01qf6zi">
               <w:r>
                 <w:rPr>
                   <w:rStyle w:val="Hyperlink"/>
@@ -5556,7 +8860,7 @@
               <w:spacing w:after="80"/>
               <w:jc w:val="center"/>
             </w:pPr>
-            <w:hyperlink w:history="1" r:id="rIdsimjoxkic5tpamnx5iz24">
+            <w:hyperlink w:history="1" r:id="rIdhwfmng3x0psbhrytryidx">
               <w:r>
                 <w:rPr>
                   <w:rStyle w:val="Hyperlink"/>
@@ -5712,7 +9016,7 @@
               <w:spacing w:after="80"/>
               <w:jc w:val="center"/>
             </w:pPr>
-            <w:hyperlink w:history="1" r:id="rIdtjlainr1jflhhlhyhenqs">
+            <w:hyperlink w:history="1" r:id="rIdfshz0ihbwzepiu5v3wfwa">
               <w:r>
                 <w:rPr>
                   <w:rStyle w:val="Hyperlink"/>
@@ -5868,7 +9172,7 @@
               <w:spacing w:after="80"/>
               <w:jc w:val="center"/>
             </w:pPr>
-            <w:hyperlink w:history="1" r:id="rIdfnkqmibls4_2vf3mez76b">
+            <w:hyperlink w:history="1" r:id="rIdvd6nd9ftczuow7avvvi5n">
               <w:r>
                 <w:rPr>
                   <w:rStyle w:val="Hyperlink"/>
@@ -6025,7 +9329,7 @@
               <w:spacing w:after="80"/>
               <w:jc w:val="center"/>
             </w:pPr>
-            <w:hyperlink w:history="1" r:id="rIdqtgncpszirq8rlgifbn-d">
+            <w:hyperlink w:history="1" r:id="rId9wu7owibydsapuew7qvlx">
               <w:r>
                 <w:rPr>
                   <w:rStyle w:val="Hyperlink"/>
@@ -6125,7 +9429,7 @@
               <w:spacing w:after="80"/>
               <w:jc w:val="center"/>
             </w:pPr>
-            <w:hyperlink w:history="1" r:id="rIdahnhguk0wwnirpaav0wug">
+            <w:hyperlink w:history="1" r:id="rIdgekwnqpxfl7rnn7fsb6fm">
               <w:r>
                 <w:rPr>
                   <w:rStyle w:val="Hyperlink"/>
@@ -6284,7 +9588,7 @@
               <w:spacing w:after="80"/>
               <w:jc w:val="center"/>
             </w:pPr>
-            <w:hyperlink w:history="1" r:id="rIdioqjadgmyvtva37606cl_">
+            <w:hyperlink w:history="1" r:id="rIdx9999h1tz1zizskufc8s6">
               <w:r>
                 <w:rPr>
                   <w:rStyle w:val="Hyperlink"/>
@@ -6384,7 +9688,7 @@
               <w:spacing w:after="80"/>
               <w:jc w:val="center"/>
             </w:pPr>
-            <w:hyperlink w:history="1" r:id="rIdbuczsq1hzohafeqruhs3u">
+            <w:hyperlink w:history="1" r:id="rIdhq1q2ndfivk7xksi9as6w">
               <w:r>
                 <w:rPr>
                   <w:rStyle w:val="Hyperlink"/>
@@ -6484,7 +9788,7 @@
               <w:spacing w:after="80"/>
               <w:jc w:val="center"/>
             </w:pPr>
-            <w:hyperlink w:history="1" r:id="rIdfv-akzo5k0ryfzrbg2tp9">
+            <w:hyperlink w:history="1" r:id="rIdbeegorfvvw6fhfdrse87e">
               <w:r>
                 <w:rPr>
                   <w:rStyle w:val="Hyperlink"/>
@@ -6584,7 +9888,7 @@
               <w:spacing w:after="80"/>
               <w:jc w:val="center"/>
             </w:pPr>
-            <w:hyperlink w:history="1" r:id="rIdrpwsysab7aqnyxawuuj49">
+            <w:hyperlink w:history="1" r:id="rIdbc2knusfp4acqv9df7nun">
               <w:r>
                 <w:rPr>
                   <w:rStyle w:val="Hyperlink"/>
@@ -6716,7 +10020,7 @@
               <w:spacing w:after="80"/>
               <w:jc w:val="center"/>
             </w:pPr>
-            <w:hyperlink w:history="1" r:id="rId9p-1ude6zlq4p9jz6aezu">
+            <w:hyperlink w:history="1" r:id="rId-axeg9mablzmpfx45j501">
               <w:r>
                 <w:rPr>
                   <w:rStyle w:val="Hyperlink"/>
@@ -6816,7 +10120,7 @@
               <w:spacing w:after="80"/>
               <w:jc w:val="center"/>
             </w:pPr>
-            <w:hyperlink w:history="1" r:id="rId8u29-h7rkdbxgpm0efhdm">
+            <w:hyperlink w:history="1" r:id="rIdwd_czbgylytlcd6tyrti9">
               <w:r>
                 <w:rPr>
                   <w:rStyle w:val="Hyperlink"/>
@@ -6916,7 +10220,7 @@
               <w:spacing w:after="80"/>
               <w:jc w:val="center"/>
             </w:pPr>
-            <w:hyperlink w:history="1" r:id="rIdwyhdszas3xpx8atqpzcxd">
+            <w:hyperlink w:history="1" r:id="rIdm_w67rzcqj3b_yvrfxapu">
               <w:r>
                 <w:rPr>
                   <w:rStyle w:val="Hyperlink"/>
@@ -7016,7 +10320,7 @@
               <w:spacing w:after="80"/>
               <w:jc w:val="center"/>
             </w:pPr>
-            <w:hyperlink w:history="1" r:id="rIdnwhkqn1ifdtn3mrerrqz4">
+            <w:hyperlink w:history="1" r:id="rIdmyx7vss4lhs7ixsudybkf">
               <w:r>
                 <w:rPr>
                   <w:rStyle w:val="Hyperlink"/>
@@ -7316,7 +10620,7 @@
                   </w:r>
                 </w:p>
                 <w:p>
-                  <w:hyperlink w:history="1" r:id="rIdp4oc0gaw2ak8titmdvqmv">
+                  <w:hyperlink w:history="1" r:id="rIdjt3wunb1f7kwkj6hwdnsm">
                     <w:r>
                       <w:rPr>
                         <w:rStyle w:val="Hyperlink"/>
@@ -7525,7 +10829,7 @@
                   </w:r>
                 </w:p>
                 <w:p>
-                  <w:hyperlink w:history="1" r:id="rIdjh2tj-e208k9am0dfjpcq">
+                  <w:hyperlink w:history="1" r:id="rIdet7ookxoxk6y320bbbz4w">
                     <w:r>
                       <w:rPr>
                         <w:rStyle w:val="Hyperlink"/>
@@ -7764,7 +11068,7 @@
                   </w:r>
                 </w:p>
                 <w:p>
-                  <w:hyperlink w:history="1" r:id="rId2t7_gkgbg11qzskvqbdno">
+                  <w:hyperlink w:history="1" r:id="rIdbnxz3xb2aof3n3d5ry0hp">
                     <w:r>
                       <w:rPr>
                         <w:rStyle w:val="Hyperlink"/>
@@ -7973,7 +11277,7 @@
                   </w:r>
                 </w:p>
                 <w:p>
-                  <w:hyperlink w:history="1" r:id="rId9mg7ywnvu_91kvgv_eyog">
+                  <w:hyperlink w:history="1" r:id="rIdex2x9i460_j63dmttgcfz">
                     <w:r>
                       <w:rPr>
                         <w:rStyle w:val="Hyperlink"/>
@@ -8212,7 +11516,7 @@
                   </w:r>
                 </w:p>
                 <w:p>
-                  <w:hyperlink w:history="1" r:id="rIdjoxqcjhy9zzxjtkfx4ylw">
+                  <w:hyperlink w:history="1" r:id="rIdiqnhpmm3l4sz9nngn59zp">
                     <w:r>
                       <w:rPr>
                         <w:rStyle w:val="Hyperlink"/>
@@ -8421,7 +11725,7 @@
                   </w:r>
                 </w:p>
                 <w:p>
-                  <w:hyperlink w:history="1" r:id="rIdb1atyso-a6wckcge8ccur">
+                  <w:hyperlink w:history="1" r:id="rId9x5zmp5lglukqlhs47ntf">
                     <w:r>
                       <w:rPr>
                         <w:rStyle w:val="Hyperlink"/>
@@ -8855,7 +12159,7 @@
                   </w:r>
                 </w:p>
                 <w:p>
-                  <w:hyperlink w:history="1" r:id="rIdplcnk4fjw-xgxjwezazje">
+                  <w:hyperlink w:history="1" r:id="rIda3n7fa0sakb7euo1djxqr">
                     <w:r>
                       <w:rPr>
                         <w:rStyle w:val="Hyperlink"/>
@@ -9094,7 +12398,7 @@
                   </w:r>
                 </w:p>
                 <w:p>
-                  <w:hyperlink w:history="1" r:id="rIdeo5gwc46cfvgd9v_ngcaj">
+                  <w:hyperlink w:history="1" r:id="rIdu2fml3zn56wnimifew7xm">
                     <w:r>
                       <w:rPr>
                         <w:rStyle w:val="Hyperlink"/>
@@ -9303,7 +12607,7 @@
                   </w:r>
                 </w:p>
                 <w:p>
-                  <w:hyperlink w:history="1" r:id="rIdjruf_l5oe_tnn0h3ue7jk">
+                  <w:hyperlink w:history="1" r:id="rIddbnnd-xau1maibhi_jfmw">
                     <w:r>
                       <w:rPr>
                         <w:rStyle w:val="Hyperlink"/>
@@ -9542,7 +12846,7 @@
                   </w:r>
                 </w:p>
                 <w:p>
-                  <w:hyperlink w:history="1" r:id="rIdkqwcodaidxixxtfqaruze">
+                  <w:hyperlink w:history="1" r:id="rIdqqgupkgp84zj99shruauo">
                     <w:r>
                       <w:rPr>
                         <w:rStyle w:val="Hyperlink"/>
@@ -9751,7 +13055,7 @@
                   </w:r>
                 </w:p>
                 <w:p>
-                  <w:hyperlink w:history="1" r:id="rIdbajw_wcdpg6ighsmnhx6v">
+                  <w:hyperlink w:history="1" r:id="rId4fev0qw4sndliz6hllzej">
                     <w:r>
                       <w:rPr>
                         <w:rStyle w:val="Hyperlink"/>
@@ -9990,7 +13294,7 @@
                   </w:r>
                 </w:p>
                 <w:p>
-                  <w:hyperlink w:history="1" r:id="rIdkguxvf3-c1txpzwmbq1zq">
+                  <w:hyperlink w:history="1" r:id="rIdcctt1heu1kytoaqu7u5gx">
                     <w:r>
                       <w:rPr>
                         <w:rStyle w:val="Hyperlink"/>
@@ -10199,7 +13503,7 @@
                   </w:r>
                 </w:p>
                 <w:p>
-                  <w:hyperlink w:history="1" r:id="rIdbrzqqamuomikwmpss_3u-">
+                  <w:hyperlink w:history="1" r:id="rIdrk0liwj6bz-svu08orr6a">
                     <w:r>
                       <w:rPr>
                         <w:rStyle w:val="Hyperlink"/>
@@ -10463,7 +13767,7 @@
                   </w:r>
                 </w:p>
                 <w:p>
-                  <w:hyperlink w:history="1" r:id="rIdicevmhge8rm0fvy0xhkbq">
+                  <w:hyperlink w:history="1" r:id="rIdholccyk8wx3wrgqcqb38j">
                     <w:r>
                       <w:rPr>
                         <w:rStyle w:val="Hyperlink"/>
@@ -10697,7 +14001,7 @@
                   </w:r>
                 </w:p>
                 <w:p>
-                  <w:hyperlink w:history="1" r:id="rIdyc9sq1pjlym2nykmypcx6">
+                  <w:hyperlink w:history="1" r:id="rIdnadv_ld38iko8ciwjzj_c">
                     <w:r>
                       <w:rPr>
                         <w:rStyle w:val="Hyperlink"/>
@@ -10936,7 +14240,7 @@
                   </w:r>
                 </w:p>
                 <w:p>
-                  <w:hyperlink w:history="1" r:id="rIdeoagcmiupbms6earsap8y">
+                  <w:hyperlink w:history="1" r:id="rIdn46jqne01ivw0bmtb3re7">
                     <w:r>
                       <w:rPr>
                         <w:rStyle w:val="Hyperlink"/>
@@ -11145,7 +14449,7 @@
                   </w:r>
                 </w:p>
                 <w:p>
-                  <w:hyperlink w:history="1" r:id="rIdrxxuyk2ps9m8i7omvcg-q">
+                  <w:hyperlink w:history="1" r:id="rIdaoxcumqiyxnrxgrzg1tnv">
                     <w:r>
                       <w:rPr>
                         <w:rStyle w:val="Hyperlink"/>
@@ -11384,7 +14688,7 @@
                   </w:r>
                 </w:p>
                 <w:p>
-                  <w:hyperlink w:history="1" r:id="rIdtosuy4sev3fcw-9eic5rn">
+                  <w:hyperlink w:history="1" r:id="rIdz7lmxfoq1oxfsh5xbv0r_">
                     <w:r>
                       <w:rPr>
                         <w:rStyle w:val="Hyperlink"/>
@@ -11593,7 +14897,7 @@
                   </w:r>
                 </w:p>
                 <w:p>
-                  <w:hyperlink w:history="1" r:id="rIdqjvd4u7-zyewke04d2pip">
+                  <w:hyperlink w:history="1" r:id="rIdfeddz3lwxrie-krlg8hew">
                     <w:r>
                       <w:rPr>
                         <w:rStyle w:val="Hyperlink"/>
@@ -11832,7 +15136,7 @@
                   </w:r>
                 </w:p>
                 <w:p>
-                  <w:hyperlink w:history="1" r:id="rIdc2o1nmpiy3svl42lfgatq">
+                  <w:hyperlink w:history="1" r:id="rIdet2anpi3mefvgpv22vadm">
                     <w:r>
                       <w:rPr>
                         <w:rStyle w:val="Hyperlink"/>
@@ -12041,7 +15345,7 @@
                   </w:r>
                 </w:p>
                 <w:p>
-                  <w:hyperlink w:history="1" r:id="rId404go7ud4iktlvzif7_e_">
+                  <w:hyperlink w:history="1" r:id="rIdprtdia8ph-ogp7ssqygkz">
                     <w:r>
                       <w:rPr>
                         <w:rStyle w:val="Hyperlink"/>
@@ -12280,7 +15584,7 @@
                   </w:r>
                 </w:p>
                 <w:p>
-                  <w:hyperlink w:history="1" r:id="rId9vvhyuo6aqqlapwshyv1k">
+                  <w:hyperlink w:history="1" r:id="rId4rrh4rhiw6nvgr9uw0awa">
                     <w:r>
                       <w:rPr>
                         <w:rStyle w:val="Hyperlink"/>
@@ -12514,7 +15818,7 @@
                   </w:r>
                 </w:p>
                 <w:p>
-                  <w:hyperlink w:history="1" r:id="rIdww4nx3kcgsia2mxbdxnpd">
+                  <w:hyperlink w:history="1" r:id="rId-vef_yh7w1zmrd_ginijr">
                     <w:r>
                       <w:rPr>
                         <w:rStyle w:val="Hyperlink"/>
@@ -12778,7 +16082,7 @@
                   </w:r>
                 </w:p>
                 <w:p>
-                  <w:hyperlink w:history="1" r:id="rId1pjfbfplgjouhdeixswhh">
+                  <w:hyperlink w:history="1" r:id="rIdkxsbxiacqkpzjsuoarrsm">
                     <w:r>
                       <w:rPr>
                         <w:rStyle w:val="Hyperlink"/>
@@ -12987,7 +16291,7 @@
                   </w:r>
                 </w:p>
                 <w:p>
-                  <w:hyperlink w:history="1" r:id="rIdd0mq_fmqqaxfa6hyjndhu">
+                  <w:hyperlink w:history="1" r:id="rIdczfyozobpsh0yynanns7k">
                     <w:r>
                       <w:rPr>
                         <w:rStyle w:val="Hyperlink"/>
@@ -13226,7 +16530,7 @@
                   </w:r>
                 </w:p>
                 <w:p>
-                  <w:hyperlink w:history="1" r:id="rIdhkjygula_odng8ueaed4j">
+                  <w:hyperlink w:history="1" r:id="rId9epdmpl1nd_fvnbbeu_vy">
                     <w:r>
                       <w:rPr>
                         <w:rStyle w:val="Hyperlink"/>
@@ -13435,7 +16739,7 @@
                   </w:r>
                 </w:p>
                 <w:p>
-                  <w:hyperlink w:history="1" r:id="rIdir0ncwvsxynz9z7bsgddu">
+                  <w:hyperlink w:history="1" r:id="rIducvpirfvpinbqxn5rszca">
                     <w:r>
                       <w:rPr>
                         <w:rStyle w:val="Hyperlink"/>
@@ -13674,7 +16978,7 @@
                   </w:r>
                 </w:p>
                 <w:p>
-                  <w:hyperlink w:history="1" r:id="rIdwmrpputu9dl6en8vlvjgf">
+                  <w:hyperlink w:history="1" r:id="rIdaxbj-culnhsqcnpj9sc59">
                     <w:r>
                       <w:rPr>
                         <w:rStyle w:val="Hyperlink"/>
@@ -13883,7 +17187,7 @@
                   </w:r>
                 </w:p>
                 <w:p>
-                  <w:hyperlink w:history="1" r:id="rIdrwnhavereqbbauqodbi9b">
+                  <w:hyperlink w:history="1" r:id="rIddi5kjqe5axatlt6fjh9cf">
                     <w:r>
                       <w:rPr>
                         <w:rStyle w:val="Hyperlink"/>
@@ -14122,7 +17426,7 @@
                   </w:r>
                 </w:p>
                 <w:p>
-                  <w:hyperlink w:history="1" r:id="rIdw3y5ov3zrvzachekjoxn9">
+                  <w:hyperlink w:history="1" r:id="rIdarj1vtrfsj7gymcc24e1t">
                     <w:r>
                       <w:rPr>
                         <w:rStyle w:val="Hyperlink"/>
@@ -14331,7 +17635,7 @@
                   </w:r>
                 </w:p>
                 <w:p>
-                  <w:hyperlink w:history="1" r:id="rId32qd2csz9imxql7pbednv">
+                  <w:hyperlink w:history="1" r:id="rIdcvexhhbqqzxbrvwrpklzs">
                     <w:r>
                       <w:rPr>
                         <w:rStyle w:val="Hyperlink"/>
@@ -14570,7 +17874,7 @@
                   </w:r>
                 </w:p>
                 <w:p>
-                  <w:hyperlink w:history="1" r:id="rIdjbhrr1wqsfzniipwwnztm">
+                  <w:hyperlink w:history="1" r:id="rIdqk1b4nasovzepwxyavhym">
                     <w:r>
                       <w:rPr>
                         <w:rStyle w:val="Hyperlink"/>
@@ -14779,7 +18083,7 @@
                   </w:r>
                 </w:p>
                 <w:p>
-                  <w:hyperlink w:history="1" r:id="rIdko1xk8liyj46yggu0klt_">
+                  <w:hyperlink w:history="1" r:id="rIdsq5upesvk-xnn4czbroso">
                     <w:r>
                       <w:rPr>
                         <w:rStyle w:val="Hyperlink"/>
@@ -15018,7 +18322,7 @@
                   </w:r>
                 </w:p>
                 <w:p>
-                  <w:hyperlink w:history="1" r:id="rId92-a3lxttlp8wvbobawo8">
+                  <w:hyperlink w:history="1" r:id="rId_fihqfs9tfcnabgykjzqt">
                     <w:r>
                       <w:rPr>
                         <w:rStyle w:val="Hyperlink"/>
@@ -15252,7 +18556,7 @@
                   </w:r>
                 </w:p>
                 <w:p>
-                  <w:hyperlink w:history="1" r:id="rIdmpeusbqb0uhpembyebzjl">
+                  <w:hyperlink w:history="1" r:id="rIdjl-wg_vewploea73a97kz">
                     <w:r>
                       <w:rPr>
                         <w:rStyle w:val="Hyperlink"/>
@@ -15491,7 +18795,7 @@
                   </w:r>
                 </w:p>
                 <w:p>
-                  <w:hyperlink w:history="1" r:id="rIdnolewlnx_qworezpygvsz">
+                  <w:hyperlink w:history="1" r:id="rIdzjzex2qjndsmm1jk40-lm">
                     <w:r>
                       <w:rPr>
                         <w:rStyle w:val="Hyperlink"/>
@@ -15700,7 +19004,7 @@
                   </w:r>
                 </w:p>
                 <w:p>
-                  <w:hyperlink w:history="1" r:id="rIdc8jodivfvwp2sjynmxzix">
+                  <w:hyperlink w:history="1" r:id="rId6sc1byl8xk0lj_nfcwpc9">
                     <w:r>
                       <w:rPr>
                         <w:rStyle w:val="Hyperlink"/>
@@ -15939,7 +19243,7 @@
                   </w:r>
                 </w:p>
                 <w:p>
-                  <w:hyperlink w:history="1" r:id="rIdf7djyep3eqvwmlskcelwp">
+                  <w:hyperlink w:history="1" r:id="rId-s9addzmilhudtchakupw">
                     <w:r>
                       <w:rPr>
                         <w:rStyle w:val="Hyperlink"/>
@@ -16148,7 +19452,7 @@
                   </w:r>
                 </w:p>
                 <w:p>
-                  <w:hyperlink w:history="1" r:id="rIdt0_-qo0lllvojysu2q-6h">
+                  <w:hyperlink w:history="1" r:id="rId8bj8zdf1_lcb724chidip">
                     <w:r>
                       <w:rPr>
                         <w:rStyle w:val="Hyperlink"/>
@@ -16365,6 +19669,23 @@
 <w:hdr xmlns:wpc="http://schemas.microsoft.com/office/word/2010/wordprocessingCanvas" xmlns:mc="http://schemas.openxmlformats.org/markup-compatibility/2006" xmlns:o="urn:schemas-microsoft-com:office:office" xmlns:r="http://schemas.openxmlformats.org/officeDocument/2006/relationships" xmlns:m="http://schemas.openxmlformats.org/officeDocument/2006/math" xmlns:v="urn:schemas-microsoft-com:vml" xmlns:wp14="http://schemas.microsoft.com/office/word/2010/wordprocessingDrawing" xmlns:wp="http://schemas.openxmlformats.org/drawingml/2006/wordprocessingDrawing" xmlns:w10="urn:schemas-microsoft-com:office:word" xmlns:w="http://schemas.openxmlformats.org/wordprocessingml/2006/main" xmlns:w14="http://schemas.microsoft.com/office/word/2010/wordml" xmlns:w15="http://schemas.microsoft.com/office/word/2012/wordml" xmlns:wpg="http://schemas.microsoft.com/office/word/2010/wordprocessingGroup" xmlns:wpi="http://schemas.microsoft.com/office/word/2010/wordprocessingInk" xmlns:wne="http://schemas.microsoft.com/office/word/2006/wordml" xmlns:wps="http://schemas.microsoft.com/office/word/2010/wordprocessingShape" xmlns:cx="http://schemas.microsoft.com/office/drawing/2014/chartex" xmlns:cx1="http://schemas.microsoft.com/office/drawing/2015/9/8/chartex" xmlns:cx2="http://schemas.microsoft.com/office/drawing/2015/10/21/chartex" xmlns:cx3="http://schemas.microsoft.com/office/drawing/2016/5/9/chartex" xmlns:cx4="http://schemas.microsoft.com/office/drawing/2016/5/10/chartex" xmlns:cx5="http://schemas.microsoft.com/office/drawing/2016/5/11/chartex" xmlns:cx6="http://schemas.microsoft.com/office/drawing/2016/5/12/chartex" xmlns:cx7="http://schemas.microsoft.com/office/drawing/2016/5/13/chartex" xmlns:cx8="http://schemas.microsoft.com/office/drawing/2016/5/14/chartex" xmlns:w16cid="http://schemas.microsoft.com/office/word/2016/wordml/cid" xmlns:w16se="http://schemas.microsoft.com/office/word/2015/wordml/symex">
   <w:p>
     <w:pPr>
+      <w:spacing w:after="0"/>
+      <w:jc w:val="right"/>
+    </w:pPr>
+    <w:r>
+      <w:rPr>
+        <w:rFonts w:ascii="Calibri" w:cs="Calibri" w:eastAsia="Calibri" w:hAnsi="Calibri"/>
+        <w:b/>
+        <w:bCs/>
+        <w:color w:val="1A1A1A"/>
+        <w:sz w:val="26"/>
+        <w:szCs w:val="26"/>
+      </w:rPr>
+      <w:t xml:space="preserve">We Run ON EOS®</w:t>
+    </w:r>
+  </w:p>
+  <w:p>
+    <w:pPr>
       <w:spacing w:after="100"/>
       <w:jc w:val="right"/>
     </w:pPr>
@@ -16375,7 +19696,7 @@
         <w:sz w:val="16"/>
         <w:szCs w:val="16"/>
       </w:rPr>
-      <w:t xml:space="preserve">WRoEOS North Texas 2026</w:t>
+      <w:t xml:space="preserve">North Texas 2026</w:t>
     </w:r>
   </w:p>
 </w:hdr>

</xml_diff>

<commit_message>
workbook: header L2 bolder/larger, uniform agenda session style, 'MY NOTES ·' leads notes headings +50%
</commit_message>
<xml_diff>
--- a/deliverables/workbook/Workbook.docx
+++ b/deliverables/workbook/Workbook.docx
@@ -656,8 +656,8 @@
                 <w:i w:val="false"/>
                 <w:iCs w:val="false"/>
                 <w:color w:val="5A6B82"/>
-                <w:sz w:val="20"/>
-                <w:szCs w:val="20"/>
+                <w:sz w:val="22"/>
+                <w:szCs w:val="22"/>
               </w:rPr>
               <w:t xml:space="preserve">Coffee, Snacks &amp; Registration</w:t>
             </w:r>
@@ -726,606 +726,6 @@
                 <w:szCs w:val="20"/>
               </w:rPr>
               <w:t xml:space="preserve">8:00 – 9:35 AM</w:t>
-            </w:r>
-          </w:p>
-        </w:tc>
-        <w:tc>
-          <w:tcPr>
-            <w:tcW w:type="dxa" w:w="5680"/>
-            <w:tcBorders>
-              <w:top w:val="none" w:color="FFFFFF" w:sz="0"/>
-              <w:left w:val="none" w:color="FFFFFF" w:sz="0"/>
-              <w:bottom w:val="none" w:color="FFFFFF" w:sz="0"/>
-              <w:right w:val="none" w:color="FFFFFF" w:sz="0"/>
-            </w:tcBorders>
-            <w:shd w:fill="F4F6F9" w:val="clear"/>
-            <w:tcMar>
-              <w:top w:type="dxa" w:w="100"/>
-              <w:left w:type="dxa" w:w="140"/>
-              <w:bottom w:type="dxa" w:w="100"/>
-              <w:right w:type="dxa" w:w="100"/>
-            </w:tcMar>
-            <w:vAlign w:val="center"/>
-          </w:tcPr>
-          <w:p>
-            <w:r>
-              <w:rPr>
-                <w:rFonts w:ascii="Calibri" w:cs="Calibri" w:eastAsia="Calibri" w:hAnsi="Calibri"/>
-                <w:b/>
-                <w:bCs/>
-                <w:i w:val="false"/>
-                <w:iCs w:val="false"/>
-                <w:color w:val="5A6B82"/>
-                <w:sz w:val="22"/>
-                <w:szCs w:val="22"/>
-              </w:rPr>
-              <w:t xml:space="preserve">Get a Grip on your Business with EOS</w:t>
-            </w:r>
-          </w:p>
-        </w:tc>
-        <w:tc>
-          <w:tcPr>
-            <w:tcW w:type="dxa" w:w="2200"/>
-            <w:tcBorders>
-              <w:top w:val="none" w:color="FFFFFF" w:sz="0"/>
-              <w:left w:val="none" w:color="FFFFFF" w:sz="0"/>
-              <w:bottom w:val="none" w:color="FFFFFF" w:sz="0"/>
-              <w:right w:val="none" w:color="FFFFFF" w:sz="0"/>
-            </w:tcBorders>
-            <w:shd w:fill="F4F6F9" w:val="clear"/>
-            <w:tcMar>
-              <w:top w:type="dxa" w:w="100"/>
-              <w:left w:type="dxa" w:w="140"/>
-              <w:bottom w:type="dxa" w:w="100"/>
-              <w:right w:type="dxa" w:w="100"/>
-            </w:tcMar>
-            <w:vAlign w:val="center"/>
-          </w:tcPr>
-          <w:p>
-            <w:r>
-              <w:rPr>
-                <w:rFonts w:ascii="Calibri" w:cs="Calibri" w:eastAsia="Calibri" w:hAnsi="Calibri"/>
-                <w:i w:val="false"/>
-                <w:iCs w:val="false"/>
-                <w:color w:val="5A6B82"/>
-                <w:sz w:val="18"/>
-                <w:szCs w:val="18"/>
-              </w:rPr>
-              <w:t xml:space="preserve">Ann Sheu</w:t>
-            </w:r>
-          </w:p>
-        </w:tc>
-      </w:tr>
-      <w:tr>
-        <w:tc>
-          <w:tcPr>
-            <w:tcW w:type="dxa" w:w="2200"/>
-            <w:tcBorders>
-              <w:top w:val="none" w:color="FFFFFF" w:sz="0"/>
-              <w:left w:val="none" w:color="FFFFFF" w:sz="0"/>
-              <w:bottom w:val="none" w:color="FFFFFF" w:sz="0"/>
-              <w:right w:val="none" w:color="FFFFFF" w:sz="0"/>
-            </w:tcBorders>
-            <w:shd w:fill="FFFFFF" w:val="clear"/>
-            <w:tcMar>
-              <w:top w:type="dxa" w:w="100"/>
-              <w:left w:type="dxa" w:w="140"/>
-              <w:bottom w:type="dxa" w:w="100"/>
-              <w:right w:type="dxa" w:w="100"/>
-            </w:tcMar>
-            <w:vAlign w:val="center"/>
-          </w:tcPr>
-          <w:p>
-            <w:r>
-              <w:rPr>
-                <w:rFonts w:ascii="Calibri" w:cs="Calibri" w:eastAsia="Calibri" w:hAnsi="Calibri"/>
-                <w:b w:val="false"/>
-                <w:bCs w:val="false"/>
-                <w:color w:val="0B1F3A"/>
-                <w:sz w:val="20"/>
-                <w:szCs w:val="20"/>
-              </w:rPr>
-              <w:t xml:space="preserve">9:35 – 9:55 AM</w:t>
-            </w:r>
-          </w:p>
-        </w:tc>
-        <w:tc>
-          <w:tcPr>
-            <w:tcW w:type="dxa" w:w="5680"/>
-            <w:tcBorders>
-              <w:top w:val="none" w:color="FFFFFF" w:sz="0"/>
-              <w:left w:val="none" w:color="FFFFFF" w:sz="0"/>
-              <w:bottom w:val="none" w:color="FFFFFF" w:sz="0"/>
-              <w:right w:val="none" w:color="FFFFFF" w:sz="0"/>
-            </w:tcBorders>
-            <w:shd w:fill="FFFFFF" w:val="clear"/>
-            <w:tcMar>
-              <w:top w:type="dxa" w:w="100"/>
-              <w:left w:type="dxa" w:w="140"/>
-              <w:bottom w:type="dxa" w:w="100"/>
-              <w:right w:type="dxa" w:w="100"/>
-            </w:tcMar>
-            <w:vAlign w:val="center"/>
-          </w:tcPr>
-          <w:p>
-            <w:r>
-              <w:rPr>
-                <w:rFonts w:ascii="Calibri" w:cs="Calibri" w:eastAsia="Calibri" w:hAnsi="Calibri"/>
-                <w:b w:val="false"/>
-                <w:bCs w:val="false"/>
-                <w:i w:val="false"/>
-                <w:iCs w:val="false"/>
-                <w:color w:val="5A6B82"/>
-                <w:sz w:val="20"/>
-                <w:szCs w:val="20"/>
-              </w:rPr>
-              <w:t xml:space="preserve">Break</w:t>
-            </w:r>
-          </w:p>
-        </w:tc>
-        <w:tc>
-          <w:tcPr>
-            <w:tcW w:type="dxa" w:w="2200"/>
-            <w:tcBorders>
-              <w:top w:val="none" w:color="FFFFFF" w:sz="0"/>
-              <w:left w:val="none" w:color="FFFFFF" w:sz="0"/>
-              <w:bottom w:val="none" w:color="FFFFFF" w:sz="0"/>
-              <w:right w:val="none" w:color="FFFFFF" w:sz="0"/>
-            </w:tcBorders>
-            <w:shd w:fill="FFFFFF" w:val="clear"/>
-            <w:tcMar>
-              <w:top w:type="dxa" w:w="100"/>
-              <w:left w:type="dxa" w:w="140"/>
-              <w:bottom w:type="dxa" w:w="100"/>
-              <w:right w:type="dxa" w:w="100"/>
-            </w:tcMar>
-            <w:vAlign w:val="center"/>
-          </w:tcPr>
-          <w:p>
-            <w:r>
-              <w:rPr>
-                <w:rFonts w:ascii="Calibri" w:cs="Calibri" w:eastAsia="Calibri" w:hAnsi="Calibri"/>
-                <w:i w:val="false"/>
-                <w:iCs w:val="false"/>
-                <w:color w:val="5A6B82"/>
-                <w:sz w:val="18"/>
-                <w:szCs w:val="18"/>
-              </w:rPr>
-              <w:t xml:space="preserve"/>
-            </w:r>
-          </w:p>
-        </w:tc>
-      </w:tr>
-      <w:tr>
-        <w:tc>
-          <w:tcPr>
-            <w:tcW w:type="dxa" w:w="2200"/>
-            <w:tcBorders>
-              <w:top w:val="none" w:color="FFFFFF" w:sz="0"/>
-              <w:left w:val="none" w:color="FFFFFF" w:sz="0"/>
-              <w:bottom w:val="none" w:color="FFFFFF" w:sz="0"/>
-              <w:right w:val="none" w:color="FFFFFF" w:sz="0"/>
-            </w:tcBorders>
-            <w:shd w:fill="F4F6F9" w:val="clear"/>
-            <w:tcMar>
-              <w:top w:type="dxa" w:w="100"/>
-              <w:left w:type="dxa" w:w="140"/>
-              <w:bottom w:type="dxa" w:w="100"/>
-              <w:right w:type="dxa" w:w="100"/>
-            </w:tcMar>
-            <w:vAlign w:val="center"/>
-          </w:tcPr>
-          <w:p>
-            <w:r>
-              <w:rPr>
-                <w:rFonts w:ascii="Calibri" w:cs="Calibri" w:eastAsia="Calibri" w:hAnsi="Calibri"/>
-                <w:b w:val="false"/>
-                <w:bCs w:val="false"/>
-                <w:color w:val="0B1F3A"/>
-                <w:sz w:val="20"/>
-                <w:szCs w:val="20"/>
-              </w:rPr>
-              <w:t xml:space="preserve">9:55 – 10:45 AM</w:t>
-            </w:r>
-          </w:p>
-        </w:tc>
-        <w:tc>
-          <w:tcPr>
-            <w:tcW w:type="dxa" w:w="5680"/>
-            <w:tcBorders>
-              <w:top w:val="none" w:color="FFFFFF" w:sz="0"/>
-              <w:left w:val="none" w:color="FFFFFF" w:sz="0"/>
-              <w:bottom w:val="none" w:color="FFFFFF" w:sz="0"/>
-              <w:right w:val="none" w:color="FFFFFF" w:sz="0"/>
-            </w:tcBorders>
-            <w:shd w:fill="F4F6F9" w:val="clear"/>
-            <w:tcMar>
-              <w:top w:type="dxa" w:w="100"/>
-              <w:left w:type="dxa" w:w="140"/>
-              <w:bottom w:type="dxa" w:w="100"/>
-              <w:right w:type="dxa" w:w="100"/>
-            </w:tcMar>
-            <w:vAlign w:val="center"/>
-          </w:tcPr>
-          <w:p>
-            <w:r>
-              <w:rPr>
-                <w:rFonts w:ascii="Calibri" w:cs="Calibri" w:eastAsia="Calibri" w:hAnsi="Calibri"/>
-                <w:b/>
-                <w:bCs/>
-                <w:i w:val="false"/>
-                <w:iCs w:val="false"/>
-                <w:color w:val="5A6B82"/>
-                <w:sz w:val="22"/>
-                <w:szCs w:val="22"/>
-              </w:rPr>
-              <w:t xml:space="preserve">Journey with an EOS Implementer</w:t>
-            </w:r>
-          </w:p>
-        </w:tc>
-        <w:tc>
-          <w:tcPr>
-            <w:tcW w:type="dxa" w:w="2200"/>
-            <w:tcBorders>
-              <w:top w:val="none" w:color="FFFFFF" w:sz="0"/>
-              <w:left w:val="none" w:color="FFFFFF" w:sz="0"/>
-              <w:bottom w:val="none" w:color="FFFFFF" w:sz="0"/>
-              <w:right w:val="none" w:color="FFFFFF" w:sz="0"/>
-            </w:tcBorders>
-            <w:shd w:fill="F4F6F9" w:val="clear"/>
-            <w:tcMar>
-              <w:top w:type="dxa" w:w="100"/>
-              <w:left w:type="dxa" w:w="140"/>
-              <w:bottom w:type="dxa" w:w="100"/>
-              <w:right w:type="dxa" w:w="100"/>
-            </w:tcMar>
-            <w:vAlign w:val="center"/>
-          </w:tcPr>
-          <w:p>
-            <w:r>
-              <w:rPr>
-                <w:rFonts w:ascii="Calibri" w:cs="Calibri" w:eastAsia="Calibri" w:hAnsi="Calibri"/>
-                <w:i w:val="false"/>
-                <w:iCs w:val="false"/>
-                <w:color w:val="5A6B82"/>
-                <w:sz w:val="18"/>
-                <w:szCs w:val="18"/>
-              </w:rPr>
-              <w:t xml:space="preserve">Strety</w:t>
-            </w:r>
-          </w:p>
-        </w:tc>
-      </w:tr>
-      <w:tr>
-        <w:tc>
-          <w:tcPr>
-            <w:tcW w:type="dxa" w:w="2200"/>
-            <w:tcBorders>
-              <w:top w:val="none" w:color="FFFFFF" w:sz="0"/>
-              <w:left w:val="none" w:color="FFFFFF" w:sz="0"/>
-              <w:bottom w:val="none" w:color="FFFFFF" w:sz="0"/>
-              <w:right w:val="none" w:color="FFFFFF" w:sz="0"/>
-            </w:tcBorders>
-            <w:shd w:fill="FFFFFF" w:val="clear"/>
-            <w:tcMar>
-              <w:top w:type="dxa" w:w="100"/>
-              <w:left w:type="dxa" w:w="140"/>
-              <w:bottom w:type="dxa" w:w="100"/>
-              <w:right w:type="dxa" w:w="100"/>
-            </w:tcMar>
-            <w:vAlign w:val="center"/>
-          </w:tcPr>
-          <w:p>
-            <w:r>
-              <w:rPr>
-                <w:rFonts w:ascii="Calibri" w:cs="Calibri" w:eastAsia="Calibri" w:hAnsi="Calibri"/>
-                <w:b w:val="false"/>
-                <w:bCs w:val="false"/>
-                <w:color w:val="0B1F3A"/>
-                <w:sz w:val="20"/>
-                <w:szCs w:val="20"/>
-              </w:rPr>
-              <w:t xml:space="preserve">10:45 – 11:00 AM</w:t>
-            </w:r>
-          </w:p>
-        </w:tc>
-        <w:tc>
-          <w:tcPr>
-            <w:tcW w:type="dxa" w:w="5680"/>
-            <w:tcBorders>
-              <w:top w:val="none" w:color="FFFFFF" w:sz="0"/>
-              <w:left w:val="none" w:color="FFFFFF" w:sz="0"/>
-              <w:bottom w:val="none" w:color="FFFFFF" w:sz="0"/>
-              <w:right w:val="none" w:color="FFFFFF" w:sz="0"/>
-            </w:tcBorders>
-            <w:shd w:fill="FFFFFF" w:val="clear"/>
-            <w:tcMar>
-              <w:top w:type="dxa" w:w="100"/>
-              <w:left w:type="dxa" w:w="140"/>
-              <w:bottom w:type="dxa" w:w="100"/>
-              <w:right w:type="dxa" w:w="100"/>
-            </w:tcMar>
-            <w:vAlign w:val="center"/>
-          </w:tcPr>
-          <w:p>
-            <w:r>
-              <w:rPr>
-                <w:rFonts w:ascii="Calibri" w:cs="Calibri" w:eastAsia="Calibri" w:hAnsi="Calibri"/>
-                <w:b w:val="false"/>
-                <w:bCs w:val="false"/>
-                <w:i w:val="false"/>
-                <w:iCs w:val="false"/>
-                <w:color w:val="5A6B82"/>
-                <w:sz w:val="20"/>
-                <w:szCs w:val="20"/>
-              </w:rPr>
-              <w:t xml:space="preserve">Break</w:t>
-            </w:r>
-          </w:p>
-        </w:tc>
-        <w:tc>
-          <w:tcPr>
-            <w:tcW w:type="dxa" w:w="2200"/>
-            <w:tcBorders>
-              <w:top w:val="none" w:color="FFFFFF" w:sz="0"/>
-              <w:left w:val="none" w:color="FFFFFF" w:sz="0"/>
-              <w:bottom w:val="none" w:color="FFFFFF" w:sz="0"/>
-              <w:right w:val="none" w:color="FFFFFF" w:sz="0"/>
-            </w:tcBorders>
-            <w:shd w:fill="FFFFFF" w:val="clear"/>
-            <w:tcMar>
-              <w:top w:type="dxa" w:w="100"/>
-              <w:left w:type="dxa" w:w="140"/>
-              <w:bottom w:type="dxa" w:w="100"/>
-              <w:right w:type="dxa" w:w="100"/>
-            </w:tcMar>
-            <w:vAlign w:val="center"/>
-          </w:tcPr>
-          <w:p>
-            <w:r>
-              <w:rPr>
-                <w:rFonts w:ascii="Calibri" w:cs="Calibri" w:eastAsia="Calibri" w:hAnsi="Calibri"/>
-                <w:i w:val="false"/>
-                <w:iCs w:val="false"/>
-                <w:color w:val="5A6B82"/>
-                <w:sz w:val="18"/>
-                <w:szCs w:val="18"/>
-              </w:rPr>
-              <w:t xml:space="preserve"/>
-            </w:r>
-          </w:p>
-        </w:tc>
-      </w:tr>
-      <w:tr>
-        <w:tc>
-          <w:tcPr>
-            <w:tcW w:type="dxa" w:w="2200"/>
-            <w:tcBorders>
-              <w:top w:val="none" w:color="FFFFFF" w:sz="0"/>
-              <w:left w:val="none" w:color="FFFFFF" w:sz="0"/>
-              <w:bottom w:val="none" w:color="FFFFFF" w:sz="0"/>
-              <w:right w:val="none" w:color="FFFFFF" w:sz="0"/>
-            </w:tcBorders>
-            <w:shd w:fill="F4F6F9" w:val="clear"/>
-            <w:tcMar>
-              <w:top w:type="dxa" w:w="100"/>
-              <w:left w:type="dxa" w:w="140"/>
-              <w:bottom w:type="dxa" w:w="100"/>
-              <w:right w:type="dxa" w:w="100"/>
-            </w:tcMar>
-            <w:vAlign w:val="center"/>
-          </w:tcPr>
-          <w:p>
-            <w:r>
-              <w:rPr>
-                <w:rFonts w:ascii="Calibri" w:cs="Calibri" w:eastAsia="Calibri" w:hAnsi="Calibri"/>
-                <w:b w:val="false"/>
-                <w:bCs w:val="false"/>
-                <w:color w:val="0B1F3A"/>
-                <w:sz w:val="20"/>
-                <w:szCs w:val="20"/>
-              </w:rPr>
-              <w:t xml:space="preserve">11:00 AM – 12:00 PM</w:t>
-            </w:r>
-          </w:p>
-        </w:tc>
-        <w:tc>
-          <w:tcPr>
-            <w:tcW w:type="dxa" w:w="5680"/>
-            <w:tcBorders>
-              <w:top w:val="none" w:color="FFFFFF" w:sz="0"/>
-              <w:left w:val="none" w:color="FFFFFF" w:sz="0"/>
-              <w:bottom w:val="none" w:color="FFFFFF" w:sz="0"/>
-              <w:right w:val="none" w:color="FFFFFF" w:sz="0"/>
-            </w:tcBorders>
-            <w:shd w:fill="F4F6F9" w:val="clear"/>
-            <w:tcMar>
-              <w:top w:type="dxa" w:w="100"/>
-              <w:left w:type="dxa" w:w="140"/>
-              <w:bottom w:type="dxa" w:w="100"/>
-              <w:right w:type="dxa" w:w="100"/>
-            </w:tcMar>
-            <w:vAlign w:val="center"/>
-          </w:tcPr>
-          <w:p>
-            <w:r>
-              <w:rPr>
-                <w:rFonts w:ascii="Calibri" w:cs="Calibri" w:eastAsia="Calibri" w:hAnsi="Calibri"/>
-                <w:b/>
-                <w:bCs/>
-                <w:i w:val="false"/>
-                <w:iCs w:val="false"/>
-                <w:color w:val="5A6B82"/>
-                <w:sz w:val="22"/>
-                <w:szCs w:val="22"/>
-              </w:rPr>
-              <w:t xml:space="preserve">Your Sales Team Isn’t the Problem. Your System Is.</w:t>
-            </w:r>
-          </w:p>
-        </w:tc>
-        <w:tc>
-          <w:tcPr>
-            <w:tcW w:type="dxa" w:w="2200"/>
-            <w:tcBorders>
-              <w:top w:val="none" w:color="FFFFFF" w:sz="0"/>
-              <w:left w:val="none" w:color="FFFFFF" w:sz="0"/>
-              <w:bottom w:val="none" w:color="FFFFFF" w:sz="0"/>
-              <w:right w:val="none" w:color="FFFFFF" w:sz="0"/>
-            </w:tcBorders>
-            <w:shd w:fill="F4F6F9" w:val="clear"/>
-            <w:tcMar>
-              <w:top w:type="dxa" w:w="100"/>
-              <w:left w:type="dxa" w:w="140"/>
-              <w:bottom w:type="dxa" w:w="100"/>
-              <w:right w:type="dxa" w:w="100"/>
-            </w:tcMar>
-            <w:vAlign w:val="center"/>
-          </w:tcPr>
-          <w:p>
-            <w:r>
-              <w:rPr>
-                <w:rFonts w:ascii="Calibri" w:cs="Calibri" w:eastAsia="Calibri" w:hAnsi="Calibri"/>
-                <w:i w:val="false"/>
-                <w:iCs w:val="false"/>
-                <w:color w:val="5A6B82"/>
-                <w:sz w:val="18"/>
-                <w:szCs w:val="18"/>
-              </w:rPr>
-              <w:t xml:space="preserve">The System of Selling</w:t>
-            </w:r>
-          </w:p>
-        </w:tc>
-      </w:tr>
-      <w:tr>
-        <w:tc>
-          <w:tcPr>
-            <w:tcW w:type="dxa" w:w="2200"/>
-            <w:tcBorders>
-              <w:top w:val="none" w:color="FFFFFF" w:sz="0"/>
-              <w:left w:val="none" w:color="FFFFFF" w:sz="0"/>
-              <w:bottom w:val="none" w:color="FFFFFF" w:sz="0"/>
-              <w:right w:val="none" w:color="FFFFFF" w:sz="0"/>
-            </w:tcBorders>
-            <w:shd w:fill="FFFFFF" w:val="clear"/>
-            <w:tcMar>
-              <w:top w:type="dxa" w:w="100"/>
-              <w:left w:type="dxa" w:w="140"/>
-              <w:bottom w:type="dxa" w:w="100"/>
-              <w:right w:type="dxa" w:w="100"/>
-            </w:tcMar>
-            <w:vAlign w:val="center"/>
-          </w:tcPr>
-          <w:p>
-            <w:r>
-              <w:rPr>
-                <w:rFonts w:ascii="Calibri" w:cs="Calibri" w:eastAsia="Calibri" w:hAnsi="Calibri"/>
-                <w:b w:val="false"/>
-                <w:bCs w:val="false"/>
-                <w:color w:val="0B1F3A"/>
-                <w:sz w:val="20"/>
-                <w:szCs w:val="20"/>
-              </w:rPr>
-              <w:t xml:space="preserve">12:00 PM – 1:00 PM</w:t>
-            </w:r>
-          </w:p>
-        </w:tc>
-        <w:tc>
-          <w:tcPr>
-            <w:tcW w:type="dxa" w:w="5680"/>
-            <w:tcBorders>
-              <w:top w:val="none" w:color="FFFFFF" w:sz="0"/>
-              <w:left w:val="none" w:color="FFFFFF" w:sz="0"/>
-              <w:bottom w:val="none" w:color="FFFFFF" w:sz="0"/>
-              <w:right w:val="none" w:color="FFFFFF" w:sz="0"/>
-            </w:tcBorders>
-            <w:shd w:fill="FFFFFF" w:val="clear"/>
-            <w:tcMar>
-              <w:top w:type="dxa" w:w="100"/>
-              <w:left w:type="dxa" w:w="140"/>
-              <w:bottom w:type="dxa" w:w="100"/>
-              <w:right w:type="dxa" w:w="100"/>
-            </w:tcMar>
-            <w:vAlign w:val="center"/>
-          </w:tcPr>
-          <w:p>
-            <w:r>
-              <w:rPr>
-                <w:rFonts w:ascii="Calibri" w:cs="Calibri" w:eastAsia="Calibri" w:hAnsi="Calibri"/>
-                <w:b/>
-                <w:bCs/>
-                <w:i w:val="false"/>
-                <w:iCs w:val="false"/>
-                <w:color w:val="5A6B82"/>
-                <w:sz w:val="22"/>
-                <w:szCs w:val="22"/>
-              </w:rPr>
-              <w:t xml:space="preserve">Lunch with Walt Brown: Healthy Matters</w:t>
-            </w:r>
-          </w:p>
-        </w:tc>
-        <w:tc>
-          <w:tcPr>
-            <w:tcW w:type="dxa" w:w="2200"/>
-            <w:tcBorders>
-              <w:top w:val="none" w:color="FFFFFF" w:sz="0"/>
-              <w:left w:val="none" w:color="FFFFFF" w:sz="0"/>
-              <w:bottom w:val="none" w:color="FFFFFF" w:sz="0"/>
-              <w:right w:val="none" w:color="FFFFFF" w:sz="0"/>
-            </w:tcBorders>
-            <w:shd w:fill="FFFFFF" w:val="clear"/>
-            <w:tcMar>
-              <w:top w:type="dxa" w:w="100"/>
-              <w:left w:type="dxa" w:w="140"/>
-              <w:bottom w:type="dxa" w:w="100"/>
-              <w:right w:type="dxa" w:w="100"/>
-            </w:tcMar>
-            <w:vAlign w:val="center"/>
-          </w:tcPr>
-          <w:p>
-            <w:r>
-              <w:rPr>
-                <w:rFonts w:ascii="Calibri" w:cs="Calibri" w:eastAsia="Calibri" w:hAnsi="Calibri"/>
-                <w:i w:val="false"/>
-                <w:iCs w:val="false"/>
-                <w:color w:val="5A6B82"/>
-                <w:sz w:val="18"/>
-                <w:szCs w:val="18"/>
-              </w:rPr>
-              <w:t xml:space="preserve">EOS Worldwide Head Coach · Walt Brown</w:t>
-            </w:r>
-          </w:p>
-        </w:tc>
-      </w:tr>
-      <w:tr>
-        <w:tc>
-          <w:tcPr>
-            <w:tcW w:type="dxa" w:w="2200"/>
-            <w:tcBorders>
-              <w:top w:val="none" w:color="FFFFFF" w:sz="0"/>
-              <w:left w:val="none" w:color="FFFFFF" w:sz="0"/>
-              <w:bottom w:val="none" w:color="FFFFFF" w:sz="0"/>
-              <w:right w:val="none" w:color="FFFFFF" w:sz="0"/>
-            </w:tcBorders>
-            <w:shd w:fill="F4F6F9" w:val="clear"/>
-            <w:tcMar>
-              <w:top w:type="dxa" w:w="100"/>
-              <w:left w:type="dxa" w:w="140"/>
-              <w:bottom w:type="dxa" w:w="100"/>
-              <w:right w:type="dxa" w:w="100"/>
-            </w:tcMar>
-            <w:vAlign w:val="center"/>
-          </w:tcPr>
-          <w:p>
-            <w:r>
-              <w:rPr>
-                <w:rFonts w:ascii="Calibri" w:cs="Calibri" w:eastAsia="Calibri" w:hAnsi="Calibri"/>
-                <w:b w:val="false"/>
-                <w:bCs w:val="false"/>
-                <w:color w:val="0B1F3A"/>
-                <w:sz w:val="20"/>
-                <w:szCs w:val="20"/>
-              </w:rPr>
-              <w:t xml:space="preserve">1:00 – 2:30 PM</w:t>
             </w:r>
           </w:p>
         </w:tc>
@@ -1359,7 +759,7 @@
                 <w:sz w:val="22"/>
                 <w:szCs w:val="22"/>
               </w:rPr>
-              <w:t xml:space="preserve">Profit Power: Stronger — or Just Bigger?</w:t>
+              <w:t xml:space="preserve">Get a Grip on your Business with EOS</w:t>
             </w:r>
           </w:p>
         </w:tc>
@@ -1391,7 +791,7 @@
                 <w:sz w:val="18"/>
                 <w:szCs w:val="18"/>
               </w:rPr>
-              <w:t xml:space="preserve">Mark Stanley</w:t>
+              <w:t xml:space="preserve">Ann Sheu</w:t>
             </w:r>
           </w:p>
         </w:tc>
@@ -1425,7 +825,7 @@
                 <w:sz w:val="20"/>
                 <w:szCs w:val="20"/>
               </w:rPr>
-              <w:t xml:space="preserve">2:30 – 2:50 PM</w:t>
+              <w:t xml:space="preserve">9:35 – 9:55 AM</w:t>
             </w:r>
           </w:p>
         </w:tc>
@@ -1455,9 +855,9 @@
                 <w:bCs w:val="false"/>
                 <w:i w:val="false"/>
                 <w:iCs w:val="false"/>
-                <w:color w:val="1A1A1A"/>
-                <w:sz w:val="20"/>
-                <w:szCs w:val="20"/>
+                <w:color w:val="5A6B82"/>
+                <w:sz w:val="22"/>
+                <w:szCs w:val="22"/>
               </w:rPr>
               <w:t xml:space="preserve">Break</w:t>
             </w:r>
@@ -1525,7 +925,7 @@
                 <w:sz w:val="20"/>
                 <w:szCs w:val="20"/>
               </w:rPr>
-              <w:t xml:space="preserve">2:50 – 4:25 PM</w:t>
+              <w:t xml:space="preserve">9:55 – 10:45 AM</w:t>
             </w:r>
           </w:p>
         </w:tc>
@@ -1559,7 +959,7 @@
                 <w:sz w:val="22"/>
                 <w:szCs w:val="22"/>
               </w:rPr>
-              <w:t xml:space="preserve">Rollout, Reworked: Your Plan for Running EOS® Company-Wide</w:t>
+              <w:t xml:space="preserve">Journey with an EOS Implementer</w:t>
             </w:r>
           </w:p>
         </w:tc>
@@ -1591,7 +991,7 @@
                 <w:sz w:val="18"/>
                 <w:szCs w:val="18"/>
               </w:rPr>
-              <w:t xml:space="preserve">Beth Fahey</w:t>
+              <w:t xml:space="preserve">Strety</w:t>
             </w:r>
           </w:p>
         </w:tc>
@@ -1625,7 +1025,7 @@
                 <w:sz w:val="20"/>
                 <w:szCs w:val="20"/>
               </w:rPr>
-              <w:t xml:space="preserve">4:25 – 4:45 PM</w:t>
+              <w:t xml:space="preserve">10:45 – 11:00 AM</w:t>
             </w:r>
           </w:p>
         </w:tc>
@@ -1655,9 +1055,9 @@
                 <w:bCs w:val="false"/>
                 <w:i w:val="false"/>
                 <w:iCs w:val="false"/>
-                <w:color w:val="1A1A1A"/>
-                <w:sz w:val="20"/>
-                <w:szCs w:val="20"/>
+                <w:color w:val="5A6B82"/>
+                <w:sz w:val="22"/>
+                <w:szCs w:val="22"/>
               </w:rPr>
               <w:t xml:space="preserve">Break</w:t>
             </w:r>
@@ -1725,7 +1125,7 @@
                 <w:sz w:val="20"/>
                 <w:szCs w:val="20"/>
               </w:rPr>
-              <w:t xml:space="preserve">4:45 – 6:15 PM</w:t>
+              <w:t xml:space="preserve">11:00 AM – 12:00 PM</w:t>
             </w:r>
           </w:p>
         </w:tc>
@@ -1759,7 +1159,7 @@
                 <w:sz w:val="22"/>
                 <w:szCs w:val="22"/>
               </w:rPr>
-              <w:t xml:space="preserve">The 10 Pillars of Visionary Greatness</w:t>
+              <w:t xml:space="preserve">Your Sales Team Isn’t the Problem. Your System Is.</w:t>
             </w:r>
           </w:p>
         </w:tc>
@@ -1791,7 +1191,7 @@
                 <w:sz w:val="18"/>
                 <w:szCs w:val="18"/>
               </w:rPr>
-              <w:t xml:space="preserve">Mark C. Winters</w:t>
+              <w:t xml:space="preserve">The System of Selling</w:t>
             </w:r>
           </w:p>
         </w:tc>
@@ -1825,7 +1225,7 @@
                 <w:sz w:val="20"/>
                 <w:szCs w:val="20"/>
               </w:rPr>
-              <w:t xml:space="preserve">6:15 – 8:00 PM</w:t>
+              <w:t xml:space="preserve">12:00 PM – 1:00 PM</w:t>
             </w:r>
           </w:p>
         </w:tc>
@@ -1851,13 +1251,613 @@
             <w:r>
               <w:rPr>
                 <w:rFonts w:ascii="Calibri" w:cs="Calibri" w:eastAsia="Calibri" w:hAnsi="Calibri"/>
+                <w:b/>
+                <w:bCs/>
+                <w:i w:val="false"/>
+                <w:iCs w:val="false"/>
+                <w:color w:val="1A1A1A"/>
+                <w:sz w:val="22"/>
+                <w:szCs w:val="22"/>
+              </w:rPr>
+              <w:t xml:space="preserve">Lunch with Walt Brown: Healthy Matters</w:t>
+            </w:r>
+          </w:p>
+        </w:tc>
+        <w:tc>
+          <w:tcPr>
+            <w:tcW w:type="dxa" w:w="2200"/>
+            <w:tcBorders>
+              <w:top w:val="none" w:color="FFFFFF" w:sz="0"/>
+              <w:left w:val="none" w:color="FFFFFF" w:sz="0"/>
+              <w:bottom w:val="none" w:color="FFFFFF" w:sz="0"/>
+              <w:right w:val="none" w:color="FFFFFF" w:sz="0"/>
+            </w:tcBorders>
+            <w:shd w:fill="FFFFFF" w:val="clear"/>
+            <w:tcMar>
+              <w:top w:type="dxa" w:w="100"/>
+              <w:left w:type="dxa" w:w="140"/>
+              <w:bottom w:type="dxa" w:w="100"/>
+              <w:right w:type="dxa" w:w="100"/>
+            </w:tcMar>
+            <w:vAlign w:val="center"/>
+          </w:tcPr>
+          <w:p>
+            <w:r>
+              <w:rPr>
+                <w:rFonts w:ascii="Calibri" w:cs="Calibri" w:eastAsia="Calibri" w:hAnsi="Calibri"/>
+                <w:i w:val="false"/>
+                <w:iCs w:val="false"/>
+                <w:color w:val="5A6B82"/>
+                <w:sz w:val="18"/>
+                <w:szCs w:val="18"/>
+              </w:rPr>
+              <w:t xml:space="preserve">EOS Worldwide Head Coach · Walt Brown</w:t>
+            </w:r>
+          </w:p>
+        </w:tc>
+      </w:tr>
+      <w:tr>
+        <w:tc>
+          <w:tcPr>
+            <w:tcW w:type="dxa" w:w="2200"/>
+            <w:tcBorders>
+              <w:top w:val="none" w:color="FFFFFF" w:sz="0"/>
+              <w:left w:val="none" w:color="FFFFFF" w:sz="0"/>
+              <w:bottom w:val="none" w:color="FFFFFF" w:sz="0"/>
+              <w:right w:val="none" w:color="FFFFFF" w:sz="0"/>
+            </w:tcBorders>
+            <w:shd w:fill="F4F6F9" w:val="clear"/>
+            <w:tcMar>
+              <w:top w:type="dxa" w:w="100"/>
+              <w:left w:type="dxa" w:w="140"/>
+              <w:bottom w:type="dxa" w:w="100"/>
+              <w:right w:type="dxa" w:w="100"/>
+            </w:tcMar>
+            <w:vAlign w:val="center"/>
+          </w:tcPr>
+          <w:p>
+            <w:r>
+              <w:rPr>
+                <w:rFonts w:ascii="Calibri" w:cs="Calibri" w:eastAsia="Calibri" w:hAnsi="Calibri"/>
+                <w:b w:val="false"/>
+                <w:bCs w:val="false"/>
+                <w:color w:val="0B1F3A"/>
+                <w:sz w:val="20"/>
+                <w:szCs w:val="20"/>
+              </w:rPr>
+              <w:t xml:space="preserve">1:00 – 2:30 PM</w:t>
+            </w:r>
+          </w:p>
+        </w:tc>
+        <w:tc>
+          <w:tcPr>
+            <w:tcW w:type="dxa" w:w="5680"/>
+            <w:tcBorders>
+              <w:top w:val="none" w:color="FFFFFF" w:sz="0"/>
+              <w:left w:val="none" w:color="FFFFFF" w:sz="0"/>
+              <w:bottom w:val="none" w:color="FFFFFF" w:sz="0"/>
+              <w:right w:val="none" w:color="FFFFFF" w:sz="0"/>
+            </w:tcBorders>
+            <w:shd w:fill="F4F6F9" w:val="clear"/>
+            <w:tcMar>
+              <w:top w:type="dxa" w:w="100"/>
+              <w:left w:type="dxa" w:w="140"/>
+              <w:bottom w:type="dxa" w:w="100"/>
+              <w:right w:type="dxa" w:w="100"/>
+            </w:tcMar>
+            <w:vAlign w:val="center"/>
+          </w:tcPr>
+          <w:p>
+            <w:r>
+              <w:rPr>
+                <w:rFonts w:ascii="Calibri" w:cs="Calibri" w:eastAsia="Calibri" w:hAnsi="Calibri"/>
+                <w:b/>
+                <w:bCs/>
+                <w:i w:val="false"/>
+                <w:iCs w:val="false"/>
+                <w:color w:val="1A1A1A"/>
+                <w:sz w:val="22"/>
+                <w:szCs w:val="22"/>
+              </w:rPr>
+              <w:t xml:space="preserve">Profit Power: Stronger — or Just Bigger?</w:t>
+            </w:r>
+          </w:p>
+        </w:tc>
+        <w:tc>
+          <w:tcPr>
+            <w:tcW w:type="dxa" w:w="2200"/>
+            <w:tcBorders>
+              <w:top w:val="none" w:color="FFFFFF" w:sz="0"/>
+              <w:left w:val="none" w:color="FFFFFF" w:sz="0"/>
+              <w:bottom w:val="none" w:color="FFFFFF" w:sz="0"/>
+              <w:right w:val="none" w:color="FFFFFF" w:sz="0"/>
+            </w:tcBorders>
+            <w:shd w:fill="F4F6F9" w:val="clear"/>
+            <w:tcMar>
+              <w:top w:type="dxa" w:w="100"/>
+              <w:left w:type="dxa" w:w="140"/>
+              <w:bottom w:type="dxa" w:w="100"/>
+              <w:right w:type="dxa" w:w="100"/>
+            </w:tcMar>
+            <w:vAlign w:val="center"/>
+          </w:tcPr>
+          <w:p>
+            <w:r>
+              <w:rPr>
+                <w:rFonts w:ascii="Calibri" w:cs="Calibri" w:eastAsia="Calibri" w:hAnsi="Calibri"/>
+                <w:i w:val="false"/>
+                <w:iCs w:val="false"/>
+                <w:color w:val="5A6B82"/>
+                <w:sz w:val="18"/>
+                <w:szCs w:val="18"/>
+              </w:rPr>
+              <w:t xml:space="preserve">Mark Stanley</w:t>
+            </w:r>
+          </w:p>
+        </w:tc>
+      </w:tr>
+      <w:tr>
+        <w:tc>
+          <w:tcPr>
+            <w:tcW w:type="dxa" w:w="2200"/>
+            <w:tcBorders>
+              <w:top w:val="none" w:color="FFFFFF" w:sz="0"/>
+              <w:left w:val="none" w:color="FFFFFF" w:sz="0"/>
+              <w:bottom w:val="none" w:color="FFFFFF" w:sz="0"/>
+              <w:right w:val="none" w:color="FFFFFF" w:sz="0"/>
+            </w:tcBorders>
+            <w:shd w:fill="FFFFFF" w:val="clear"/>
+            <w:tcMar>
+              <w:top w:type="dxa" w:w="100"/>
+              <w:left w:type="dxa" w:w="140"/>
+              <w:bottom w:type="dxa" w:w="100"/>
+              <w:right w:type="dxa" w:w="100"/>
+            </w:tcMar>
+            <w:vAlign w:val="center"/>
+          </w:tcPr>
+          <w:p>
+            <w:r>
+              <w:rPr>
+                <w:rFonts w:ascii="Calibri" w:cs="Calibri" w:eastAsia="Calibri" w:hAnsi="Calibri"/>
+                <w:b w:val="false"/>
+                <w:bCs w:val="false"/>
+                <w:color w:val="0B1F3A"/>
+                <w:sz w:val="20"/>
+                <w:szCs w:val="20"/>
+              </w:rPr>
+              <w:t xml:space="preserve">2:30 – 2:50 PM</w:t>
+            </w:r>
+          </w:p>
+        </w:tc>
+        <w:tc>
+          <w:tcPr>
+            <w:tcW w:type="dxa" w:w="5680"/>
+            <w:tcBorders>
+              <w:top w:val="none" w:color="FFFFFF" w:sz="0"/>
+              <w:left w:val="none" w:color="FFFFFF" w:sz="0"/>
+              <w:bottom w:val="none" w:color="FFFFFF" w:sz="0"/>
+              <w:right w:val="none" w:color="FFFFFF" w:sz="0"/>
+            </w:tcBorders>
+            <w:shd w:fill="FFFFFF" w:val="clear"/>
+            <w:tcMar>
+              <w:top w:type="dxa" w:w="100"/>
+              <w:left w:type="dxa" w:w="140"/>
+              <w:bottom w:type="dxa" w:w="100"/>
+              <w:right w:type="dxa" w:w="100"/>
+            </w:tcMar>
+            <w:vAlign w:val="center"/>
+          </w:tcPr>
+          <w:p>
+            <w:r>
+              <w:rPr>
+                <w:rFonts w:ascii="Calibri" w:cs="Calibri" w:eastAsia="Calibri" w:hAnsi="Calibri"/>
                 <w:b w:val="false"/>
                 <w:bCs w:val="false"/>
                 <w:i w:val="false"/>
                 <w:iCs w:val="false"/>
-                <w:color w:val="1A1A1A"/>
+                <w:color w:val="5A6B82"/>
+                <w:sz w:val="22"/>
+                <w:szCs w:val="22"/>
+              </w:rPr>
+              <w:t xml:space="preserve">Break</w:t>
+            </w:r>
+          </w:p>
+        </w:tc>
+        <w:tc>
+          <w:tcPr>
+            <w:tcW w:type="dxa" w:w="2200"/>
+            <w:tcBorders>
+              <w:top w:val="none" w:color="FFFFFF" w:sz="0"/>
+              <w:left w:val="none" w:color="FFFFFF" w:sz="0"/>
+              <w:bottom w:val="none" w:color="FFFFFF" w:sz="0"/>
+              <w:right w:val="none" w:color="FFFFFF" w:sz="0"/>
+            </w:tcBorders>
+            <w:shd w:fill="FFFFFF" w:val="clear"/>
+            <w:tcMar>
+              <w:top w:type="dxa" w:w="100"/>
+              <w:left w:type="dxa" w:w="140"/>
+              <w:bottom w:type="dxa" w:w="100"/>
+              <w:right w:type="dxa" w:w="100"/>
+            </w:tcMar>
+            <w:vAlign w:val="center"/>
+          </w:tcPr>
+          <w:p>
+            <w:r>
+              <w:rPr>
+                <w:rFonts w:ascii="Calibri" w:cs="Calibri" w:eastAsia="Calibri" w:hAnsi="Calibri"/>
+                <w:i w:val="false"/>
+                <w:iCs w:val="false"/>
+                <w:color w:val="5A6B82"/>
+                <w:sz w:val="18"/>
+                <w:szCs w:val="18"/>
+              </w:rPr>
+              <w:t xml:space="preserve"/>
+            </w:r>
+          </w:p>
+        </w:tc>
+      </w:tr>
+      <w:tr>
+        <w:tc>
+          <w:tcPr>
+            <w:tcW w:type="dxa" w:w="2200"/>
+            <w:tcBorders>
+              <w:top w:val="none" w:color="FFFFFF" w:sz="0"/>
+              <w:left w:val="none" w:color="FFFFFF" w:sz="0"/>
+              <w:bottom w:val="none" w:color="FFFFFF" w:sz="0"/>
+              <w:right w:val="none" w:color="FFFFFF" w:sz="0"/>
+            </w:tcBorders>
+            <w:shd w:fill="F4F6F9" w:val="clear"/>
+            <w:tcMar>
+              <w:top w:type="dxa" w:w="100"/>
+              <w:left w:type="dxa" w:w="140"/>
+              <w:bottom w:type="dxa" w:w="100"/>
+              <w:right w:type="dxa" w:w="100"/>
+            </w:tcMar>
+            <w:vAlign w:val="center"/>
+          </w:tcPr>
+          <w:p>
+            <w:r>
+              <w:rPr>
+                <w:rFonts w:ascii="Calibri" w:cs="Calibri" w:eastAsia="Calibri" w:hAnsi="Calibri"/>
+                <w:b w:val="false"/>
+                <w:bCs w:val="false"/>
+                <w:color w:val="0B1F3A"/>
                 <w:sz w:val="20"/>
                 <w:szCs w:val="20"/>
+              </w:rPr>
+              <w:t xml:space="preserve">2:50 – 4:25 PM</w:t>
+            </w:r>
+          </w:p>
+        </w:tc>
+        <w:tc>
+          <w:tcPr>
+            <w:tcW w:type="dxa" w:w="5680"/>
+            <w:tcBorders>
+              <w:top w:val="none" w:color="FFFFFF" w:sz="0"/>
+              <w:left w:val="none" w:color="FFFFFF" w:sz="0"/>
+              <w:bottom w:val="none" w:color="FFFFFF" w:sz="0"/>
+              <w:right w:val="none" w:color="FFFFFF" w:sz="0"/>
+            </w:tcBorders>
+            <w:shd w:fill="F4F6F9" w:val="clear"/>
+            <w:tcMar>
+              <w:top w:type="dxa" w:w="100"/>
+              <w:left w:type="dxa" w:w="140"/>
+              <w:bottom w:type="dxa" w:w="100"/>
+              <w:right w:type="dxa" w:w="100"/>
+            </w:tcMar>
+            <w:vAlign w:val="center"/>
+          </w:tcPr>
+          <w:p>
+            <w:r>
+              <w:rPr>
+                <w:rFonts w:ascii="Calibri" w:cs="Calibri" w:eastAsia="Calibri" w:hAnsi="Calibri"/>
+                <w:b/>
+                <w:bCs/>
+                <w:i w:val="false"/>
+                <w:iCs w:val="false"/>
+                <w:color w:val="1A1A1A"/>
+                <w:sz w:val="22"/>
+                <w:szCs w:val="22"/>
+              </w:rPr>
+              <w:t xml:space="preserve">Rollout, Reworked: Your Plan for Running EOS® Company-Wide</w:t>
+            </w:r>
+          </w:p>
+        </w:tc>
+        <w:tc>
+          <w:tcPr>
+            <w:tcW w:type="dxa" w:w="2200"/>
+            <w:tcBorders>
+              <w:top w:val="none" w:color="FFFFFF" w:sz="0"/>
+              <w:left w:val="none" w:color="FFFFFF" w:sz="0"/>
+              <w:bottom w:val="none" w:color="FFFFFF" w:sz="0"/>
+              <w:right w:val="none" w:color="FFFFFF" w:sz="0"/>
+            </w:tcBorders>
+            <w:shd w:fill="F4F6F9" w:val="clear"/>
+            <w:tcMar>
+              <w:top w:type="dxa" w:w="100"/>
+              <w:left w:type="dxa" w:w="140"/>
+              <w:bottom w:type="dxa" w:w="100"/>
+              <w:right w:type="dxa" w:w="100"/>
+            </w:tcMar>
+            <w:vAlign w:val="center"/>
+          </w:tcPr>
+          <w:p>
+            <w:r>
+              <w:rPr>
+                <w:rFonts w:ascii="Calibri" w:cs="Calibri" w:eastAsia="Calibri" w:hAnsi="Calibri"/>
+                <w:i w:val="false"/>
+                <w:iCs w:val="false"/>
+                <w:color w:val="5A6B82"/>
+                <w:sz w:val="18"/>
+                <w:szCs w:val="18"/>
+              </w:rPr>
+              <w:t xml:space="preserve">Beth Fahey</w:t>
+            </w:r>
+          </w:p>
+        </w:tc>
+      </w:tr>
+      <w:tr>
+        <w:tc>
+          <w:tcPr>
+            <w:tcW w:type="dxa" w:w="2200"/>
+            <w:tcBorders>
+              <w:top w:val="none" w:color="FFFFFF" w:sz="0"/>
+              <w:left w:val="none" w:color="FFFFFF" w:sz="0"/>
+              <w:bottom w:val="none" w:color="FFFFFF" w:sz="0"/>
+              <w:right w:val="none" w:color="FFFFFF" w:sz="0"/>
+            </w:tcBorders>
+            <w:shd w:fill="FFFFFF" w:val="clear"/>
+            <w:tcMar>
+              <w:top w:type="dxa" w:w="100"/>
+              <w:left w:type="dxa" w:w="140"/>
+              <w:bottom w:type="dxa" w:w="100"/>
+              <w:right w:type="dxa" w:w="100"/>
+            </w:tcMar>
+            <w:vAlign w:val="center"/>
+          </w:tcPr>
+          <w:p>
+            <w:r>
+              <w:rPr>
+                <w:rFonts w:ascii="Calibri" w:cs="Calibri" w:eastAsia="Calibri" w:hAnsi="Calibri"/>
+                <w:b w:val="false"/>
+                <w:bCs w:val="false"/>
+                <w:color w:val="0B1F3A"/>
+                <w:sz w:val="20"/>
+                <w:szCs w:val="20"/>
+              </w:rPr>
+              <w:t xml:space="preserve">4:25 – 4:45 PM</w:t>
+            </w:r>
+          </w:p>
+        </w:tc>
+        <w:tc>
+          <w:tcPr>
+            <w:tcW w:type="dxa" w:w="5680"/>
+            <w:tcBorders>
+              <w:top w:val="none" w:color="FFFFFF" w:sz="0"/>
+              <w:left w:val="none" w:color="FFFFFF" w:sz="0"/>
+              <w:bottom w:val="none" w:color="FFFFFF" w:sz="0"/>
+              <w:right w:val="none" w:color="FFFFFF" w:sz="0"/>
+            </w:tcBorders>
+            <w:shd w:fill="FFFFFF" w:val="clear"/>
+            <w:tcMar>
+              <w:top w:type="dxa" w:w="100"/>
+              <w:left w:type="dxa" w:w="140"/>
+              <w:bottom w:type="dxa" w:w="100"/>
+              <w:right w:type="dxa" w:w="100"/>
+            </w:tcMar>
+            <w:vAlign w:val="center"/>
+          </w:tcPr>
+          <w:p>
+            <w:r>
+              <w:rPr>
+                <w:rFonts w:ascii="Calibri" w:cs="Calibri" w:eastAsia="Calibri" w:hAnsi="Calibri"/>
+                <w:b w:val="false"/>
+                <w:bCs w:val="false"/>
+                <w:i w:val="false"/>
+                <w:iCs w:val="false"/>
+                <w:color w:val="5A6B82"/>
+                <w:sz w:val="22"/>
+                <w:szCs w:val="22"/>
+              </w:rPr>
+              <w:t xml:space="preserve">Break</w:t>
+            </w:r>
+          </w:p>
+        </w:tc>
+        <w:tc>
+          <w:tcPr>
+            <w:tcW w:type="dxa" w:w="2200"/>
+            <w:tcBorders>
+              <w:top w:val="none" w:color="FFFFFF" w:sz="0"/>
+              <w:left w:val="none" w:color="FFFFFF" w:sz="0"/>
+              <w:bottom w:val="none" w:color="FFFFFF" w:sz="0"/>
+              <w:right w:val="none" w:color="FFFFFF" w:sz="0"/>
+            </w:tcBorders>
+            <w:shd w:fill="FFFFFF" w:val="clear"/>
+            <w:tcMar>
+              <w:top w:type="dxa" w:w="100"/>
+              <w:left w:type="dxa" w:w="140"/>
+              <w:bottom w:type="dxa" w:w="100"/>
+              <w:right w:type="dxa" w:w="100"/>
+            </w:tcMar>
+            <w:vAlign w:val="center"/>
+          </w:tcPr>
+          <w:p>
+            <w:r>
+              <w:rPr>
+                <w:rFonts w:ascii="Calibri" w:cs="Calibri" w:eastAsia="Calibri" w:hAnsi="Calibri"/>
+                <w:i w:val="false"/>
+                <w:iCs w:val="false"/>
+                <w:color w:val="5A6B82"/>
+                <w:sz w:val="18"/>
+                <w:szCs w:val="18"/>
+              </w:rPr>
+              <w:t xml:space="preserve"/>
+            </w:r>
+          </w:p>
+        </w:tc>
+      </w:tr>
+      <w:tr>
+        <w:tc>
+          <w:tcPr>
+            <w:tcW w:type="dxa" w:w="2200"/>
+            <w:tcBorders>
+              <w:top w:val="none" w:color="FFFFFF" w:sz="0"/>
+              <w:left w:val="none" w:color="FFFFFF" w:sz="0"/>
+              <w:bottom w:val="none" w:color="FFFFFF" w:sz="0"/>
+              <w:right w:val="none" w:color="FFFFFF" w:sz="0"/>
+            </w:tcBorders>
+            <w:shd w:fill="F4F6F9" w:val="clear"/>
+            <w:tcMar>
+              <w:top w:type="dxa" w:w="100"/>
+              <w:left w:type="dxa" w:w="140"/>
+              <w:bottom w:type="dxa" w:w="100"/>
+              <w:right w:type="dxa" w:w="100"/>
+            </w:tcMar>
+            <w:vAlign w:val="center"/>
+          </w:tcPr>
+          <w:p>
+            <w:r>
+              <w:rPr>
+                <w:rFonts w:ascii="Calibri" w:cs="Calibri" w:eastAsia="Calibri" w:hAnsi="Calibri"/>
+                <w:b w:val="false"/>
+                <w:bCs w:val="false"/>
+                <w:color w:val="0B1F3A"/>
+                <w:sz w:val="20"/>
+                <w:szCs w:val="20"/>
+              </w:rPr>
+              <w:t xml:space="preserve">4:45 – 6:15 PM</w:t>
+            </w:r>
+          </w:p>
+        </w:tc>
+        <w:tc>
+          <w:tcPr>
+            <w:tcW w:type="dxa" w:w="5680"/>
+            <w:tcBorders>
+              <w:top w:val="none" w:color="FFFFFF" w:sz="0"/>
+              <w:left w:val="none" w:color="FFFFFF" w:sz="0"/>
+              <w:bottom w:val="none" w:color="FFFFFF" w:sz="0"/>
+              <w:right w:val="none" w:color="FFFFFF" w:sz="0"/>
+            </w:tcBorders>
+            <w:shd w:fill="F4F6F9" w:val="clear"/>
+            <w:tcMar>
+              <w:top w:type="dxa" w:w="100"/>
+              <w:left w:type="dxa" w:w="140"/>
+              <w:bottom w:type="dxa" w:w="100"/>
+              <w:right w:type="dxa" w:w="100"/>
+            </w:tcMar>
+            <w:vAlign w:val="center"/>
+          </w:tcPr>
+          <w:p>
+            <w:r>
+              <w:rPr>
+                <w:rFonts w:ascii="Calibri" w:cs="Calibri" w:eastAsia="Calibri" w:hAnsi="Calibri"/>
+                <w:b/>
+                <w:bCs/>
+                <w:i w:val="false"/>
+                <w:iCs w:val="false"/>
+                <w:color w:val="1A1A1A"/>
+                <w:sz w:val="22"/>
+                <w:szCs w:val="22"/>
+              </w:rPr>
+              <w:t xml:space="preserve">The 10 Pillars of Visionary Greatness</w:t>
+            </w:r>
+          </w:p>
+        </w:tc>
+        <w:tc>
+          <w:tcPr>
+            <w:tcW w:type="dxa" w:w="2200"/>
+            <w:tcBorders>
+              <w:top w:val="none" w:color="FFFFFF" w:sz="0"/>
+              <w:left w:val="none" w:color="FFFFFF" w:sz="0"/>
+              <w:bottom w:val="none" w:color="FFFFFF" w:sz="0"/>
+              <w:right w:val="none" w:color="FFFFFF" w:sz="0"/>
+            </w:tcBorders>
+            <w:shd w:fill="F4F6F9" w:val="clear"/>
+            <w:tcMar>
+              <w:top w:type="dxa" w:w="100"/>
+              <w:left w:type="dxa" w:w="140"/>
+              <w:bottom w:type="dxa" w:w="100"/>
+              <w:right w:type="dxa" w:w="100"/>
+            </w:tcMar>
+            <w:vAlign w:val="center"/>
+          </w:tcPr>
+          <w:p>
+            <w:r>
+              <w:rPr>
+                <w:rFonts w:ascii="Calibri" w:cs="Calibri" w:eastAsia="Calibri" w:hAnsi="Calibri"/>
+                <w:i w:val="false"/>
+                <w:iCs w:val="false"/>
+                <w:color w:val="5A6B82"/>
+                <w:sz w:val="18"/>
+                <w:szCs w:val="18"/>
+              </w:rPr>
+              <w:t xml:space="preserve">Mark C. Winters</w:t>
+            </w:r>
+          </w:p>
+        </w:tc>
+      </w:tr>
+      <w:tr>
+        <w:tc>
+          <w:tcPr>
+            <w:tcW w:type="dxa" w:w="2200"/>
+            <w:tcBorders>
+              <w:top w:val="none" w:color="FFFFFF" w:sz="0"/>
+              <w:left w:val="none" w:color="FFFFFF" w:sz="0"/>
+              <w:bottom w:val="none" w:color="FFFFFF" w:sz="0"/>
+              <w:right w:val="none" w:color="FFFFFF" w:sz="0"/>
+            </w:tcBorders>
+            <w:shd w:fill="FFFFFF" w:val="clear"/>
+            <w:tcMar>
+              <w:top w:type="dxa" w:w="100"/>
+              <w:left w:type="dxa" w:w="140"/>
+              <w:bottom w:type="dxa" w:w="100"/>
+              <w:right w:type="dxa" w:w="100"/>
+            </w:tcMar>
+            <w:vAlign w:val="center"/>
+          </w:tcPr>
+          <w:p>
+            <w:r>
+              <w:rPr>
+                <w:rFonts w:ascii="Calibri" w:cs="Calibri" w:eastAsia="Calibri" w:hAnsi="Calibri"/>
+                <w:b w:val="false"/>
+                <w:bCs w:val="false"/>
+                <w:color w:val="0B1F3A"/>
+                <w:sz w:val="20"/>
+                <w:szCs w:val="20"/>
+              </w:rPr>
+              <w:t xml:space="preserve">6:15 – 8:00 PM</w:t>
+            </w:r>
+          </w:p>
+        </w:tc>
+        <w:tc>
+          <w:tcPr>
+            <w:tcW w:type="dxa" w:w="5680"/>
+            <w:tcBorders>
+              <w:top w:val="none" w:color="FFFFFF" w:sz="0"/>
+              <w:left w:val="none" w:color="FFFFFF" w:sz="0"/>
+              <w:bottom w:val="none" w:color="FFFFFF" w:sz="0"/>
+              <w:right w:val="none" w:color="FFFFFF" w:sz="0"/>
+            </w:tcBorders>
+            <w:shd w:fill="FFFFFF" w:val="clear"/>
+            <w:tcMar>
+              <w:top w:type="dxa" w:w="100"/>
+              <w:left w:type="dxa" w:w="140"/>
+              <w:bottom w:type="dxa" w:w="100"/>
+              <w:right w:type="dxa" w:w="100"/>
+            </w:tcMar>
+            <w:vAlign w:val="center"/>
+          </w:tcPr>
+          <w:p>
+            <w:r>
+              <w:rPr>
+                <w:rFonts w:ascii="Calibri" w:cs="Calibri" w:eastAsia="Calibri" w:hAnsi="Calibri"/>
+                <w:b w:val="false"/>
+                <w:bCs w:val="false"/>
+                <w:i w:val="false"/>
+                <w:iCs w:val="false"/>
+                <w:color w:val="5A6B82"/>
+                <w:sz w:val="22"/>
+                <w:szCs w:val="22"/>
               </w:rPr>
               <w:t xml:space="preserve">Happy Hour + Networking</w:t>
             </w:r>
@@ -1913,10 +1913,10 @@
           <w:b/>
           <w:bCs/>
           <w:color w:val="E87722"/>
-          <w:sz w:val="16"/>
-          <w:szCs w:val="16"/>
+          <w:sz w:val="24"/>
+          <w:szCs w:val="24"/>
         </w:rPr>
-        <w:t xml:space="preserve">GET A GRIP ON YOUR BUSINESS WITH EOS · MY NOTES</w:t>
+        <w:t xml:space="preserve">MY NOTES · GET A GRIP ON YOUR BUSINESS WITH EOS</w:t>
       </w:r>
     </w:p>
     <w:p>
@@ -2739,10 +2739,10 @@
           <w:b/>
           <w:bCs/>
           <w:color w:val="E87722"/>
-          <w:sz w:val="16"/>
-          <w:szCs w:val="16"/>
+          <w:sz w:val="24"/>
+          <w:szCs w:val="24"/>
         </w:rPr>
-        <w:t xml:space="preserve">JOURNEY WITH AN EOS IMPLEMENTER · MY NOTES</w:t>
+        <w:t xml:space="preserve">MY NOTES · JOURNEY WITH AN EOS IMPLEMENTER</w:t>
       </w:r>
     </w:p>
     <w:p>
@@ -3565,10 +3565,10 @@
           <w:b/>
           <w:bCs/>
           <w:color w:val="E87722"/>
-          <w:sz w:val="16"/>
-          <w:szCs w:val="16"/>
+          <w:sz w:val="24"/>
+          <w:szCs w:val="24"/>
         </w:rPr>
-        <w:t xml:space="preserve">YOUR SALES TEAM ISN’T THE PROBLEM. YOUR SYSTEM IS. · MY NOTES</w:t>
+        <w:t xml:space="preserve">MY NOTES · YOUR SALES TEAM ISN’T THE PROBLEM. YOUR SYSTEM IS.</w:t>
       </w:r>
     </w:p>
     <w:p>
@@ -4391,10 +4391,10 @@
           <w:b/>
           <w:bCs/>
           <w:color w:val="E87722"/>
-          <w:sz w:val="16"/>
-          <w:szCs w:val="16"/>
+          <w:sz w:val="24"/>
+          <w:szCs w:val="24"/>
         </w:rPr>
-        <w:t xml:space="preserve">LUNCH WITH WALT BROWN: HEALTHY MATTERS · MY NOTES</w:t>
+        <w:t xml:space="preserve">MY NOTES · LUNCH WITH WALT BROWN: HEALTHY MATTERS</w:t>
       </w:r>
     </w:p>
     <w:p>
@@ -5330,10 +5330,10 @@
           <w:b/>
           <w:bCs/>
           <w:color w:val="E87722"/>
-          <w:sz w:val="16"/>
-          <w:szCs w:val="16"/>
+          <w:sz w:val="24"/>
+          <w:szCs w:val="24"/>
         </w:rPr>
-        <w:t xml:space="preserve">PROFIT POWER: STRONGER — OR JUST BIGGER? · MY NOTES</w:t>
+        <w:t xml:space="preserve">MY NOTES · PROFIT POWER: STRONGER — OR JUST BIGGER?</w:t>
       </w:r>
     </w:p>
     <w:p>
@@ -6193,10 +6193,10 @@
           <w:b/>
           <w:bCs/>
           <w:color w:val="E87722"/>
-          <w:sz w:val="16"/>
-          <w:szCs w:val="16"/>
+          <w:sz w:val="24"/>
+          <w:szCs w:val="24"/>
         </w:rPr>
-        <w:t xml:space="preserve">ROLLOUT, REWORKED: YOUR PLAN FOR RUNNING EOS® COMPANY-WIDE · MY NOTES</w:t>
+        <w:t xml:space="preserve">MY NOTES · ROLLOUT, REWORKED: YOUR PLAN FOR RUNNING EOS® COMPANY-WIDE</w:t>
       </w:r>
     </w:p>
     <w:p>
@@ -7056,10 +7056,10 @@
           <w:b/>
           <w:bCs/>
           <w:color w:val="E87722"/>
-          <w:sz w:val="16"/>
-          <w:szCs w:val="16"/>
+          <w:sz w:val="24"/>
+          <w:szCs w:val="24"/>
         </w:rPr>
-        <w:t xml:space="preserve">THE 10 PILLARS OF VISIONARY GREATNESS · MY NOTES</w:t>
+        <w:t xml:space="preserve">MY NOTES · THE 10 PILLARS OF VISIONARY GREATNESS</w:t>
       </w:r>
     </w:p>
     <w:p>
@@ -8503,7 +8503,7 @@
               <w:spacing w:after="80"/>
               <w:jc w:val="center"/>
             </w:pPr>
-            <w:hyperlink w:history="1" r:id="rIddrosdes88ledaujq1ess9">
+            <w:hyperlink w:history="1" r:id="rIdsgqvkszzbyqshpg0lrfez">
               <w:r>
                 <w:rPr>
                   <w:rStyle w:val="Hyperlink"/>
@@ -8603,7 +8603,7 @@
               <w:spacing w:after="80"/>
               <w:jc w:val="center"/>
             </w:pPr>
-            <w:hyperlink w:history="1" r:id="rIdnfqb90zmxqfbjsgr24mnw">
+            <w:hyperlink w:history="1" r:id="rIdo_c5do8b3m3knzydbp_w6">
               <w:r>
                 <w:rPr>
                   <w:rStyle w:val="Hyperlink"/>
@@ -8760,7 +8760,7 @@
               <w:spacing w:after="80"/>
               <w:jc w:val="center"/>
             </w:pPr>
-            <w:hyperlink w:history="1" r:id="rIddho4xzplzbkpns01qf6zi">
+            <w:hyperlink w:history="1" r:id="rIduer8vkf5yqse3-jvztq01">
               <w:r>
                 <w:rPr>
                   <w:rStyle w:val="Hyperlink"/>
@@ -8860,7 +8860,7 @@
               <w:spacing w:after="80"/>
               <w:jc w:val="center"/>
             </w:pPr>
-            <w:hyperlink w:history="1" r:id="rIdhwfmng3x0psbhrytryidx">
+            <w:hyperlink w:history="1" r:id="rIdamzbwnfnwwcw6s4bft0xm">
               <w:r>
                 <w:rPr>
                   <w:rStyle w:val="Hyperlink"/>
@@ -9016,7 +9016,7 @@
               <w:spacing w:after="80"/>
               <w:jc w:val="center"/>
             </w:pPr>
-            <w:hyperlink w:history="1" r:id="rIdfshz0ihbwzepiu5v3wfwa">
+            <w:hyperlink w:history="1" r:id="rIdo3lg52wd9-br5zhgaolqx">
               <w:r>
                 <w:rPr>
                   <w:rStyle w:val="Hyperlink"/>
@@ -9172,7 +9172,7 @@
               <w:spacing w:after="80"/>
               <w:jc w:val="center"/>
             </w:pPr>
-            <w:hyperlink w:history="1" r:id="rIdvd6nd9ftczuow7avvvi5n">
+            <w:hyperlink w:history="1" r:id="rIdnsfizlxalsragtvxb3q9b">
               <w:r>
                 <w:rPr>
                   <w:rStyle w:val="Hyperlink"/>
@@ -9329,7 +9329,7 @@
               <w:spacing w:after="80"/>
               <w:jc w:val="center"/>
             </w:pPr>
-            <w:hyperlink w:history="1" r:id="rId9wu7owibydsapuew7qvlx">
+            <w:hyperlink w:history="1" r:id="rIdzmvwsz4w9kykewi41iu-i">
               <w:r>
                 <w:rPr>
                   <w:rStyle w:val="Hyperlink"/>
@@ -9429,7 +9429,7 @@
               <w:spacing w:after="80"/>
               <w:jc w:val="center"/>
             </w:pPr>
-            <w:hyperlink w:history="1" r:id="rIdgekwnqpxfl7rnn7fsb6fm">
+            <w:hyperlink w:history="1" r:id="rIdp6un0vn6e6sgvmjkd0ahh">
               <w:r>
                 <w:rPr>
                   <w:rStyle w:val="Hyperlink"/>
@@ -9588,7 +9588,7 @@
               <w:spacing w:after="80"/>
               <w:jc w:val="center"/>
             </w:pPr>
-            <w:hyperlink w:history="1" r:id="rIdx9999h1tz1zizskufc8s6">
+            <w:hyperlink w:history="1" r:id="rId78nyt2-e3jdozi9vaq2wu">
               <w:r>
                 <w:rPr>
                   <w:rStyle w:val="Hyperlink"/>
@@ -9688,7 +9688,7 @@
               <w:spacing w:after="80"/>
               <w:jc w:val="center"/>
             </w:pPr>
-            <w:hyperlink w:history="1" r:id="rIdhq1q2ndfivk7xksi9as6w">
+            <w:hyperlink w:history="1" r:id="rIdtrbfs5orni9zbao4ocmmi">
               <w:r>
                 <w:rPr>
                   <w:rStyle w:val="Hyperlink"/>
@@ -9788,7 +9788,7 @@
               <w:spacing w:after="80"/>
               <w:jc w:val="center"/>
             </w:pPr>
-            <w:hyperlink w:history="1" r:id="rIdbeegorfvvw6fhfdrse87e">
+            <w:hyperlink w:history="1" r:id="rIdtdti37nc0skri19p84cuk">
               <w:r>
                 <w:rPr>
                   <w:rStyle w:val="Hyperlink"/>
@@ -9888,7 +9888,7 @@
               <w:spacing w:after="80"/>
               <w:jc w:val="center"/>
             </w:pPr>
-            <w:hyperlink w:history="1" r:id="rIdbc2knusfp4acqv9df7nun">
+            <w:hyperlink w:history="1" r:id="rIdrcccmmrsk4vjnlpi5y7ub">
               <w:r>
                 <w:rPr>
                   <w:rStyle w:val="Hyperlink"/>
@@ -10020,7 +10020,7 @@
               <w:spacing w:after="80"/>
               <w:jc w:val="center"/>
             </w:pPr>
-            <w:hyperlink w:history="1" r:id="rId-axeg9mablzmpfx45j501">
+            <w:hyperlink w:history="1" r:id="rIdlnobhbsvl1oozs4lwter-">
               <w:r>
                 <w:rPr>
                   <w:rStyle w:val="Hyperlink"/>
@@ -10120,7 +10120,7 @@
               <w:spacing w:after="80"/>
               <w:jc w:val="center"/>
             </w:pPr>
-            <w:hyperlink w:history="1" r:id="rIdwd_czbgylytlcd6tyrti9">
+            <w:hyperlink w:history="1" r:id="rIdb-8z2zjaq1cxyasjioa3g">
               <w:r>
                 <w:rPr>
                   <w:rStyle w:val="Hyperlink"/>
@@ -10220,7 +10220,7 @@
               <w:spacing w:after="80"/>
               <w:jc w:val="center"/>
             </w:pPr>
-            <w:hyperlink w:history="1" r:id="rIdm_w67rzcqj3b_yvrfxapu">
+            <w:hyperlink w:history="1" r:id="rIdgim_jmbg8kgtakh0lxbpm">
               <w:r>
                 <w:rPr>
                   <w:rStyle w:val="Hyperlink"/>
@@ -10320,7 +10320,7 @@
               <w:spacing w:after="80"/>
               <w:jc w:val="center"/>
             </w:pPr>
-            <w:hyperlink w:history="1" r:id="rIdmyx7vss4lhs7ixsudybkf">
+            <w:hyperlink w:history="1" r:id="rIdw_wimjwyjealbme-ontck">
               <w:r>
                 <w:rPr>
                   <w:rStyle w:val="Hyperlink"/>
@@ -10620,7 +10620,7 @@
                   </w:r>
                 </w:p>
                 <w:p>
-                  <w:hyperlink w:history="1" r:id="rIdjt3wunb1f7kwkj6hwdnsm">
+                  <w:hyperlink w:history="1" r:id="rIdvxk-g_tlbquppa0aadhfb">
                     <w:r>
                       <w:rPr>
                         <w:rStyle w:val="Hyperlink"/>
@@ -10829,7 +10829,7 @@
                   </w:r>
                 </w:p>
                 <w:p>
-                  <w:hyperlink w:history="1" r:id="rIdet7ookxoxk6y320bbbz4w">
+                  <w:hyperlink w:history="1" r:id="rIdaje3n3m6j0cjvuu4p2dnf">
                     <w:r>
                       <w:rPr>
                         <w:rStyle w:val="Hyperlink"/>
@@ -11068,7 +11068,7 @@
                   </w:r>
                 </w:p>
                 <w:p>
-                  <w:hyperlink w:history="1" r:id="rIdbnxz3xb2aof3n3d5ry0hp">
+                  <w:hyperlink w:history="1" r:id="rIdner64eqbbof2yx4o3iq4w">
                     <w:r>
                       <w:rPr>
                         <w:rStyle w:val="Hyperlink"/>
@@ -11277,7 +11277,7 @@
                   </w:r>
                 </w:p>
                 <w:p>
-                  <w:hyperlink w:history="1" r:id="rIdex2x9i460_j63dmttgcfz">
+                  <w:hyperlink w:history="1" r:id="rIdqennp5h-fefenrhprfm3d">
                     <w:r>
                       <w:rPr>
                         <w:rStyle w:val="Hyperlink"/>
@@ -11516,7 +11516,7 @@
                   </w:r>
                 </w:p>
                 <w:p>
-                  <w:hyperlink w:history="1" r:id="rIdiqnhpmm3l4sz9nngn59zp">
+                  <w:hyperlink w:history="1" r:id="rIdu9ofkdjpbonieapy6v6mf">
                     <w:r>
                       <w:rPr>
                         <w:rStyle w:val="Hyperlink"/>
@@ -11725,7 +11725,7 @@
                   </w:r>
                 </w:p>
                 <w:p>
-                  <w:hyperlink w:history="1" r:id="rId9x5zmp5lglukqlhs47ntf">
+                  <w:hyperlink w:history="1" r:id="rIdypopuudier_4htc59tnkm">
                     <w:r>
                       <w:rPr>
                         <w:rStyle w:val="Hyperlink"/>
@@ -12159,7 +12159,7 @@
                   </w:r>
                 </w:p>
                 <w:p>
-                  <w:hyperlink w:history="1" r:id="rIda3n7fa0sakb7euo1djxqr">
+                  <w:hyperlink w:history="1" r:id="rIdhaasse5demvxfojpbxdnn">
                     <w:r>
                       <w:rPr>
                         <w:rStyle w:val="Hyperlink"/>
@@ -12398,7 +12398,7 @@
                   </w:r>
                 </w:p>
                 <w:p>
-                  <w:hyperlink w:history="1" r:id="rIdu2fml3zn56wnimifew7xm">
+                  <w:hyperlink w:history="1" r:id="rId62ivakloc8uonbcnyzv0k">
                     <w:r>
                       <w:rPr>
                         <w:rStyle w:val="Hyperlink"/>
@@ -12607,7 +12607,7 @@
                   </w:r>
                 </w:p>
                 <w:p>
-                  <w:hyperlink w:history="1" r:id="rIddbnnd-xau1maibhi_jfmw">
+                  <w:hyperlink w:history="1" r:id="rIdx19ls3fowfpdkwmsr3mr-">
                     <w:r>
                       <w:rPr>
                         <w:rStyle w:val="Hyperlink"/>
@@ -12846,7 +12846,7 @@
                   </w:r>
                 </w:p>
                 <w:p>
-                  <w:hyperlink w:history="1" r:id="rIdqqgupkgp84zj99shruauo">
+                  <w:hyperlink w:history="1" r:id="rIdf1tfrbmzyxxzasxzr9wy5">
                     <w:r>
                       <w:rPr>
                         <w:rStyle w:val="Hyperlink"/>
@@ -13055,7 +13055,7 @@
                   </w:r>
                 </w:p>
                 <w:p>
-                  <w:hyperlink w:history="1" r:id="rId4fev0qw4sndliz6hllzej">
+                  <w:hyperlink w:history="1" r:id="rIdz3fnripmhovtuu5ml2fmi">
                     <w:r>
                       <w:rPr>
                         <w:rStyle w:val="Hyperlink"/>
@@ -13294,7 +13294,7 @@
                   </w:r>
                 </w:p>
                 <w:p>
-                  <w:hyperlink w:history="1" r:id="rIdcctt1heu1kytoaqu7u5gx">
+                  <w:hyperlink w:history="1" r:id="rIdr0kgrahc7jrm6fbftmceg">
                     <w:r>
                       <w:rPr>
                         <w:rStyle w:val="Hyperlink"/>
@@ -13503,7 +13503,7 @@
                   </w:r>
                 </w:p>
                 <w:p>
-                  <w:hyperlink w:history="1" r:id="rIdrk0liwj6bz-svu08orr6a">
+                  <w:hyperlink w:history="1" r:id="rId9ffkph25dwfzxnh2zlujd">
                     <w:r>
                       <w:rPr>
                         <w:rStyle w:val="Hyperlink"/>
@@ -13767,7 +13767,7 @@
                   </w:r>
                 </w:p>
                 <w:p>
-                  <w:hyperlink w:history="1" r:id="rIdholccyk8wx3wrgqcqb38j">
+                  <w:hyperlink w:history="1" r:id="rIduxf9rptk_1-a6_bsoztk3">
                     <w:r>
                       <w:rPr>
                         <w:rStyle w:val="Hyperlink"/>
@@ -14001,7 +14001,7 @@
                   </w:r>
                 </w:p>
                 <w:p>
-                  <w:hyperlink w:history="1" r:id="rIdnadv_ld38iko8ciwjzj_c">
+                  <w:hyperlink w:history="1" r:id="rIdiuivimewzo36kwfehhvdy">
                     <w:r>
                       <w:rPr>
                         <w:rStyle w:val="Hyperlink"/>
@@ -14240,7 +14240,7 @@
                   </w:r>
                 </w:p>
                 <w:p>
-                  <w:hyperlink w:history="1" r:id="rIdn46jqne01ivw0bmtb3re7">
+                  <w:hyperlink w:history="1" r:id="rIde_rffpghxbrilgfvmk3ap">
                     <w:r>
                       <w:rPr>
                         <w:rStyle w:val="Hyperlink"/>
@@ -14449,7 +14449,7 @@
                   </w:r>
                 </w:p>
                 <w:p>
-                  <w:hyperlink w:history="1" r:id="rIdaoxcumqiyxnrxgrzg1tnv">
+                  <w:hyperlink w:history="1" r:id="rIddi88gplzqpp8jaq5kmzse">
                     <w:r>
                       <w:rPr>
                         <w:rStyle w:val="Hyperlink"/>
@@ -14688,7 +14688,7 @@
                   </w:r>
                 </w:p>
                 <w:p>
-                  <w:hyperlink w:history="1" r:id="rIdz7lmxfoq1oxfsh5xbv0r_">
+                  <w:hyperlink w:history="1" r:id="rId86oxuqy8chjsle9l81mc-">
                     <w:r>
                       <w:rPr>
                         <w:rStyle w:val="Hyperlink"/>
@@ -14897,7 +14897,7 @@
                   </w:r>
                 </w:p>
                 <w:p>
-                  <w:hyperlink w:history="1" r:id="rIdfeddz3lwxrie-krlg8hew">
+                  <w:hyperlink w:history="1" r:id="rIdk1vzeb2qg7pmfsdem3vvx">
                     <w:r>
                       <w:rPr>
                         <w:rStyle w:val="Hyperlink"/>
@@ -15136,7 +15136,7 @@
                   </w:r>
                 </w:p>
                 <w:p>
-                  <w:hyperlink w:history="1" r:id="rIdet2anpi3mefvgpv22vadm">
+                  <w:hyperlink w:history="1" r:id="rId21jpqy_qrl2lccgf3syje">
                     <w:r>
                       <w:rPr>
                         <w:rStyle w:val="Hyperlink"/>
@@ -15345,7 +15345,7 @@
                   </w:r>
                 </w:p>
                 <w:p>
-                  <w:hyperlink w:history="1" r:id="rIdprtdia8ph-ogp7ssqygkz">
+                  <w:hyperlink w:history="1" r:id="rIdbaeshvblukvits3nocq6r">
                     <w:r>
                       <w:rPr>
                         <w:rStyle w:val="Hyperlink"/>
@@ -15584,7 +15584,7 @@
                   </w:r>
                 </w:p>
                 <w:p>
-                  <w:hyperlink w:history="1" r:id="rId4rrh4rhiw6nvgr9uw0awa">
+                  <w:hyperlink w:history="1" r:id="rIdbqicjhhyrul4uieefeic6">
                     <w:r>
                       <w:rPr>
                         <w:rStyle w:val="Hyperlink"/>
@@ -15818,7 +15818,7 @@
                   </w:r>
                 </w:p>
                 <w:p>
-                  <w:hyperlink w:history="1" r:id="rId-vef_yh7w1zmrd_ginijr">
+                  <w:hyperlink w:history="1" r:id="rIdqeoh_2nb7nujpxmrv3wph">
                     <w:r>
                       <w:rPr>
                         <w:rStyle w:val="Hyperlink"/>
@@ -16082,7 +16082,7 @@
                   </w:r>
                 </w:p>
                 <w:p>
-                  <w:hyperlink w:history="1" r:id="rIdkxsbxiacqkpzjsuoarrsm">
+                  <w:hyperlink w:history="1" r:id="rIdvzlkzobr0p0yb16dr_8yv">
                     <w:r>
                       <w:rPr>
                         <w:rStyle w:val="Hyperlink"/>
@@ -16291,7 +16291,7 @@
                   </w:r>
                 </w:p>
                 <w:p>
-                  <w:hyperlink w:history="1" r:id="rIdczfyozobpsh0yynanns7k">
+                  <w:hyperlink w:history="1" r:id="rIdwgihnxsmxydjfk1p9exlv">
                     <w:r>
                       <w:rPr>
                         <w:rStyle w:val="Hyperlink"/>
@@ -16530,7 +16530,7 @@
                   </w:r>
                 </w:p>
                 <w:p>
-                  <w:hyperlink w:history="1" r:id="rId9epdmpl1nd_fvnbbeu_vy">
+                  <w:hyperlink w:history="1" r:id="rId6wcdplzplq5mux00dchv5">
                     <w:r>
                       <w:rPr>
                         <w:rStyle w:val="Hyperlink"/>
@@ -16739,7 +16739,7 @@
                   </w:r>
                 </w:p>
                 <w:p>
-                  <w:hyperlink w:history="1" r:id="rIducvpirfvpinbqxn5rszca">
+                  <w:hyperlink w:history="1" r:id="rId6nzfffu_eza3432ob3x__">
                     <w:r>
                       <w:rPr>
                         <w:rStyle w:val="Hyperlink"/>
@@ -16978,7 +16978,7 @@
                   </w:r>
                 </w:p>
                 <w:p>
-                  <w:hyperlink w:history="1" r:id="rIdaxbj-culnhsqcnpj9sc59">
+                  <w:hyperlink w:history="1" r:id="rIdm1vi4cumjmtqakur3afx2">
                     <w:r>
                       <w:rPr>
                         <w:rStyle w:val="Hyperlink"/>
@@ -17187,7 +17187,7 @@
                   </w:r>
                 </w:p>
                 <w:p>
-                  <w:hyperlink w:history="1" r:id="rIddi5kjqe5axatlt6fjh9cf">
+                  <w:hyperlink w:history="1" r:id="rId5vdoigs_mywmi1ar8axjo">
                     <w:r>
                       <w:rPr>
                         <w:rStyle w:val="Hyperlink"/>
@@ -17426,7 +17426,7 @@
                   </w:r>
                 </w:p>
                 <w:p>
-                  <w:hyperlink w:history="1" r:id="rIdarj1vtrfsj7gymcc24e1t">
+                  <w:hyperlink w:history="1" r:id="rIdf4jsmnjrzobxw5mbfakhg">
                     <w:r>
                       <w:rPr>
                         <w:rStyle w:val="Hyperlink"/>
@@ -17635,7 +17635,7 @@
                   </w:r>
                 </w:p>
                 <w:p>
-                  <w:hyperlink w:history="1" r:id="rIdcvexhhbqqzxbrvwrpklzs">
+                  <w:hyperlink w:history="1" r:id="rIdbwveoy6pce2bs9o5frhcy">
                     <w:r>
                       <w:rPr>
                         <w:rStyle w:val="Hyperlink"/>
@@ -17874,7 +17874,7 @@
                   </w:r>
                 </w:p>
                 <w:p>
-                  <w:hyperlink w:history="1" r:id="rIdqk1b4nasovzepwxyavhym">
+                  <w:hyperlink w:history="1" r:id="rIdaz3aqcotbrqvfad3einfx">
                     <w:r>
                       <w:rPr>
                         <w:rStyle w:val="Hyperlink"/>
@@ -18083,7 +18083,7 @@
                   </w:r>
                 </w:p>
                 <w:p>
-                  <w:hyperlink w:history="1" r:id="rIdsq5upesvk-xnn4czbroso">
+                  <w:hyperlink w:history="1" r:id="rId--y9cb9v2tzx0mxubzqhj">
                     <w:r>
                       <w:rPr>
                         <w:rStyle w:val="Hyperlink"/>
@@ -18322,7 +18322,7 @@
                   </w:r>
                 </w:p>
                 <w:p>
-                  <w:hyperlink w:history="1" r:id="rId_fihqfs9tfcnabgykjzqt">
+                  <w:hyperlink w:history="1" r:id="rIdqnk2oflwb70p5lunyqqns">
                     <w:r>
                       <w:rPr>
                         <w:rStyle w:val="Hyperlink"/>
@@ -18556,7 +18556,7 @@
                   </w:r>
                 </w:p>
                 <w:p>
-                  <w:hyperlink w:history="1" r:id="rIdjl-wg_vewploea73a97kz">
+                  <w:hyperlink w:history="1" r:id="rIdweuhj2lahdzwpiv4key0u">
                     <w:r>
                       <w:rPr>
                         <w:rStyle w:val="Hyperlink"/>
@@ -18795,7 +18795,7 @@
                   </w:r>
                 </w:p>
                 <w:p>
-                  <w:hyperlink w:history="1" r:id="rIdzjzex2qjndsmm1jk40-lm">
+                  <w:hyperlink w:history="1" r:id="rIdplol-qvtzzghgcs5lsugd">
                     <w:r>
                       <w:rPr>
                         <w:rStyle w:val="Hyperlink"/>
@@ -19004,7 +19004,7 @@
                   </w:r>
                 </w:p>
                 <w:p>
-                  <w:hyperlink w:history="1" r:id="rId6sc1byl8xk0lj_nfcwpc9">
+                  <w:hyperlink w:history="1" r:id="rIdbxzppbjg_udmg7juifb8n">
                     <w:r>
                       <w:rPr>
                         <w:rStyle w:val="Hyperlink"/>
@@ -19243,7 +19243,7 @@
                   </w:r>
                 </w:p>
                 <w:p>
-                  <w:hyperlink w:history="1" r:id="rId-s9addzmilhudtchakupw">
+                  <w:hyperlink w:history="1" r:id="rIdxfygg8jtalltfj5_k6hpq">
                     <w:r>
                       <w:rPr>
                         <w:rStyle w:val="Hyperlink"/>
@@ -19452,7 +19452,7 @@
                   </w:r>
                 </w:p>
                 <w:p>
-                  <w:hyperlink w:history="1" r:id="rId8bj8zdf1_lcb724chidip">
+                  <w:hyperlink w:history="1" r:id="rIdpr_hxkidn_mlmtbbzmhnc">
                     <w:r>
                       <w:rPr>
                         <w:rStyle w:val="Hyperlink"/>
@@ -19692,9 +19692,11 @@
     <w:r>
       <w:rPr>
         <w:rFonts w:ascii="Calibri" w:cs="Calibri" w:eastAsia="Calibri" w:hAnsi="Calibri"/>
+        <w:b/>
+        <w:bCs/>
         <w:color w:val="5A6B82"/>
-        <w:sz w:val="16"/>
-        <w:szCs w:val="16"/>
+        <w:sz w:val="22"/>
+        <w:szCs w:val="22"/>
       </w:rPr>
       <w:t xml:space="preserve">North Texas 2026</w:t>
     </w:r>

</xml_diff>

<commit_message>
workbook: add speaker photo + bio to each SESSION cover page
- Photos (600x600 JPG, center-cropped) for Stanley, Fahey, Winters
- Bios drawn from EOS Worldwide Implementer profiles
- Two-column layout on each session cover: 1.5" photo left, bio right
- Still 29 pages
</commit_message>
<xml_diff>
--- a/deliverables/workbook/Workbook.docx
+++ b/deliverables/workbook/Workbook.docx
@@ -5299,7 +5299,7 @@
     </w:p>
     <w:p>
       <w:pPr>
-        <w:spacing w:after="400"/>
+        <w:spacing w:after="300"/>
         <w:jc w:val="left"/>
       </w:pPr>
       <w:r>
@@ -5314,6 +5314,125 @@
         <w:t xml:space="preserve">Expert EOS Implementer®</w:t>
       </w:r>
     </w:p>
+    <w:tbl>
+      <w:tblPr>
+        <w:tblW w:type="dxa" w:w="8880"/>
+        <w:tblBorders>
+          <w:top w:val="single" w:color="auto" w:sz="4"/>
+          <w:left w:val="single" w:color="auto" w:sz="4"/>
+          <w:bottom w:val="single" w:color="auto" w:sz="4"/>
+          <w:right w:val="single" w:color="auto" w:sz="4"/>
+          <w:insideH w:val="single" w:color="auto" w:sz="4"/>
+          <w:insideV w:val="single" w:color="auto" w:sz="4"/>
+        </w:tblBorders>
+      </w:tblPr>
+      <w:tblGrid>
+        <w:gridCol w:w="2160"/>
+        <w:gridCol w:w="6720"/>
+      </w:tblGrid>
+      <w:tr>
+        <w:trPr>
+          <w:cantSplit/>
+        </w:trPr>
+        <w:tc>
+          <w:tcPr>
+            <w:tcW w:type="dxa" w:w="2160"/>
+            <w:tcBorders>
+              <w:top w:val="none" w:color="FFFFFF" w:sz="0"/>
+              <w:left w:val="none" w:color="FFFFFF" w:sz="0"/>
+              <w:bottom w:val="none" w:color="FFFFFF" w:sz="0"/>
+              <w:right w:val="none" w:color="FFFFFF" w:sz="0"/>
+            </w:tcBorders>
+            <w:tcMar>
+              <w:top w:type="dxa" w:w="0"/>
+              <w:left w:type="dxa" w:w="0"/>
+              <w:bottom w:type="dxa" w:w="0"/>
+              <w:right w:type="dxa" w:w="240"/>
+            </w:tcMar>
+            <w:vAlign w:val="top"/>
+          </w:tcPr>
+          <w:p>
+            <w:pPr>
+              <w:spacing w:after="0"/>
+              <w:jc w:val="left"/>
+            </w:pPr>
+            <w:r>
+              <w:drawing>
+                <wp:inline distT="0" distB="0" distL="0" distR="0">
+                  <wp:extent cx="1371600" cy="1371600"/>
+                  <wp:effectExtent t="0" r="0" b="0" l="0"/>
+                  <wp:docPr id="1" name="img" descr="image" title="mark-stanley.jpg"/>
+                  <wp:cNvGraphicFramePr>
+                    <a:graphicFrameLocks xmlns:a="http://schemas.openxmlformats.org/drawingml/2006/main" noChangeAspect="1"/>
+                  </wp:cNvGraphicFramePr>
+                  <a:graphic xmlns:a="http://schemas.openxmlformats.org/drawingml/2006/main">
+                    <a:graphicData uri="http://schemas.openxmlformats.org/drawingml/2006/picture">
+                      <pic:pic xmlns:pic="http://schemas.openxmlformats.org/drawingml/2006/picture">
+                        <pic:nvPicPr>
+                          <pic:cNvPr id="0" name="" descr=""/>
+                          <pic:cNvPicPr>
+                            <a:picLocks noChangeAspect="1" noChangeArrowheads="1"/>
+                          </pic:cNvPicPr>
+                        </pic:nvPicPr>
+                        <pic:blipFill>
+                          <a:blip r:embed="rId11" cstate="none"/>
+                          <a:srcRect/>
+                          <a:stretch>
+                            <a:fillRect/>
+                          </a:stretch>
+                        </pic:blipFill>
+                        <pic:spPr bwMode="auto">
+                          <a:xfrm>
+                            <a:off x="0" y="0"/>
+                            <a:ext cx="1371600" cy="1371600"/>
+                          </a:xfrm>
+                          <a:prstGeom prst="rect">
+                            <a:avLst/>
+                          </a:prstGeom>
+                        </pic:spPr>
+                      </pic:pic>
+                    </a:graphicData>
+                  </a:graphic>
+                </wp:inline>
+              </w:drawing>
+            </w:r>
+          </w:p>
+        </w:tc>
+        <w:tc>
+          <w:tcPr>
+            <w:tcW w:type="dxa" w:w="6720"/>
+            <w:tcBorders>
+              <w:top w:val="none" w:color="FFFFFF" w:sz="0"/>
+              <w:left w:val="none" w:color="FFFFFF" w:sz="0"/>
+              <w:bottom w:val="none" w:color="FFFFFF" w:sz="0"/>
+              <w:right w:val="none" w:color="FFFFFF" w:sz="0"/>
+            </w:tcBorders>
+            <w:tcMar>
+              <w:top w:type="dxa" w:w="0"/>
+              <w:left w:type="dxa" w:w="0"/>
+              <w:bottom w:type="dxa" w:w="0"/>
+              <w:right w:type="dxa" w:w="0"/>
+            </w:tcMar>
+            <w:vAlign w:val="top"/>
+          </w:tcPr>
+          <w:p>
+            <w:pPr>
+              <w:spacing w:after="0" w:line="300"/>
+              <w:jc w:val="left"/>
+            </w:pPr>
+            <w:r>
+              <w:rPr>
+                <w:rFonts w:ascii="Calibri" w:cs="Calibri" w:eastAsia="Calibri" w:hAnsi="Calibri"/>
+                <w:color w:val="1A1A1A"/>
+                <w:sz w:val="20"/>
+                <w:szCs w:val="20"/>
+              </w:rPr>
+              <w:t xml:space="preserve">One of the first EOS® Implementers in the world (2009) and now an Expert EOS Implementer with 1,700+ full-day sessions across 180+ leadership teams. Co-author of The Data Book, co-founder of the UNSTOPPABLE! Data-Driven Leader community, and a three-time entrepreneur. Brings a Theory of Constraints, Lean, and Six Sigma toolkit — plus a bias for action — to every session. BBA (Iowa), MBA (Drake). Lives in Johnston, Iowa.</w:t>
+            </w:r>
+          </w:p>
+        </w:tc>
+      </w:tr>
+    </w:tbl>
     <w:p>
       <w:r>
         <w:br w:type="page"/>
@@ -6162,7 +6281,7 @@
     </w:p>
     <w:p>
       <w:pPr>
-        <w:spacing w:after="400"/>
+        <w:spacing w:after="300"/>
         <w:jc w:val="left"/>
       </w:pPr>
       <w:r>
@@ -6177,6 +6296,125 @@
         <w:t xml:space="preserve">Expert EOS Implementer®</w:t>
       </w:r>
     </w:p>
+    <w:tbl>
+      <w:tblPr>
+        <w:tblW w:type="dxa" w:w="8880"/>
+        <w:tblBorders>
+          <w:top w:val="single" w:color="auto" w:sz="4"/>
+          <w:left w:val="single" w:color="auto" w:sz="4"/>
+          <w:bottom w:val="single" w:color="auto" w:sz="4"/>
+          <w:right w:val="single" w:color="auto" w:sz="4"/>
+          <w:insideH w:val="single" w:color="auto" w:sz="4"/>
+          <w:insideV w:val="single" w:color="auto" w:sz="4"/>
+        </w:tblBorders>
+      </w:tblPr>
+      <w:tblGrid>
+        <w:gridCol w:w="2160"/>
+        <w:gridCol w:w="6720"/>
+      </w:tblGrid>
+      <w:tr>
+        <w:trPr>
+          <w:cantSplit/>
+        </w:trPr>
+        <w:tc>
+          <w:tcPr>
+            <w:tcW w:type="dxa" w:w="2160"/>
+            <w:tcBorders>
+              <w:top w:val="none" w:color="FFFFFF" w:sz="0"/>
+              <w:left w:val="none" w:color="FFFFFF" w:sz="0"/>
+              <w:bottom w:val="none" w:color="FFFFFF" w:sz="0"/>
+              <w:right w:val="none" w:color="FFFFFF" w:sz="0"/>
+            </w:tcBorders>
+            <w:tcMar>
+              <w:top w:type="dxa" w:w="0"/>
+              <w:left w:type="dxa" w:w="0"/>
+              <w:bottom w:type="dxa" w:w="0"/>
+              <w:right w:type="dxa" w:w="240"/>
+            </w:tcMar>
+            <w:vAlign w:val="top"/>
+          </w:tcPr>
+          <w:p>
+            <w:pPr>
+              <w:spacing w:after="0"/>
+              <w:jc w:val="left"/>
+            </w:pPr>
+            <w:r>
+              <w:drawing>
+                <wp:inline distT="0" distB="0" distL="0" distR="0">
+                  <wp:extent cx="1371600" cy="1371600"/>
+                  <wp:effectExtent t="0" r="0" b="0" l="0"/>
+                  <wp:docPr id="1" name="img" descr="image" title="beth-fahey.jpg"/>
+                  <wp:cNvGraphicFramePr>
+                    <a:graphicFrameLocks xmlns:a="http://schemas.openxmlformats.org/drawingml/2006/main" noChangeAspect="1"/>
+                  </wp:cNvGraphicFramePr>
+                  <a:graphic xmlns:a="http://schemas.openxmlformats.org/drawingml/2006/main">
+                    <a:graphicData uri="http://schemas.openxmlformats.org/drawingml/2006/picture">
+                      <pic:pic xmlns:pic="http://schemas.openxmlformats.org/drawingml/2006/picture">
+                        <pic:nvPicPr>
+                          <pic:cNvPr id="0" name="" descr=""/>
+                          <pic:cNvPicPr>
+                            <a:picLocks noChangeAspect="1" noChangeArrowheads="1"/>
+                          </pic:cNvPicPr>
+                        </pic:nvPicPr>
+                        <pic:blipFill>
+                          <a:blip r:embed="rId12" cstate="none"/>
+                          <a:srcRect/>
+                          <a:stretch>
+                            <a:fillRect/>
+                          </a:stretch>
+                        </pic:blipFill>
+                        <pic:spPr bwMode="auto">
+                          <a:xfrm>
+                            <a:off x="0" y="0"/>
+                            <a:ext cx="1371600" cy="1371600"/>
+                          </a:xfrm>
+                          <a:prstGeom prst="rect">
+                            <a:avLst/>
+                          </a:prstGeom>
+                        </pic:spPr>
+                      </pic:pic>
+                    </a:graphicData>
+                  </a:graphic>
+                </wp:inline>
+              </w:drawing>
+            </w:r>
+          </w:p>
+        </w:tc>
+        <w:tc>
+          <w:tcPr>
+            <w:tcW w:type="dxa" w:w="6720"/>
+            <w:tcBorders>
+              <w:top w:val="none" w:color="FFFFFF" w:sz="0"/>
+              <w:left w:val="none" w:color="FFFFFF" w:sz="0"/>
+              <w:bottom w:val="none" w:color="FFFFFF" w:sz="0"/>
+              <w:right w:val="none" w:color="FFFFFF" w:sz="0"/>
+            </w:tcBorders>
+            <w:tcMar>
+              <w:top w:type="dxa" w:w="0"/>
+              <w:left w:type="dxa" w:w="0"/>
+              <w:bottom w:type="dxa" w:w="0"/>
+              <w:right w:type="dxa" w:w="0"/>
+            </w:tcMar>
+            <w:vAlign w:val="top"/>
+          </w:tcPr>
+          <w:p>
+            <w:pPr>
+              <w:spacing w:after="0" w:line="300"/>
+              <w:jc w:val="left"/>
+            </w:pPr>
+            <w:r>
+              <w:rPr>
+                <w:rFonts w:ascii="Calibri" w:cs="Calibri" w:eastAsia="Calibri" w:hAnsi="Calibri"/>
+                <w:color w:val="1A1A1A"/>
+                <w:sz w:val="20"/>
+                <w:szCs w:val="20"/>
+              </w:rPr>
+              <w:t xml:space="preserve">Expert EOS Implementer® with 500+ client sessions and an EOS Worldwide Coach who trains other Implementers. Co-author of ROLLOUT: Get Your Entire Team Running on EOS® to Achieve Your Vision, and co-creator of the Great Boss™ Workshops with René Boer — more than 40 workshops delivered to thousands of managers. Host of the Bad Boss Confessional podcast. Founder-first perspective: she built a bakery, ran it on EOS, and led the Retail Bakers of America before going full-time as an Implementer. Based in the Chicago area.</w:t>
+            </w:r>
+          </w:p>
+        </w:tc>
+      </w:tr>
+    </w:tbl>
     <w:p>
       <w:r>
         <w:br w:type="page"/>
@@ -7025,7 +7263,7 @@
     </w:p>
     <w:p>
       <w:pPr>
-        <w:spacing w:after="400"/>
+        <w:spacing w:after="300"/>
         <w:jc w:val="left"/>
       </w:pPr>
       <w:r>
@@ -7040,6 +7278,125 @@
         <w:t xml:space="preserve">Expert EOS Implementer®</w:t>
       </w:r>
     </w:p>
+    <w:tbl>
+      <w:tblPr>
+        <w:tblW w:type="dxa" w:w="8880"/>
+        <w:tblBorders>
+          <w:top w:val="single" w:color="auto" w:sz="4"/>
+          <w:left w:val="single" w:color="auto" w:sz="4"/>
+          <w:bottom w:val="single" w:color="auto" w:sz="4"/>
+          <w:right w:val="single" w:color="auto" w:sz="4"/>
+          <w:insideH w:val="single" w:color="auto" w:sz="4"/>
+          <w:insideV w:val="single" w:color="auto" w:sz="4"/>
+        </w:tblBorders>
+      </w:tblPr>
+      <w:tblGrid>
+        <w:gridCol w:w="2160"/>
+        <w:gridCol w:w="6720"/>
+      </w:tblGrid>
+      <w:tr>
+        <w:trPr>
+          <w:cantSplit/>
+        </w:trPr>
+        <w:tc>
+          <w:tcPr>
+            <w:tcW w:type="dxa" w:w="2160"/>
+            <w:tcBorders>
+              <w:top w:val="none" w:color="FFFFFF" w:sz="0"/>
+              <w:left w:val="none" w:color="FFFFFF" w:sz="0"/>
+              <w:bottom w:val="none" w:color="FFFFFF" w:sz="0"/>
+              <w:right w:val="none" w:color="FFFFFF" w:sz="0"/>
+            </w:tcBorders>
+            <w:tcMar>
+              <w:top w:type="dxa" w:w="0"/>
+              <w:left w:type="dxa" w:w="0"/>
+              <w:bottom w:type="dxa" w:w="0"/>
+              <w:right w:type="dxa" w:w="240"/>
+            </w:tcMar>
+            <w:vAlign w:val="top"/>
+          </w:tcPr>
+          <w:p>
+            <w:pPr>
+              <w:spacing w:after="0"/>
+              <w:jc w:val="left"/>
+            </w:pPr>
+            <w:r>
+              <w:drawing>
+                <wp:inline distT="0" distB="0" distL="0" distR="0">
+                  <wp:extent cx="1371600" cy="1371600"/>
+                  <wp:effectExtent t="0" r="0" b="0" l="0"/>
+                  <wp:docPr id="1" name="img" descr="image" title="mark-c-winters.jpg"/>
+                  <wp:cNvGraphicFramePr>
+                    <a:graphicFrameLocks xmlns:a="http://schemas.openxmlformats.org/drawingml/2006/main" noChangeAspect="1"/>
+                  </wp:cNvGraphicFramePr>
+                  <a:graphic xmlns:a="http://schemas.openxmlformats.org/drawingml/2006/main">
+                    <a:graphicData uri="http://schemas.openxmlformats.org/drawingml/2006/picture">
+                      <pic:pic xmlns:pic="http://schemas.openxmlformats.org/drawingml/2006/picture">
+                        <pic:nvPicPr>
+                          <pic:cNvPr id="0" name="" descr=""/>
+                          <pic:cNvPicPr>
+                            <a:picLocks noChangeAspect="1" noChangeArrowheads="1"/>
+                          </pic:cNvPicPr>
+                        </pic:nvPicPr>
+                        <pic:blipFill>
+                          <a:blip r:embed="rId13" cstate="none"/>
+                          <a:srcRect/>
+                          <a:stretch>
+                            <a:fillRect/>
+                          </a:stretch>
+                        </pic:blipFill>
+                        <pic:spPr bwMode="auto">
+                          <a:xfrm>
+                            <a:off x="0" y="0"/>
+                            <a:ext cx="1371600" cy="1371600"/>
+                          </a:xfrm>
+                          <a:prstGeom prst="rect">
+                            <a:avLst/>
+                          </a:prstGeom>
+                        </pic:spPr>
+                      </pic:pic>
+                    </a:graphicData>
+                  </a:graphic>
+                </wp:inline>
+              </w:drawing>
+            </w:r>
+          </w:p>
+        </w:tc>
+        <w:tc>
+          <w:tcPr>
+            <w:tcW w:type="dxa" w:w="6720"/>
+            <w:tcBorders>
+              <w:top w:val="none" w:color="FFFFFF" w:sz="0"/>
+              <w:left w:val="none" w:color="FFFFFF" w:sz="0"/>
+              <w:bottom w:val="none" w:color="FFFFFF" w:sz="0"/>
+              <w:right w:val="none" w:color="FFFFFF" w:sz="0"/>
+            </w:tcBorders>
+            <w:tcMar>
+              <w:top w:type="dxa" w:w="0"/>
+              <w:left w:type="dxa" w:w="0"/>
+              <w:bottom w:type="dxa" w:w="0"/>
+              <w:right w:type="dxa" w:w="0"/>
+            </w:tcMar>
+            <w:vAlign w:val="top"/>
+          </w:tcPr>
+          <w:p>
+            <w:pPr>
+              <w:spacing w:after="0" w:line="300"/>
+              <w:jc w:val="left"/>
+            </w:pPr>
+            <w:r>
+              <w:rPr>
+                <w:rFonts w:ascii="Calibri" w:cs="Calibri" w:eastAsia="Calibri" w:hAnsi="Calibri"/>
+                <w:color w:val="1A1A1A"/>
+                <w:sz w:val="20"/>
+                <w:szCs w:val="20"/>
+              </w:rPr>
+              <w:t xml:space="preserve">Expert EOS Implementer® since 2012 with 1,000+ full-day sessions delivered. Author of Visionary and co-author of Rocket Fuel with EOS founder Gino Wickman — the definitive book on the Visionary/Integrator partnership. Founder and Visionary of Rocket Fuel University and host of the Rocket Fuel Podcast. Serial entrepreneur (14 companies started, bought, sold, or shut down) with one exit at a 100x cash return in under three years. MBA from The University of Chicago. Based in Dallas.</w:t>
+            </w:r>
+          </w:p>
+        </w:tc>
+      </w:tr>
+    </w:tbl>
     <w:p>
       <w:r>
         <w:br w:type="page"/>
@@ -7908,7 +8265,7 @@
                           </pic:cNvPicPr>
                         </pic:nvPicPr>
                         <pic:blipFill>
-                          <a:blip r:embed="rId11" cstate="none"/>
+                          <a:blip r:embed="rId14" cstate="none"/>
                           <a:srcRect/>
                           <a:stretch>
                             <a:fillRect/>
@@ -8066,7 +8423,7 @@
                           </pic:cNvPicPr>
                         </pic:nvPicPr>
                         <pic:blipFill>
-                          <a:blip r:embed="rId12" cstate="none"/>
+                          <a:blip r:embed="rId15" cstate="none"/>
                           <a:srcRect/>
                           <a:stretch>
                             <a:fillRect/>
@@ -8224,7 +8581,7 @@
                           </pic:cNvPicPr>
                         </pic:nvPicPr>
                         <pic:blipFill>
-                          <a:blip r:embed="rId13" cstate="none"/>
+                          <a:blip r:embed="rId16" cstate="none"/>
                           <a:srcRect/>
                           <a:stretch>
                             <a:fillRect/>
@@ -8459,7 +8816,7 @@
                           </pic:cNvPicPr>
                         </pic:nvPicPr>
                         <pic:blipFill>
-                          <a:blip r:embed="rId14" cstate="none"/>
+                          <a:blip r:embed="rId17" cstate="none"/>
                           <a:srcRect/>
                           <a:stretch>
                             <a:fillRect/>
@@ -8503,7 +8860,7 @@
               <w:spacing w:after="80"/>
               <w:jc w:val="center"/>
             </w:pPr>
-            <w:hyperlink w:history="1" r:id="rIdsgqvkszzbyqshpg0lrfez">
+            <w:hyperlink w:history="1" r:id="rIdiilm1lfnxpgzr1k64uv1_">
               <w:r>
                 <w:rPr>
                   <w:rStyle w:val="Hyperlink"/>
@@ -8559,7 +8916,7 @@
                           </pic:cNvPicPr>
                         </pic:nvPicPr>
                         <pic:blipFill>
-                          <a:blip r:embed="rId15" cstate="none"/>
+                          <a:blip r:embed="rId18" cstate="none"/>
                           <a:srcRect/>
                           <a:stretch>
                             <a:fillRect/>
@@ -8603,7 +8960,7 @@
               <w:spacing w:after="80"/>
               <w:jc w:val="center"/>
             </w:pPr>
-            <w:hyperlink w:history="1" r:id="rIdo_c5do8b3m3knzydbp_w6">
+            <w:hyperlink w:history="1" r:id="rId6b-8jqhtbttamblgdu-6a">
               <w:r>
                 <w:rPr>
                   <w:rStyle w:val="Hyperlink"/>
@@ -8716,7 +9073,7 @@
                           </pic:cNvPicPr>
                         </pic:nvPicPr>
                         <pic:blipFill>
-                          <a:blip r:embed="rId16" cstate="none"/>
+                          <a:blip r:embed="rId19" cstate="none"/>
                           <a:srcRect/>
                           <a:stretch>
                             <a:fillRect/>
@@ -8760,7 +9117,7 @@
               <w:spacing w:after="80"/>
               <w:jc w:val="center"/>
             </w:pPr>
-            <w:hyperlink w:history="1" r:id="rIduer8vkf5yqse3-jvztq01">
+            <w:hyperlink w:history="1" r:id="rIdpqg_5d67fnz9wk0m3r7q6">
               <w:r>
                 <w:rPr>
                   <w:rStyle w:val="Hyperlink"/>
@@ -8816,7 +9173,7 @@
                           </pic:cNvPicPr>
                         </pic:nvPicPr>
                         <pic:blipFill>
-                          <a:blip r:embed="rId17" cstate="none"/>
+                          <a:blip r:embed="rId20" cstate="none"/>
                           <a:srcRect/>
                           <a:stretch>
                             <a:fillRect/>
@@ -8860,7 +9217,7 @@
               <w:spacing w:after="80"/>
               <w:jc w:val="center"/>
             </w:pPr>
-            <w:hyperlink w:history="1" r:id="rIdamzbwnfnwwcw6s4bft0xm">
+            <w:hyperlink w:history="1" r:id="rIdsoe0usjbc2rlugpdp6bdh">
               <w:r>
                 <w:rPr>
                   <w:rStyle w:val="Hyperlink"/>
@@ -8972,7 +9329,7 @@
                           </pic:cNvPicPr>
                         </pic:nvPicPr>
                         <pic:blipFill>
-                          <a:blip r:embed="rId18" cstate="none"/>
+                          <a:blip r:embed="rId21" cstate="none"/>
                           <a:srcRect/>
                           <a:stretch>
                             <a:fillRect/>
@@ -9016,7 +9373,7 @@
               <w:spacing w:after="80"/>
               <w:jc w:val="center"/>
             </w:pPr>
-            <w:hyperlink w:history="1" r:id="rIdo3lg52wd9-br5zhgaolqx">
+            <w:hyperlink w:history="1" r:id="rIdys4qqwco2ulmxst4osrr1">
               <w:r>
                 <w:rPr>
                   <w:rStyle w:val="Hyperlink"/>
@@ -9128,7 +9485,7 @@
                           </pic:cNvPicPr>
                         </pic:nvPicPr>
                         <pic:blipFill>
-                          <a:blip r:embed="rId19" cstate="none"/>
+                          <a:blip r:embed="rId22" cstate="none"/>
                           <a:srcRect/>
                           <a:stretch>
                             <a:fillRect/>
@@ -9172,7 +9529,7 @@
               <w:spacing w:after="80"/>
               <w:jc w:val="center"/>
             </w:pPr>
-            <w:hyperlink w:history="1" r:id="rIdnsfizlxalsragtvxb3q9b">
+            <w:hyperlink w:history="1" r:id="rId-xt1bpz-a9nkocncimpn8">
               <w:r>
                 <w:rPr>
                   <w:rStyle w:val="Hyperlink"/>
@@ -9285,7 +9642,7 @@
                           </pic:cNvPicPr>
                         </pic:nvPicPr>
                         <pic:blipFill>
-                          <a:blip r:embed="rId20" cstate="none"/>
+                          <a:blip r:embed="rId23" cstate="none"/>
                           <a:srcRect/>
                           <a:stretch>
                             <a:fillRect/>
@@ -9329,7 +9686,7 @@
               <w:spacing w:after="80"/>
               <w:jc w:val="center"/>
             </w:pPr>
-            <w:hyperlink w:history="1" r:id="rIdzmvwsz4w9kykewi41iu-i">
+            <w:hyperlink w:history="1" r:id="rIdqkgzktna49q_sxccmrjmg">
               <w:r>
                 <w:rPr>
                   <w:rStyle w:val="Hyperlink"/>
@@ -9385,7 +9742,7 @@
                           </pic:cNvPicPr>
                         </pic:nvPicPr>
                         <pic:blipFill>
-                          <a:blip r:embed="rId21" cstate="none"/>
+                          <a:blip r:embed="rId24" cstate="none"/>
                           <a:srcRect/>
                           <a:stretch>
                             <a:fillRect/>
@@ -9429,7 +9786,7 @@
               <w:spacing w:after="80"/>
               <w:jc w:val="center"/>
             </w:pPr>
-            <w:hyperlink w:history="1" r:id="rIdp6un0vn6e6sgvmjkd0ahh">
+            <w:hyperlink w:history="1" r:id="rIdcapgn86sbeypon5iaqdxo">
               <w:r>
                 <w:rPr>
                   <w:rStyle w:val="Hyperlink"/>
@@ -9544,7 +9901,7 @@
                           </pic:cNvPicPr>
                         </pic:nvPicPr>
                         <pic:blipFill>
-                          <a:blip r:embed="rId22" cstate="none"/>
+                          <a:blip r:embed="rId25" cstate="none"/>
                           <a:srcRect/>
                           <a:stretch>
                             <a:fillRect/>
@@ -9588,7 +9945,7 @@
               <w:spacing w:after="80"/>
               <w:jc w:val="center"/>
             </w:pPr>
-            <w:hyperlink w:history="1" r:id="rId78nyt2-e3jdozi9vaq2wu">
+            <w:hyperlink w:history="1" r:id="rIdwq2sqywd1w-xaprrreupv">
               <w:r>
                 <w:rPr>
                   <w:rStyle w:val="Hyperlink"/>
@@ -9644,7 +10001,7 @@
                           </pic:cNvPicPr>
                         </pic:nvPicPr>
                         <pic:blipFill>
-                          <a:blip r:embed="rId23" cstate="none"/>
+                          <a:blip r:embed="rId26" cstate="none"/>
                           <a:srcRect/>
                           <a:stretch>
                             <a:fillRect/>
@@ -9688,7 +10045,7 @@
               <w:spacing w:after="80"/>
               <w:jc w:val="center"/>
             </w:pPr>
-            <w:hyperlink w:history="1" r:id="rIdtrbfs5orni9zbao4ocmmi">
+            <w:hyperlink w:history="1" r:id="rIddt886yt_sgxq7g5mjokyt">
               <w:r>
                 <w:rPr>
                   <w:rStyle w:val="Hyperlink"/>
@@ -9744,7 +10101,7 @@
                           </pic:cNvPicPr>
                         </pic:nvPicPr>
                         <pic:blipFill>
-                          <a:blip r:embed="rId24" cstate="none"/>
+                          <a:blip r:embed="rId27" cstate="none"/>
                           <a:srcRect/>
                           <a:stretch>
                             <a:fillRect/>
@@ -9788,7 +10145,7 @@
               <w:spacing w:after="80"/>
               <w:jc w:val="center"/>
             </w:pPr>
-            <w:hyperlink w:history="1" r:id="rIdtdti37nc0skri19p84cuk">
+            <w:hyperlink w:history="1" r:id="rIdtoocg5-l-yhqdfincssle">
               <w:r>
                 <w:rPr>
                   <w:rStyle w:val="Hyperlink"/>
@@ -9844,7 +10201,7 @@
                           </pic:cNvPicPr>
                         </pic:nvPicPr>
                         <pic:blipFill>
-                          <a:blip r:embed="rId25" cstate="none"/>
+                          <a:blip r:embed="rId28" cstate="none"/>
                           <a:srcRect/>
                           <a:stretch>
                             <a:fillRect/>
@@ -9888,7 +10245,7 @@
               <w:spacing w:after="80"/>
               <w:jc w:val="center"/>
             </w:pPr>
-            <w:hyperlink w:history="1" r:id="rIdrcccmmrsk4vjnlpi5y7ub">
+            <w:hyperlink w:history="1" r:id="rIdwn5clvig5pq7f30sbanfh">
               <w:r>
                 <w:rPr>
                   <w:rStyle w:val="Hyperlink"/>
@@ -9976,7 +10333,7 @@
                           </pic:cNvPicPr>
                         </pic:nvPicPr>
                         <pic:blipFill>
-                          <a:blip r:embed="rId26" cstate="none"/>
+                          <a:blip r:embed="rId29" cstate="none"/>
                           <a:srcRect/>
                           <a:stretch>
                             <a:fillRect/>
@@ -10020,7 +10377,7 @@
               <w:spacing w:after="80"/>
               <w:jc w:val="center"/>
             </w:pPr>
-            <w:hyperlink w:history="1" r:id="rIdlnobhbsvl1oozs4lwter-">
+            <w:hyperlink w:history="1" r:id="rIdeyw4tttuqnzagekant4er">
               <w:r>
                 <w:rPr>
                   <w:rStyle w:val="Hyperlink"/>
@@ -10076,7 +10433,7 @@
                           </pic:cNvPicPr>
                         </pic:nvPicPr>
                         <pic:blipFill>
-                          <a:blip r:embed="rId27" cstate="none"/>
+                          <a:blip r:embed="rId30" cstate="none"/>
                           <a:srcRect/>
                           <a:stretch>
                             <a:fillRect/>
@@ -10120,7 +10477,7 @@
               <w:spacing w:after="80"/>
               <w:jc w:val="center"/>
             </w:pPr>
-            <w:hyperlink w:history="1" r:id="rIdb-8z2zjaq1cxyasjioa3g">
+            <w:hyperlink w:history="1" r:id="rIdehjv7pd5hfuwfgibxhjp4">
               <w:r>
                 <w:rPr>
                   <w:rStyle w:val="Hyperlink"/>
@@ -10176,7 +10533,7 @@
                           </pic:cNvPicPr>
                         </pic:nvPicPr>
                         <pic:blipFill>
-                          <a:blip r:embed="rId28" cstate="none"/>
+                          <a:blip r:embed="rId31" cstate="none"/>
                           <a:srcRect/>
                           <a:stretch>
                             <a:fillRect/>
@@ -10220,7 +10577,7 @@
               <w:spacing w:after="80"/>
               <w:jc w:val="center"/>
             </w:pPr>
-            <w:hyperlink w:history="1" r:id="rIdgim_jmbg8kgtakh0lxbpm">
+            <w:hyperlink w:history="1" r:id="rIdibk6kautxlbnxx9jrnhmf">
               <w:r>
                 <w:rPr>
                   <w:rStyle w:val="Hyperlink"/>
@@ -10276,7 +10633,7 @@
                           </pic:cNvPicPr>
                         </pic:nvPicPr>
                         <pic:blipFill>
-                          <a:blip r:embed="rId29" cstate="none"/>
+                          <a:blip r:embed="rId32" cstate="none"/>
                           <a:srcRect/>
                           <a:stretch>
                             <a:fillRect/>
@@ -10320,7 +10677,7 @@
               <w:spacing w:after="80"/>
               <w:jc w:val="center"/>
             </w:pPr>
-            <w:hyperlink w:history="1" r:id="rIdw_wimjwyjealbme-ontck">
+            <w:hyperlink w:history="1" r:id="rId5nuvus8pb-s6ee9s0rf6x">
               <w:r>
                 <w:rPr>
                   <w:rStyle w:val="Hyperlink"/>
@@ -10508,7 +10865,7 @@
                                 </pic:cNvPicPr>
                               </pic:nvPicPr>
                               <pic:blipFill>
-                                <a:blip r:embed="rId30" cstate="none"/>
+                                <a:blip r:embed="rId33" cstate="none"/>
                                 <a:srcRect/>
                                 <a:stretch>
                                   <a:fillRect/>
@@ -10620,7 +10977,7 @@
                   </w:r>
                 </w:p>
                 <w:p>
-                  <w:hyperlink w:history="1" r:id="rIdvxk-g_tlbquppa0aadhfb">
+                  <w:hyperlink w:history="1" r:id="rIdkmnfr0yahoerzdijkajrj">
                     <w:r>
                       <w:rPr>
                         <w:rStyle w:val="Hyperlink"/>
@@ -10717,7 +11074,7 @@
                                 </pic:cNvPicPr>
                               </pic:nvPicPr>
                               <pic:blipFill>
-                                <a:blip r:embed="rId31" cstate="none"/>
+                                <a:blip r:embed="rId34" cstate="none"/>
                                 <a:srcRect/>
                                 <a:stretch>
                                   <a:fillRect/>
@@ -10829,7 +11186,7 @@
                   </w:r>
                 </w:p>
                 <w:p>
-                  <w:hyperlink w:history="1" r:id="rIdaje3n3m6j0cjvuu4p2dnf">
+                  <w:hyperlink w:history="1" r:id="rIdrtcsa7u_l1aj7i-rkmduz">
                     <w:r>
                       <w:rPr>
                         <w:rStyle w:val="Hyperlink"/>
@@ -10956,7 +11313,7 @@
                                 </pic:cNvPicPr>
                               </pic:nvPicPr>
                               <pic:blipFill>
-                                <a:blip r:embed="rId32" cstate="none"/>
+                                <a:blip r:embed="rId35" cstate="none"/>
                                 <a:srcRect/>
                                 <a:stretch>
                                   <a:fillRect/>
@@ -11068,7 +11425,7 @@
                   </w:r>
                 </w:p>
                 <w:p>
-                  <w:hyperlink w:history="1" r:id="rIdner64eqbbof2yx4o3iq4w">
+                  <w:hyperlink w:history="1" r:id="rIdyglieugt-lzyi2mpxq1vp">
                     <w:r>
                       <w:rPr>
                         <w:rStyle w:val="Hyperlink"/>
@@ -11165,7 +11522,7 @@
                                 </pic:cNvPicPr>
                               </pic:nvPicPr>
                               <pic:blipFill>
-                                <a:blip r:embed="rId33" cstate="none"/>
+                                <a:blip r:embed="rId36" cstate="none"/>
                                 <a:srcRect/>
                                 <a:stretch>
                                   <a:fillRect/>
@@ -11277,7 +11634,7 @@
                   </w:r>
                 </w:p>
                 <w:p>
-                  <w:hyperlink w:history="1" r:id="rIdqennp5h-fefenrhprfm3d">
+                  <w:hyperlink w:history="1" r:id="rId-bup5dayhuj-n8ocfu5pi">
                     <w:r>
                       <w:rPr>
                         <w:rStyle w:val="Hyperlink"/>
@@ -11404,7 +11761,7 @@
                                 </pic:cNvPicPr>
                               </pic:nvPicPr>
                               <pic:blipFill>
-                                <a:blip r:embed="rId34" cstate="none"/>
+                                <a:blip r:embed="rId37" cstate="none"/>
                                 <a:srcRect/>
                                 <a:stretch>
                                   <a:fillRect/>
@@ -11516,7 +11873,7 @@
                   </w:r>
                 </w:p>
                 <w:p>
-                  <w:hyperlink w:history="1" r:id="rIdu9ofkdjpbonieapy6v6mf">
+                  <w:hyperlink w:history="1" r:id="rIdqmprxvn1ydioth2ltlppk">
                     <w:r>
                       <w:rPr>
                         <w:rStyle w:val="Hyperlink"/>
@@ -11613,7 +11970,7 @@
                                 </pic:cNvPicPr>
                               </pic:nvPicPr>
                               <pic:blipFill>
-                                <a:blip r:embed="rId35" cstate="none"/>
+                                <a:blip r:embed="rId38" cstate="none"/>
                                 <a:srcRect/>
                                 <a:stretch>
                                   <a:fillRect/>
@@ -11725,7 +12082,7 @@
                   </w:r>
                 </w:p>
                 <w:p>
-                  <w:hyperlink w:history="1" r:id="rIdypopuudier_4htc59tnkm">
+                  <w:hyperlink w:history="1" r:id="rIdxt4l0whh5iiu8gyhchltk">
                     <w:r>
                       <w:rPr>
                         <w:rStyle w:val="Hyperlink"/>
@@ -11852,7 +12209,7 @@
                                 </pic:cNvPicPr>
                               </pic:nvPicPr>
                               <pic:blipFill>
-                                <a:blip r:embed="rId36" cstate="none"/>
+                                <a:blip r:embed="rId39" cstate="none"/>
                                 <a:srcRect/>
                                 <a:stretch>
                                   <a:fillRect/>
@@ -12047,7 +12404,7 @@
                                 </pic:cNvPicPr>
                               </pic:nvPicPr>
                               <pic:blipFill>
-                                <a:blip r:embed="rId37" cstate="none"/>
+                                <a:blip r:embed="rId40" cstate="none"/>
                                 <a:srcRect/>
                                 <a:stretch>
                                   <a:fillRect/>
@@ -12159,7 +12516,7 @@
                   </w:r>
                 </w:p>
                 <w:p>
-                  <w:hyperlink w:history="1" r:id="rIdhaasse5demvxfojpbxdnn">
+                  <w:hyperlink w:history="1" r:id="rIdql-8mokxctsycaeru-6r8">
                     <w:r>
                       <w:rPr>
                         <w:rStyle w:val="Hyperlink"/>
@@ -12286,7 +12643,7 @@
                                 </pic:cNvPicPr>
                               </pic:nvPicPr>
                               <pic:blipFill>
-                                <a:blip r:embed="rId38" cstate="none"/>
+                                <a:blip r:embed="rId41" cstate="none"/>
                                 <a:srcRect/>
                                 <a:stretch>
                                   <a:fillRect/>
@@ -12398,7 +12755,7 @@
                   </w:r>
                 </w:p>
                 <w:p>
-                  <w:hyperlink w:history="1" r:id="rId62ivakloc8uonbcnyzv0k">
+                  <w:hyperlink w:history="1" r:id="rId--t0yjkcmkm9k6sdvbfb-">
                     <w:r>
                       <w:rPr>
                         <w:rStyle w:val="Hyperlink"/>
@@ -12495,7 +12852,7 @@
                                 </pic:cNvPicPr>
                               </pic:nvPicPr>
                               <pic:blipFill>
-                                <a:blip r:embed="rId39" cstate="none"/>
+                                <a:blip r:embed="rId42" cstate="none"/>
                                 <a:srcRect/>
                                 <a:stretch>
                                   <a:fillRect/>
@@ -12607,7 +12964,7 @@
                   </w:r>
                 </w:p>
                 <w:p>
-                  <w:hyperlink w:history="1" r:id="rIdx19ls3fowfpdkwmsr3mr-">
+                  <w:hyperlink w:history="1" r:id="rId1xnrunsjtmm_yjcue2xbq">
                     <w:r>
                       <w:rPr>
                         <w:rStyle w:val="Hyperlink"/>
@@ -12734,7 +13091,7 @@
                                 </pic:cNvPicPr>
                               </pic:nvPicPr>
                               <pic:blipFill>
-                                <a:blip r:embed="rId40" cstate="none"/>
+                                <a:blip r:embed="rId43" cstate="none"/>
                                 <a:srcRect/>
                                 <a:stretch>
                                   <a:fillRect/>
@@ -12846,7 +13203,7 @@
                   </w:r>
                 </w:p>
                 <w:p>
-                  <w:hyperlink w:history="1" r:id="rIdf1tfrbmzyxxzasxzr9wy5">
+                  <w:hyperlink w:history="1" r:id="rIdkw92siz9ofjfes7v_rxsr">
                     <w:r>
                       <w:rPr>
                         <w:rStyle w:val="Hyperlink"/>
@@ -12943,7 +13300,7 @@
                                 </pic:cNvPicPr>
                               </pic:nvPicPr>
                               <pic:blipFill>
-                                <a:blip r:embed="rId41" cstate="none"/>
+                                <a:blip r:embed="rId44" cstate="none"/>
                                 <a:srcRect/>
                                 <a:stretch>
                                   <a:fillRect/>
@@ -13055,7 +13412,7 @@
                   </w:r>
                 </w:p>
                 <w:p>
-                  <w:hyperlink w:history="1" r:id="rIdz3fnripmhovtuu5ml2fmi">
+                  <w:hyperlink w:history="1" r:id="rId3vwbwdgzyd4twbn29ok29">
                     <w:r>
                       <w:rPr>
                         <w:rStyle w:val="Hyperlink"/>
@@ -13182,7 +13539,7 @@
                                 </pic:cNvPicPr>
                               </pic:nvPicPr>
                               <pic:blipFill>
-                                <a:blip r:embed="rId42" cstate="none"/>
+                                <a:blip r:embed="rId45" cstate="none"/>
                                 <a:srcRect/>
                                 <a:stretch>
                                   <a:fillRect/>
@@ -13294,7 +13651,7 @@
                   </w:r>
                 </w:p>
                 <w:p>
-                  <w:hyperlink w:history="1" r:id="rIdr0kgrahc7jrm6fbftmceg">
+                  <w:hyperlink w:history="1" r:id="rIdtwrvoplvvy5zbsnygdapm">
                     <w:r>
                       <w:rPr>
                         <w:rStyle w:val="Hyperlink"/>
@@ -13391,7 +13748,7 @@
                                 </pic:cNvPicPr>
                               </pic:nvPicPr>
                               <pic:blipFill>
-                                <a:blip r:embed="rId43" cstate="none"/>
+                                <a:blip r:embed="rId46" cstate="none"/>
                                 <a:srcRect/>
                                 <a:stretch>
                                   <a:fillRect/>
@@ -13503,7 +13860,7 @@
                   </w:r>
                 </w:p>
                 <w:p>
-                  <w:hyperlink w:history="1" r:id="rId9ffkph25dwfzxnh2zlujd">
+                  <w:hyperlink w:history="1" r:id="rIdf_dkbfeldusqm1hhuuuta">
                     <w:r>
                       <w:rPr>
                         <w:rStyle w:val="Hyperlink"/>
@@ -13630,7 +13987,7 @@
                                 </pic:cNvPicPr>
                               </pic:nvPicPr>
                               <pic:blipFill>
-                                <a:blip r:embed="rId44" cstate="none"/>
+                                <a:blip r:embed="rId47" cstate="none"/>
                                 <a:srcRect/>
                                 <a:stretch>
                                   <a:fillRect/>
@@ -13767,7 +14124,7 @@
                   </w:r>
                 </w:p>
                 <w:p>
-                  <w:hyperlink w:history="1" r:id="rIduxf9rptk_1-a6_bsoztk3">
+                  <w:hyperlink w:history="1" r:id="rId75rovjgijjuudcdelhxz5">
                     <w:r>
                       <w:rPr>
                         <w:rStyle w:val="Hyperlink"/>
@@ -13864,7 +14221,7 @@
                                 </pic:cNvPicPr>
                               </pic:nvPicPr>
                               <pic:blipFill>
-                                <a:blip r:embed="rId45" cstate="none"/>
+                                <a:blip r:embed="rId48" cstate="none"/>
                                 <a:srcRect/>
                                 <a:stretch>
                                   <a:fillRect/>
@@ -14001,7 +14358,7 @@
                   </w:r>
                 </w:p>
                 <w:p>
-                  <w:hyperlink w:history="1" r:id="rIdiuivimewzo36kwfehhvdy">
+                  <w:hyperlink w:history="1" r:id="rIddy181lnevnekjp8gzoocv">
                     <w:r>
                       <w:rPr>
                         <w:rStyle w:val="Hyperlink"/>
@@ -14128,7 +14485,7 @@
                                 </pic:cNvPicPr>
                               </pic:nvPicPr>
                               <pic:blipFill>
-                                <a:blip r:embed="rId46" cstate="none"/>
+                                <a:blip r:embed="rId49" cstate="none"/>
                                 <a:srcRect/>
                                 <a:stretch>
                                   <a:fillRect/>
@@ -14240,7 +14597,7 @@
                   </w:r>
                 </w:p>
                 <w:p>
-                  <w:hyperlink w:history="1" r:id="rIde_rffpghxbrilgfvmk3ap">
+                  <w:hyperlink w:history="1" r:id="rId4tdhf_inxyrs1fytbcflz">
                     <w:r>
                       <w:rPr>
                         <w:rStyle w:val="Hyperlink"/>
@@ -14337,7 +14694,7 @@
                                 </pic:cNvPicPr>
                               </pic:nvPicPr>
                               <pic:blipFill>
-                                <a:blip r:embed="rId47" cstate="none"/>
+                                <a:blip r:embed="rId50" cstate="none"/>
                                 <a:srcRect/>
                                 <a:stretch>
                                   <a:fillRect/>
@@ -14449,7 +14806,7 @@
                   </w:r>
                 </w:p>
                 <w:p>
-                  <w:hyperlink w:history="1" r:id="rIddi88gplzqpp8jaq5kmzse">
+                  <w:hyperlink w:history="1" r:id="rId0qszncv3hmjp51lbmosjw">
                     <w:r>
                       <w:rPr>
                         <w:rStyle w:val="Hyperlink"/>
@@ -14576,7 +14933,7 @@
                                 </pic:cNvPicPr>
                               </pic:nvPicPr>
                               <pic:blipFill>
-                                <a:blip r:embed="rId48" cstate="none"/>
+                                <a:blip r:embed="rId51" cstate="none"/>
                                 <a:srcRect/>
                                 <a:stretch>
                                   <a:fillRect/>
@@ -14688,7 +15045,7 @@
                   </w:r>
                 </w:p>
                 <w:p>
-                  <w:hyperlink w:history="1" r:id="rId86oxuqy8chjsle9l81mc-">
+                  <w:hyperlink w:history="1" r:id="rIdrqz9hck0treuvt_twezqy">
                     <w:r>
                       <w:rPr>
                         <w:rStyle w:val="Hyperlink"/>
@@ -14785,7 +15142,7 @@
                                 </pic:cNvPicPr>
                               </pic:nvPicPr>
                               <pic:blipFill>
-                                <a:blip r:embed="rId49" cstate="none"/>
+                                <a:blip r:embed="rId52" cstate="none"/>
                                 <a:srcRect/>
                                 <a:stretch>
                                   <a:fillRect/>
@@ -14897,7 +15254,7 @@
                   </w:r>
                 </w:p>
                 <w:p>
-                  <w:hyperlink w:history="1" r:id="rIdk1vzeb2qg7pmfsdem3vvx">
+                  <w:hyperlink w:history="1" r:id="rId7ex3vcokklt7fwngnvcem">
                     <w:r>
                       <w:rPr>
                         <w:rStyle w:val="Hyperlink"/>
@@ -15024,7 +15381,7 @@
                                 </pic:cNvPicPr>
                               </pic:nvPicPr>
                               <pic:blipFill>
-                                <a:blip r:embed="rId50" cstate="none"/>
+                                <a:blip r:embed="rId53" cstate="none"/>
                                 <a:srcRect/>
                                 <a:stretch>
                                   <a:fillRect/>
@@ -15136,7 +15493,7 @@
                   </w:r>
                 </w:p>
                 <w:p>
-                  <w:hyperlink w:history="1" r:id="rId21jpqy_qrl2lccgf3syje">
+                  <w:hyperlink w:history="1" r:id="rIdyrkao6p2c8ug1nx5qak91">
                     <w:r>
                       <w:rPr>
                         <w:rStyle w:val="Hyperlink"/>
@@ -15233,7 +15590,7 @@
                                 </pic:cNvPicPr>
                               </pic:nvPicPr>
                               <pic:blipFill>
-                                <a:blip r:embed="rId51" cstate="none"/>
+                                <a:blip r:embed="rId54" cstate="none"/>
                                 <a:srcRect/>
                                 <a:stretch>
                                   <a:fillRect/>
@@ -15345,7 +15702,7 @@
                   </w:r>
                 </w:p>
                 <w:p>
-                  <w:hyperlink w:history="1" r:id="rIdbaeshvblukvits3nocq6r">
+                  <w:hyperlink w:history="1" r:id="rIdj2hb8djv5zoeznjsq1_rd">
                     <w:r>
                       <w:rPr>
                         <w:rStyle w:val="Hyperlink"/>
@@ -15472,7 +15829,7 @@
                                 </pic:cNvPicPr>
                               </pic:nvPicPr>
                               <pic:blipFill>
-                                <a:blip r:embed="rId52" cstate="none"/>
+                                <a:blip r:embed="rId55" cstate="none"/>
                                 <a:srcRect/>
                                 <a:stretch>
                                   <a:fillRect/>
@@ -15584,7 +15941,7 @@
                   </w:r>
                 </w:p>
                 <w:p>
-                  <w:hyperlink w:history="1" r:id="rIdbqicjhhyrul4uieefeic6">
+                  <w:hyperlink w:history="1" r:id="rId6zze6x-5k7ktmjw-drymt">
                     <w:r>
                       <w:rPr>
                         <w:rStyle w:val="Hyperlink"/>
@@ -15681,7 +16038,7 @@
                                 </pic:cNvPicPr>
                               </pic:nvPicPr>
                               <pic:blipFill>
-                                <a:blip r:embed="rId53" cstate="none"/>
+                                <a:blip r:embed="rId56" cstate="none"/>
                                 <a:srcRect/>
                                 <a:stretch>
                                   <a:fillRect/>
@@ -15818,7 +16175,7 @@
                   </w:r>
                 </w:p>
                 <w:p>
-                  <w:hyperlink w:history="1" r:id="rIdqeoh_2nb7nujpxmrv3wph">
+                  <w:hyperlink w:history="1" r:id="rIdagsikjhvv3vqa85kgjefd">
                     <w:r>
                       <w:rPr>
                         <w:rStyle w:val="Hyperlink"/>
@@ -15945,7 +16302,7 @@
                                 </pic:cNvPicPr>
                               </pic:nvPicPr>
                               <pic:blipFill>
-                                <a:blip r:embed="rId54" cstate="none"/>
+                                <a:blip r:embed="rId57" cstate="none"/>
                                 <a:srcRect/>
                                 <a:stretch>
                                   <a:fillRect/>
@@ -16082,7 +16439,7 @@
                   </w:r>
                 </w:p>
                 <w:p>
-                  <w:hyperlink w:history="1" r:id="rIdvzlkzobr0p0yb16dr_8yv">
+                  <w:hyperlink w:history="1" r:id="rIdv7g8uqdso1stanci5dsg8">
                     <w:r>
                       <w:rPr>
                         <w:rStyle w:val="Hyperlink"/>
@@ -16179,7 +16536,7 @@
                                 </pic:cNvPicPr>
                               </pic:nvPicPr>
                               <pic:blipFill>
-                                <a:blip r:embed="rId55" cstate="none"/>
+                                <a:blip r:embed="rId58" cstate="none"/>
                                 <a:srcRect/>
                                 <a:stretch>
                                   <a:fillRect/>
@@ -16291,7 +16648,7 @@
                   </w:r>
                 </w:p>
                 <w:p>
-                  <w:hyperlink w:history="1" r:id="rIdwgihnxsmxydjfk1p9exlv">
+                  <w:hyperlink w:history="1" r:id="rIdaoghxda6rakoxtf9sc6x8">
                     <w:r>
                       <w:rPr>
                         <w:rStyle w:val="Hyperlink"/>
@@ -16418,7 +16775,7 @@
                                 </pic:cNvPicPr>
                               </pic:nvPicPr>
                               <pic:blipFill>
-                                <a:blip r:embed="rId56" cstate="none"/>
+                                <a:blip r:embed="rId59" cstate="none"/>
                                 <a:srcRect/>
                                 <a:stretch>
                                   <a:fillRect/>
@@ -16530,7 +16887,7 @@
                   </w:r>
                 </w:p>
                 <w:p>
-                  <w:hyperlink w:history="1" r:id="rId6wcdplzplq5mux00dchv5">
+                  <w:hyperlink w:history="1" r:id="rIdvgyn3p3wzrakearzdvbue">
                     <w:r>
                       <w:rPr>
                         <w:rStyle w:val="Hyperlink"/>
@@ -16627,7 +16984,7 @@
                                 </pic:cNvPicPr>
                               </pic:nvPicPr>
                               <pic:blipFill>
-                                <a:blip r:embed="rId57" cstate="none"/>
+                                <a:blip r:embed="rId60" cstate="none"/>
                                 <a:srcRect/>
                                 <a:stretch>
                                   <a:fillRect/>
@@ -16739,7 +17096,7 @@
                   </w:r>
                 </w:p>
                 <w:p>
-                  <w:hyperlink w:history="1" r:id="rId6nzfffu_eza3432ob3x__">
+                  <w:hyperlink w:history="1" r:id="rIdml3kg2vk-8afbhvy-tmje">
                     <w:r>
                       <w:rPr>
                         <w:rStyle w:val="Hyperlink"/>
@@ -16866,7 +17223,7 @@
                                 </pic:cNvPicPr>
                               </pic:nvPicPr>
                               <pic:blipFill>
-                                <a:blip r:embed="rId58" cstate="none"/>
+                                <a:blip r:embed="rId61" cstate="none"/>
                                 <a:srcRect/>
                                 <a:stretch>
                                   <a:fillRect/>
@@ -16978,7 +17335,7 @@
                   </w:r>
                 </w:p>
                 <w:p>
-                  <w:hyperlink w:history="1" r:id="rIdm1vi4cumjmtqakur3afx2">
+                  <w:hyperlink w:history="1" r:id="rId7ix7fxxxod_bgpa2iu35e">
                     <w:r>
                       <w:rPr>
                         <w:rStyle w:val="Hyperlink"/>
@@ -17075,7 +17432,7 @@
                                 </pic:cNvPicPr>
                               </pic:nvPicPr>
                               <pic:blipFill>
-                                <a:blip r:embed="rId59" cstate="none"/>
+                                <a:blip r:embed="rId62" cstate="none"/>
                                 <a:srcRect/>
                                 <a:stretch>
                                   <a:fillRect/>
@@ -17187,7 +17544,7 @@
                   </w:r>
                 </w:p>
                 <w:p>
-                  <w:hyperlink w:history="1" r:id="rId5vdoigs_mywmi1ar8axjo">
+                  <w:hyperlink w:history="1" r:id="rIdkddjhsna_vem_usxdrvuf">
                     <w:r>
                       <w:rPr>
                         <w:rStyle w:val="Hyperlink"/>
@@ -17314,7 +17671,7 @@
                                 </pic:cNvPicPr>
                               </pic:nvPicPr>
                               <pic:blipFill>
-                                <a:blip r:embed="rId60" cstate="none"/>
+                                <a:blip r:embed="rId63" cstate="none"/>
                                 <a:srcRect/>
                                 <a:stretch>
                                   <a:fillRect/>
@@ -17426,7 +17783,7 @@
                   </w:r>
                 </w:p>
                 <w:p>
-                  <w:hyperlink w:history="1" r:id="rIdf4jsmnjrzobxw5mbfakhg">
+                  <w:hyperlink w:history="1" r:id="rIdccba1y5vqwoxecys-apa1">
                     <w:r>
                       <w:rPr>
                         <w:rStyle w:val="Hyperlink"/>
@@ -17523,7 +17880,7 @@
                                 </pic:cNvPicPr>
                               </pic:nvPicPr>
                               <pic:blipFill>
-                                <a:blip r:embed="rId61" cstate="none"/>
+                                <a:blip r:embed="rId64" cstate="none"/>
                                 <a:srcRect/>
                                 <a:stretch>
                                   <a:fillRect/>
@@ -17635,7 +17992,7 @@
                   </w:r>
                 </w:p>
                 <w:p>
-                  <w:hyperlink w:history="1" r:id="rIdbwveoy6pce2bs9o5frhcy">
+                  <w:hyperlink w:history="1" r:id="rIdwkknfd3l0-4mchj_qvzs7">
                     <w:r>
                       <w:rPr>
                         <w:rStyle w:val="Hyperlink"/>
@@ -17762,7 +18119,7 @@
                                 </pic:cNvPicPr>
                               </pic:nvPicPr>
                               <pic:blipFill>
-                                <a:blip r:embed="rId62" cstate="none"/>
+                                <a:blip r:embed="rId65" cstate="none"/>
                                 <a:srcRect/>
                                 <a:stretch>
                                   <a:fillRect/>
@@ -17874,7 +18231,7 @@
                   </w:r>
                 </w:p>
                 <w:p>
-                  <w:hyperlink w:history="1" r:id="rIdaz3aqcotbrqvfad3einfx">
+                  <w:hyperlink w:history="1" r:id="rId5u2afxlcoov0k_3qwb5zs">
                     <w:r>
                       <w:rPr>
                         <w:rStyle w:val="Hyperlink"/>
@@ -17971,7 +18328,7 @@
                                 </pic:cNvPicPr>
                               </pic:nvPicPr>
                               <pic:blipFill>
-                                <a:blip r:embed="rId63" cstate="none"/>
+                                <a:blip r:embed="rId66" cstate="none"/>
                                 <a:srcRect/>
                                 <a:stretch>
                                   <a:fillRect/>
@@ -18083,7 +18440,7 @@
                   </w:r>
                 </w:p>
                 <w:p>
-                  <w:hyperlink w:history="1" r:id="rId--y9cb9v2tzx0mxubzqhj">
+                  <w:hyperlink w:history="1" r:id="rId5ohssmvwana5aovecxcws">
                     <w:r>
                       <w:rPr>
                         <w:rStyle w:val="Hyperlink"/>
@@ -18210,7 +18567,7 @@
                                 </pic:cNvPicPr>
                               </pic:nvPicPr>
                               <pic:blipFill>
-                                <a:blip r:embed="rId64" cstate="none"/>
+                                <a:blip r:embed="rId67" cstate="none"/>
                                 <a:srcRect/>
                                 <a:stretch>
                                   <a:fillRect/>
@@ -18322,7 +18679,7 @@
                   </w:r>
                 </w:p>
                 <w:p>
-                  <w:hyperlink w:history="1" r:id="rIdqnk2oflwb70p5lunyqqns">
+                  <w:hyperlink w:history="1" r:id="rIdqymkqe8wgdgb9ey_xthoc">
                     <w:r>
                       <w:rPr>
                         <w:rStyle w:val="Hyperlink"/>
@@ -18419,7 +18776,7 @@
                                 </pic:cNvPicPr>
                               </pic:nvPicPr>
                               <pic:blipFill>
-                                <a:blip r:embed="rId65" cstate="none"/>
+                                <a:blip r:embed="rId68" cstate="none"/>
                                 <a:srcRect/>
                                 <a:stretch>
                                   <a:fillRect/>
@@ -18556,7 +18913,7 @@
                   </w:r>
                 </w:p>
                 <w:p>
-                  <w:hyperlink w:history="1" r:id="rIdweuhj2lahdzwpiv4key0u">
+                  <w:hyperlink w:history="1" r:id="rIdi0l6vxefhp5wozrvgdm4a">
                     <w:r>
                       <w:rPr>
                         <w:rStyle w:val="Hyperlink"/>
@@ -18683,7 +19040,7 @@
                                 </pic:cNvPicPr>
                               </pic:nvPicPr>
                               <pic:blipFill>
-                                <a:blip r:embed="rId66" cstate="none"/>
+                                <a:blip r:embed="rId69" cstate="none"/>
                                 <a:srcRect/>
                                 <a:stretch>
                                   <a:fillRect/>
@@ -18795,7 +19152,7 @@
                   </w:r>
                 </w:p>
                 <w:p>
-                  <w:hyperlink w:history="1" r:id="rIdplol-qvtzzghgcs5lsugd">
+                  <w:hyperlink w:history="1" r:id="rIdehoaxfvmn439pr9ihfw6p">
                     <w:r>
                       <w:rPr>
                         <w:rStyle w:val="Hyperlink"/>
@@ -18892,7 +19249,7 @@
                                 </pic:cNvPicPr>
                               </pic:nvPicPr>
                               <pic:blipFill>
-                                <a:blip r:embed="rId67" cstate="none"/>
+                                <a:blip r:embed="rId70" cstate="none"/>
                                 <a:srcRect/>
                                 <a:stretch>
                                   <a:fillRect/>
@@ -19004,7 +19361,7 @@
                   </w:r>
                 </w:p>
                 <w:p>
-                  <w:hyperlink w:history="1" r:id="rIdbxzppbjg_udmg7juifb8n">
+                  <w:hyperlink w:history="1" r:id="rId0cx7xr3lsncz3qe0aqmsc">
                     <w:r>
                       <w:rPr>
                         <w:rStyle w:val="Hyperlink"/>
@@ -19131,7 +19488,7 @@
                                 </pic:cNvPicPr>
                               </pic:nvPicPr>
                               <pic:blipFill>
-                                <a:blip r:embed="rId68" cstate="none"/>
+                                <a:blip r:embed="rId71" cstate="none"/>
                                 <a:srcRect/>
                                 <a:stretch>
                                   <a:fillRect/>
@@ -19243,7 +19600,7 @@
                   </w:r>
                 </w:p>
                 <w:p>
-                  <w:hyperlink w:history="1" r:id="rIdxfygg8jtalltfj5_k6hpq">
+                  <w:hyperlink w:history="1" r:id="rIdfs1c8k0sxplqkdxadctwi">
                     <w:r>
                       <w:rPr>
                         <w:rStyle w:val="Hyperlink"/>
@@ -19340,7 +19697,7 @@
                                 </pic:cNvPicPr>
                               </pic:nvPicPr>
                               <pic:blipFill>
-                                <a:blip r:embed="rId69" cstate="none"/>
+                                <a:blip r:embed="rId72" cstate="none"/>
                                 <a:srcRect/>
                                 <a:stretch>
                                   <a:fillRect/>
@@ -19452,7 +19809,7 @@
                   </w:r>
                 </w:p>
                 <w:p>
-                  <w:hyperlink w:history="1" r:id="rIdpr_hxkidn_mlmtbbzmhnc">
+                  <w:hyperlink w:history="1" r:id="rIdhchfp8kos-m-woohnbigw">
                     <w:r>
                       <w:rPr>
                         <w:rStyle w:val="Hyperlink"/>

</xml_diff>

<commit_message>
workbook: widen gap between speaker photo and bio (+0.5")
</commit_message>
<xml_diff>
--- a/deliverables/workbook/Workbook.docx
+++ b/deliverables/workbook/Workbook.docx
@@ -5347,7 +5347,7 @@
               <w:top w:type="dxa" w:w="0"/>
               <w:left w:type="dxa" w:w="0"/>
               <w:bottom w:type="dxa" w:w="0"/>
-              <w:right w:type="dxa" w:w="240"/>
+              <w:right w:type="dxa" w:w="480"/>
             </w:tcMar>
             <w:vAlign w:val="top"/>
           </w:tcPr>
@@ -5409,7 +5409,7 @@
             </w:tcBorders>
             <w:tcMar>
               <w:top w:type="dxa" w:w="0"/>
-              <w:left w:type="dxa" w:w="0"/>
+              <w:left w:type="dxa" w:w="240"/>
               <w:bottom w:type="dxa" w:w="0"/>
               <w:right w:type="dxa" w:w="0"/>
             </w:tcMar>
@@ -6329,7 +6329,7 @@
               <w:top w:type="dxa" w:w="0"/>
               <w:left w:type="dxa" w:w="0"/>
               <w:bottom w:type="dxa" w:w="0"/>
-              <w:right w:type="dxa" w:w="240"/>
+              <w:right w:type="dxa" w:w="480"/>
             </w:tcMar>
             <w:vAlign w:val="top"/>
           </w:tcPr>
@@ -6391,7 +6391,7 @@
             </w:tcBorders>
             <w:tcMar>
               <w:top w:type="dxa" w:w="0"/>
-              <w:left w:type="dxa" w:w="0"/>
+              <w:left w:type="dxa" w:w="240"/>
               <w:bottom w:type="dxa" w:w="0"/>
               <w:right w:type="dxa" w:w="0"/>
             </w:tcMar>
@@ -7311,7 +7311,7 @@
               <w:top w:type="dxa" w:w="0"/>
               <w:left w:type="dxa" w:w="0"/>
               <w:bottom w:type="dxa" w:w="0"/>
-              <w:right w:type="dxa" w:w="240"/>
+              <w:right w:type="dxa" w:w="480"/>
             </w:tcMar>
             <w:vAlign w:val="top"/>
           </w:tcPr>
@@ -7373,7 +7373,7 @@
             </w:tcBorders>
             <w:tcMar>
               <w:top w:type="dxa" w:w="0"/>
-              <w:left w:type="dxa" w:w="0"/>
+              <w:left w:type="dxa" w:w="240"/>
               <w:bottom w:type="dxa" w:w="0"/>
               <w:right w:type="dxa" w:w="0"/>
             </w:tcMar>
@@ -8860,7 +8860,7 @@
               <w:spacing w:after="80"/>
               <w:jc w:val="center"/>
             </w:pPr>
-            <w:hyperlink w:history="1" r:id="rIdiilm1lfnxpgzr1k64uv1_">
+            <w:hyperlink w:history="1" r:id="rIdyqazzzffg6hsqqcq6jtz5">
               <w:r>
                 <w:rPr>
                   <w:rStyle w:val="Hyperlink"/>
@@ -8960,7 +8960,7 @@
               <w:spacing w:after="80"/>
               <w:jc w:val="center"/>
             </w:pPr>
-            <w:hyperlink w:history="1" r:id="rId6b-8jqhtbttamblgdu-6a">
+            <w:hyperlink w:history="1" r:id="rIdgtyu-mtbllmfqgsa007dk">
               <w:r>
                 <w:rPr>
                   <w:rStyle w:val="Hyperlink"/>
@@ -9117,7 +9117,7 @@
               <w:spacing w:after="80"/>
               <w:jc w:val="center"/>
             </w:pPr>
-            <w:hyperlink w:history="1" r:id="rIdpqg_5d67fnz9wk0m3r7q6">
+            <w:hyperlink w:history="1" r:id="rIdyc8e6cbsxxjmcljjswrwt">
               <w:r>
                 <w:rPr>
                   <w:rStyle w:val="Hyperlink"/>
@@ -9217,7 +9217,7 @@
               <w:spacing w:after="80"/>
               <w:jc w:val="center"/>
             </w:pPr>
-            <w:hyperlink w:history="1" r:id="rIdsoe0usjbc2rlugpdp6bdh">
+            <w:hyperlink w:history="1" r:id="rIdthiaxnpadg2jrildmmsc4">
               <w:r>
                 <w:rPr>
                   <w:rStyle w:val="Hyperlink"/>
@@ -9373,7 +9373,7 @@
               <w:spacing w:after="80"/>
               <w:jc w:val="center"/>
             </w:pPr>
-            <w:hyperlink w:history="1" r:id="rIdys4qqwco2ulmxst4osrr1">
+            <w:hyperlink w:history="1" r:id="rIdbonii0nfluejllywdt43k">
               <w:r>
                 <w:rPr>
                   <w:rStyle w:val="Hyperlink"/>
@@ -9529,7 +9529,7 @@
               <w:spacing w:after="80"/>
               <w:jc w:val="center"/>
             </w:pPr>
-            <w:hyperlink w:history="1" r:id="rId-xt1bpz-a9nkocncimpn8">
+            <w:hyperlink w:history="1" r:id="rIdkmuuab5va1qxtqoepefh-">
               <w:r>
                 <w:rPr>
                   <w:rStyle w:val="Hyperlink"/>
@@ -9686,7 +9686,7 @@
               <w:spacing w:after="80"/>
               <w:jc w:val="center"/>
             </w:pPr>
-            <w:hyperlink w:history="1" r:id="rIdqkgzktna49q_sxccmrjmg">
+            <w:hyperlink w:history="1" r:id="rIdz8x7tk2dejlejslbzqq0u">
               <w:r>
                 <w:rPr>
                   <w:rStyle w:val="Hyperlink"/>
@@ -9786,7 +9786,7 @@
               <w:spacing w:after="80"/>
               <w:jc w:val="center"/>
             </w:pPr>
-            <w:hyperlink w:history="1" r:id="rIdcapgn86sbeypon5iaqdxo">
+            <w:hyperlink w:history="1" r:id="rIdn9suuhhsx4itldfgu6ff0">
               <w:r>
                 <w:rPr>
                   <w:rStyle w:val="Hyperlink"/>
@@ -9945,7 +9945,7 @@
               <w:spacing w:after="80"/>
               <w:jc w:val="center"/>
             </w:pPr>
-            <w:hyperlink w:history="1" r:id="rIdwq2sqywd1w-xaprrreupv">
+            <w:hyperlink w:history="1" r:id="rIdsxngngn6tnvuukpwqulkv">
               <w:r>
                 <w:rPr>
                   <w:rStyle w:val="Hyperlink"/>
@@ -10045,7 +10045,7 @@
               <w:spacing w:after="80"/>
               <w:jc w:val="center"/>
             </w:pPr>
-            <w:hyperlink w:history="1" r:id="rIddt886yt_sgxq7g5mjokyt">
+            <w:hyperlink w:history="1" r:id="rId9m_5lpaatci__bfddpodz">
               <w:r>
                 <w:rPr>
                   <w:rStyle w:val="Hyperlink"/>
@@ -10145,7 +10145,7 @@
               <w:spacing w:after="80"/>
               <w:jc w:val="center"/>
             </w:pPr>
-            <w:hyperlink w:history="1" r:id="rIdtoocg5-l-yhqdfincssle">
+            <w:hyperlink w:history="1" r:id="rId5x9xzhf1g3pj_20hlxohz">
               <w:r>
                 <w:rPr>
                   <w:rStyle w:val="Hyperlink"/>
@@ -10245,7 +10245,7 @@
               <w:spacing w:after="80"/>
               <w:jc w:val="center"/>
             </w:pPr>
-            <w:hyperlink w:history="1" r:id="rIdwn5clvig5pq7f30sbanfh">
+            <w:hyperlink w:history="1" r:id="rId9hk2xe2383tzhjik272kv">
               <w:r>
                 <w:rPr>
                   <w:rStyle w:val="Hyperlink"/>
@@ -10377,7 +10377,7 @@
               <w:spacing w:after="80"/>
               <w:jc w:val="center"/>
             </w:pPr>
-            <w:hyperlink w:history="1" r:id="rIdeyw4tttuqnzagekant4er">
+            <w:hyperlink w:history="1" r:id="rIdthvvzlxrgwrw-yfheh_k_">
               <w:r>
                 <w:rPr>
                   <w:rStyle w:val="Hyperlink"/>
@@ -10477,7 +10477,7 @@
               <w:spacing w:after="80"/>
               <w:jc w:val="center"/>
             </w:pPr>
-            <w:hyperlink w:history="1" r:id="rIdehjv7pd5hfuwfgibxhjp4">
+            <w:hyperlink w:history="1" r:id="rIdcyv_reoi33y8xbn21qkq8">
               <w:r>
                 <w:rPr>
                   <w:rStyle w:val="Hyperlink"/>
@@ -10577,7 +10577,7 @@
               <w:spacing w:after="80"/>
               <w:jc w:val="center"/>
             </w:pPr>
-            <w:hyperlink w:history="1" r:id="rIdibk6kautxlbnxx9jrnhmf">
+            <w:hyperlink w:history="1" r:id="rIdvqrqg4s2fuz1fh3gogjro">
               <w:r>
                 <w:rPr>
                   <w:rStyle w:val="Hyperlink"/>
@@ -10677,7 +10677,7 @@
               <w:spacing w:after="80"/>
               <w:jc w:val="center"/>
             </w:pPr>
-            <w:hyperlink w:history="1" r:id="rId5nuvus8pb-s6ee9s0rf6x">
+            <w:hyperlink w:history="1" r:id="rIdua4oe_08pvwqklbj-f0xd">
               <w:r>
                 <w:rPr>
                   <w:rStyle w:val="Hyperlink"/>
@@ -10977,7 +10977,7 @@
                   </w:r>
                 </w:p>
                 <w:p>
-                  <w:hyperlink w:history="1" r:id="rIdkmnfr0yahoerzdijkajrj">
+                  <w:hyperlink w:history="1" r:id="rIdfitq1tinvvjbju9-lwxrp">
                     <w:r>
                       <w:rPr>
                         <w:rStyle w:val="Hyperlink"/>
@@ -11186,7 +11186,7 @@
                   </w:r>
                 </w:p>
                 <w:p>
-                  <w:hyperlink w:history="1" r:id="rIdrtcsa7u_l1aj7i-rkmduz">
+                  <w:hyperlink w:history="1" r:id="rIdiuchm6toisz9c9-t5b3h9">
                     <w:r>
                       <w:rPr>
                         <w:rStyle w:val="Hyperlink"/>
@@ -11425,7 +11425,7 @@
                   </w:r>
                 </w:p>
                 <w:p>
-                  <w:hyperlink w:history="1" r:id="rIdyglieugt-lzyi2mpxq1vp">
+                  <w:hyperlink w:history="1" r:id="rIdwvu4ghae_gptdgiyn6far">
                     <w:r>
                       <w:rPr>
                         <w:rStyle w:val="Hyperlink"/>
@@ -11634,7 +11634,7 @@
                   </w:r>
                 </w:p>
                 <w:p>
-                  <w:hyperlink w:history="1" r:id="rId-bup5dayhuj-n8ocfu5pi">
+                  <w:hyperlink w:history="1" r:id="rId301bnleyudubs8v7kz5cc">
                     <w:r>
                       <w:rPr>
                         <w:rStyle w:val="Hyperlink"/>
@@ -11873,7 +11873,7 @@
                   </w:r>
                 </w:p>
                 <w:p>
-                  <w:hyperlink w:history="1" r:id="rIdqmprxvn1ydioth2ltlppk">
+                  <w:hyperlink w:history="1" r:id="rIdqtchd44mgqbr9pjer1lbo">
                     <w:r>
                       <w:rPr>
                         <w:rStyle w:val="Hyperlink"/>
@@ -12082,7 +12082,7 @@
                   </w:r>
                 </w:p>
                 <w:p>
-                  <w:hyperlink w:history="1" r:id="rIdxt4l0whh5iiu8gyhchltk">
+                  <w:hyperlink w:history="1" r:id="rId4txzd-_og5uewoxezzf8d">
                     <w:r>
                       <w:rPr>
                         <w:rStyle w:val="Hyperlink"/>
@@ -12516,7 +12516,7 @@
                   </w:r>
                 </w:p>
                 <w:p>
-                  <w:hyperlink w:history="1" r:id="rIdql-8mokxctsycaeru-6r8">
+                  <w:hyperlink w:history="1" r:id="rIdtzii6uilrznhlw4zgzsih">
                     <w:r>
                       <w:rPr>
                         <w:rStyle w:val="Hyperlink"/>
@@ -12755,7 +12755,7 @@
                   </w:r>
                 </w:p>
                 <w:p>
-                  <w:hyperlink w:history="1" r:id="rId--t0yjkcmkm9k6sdvbfb-">
+                  <w:hyperlink w:history="1" r:id="rIdgjpsuwdqhsq2u8n9cjq4x">
                     <w:r>
                       <w:rPr>
                         <w:rStyle w:val="Hyperlink"/>
@@ -12964,7 +12964,7 @@
                   </w:r>
                 </w:p>
                 <w:p>
-                  <w:hyperlink w:history="1" r:id="rId1xnrunsjtmm_yjcue2xbq">
+                  <w:hyperlink w:history="1" r:id="rIdy2qwtaxqhfjehsehlbhcm">
                     <w:r>
                       <w:rPr>
                         <w:rStyle w:val="Hyperlink"/>
@@ -13203,7 +13203,7 @@
                   </w:r>
                 </w:p>
                 <w:p>
-                  <w:hyperlink w:history="1" r:id="rIdkw92siz9ofjfes7v_rxsr">
+                  <w:hyperlink w:history="1" r:id="rIdmc4eupnqm2ni5zdrgrtps">
                     <w:r>
                       <w:rPr>
                         <w:rStyle w:val="Hyperlink"/>
@@ -13412,7 +13412,7 @@
                   </w:r>
                 </w:p>
                 <w:p>
-                  <w:hyperlink w:history="1" r:id="rId3vwbwdgzyd4twbn29ok29">
+                  <w:hyperlink w:history="1" r:id="rId1u_-qwqcgdih-zm5yiwt8">
                     <w:r>
                       <w:rPr>
                         <w:rStyle w:val="Hyperlink"/>
@@ -13651,7 +13651,7 @@
                   </w:r>
                 </w:p>
                 <w:p>
-                  <w:hyperlink w:history="1" r:id="rIdtwrvoplvvy5zbsnygdapm">
+                  <w:hyperlink w:history="1" r:id="rIdyafgztxxad2rfdai_vagw">
                     <w:r>
                       <w:rPr>
                         <w:rStyle w:val="Hyperlink"/>
@@ -13860,7 +13860,7 @@
                   </w:r>
                 </w:p>
                 <w:p>
-                  <w:hyperlink w:history="1" r:id="rIdf_dkbfeldusqm1hhuuuta">
+                  <w:hyperlink w:history="1" r:id="rIdrzdsghn75ymufeh-eqq_k">
                     <w:r>
                       <w:rPr>
                         <w:rStyle w:val="Hyperlink"/>
@@ -14124,7 +14124,7 @@
                   </w:r>
                 </w:p>
                 <w:p>
-                  <w:hyperlink w:history="1" r:id="rId75rovjgijjuudcdelhxz5">
+                  <w:hyperlink w:history="1" r:id="rIdcyyi1wxhblkewwt54zkvt">
                     <w:r>
                       <w:rPr>
                         <w:rStyle w:val="Hyperlink"/>
@@ -14358,7 +14358,7 @@
                   </w:r>
                 </w:p>
                 <w:p>
-                  <w:hyperlink w:history="1" r:id="rIddy181lnevnekjp8gzoocv">
+                  <w:hyperlink w:history="1" r:id="rIdwjmm7siaujo7qpsznpegu">
                     <w:r>
                       <w:rPr>
                         <w:rStyle w:val="Hyperlink"/>
@@ -14597,7 +14597,7 @@
                   </w:r>
                 </w:p>
                 <w:p>
-                  <w:hyperlink w:history="1" r:id="rId4tdhf_inxyrs1fytbcflz">
+                  <w:hyperlink w:history="1" r:id="rIdjplnseiuewbzf0l8a6h2d">
                     <w:r>
                       <w:rPr>
                         <w:rStyle w:val="Hyperlink"/>
@@ -14806,7 +14806,7 @@
                   </w:r>
                 </w:p>
                 <w:p>
-                  <w:hyperlink w:history="1" r:id="rId0qszncv3hmjp51lbmosjw">
+                  <w:hyperlink w:history="1" r:id="rIda1c9-mqx7b6zggtkpjwuv">
                     <w:r>
                       <w:rPr>
                         <w:rStyle w:val="Hyperlink"/>
@@ -15045,7 +15045,7 @@
                   </w:r>
                 </w:p>
                 <w:p>
-                  <w:hyperlink w:history="1" r:id="rIdrqz9hck0treuvt_twezqy">
+                  <w:hyperlink w:history="1" r:id="rIdybmiwhdxrb8j3cx5cqilt">
                     <w:r>
                       <w:rPr>
                         <w:rStyle w:val="Hyperlink"/>
@@ -15254,7 +15254,7 @@
                   </w:r>
                 </w:p>
                 <w:p>
-                  <w:hyperlink w:history="1" r:id="rId7ex3vcokklt7fwngnvcem">
+                  <w:hyperlink w:history="1" r:id="rIdit5hxsreqjgyikael2pak">
                     <w:r>
                       <w:rPr>
                         <w:rStyle w:val="Hyperlink"/>
@@ -15493,7 +15493,7 @@
                   </w:r>
                 </w:p>
                 <w:p>
-                  <w:hyperlink w:history="1" r:id="rIdyrkao6p2c8ug1nx5qak91">
+                  <w:hyperlink w:history="1" r:id="rIddk6duehpnc0whv44lmn5h">
                     <w:r>
                       <w:rPr>
                         <w:rStyle w:val="Hyperlink"/>
@@ -15702,7 +15702,7 @@
                   </w:r>
                 </w:p>
                 <w:p>
-                  <w:hyperlink w:history="1" r:id="rIdj2hb8djv5zoeznjsq1_rd">
+                  <w:hyperlink w:history="1" r:id="rIdtb-o3nxzyv5xnqttkt5ar">
                     <w:r>
                       <w:rPr>
                         <w:rStyle w:val="Hyperlink"/>
@@ -15941,7 +15941,7 @@
                   </w:r>
                 </w:p>
                 <w:p>
-                  <w:hyperlink w:history="1" r:id="rId6zze6x-5k7ktmjw-drymt">
+                  <w:hyperlink w:history="1" r:id="rIdfkdvfl0zb-wdt880fzdve">
                     <w:r>
                       <w:rPr>
                         <w:rStyle w:val="Hyperlink"/>
@@ -16175,7 +16175,7 @@
                   </w:r>
                 </w:p>
                 <w:p>
-                  <w:hyperlink w:history="1" r:id="rIdagsikjhvv3vqa85kgjefd">
+                  <w:hyperlink w:history="1" r:id="rId9gkvzqjewy76olmytjcmk">
                     <w:r>
                       <w:rPr>
                         <w:rStyle w:val="Hyperlink"/>
@@ -16439,7 +16439,7 @@
                   </w:r>
                 </w:p>
                 <w:p>
-                  <w:hyperlink w:history="1" r:id="rIdv7g8uqdso1stanci5dsg8">
+                  <w:hyperlink w:history="1" r:id="rIdff6xlcfkoszp3-o1nm_19">
                     <w:r>
                       <w:rPr>
                         <w:rStyle w:val="Hyperlink"/>
@@ -16648,7 +16648,7 @@
                   </w:r>
                 </w:p>
                 <w:p>
-                  <w:hyperlink w:history="1" r:id="rIdaoghxda6rakoxtf9sc6x8">
+                  <w:hyperlink w:history="1" r:id="rIdgh-3oepvh1yncpjauchib">
                     <w:r>
                       <w:rPr>
                         <w:rStyle w:val="Hyperlink"/>
@@ -16887,7 +16887,7 @@
                   </w:r>
                 </w:p>
                 <w:p>
-                  <w:hyperlink w:history="1" r:id="rIdvgyn3p3wzrakearzdvbue">
+                  <w:hyperlink w:history="1" r:id="rIdobajit0q3mxob1jm21ie8">
                     <w:r>
                       <w:rPr>
                         <w:rStyle w:val="Hyperlink"/>
@@ -17096,7 +17096,7 @@
                   </w:r>
                 </w:p>
                 <w:p>
-                  <w:hyperlink w:history="1" r:id="rIdml3kg2vk-8afbhvy-tmje">
+                  <w:hyperlink w:history="1" r:id="rId_hyopajohfccwhmoc0vbq">
                     <w:r>
                       <w:rPr>
                         <w:rStyle w:val="Hyperlink"/>
@@ -17335,7 +17335,7 @@
                   </w:r>
                 </w:p>
                 <w:p>
-                  <w:hyperlink w:history="1" r:id="rId7ix7fxxxod_bgpa2iu35e">
+                  <w:hyperlink w:history="1" r:id="rIdgqwskxdvidswydov4ipre">
                     <w:r>
                       <w:rPr>
                         <w:rStyle w:val="Hyperlink"/>
@@ -17544,7 +17544,7 @@
                   </w:r>
                 </w:p>
                 <w:p>
-                  <w:hyperlink w:history="1" r:id="rIdkddjhsna_vem_usxdrvuf">
+                  <w:hyperlink w:history="1" r:id="rId_hmjsgcbnmmzkzd_97a3y">
                     <w:r>
                       <w:rPr>
                         <w:rStyle w:val="Hyperlink"/>
@@ -17783,7 +17783,7 @@
                   </w:r>
                 </w:p>
                 <w:p>
-                  <w:hyperlink w:history="1" r:id="rIdccba1y5vqwoxecys-apa1">
+                  <w:hyperlink w:history="1" r:id="rIdaqlbfkxnauaceb4qvg-w_">
                     <w:r>
                       <w:rPr>
                         <w:rStyle w:val="Hyperlink"/>
@@ -17992,7 +17992,7 @@
                   </w:r>
                 </w:p>
                 <w:p>
-                  <w:hyperlink w:history="1" r:id="rIdwkknfd3l0-4mchj_qvzs7">
+                  <w:hyperlink w:history="1" r:id="rIdcbw41giqdwva2h7tekbwi">
                     <w:r>
                       <w:rPr>
                         <w:rStyle w:val="Hyperlink"/>
@@ -18231,7 +18231,7 @@
                   </w:r>
                 </w:p>
                 <w:p>
-                  <w:hyperlink w:history="1" r:id="rId5u2afxlcoov0k_3qwb5zs">
+                  <w:hyperlink w:history="1" r:id="rIdijhy041idfzp8ppihiiet">
                     <w:r>
                       <w:rPr>
                         <w:rStyle w:val="Hyperlink"/>
@@ -18440,7 +18440,7 @@
                   </w:r>
                 </w:p>
                 <w:p>
-                  <w:hyperlink w:history="1" r:id="rId5ohssmvwana5aovecxcws">
+                  <w:hyperlink w:history="1" r:id="rIdmrerz260ajmkdmzbthgjx">
                     <w:r>
                       <w:rPr>
                         <w:rStyle w:val="Hyperlink"/>
@@ -18679,7 +18679,7 @@
                   </w:r>
                 </w:p>
                 <w:p>
-                  <w:hyperlink w:history="1" r:id="rIdqymkqe8wgdgb9ey_xthoc">
+                  <w:hyperlink w:history="1" r:id="rIdadut_htnipn13w2nbxpua">
                     <w:r>
                       <w:rPr>
                         <w:rStyle w:val="Hyperlink"/>
@@ -18913,7 +18913,7 @@
                   </w:r>
                 </w:p>
                 <w:p>
-                  <w:hyperlink w:history="1" r:id="rIdi0l6vxefhp5wozrvgdm4a">
+                  <w:hyperlink w:history="1" r:id="rIdihxlbs4txjvxov8q-lpwo">
                     <w:r>
                       <w:rPr>
                         <w:rStyle w:val="Hyperlink"/>
@@ -19152,7 +19152,7 @@
                   </w:r>
                 </w:p>
                 <w:p>
-                  <w:hyperlink w:history="1" r:id="rIdehoaxfvmn439pr9ihfw6p">
+                  <w:hyperlink w:history="1" r:id="rIdhqhjydwzj4gv_xoi2iicz">
                     <w:r>
                       <w:rPr>
                         <w:rStyle w:val="Hyperlink"/>
@@ -19361,7 +19361,7 @@
                   </w:r>
                 </w:p>
                 <w:p>
-                  <w:hyperlink w:history="1" r:id="rId0cx7xr3lsncz3qe0aqmsc">
+                  <w:hyperlink w:history="1" r:id="rIdxiglxpvkwijjiwsyswxgr">
                     <w:r>
                       <w:rPr>
                         <w:rStyle w:val="Hyperlink"/>
@@ -19600,7 +19600,7 @@
                   </w:r>
                 </w:p>
                 <w:p>
-                  <w:hyperlink w:history="1" r:id="rIdfs1c8k0sxplqkdxadctwi">
+                  <w:hyperlink w:history="1" r:id="rIdq4xj-ybydybqqq1sr9rz1">
                     <w:r>
                       <w:rPr>
                         <w:rStyle w:val="Hyperlink"/>
@@ -19809,7 +19809,7 @@
                   </w:r>
                 </w:p>
                 <w:p>
-                  <w:hyperlink w:history="1" r:id="rIdhchfp8kos-m-woohnbigw">
+                  <w:hyperlink w:history="1" r:id="rIdj1ap5wheaq5csebrhl8ur">
                     <w:r>
                       <w:rPr>
                         <w:rStyle w:val="Hyperlink"/>

</xml_diff>

<commit_message>
workbook: fill notes pages with more lines (morning 25, speaker 26)
</commit_message>
<xml_diff>
--- a/deliverables/workbook/Workbook.docx
+++ b/deliverables/workbook/Workbook.docx
@@ -1954,7 +1954,7 @@
       </w:tblGrid>
       <w:tr>
         <w:trPr>
-          <w:trHeight w:val="460" w:hRule="exact"/>
+          <w:trHeight w:val="470" w:hRule="exact"/>
         </w:trPr>
         <w:tc>
           <w:tcPr>
@@ -1989,7 +1989,7 @@
       </w:tr>
       <w:tr>
         <w:trPr>
-          <w:trHeight w:val="460" w:hRule="exact"/>
+          <w:trHeight w:val="470" w:hRule="exact"/>
         </w:trPr>
         <w:tc>
           <w:tcPr>
@@ -2024,7 +2024,7 @@
       </w:tr>
       <w:tr>
         <w:trPr>
-          <w:trHeight w:val="460" w:hRule="exact"/>
+          <w:trHeight w:val="470" w:hRule="exact"/>
         </w:trPr>
         <w:tc>
           <w:tcPr>
@@ -2059,7 +2059,7 @@
       </w:tr>
       <w:tr>
         <w:trPr>
-          <w:trHeight w:val="460" w:hRule="exact"/>
+          <w:trHeight w:val="470" w:hRule="exact"/>
         </w:trPr>
         <w:tc>
           <w:tcPr>
@@ -2094,7 +2094,7 @@
       </w:tr>
       <w:tr>
         <w:trPr>
-          <w:trHeight w:val="460" w:hRule="exact"/>
+          <w:trHeight w:val="470" w:hRule="exact"/>
         </w:trPr>
         <w:tc>
           <w:tcPr>
@@ -2129,7 +2129,7 @@
       </w:tr>
       <w:tr>
         <w:trPr>
-          <w:trHeight w:val="460" w:hRule="exact"/>
+          <w:trHeight w:val="470" w:hRule="exact"/>
         </w:trPr>
         <w:tc>
           <w:tcPr>
@@ -2164,7 +2164,7 @@
       </w:tr>
       <w:tr>
         <w:trPr>
-          <w:trHeight w:val="460" w:hRule="exact"/>
+          <w:trHeight w:val="470" w:hRule="exact"/>
         </w:trPr>
         <w:tc>
           <w:tcPr>
@@ -2199,7 +2199,7 @@
       </w:tr>
       <w:tr>
         <w:trPr>
-          <w:trHeight w:val="460" w:hRule="exact"/>
+          <w:trHeight w:val="470" w:hRule="exact"/>
         </w:trPr>
         <w:tc>
           <w:tcPr>
@@ -2234,7 +2234,7 @@
       </w:tr>
       <w:tr>
         <w:trPr>
-          <w:trHeight w:val="460" w:hRule="exact"/>
+          <w:trHeight w:val="470" w:hRule="exact"/>
         </w:trPr>
         <w:tc>
           <w:tcPr>
@@ -2269,7 +2269,7 @@
       </w:tr>
       <w:tr>
         <w:trPr>
-          <w:trHeight w:val="460" w:hRule="exact"/>
+          <w:trHeight w:val="470" w:hRule="exact"/>
         </w:trPr>
         <w:tc>
           <w:tcPr>
@@ -2304,7 +2304,7 @@
       </w:tr>
       <w:tr>
         <w:trPr>
-          <w:trHeight w:val="460" w:hRule="exact"/>
+          <w:trHeight w:val="470" w:hRule="exact"/>
         </w:trPr>
         <w:tc>
           <w:tcPr>
@@ -2339,7 +2339,7 @@
       </w:tr>
       <w:tr>
         <w:trPr>
-          <w:trHeight w:val="460" w:hRule="exact"/>
+          <w:trHeight w:val="470" w:hRule="exact"/>
         </w:trPr>
         <w:tc>
           <w:tcPr>
@@ -2374,7 +2374,7 @@
       </w:tr>
       <w:tr>
         <w:trPr>
-          <w:trHeight w:val="460" w:hRule="exact"/>
+          <w:trHeight w:val="470" w:hRule="exact"/>
         </w:trPr>
         <w:tc>
           <w:tcPr>
@@ -2409,7 +2409,7 @@
       </w:tr>
       <w:tr>
         <w:trPr>
-          <w:trHeight w:val="460" w:hRule="exact"/>
+          <w:trHeight w:val="470" w:hRule="exact"/>
         </w:trPr>
         <w:tc>
           <w:tcPr>
@@ -2444,7 +2444,7 @@
       </w:tr>
       <w:tr>
         <w:trPr>
-          <w:trHeight w:val="460" w:hRule="exact"/>
+          <w:trHeight w:val="470" w:hRule="exact"/>
         </w:trPr>
         <w:tc>
           <w:tcPr>
@@ -2479,7 +2479,7 @@
       </w:tr>
       <w:tr>
         <w:trPr>
-          <w:trHeight w:val="460" w:hRule="exact"/>
+          <w:trHeight w:val="470" w:hRule="exact"/>
         </w:trPr>
         <w:tc>
           <w:tcPr>
@@ -2514,7 +2514,7 @@
       </w:tr>
       <w:tr>
         <w:trPr>
-          <w:trHeight w:val="460" w:hRule="exact"/>
+          <w:trHeight w:val="470" w:hRule="exact"/>
         </w:trPr>
         <w:tc>
           <w:tcPr>
@@ -2549,7 +2549,7 @@
       </w:tr>
       <w:tr>
         <w:trPr>
-          <w:trHeight w:val="460" w:hRule="exact"/>
+          <w:trHeight w:val="470" w:hRule="exact"/>
         </w:trPr>
         <w:tc>
           <w:tcPr>
@@ -2584,7 +2584,7 @@
       </w:tr>
       <w:tr>
         <w:trPr>
-          <w:trHeight w:val="460" w:hRule="exact"/>
+          <w:trHeight w:val="470" w:hRule="exact"/>
         </w:trPr>
         <w:tc>
           <w:tcPr>
@@ -2619,7 +2619,7 @@
       </w:tr>
       <w:tr>
         <w:trPr>
-          <w:trHeight w:val="460" w:hRule="exact"/>
+          <w:trHeight w:val="470" w:hRule="exact"/>
         </w:trPr>
         <w:tc>
           <w:tcPr>
@@ -2654,7 +2654,7 @@
       </w:tr>
       <w:tr>
         <w:trPr>
-          <w:trHeight w:val="460" w:hRule="exact"/>
+          <w:trHeight w:val="470" w:hRule="exact"/>
         </w:trPr>
         <w:tc>
           <w:tcPr>
@@ -2689,7 +2689,112 @@
       </w:tr>
       <w:tr>
         <w:trPr>
-          <w:trHeight w:val="460" w:hRule="exact"/>
+          <w:trHeight w:val="470" w:hRule="exact"/>
+        </w:trPr>
+        <w:tc>
+          <w:tcPr>
+            <w:tcW w:type="dxa" w:w="10080"/>
+            <w:tcBorders>
+              <w:top w:val="none" w:color="FFFFFF" w:sz="0"/>
+              <w:left w:val="none" w:color="FFFFFF" w:sz="0"/>
+              <w:bottom w:val="single" w:color="C9D2DE" w:sz="4"/>
+              <w:right w:val="none" w:color="FFFFFF" w:sz="0"/>
+            </w:tcBorders>
+            <w:tcMar>
+              <w:top w:type="dxa" w:w="0"/>
+              <w:left w:type="dxa" w:w="0"/>
+              <w:bottom w:type="dxa" w:w="0"/>
+              <w:right w:type="dxa" w:w="0"/>
+            </w:tcMar>
+          </w:tcPr>
+          <w:p>
+            <w:pPr>
+              <w:spacing w:after="0" w:before="0"/>
+            </w:pPr>
+            <w:r>
+              <w:rPr>
+                <w:rFonts w:ascii="Calibri" w:cs="Calibri" w:eastAsia="Calibri" w:hAnsi="Calibri"/>
+                <w:sz w:val="22"/>
+                <w:szCs w:val="22"/>
+              </w:rPr>
+              <w:t xml:space="preserve"> </w:t>
+            </w:r>
+          </w:p>
+        </w:tc>
+      </w:tr>
+      <w:tr>
+        <w:trPr>
+          <w:trHeight w:val="470" w:hRule="exact"/>
+        </w:trPr>
+        <w:tc>
+          <w:tcPr>
+            <w:tcW w:type="dxa" w:w="10080"/>
+            <w:tcBorders>
+              <w:top w:val="none" w:color="FFFFFF" w:sz="0"/>
+              <w:left w:val="none" w:color="FFFFFF" w:sz="0"/>
+              <w:bottom w:val="single" w:color="C9D2DE" w:sz="4"/>
+              <w:right w:val="none" w:color="FFFFFF" w:sz="0"/>
+            </w:tcBorders>
+            <w:tcMar>
+              <w:top w:type="dxa" w:w="0"/>
+              <w:left w:type="dxa" w:w="0"/>
+              <w:bottom w:type="dxa" w:w="0"/>
+              <w:right w:type="dxa" w:w="0"/>
+            </w:tcMar>
+          </w:tcPr>
+          <w:p>
+            <w:pPr>
+              <w:spacing w:after="0" w:before="0"/>
+            </w:pPr>
+            <w:r>
+              <w:rPr>
+                <w:rFonts w:ascii="Calibri" w:cs="Calibri" w:eastAsia="Calibri" w:hAnsi="Calibri"/>
+                <w:sz w:val="22"/>
+                <w:szCs w:val="22"/>
+              </w:rPr>
+              <w:t xml:space="preserve"> </w:t>
+            </w:r>
+          </w:p>
+        </w:tc>
+      </w:tr>
+      <w:tr>
+        <w:trPr>
+          <w:trHeight w:val="470" w:hRule="exact"/>
+        </w:trPr>
+        <w:tc>
+          <w:tcPr>
+            <w:tcW w:type="dxa" w:w="10080"/>
+            <w:tcBorders>
+              <w:top w:val="none" w:color="FFFFFF" w:sz="0"/>
+              <w:left w:val="none" w:color="FFFFFF" w:sz="0"/>
+              <w:bottom w:val="single" w:color="C9D2DE" w:sz="4"/>
+              <w:right w:val="none" w:color="FFFFFF" w:sz="0"/>
+            </w:tcBorders>
+            <w:tcMar>
+              <w:top w:type="dxa" w:w="0"/>
+              <w:left w:type="dxa" w:w="0"/>
+              <w:bottom w:type="dxa" w:w="0"/>
+              <w:right w:type="dxa" w:w="0"/>
+            </w:tcMar>
+          </w:tcPr>
+          <w:p>
+            <w:pPr>
+              <w:spacing w:after="0" w:before="0"/>
+            </w:pPr>
+            <w:r>
+              <w:rPr>
+                <w:rFonts w:ascii="Calibri" w:cs="Calibri" w:eastAsia="Calibri" w:hAnsi="Calibri"/>
+                <w:sz w:val="22"/>
+                <w:szCs w:val="22"/>
+              </w:rPr>
+              <w:t xml:space="preserve"> </w:t>
+            </w:r>
+          </w:p>
+        </w:tc>
+      </w:tr>
+      <w:tr>
+        <w:trPr>
+          <w:trHeight w:val="470" w:hRule="exact"/>
         </w:trPr>
         <w:tc>
           <w:tcPr>
@@ -2780,7 +2885,7 @@
       </w:tblGrid>
       <w:tr>
         <w:trPr>
-          <w:trHeight w:val="460" w:hRule="exact"/>
+          <w:trHeight w:val="470" w:hRule="exact"/>
         </w:trPr>
         <w:tc>
           <w:tcPr>
@@ -2815,7 +2920,7 @@
       </w:tr>
       <w:tr>
         <w:trPr>
-          <w:trHeight w:val="460" w:hRule="exact"/>
+          <w:trHeight w:val="470" w:hRule="exact"/>
         </w:trPr>
         <w:tc>
           <w:tcPr>
@@ -2850,7 +2955,7 @@
       </w:tr>
       <w:tr>
         <w:trPr>
-          <w:trHeight w:val="460" w:hRule="exact"/>
+          <w:trHeight w:val="470" w:hRule="exact"/>
         </w:trPr>
         <w:tc>
           <w:tcPr>
@@ -2885,7 +2990,7 @@
       </w:tr>
       <w:tr>
         <w:trPr>
-          <w:trHeight w:val="460" w:hRule="exact"/>
+          <w:trHeight w:val="470" w:hRule="exact"/>
         </w:trPr>
         <w:tc>
           <w:tcPr>
@@ -2920,7 +3025,7 @@
       </w:tr>
       <w:tr>
         <w:trPr>
-          <w:trHeight w:val="460" w:hRule="exact"/>
+          <w:trHeight w:val="470" w:hRule="exact"/>
         </w:trPr>
         <w:tc>
           <w:tcPr>
@@ -2955,7 +3060,7 @@
       </w:tr>
       <w:tr>
         <w:trPr>
-          <w:trHeight w:val="460" w:hRule="exact"/>
+          <w:trHeight w:val="470" w:hRule="exact"/>
         </w:trPr>
         <w:tc>
           <w:tcPr>
@@ -2990,7 +3095,7 @@
       </w:tr>
       <w:tr>
         <w:trPr>
-          <w:trHeight w:val="460" w:hRule="exact"/>
+          <w:trHeight w:val="470" w:hRule="exact"/>
         </w:trPr>
         <w:tc>
           <w:tcPr>
@@ -3025,7 +3130,7 @@
       </w:tr>
       <w:tr>
         <w:trPr>
-          <w:trHeight w:val="460" w:hRule="exact"/>
+          <w:trHeight w:val="470" w:hRule="exact"/>
         </w:trPr>
         <w:tc>
           <w:tcPr>
@@ -3060,7 +3165,7 @@
       </w:tr>
       <w:tr>
         <w:trPr>
-          <w:trHeight w:val="460" w:hRule="exact"/>
+          <w:trHeight w:val="470" w:hRule="exact"/>
         </w:trPr>
         <w:tc>
           <w:tcPr>
@@ -3095,7 +3200,7 @@
       </w:tr>
       <w:tr>
         <w:trPr>
-          <w:trHeight w:val="460" w:hRule="exact"/>
+          <w:trHeight w:val="470" w:hRule="exact"/>
         </w:trPr>
         <w:tc>
           <w:tcPr>
@@ -3130,7 +3235,7 @@
       </w:tr>
       <w:tr>
         <w:trPr>
-          <w:trHeight w:val="460" w:hRule="exact"/>
+          <w:trHeight w:val="470" w:hRule="exact"/>
         </w:trPr>
         <w:tc>
           <w:tcPr>
@@ -3165,7 +3270,7 @@
       </w:tr>
       <w:tr>
         <w:trPr>
-          <w:trHeight w:val="460" w:hRule="exact"/>
+          <w:trHeight w:val="470" w:hRule="exact"/>
         </w:trPr>
         <w:tc>
           <w:tcPr>
@@ -3200,7 +3305,7 @@
       </w:tr>
       <w:tr>
         <w:trPr>
-          <w:trHeight w:val="460" w:hRule="exact"/>
+          <w:trHeight w:val="470" w:hRule="exact"/>
         </w:trPr>
         <w:tc>
           <w:tcPr>
@@ -3235,7 +3340,7 @@
       </w:tr>
       <w:tr>
         <w:trPr>
-          <w:trHeight w:val="460" w:hRule="exact"/>
+          <w:trHeight w:val="470" w:hRule="exact"/>
         </w:trPr>
         <w:tc>
           <w:tcPr>
@@ -3270,7 +3375,7 @@
       </w:tr>
       <w:tr>
         <w:trPr>
-          <w:trHeight w:val="460" w:hRule="exact"/>
+          <w:trHeight w:val="470" w:hRule="exact"/>
         </w:trPr>
         <w:tc>
           <w:tcPr>
@@ -3305,7 +3410,7 @@
       </w:tr>
       <w:tr>
         <w:trPr>
-          <w:trHeight w:val="460" w:hRule="exact"/>
+          <w:trHeight w:val="470" w:hRule="exact"/>
         </w:trPr>
         <w:tc>
           <w:tcPr>
@@ -3340,7 +3445,7 @@
       </w:tr>
       <w:tr>
         <w:trPr>
-          <w:trHeight w:val="460" w:hRule="exact"/>
+          <w:trHeight w:val="470" w:hRule="exact"/>
         </w:trPr>
         <w:tc>
           <w:tcPr>
@@ -3375,7 +3480,7 @@
       </w:tr>
       <w:tr>
         <w:trPr>
-          <w:trHeight w:val="460" w:hRule="exact"/>
+          <w:trHeight w:val="470" w:hRule="exact"/>
         </w:trPr>
         <w:tc>
           <w:tcPr>
@@ -3410,7 +3515,7 @@
       </w:tr>
       <w:tr>
         <w:trPr>
-          <w:trHeight w:val="460" w:hRule="exact"/>
+          <w:trHeight w:val="470" w:hRule="exact"/>
         </w:trPr>
         <w:tc>
           <w:tcPr>
@@ -3445,7 +3550,7 @@
       </w:tr>
       <w:tr>
         <w:trPr>
-          <w:trHeight w:val="460" w:hRule="exact"/>
+          <w:trHeight w:val="470" w:hRule="exact"/>
         </w:trPr>
         <w:tc>
           <w:tcPr>
@@ -3480,7 +3585,7 @@
       </w:tr>
       <w:tr>
         <w:trPr>
-          <w:trHeight w:val="460" w:hRule="exact"/>
+          <w:trHeight w:val="470" w:hRule="exact"/>
         </w:trPr>
         <w:tc>
           <w:tcPr>
@@ -3515,7 +3620,112 @@
       </w:tr>
       <w:tr>
         <w:trPr>
-          <w:trHeight w:val="460" w:hRule="exact"/>
+          <w:trHeight w:val="470" w:hRule="exact"/>
+        </w:trPr>
+        <w:tc>
+          <w:tcPr>
+            <w:tcW w:type="dxa" w:w="10080"/>
+            <w:tcBorders>
+              <w:top w:val="none" w:color="FFFFFF" w:sz="0"/>
+              <w:left w:val="none" w:color="FFFFFF" w:sz="0"/>
+              <w:bottom w:val="single" w:color="C9D2DE" w:sz="4"/>
+              <w:right w:val="none" w:color="FFFFFF" w:sz="0"/>
+            </w:tcBorders>
+            <w:tcMar>
+              <w:top w:type="dxa" w:w="0"/>
+              <w:left w:type="dxa" w:w="0"/>
+              <w:bottom w:type="dxa" w:w="0"/>
+              <w:right w:type="dxa" w:w="0"/>
+            </w:tcMar>
+          </w:tcPr>
+          <w:p>
+            <w:pPr>
+              <w:spacing w:after="0" w:before="0"/>
+            </w:pPr>
+            <w:r>
+              <w:rPr>
+                <w:rFonts w:ascii="Calibri" w:cs="Calibri" w:eastAsia="Calibri" w:hAnsi="Calibri"/>
+                <w:sz w:val="22"/>
+                <w:szCs w:val="22"/>
+              </w:rPr>
+              <w:t xml:space="preserve"> </w:t>
+            </w:r>
+          </w:p>
+        </w:tc>
+      </w:tr>
+      <w:tr>
+        <w:trPr>
+          <w:trHeight w:val="470" w:hRule="exact"/>
+        </w:trPr>
+        <w:tc>
+          <w:tcPr>
+            <w:tcW w:type="dxa" w:w="10080"/>
+            <w:tcBorders>
+              <w:top w:val="none" w:color="FFFFFF" w:sz="0"/>
+              <w:left w:val="none" w:color="FFFFFF" w:sz="0"/>
+              <w:bottom w:val="single" w:color="C9D2DE" w:sz="4"/>
+              <w:right w:val="none" w:color="FFFFFF" w:sz="0"/>
+            </w:tcBorders>
+            <w:tcMar>
+              <w:top w:type="dxa" w:w="0"/>
+              <w:left w:type="dxa" w:w="0"/>
+              <w:bottom w:type="dxa" w:w="0"/>
+              <w:right w:type="dxa" w:w="0"/>
+            </w:tcMar>
+          </w:tcPr>
+          <w:p>
+            <w:pPr>
+              <w:spacing w:after="0" w:before="0"/>
+            </w:pPr>
+            <w:r>
+              <w:rPr>
+                <w:rFonts w:ascii="Calibri" w:cs="Calibri" w:eastAsia="Calibri" w:hAnsi="Calibri"/>
+                <w:sz w:val="22"/>
+                <w:szCs w:val="22"/>
+              </w:rPr>
+              <w:t xml:space="preserve"> </w:t>
+            </w:r>
+          </w:p>
+        </w:tc>
+      </w:tr>
+      <w:tr>
+        <w:trPr>
+          <w:trHeight w:val="470" w:hRule="exact"/>
+        </w:trPr>
+        <w:tc>
+          <w:tcPr>
+            <w:tcW w:type="dxa" w:w="10080"/>
+            <w:tcBorders>
+              <w:top w:val="none" w:color="FFFFFF" w:sz="0"/>
+              <w:left w:val="none" w:color="FFFFFF" w:sz="0"/>
+              <w:bottom w:val="single" w:color="C9D2DE" w:sz="4"/>
+              <w:right w:val="none" w:color="FFFFFF" w:sz="0"/>
+            </w:tcBorders>
+            <w:tcMar>
+              <w:top w:type="dxa" w:w="0"/>
+              <w:left w:type="dxa" w:w="0"/>
+              <w:bottom w:type="dxa" w:w="0"/>
+              <w:right w:type="dxa" w:w="0"/>
+            </w:tcMar>
+          </w:tcPr>
+          <w:p>
+            <w:pPr>
+              <w:spacing w:after="0" w:before="0"/>
+            </w:pPr>
+            <w:r>
+              <w:rPr>
+                <w:rFonts w:ascii="Calibri" w:cs="Calibri" w:eastAsia="Calibri" w:hAnsi="Calibri"/>
+                <w:sz w:val="22"/>
+                <w:szCs w:val="22"/>
+              </w:rPr>
+              <w:t xml:space="preserve"> </w:t>
+            </w:r>
+          </w:p>
+        </w:tc>
+      </w:tr>
+      <w:tr>
+        <w:trPr>
+          <w:trHeight w:val="470" w:hRule="exact"/>
         </w:trPr>
         <w:tc>
           <w:tcPr>
@@ -3606,7 +3816,7 @@
       </w:tblGrid>
       <w:tr>
         <w:trPr>
-          <w:trHeight w:val="460" w:hRule="exact"/>
+          <w:trHeight w:val="470" w:hRule="exact"/>
         </w:trPr>
         <w:tc>
           <w:tcPr>
@@ -3641,7 +3851,7 @@
       </w:tr>
       <w:tr>
         <w:trPr>
-          <w:trHeight w:val="460" w:hRule="exact"/>
+          <w:trHeight w:val="470" w:hRule="exact"/>
         </w:trPr>
         <w:tc>
           <w:tcPr>
@@ -3676,7 +3886,7 @@
       </w:tr>
       <w:tr>
         <w:trPr>
-          <w:trHeight w:val="460" w:hRule="exact"/>
+          <w:trHeight w:val="470" w:hRule="exact"/>
         </w:trPr>
         <w:tc>
           <w:tcPr>
@@ -3711,7 +3921,7 @@
       </w:tr>
       <w:tr>
         <w:trPr>
-          <w:trHeight w:val="460" w:hRule="exact"/>
+          <w:trHeight w:val="470" w:hRule="exact"/>
         </w:trPr>
         <w:tc>
           <w:tcPr>
@@ -3746,7 +3956,7 @@
       </w:tr>
       <w:tr>
         <w:trPr>
-          <w:trHeight w:val="460" w:hRule="exact"/>
+          <w:trHeight w:val="470" w:hRule="exact"/>
         </w:trPr>
         <w:tc>
           <w:tcPr>
@@ -3781,7 +3991,7 @@
       </w:tr>
       <w:tr>
         <w:trPr>
-          <w:trHeight w:val="460" w:hRule="exact"/>
+          <w:trHeight w:val="470" w:hRule="exact"/>
         </w:trPr>
         <w:tc>
           <w:tcPr>
@@ -3816,7 +4026,7 @@
       </w:tr>
       <w:tr>
         <w:trPr>
-          <w:trHeight w:val="460" w:hRule="exact"/>
+          <w:trHeight w:val="470" w:hRule="exact"/>
         </w:trPr>
         <w:tc>
           <w:tcPr>
@@ -3851,7 +4061,7 @@
       </w:tr>
       <w:tr>
         <w:trPr>
-          <w:trHeight w:val="460" w:hRule="exact"/>
+          <w:trHeight w:val="470" w:hRule="exact"/>
         </w:trPr>
         <w:tc>
           <w:tcPr>
@@ -3886,7 +4096,7 @@
       </w:tr>
       <w:tr>
         <w:trPr>
-          <w:trHeight w:val="460" w:hRule="exact"/>
+          <w:trHeight w:val="470" w:hRule="exact"/>
         </w:trPr>
         <w:tc>
           <w:tcPr>
@@ -3921,7 +4131,7 @@
       </w:tr>
       <w:tr>
         <w:trPr>
-          <w:trHeight w:val="460" w:hRule="exact"/>
+          <w:trHeight w:val="470" w:hRule="exact"/>
         </w:trPr>
         <w:tc>
           <w:tcPr>
@@ -3956,7 +4166,7 @@
       </w:tr>
       <w:tr>
         <w:trPr>
-          <w:trHeight w:val="460" w:hRule="exact"/>
+          <w:trHeight w:val="470" w:hRule="exact"/>
         </w:trPr>
         <w:tc>
           <w:tcPr>
@@ -3991,7 +4201,7 @@
       </w:tr>
       <w:tr>
         <w:trPr>
-          <w:trHeight w:val="460" w:hRule="exact"/>
+          <w:trHeight w:val="470" w:hRule="exact"/>
         </w:trPr>
         <w:tc>
           <w:tcPr>
@@ -4026,7 +4236,7 @@
       </w:tr>
       <w:tr>
         <w:trPr>
-          <w:trHeight w:val="460" w:hRule="exact"/>
+          <w:trHeight w:val="470" w:hRule="exact"/>
         </w:trPr>
         <w:tc>
           <w:tcPr>
@@ -4061,7 +4271,7 @@
       </w:tr>
       <w:tr>
         <w:trPr>
-          <w:trHeight w:val="460" w:hRule="exact"/>
+          <w:trHeight w:val="470" w:hRule="exact"/>
         </w:trPr>
         <w:tc>
           <w:tcPr>
@@ -4096,7 +4306,7 @@
       </w:tr>
       <w:tr>
         <w:trPr>
-          <w:trHeight w:val="460" w:hRule="exact"/>
+          <w:trHeight w:val="470" w:hRule="exact"/>
         </w:trPr>
         <w:tc>
           <w:tcPr>
@@ -4131,7 +4341,7 @@
       </w:tr>
       <w:tr>
         <w:trPr>
-          <w:trHeight w:val="460" w:hRule="exact"/>
+          <w:trHeight w:val="470" w:hRule="exact"/>
         </w:trPr>
         <w:tc>
           <w:tcPr>
@@ -4166,7 +4376,7 @@
       </w:tr>
       <w:tr>
         <w:trPr>
-          <w:trHeight w:val="460" w:hRule="exact"/>
+          <w:trHeight w:val="470" w:hRule="exact"/>
         </w:trPr>
         <w:tc>
           <w:tcPr>
@@ -4201,7 +4411,7 @@
       </w:tr>
       <w:tr>
         <w:trPr>
-          <w:trHeight w:val="460" w:hRule="exact"/>
+          <w:trHeight w:val="470" w:hRule="exact"/>
         </w:trPr>
         <w:tc>
           <w:tcPr>
@@ -4236,7 +4446,7 @@
       </w:tr>
       <w:tr>
         <w:trPr>
-          <w:trHeight w:val="460" w:hRule="exact"/>
+          <w:trHeight w:val="470" w:hRule="exact"/>
         </w:trPr>
         <w:tc>
           <w:tcPr>
@@ -4271,7 +4481,7 @@
       </w:tr>
       <w:tr>
         <w:trPr>
-          <w:trHeight w:val="460" w:hRule="exact"/>
+          <w:trHeight w:val="470" w:hRule="exact"/>
         </w:trPr>
         <w:tc>
           <w:tcPr>
@@ -4306,7 +4516,7 @@
       </w:tr>
       <w:tr>
         <w:trPr>
-          <w:trHeight w:val="460" w:hRule="exact"/>
+          <w:trHeight w:val="470" w:hRule="exact"/>
         </w:trPr>
         <w:tc>
           <w:tcPr>
@@ -4341,7 +4551,112 @@
       </w:tr>
       <w:tr>
         <w:trPr>
-          <w:trHeight w:val="460" w:hRule="exact"/>
+          <w:trHeight w:val="470" w:hRule="exact"/>
+        </w:trPr>
+        <w:tc>
+          <w:tcPr>
+            <w:tcW w:type="dxa" w:w="10080"/>
+            <w:tcBorders>
+              <w:top w:val="none" w:color="FFFFFF" w:sz="0"/>
+              <w:left w:val="none" w:color="FFFFFF" w:sz="0"/>
+              <w:bottom w:val="single" w:color="C9D2DE" w:sz="4"/>
+              <w:right w:val="none" w:color="FFFFFF" w:sz="0"/>
+            </w:tcBorders>
+            <w:tcMar>
+              <w:top w:type="dxa" w:w="0"/>
+              <w:left w:type="dxa" w:w="0"/>
+              <w:bottom w:type="dxa" w:w="0"/>
+              <w:right w:type="dxa" w:w="0"/>
+            </w:tcMar>
+          </w:tcPr>
+          <w:p>
+            <w:pPr>
+              <w:spacing w:after="0" w:before="0"/>
+            </w:pPr>
+            <w:r>
+              <w:rPr>
+                <w:rFonts w:ascii="Calibri" w:cs="Calibri" w:eastAsia="Calibri" w:hAnsi="Calibri"/>
+                <w:sz w:val="22"/>
+                <w:szCs w:val="22"/>
+              </w:rPr>
+              <w:t xml:space="preserve"> </w:t>
+            </w:r>
+          </w:p>
+        </w:tc>
+      </w:tr>
+      <w:tr>
+        <w:trPr>
+          <w:trHeight w:val="470" w:hRule="exact"/>
+        </w:trPr>
+        <w:tc>
+          <w:tcPr>
+            <w:tcW w:type="dxa" w:w="10080"/>
+            <w:tcBorders>
+              <w:top w:val="none" w:color="FFFFFF" w:sz="0"/>
+              <w:left w:val="none" w:color="FFFFFF" w:sz="0"/>
+              <w:bottom w:val="single" w:color="C9D2DE" w:sz="4"/>
+              <w:right w:val="none" w:color="FFFFFF" w:sz="0"/>
+            </w:tcBorders>
+            <w:tcMar>
+              <w:top w:type="dxa" w:w="0"/>
+              <w:left w:type="dxa" w:w="0"/>
+              <w:bottom w:type="dxa" w:w="0"/>
+              <w:right w:type="dxa" w:w="0"/>
+            </w:tcMar>
+          </w:tcPr>
+          <w:p>
+            <w:pPr>
+              <w:spacing w:after="0" w:before="0"/>
+            </w:pPr>
+            <w:r>
+              <w:rPr>
+                <w:rFonts w:ascii="Calibri" w:cs="Calibri" w:eastAsia="Calibri" w:hAnsi="Calibri"/>
+                <w:sz w:val="22"/>
+                <w:szCs w:val="22"/>
+              </w:rPr>
+              <w:t xml:space="preserve"> </w:t>
+            </w:r>
+          </w:p>
+        </w:tc>
+      </w:tr>
+      <w:tr>
+        <w:trPr>
+          <w:trHeight w:val="470" w:hRule="exact"/>
+        </w:trPr>
+        <w:tc>
+          <w:tcPr>
+            <w:tcW w:type="dxa" w:w="10080"/>
+            <w:tcBorders>
+              <w:top w:val="none" w:color="FFFFFF" w:sz="0"/>
+              <w:left w:val="none" w:color="FFFFFF" w:sz="0"/>
+              <w:bottom w:val="single" w:color="C9D2DE" w:sz="4"/>
+              <w:right w:val="none" w:color="FFFFFF" w:sz="0"/>
+            </w:tcBorders>
+            <w:tcMar>
+              <w:top w:type="dxa" w:w="0"/>
+              <w:left w:type="dxa" w:w="0"/>
+              <w:bottom w:type="dxa" w:w="0"/>
+              <w:right w:type="dxa" w:w="0"/>
+            </w:tcMar>
+          </w:tcPr>
+          <w:p>
+            <w:pPr>
+              <w:spacing w:after="0" w:before="0"/>
+            </w:pPr>
+            <w:r>
+              <w:rPr>
+                <w:rFonts w:ascii="Calibri" w:cs="Calibri" w:eastAsia="Calibri" w:hAnsi="Calibri"/>
+                <w:sz w:val="22"/>
+                <w:szCs w:val="22"/>
+              </w:rPr>
+              <w:t xml:space="preserve"> </w:t>
+            </w:r>
+          </w:p>
+        </w:tc>
+      </w:tr>
+      <w:tr>
+        <w:trPr>
+          <w:trHeight w:val="470" w:hRule="exact"/>
         </w:trPr>
         <w:tc>
           <w:tcPr>
@@ -4432,7 +4747,7 @@
       </w:tblGrid>
       <w:tr>
         <w:trPr>
-          <w:trHeight w:val="460" w:hRule="exact"/>
+          <w:trHeight w:val="470" w:hRule="exact"/>
         </w:trPr>
         <w:tc>
           <w:tcPr>
@@ -4467,7 +4782,7 @@
       </w:tr>
       <w:tr>
         <w:trPr>
-          <w:trHeight w:val="460" w:hRule="exact"/>
+          <w:trHeight w:val="470" w:hRule="exact"/>
         </w:trPr>
         <w:tc>
           <w:tcPr>
@@ -4502,7 +4817,7 @@
       </w:tr>
       <w:tr>
         <w:trPr>
-          <w:trHeight w:val="460" w:hRule="exact"/>
+          <w:trHeight w:val="470" w:hRule="exact"/>
         </w:trPr>
         <w:tc>
           <w:tcPr>
@@ -4537,7 +4852,7 @@
       </w:tr>
       <w:tr>
         <w:trPr>
-          <w:trHeight w:val="460" w:hRule="exact"/>
+          <w:trHeight w:val="470" w:hRule="exact"/>
         </w:trPr>
         <w:tc>
           <w:tcPr>
@@ -4572,7 +4887,7 @@
       </w:tr>
       <w:tr>
         <w:trPr>
-          <w:trHeight w:val="460" w:hRule="exact"/>
+          <w:trHeight w:val="470" w:hRule="exact"/>
         </w:trPr>
         <w:tc>
           <w:tcPr>
@@ -4607,7 +4922,7 @@
       </w:tr>
       <w:tr>
         <w:trPr>
-          <w:trHeight w:val="460" w:hRule="exact"/>
+          <w:trHeight w:val="470" w:hRule="exact"/>
         </w:trPr>
         <w:tc>
           <w:tcPr>
@@ -4642,7 +4957,7 @@
       </w:tr>
       <w:tr>
         <w:trPr>
-          <w:trHeight w:val="460" w:hRule="exact"/>
+          <w:trHeight w:val="470" w:hRule="exact"/>
         </w:trPr>
         <w:tc>
           <w:tcPr>
@@ -4677,7 +4992,7 @@
       </w:tr>
       <w:tr>
         <w:trPr>
-          <w:trHeight w:val="460" w:hRule="exact"/>
+          <w:trHeight w:val="470" w:hRule="exact"/>
         </w:trPr>
         <w:tc>
           <w:tcPr>
@@ -4712,7 +5027,7 @@
       </w:tr>
       <w:tr>
         <w:trPr>
-          <w:trHeight w:val="460" w:hRule="exact"/>
+          <w:trHeight w:val="470" w:hRule="exact"/>
         </w:trPr>
         <w:tc>
           <w:tcPr>
@@ -4747,7 +5062,7 @@
       </w:tr>
       <w:tr>
         <w:trPr>
-          <w:trHeight w:val="460" w:hRule="exact"/>
+          <w:trHeight w:val="470" w:hRule="exact"/>
         </w:trPr>
         <w:tc>
           <w:tcPr>
@@ -4782,7 +5097,7 @@
       </w:tr>
       <w:tr>
         <w:trPr>
-          <w:trHeight w:val="460" w:hRule="exact"/>
+          <w:trHeight w:val="470" w:hRule="exact"/>
         </w:trPr>
         <w:tc>
           <w:tcPr>
@@ -4817,7 +5132,7 @@
       </w:tr>
       <w:tr>
         <w:trPr>
-          <w:trHeight w:val="460" w:hRule="exact"/>
+          <w:trHeight w:val="470" w:hRule="exact"/>
         </w:trPr>
         <w:tc>
           <w:tcPr>
@@ -4852,7 +5167,7 @@
       </w:tr>
       <w:tr>
         <w:trPr>
-          <w:trHeight w:val="460" w:hRule="exact"/>
+          <w:trHeight w:val="470" w:hRule="exact"/>
         </w:trPr>
         <w:tc>
           <w:tcPr>
@@ -4887,7 +5202,7 @@
       </w:tr>
       <w:tr>
         <w:trPr>
-          <w:trHeight w:val="460" w:hRule="exact"/>
+          <w:trHeight w:val="470" w:hRule="exact"/>
         </w:trPr>
         <w:tc>
           <w:tcPr>
@@ -4922,7 +5237,7 @@
       </w:tr>
       <w:tr>
         <w:trPr>
-          <w:trHeight w:val="460" w:hRule="exact"/>
+          <w:trHeight w:val="470" w:hRule="exact"/>
         </w:trPr>
         <w:tc>
           <w:tcPr>
@@ -4957,7 +5272,7 @@
       </w:tr>
       <w:tr>
         <w:trPr>
-          <w:trHeight w:val="460" w:hRule="exact"/>
+          <w:trHeight w:val="470" w:hRule="exact"/>
         </w:trPr>
         <w:tc>
           <w:tcPr>
@@ -4992,7 +5307,7 @@
       </w:tr>
       <w:tr>
         <w:trPr>
-          <w:trHeight w:val="460" w:hRule="exact"/>
+          <w:trHeight w:val="470" w:hRule="exact"/>
         </w:trPr>
         <w:tc>
           <w:tcPr>
@@ -5027,7 +5342,7 @@
       </w:tr>
       <w:tr>
         <w:trPr>
-          <w:trHeight w:val="460" w:hRule="exact"/>
+          <w:trHeight w:val="470" w:hRule="exact"/>
         </w:trPr>
         <w:tc>
           <w:tcPr>
@@ -5062,7 +5377,7 @@
       </w:tr>
       <w:tr>
         <w:trPr>
-          <w:trHeight w:val="460" w:hRule="exact"/>
+          <w:trHeight w:val="470" w:hRule="exact"/>
         </w:trPr>
         <w:tc>
           <w:tcPr>
@@ -5097,7 +5412,7 @@
       </w:tr>
       <w:tr>
         <w:trPr>
-          <w:trHeight w:val="460" w:hRule="exact"/>
+          <w:trHeight w:val="470" w:hRule="exact"/>
         </w:trPr>
         <w:tc>
           <w:tcPr>
@@ -5132,7 +5447,7 @@
       </w:tr>
       <w:tr>
         <w:trPr>
-          <w:trHeight w:val="460" w:hRule="exact"/>
+          <w:trHeight w:val="470" w:hRule="exact"/>
         </w:trPr>
         <w:tc>
           <w:tcPr>
@@ -5167,7 +5482,112 @@
       </w:tr>
       <w:tr>
         <w:trPr>
-          <w:trHeight w:val="460" w:hRule="exact"/>
+          <w:trHeight w:val="470" w:hRule="exact"/>
+        </w:trPr>
+        <w:tc>
+          <w:tcPr>
+            <w:tcW w:type="dxa" w:w="10080"/>
+            <w:tcBorders>
+              <w:top w:val="none" w:color="FFFFFF" w:sz="0"/>
+              <w:left w:val="none" w:color="FFFFFF" w:sz="0"/>
+              <w:bottom w:val="single" w:color="C9D2DE" w:sz="4"/>
+              <w:right w:val="none" w:color="FFFFFF" w:sz="0"/>
+            </w:tcBorders>
+            <w:tcMar>
+              <w:top w:type="dxa" w:w="0"/>
+              <w:left w:type="dxa" w:w="0"/>
+              <w:bottom w:type="dxa" w:w="0"/>
+              <w:right w:type="dxa" w:w="0"/>
+            </w:tcMar>
+          </w:tcPr>
+          <w:p>
+            <w:pPr>
+              <w:spacing w:after="0" w:before="0"/>
+            </w:pPr>
+            <w:r>
+              <w:rPr>
+                <w:rFonts w:ascii="Calibri" w:cs="Calibri" w:eastAsia="Calibri" w:hAnsi="Calibri"/>
+                <w:sz w:val="22"/>
+                <w:szCs w:val="22"/>
+              </w:rPr>
+              <w:t xml:space="preserve"> </w:t>
+            </w:r>
+          </w:p>
+        </w:tc>
+      </w:tr>
+      <w:tr>
+        <w:trPr>
+          <w:trHeight w:val="470" w:hRule="exact"/>
+        </w:trPr>
+        <w:tc>
+          <w:tcPr>
+            <w:tcW w:type="dxa" w:w="10080"/>
+            <w:tcBorders>
+              <w:top w:val="none" w:color="FFFFFF" w:sz="0"/>
+              <w:left w:val="none" w:color="FFFFFF" w:sz="0"/>
+              <w:bottom w:val="single" w:color="C9D2DE" w:sz="4"/>
+              <w:right w:val="none" w:color="FFFFFF" w:sz="0"/>
+            </w:tcBorders>
+            <w:tcMar>
+              <w:top w:type="dxa" w:w="0"/>
+              <w:left w:type="dxa" w:w="0"/>
+              <w:bottom w:type="dxa" w:w="0"/>
+              <w:right w:type="dxa" w:w="0"/>
+            </w:tcMar>
+          </w:tcPr>
+          <w:p>
+            <w:pPr>
+              <w:spacing w:after="0" w:before="0"/>
+            </w:pPr>
+            <w:r>
+              <w:rPr>
+                <w:rFonts w:ascii="Calibri" w:cs="Calibri" w:eastAsia="Calibri" w:hAnsi="Calibri"/>
+                <w:sz w:val="22"/>
+                <w:szCs w:val="22"/>
+              </w:rPr>
+              <w:t xml:space="preserve"> </w:t>
+            </w:r>
+          </w:p>
+        </w:tc>
+      </w:tr>
+      <w:tr>
+        <w:trPr>
+          <w:trHeight w:val="470" w:hRule="exact"/>
+        </w:trPr>
+        <w:tc>
+          <w:tcPr>
+            <w:tcW w:type="dxa" w:w="10080"/>
+            <w:tcBorders>
+              <w:top w:val="none" w:color="FFFFFF" w:sz="0"/>
+              <w:left w:val="none" w:color="FFFFFF" w:sz="0"/>
+              <w:bottom w:val="single" w:color="C9D2DE" w:sz="4"/>
+              <w:right w:val="none" w:color="FFFFFF" w:sz="0"/>
+            </w:tcBorders>
+            <w:tcMar>
+              <w:top w:type="dxa" w:w="0"/>
+              <w:left w:type="dxa" w:w="0"/>
+              <w:bottom w:type="dxa" w:w="0"/>
+              <w:right w:type="dxa" w:w="0"/>
+            </w:tcMar>
+          </w:tcPr>
+          <w:p>
+            <w:pPr>
+              <w:spacing w:after="0" w:before="0"/>
+            </w:pPr>
+            <w:r>
+              <w:rPr>
+                <w:rFonts w:ascii="Calibri" w:cs="Calibri" w:eastAsia="Calibri" w:hAnsi="Calibri"/>
+                <w:sz w:val="22"/>
+                <w:szCs w:val="22"/>
+              </w:rPr>
+              <w:t xml:space="preserve"> </w:t>
+            </w:r>
+          </w:p>
+        </w:tc>
+      </w:tr>
+      <w:tr>
+        <w:trPr>
+          <w:trHeight w:val="470" w:hRule="exact"/>
         </w:trPr>
         <w:tc>
           <w:tcPr>
@@ -5484,7 +5904,7 @@
       </w:tblGrid>
       <w:tr>
         <w:trPr>
-          <w:trHeight w:val="460" w:hRule="exact"/>
+          <w:trHeight w:val="470" w:hRule="exact"/>
         </w:trPr>
         <w:tc>
           <w:tcPr>
@@ -5519,7 +5939,7 @@
       </w:tr>
       <w:tr>
         <w:trPr>
-          <w:trHeight w:val="460" w:hRule="exact"/>
+          <w:trHeight w:val="470" w:hRule="exact"/>
         </w:trPr>
         <w:tc>
           <w:tcPr>
@@ -5554,7 +5974,7 @@
       </w:tr>
       <w:tr>
         <w:trPr>
-          <w:trHeight w:val="460" w:hRule="exact"/>
+          <w:trHeight w:val="470" w:hRule="exact"/>
         </w:trPr>
         <w:tc>
           <w:tcPr>
@@ -5589,7 +6009,7 @@
       </w:tr>
       <w:tr>
         <w:trPr>
-          <w:trHeight w:val="460" w:hRule="exact"/>
+          <w:trHeight w:val="470" w:hRule="exact"/>
         </w:trPr>
         <w:tc>
           <w:tcPr>
@@ -5624,7 +6044,7 @@
       </w:tr>
       <w:tr>
         <w:trPr>
-          <w:trHeight w:val="460" w:hRule="exact"/>
+          <w:trHeight w:val="470" w:hRule="exact"/>
         </w:trPr>
         <w:tc>
           <w:tcPr>
@@ -5659,7 +6079,7 @@
       </w:tr>
       <w:tr>
         <w:trPr>
-          <w:trHeight w:val="460" w:hRule="exact"/>
+          <w:trHeight w:val="470" w:hRule="exact"/>
         </w:trPr>
         <w:tc>
           <w:tcPr>
@@ -5694,7 +6114,7 @@
       </w:tr>
       <w:tr>
         <w:trPr>
-          <w:trHeight w:val="460" w:hRule="exact"/>
+          <w:trHeight w:val="470" w:hRule="exact"/>
         </w:trPr>
         <w:tc>
           <w:tcPr>
@@ -5729,7 +6149,7 @@
       </w:tr>
       <w:tr>
         <w:trPr>
-          <w:trHeight w:val="460" w:hRule="exact"/>
+          <w:trHeight w:val="470" w:hRule="exact"/>
         </w:trPr>
         <w:tc>
           <w:tcPr>
@@ -5764,7 +6184,7 @@
       </w:tr>
       <w:tr>
         <w:trPr>
-          <w:trHeight w:val="460" w:hRule="exact"/>
+          <w:trHeight w:val="470" w:hRule="exact"/>
         </w:trPr>
         <w:tc>
           <w:tcPr>
@@ -5799,7 +6219,7 @@
       </w:tr>
       <w:tr>
         <w:trPr>
-          <w:trHeight w:val="460" w:hRule="exact"/>
+          <w:trHeight w:val="470" w:hRule="exact"/>
         </w:trPr>
         <w:tc>
           <w:tcPr>
@@ -5834,7 +6254,7 @@
       </w:tr>
       <w:tr>
         <w:trPr>
-          <w:trHeight w:val="460" w:hRule="exact"/>
+          <w:trHeight w:val="470" w:hRule="exact"/>
         </w:trPr>
         <w:tc>
           <w:tcPr>
@@ -5869,7 +6289,7 @@
       </w:tr>
       <w:tr>
         <w:trPr>
-          <w:trHeight w:val="460" w:hRule="exact"/>
+          <w:trHeight w:val="470" w:hRule="exact"/>
         </w:trPr>
         <w:tc>
           <w:tcPr>
@@ -5904,7 +6324,7 @@
       </w:tr>
       <w:tr>
         <w:trPr>
-          <w:trHeight w:val="460" w:hRule="exact"/>
+          <w:trHeight w:val="470" w:hRule="exact"/>
         </w:trPr>
         <w:tc>
           <w:tcPr>
@@ -5939,7 +6359,7 @@
       </w:tr>
       <w:tr>
         <w:trPr>
-          <w:trHeight w:val="460" w:hRule="exact"/>
+          <w:trHeight w:val="470" w:hRule="exact"/>
         </w:trPr>
         <w:tc>
           <w:tcPr>
@@ -5974,7 +6394,7 @@
       </w:tr>
       <w:tr>
         <w:trPr>
-          <w:trHeight w:val="460" w:hRule="exact"/>
+          <w:trHeight w:val="470" w:hRule="exact"/>
         </w:trPr>
         <w:tc>
           <w:tcPr>
@@ -6009,7 +6429,7 @@
       </w:tr>
       <w:tr>
         <w:trPr>
-          <w:trHeight w:val="460" w:hRule="exact"/>
+          <w:trHeight w:val="470" w:hRule="exact"/>
         </w:trPr>
         <w:tc>
           <w:tcPr>
@@ -6044,7 +6464,7 @@
       </w:tr>
       <w:tr>
         <w:trPr>
-          <w:trHeight w:val="460" w:hRule="exact"/>
+          <w:trHeight w:val="470" w:hRule="exact"/>
         </w:trPr>
         <w:tc>
           <w:tcPr>
@@ -6079,7 +6499,7 @@
       </w:tr>
       <w:tr>
         <w:trPr>
-          <w:trHeight w:val="460" w:hRule="exact"/>
+          <w:trHeight w:val="470" w:hRule="exact"/>
         </w:trPr>
         <w:tc>
           <w:tcPr>
@@ -6114,7 +6534,7 @@
       </w:tr>
       <w:tr>
         <w:trPr>
-          <w:trHeight w:val="460" w:hRule="exact"/>
+          <w:trHeight w:val="470" w:hRule="exact"/>
         </w:trPr>
         <w:tc>
           <w:tcPr>
@@ -6149,7 +6569,217 @@
       </w:tr>
       <w:tr>
         <w:trPr>
-          <w:trHeight w:val="460" w:hRule="exact"/>
+          <w:trHeight w:val="470" w:hRule="exact"/>
+        </w:trPr>
+        <w:tc>
+          <w:tcPr>
+            <w:tcW w:type="dxa" w:w="10080"/>
+            <w:tcBorders>
+              <w:top w:val="none" w:color="FFFFFF" w:sz="0"/>
+              <w:left w:val="none" w:color="FFFFFF" w:sz="0"/>
+              <w:bottom w:val="single" w:color="C9D2DE" w:sz="4"/>
+              <w:right w:val="none" w:color="FFFFFF" w:sz="0"/>
+            </w:tcBorders>
+            <w:tcMar>
+              <w:top w:type="dxa" w:w="0"/>
+              <w:left w:type="dxa" w:w="0"/>
+              <w:bottom w:type="dxa" w:w="0"/>
+              <w:right w:type="dxa" w:w="0"/>
+            </w:tcMar>
+          </w:tcPr>
+          <w:p>
+            <w:pPr>
+              <w:spacing w:after="0" w:before="0"/>
+            </w:pPr>
+            <w:r>
+              <w:rPr>
+                <w:rFonts w:ascii="Calibri" w:cs="Calibri" w:eastAsia="Calibri" w:hAnsi="Calibri"/>
+                <w:sz w:val="22"/>
+                <w:szCs w:val="22"/>
+              </w:rPr>
+              <w:t xml:space="preserve"> </w:t>
+            </w:r>
+          </w:p>
+        </w:tc>
+      </w:tr>
+      <w:tr>
+        <w:trPr>
+          <w:trHeight w:val="470" w:hRule="exact"/>
+        </w:trPr>
+        <w:tc>
+          <w:tcPr>
+            <w:tcW w:type="dxa" w:w="10080"/>
+            <w:tcBorders>
+              <w:top w:val="none" w:color="FFFFFF" w:sz="0"/>
+              <w:left w:val="none" w:color="FFFFFF" w:sz="0"/>
+              <w:bottom w:val="single" w:color="C9D2DE" w:sz="4"/>
+              <w:right w:val="none" w:color="FFFFFF" w:sz="0"/>
+            </w:tcBorders>
+            <w:tcMar>
+              <w:top w:type="dxa" w:w="0"/>
+              <w:left w:type="dxa" w:w="0"/>
+              <w:bottom w:type="dxa" w:w="0"/>
+              <w:right w:type="dxa" w:w="0"/>
+            </w:tcMar>
+          </w:tcPr>
+          <w:p>
+            <w:pPr>
+              <w:spacing w:after="0" w:before="0"/>
+            </w:pPr>
+            <w:r>
+              <w:rPr>
+                <w:rFonts w:ascii="Calibri" w:cs="Calibri" w:eastAsia="Calibri" w:hAnsi="Calibri"/>
+                <w:sz w:val="22"/>
+                <w:szCs w:val="22"/>
+              </w:rPr>
+              <w:t xml:space="preserve"> </w:t>
+            </w:r>
+          </w:p>
+        </w:tc>
+      </w:tr>
+      <w:tr>
+        <w:trPr>
+          <w:trHeight w:val="470" w:hRule="exact"/>
+        </w:trPr>
+        <w:tc>
+          <w:tcPr>
+            <w:tcW w:type="dxa" w:w="10080"/>
+            <w:tcBorders>
+              <w:top w:val="none" w:color="FFFFFF" w:sz="0"/>
+              <w:left w:val="none" w:color="FFFFFF" w:sz="0"/>
+              <w:bottom w:val="single" w:color="C9D2DE" w:sz="4"/>
+              <w:right w:val="none" w:color="FFFFFF" w:sz="0"/>
+            </w:tcBorders>
+            <w:tcMar>
+              <w:top w:type="dxa" w:w="0"/>
+              <w:left w:type="dxa" w:w="0"/>
+              <w:bottom w:type="dxa" w:w="0"/>
+              <w:right w:type="dxa" w:w="0"/>
+            </w:tcMar>
+          </w:tcPr>
+          <w:p>
+            <w:pPr>
+              <w:spacing w:after="0" w:before="0"/>
+            </w:pPr>
+            <w:r>
+              <w:rPr>
+                <w:rFonts w:ascii="Calibri" w:cs="Calibri" w:eastAsia="Calibri" w:hAnsi="Calibri"/>
+                <w:sz w:val="22"/>
+                <w:szCs w:val="22"/>
+              </w:rPr>
+              <w:t xml:space="preserve"> </w:t>
+            </w:r>
+          </w:p>
+        </w:tc>
+      </w:tr>
+      <w:tr>
+        <w:trPr>
+          <w:trHeight w:val="470" w:hRule="exact"/>
+        </w:trPr>
+        <w:tc>
+          <w:tcPr>
+            <w:tcW w:type="dxa" w:w="10080"/>
+            <w:tcBorders>
+              <w:top w:val="none" w:color="FFFFFF" w:sz="0"/>
+              <w:left w:val="none" w:color="FFFFFF" w:sz="0"/>
+              <w:bottom w:val="single" w:color="C9D2DE" w:sz="4"/>
+              <w:right w:val="none" w:color="FFFFFF" w:sz="0"/>
+            </w:tcBorders>
+            <w:tcMar>
+              <w:top w:type="dxa" w:w="0"/>
+              <w:left w:type="dxa" w:w="0"/>
+              <w:bottom w:type="dxa" w:w="0"/>
+              <w:right w:type="dxa" w:w="0"/>
+            </w:tcMar>
+          </w:tcPr>
+          <w:p>
+            <w:pPr>
+              <w:spacing w:after="0" w:before="0"/>
+            </w:pPr>
+            <w:r>
+              <w:rPr>
+                <w:rFonts w:ascii="Calibri" w:cs="Calibri" w:eastAsia="Calibri" w:hAnsi="Calibri"/>
+                <w:sz w:val="22"/>
+                <w:szCs w:val="22"/>
+              </w:rPr>
+              <w:t xml:space="preserve"> </w:t>
+            </w:r>
+          </w:p>
+        </w:tc>
+      </w:tr>
+      <w:tr>
+        <w:trPr>
+          <w:trHeight w:val="470" w:hRule="exact"/>
+        </w:trPr>
+        <w:tc>
+          <w:tcPr>
+            <w:tcW w:type="dxa" w:w="10080"/>
+            <w:tcBorders>
+              <w:top w:val="none" w:color="FFFFFF" w:sz="0"/>
+              <w:left w:val="none" w:color="FFFFFF" w:sz="0"/>
+              <w:bottom w:val="single" w:color="C9D2DE" w:sz="4"/>
+              <w:right w:val="none" w:color="FFFFFF" w:sz="0"/>
+            </w:tcBorders>
+            <w:tcMar>
+              <w:top w:type="dxa" w:w="0"/>
+              <w:left w:type="dxa" w:w="0"/>
+              <w:bottom w:type="dxa" w:w="0"/>
+              <w:right w:type="dxa" w:w="0"/>
+            </w:tcMar>
+          </w:tcPr>
+          <w:p>
+            <w:pPr>
+              <w:spacing w:after="0" w:before="0"/>
+            </w:pPr>
+            <w:r>
+              <w:rPr>
+                <w:rFonts w:ascii="Calibri" w:cs="Calibri" w:eastAsia="Calibri" w:hAnsi="Calibri"/>
+                <w:sz w:val="22"/>
+                <w:szCs w:val="22"/>
+              </w:rPr>
+              <w:t xml:space="preserve"> </w:t>
+            </w:r>
+          </w:p>
+        </w:tc>
+      </w:tr>
+      <w:tr>
+        <w:trPr>
+          <w:trHeight w:val="470" w:hRule="exact"/>
+        </w:trPr>
+        <w:tc>
+          <w:tcPr>
+            <w:tcW w:type="dxa" w:w="10080"/>
+            <w:tcBorders>
+              <w:top w:val="none" w:color="FFFFFF" w:sz="0"/>
+              <w:left w:val="none" w:color="FFFFFF" w:sz="0"/>
+              <w:bottom w:val="single" w:color="C9D2DE" w:sz="4"/>
+              <w:right w:val="none" w:color="FFFFFF" w:sz="0"/>
+            </w:tcBorders>
+            <w:tcMar>
+              <w:top w:type="dxa" w:w="0"/>
+              <w:left w:type="dxa" w:w="0"/>
+              <w:bottom w:type="dxa" w:w="0"/>
+              <w:right w:type="dxa" w:w="0"/>
+            </w:tcMar>
+          </w:tcPr>
+          <w:p>
+            <w:pPr>
+              <w:spacing w:after="0" w:before="0"/>
+            </w:pPr>
+            <w:r>
+              <w:rPr>
+                <w:rFonts w:ascii="Calibri" w:cs="Calibri" w:eastAsia="Calibri" w:hAnsi="Calibri"/>
+                <w:sz w:val="22"/>
+                <w:szCs w:val="22"/>
+              </w:rPr>
+              <w:t xml:space="preserve"> </w:t>
+            </w:r>
+          </w:p>
+        </w:tc>
+      </w:tr>
+      <w:tr>
+        <w:trPr>
+          <w:trHeight w:val="470" w:hRule="exact"/>
         </w:trPr>
         <w:tc>
           <w:tcPr>
@@ -6466,7 +7096,7 @@
       </w:tblGrid>
       <w:tr>
         <w:trPr>
-          <w:trHeight w:val="460" w:hRule="exact"/>
+          <w:trHeight w:val="470" w:hRule="exact"/>
         </w:trPr>
         <w:tc>
           <w:tcPr>
@@ -6501,7 +7131,7 @@
       </w:tr>
       <w:tr>
         <w:trPr>
-          <w:trHeight w:val="460" w:hRule="exact"/>
+          <w:trHeight w:val="470" w:hRule="exact"/>
         </w:trPr>
         <w:tc>
           <w:tcPr>
@@ -6536,7 +7166,7 @@
       </w:tr>
       <w:tr>
         <w:trPr>
-          <w:trHeight w:val="460" w:hRule="exact"/>
+          <w:trHeight w:val="470" w:hRule="exact"/>
         </w:trPr>
         <w:tc>
           <w:tcPr>
@@ -6571,7 +7201,7 @@
       </w:tr>
       <w:tr>
         <w:trPr>
-          <w:trHeight w:val="460" w:hRule="exact"/>
+          <w:trHeight w:val="470" w:hRule="exact"/>
         </w:trPr>
         <w:tc>
           <w:tcPr>
@@ -6606,7 +7236,7 @@
       </w:tr>
       <w:tr>
         <w:trPr>
-          <w:trHeight w:val="460" w:hRule="exact"/>
+          <w:trHeight w:val="470" w:hRule="exact"/>
         </w:trPr>
         <w:tc>
           <w:tcPr>
@@ -6641,7 +7271,7 @@
       </w:tr>
       <w:tr>
         <w:trPr>
-          <w:trHeight w:val="460" w:hRule="exact"/>
+          <w:trHeight w:val="470" w:hRule="exact"/>
         </w:trPr>
         <w:tc>
           <w:tcPr>
@@ -6676,7 +7306,7 @@
       </w:tr>
       <w:tr>
         <w:trPr>
-          <w:trHeight w:val="460" w:hRule="exact"/>
+          <w:trHeight w:val="470" w:hRule="exact"/>
         </w:trPr>
         <w:tc>
           <w:tcPr>
@@ -6711,7 +7341,7 @@
       </w:tr>
       <w:tr>
         <w:trPr>
-          <w:trHeight w:val="460" w:hRule="exact"/>
+          <w:trHeight w:val="470" w:hRule="exact"/>
         </w:trPr>
         <w:tc>
           <w:tcPr>
@@ -6746,7 +7376,7 @@
       </w:tr>
       <w:tr>
         <w:trPr>
-          <w:trHeight w:val="460" w:hRule="exact"/>
+          <w:trHeight w:val="470" w:hRule="exact"/>
         </w:trPr>
         <w:tc>
           <w:tcPr>
@@ -6781,7 +7411,7 @@
       </w:tr>
       <w:tr>
         <w:trPr>
-          <w:trHeight w:val="460" w:hRule="exact"/>
+          <w:trHeight w:val="470" w:hRule="exact"/>
         </w:trPr>
         <w:tc>
           <w:tcPr>
@@ -6816,7 +7446,7 @@
       </w:tr>
       <w:tr>
         <w:trPr>
-          <w:trHeight w:val="460" w:hRule="exact"/>
+          <w:trHeight w:val="470" w:hRule="exact"/>
         </w:trPr>
         <w:tc>
           <w:tcPr>
@@ -6851,7 +7481,7 @@
       </w:tr>
       <w:tr>
         <w:trPr>
-          <w:trHeight w:val="460" w:hRule="exact"/>
+          <w:trHeight w:val="470" w:hRule="exact"/>
         </w:trPr>
         <w:tc>
           <w:tcPr>
@@ -6886,7 +7516,7 @@
       </w:tr>
       <w:tr>
         <w:trPr>
-          <w:trHeight w:val="460" w:hRule="exact"/>
+          <w:trHeight w:val="470" w:hRule="exact"/>
         </w:trPr>
         <w:tc>
           <w:tcPr>
@@ -6921,7 +7551,7 @@
       </w:tr>
       <w:tr>
         <w:trPr>
-          <w:trHeight w:val="460" w:hRule="exact"/>
+          <w:trHeight w:val="470" w:hRule="exact"/>
         </w:trPr>
         <w:tc>
           <w:tcPr>
@@ -6956,7 +7586,7 @@
       </w:tr>
       <w:tr>
         <w:trPr>
-          <w:trHeight w:val="460" w:hRule="exact"/>
+          <w:trHeight w:val="470" w:hRule="exact"/>
         </w:trPr>
         <w:tc>
           <w:tcPr>
@@ -6991,7 +7621,7 @@
       </w:tr>
       <w:tr>
         <w:trPr>
-          <w:trHeight w:val="460" w:hRule="exact"/>
+          <w:trHeight w:val="470" w:hRule="exact"/>
         </w:trPr>
         <w:tc>
           <w:tcPr>
@@ -7026,7 +7656,7 @@
       </w:tr>
       <w:tr>
         <w:trPr>
-          <w:trHeight w:val="460" w:hRule="exact"/>
+          <w:trHeight w:val="470" w:hRule="exact"/>
         </w:trPr>
         <w:tc>
           <w:tcPr>
@@ -7061,7 +7691,7 @@
       </w:tr>
       <w:tr>
         <w:trPr>
-          <w:trHeight w:val="460" w:hRule="exact"/>
+          <w:trHeight w:val="470" w:hRule="exact"/>
         </w:trPr>
         <w:tc>
           <w:tcPr>
@@ -7096,7 +7726,7 @@
       </w:tr>
       <w:tr>
         <w:trPr>
-          <w:trHeight w:val="460" w:hRule="exact"/>
+          <w:trHeight w:val="470" w:hRule="exact"/>
         </w:trPr>
         <w:tc>
           <w:tcPr>
@@ -7131,7 +7761,217 @@
       </w:tr>
       <w:tr>
         <w:trPr>
-          <w:trHeight w:val="460" w:hRule="exact"/>
+          <w:trHeight w:val="470" w:hRule="exact"/>
+        </w:trPr>
+        <w:tc>
+          <w:tcPr>
+            <w:tcW w:type="dxa" w:w="10080"/>
+            <w:tcBorders>
+              <w:top w:val="none" w:color="FFFFFF" w:sz="0"/>
+              <w:left w:val="none" w:color="FFFFFF" w:sz="0"/>
+              <w:bottom w:val="single" w:color="C9D2DE" w:sz="4"/>
+              <w:right w:val="none" w:color="FFFFFF" w:sz="0"/>
+            </w:tcBorders>
+            <w:tcMar>
+              <w:top w:type="dxa" w:w="0"/>
+              <w:left w:type="dxa" w:w="0"/>
+              <w:bottom w:type="dxa" w:w="0"/>
+              <w:right w:type="dxa" w:w="0"/>
+            </w:tcMar>
+          </w:tcPr>
+          <w:p>
+            <w:pPr>
+              <w:spacing w:after="0" w:before="0"/>
+            </w:pPr>
+            <w:r>
+              <w:rPr>
+                <w:rFonts w:ascii="Calibri" w:cs="Calibri" w:eastAsia="Calibri" w:hAnsi="Calibri"/>
+                <w:sz w:val="22"/>
+                <w:szCs w:val="22"/>
+              </w:rPr>
+              <w:t xml:space="preserve"> </w:t>
+            </w:r>
+          </w:p>
+        </w:tc>
+      </w:tr>
+      <w:tr>
+        <w:trPr>
+          <w:trHeight w:val="470" w:hRule="exact"/>
+        </w:trPr>
+        <w:tc>
+          <w:tcPr>
+            <w:tcW w:type="dxa" w:w="10080"/>
+            <w:tcBorders>
+              <w:top w:val="none" w:color="FFFFFF" w:sz="0"/>
+              <w:left w:val="none" w:color="FFFFFF" w:sz="0"/>
+              <w:bottom w:val="single" w:color="C9D2DE" w:sz="4"/>
+              <w:right w:val="none" w:color="FFFFFF" w:sz="0"/>
+            </w:tcBorders>
+            <w:tcMar>
+              <w:top w:type="dxa" w:w="0"/>
+              <w:left w:type="dxa" w:w="0"/>
+              <w:bottom w:type="dxa" w:w="0"/>
+              <w:right w:type="dxa" w:w="0"/>
+            </w:tcMar>
+          </w:tcPr>
+          <w:p>
+            <w:pPr>
+              <w:spacing w:after="0" w:before="0"/>
+            </w:pPr>
+            <w:r>
+              <w:rPr>
+                <w:rFonts w:ascii="Calibri" w:cs="Calibri" w:eastAsia="Calibri" w:hAnsi="Calibri"/>
+                <w:sz w:val="22"/>
+                <w:szCs w:val="22"/>
+              </w:rPr>
+              <w:t xml:space="preserve"> </w:t>
+            </w:r>
+          </w:p>
+        </w:tc>
+      </w:tr>
+      <w:tr>
+        <w:trPr>
+          <w:trHeight w:val="470" w:hRule="exact"/>
+        </w:trPr>
+        <w:tc>
+          <w:tcPr>
+            <w:tcW w:type="dxa" w:w="10080"/>
+            <w:tcBorders>
+              <w:top w:val="none" w:color="FFFFFF" w:sz="0"/>
+              <w:left w:val="none" w:color="FFFFFF" w:sz="0"/>
+              <w:bottom w:val="single" w:color="C9D2DE" w:sz="4"/>
+              <w:right w:val="none" w:color="FFFFFF" w:sz="0"/>
+            </w:tcBorders>
+            <w:tcMar>
+              <w:top w:type="dxa" w:w="0"/>
+              <w:left w:type="dxa" w:w="0"/>
+              <w:bottom w:type="dxa" w:w="0"/>
+              <w:right w:type="dxa" w:w="0"/>
+            </w:tcMar>
+          </w:tcPr>
+          <w:p>
+            <w:pPr>
+              <w:spacing w:after="0" w:before="0"/>
+            </w:pPr>
+            <w:r>
+              <w:rPr>
+                <w:rFonts w:ascii="Calibri" w:cs="Calibri" w:eastAsia="Calibri" w:hAnsi="Calibri"/>
+                <w:sz w:val="22"/>
+                <w:szCs w:val="22"/>
+              </w:rPr>
+              <w:t xml:space="preserve"> </w:t>
+            </w:r>
+          </w:p>
+        </w:tc>
+      </w:tr>
+      <w:tr>
+        <w:trPr>
+          <w:trHeight w:val="470" w:hRule="exact"/>
+        </w:trPr>
+        <w:tc>
+          <w:tcPr>
+            <w:tcW w:type="dxa" w:w="10080"/>
+            <w:tcBorders>
+              <w:top w:val="none" w:color="FFFFFF" w:sz="0"/>
+              <w:left w:val="none" w:color="FFFFFF" w:sz="0"/>
+              <w:bottom w:val="single" w:color="C9D2DE" w:sz="4"/>
+              <w:right w:val="none" w:color="FFFFFF" w:sz="0"/>
+            </w:tcBorders>
+            <w:tcMar>
+              <w:top w:type="dxa" w:w="0"/>
+              <w:left w:type="dxa" w:w="0"/>
+              <w:bottom w:type="dxa" w:w="0"/>
+              <w:right w:type="dxa" w:w="0"/>
+            </w:tcMar>
+          </w:tcPr>
+          <w:p>
+            <w:pPr>
+              <w:spacing w:after="0" w:before="0"/>
+            </w:pPr>
+            <w:r>
+              <w:rPr>
+                <w:rFonts w:ascii="Calibri" w:cs="Calibri" w:eastAsia="Calibri" w:hAnsi="Calibri"/>
+                <w:sz w:val="22"/>
+                <w:szCs w:val="22"/>
+              </w:rPr>
+              <w:t xml:space="preserve"> </w:t>
+            </w:r>
+          </w:p>
+        </w:tc>
+      </w:tr>
+      <w:tr>
+        <w:trPr>
+          <w:trHeight w:val="470" w:hRule="exact"/>
+        </w:trPr>
+        <w:tc>
+          <w:tcPr>
+            <w:tcW w:type="dxa" w:w="10080"/>
+            <w:tcBorders>
+              <w:top w:val="none" w:color="FFFFFF" w:sz="0"/>
+              <w:left w:val="none" w:color="FFFFFF" w:sz="0"/>
+              <w:bottom w:val="single" w:color="C9D2DE" w:sz="4"/>
+              <w:right w:val="none" w:color="FFFFFF" w:sz="0"/>
+            </w:tcBorders>
+            <w:tcMar>
+              <w:top w:type="dxa" w:w="0"/>
+              <w:left w:type="dxa" w:w="0"/>
+              <w:bottom w:type="dxa" w:w="0"/>
+              <w:right w:type="dxa" w:w="0"/>
+            </w:tcMar>
+          </w:tcPr>
+          <w:p>
+            <w:pPr>
+              <w:spacing w:after="0" w:before="0"/>
+            </w:pPr>
+            <w:r>
+              <w:rPr>
+                <w:rFonts w:ascii="Calibri" w:cs="Calibri" w:eastAsia="Calibri" w:hAnsi="Calibri"/>
+                <w:sz w:val="22"/>
+                <w:szCs w:val="22"/>
+              </w:rPr>
+              <w:t xml:space="preserve"> </w:t>
+            </w:r>
+          </w:p>
+        </w:tc>
+      </w:tr>
+      <w:tr>
+        <w:trPr>
+          <w:trHeight w:val="470" w:hRule="exact"/>
+        </w:trPr>
+        <w:tc>
+          <w:tcPr>
+            <w:tcW w:type="dxa" w:w="10080"/>
+            <w:tcBorders>
+              <w:top w:val="none" w:color="FFFFFF" w:sz="0"/>
+              <w:left w:val="none" w:color="FFFFFF" w:sz="0"/>
+              <w:bottom w:val="single" w:color="C9D2DE" w:sz="4"/>
+              <w:right w:val="none" w:color="FFFFFF" w:sz="0"/>
+            </w:tcBorders>
+            <w:tcMar>
+              <w:top w:type="dxa" w:w="0"/>
+              <w:left w:type="dxa" w:w="0"/>
+              <w:bottom w:type="dxa" w:w="0"/>
+              <w:right w:type="dxa" w:w="0"/>
+            </w:tcMar>
+          </w:tcPr>
+          <w:p>
+            <w:pPr>
+              <w:spacing w:after="0" w:before="0"/>
+            </w:pPr>
+            <w:r>
+              <w:rPr>
+                <w:rFonts w:ascii="Calibri" w:cs="Calibri" w:eastAsia="Calibri" w:hAnsi="Calibri"/>
+                <w:sz w:val="22"/>
+                <w:szCs w:val="22"/>
+              </w:rPr>
+              <w:t xml:space="preserve"> </w:t>
+            </w:r>
+          </w:p>
+        </w:tc>
+      </w:tr>
+      <w:tr>
+        <w:trPr>
+          <w:trHeight w:val="470" w:hRule="exact"/>
         </w:trPr>
         <w:tc>
           <w:tcPr>
@@ -7448,7 +8288,7 @@
       </w:tblGrid>
       <w:tr>
         <w:trPr>
-          <w:trHeight w:val="460" w:hRule="exact"/>
+          <w:trHeight w:val="470" w:hRule="exact"/>
         </w:trPr>
         <w:tc>
           <w:tcPr>
@@ -7483,7 +8323,7 @@
       </w:tr>
       <w:tr>
         <w:trPr>
-          <w:trHeight w:val="460" w:hRule="exact"/>
+          <w:trHeight w:val="470" w:hRule="exact"/>
         </w:trPr>
         <w:tc>
           <w:tcPr>
@@ -7518,7 +8358,7 @@
       </w:tr>
       <w:tr>
         <w:trPr>
-          <w:trHeight w:val="460" w:hRule="exact"/>
+          <w:trHeight w:val="470" w:hRule="exact"/>
         </w:trPr>
         <w:tc>
           <w:tcPr>
@@ -7553,7 +8393,7 @@
       </w:tr>
       <w:tr>
         <w:trPr>
-          <w:trHeight w:val="460" w:hRule="exact"/>
+          <w:trHeight w:val="470" w:hRule="exact"/>
         </w:trPr>
         <w:tc>
           <w:tcPr>
@@ -7588,7 +8428,7 @@
       </w:tr>
       <w:tr>
         <w:trPr>
-          <w:trHeight w:val="460" w:hRule="exact"/>
+          <w:trHeight w:val="470" w:hRule="exact"/>
         </w:trPr>
         <w:tc>
           <w:tcPr>
@@ -7623,7 +8463,7 @@
       </w:tr>
       <w:tr>
         <w:trPr>
-          <w:trHeight w:val="460" w:hRule="exact"/>
+          <w:trHeight w:val="470" w:hRule="exact"/>
         </w:trPr>
         <w:tc>
           <w:tcPr>
@@ -7658,7 +8498,7 @@
       </w:tr>
       <w:tr>
         <w:trPr>
-          <w:trHeight w:val="460" w:hRule="exact"/>
+          <w:trHeight w:val="470" w:hRule="exact"/>
         </w:trPr>
         <w:tc>
           <w:tcPr>
@@ -7693,7 +8533,7 @@
       </w:tr>
       <w:tr>
         <w:trPr>
-          <w:trHeight w:val="460" w:hRule="exact"/>
+          <w:trHeight w:val="470" w:hRule="exact"/>
         </w:trPr>
         <w:tc>
           <w:tcPr>
@@ -7728,7 +8568,7 @@
       </w:tr>
       <w:tr>
         <w:trPr>
-          <w:trHeight w:val="460" w:hRule="exact"/>
+          <w:trHeight w:val="470" w:hRule="exact"/>
         </w:trPr>
         <w:tc>
           <w:tcPr>
@@ -7763,7 +8603,7 @@
       </w:tr>
       <w:tr>
         <w:trPr>
-          <w:trHeight w:val="460" w:hRule="exact"/>
+          <w:trHeight w:val="470" w:hRule="exact"/>
         </w:trPr>
         <w:tc>
           <w:tcPr>
@@ -7798,7 +8638,7 @@
       </w:tr>
       <w:tr>
         <w:trPr>
-          <w:trHeight w:val="460" w:hRule="exact"/>
+          <w:trHeight w:val="470" w:hRule="exact"/>
         </w:trPr>
         <w:tc>
           <w:tcPr>
@@ -7833,7 +8673,7 @@
       </w:tr>
       <w:tr>
         <w:trPr>
-          <w:trHeight w:val="460" w:hRule="exact"/>
+          <w:trHeight w:val="470" w:hRule="exact"/>
         </w:trPr>
         <w:tc>
           <w:tcPr>
@@ -7868,7 +8708,7 @@
       </w:tr>
       <w:tr>
         <w:trPr>
-          <w:trHeight w:val="460" w:hRule="exact"/>
+          <w:trHeight w:val="470" w:hRule="exact"/>
         </w:trPr>
         <w:tc>
           <w:tcPr>
@@ -7903,7 +8743,7 @@
       </w:tr>
       <w:tr>
         <w:trPr>
-          <w:trHeight w:val="460" w:hRule="exact"/>
+          <w:trHeight w:val="470" w:hRule="exact"/>
         </w:trPr>
         <w:tc>
           <w:tcPr>
@@ -7938,7 +8778,7 @@
       </w:tr>
       <w:tr>
         <w:trPr>
-          <w:trHeight w:val="460" w:hRule="exact"/>
+          <w:trHeight w:val="470" w:hRule="exact"/>
         </w:trPr>
         <w:tc>
           <w:tcPr>
@@ -7973,7 +8813,7 @@
       </w:tr>
       <w:tr>
         <w:trPr>
-          <w:trHeight w:val="460" w:hRule="exact"/>
+          <w:trHeight w:val="470" w:hRule="exact"/>
         </w:trPr>
         <w:tc>
           <w:tcPr>
@@ -8008,7 +8848,7 @@
       </w:tr>
       <w:tr>
         <w:trPr>
-          <w:trHeight w:val="460" w:hRule="exact"/>
+          <w:trHeight w:val="470" w:hRule="exact"/>
         </w:trPr>
         <w:tc>
           <w:tcPr>
@@ -8043,7 +8883,7 @@
       </w:tr>
       <w:tr>
         <w:trPr>
-          <w:trHeight w:val="460" w:hRule="exact"/>
+          <w:trHeight w:val="470" w:hRule="exact"/>
         </w:trPr>
         <w:tc>
           <w:tcPr>
@@ -8078,7 +8918,7 @@
       </w:tr>
       <w:tr>
         <w:trPr>
-          <w:trHeight w:val="460" w:hRule="exact"/>
+          <w:trHeight w:val="470" w:hRule="exact"/>
         </w:trPr>
         <w:tc>
           <w:tcPr>
@@ -8113,7 +8953,217 @@
       </w:tr>
       <w:tr>
         <w:trPr>
-          <w:trHeight w:val="460" w:hRule="exact"/>
+          <w:trHeight w:val="470" w:hRule="exact"/>
+        </w:trPr>
+        <w:tc>
+          <w:tcPr>
+            <w:tcW w:type="dxa" w:w="10080"/>
+            <w:tcBorders>
+              <w:top w:val="none" w:color="FFFFFF" w:sz="0"/>
+              <w:left w:val="none" w:color="FFFFFF" w:sz="0"/>
+              <w:bottom w:val="single" w:color="C9D2DE" w:sz="4"/>
+              <w:right w:val="none" w:color="FFFFFF" w:sz="0"/>
+            </w:tcBorders>
+            <w:tcMar>
+              <w:top w:type="dxa" w:w="0"/>
+              <w:left w:type="dxa" w:w="0"/>
+              <w:bottom w:type="dxa" w:w="0"/>
+              <w:right w:type="dxa" w:w="0"/>
+            </w:tcMar>
+          </w:tcPr>
+          <w:p>
+            <w:pPr>
+              <w:spacing w:after="0" w:before="0"/>
+            </w:pPr>
+            <w:r>
+              <w:rPr>
+                <w:rFonts w:ascii="Calibri" w:cs="Calibri" w:eastAsia="Calibri" w:hAnsi="Calibri"/>
+                <w:sz w:val="22"/>
+                <w:szCs w:val="22"/>
+              </w:rPr>
+              <w:t xml:space="preserve"> </w:t>
+            </w:r>
+          </w:p>
+        </w:tc>
+      </w:tr>
+      <w:tr>
+        <w:trPr>
+          <w:trHeight w:val="470" w:hRule="exact"/>
+        </w:trPr>
+        <w:tc>
+          <w:tcPr>
+            <w:tcW w:type="dxa" w:w="10080"/>
+            <w:tcBorders>
+              <w:top w:val="none" w:color="FFFFFF" w:sz="0"/>
+              <w:left w:val="none" w:color="FFFFFF" w:sz="0"/>
+              <w:bottom w:val="single" w:color="C9D2DE" w:sz="4"/>
+              <w:right w:val="none" w:color="FFFFFF" w:sz="0"/>
+            </w:tcBorders>
+            <w:tcMar>
+              <w:top w:type="dxa" w:w="0"/>
+              <w:left w:type="dxa" w:w="0"/>
+              <w:bottom w:type="dxa" w:w="0"/>
+              <w:right w:type="dxa" w:w="0"/>
+            </w:tcMar>
+          </w:tcPr>
+          <w:p>
+            <w:pPr>
+              <w:spacing w:after="0" w:before="0"/>
+            </w:pPr>
+            <w:r>
+              <w:rPr>
+                <w:rFonts w:ascii="Calibri" w:cs="Calibri" w:eastAsia="Calibri" w:hAnsi="Calibri"/>
+                <w:sz w:val="22"/>
+                <w:szCs w:val="22"/>
+              </w:rPr>
+              <w:t xml:space="preserve"> </w:t>
+            </w:r>
+          </w:p>
+        </w:tc>
+      </w:tr>
+      <w:tr>
+        <w:trPr>
+          <w:trHeight w:val="470" w:hRule="exact"/>
+        </w:trPr>
+        <w:tc>
+          <w:tcPr>
+            <w:tcW w:type="dxa" w:w="10080"/>
+            <w:tcBorders>
+              <w:top w:val="none" w:color="FFFFFF" w:sz="0"/>
+              <w:left w:val="none" w:color="FFFFFF" w:sz="0"/>
+              <w:bottom w:val="single" w:color="C9D2DE" w:sz="4"/>
+              <w:right w:val="none" w:color="FFFFFF" w:sz="0"/>
+            </w:tcBorders>
+            <w:tcMar>
+              <w:top w:type="dxa" w:w="0"/>
+              <w:left w:type="dxa" w:w="0"/>
+              <w:bottom w:type="dxa" w:w="0"/>
+              <w:right w:type="dxa" w:w="0"/>
+            </w:tcMar>
+          </w:tcPr>
+          <w:p>
+            <w:pPr>
+              <w:spacing w:after="0" w:before="0"/>
+            </w:pPr>
+            <w:r>
+              <w:rPr>
+                <w:rFonts w:ascii="Calibri" w:cs="Calibri" w:eastAsia="Calibri" w:hAnsi="Calibri"/>
+                <w:sz w:val="22"/>
+                <w:szCs w:val="22"/>
+              </w:rPr>
+              <w:t xml:space="preserve"> </w:t>
+            </w:r>
+          </w:p>
+        </w:tc>
+      </w:tr>
+      <w:tr>
+        <w:trPr>
+          <w:trHeight w:val="470" w:hRule="exact"/>
+        </w:trPr>
+        <w:tc>
+          <w:tcPr>
+            <w:tcW w:type="dxa" w:w="10080"/>
+            <w:tcBorders>
+              <w:top w:val="none" w:color="FFFFFF" w:sz="0"/>
+              <w:left w:val="none" w:color="FFFFFF" w:sz="0"/>
+              <w:bottom w:val="single" w:color="C9D2DE" w:sz="4"/>
+              <w:right w:val="none" w:color="FFFFFF" w:sz="0"/>
+            </w:tcBorders>
+            <w:tcMar>
+              <w:top w:type="dxa" w:w="0"/>
+              <w:left w:type="dxa" w:w="0"/>
+              <w:bottom w:type="dxa" w:w="0"/>
+              <w:right w:type="dxa" w:w="0"/>
+            </w:tcMar>
+          </w:tcPr>
+          <w:p>
+            <w:pPr>
+              <w:spacing w:after="0" w:before="0"/>
+            </w:pPr>
+            <w:r>
+              <w:rPr>
+                <w:rFonts w:ascii="Calibri" w:cs="Calibri" w:eastAsia="Calibri" w:hAnsi="Calibri"/>
+                <w:sz w:val="22"/>
+                <w:szCs w:val="22"/>
+              </w:rPr>
+              <w:t xml:space="preserve"> </w:t>
+            </w:r>
+          </w:p>
+        </w:tc>
+      </w:tr>
+      <w:tr>
+        <w:trPr>
+          <w:trHeight w:val="470" w:hRule="exact"/>
+        </w:trPr>
+        <w:tc>
+          <w:tcPr>
+            <w:tcW w:type="dxa" w:w="10080"/>
+            <w:tcBorders>
+              <w:top w:val="none" w:color="FFFFFF" w:sz="0"/>
+              <w:left w:val="none" w:color="FFFFFF" w:sz="0"/>
+              <w:bottom w:val="single" w:color="C9D2DE" w:sz="4"/>
+              <w:right w:val="none" w:color="FFFFFF" w:sz="0"/>
+            </w:tcBorders>
+            <w:tcMar>
+              <w:top w:type="dxa" w:w="0"/>
+              <w:left w:type="dxa" w:w="0"/>
+              <w:bottom w:type="dxa" w:w="0"/>
+              <w:right w:type="dxa" w:w="0"/>
+            </w:tcMar>
+          </w:tcPr>
+          <w:p>
+            <w:pPr>
+              <w:spacing w:after="0" w:before="0"/>
+            </w:pPr>
+            <w:r>
+              <w:rPr>
+                <w:rFonts w:ascii="Calibri" w:cs="Calibri" w:eastAsia="Calibri" w:hAnsi="Calibri"/>
+                <w:sz w:val="22"/>
+                <w:szCs w:val="22"/>
+              </w:rPr>
+              <w:t xml:space="preserve"> </w:t>
+            </w:r>
+          </w:p>
+        </w:tc>
+      </w:tr>
+      <w:tr>
+        <w:trPr>
+          <w:trHeight w:val="470" w:hRule="exact"/>
+        </w:trPr>
+        <w:tc>
+          <w:tcPr>
+            <w:tcW w:type="dxa" w:w="10080"/>
+            <w:tcBorders>
+              <w:top w:val="none" w:color="FFFFFF" w:sz="0"/>
+              <w:left w:val="none" w:color="FFFFFF" w:sz="0"/>
+              <w:bottom w:val="single" w:color="C9D2DE" w:sz="4"/>
+              <w:right w:val="none" w:color="FFFFFF" w:sz="0"/>
+            </w:tcBorders>
+            <w:tcMar>
+              <w:top w:type="dxa" w:w="0"/>
+              <w:left w:type="dxa" w:w="0"/>
+              <w:bottom w:type="dxa" w:w="0"/>
+              <w:right w:type="dxa" w:w="0"/>
+            </w:tcMar>
+          </w:tcPr>
+          <w:p>
+            <w:pPr>
+              <w:spacing w:after="0" w:before="0"/>
+            </w:pPr>
+            <w:r>
+              <w:rPr>
+                <w:rFonts w:ascii="Calibri" w:cs="Calibri" w:eastAsia="Calibri" w:hAnsi="Calibri"/>
+                <w:sz w:val="22"/>
+                <w:szCs w:val="22"/>
+              </w:rPr>
+              <w:t xml:space="preserve"> </w:t>
+            </w:r>
+          </w:p>
+        </w:tc>
+      </w:tr>
+      <w:tr>
+        <w:trPr>
+          <w:trHeight w:val="470" w:hRule="exact"/>
         </w:trPr>
         <w:tc>
           <w:tcPr>

</xml_diff>

<commit_message>
workbook: back cover in its own section, no header/footer/page number on Thank You page
</commit_message>
<xml_diff>
--- a/deliverables/workbook/Workbook.docx
+++ b/deliverables/workbook/Workbook.docx
@@ -5795,7 +5795,7 @@
                           </pic:cNvPicPr>
                         </pic:nvPicPr>
                         <pic:blipFill>
-                          <a:blip r:embed="rId11" cstate="none"/>
+                          <a:blip r:embed="rId13" cstate="none"/>
                           <a:srcRect/>
                           <a:stretch>
                             <a:fillRect/>
@@ -6987,7 +6987,7 @@
                           </pic:cNvPicPr>
                         </pic:nvPicPr>
                         <pic:blipFill>
-                          <a:blip r:embed="rId12" cstate="none"/>
+                          <a:blip r:embed="rId14" cstate="none"/>
                           <a:srcRect/>
                           <a:stretch>
                             <a:fillRect/>
@@ -8179,7 +8179,7 @@
                           </pic:cNvPicPr>
                         </pic:nvPicPr>
                         <pic:blipFill>
-                          <a:blip r:embed="rId13" cstate="none"/>
+                          <a:blip r:embed="rId15" cstate="none"/>
                           <a:srcRect/>
                           <a:stretch>
                             <a:fillRect/>
@@ -9315,7 +9315,7 @@
                           </pic:cNvPicPr>
                         </pic:nvPicPr>
                         <pic:blipFill>
-                          <a:blip r:embed="rId14" cstate="none"/>
+                          <a:blip r:embed="rId16" cstate="none"/>
                           <a:srcRect/>
                           <a:stretch>
                             <a:fillRect/>
@@ -9473,7 +9473,7 @@
                           </pic:cNvPicPr>
                         </pic:nvPicPr>
                         <pic:blipFill>
-                          <a:blip r:embed="rId15" cstate="none"/>
+                          <a:blip r:embed="rId17" cstate="none"/>
                           <a:srcRect/>
                           <a:stretch>
                             <a:fillRect/>
@@ -9631,7 +9631,7 @@
                           </pic:cNvPicPr>
                         </pic:nvPicPr>
                         <pic:blipFill>
-                          <a:blip r:embed="rId16" cstate="none"/>
+                          <a:blip r:embed="rId18" cstate="none"/>
                           <a:srcRect/>
                           <a:stretch>
                             <a:fillRect/>
@@ -9901,7 +9901,7 @@
                                 </pic:cNvPicPr>
                               </pic:nvPicPr>
                               <pic:blipFill>
-                                <a:blip r:embed="rId17" cstate="none"/>
+                                <a:blip r:embed="rId19" cstate="none"/>
                                 <a:srcRect/>
                                 <a:stretch>
                                   <a:fillRect/>
@@ -9982,7 +9982,7 @@
                                 </pic:cNvPicPr>
                               </pic:nvPicPr>
                               <pic:blipFill>
-                                <a:blip r:embed="rId18" cstate="none"/>
+                                <a:blip r:embed="rId20" cstate="none"/>
                                 <a:srcRect/>
                                 <a:stretch>
                                   <a:fillRect/>
@@ -10088,7 +10088,7 @@
                                 </pic:cNvPicPr>
                               </pic:nvPicPr>
                               <pic:blipFill>
-                                <a:blip r:embed="rId19" cstate="none"/>
+                                <a:blip r:embed="rId21" cstate="none"/>
                                 <a:srcRect/>
                                 <a:stretch>
                                   <a:fillRect/>
@@ -10169,7 +10169,7 @@
                                 </pic:cNvPicPr>
                               </pic:nvPicPr>
                               <pic:blipFill>
-                                <a:blip r:embed="rId20" cstate="none"/>
+                                <a:blip r:embed="rId22" cstate="none"/>
                                 <a:srcRect/>
                                 <a:stretch>
                                   <a:fillRect/>
@@ -10322,7 +10322,7 @@
                                 </pic:cNvPicPr>
                               </pic:nvPicPr>
                               <pic:blipFill>
-                                <a:blip r:embed="rId21" cstate="none"/>
+                                <a:blip r:embed="rId23" cstate="none"/>
                                 <a:srcRect/>
                                 <a:stretch>
                                   <a:fillRect/>
@@ -10403,7 +10403,7 @@
                                 </pic:cNvPicPr>
                               </pic:nvPicPr>
                               <pic:blipFill>
-                                <a:blip r:embed="rId22" cstate="none"/>
+                                <a:blip r:embed="rId24" cstate="none"/>
                                 <a:srcRect/>
                                 <a:stretch>
                                   <a:fillRect/>
@@ -10509,7 +10509,7 @@
                                 </pic:cNvPicPr>
                               </pic:nvPicPr>
                               <pic:blipFill>
-                                <a:blip r:embed="rId23" cstate="none"/>
+                                <a:blip r:embed="rId25" cstate="none"/>
                                 <a:srcRect/>
                                 <a:stretch>
                                   <a:fillRect/>
@@ -10590,7 +10590,7 @@
                                 </pic:cNvPicPr>
                               </pic:nvPicPr>
                               <pic:blipFill>
-                                <a:blip r:embed="rId24" cstate="none"/>
+                                <a:blip r:embed="rId26" cstate="none"/>
                                 <a:srcRect/>
                                 <a:stretch>
                                   <a:fillRect/>
@@ -10743,7 +10743,7 @@
                                 </pic:cNvPicPr>
                               </pic:nvPicPr>
                               <pic:blipFill>
-                                <a:blip r:embed="rId25" cstate="none"/>
+                                <a:blip r:embed="rId27" cstate="none"/>
                                 <a:srcRect/>
                                 <a:stretch>
                                   <a:fillRect/>
@@ -10824,7 +10824,7 @@
                                 </pic:cNvPicPr>
                               </pic:nvPicPr>
                               <pic:blipFill>
-                                <a:blip r:embed="rId26" cstate="none"/>
+                                <a:blip r:embed="rId28" cstate="none"/>
                                 <a:srcRect/>
                                 <a:stretch>
                                   <a:fillRect/>
@@ -10930,7 +10930,7 @@
                                 </pic:cNvPicPr>
                               </pic:nvPicPr>
                               <pic:blipFill>
-                                <a:blip r:embed="rId27" cstate="none"/>
+                                <a:blip r:embed="rId29" cstate="none"/>
                                 <a:srcRect/>
                                 <a:stretch>
                                   <a:fillRect/>
@@ -11011,7 +11011,7 @@
                                 </pic:cNvPicPr>
                               </pic:nvPicPr>
                               <pic:blipFill>
-                                <a:blip r:embed="rId28" cstate="none"/>
+                                <a:blip r:embed="rId30" cstate="none"/>
                                 <a:srcRect/>
                                 <a:stretch>
                                   <a:fillRect/>
@@ -11164,7 +11164,7 @@
                                 </pic:cNvPicPr>
                               </pic:nvPicPr>
                               <pic:blipFill>
-                                <a:blip r:embed="rId29" cstate="none"/>
+                                <a:blip r:embed="rId31" cstate="none"/>
                                 <a:srcRect/>
                                 <a:stretch>
                                   <a:fillRect/>
@@ -11245,7 +11245,7 @@
                                 </pic:cNvPicPr>
                               </pic:nvPicPr>
                               <pic:blipFill>
-                                <a:blip r:embed="rId30" cstate="none"/>
+                                <a:blip r:embed="rId32" cstate="none"/>
                                 <a:srcRect/>
                                 <a:stretch>
                                   <a:fillRect/>
@@ -11351,7 +11351,7 @@
                                 </pic:cNvPicPr>
                               </pic:nvPicPr>
                               <pic:blipFill>
-                                <a:blip r:embed="rId31" cstate="none"/>
+                                <a:blip r:embed="rId33" cstate="none"/>
                                 <a:srcRect/>
                                 <a:stretch>
                                   <a:fillRect/>
@@ -11432,7 +11432,7 @@
                                 </pic:cNvPicPr>
                               </pic:nvPicPr>
                               <pic:blipFill>
-                                <a:blip r:embed="rId32" cstate="none"/>
+                                <a:blip r:embed="rId34" cstate="none"/>
                                 <a:srcRect/>
                                 <a:stretch>
                                   <a:fillRect/>
@@ -11587,7 +11587,7 @@
                                 </pic:cNvPicPr>
                               </pic:nvPicPr>
                               <pic:blipFill>
-                                <a:blip r:embed="rId33" cstate="none"/>
+                                <a:blip r:embed="rId35" cstate="none"/>
                                 <a:srcRect/>
                                 <a:stretch>
                                   <a:fillRect/>
@@ -11668,7 +11668,7 @@
                                 </pic:cNvPicPr>
                               </pic:nvPicPr>
                               <pic:blipFill>
-                                <a:blip r:embed="rId34" cstate="none"/>
+                                <a:blip r:embed="rId36" cstate="none"/>
                                 <a:srcRect/>
                                 <a:stretch>
                                   <a:fillRect/>
@@ -11774,7 +11774,7 @@
                                 </pic:cNvPicPr>
                               </pic:nvPicPr>
                               <pic:blipFill>
-                                <a:blip r:embed="rId35" cstate="none"/>
+                                <a:blip r:embed="rId37" cstate="none"/>
                                 <a:srcRect/>
                                 <a:stretch>
                                   <a:fillRect/>
@@ -11855,7 +11855,7 @@
                                 </pic:cNvPicPr>
                               </pic:nvPicPr>
                               <pic:blipFill>
-                                <a:blip r:embed="rId36" cstate="none"/>
+                                <a:blip r:embed="rId38" cstate="none"/>
                                 <a:srcRect/>
                                 <a:stretch>
                                   <a:fillRect/>
@@ -11961,7 +11961,7 @@
                                 </pic:cNvPicPr>
                               </pic:nvPicPr>
                               <pic:blipFill>
-                                <a:blip r:embed="rId37" cstate="none"/>
+                                <a:blip r:embed="rId39" cstate="none"/>
                                 <a:srcRect/>
                                 <a:stretch>
                                   <a:fillRect/>
@@ -12042,7 +12042,7 @@
                                 </pic:cNvPicPr>
                               </pic:nvPicPr>
                               <pic:blipFill>
-                                <a:blip r:embed="rId38" cstate="none"/>
+                                <a:blip r:embed="rId40" cstate="none"/>
                                 <a:srcRect/>
                                 <a:stretch>
                                   <a:fillRect/>
@@ -12148,7 +12148,7 @@
                                 </pic:cNvPicPr>
                               </pic:nvPicPr>
                               <pic:blipFill>
-                                <a:blip r:embed="rId39" cstate="none"/>
+                                <a:blip r:embed="rId41" cstate="none"/>
                                 <a:srcRect/>
                                 <a:stretch>
                                   <a:fillRect/>
@@ -12229,7 +12229,7 @@
                                 </pic:cNvPicPr>
                               </pic:nvPicPr>
                               <pic:blipFill>
-                                <a:blip r:embed="rId40" cstate="none"/>
+                                <a:blip r:embed="rId42" cstate="none"/>
                                 <a:srcRect/>
                                 <a:stretch>
                                   <a:fillRect/>
@@ -12340,7 +12340,7 @@
                                 </pic:cNvPicPr>
                               </pic:nvPicPr>
                               <pic:blipFill>
-                                <a:blip r:embed="rId41" cstate="none"/>
+                                <a:blip r:embed="rId43" cstate="none"/>
                                 <a:srcRect/>
                                 <a:stretch>
                                   <a:fillRect/>
@@ -12421,7 +12421,7 @@
                                 </pic:cNvPicPr>
                               </pic:nvPicPr>
                               <pic:blipFill>
-                                <a:blip r:embed="rId42" cstate="none"/>
+                                <a:blip r:embed="rId44" cstate="none"/>
                                 <a:srcRect/>
                                 <a:stretch>
                                   <a:fillRect/>
@@ -12527,7 +12527,7 @@
                                 </pic:cNvPicPr>
                               </pic:nvPicPr>
                               <pic:blipFill>
-                                <a:blip r:embed="rId43" cstate="none"/>
+                                <a:blip r:embed="rId45" cstate="none"/>
                                 <a:srcRect/>
                                 <a:stretch>
                                   <a:fillRect/>
@@ -12608,7 +12608,7 @@
                                 </pic:cNvPicPr>
                               </pic:nvPicPr>
                               <pic:blipFill>
-                                <a:blip r:embed="rId44" cstate="none"/>
+                                <a:blip r:embed="rId46" cstate="none"/>
                                 <a:srcRect/>
                                 <a:stretch>
                                   <a:fillRect/>
@@ -12714,7 +12714,7 @@
                                 </pic:cNvPicPr>
                               </pic:nvPicPr>
                               <pic:blipFill>
-                                <a:blip r:embed="rId45" cstate="none"/>
+                                <a:blip r:embed="rId47" cstate="none"/>
                                 <a:srcRect/>
                                 <a:stretch>
                                   <a:fillRect/>
@@ -12795,7 +12795,7 @@
                                 </pic:cNvPicPr>
                               </pic:nvPicPr>
                               <pic:blipFill>
-                                <a:blip r:embed="rId46" cstate="none"/>
+                                <a:blip r:embed="rId48" cstate="none"/>
                                 <a:srcRect/>
                                 <a:stretch>
                                   <a:fillRect/>
@@ -12901,7 +12901,7 @@
                                 </pic:cNvPicPr>
                               </pic:nvPicPr>
                               <pic:blipFill>
-                                <a:blip r:embed="rId47" cstate="none"/>
+                                <a:blip r:embed="rId49" cstate="none"/>
                                 <a:srcRect/>
                                 <a:stretch>
                                   <a:fillRect/>
@@ -12982,7 +12982,7 @@
                                 </pic:cNvPicPr>
                               </pic:nvPicPr>
                               <pic:blipFill>
-                                <a:blip r:embed="rId48" cstate="none"/>
+                                <a:blip r:embed="rId50" cstate="none"/>
                                 <a:srcRect/>
                                 <a:stretch>
                                   <a:fillRect/>
@@ -13176,7 +13176,7 @@
                                 </pic:cNvPicPr>
                               </pic:nvPicPr>
                               <pic:blipFill>
-                                <a:blip r:embed="rId49" cstate="none"/>
+                                <a:blip r:embed="rId51" cstate="none"/>
                                 <a:srcRect/>
                                 <a:stretch>
                                   <a:fillRect/>
@@ -13315,7 +13315,7 @@
                                 </pic:cNvPicPr>
                               </pic:nvPicPr>
                               <pic:blipFill>
-                                <a:blip r:embed="rId50" cstate="none"/>
+                                <a:blip r:embed="rId52" cstate="none"/>
                                 <a:srcRect/>
                                 <a:stretch>
                                   <a:fillRect/>
@@ -13422,7 +13422,7 @@
                                 </pic:cNvPicPr>
                               </pic:nvPicPr>
                               <pic:blipFill>
-                                <a:blip r:embed="rId51" cstate="none"/>
+                                <a:blip r:embed="rId53" cstate="none"/>
                                 <a:srcRect/>
                                 <a:stretch>
                                   <a:fillRect/>
@@ -13561,7 +13561,7 @@
                                 </pic:cNvPicPr>
                               </pic:nvPicPr>
                               <pic:blipFill>
-                                <a:blip r:embed="rId52" cstate="none"/>
+                                <a:blip r:embed="rId54" cstate="none"/>
                                 <a:srcRect/>
                                 <a:stretch>
                                   <a:fillRect/>
@@ -13698,7 +13698,7 @@
                                 </pic:cNvPicPr>
                               </pic:nvPicPr>
                               <pic:blipFill>
-                                <a:blip r:embed="rId53" cstate="none"/>
+                                <a:blip r:embed="rId55" cstate="none"/>
                                 <a:srcRect/>
                                 <a:stretch>
                                   <a:fillRect/>
@@ -13837,7 +13837,7 @@
                                 </pic:cNvPicPr>
                               </pic:nvPicPr>
                               <pic:blipFill>
-                                <a:blip r:embed="rId54" cstate="none"/>
+                                <a:blip r:embed="rId56" cstate="none"/>
                                 <a:srcRect/>
                                 <a:stretch>
                                   <a:fillRect/>
@@ -13944,7 +13944,7 @@
                                 </pic:cNvPicPr>
                               </pic:nvPicPr>
                               <pic:blipFill>
-                                <a:blip r:embed="rId55" cstate="none"/>
+                                <a:blip r:embed="rId57" cstate="none"/>
                                 <a:srcRect/>
                                 <a:stretch>
                                   <a:fillRect/>
@@ -14083,7 +14083,7 @@
                                 </pic:cNvPicPr>
                               </pic:nvPicPr>
                               <pic:blipFill>
-                                <a:blip r:embed="rId56" cstate="none"/>
+                                <a:blip r:embed="rId58" cstate="none"/>
                                 <a:srcRect/>
                                 <a:stretch>
                                   <a:fillRect/>
@@ -14220,7 +14220,7 @@
                                 </pic:cNvPicPr>
                               </pic:nvPicPr>
                               <pic:blipFill>
-                                <a:blip r:embed="rId57" cstate="none"/>
+                                <a:blip r:embed="rId59" cstate="none"/>
                                 <a:srcRect/>
                                 <a:stretch>
                                   <a:fillRect/>
@@ -14359,7 +14359,7 @@
                                 </pic:cNvPicPr>
                               </pic:nvPicPr>
                               <pic:blipFill>
-                                <a:blip r:embed="rId58" cstate="none"/>
+                                <a:blip r:embed="rId60" cstate="none"/>
                                 <a:srcRect/>
                                 <a:stretch>
                                   <a:fillRect/>
@@ -14466,7 +14466,7 @@
                                 </pic:cNvPicPr>
                               </pic:nvPicPr>
                               <pic:blipFill>
-                                <a:blip r:embed="rId59" cstate="none"/>
+                                <a:blip r:embed="rId61" cstate="none"/>
                                 <a:srcRect/>
                                 <a:stretch>
                                   <a:fillRect/>
@@ -14605,7 +14605,7 @@
                                 </pic:cNvPicPr>
                               </pic:nvPicPr>
                               <pic:blipFill>
-                                <a:blip r:embed="rId60" cstate="none"/>
+                                <a:blip r:embed="rId62" cstate="none"/>
                                 <a:srcRect/>
                                 <a:stretch>
                                   <a:fillRect/>
@@ -14742,7 +14742,7 @@
                                 </pic:cNvPicPr>
                               </pic:nvPicPr>
                               <pic:blipFill>
-                                <a:blip r:embed="rId61" cstate="none"/>
+                                <a:blip r:embed="rId63" cstate="none"/>
                                 <a:srcRect/>
                                 <a:stretch>
                                   <a:fillRect/>
@@ -14881,7 +14881,7 @@
                                 </pic:cNvPicPr>
                               </pic:nvPicPr>
                               <pic:blipFill>
-                                <a:blip r:embed="rId62" cstate="none"/>
+                                <a:blip r:embed="rId64" cstate="none"/>
                                 <a:srcRect/>
                                 <a:stretch>
                                   <a:fillRect/>
@@ -14988,7 +14988,7 @@
                                 </pic:cNvPicPr>
                               </pic:nvPicPr>
                               <pic:blipFill>
-                                <a:blip r:embed="rId63" cstate="none"/>
+                                <a:blip r:embed="rId65" cstate="none"/>
                                 <a:srcRect/>
                                 <a:stretch>
                                   <a:fillRect/>
@@ -15127,7 +15127,7 @@
                                 </pic:cNvPicPr>
                               </pic:nvPicPr>
                               <pic:blipFill>
-                                <a:blip r:embed="rId64" cstate="none"/>
+                                <a:blip r:embed="rId66" cstate="none"/>
                                 <a:srcRect/>
                                 <a:stretch>
                                   <a:fillRect/>
@@ -15264,7 +15264,7 @@
                                 </pic:cNvPicPr>
                               </pic:nvPicPr>
                               <pic:blipFill>
-                                <a:blip r:embed="rId65" cstate="none"/>
+                                <a:blip r:embed="rId67" cstate="none"/>
                                 <a:srcRect/>
                                 <a:stretch>
                                   <a:fillRect/>
@@ -15403,7 +15403,7 @@
                                 </pic:cNvPicPr>
                               </pic:nvPicPr>
                               <pic:blipFill>
-                                <a:blip r:embed="rId66" cstate="none"/>
+                                <a:blip r:embed="rId68" cstate="none"/>
                                 <a:srcRect/>
                                 <a:stretch>
                                   <a:fillRect/>
@@ -15510,7 +15510,7 @@
                                 </pic:cNvPicPr>
                               </pic:nvPicPr>
                               <pic:blipFill>
-                                <a:blip r:embed="rId67" cstate="none"/>
+                                <a:blip r:embed="rId69" cstate="none"/>
                                 <a:srcRect/>
                                 <a:stretch>
                                   <a:fillRect/>
@@ -15649,7 +15649,7 @@
                                 </pic:cNvPicPr>
                               </pic:nvPicPr>
                               <pic:blipFill>
-                                <a:blip r:embed="rId68" cstate="none"/>
+                                <a:blip r:embed="rId70" cstate="none"/>
                                 <a:srcRect/>
                                 <a:stretch>
                                   <a:fillRect/>
@@ -15786,7 +15786,7 @@
                                 </pic:cNvPicPr>
                               </pic:nvPicPr>
                               <pic:blipFill>
-                                <a:blip r:embed="rId69" cstate="none"/>
+                                <a:blip r:embed="rId71" cstate="none"/>
                                 <a:srcRect/>
                                 <a:stretch>
                                   <a:fillRect/>
@@ -15925,7 +15925,7 @@
                                 </pic:cNvPicPr>
                               </pic:nvPicPr>
                               <pic:blipFill>
-                                <a:blip r:embed="rId70" cstate="none"/>
+                                <a:blip r:embed="rId72" cstate="none"/>
                                 <a:srcRect/>
                                 <a:stretch>
                                   <a:fillRect/>
@@ -16032,7 +16032,7 @@
                                 </pic:cNvPicPr>
                               </pic:nvPicPr>
                               <pic:blipFill>
-                                <a:blip r:embed="rId71" cstate="none"/>
+                                <a:blip r:embed="rId73" cstate="none"/>
                                 <a:srcRect/>
                                 <a:stretch>
                                   <a:fillRect/>
@@ -16171,7 +16171,7 @@
                                 </pic:cNvPicPr>
                               </pic:nvPicPr>
                               <pic:blipFill>
-                                <a:blip r:embed="rId72" cstate="none"/>
+                                <a:blip r:embed="rId74" cstate="none"/>
                                 <a:srcRect/>
                                 <a:stretch>
                                   <a:fillRect/>
@@ -16308,7 +16308,7 @@
                                 </pic:cNvPicPr>
                               </pic:nvPicPr>
                               <pic:blipFill>
-                                <a:blip r:embed="rId73" cstate="none"/>
+                                <a:blip r:embed="rId75" cstate="none"/>
                                 <a:srcRect/>
                                 <a:stretch>
                                   <a:fillRect/>
@@ -16447,7 +16447,7 @@
                                 </pic:cNvPicPr>
                               </pic:nvPicPr>
                               <pic:blipFill>
-                                <a:blip r:embed="rId74" cstate="none"/>
+                                <a:blip r:embed="rId76" cstate="none"/>
                                 <a:srcRect/>
                                 <a:stretch>
                                   <a:fillRect/>
@@ -16554,7 +16554,7 @@
                                 </pic:cNvPicPr>
                               </pic:nvPicPr>
                               <pic:blipFill>
-                                <a:blip r:embed="rId75" cstate="none"/>
+                                <a:blip r:embed="rId77" cstate="none"/>
                                 <a:srcRect/>
                                 <a:stretch>
                                   <a:fillRect/>
@@ -16693,7 +16693,7 @@
                                 </pic:cNvPicPr>
                               </pic:nvPicPr>
                               <pic:blipFill>
-                                <a:blip r:embed="rId76" cstate="none"/>
+                                <a:blip r:embed="rId78" cstate="none"/>
                                 <a:srcRect/>
                                 <a:stretch>
                                   <a:fillRect/>
@@ -16830,7 +16830,7 @@
                                 </pic:cNvPicPr>
                               </pic:nvPicPr>
                               <pic:blipFill>
-                                <a:blip r:embed="rId77" cstate="none"/>
+                                <a:blip r:embed="rId79" cstate="none"/>
                                 <a:srcRect/>
                                 <a:stretch>
                                   <a:fillRect/>
@@ -16994,7 +16994,7 @@
                                 </pic:cNvPicPr>
                               </pic:nvPicPr>
                               <pic:blipFill>
-                                <a:blip r:embed="rId78" cstate="none"/>
+                                <a:blip r:embed="rId80" cstate="none"/>
                                 <a:srcRect/>
                                 <a:stretch>
                                   <a:fillRect/>
@@ -17101,7 +17101,7 @@
                                 </pic:cNvPicPr>
                               </pic:nvPicPr>
                               <pic:blipFill>
-                                <a:blip r:embed="rId79" cstate="none"/>
+                                <a:blip r:embed="rId81" cstate="none"/>
                                 <a:srcRect/>
                                 <a:stretch>
                                   <a:fillRect/>
@@ -17265,7 +17265,7 @@
                                 </pic:cNvPicPr>
                               </pic:nvPicPr>
                               <pic:blipFill>
-                                <a:blip r:embed="rId80" cstate="none"/>
+                                <a:blip r:embed="rId82" cstate="none"/>
                                 <a:srcRect/>
                                 <a:stretch>
                                   <a:fillRect/>
@@ -17402,7 +17402,7 @@
                                 </pic:cNvPicPr>
                               </pic:nvPicPr>
                               <pic:blipFill>
-                                <a:blip r:embed="rId81" cstate="none"/>
+                                <a:blip r:embed="rId83" cstate="none"/>
                                 <a:srcRect/>
                                 <a:stretch>
                                   <a:fillRect/>
@@ -17541,7 +17541,7 @@
                                 </pic:cNvPicPr>
                               </pic:nvPicPr>
                               <pic:blipFill>
-                                <a:blip r:embed="rId82" cstate="none"/>
+                                <a:blip r:embed="rId84" cstate="none"/>
                                 <a:srcRect/>
                                 <a:stretch>
                                   <a:fillRect/>
@@ -17648,7 +17648,7 @@
                                 </pic:cNvPicPr>
                               </pic:nvPicPr>
                               <pic:blipFill>
-                                <a:blip r:embed="rId83" cstate="none"/>
+                                <a:blip r:embed="rId85" cstate="none"/>
                                 <a:srcRect/>
                                 <a:stretch>
                                   <a:fillRect/>
@@ -17787,7 +17787,7 @@
                                 </pic:cNvPicPr>
                               </pic:nvPicPr>
                               <pic:blipFill>
-                                <a:blip r:embed="rId84" cstate="none"/>
+                                <a:blip r:embed="rId86" cstate="none"/>
                                 <a:srcRect/>
                                 <a:stretch>
                                   <a:fillRect/>
@@ -17924,7 +17924,7 @@
                                 </pic:cNvPicPr>
                               </pic:nvPicPr>
                               <pic:blipFill>
-                                <a:blip r:embed="rId85" cstate="none"/>
+                                <a:blip r:embed="rId87" cstate="none"/>
                                 <a:srcRect/>
                                 <a:stretch>
                                   <a:fillRect/>
@@ -18063,7 +18063,7 @@
                                 </pic:cNvPicPr>
                               </pic:nvPicPr>
                               <pic:blipFill>
-                                <a:blip r:embed="rId86" cstate="none"/>
+                                <a:blip r:embed="rId88" cstate="none"/>
                                 <a:srcRect/>
                                 <a:stretch>
                                   <a:fillRect/>
@@ -18170,7 +18170,7 @@
                                 </pic:cNvPicPr>
                               </pic:nvPicPr>
                               <pic:blipFill>
-                                <a:blip r:embed="rId87" cstate="none"/>
+                                <a:blip r:embed="rId89" cstate="none"/>
                                 <a:srcRect/>
                                 <a:stretch>
                                   <a:fillRect/>
@@ -18309,7 +18309,7 @@
                                 </pic:cNvPicPr>
                               </pic:nvPicPr>
                               <pic:blipFill>
-                                <a:blip r:embed="rId88" cstate="none"/>
+                                <a:blip r:embed="rId90" cstate="none"/>
                                 <a:srcRect/>
                                 <a:stretch>
                                   <a:fillRect/>
@@ -18446,7 +18446,7 @@
                                 </pic:cNvPicPr>
                               </pic:nvPicPr>
                               <pic:blipFill>
-                                <a:blip r:embed="rId89" cstate="none"/>
+                                <a:blip r:embed="rId91" cstate="none"/>
                                 <a:srcRect/>
                                 <a:stretch>
                                   <a:fillRect/>
@@ -18585,7 +18585,7 @@
                                 </pic:cNvPicPr>
                               </pic:nvPicPr>
                               <pic:blipFill>
-                                <a:blip r:embed="rId90" cstate="none"/>
+                                <a:blip r:embed="rId92" cstate="none"/>
                                 <a:srcRect/>
                                 <a:stretch>
                                   <a:fillRect/>
@@ -18692,7 +18692,7 @@
                                 </pic:cNvPicPr>
                               </pic:nvPicPr>
                               <pic:blipFill>
-                                <a:blip r:embed="rId91" cstate="none"/>
+                                <a:blip r:embed="rId93" cstate="none"/>
                                 <a:srcRect/>
                                 <a:stretch>
                                   <a:fillRect/>
@@ -18831,7 +18831,7 @@
                                 </pic:cNvPicPr>
                               </pic:nvPicPr>
                               <pic:blipFill>
-                                <a:blip r:embed="rId92" cstate="none"/>
+                                <a:blip r:embed="rId94" cstate="none"/>
                                 <a:srcRect/>
                                 <a:stretch>
                                   <a:fillRect/>
@@ -18968,7 +18968,7 @@
                                 </pic:cNvPicPr>
                               </pic:nvPicPr>
                               <pic:blipFill>
-                                <a:blip r:embed="rId93" cstate="none"/>
+                                <a:blip r:embed="rId95" cstate="none"/>
                                 <a:srcRect/>
                                 <a:stretch>
                                   <a:fillRect/>
@@ -19107,7 +19107,7 @@
                                 </pic:cNvPicPr>
                               </pic:nvPicPr>
                               <pic:blipFill>
-                                <a:blip r:embed="rId94" cstate="none"/>
+                                <a:blip r:embed="rId96" cstate="none"/>
                                 <a:srcRect/>
                                 <a:stretch>
                                   <a:fillRect/>
@@ -19214,7 +19214,7 @@
                                 </pic:cNvPicPr>
                               </pic:nvPicPr>
                               <pic:blipFill>
-                                <a:blip r:embed="rId95" cstate="none"/>
+                                <a:blip r:embed="rId97" cstate="none"/>
                                 <a:srcRect/>
                                 <a:stretch>
                                   <a:fillRect/>
@@ -19378,7 +19378,7 @@
                                 </pic:cNvPicPr>
                               </pic:nvPicPr>
                               <pic:blipFill>
-                                <a:blip r:embed="rId96" cstate="none"/>
+                                <a:blip r:embed="rId98" cstate="none"/>
                                 <a:srcRect/>
                                 <a:stretch>
                                   <a:fillRect/>
@@ -19515,7 +19515,7 @@
                                 </pic:cNvPicPr>
                               </pic:nvPicPr>
                               <pic:blipFill>
-                                <a:blip r:embed="rId97" cstate="none"/>
+                                <a:blip r:embed="rId99" cstate="none"/>
                                 <a:srcRect/>
                                 <a:stretch>
                                   <a:fillRect/>
@@ -19679,7 +19679,7 @@
                                 </pic:cNvPicPr>
                               </pic:nvPicPr>
                               <pic:blipFill>
-                                <a:blip r:embed="rId98" cstate="none"/>
+                                <a:blip r:embed="rId100" cstate="none"/>
                                 <a:srcRect/>
                                 <a:stretch>
                                   <a:fillRect/>
@@ -19786,7 +19786,7 @@
                                 </pic:cNvPicPr>
                               </pic:nvPicPr>
                               <pic:blipFill>
-                                <a:blip r:embed="rId99" cstate="none"/>
+                                <a:blip r:embed="rId101" cstate="none"/>
                                 <a:srcRect/>
                                 <a:stretch>
                                   <a:fillRect/>
@@ -19925,7 +19925,7 @@
                                 </pic:cNvPicPr>
                               </pic:nvPicPr>
                               <pic:blipFill>
-                                <a:blip r:embed="rId100" cstate="none"/>
+                                <a:blip r:embed="rId102" cstate="none"/>
                                 <a:srcRect/>
                                 <a:stretch>
                                   <a:fillRect/>
@@ -20062,7 +20062,7 @@
                                 </pic:cNvPicPr>
                               </pic:nvPicPr>
                               <pic:blipFill>
-                                <a:blip r:embed="rId101" cstate="none"/>
+                                <a:blip r:embed="rId103" cstate="none"/>
                                 <a:srcRect/>
                                 <a:stretch>
                                   <a:fillRect/>
@@ -20201,7 +20201,7 @@
                                 </pic:cNvPicPr>
                               </pic:nvPicPr>
                               <pic:blipFill>
-                                <a:blip r:embed="rId102" cstate="none"/>
+                                <a:blip r:embed="rId104" cstate="none"/>
                                 <a:srcRect/>
                                 <a:stretch>
                                   <a:fillRect/>
@@ -20308,7 +20308,7 @@
                                 </pic:cNvPicPr>
                               </pic:nvPicPr>
                               <pic:blipFill>
-                                <a:blip r:embed="rId103" cstate="none"/>
+                                <a:blip r:embed="rId105" cstate="none"/>
                                 <a:srcRect/>
                                 <a:stretch>
                                   <a:fillRect/>
@@ -20447,7 +20447,7 @@
                                 </pic:cNvPicPr>
                               </pic:nvPicPr>
                               <pic:blipFill>
-                                <a:blip r:embed="rId104" cstate="none"/>
+                                <a:blip r:embed="rId106" cstate="none"/>
                                 <a:srcRect/>
                                 <a:stretch>
                                   <a:fillRect/>
@@ -20584,7 +20584,7 @@
                                 </pic:cNvPicPr>
                               </pic:nvPicPr>
                               <pic:blipFill>
-                                <a:blip r:embed="rId105" cstate="none"/>
+                                <a:blip r:embed="rId107" cstate="none"/>
                                 <a:srcRect/>
                                 <a:stretch>
                                   <a:fillRect/>
@@ -20723,7 +20723,7 @@
                                 </pic:cNvPicPr>
                               </pic:nvPicPr>
                               <pic:blipFill>
-                                <a:blip r:embed="rId106" cstate="none"/>
+                                <a:blip r:embed="rId108" cstate="none"/>
                                 <a:srcRect/>
                                 <a:stretch>
                                   <a:fillRect/>
@@ -20830,7 +20830,7 @@
                                 </pic:cNvPicPr>
                               </pic:nvPicPr>
                               <pic:blipFill>
-                                <a:blip r:embed="rId107" cstate="none"/>
+                                <a:blip r:embed="rId109" cstate="none"/>
                                 <a:srcRect/>
                                 <a:stretch>
                                   <a:fillRect/>
@@ -20969,7 +20969,7 @@
                                 </pic:cNvPicPr>
                               </pic:nvPicPr>
                               <pic:blipFill>
-                                <a:blip r:embed="rId108" cstate="none"/>
+                                <a:blip r:embed="rId110" cstate="none"/>
                                 <a:srcRect/>
                                 <a:stretch>
                                   <a:fillRect/>
@@ -21106,7 +21106,7 @@
                                 </pic:cNvPicPr>
                               </pic:nvPicPr>
                               <pic:blipFill>
-                                <a:blip r:embed="rId109" cstate="none"/>
+                                <a:blip r:embed="rId111" cstate="none"/>
                                 <a:srcRect/>
                                 <a:stretch>
                                   <a:fillRect/>
@@ -21245,7 +21245,7 @@
                                 </pic:cNvPicPr>
                               </pic:nvPicPr>
                               <pic:blipFill>
-                                <a:blip r:embed="rId110" cstate="none"/>
+                                <a:blip r:embed="rId112" cstate="none"/>
                                 <a:srcRect/>
                                 <a:stretch>
                                   <a:fillRect/>
@@ -21352,7 +21352,7 @@
                                 </pic:cNvPicPr>
                               </pic:nvPicPr>
                               <pic:blipFill>
-                                <a:blip r:embed="rId111" cstate="none"/>
+                                <a:blip r:embed="rId113" cstate="none"/>
                                 <a:srcRect/>
                                 <a:stretch>
                                   <a:fillRect/>
@@ -21491,7 +21491,7 @@
                                 </pic:cNvPicPr>
                               </pic:nvPicPr>
                               <pic:blipFill>
-                                <a:blip r:embed="rId112" cstate="none"/>
+                                <a:blip r:embed="rId114" cstate="none"/>
                                 <a:srcRect/>
                                 <a:stretch>
                                   <a:fillRect/>
@@ -21628,7 +21628,7 @@
                                 </pic:cNvPicPr>
                               </pic:nvPicPr>
                               <pic:blipFill>
-                                <a:blip r:embed="rId113" cstate="none"/>
+                                <a:blip r:embed="rId115" cstate="none"/>
                                 <a:srcRect/>
                                 <a:stretch>
                                   <a:fillRect/>
@@ -21767,7 +21767,7 @@
                                 </pic:cNvPicPr>
                               </pic:nvPicPr>
                               <pic:blipFill>
-                                <a:blip r:embed="rId114" cstate="none"/>
+                                <a:blip r:embed="rId116" cstate="none"/>
                                 <a:srcRect/>
                                 <a:stretch>
                                   <a:fillRect/>
@@ -21874,7 +21874,7 @@
                                 </pic:cNvPicPr>
                               </pic:nvPicPr>
                               <pic:blipFill>
-                                <a:blip r:embed="rId115" cstate="none"/>
+                                <a:blip r:embed="rId117" cstate="none"/>
                                 <a:srcRect/>
                                 <a:stretch>
                                   <a:fillRect/>
@@ -22013,7 +22013,7 @@
                                 </pic:cNvPicPr>
                               </pic:nvPicPr>
                               <pic:blipFill>
-                                <a:blip r:embed="rId116" cstate="none"/>
+                                <a:blip r:embed="rId118" cstate="none"/>
                                 <a:srcRect/>
                                 <a:stretch>
                                   <a:fillRect/>
@@ -22150,7 +22150,7 @@
                                 </pic:cNvPicPr>
                               </pic:nvPicPr>
                               <pic:blipFill>
-                                <a:blip r:embed="rId117" cstate="none"/>
+                                <a:blip r:embed="rId119" cstate="none"/>
                                 <a:srcRect/>
                                 <a:stretch>
                                   <a:fillRect/>
@@ -22289,7 +22289,7 @@
                                 </pic:cNvPicPr>
                               </pic:nvPicPr>
                               <pic:blipFill>
-                                <a:blip r:embed="rId118" cstate="none"/>
+                                <a:blip r:embed="rId120" cstate="none"/>
                                 <a:srcRect/>
                                 <a:stretch>
                                   <a:fillRect/>
@@ -22396,7 +22396,7 @@
                                 </pic:cNvPicPr>
                               </pic:nvPicPr>
                               <pic:blipFill>
-                                <a:blip r:embed="rId119" cstate="none"/>
+                                <a:blip r:embed="rId121" cstate="none"/>
                                 <a:srcRect/>
                                 <a:stretch>
                                   <a:fillRect/>
@@ -22560,7 +22560,7 @@
                                 </pic:cNvPicPr>
                               </pic:nvPicPr>
                               <pic:blipFill>
-                                <a:blip r:embed="rId120" cstate="none"/>
+                                <a:blip r:embed="rId122" cstate="none"/>
                                 <a:srcRect/>
                                 <a:stretch>
                                   <a:fillRect/>
@@ -22697,7 +22697,7 @@
                                 </pic:cNvPicPr>
                               </pic:nvPicPr>
                               <pic:blipFill>
-                                <a:blip r:embed="rId121" cstate="none"/>
+                                <a:blip r:embed="rId123" cstate="none"/>
                                 <a:srcRect/>
                                 <a:stretch>
                                   <a:fillRect/>
@@ -22836,7 +22836,7 @@
                                 </pic:cNvPicPr>
                               </pic:nvPicPr>
                               <pic:blipFill>
-                                <a:blip r:embed="rId122" cstate="none"/>
+                                <a:blip r:embed="rId124" cstate="none"/>
                                 <a:srcRect/>
                                 <a:stretch>
                                   <a:fillRect/>
@@ -22943,7 +22943,7 @@
                                 </pic:cNvPicPr>
                               </pic:nvPicPr>
                               <pic:blipFill>
-                                <a:blip r:embed="rId123" cstate="none"/>
+                                <a:blip r:embed="rId125" cstate="none"/>
                                 <a:srcRect/>
                                 <a:stretch>
                                   <a:fillRect/>
@@ -23082,7 +23082,7 @@
                                 </pic:cNvPicPr>
                               </pic:nvPicPr>
                               <pic:blipFill>
-                                <a:blip r:embed="rId124" cstate="none"/>
+                                <a:blip r:embed="rId126" cstate="none"/>
                                 <a:srcRect/>
                                 <a:stretch>
                                   <a:fillRect/>
@@ -23219,7 +23219,7 @@
                                 </pic:cNvPicPr>
                               </pic:nvPicPr>
                               <pic:blipFill>
-                                <a:blip r:embed="rId125" cstate="none"/>
+                                <a:blip r:embed="rId127" cstate="none"/>
                                 <a:srcRect/>
                                 <a:stretch>
                                   <a:fillRect/>
@@ -23358,7 +23358,7 @@
                                 </pic:cNvPicPr>
                               </pic:nvPicPr>
                               <pic:blipFill>
-                                <a:blip r:embed="rId126" cstate="none"/>
+                                <a:blip r:embed="rId128" cstate="none"/>
                                 <a:srcRect/>
                                 <a:stretch>
                                   <a:fillRect/>
@@ -23465,7 +23465,7 @@
                                 </pic:cNvPicPr>
                               </pic:nvPicPr>
                               <pic:blipFill>
-                                <a:blip r:embed="rId127" cstate="none"/>
+                                <a:blip r:embed="rId129" cstate="none"/>
                                 <a:srcRect/>
                                 <a:stretch>
                                   <a:fillRect/>
@@ -23604,7 +23604,7 @@
                                 </pic:cNvPicPr>
                               </pic:nvPicPr>
                               <pic:blipFill>
-                                <a:blip r:embed="rId128" cstate="none"/>
+                                <a:blip r:embed="rId130" cstate="none"/>
                                 <a:srcRect/>
                                 <a:stretch>
                                   <a:fillRect/>
@@ -23643,7 +23643,21 @@
     </w:p>
     <w:p>
       <w:pPr>
-        <w:pageBreakBefore/>
+        <w:sectPr>
+          <w:headerReference w:type="default" r:id="rId7"/>
+          <w:headerReference w:type="first" r:id="rId8"/>
+          <w:footerReference w:type="default" r:id="rId9"/>
+          <w:footerReference w:type="first" r:id="rId10"/>
+          <w:pgSz w:w="12240" w:h="15840" w:orient="portrait"/>
+          <w:pgMar w:top="1080" w:right="1080" w:bottom="1080" w:left="1080" w:header="708" w:footer="708" w:gutter="0"/>
+          <w:pgNumType/>
+          <w:titlePg/>
+          <w:docGrid w:linePitch="360"/>
+        </w:sectPr>
+      </w:pPr>
+    </w:p>
+    <w:p>
+      <w:pPr>
         <w:spacing w:before="3000"/>
       </w:pPr>
       <w:r>
@@ -23714,14 +23728,11 @@
       </w:r>
     </w:p>
     <w:sectPr>
-      <w:headerReference w:type="default" r:id="rId7"/>
-      <w:headerReference w:type="first" r:id="rId8"/>
-      <w:footerReference w:type="default" r:id="rId9"/>
-      <w:footerReference w:type="first" r:id="rId10"/>
+      <w:headerReference w:type="default" r:id="rId11"/>
+      <w:footerReference w:type="default" r:id="rId12"/>
       <w:pgSz w:w="12240" w:h="15840" w:orient="portrait"/>
       <w:pgMar w:top="1080" w:right="1080" w:bottom="1080" w:left="1080" w:header="708" w:footer="708" w:gutter="0"/>
       <w:pgNumType/>
-      <w:titlePg/>
       <w:docGrid w:linePitch="360"/>
     </w:sectPr>
   </w:body>
@@ -23780,6 +23791,16 @@
 </file>
 
 <file path=word/footer2.xml><?xml version="1.0" encoding="utf-8"?>
+<w:ftr xmlns:wpc="http://schemas.microsoft.com/office/word/2010/wordprocessingCanvas" xmlns:mc="http://schemas.openxmlformats.org/markup-compatibility/2006" xmlns:o="urn:schemas-microsoft-com:office:office" xmlns:r="http://schemas.openxmlformats.org/officeDocument/2006/relationships" xmlns:m="http://schemas.openxmlformats.org/officeDocument/2006/math" xmlns:v="urn:schemas-microsoft-com:vml" xmlns:wp14="http://schemas.microsoft.com/office/word/2010/wordprocessingDrawing" xmlns:wp="http://schemas.openxmlformats.org/drawingml/2006/wordprocessingDrawing" xmlns:w10="urn:schemas-microsoft-com:office:word" xmlns:w="http://schemas.openxmlformats.org/wordprocessingml/2006/main" xmlns:w14="http://schemas.microsoft.com/office/word/2010/wordml" xmlns:w15="http://schemas.microsoft.com/office/word/2012/wordml" xmlns:wpg="http://schemas.microsoft.com/office/word/2010/wordprocessingGroup" xmlns:wpi="http://schemas.microsoft.com/office/word/2010/wordprocessingInk" xmlns:wne="http://schemas.microsoft.com/office/word/2006/wordml" xmlns:wps="http://schemas.microsoft.com/office/word/2010/wordprocessingShape">
+  <w:p>
+    <w:r>
+      <w:t xml:space="preserve"/>
+    </w:r>
+  </w:p>
+</w:ftr>
+</file>
+
+<file path=word/footer3.xml><?xml version="1.0" encoding="utf-8"?>
 <w:ftr xmlns:wpc="http://schemas.microsoft.com/office/word/2010/wordprocessingCanvas" xmlns:mc="http://schemas.openxmlformats.org/markup-compatibility/2006" xmlns:o="urn:schemas-microsoft-com:office:office" xmlns:r="http://schemas.openxmlformats.org/officeDocument/2006/relationships" xmlns:m="http://schemas.openxmlformats.org/officeDocument/2006/math" xmlns:v="urn:schemas-microsoft-com:vml" xmlns:wp14="http://schemas.microsoft.com/office/word/2010/wordprocessingDrawing" xmlns:wp="http://schemas.openxmlformats.org/drawingml/2006/wordprocessingDrawing" xmlns:w10="urn:schemas-microsoft-com:office:word" xmlns:w="http://schemas.openxmlformats.org/wordprocessingml/2006/main" xmlns:w14="http://schemas.microsoft.com/office/word/2010/wordml" xmlns:w15="http://schemas.microsoft.com/office/word/2012/wordml" xmlns:wpg="http://schemas.microsoft.com/office/word/2010/wordprocessingGroup" xmlns:wpi="http://schemas.microsoft.com/office/word/2010/wordprocessingInk" xmlns:wne="http://schemas.microsoft.com/office/word/2006/wordml" xmlns:wps="http://schemas.microsoft.com/office/word/2010/wordprocessingShape">
   <w:p>
     <w:r>
@@ -23866,6 +23887,16 @@
 </file>
 
 <file path=word/header2.xml><?xml version="1.0" encoding="utf-8"?>
+<w:hdr xmlns:wpc="http://schemas.microsoft.com/office/word/2010/wordprocessingCanvas" xmlns:mc="http://schemas.openxmlformats.org/markup-compatibility/2006" xmlns:o="urn:schemas-microsoft-com:office:office" xmlns:r="http://schemas.openxmlformats.org/officeDocument/2006/relationships" xmlns:m="http://schemas.openxmlformats.org/officeDocument/2006/math" xmlns:v="urn:schemas-microsoft-com:vml" xmlns:wp14="http://schemas.microsoft.com/office/word/2010/wordprocessingDrawing" xmlns:wp="http://schemas.openxmlformats.org/drawingml/2006/wordprocessingDrawing" xmlns:w10="urn:schemas-microsoft-com:office:word" xmlns:w="http://schemas.openxmlformats.org/wordprocessingml/2006/main" xmlns:w14="http://schemas.microsoft.com/office/word/2010/wordml" xmlns:w15="http://schemas.microsoft.com/office/word/2012/wordml" xmlns:wpg="http://schemas.microsoft.com/office/word/2010/wordprocessingGroup" xmlns:wpi="http://schemas.microsoft.com/office/word/2010/wordprocessingInk" xmlns:wne="http://schemas.microsoft.com/office/word/2006/wordml" xmlns:wps="http://schemas.microsoft.com/office/word/2010/wordprocessingShape" xmlns:cx="http://schemas.microsoft.com/office/drawing/2014/chartex" xmlns:cx1="http://schemas.microsoft.com/office/drawing/2015/9/8/chartex" xmlns:cx2="http://schemas.microsoft.com/office/drawing/2015/10/21/chartex" xmlns:cx3="http://schemas.microsoft.com/office/drawing/2016/5/9/chartex" xmlns:cx4="http://schemas.microsoft.com/office/drawing/2016/5/10/chartex" xmlns:cx5="http://schemas.microsoft.com/office/drawing/2016/5/11/chartex" xmlns:cx6="http://schemas.microsoft.com/office/drawing/2016/5/12/chartex" xmlns:cx7="http://schemas.microsoft.com/office/drawing/2016/5/13/chartex" xmlns:cx8="http://schemas.microsoft.com/office/drawing/2016/5/14/chartex" xmlns:w16cid="http://schemas.microsoft.com/office/word/2016/wordml/cid" xmlns:w16se="http://schemas.microsoft.com/office/word/2015/wordml/symex">
+  <w:p>
+    <w:r>
+      <w:t xml:space="preserve"/>
+    </w:r>
+  </w:p>
+</w:hdr>
+</file>
+
+<file path=word/header3.xml><?xml version="1.0" encoding="utf-8"?>
 <w:hdr xmlns:wpc="http://schemas.microsoft.com/office/word/2010/wordprocessingCanvas" xmlns:mc="http://schemas.openxmlformats.org/markup-compatibility/2006" xmlns:o="urn:schemas-microsoft-com:office:office" xmlns:r="http://schemas.openxmlformats.org/officeDocument/2006/relationships" xmlns:m="http://schemas.openxmlformats.org/officeDocument/2006/math" xmlns:v="urn:schemas-microsoft-com:vml" xmlns:wp14="http://schemas.microsoft.com/office/word/2010/wordprocessingDrawing" xmlns:wp="http://schemas.openxmlformats.org/drawingml/2006/wordprocessingDrawing" xmlns:w10="urn:schemas-microsoft-com:office:word" xmlns:w="http://schemas.openxmlformats.org/wordprocessingml/2006/main" xmlns:w14="http://schemas.microsoft.com/office/word/2010/wordml" xmlns:w15="http://schemas.microsoft.com/office/word/2012/wordml" xmlns:wpg="http://schemas.microsoft.com/office/word/2010/wordprocessingGroup" xmlns:wpi="http://schemas.microsoft.com/office/word/2010/wordprocessingInk" xmlns:wne="http://schemas.microsoft.com/office/word/2006/wordml" xmlns:wps="http://schemas.microsoft.com/office/word/2010/wordprocessingShape" xmlns:cx="http://schemas.microsoft.com/office/drawing/2014/chartex" xmlns:cx1="http://schemas.microsoft.com/office/drawing/2015/9/8/chartex" xmlns:cx2="http://schemas.microsoft.com/office/drawing/2015/10/21/chartex" xmlns:cx3="http://schemas.microsoft.com/office/drawing/2016/5/9/chartex" xmlns:cx4="http://schemas.microsoft.com/office/drawing/2016/5/10/chartex" xmlns:cx5="http://schemas.microsoft.com/office/drawing/2016/5/11/chartex" xmlns:cx6="http://schemas.microsoft.com/office/drawing/2016/5/12/chartex" xmlns:cx7="http://schemas.microsoft.com/office/drawing/2016/5/13/chartex" xmlns:cx8="http://schemas.microsoft.com/office/drawing/2016/5/14/chartex" xmlns:w16cid="http://schemas.microsoft.com/office/word/2016/wordml/cid" xmlns:w16se="http://schemas.microsoft.com/office/word/2015/wordml/symex">
   <w:p>
     <w:r>

</xml_diff>

<commit_message>
workbook: add Texas 'We run on EOS Y'all NTX' mark to cover + back; drop redundant WE RUN ON / EOS NORTH TEXAS text on cover
</commit_message>
<xml_diff>
--- a/deliverables/workbook/Workbook.docx
+++ b/deliverables/workbook/Workbook.docx
@@ -21,36 +21,48 @@
     </w:p>
     <w:p>
       <w:pPr>
-        <w:spacing w:after="100"/>
+        <w:spacing w:after="400"/>
         <w:jc w:val="center"/>
       </w:pPr>
       <w:r>
-        <w:rPr>
-          <w:rFonts w:ascii="Calibri" w:cs="Calibri" w:eastAsia="Calibri" w:hAnsi="Calibri"/>
-          <w:b/>
-          <w:bCs/>
-          <w:color w:val="5A6B82"/>
-          <w:sz w:val="40"/>
-          <w:szCs w:val="40"/>
-        </w:rPr>
-        <w:t xml:space="preserve">WE RUN ON</w:t>
-      </w:r>
-    </w:p>
-    <w:p>
-      <w:pPr>
-        <w:spacing w:after="100"/>
-        <w:jc w:val="center"/>
-      </w:pPr>
-      <w:r>
-        <w:rPr>
-          <w:rFonts w:ascii="Calibri" w:cs="Calibri" w:eastAsia="Calibri" w:hAnsi="Calibri"/>
-          <w:b/>
-          <w:bCs/>
-          <w:color w:val="0B1F3A"/>
-          <w:sz w:val="96"/>
-          <w:szCs w:val="96"/>
-        </w:rPr>
-        <w:t xml:space="preserve">EOS® NORTH TEXAS</w:t>
+        <w:drawing>
+          <wp:inline distT="0" distB="0" distL="0" distR="0">
+            <wp:extent cx="3619500" cy="2800350"/>
+            <wp:effectExtent t="0" r="0" b="0" l="0"/>
+            <wp:docPr id="1" name="img" descr="image" title="we-run-on-eos-ntx.jpg"/>
+            <wp:cNvGraphicFramePr>
+              <a:graphicFrameLocks xmlns:a="http://schemas.openxmlformats.org/drawingml/2006/main" noChangeAspect="1"/>
+            </wp:cNvGraphicFramePr>
+            <a:graphic xmlns:a="http://schemas.openxmlformats.org/drawingml/2006/main">
+              <a:graphicData uri="http://schemas.openxmlformats.org/drawingml/2006/picture">
+                <pic:pic xmlns:pic="http://schemas.openxmlformats.org/drawingml/2006/picture">
+                  <pic:nvPicPr>
+                    <pic:cNvPr id="0" name="" descr=""/>
+                    <pic:cNvPicPr>
+                      <a:picLocks noChangeAspect="1" noChangeArrowheads="1"/>
+                    </pic:cNvPicPr>
+                  </pic:nvPicPr>
+                  <pic:blipFill>
+                    <a:blip r:embed="rId13" cstate="none"/>
+                    <a:srcRect/>
+                    <a:stretch>
+                      <a:fillRect/>
+                    </a:stretch>
+                  </pic:blipFill>
+                  <pic:spPr bwMode="auto">
+                    <a:xfrm>
+                      <a:off x="0" y="0"/>
+                      <a:ext cx="3619500" cy="2800350"/>
+                    </a:xfrm>
+                    <a:prstGeom prst="rect">
+                      <a:avLst/>
+                    </a:prstGeom>
+                  </pic:spPr>
+                </pic:pic>
+              </a:graphicData>
+            </a:graphic>
+          </wp:inline>
+        </w:drawing>
       </w:r>
     </w:p>
     <w:p>
@@ -5795,7 +5807,7 @@
                           </pic:cNvPicPr>
                         </pic:nvPicPr>
                         <pic:blipFill>
-                          <a:blip r:embed="rId13" cstate="none"/>
+                          <a:blip r:embed="rId14" cstate="none"/>
                           <a:srcRect/>
                           <a:stretch>
                             <a:fillRect/>
@@ -6987,7 +6999,7 @@
                           </pic:cNvPicPr>
                         </pic:nvPicPr>
                         <pic:blipFill>
-                          <a:blip r:embed="rId14" cstate="none"/>
+                          <a:blip r:embed="rId15" cstate="none"/>
                           <a:srcRect/>
                           <a:stretch>
                             <a:fillRect/>
@@ -8179,7 +8191,7 @@
                           </pic:cNvPicPr>
                         </pic:nvPicPr>
                         <pic:blipFill>
-                          <a:blip r:embed="rId15" cstate="none"/>
+                          <a:blip r:embed="rId16" cstate="none"/>
                           <a:srcRect/>
                           <a:stretch>
                             <a:fillRect/>
@@ -9315,7 +9327,7 @@
                           </pic:cNvPicPr>
                         </pic:nvPicPr>
                         <pic:blipFill>
-                          <a:blip r:embed="rId16" cstate="none"/>
+                          <a:blip r:embed="rId17" cstate="none"/>
                           <a:srcRect/>
                           <a:stretch>
                             <a:fillRect/>
@@ -9473,7 +9485,7 @@
                           </pic:cNvPicPr>
                         </pic:nvPicPr>
                         <pic:blipFill>
-                          <a:blip r:embed="rId17" cstate="none"/>
+                          <a:blip r:embed="rId18" cstate="none"/>
                           <a:srcRect/>
                           <a:stretch>
                             <a:fillRect/>
@@ -9631,7 +9643,7 @@
                           </pic:cNvPicPr>
                         </pic:nvPicPr>
                         <pic:blipFill>
-                          <a:blip r:embed="rId18" cstate="none"/>
+                          <a:blip r:embed="rId19" cstate="none"/>
                           <a:srcRect/>
                           <a:stretch>
                             <a:fillRect/>
@@ -9901,7 +9913,7 @@
                                 </pic:cNvPicPr>
                               </pic:nvPicPr>
                               <pic:blipFill>
-                                <a:blip r:embed="rId19" cstate="none"/>
+                                <a:blip r:embed="rId20" cstate="none"/>
                                 <a:srcRect/>
                                 <a:stretch>
                                   <a:fillRect/>
@@ -9982,7 +9994,7 @@
                                 </pic:cNvPicPr>
                               </pic:nvPicPr>
                               <pic:blipFill>
-                                <a:blip r:embed="rId20" cstate="none"/>
+                                <a:blip r:embed="rId21" cstate="none"/>
                                 <a:srcRect/>
                                 <a:stretch>
                                   <a:fillRect/>
@@ -10088,7 +10100,7 @@
                                 </pic:cNvPicPr>
                               </pic:nvPicPr>
                               <pic:blipFill>
-                                <a:blip r:embed="rId21" cstate="none"/>
+                                <a:blip r:embed="rId22" cstate="none"/>
                                 <a:srcRect/>
                                 <a:stretch>
                                   <a:fillRect/>
@@ -10169,7 +10181,7 @@
                                 </pic:cNvPicPr>
                               </pic:nvPicPr>
                               <pic:blipFill>
-                                <a:blip r:embed="rId22" cstate="none"/>
+                                <a:blip r:embed="rId23" cstate="none"/>
                                 <a:srcRect/>
                                 <a:stretch>
                                   <a:fillRect/>
@@ -10322,7 +10334,7 @@
                                 </pic:cNvPicPr>
                               </pic:nvPicPr>
                               <pic:blipFill>
-                                <a:blip r:embed="rId23" cstate="none"/>
+                                <a:blip r:embed="rId24" cstate="none"/>
                                 <a:srcRect/>
                                 <a:stretch>
                                   <a:fillRect/>
@@ -10403,7 +10415,7 @@
                                 </pic:cNvPicPr>
                               </pic:nvPicPr>
                               <pic:blipFill>
-                                <a:blip r:embed="rId24" cstate="none"/>
+                                <a:blip r:embed="rId25" cstate="none"/>
                                 <a:srcRect/>
                                 <a:stretch>
                                   <a:fillRect/>
@@ -10509,7 +10521,7 @@
                                 </pic:cNvPicPr>
                               </pic:nvPicPr>
                               <pic:blipFill>
-                                <a:blip r:embed="rId25" cstate="none"/>
+                                <a:blip r:embed="rId26" cstate="none"/>
                                 <a:srcRect/>
                                 <a:stretch>
                                   <a:fillRect/>
@@ -10590,7 +10602,7 @@
                                 </pic:cNvPicPr>
                               </pic:nvPicPr>
                               <pic:blipFill>
-                                <a:blip r:embed="rId26" cstate="none"/>
+                                <a:blip r:embed="rId27" cstate="none"/>
                                 <a:srcRect/>
                                 <a:stretch>
                                   <a:fillRect/>
@@ -10743,7 +10755,7 @@
                                 </pic:cNvPicPr>
                               </pic:nvPicPr>
                               <pic:blipFill>
-                                <a:blip r:embed="rId27" cstate="none"/>
+                                <a:blip r:embed="rId28" cstate="none"/>
                                 <a:srcRect/>
                                 <a:stretch>
                                   <a:fillRect/>
@@ -10824,7 +10836,7 @@
                                 </pic:cNvPicPr>
                               </pic:nvPicPr>
                               <pic:blipFill>
-                                <a:blip r:embed="rId28" cstate="none"/>
+                                <a:blip r:embed="rId29" cstate="none"/>
                                 <a:srcRect/>
                                 <a:stretch>
                                   <a:fillRect/>
@@ -10930,7 +10942,7 @@
                                 </pic:cNvPicPr>
                               </pic:nvPicPr>
                               <pic:blipFill>
-                                <a:blip r:embed="rId29" cstate="none"/>
+                                <a:blip r:embed="rId30" cstate="none"/>
                                 <a:srcRect/>
                                 <a:stretch>
                                   <a:fillRect/>
@@ -11011,7 +11023,7 @@
                                 </pic:cNvPicPr>
                               </pic:nvPicPr>
                               <pic:blipFill>
-                                <a:blip r:embed="rId30" cstate="none"/>
+                                <a:blip r:embed="rId31" cstate="none"/>
                                 <a:srcRect/>
                                 <a:stretch>
                                   <a:fillRect/>
@@ -11164,7 +11176,7 @@
                                 </pic:cNvPicPr>
                               </pic:nvPicPr>
                               <pic:blipFill>
-                                <a:blip r:embed="rId31" cstate="none"/>
+                                <a:blip r:embed="rId32" cstate="none"/>
                                 <a:srcRect/>
                                 <a:stretch>
                                   <a:fillRect/>
@@ -11245,7 +11257,7 @@
                                 </pic:cNvPicPr>
                               </pic:nvPicPr>
                               <pic:blipFill>
-                                <a:blip r:embed="rId32" cstate="none"/>
+                                <a:blip r:embed="rId33" cstate="none"/>
                                 <a:srcRect/>
                                 <a:stretch>
                                   <a:fillRect/>
@@ -11351,7 +11363,7 @@
                                 </pic:cNvPicPr>
                               </pic:nvPicPr>
                               <pic:blipFill>
-                                <a:blip r:embed="rId33" cstate="none"/>
+                                <a:blip r:embed="rId34" cstate="none"/>
                                 <a:srcRect/>
                                 <a:stretch>
                                   <a:fillRect/>
@@ -11432,7 +11444,7 @@
                                 </pic:cNvPicPr>
                               </pic:nvPicPr>
                               <pic:blipFill>
-                                <a:blip r:embed="rId34" cstate="none"/>
+                                <a:blip r:embed="rId35" cstate="none"/>
                                 <a:srcRect/>
                                 <a:stretch>
                                   <a:fillRect/>
@@ -11587,7 +11599,7 @@
                                 </pic:cNvPicPr>
                               </pic:nvPicPr>
                               <pic:blipFill>
-                                <a:blip r:embed="rId35" cstate="none"/>
+                                <a:blip r:embed="rId36" cstate="none"/>
                                 <a:srcRect/>
                                 <a:stretch>
                                   <a:fillRect/>
@@ -11668,7 +11680,7 @@
                                 </pic:cNvPicPr>
                               </pic:nvPicPr>
                               <pic:blipFill>
-                                <a:blip r:embed="rId36" cstate="none"/>
+                                <a:blip r:embed="rId37" cstate="none"/>
                                 <a:srcRect/>
                                 <a:stretch>
                                   <a:fillRect/>
@@ -11774,7 +11786,7 @@
                                 </pic:cNvPicPr>
                               </pic:nvPicPr>
                               <pic:blipFill>
-                                <a:blip r:embed="rId37" cstate="none"/>
+                                <a:blip r:embed="rId38" cstate="none"/>
                                 <a:srcRect/>
                                 <a:stretch>
                                   <a:fillRect/>
@@ -11855,7 +11867,7 @@
                                 </pic:cNvPicPr>
                               </pic:nvPicPr>
                               <pic:blipFill>
-                                <a:blip r:embed="rId38" cstate="none"/>
+                                <a:blip r:embed="rId39" cstate="none"/>
                                 <a:srcRect/>
                                 <a:stretch>
                                   <a:fillRect/>
@@ -11961,7 +11973,7 @@
                                 </pic:cNvPicPr>
                               </pic:nvPicPr>
                               <pic:blipFill>
-                                <a:blip r:embed="rId39" cstate="none"/>
+                                <a:blip r:embed="rId40" cstate="none"/>
                                 <a:srcRect/>
                                 <a:stretch>
                                   <a:fillRect/>
@@ -12042,7 +12054,7 @@
                                 </pic:cNvPicPr>
                               </pic:nvPicPr>
                               <pic:blipFill>
-                                <a:blip r:embed="rId40" cstate="none"/>
+                                <a:blip r:embed="rId41" cstate="none"/>
                                 <a:srcRect/>
                                 <a:stretch>
                                   <a:fillRect/>
@@ -12148,7 +12160,7 @@
                                 </pic:cNvPicPr>
                               </pic:nvPicPr>
                               <pic:blipFill>
-                                <a:blip r:embed="rId41" cstate="none"/>
+                                <a:blip r:embed="rId42" cstate="none"/>
                                 <a:srcRect/>
                                 <a:stretch>
                                   <a:fillRect/>
@@ -12229,7 +12241,7 @@
                                 </pic:cNvPicPr>
                               </pic:nvPicPr>
                               <pic:blipFill>
-                                <a:blip r:embed="rId42" cstate="none"/>
+                                <a:blip r:embed="rId43" cstate="none"/>
                                 <a:srcRect/>
                                 <a:stretch>
                                   <a:fillRect/>
@@ -12340,7 +12352,7 @@
                                 </pic:cNvPicPr>
                               </pic:nvPicPr>
                               <pic:blipFill>
-                                <a:blip r:embed="rId43" cstate="none"/>
+                                <a:blip r:embed="rId44" cstate="none"/>
                                 <a:srcRect/>
                                 <a:stretch>
                                   <a:fillRect/>
@@ -12421,7 +12433,7 @@
                                 </pic:cNvPicPr>
                               </pic:nvPicPr>
                               <pic:blipFill>
-                                <a:blip r:embed="rId44" cstate="none"/>
+                                <a:blip r:embed="rId45" cstate="none"/>
                                 <a:srcRect/>
                                 <a:stretch>
                                   <a:fillRect/>
@@ -12527,7 +12539,7 @@
                                 </pic:cNvPicPr>
                               </pic:nvPicPr>
                               <pic:blipFill>
-                                <a:blip r:embed="rId45" cstate="none"/>
+                                <a:blip r:embed="rId46" cstate="none"/>
                                 <a:srcRect/>
                                 <a:stretch>
                                   <a:fillRect/>
@@ -12608,7 +12620,7 @@
                                 </pic:cNvPicPr>
                               </pic:nvPicPr>
                               <pic:blipFill>
-                                <a:blip r:embed="rId46" cstate="none"/>
+                                <a:blip r:embed="rId47" cstate="none"/>
                                 <a:srcRect/>
                                 <a:stretch>
                                   <a:fillRect/>
@@ -12714,7 +12726,7 @@
                                 </pic:cNvPicPr>
                               </pic:nvPicPr>
                               <pic:blipFill>
-                                <a:blip r:embed="rId47" cstate="none"/>
+                                <a:blip r:embed="rId48" cstate="none"/>
                                 <a:srcRect/>
                                 <a:stretch>
                                   <a:fillRect/>
@@ -12795,7 +12807,7 @@
                                 </pic:cNvPicPr>
                               </pic:nvPicPr>
                               <pic:blipFill>
-                                <a:blip r:embed="rId48" cstate="none"/>
+                                <a:blip r:embed="rId49" cstate="none"/>
                                 <a:srcRect/>
                                 <a:stretch>
                                   <a:fillRect/>
@@ -12901,7 +12913,7 @@
                                 </pic:cNvPicPr>
                               </pic:nvPicPr>
                               <pic:blipFill>
-                                <a:blip r:embed="rId49" cstate="none"/>
+                                <a:blip r:embed="rId50" cstate="none"/>
                                 <a:srcRect/>
                                 <a:stretch>
                                   <a:fillRect/>
@@ -12982,7 +12994,7 @@
                                 </pic:cNvPicPr>
                               </pic:nvPicPr>
                               <pic:blipFill>
-                                <a:blip r:embed="rId50" cstate="none"/>
+                                <a:blip r:embed="rId51" cstate="none"/>
                                 <a:srcRect/>
                                 <a:stretch>
                                   <a:fillRect/>
@@ -13176,7 +13188,7 @@
                                 </pic:cNvPicPr>
                               </pic:nvPicPr>
                               <pic:blipFill>
-                                <a:blip r:embed="rId51" cstate="none"/>
+                                <a:blip r:embed="rId52" cstate="none"/>
                                 <a:srcRect/>
                                 <a:stretch>
                                   <a:fillRect/>
@@ -13315,7 +13327,7 @@
                                 </pic:cNvPicPr>
                               </pic:nvPicPr>
                               <pic:blipFill>
-                                <a:blip r:embed="rId52" cstate="none"/>
+                                <a:blip r:embed="rId53" cstate="none"/>
                                 <a:srcRect/>
                                 <a:stretch>
                                   <a:fillRect/>
@@ -13422,7 +13434,7 @@
                                 </pic:cNvPicPr>
                               </pic:nvPicPr>
                               <pic:blipFill>
-                                <a:blip r:embed="rId53" cstate="none"/>
+                                <a:blip r:embed="rId54" cstate="none"/>
                                 <a:srcRect/>
                                 <a:stretch>
                                   <a:fillRect/>
@@ -13561,7 +13573,7 @@
                                 </pic:cNvPicPr>
                               </pic:nvPicPr>
                               <pic:blipFill>
-                                <a:blip r:embed="rId54" cstate="none"/>
+                                <a:blip r:embed="rId55" cstate="none"/>
                                 <a:srcRect/>
                                 <a:stretch>
                                   <a:fillRect/>
@@ -13698,7 +13710,7 @@
                                 </pic:cNvPicPr>
                               </pic:nvPicPr>
                               <pic:blipFill>
-                                <a:blip r:embed="rId55" cstate="none"/>
+                                <a:blip r:embed="rId56" cstate="none"/>
                                 <a:srcRect/>
                                 <a:stretch>
                                   <a:fillRect/>
@@ -13837,7 +13849,7 @@
                                 </pic:cNvPicPr>
                               </pic:nvPicPr>
                               <pic:blipFill>
-                                <a:blip r:embed="rId56" cstate="none"/>
+                                <a:blip r:embed="rId57" cstate="none"/>
                                 <a:srcRect/>
                                 <a:stretch>
                                   <a:fillRect/>
@@ -13944,7 +13956,7 @@
                                 </pic:cNvPicPr>
                               </pic:nvPicPr>
                               <pic:blipFill>
-                                <a:blip r:embed="rId57" cstate="none"/>
+                                <a:blip r:embed="rId58" cstate="none"/>
                                 <a:srcRect/>
                                 <a:stretch>
                                   <a:fillRect/>
@@ -14083,7 +14095,7 @@
                                 </pic:cNvPicPr>
                               </pic:nvPicPr>
                               <pic:blipFill>
-                                <a:blip r:embed="rId58" cstate="none"/>
+                                <a:blip r:embed="rId59" cstate="none"/>
                                 <a:srcRect/>
                                 <a:stretch>
                                   <a:fillRect/>
@@ -14220,7 +14232,7 @@
                                 </pic:cNvPicPr>
                               </pic:nvPicPr>
                               <pic:blipFill>
-                                <a:blip r:embed="rId59" cstate="none"/>
+                                <a:blip r:embed="rId60" cstate="none"/>
                                 <a:srcRect/>
                                 <a:stretch>
                                   <a:fillRect/>
@@ -14359,7 +14371,7 @@
                                 </pic:cNvPicPr>
                               </pic:nvPicPr>
                               <pic:blipFill>
-                                <a:blip r:embed="rId60" cstate="none"/>
+                                <a:blip r:embed="rId61" cstate="none"/>
                                 <a:srcRect/>
                                 <a:stretch>
                                   <a:fillRect/>
@@ -14466,7 +14478,7 @@
                                 </pic:cNvPicPr>
                               </pic:nvPicPr>
                               <pic:blipFill>
-                                <a:blip r:embed="rId61" cstate="none"/>
+                                <a:blip r:embed="rId62" cstate="none"/>
                                 <a:srcRect/>
                                 <a:stretch>
                                   <a:fillRect/>
@@ -14605,7 +14617,7 @@
                                 </pic:cNvPicPr>
                               </pic:nvPicPr>
                               <pic:blipFill>
-                                <a:blip r:embed="rId62" cstate="none"/>
+                                <a:blip r:embed="rId63" cstate="none"/>
                                 <a:srcRect/>
                                 <a:stretch>
                                   <a:fillRect/>
@@ -14742,7 +14754,7 @@
                                 </pic:cNvPicPr>
                               </pic:nvPicPr>
                               <pic:blipFill>
-                                <a:blip r:embed="rId63" cstate="none"/>
+                                <a:blip r:embed="rId64" cstate="none"/>
                                 <a:srcRect/>
                                 <a:stretch>
                                   <a:fillRect/>
@@ -14881,7 +14893,7 @@
                                 </pic:cNvPicPr>
                               </pic:nvPicPr>
                               <pic:blipFill>
-                                <a:blip r:embed="rId64" cstate="none"/>
+                                <a:blip r:embed="rId65" cstate="none"/>
                                 <a:srcRect/>
                                 <a:stretch>
                                   <a:fillRect/>
@@ -14988,7 +15000,7 @@
                                 </pic:cNvPicPr>
                               </pic:nvPicPr>
                               <pic:blipFill>
-                                <a:blip r:embed="rId65" cstate="none"/>
+                                <a:blip r:embed="rId66" cstate="none"/>
                                 <a:srcRect/>
                                 <a:stretch>
                                   <a:fillRect/>
@@ -15127,7 +15139,7 @@
                                 </pic:cNvPicPr>
                               </pic:nvPicPr>
                               <pic:blipFill>
-                                <a:blip r:embed="rId66" cstate="none"/>
+                                <a:blip r:embed="rId67" cstate="none"/>
                                 <a:srcRect/>
                                 <a:stretch>
                                   <a:fillRect/>
@@ -15264,7 +15276,7 @@
                                 </pic:cNvPicPr>
                               </pic:nvPicPr>
                               <pic:blipFill>
-                                <a:blip r:embed="rId67" cstate="none"/>
+                                <a:blip r:embed="rId68" cstate="none"/>
                                 <a:srcRect/>
                                 <a:stretch>
                                   <a:fillRect/>
@@ -15403,7 +15415,7 @@
                                 </pic:cNvPicPr>
                               </pic:nvPicPr>
                               <pic:blipFill>
-                                <a:blip r:embed="rId68" cstate="none"/>
+                                <a:blip r:embed="rId69" cstate="none"/>
                                 <a:srcRect/>
                                 <a:stretch>
                                   <a:fillRect/>
@@ -15510,7 +15522,7 @@
                                 </pic:cNvPicPr>
                               </pic:nvPicPr>
                               <pic:blipFill>
-                                <a:blip r:embed="rId69" cstate="none"/>
+                                <a:blip r:embed="rId70" cstate="none"/>
                                 <a:srcRect/>
                                 <a:stretch>
                                   <a:fillRect/>
@@ -15649,7 +15661,7 @@
                                 </pic:cNvPicPr>
                               </pic:nvPicPr>
                               <pic:blipFill>
-                                <a:blip r:embed="rId70" cstate="none"/>
+                                <a:blip r:embed="rId71" cstate="none"/>
                                 <a:srcRect/>
                                 <a:stretch>
                                   <a:fillRect/>
@@ -15786,7 +15798,7 @@
                                 </pic:cNvPicPr>
                               </pic:nvPicPr>
                               <pic:blipFill>
-                                <a:blip r:embed="rId71" cstate="none"/>
+                                <a:blip r:embed="rId72" cstate="none"/>
                                 <a:srcRect/>
                                 <a:stretch>
                                   <a:fillRect/>
@@ -15925,7 +15937,7 @@
                                 </pic:cNvPicPr>
                               </pic:nvPicPr>
                               <pic:blipFill>
-                                <a:blip r:embed="rId72" cstate="none"/>
+                                <a:blip r:embed="rId73" cstate="none"/>
                                 <a:srcRect/>
                                 <a:stretch>
                                   <a:fillRect/>
@@ -16032,7 +16044,7 @@
                                 </pic:cNvPicPr>
                               </pic:nvPicPr>
                               <pic:blipFill>
-                                <a:blip r:embed="rId73" cstate="none"/>
+                                <a:blip r:embed="rId74" cstate="none"/>
                                 <a:srcRect/>
                                 <a:stretch>
                                   <a:fillRect/>
@@ -16171,7 +16183,7 @@
                                 </pic:cNvPicPr>
                               </pic:nvPicPr>
                               <pic:blipFill>
-                                <a:blip r:embed="rId74" cstate="none"/>
+                                <a:blip r:embed="rId75" cstate="none"/>
                                 <a:srcRect/>
                                 <a:stretch>
                                   <a:fillRect/>
@@ -16308,7 +16320,7 @@
                                 </pic:cNvPicPr>
                               </pic:nvPicPr>
                               <pic:blipFill>
-                                <a:blip r:embed="rId75" cstate="none"/>
+                                <a:blip r:embed="rId76" cstate="none"/>
                                 <a:srcRect/>
                                 <a:stretch>
                                   <a:fillRect/>
@@ -16447,7 +16459,7 @@
                                 </pic:cNvPicPr>
                               </pic:nvPicPr>
                               <pic:blipFill>
-                                <a:blip r:embed="rId76" cstate="none"/>
+                                <a:blip r:embed="rId77" cstate="none"/>
                                 <a:srcRect/>
                                 <a:stretch>
                                   <a:fillRect/>
@@ -16554,7 +16566,7 @@
                                 </pic:cNvPicPr>
                               </pic:nvPicPr>
                               <pic:blipFill>
-                                <a:blip r:embed="rId77" cstate="none"/>
+                                <a:blip r:embed="rId78" cstate="none"/>
                                 <a:srcRect/>
                                 <a:stretch>
                                   <a:fillRect/>
@@ -16693,7 +16705,7 @@
                                 </pic:cNvPicPr>
                               </pic:nvPicPr>
                               <pic:blipFill>
-                                <a:blip r:embed="rId78" cstate="none"/>
+                                <a:blip r:embed="rId79" cstate="none"/>
                                 <a:srcRect/>
                                 <a:stretch>
                                   <a:fillRect/>
@@ -16830,7 +16842,7 @@
                                 </pic:cNvPicPr>
                               </pic:nvPicPr>
                               <pic:blipFill>
-                                <a:blip r:embed="rId79" cstate="none"/>
+                                <a:blip r:embed="rId80" cstate="none"/>
                                 <a:srcRect/>
                                 <a:stretch>
                                   <a:fillRect/>
@@ -16994,7 +17006,7 @@
                                 </pic:cNvPicPr>
                               </pic:nvPicPr>
                               <pic:blipFill>
-                                <a:blip r:embed="rId80" cstate="none"/>
+                                <a:blip r:embed="rId81" cstate="none"/>
                                 <a:srcRect/>
                                 <a:stretch>
                                   <a:fillRect/>
@@ -17101,7 +17113,7 @@
                                 </pic:cNvPicPr>
                               </pic:nvPicPr>
                               <pic:blipFill>
-                                <a:blip r:embed="rId81" cstate="none"/>
+                                <a:blip r:embed="rId82" cstate="none"/>
                                 <a:srcRect/>
                                 <a:stretch>
                                   <a:fillRect/>
@@ -17265,7 +17277,7 @@
                                 </pic:cNvPicPr>
                               </pic:nvPicPr>
                               <pic:blipFill>
-                                <a:blip r:embed="rId82" cstate="none"/>
+                                <a:blip r:embed="rId83" cstate="none"/>
                                 <a:srcRect/>
                                 <a:stretch>
                                   <a:fillRect/>
@@ -17402,7 +17414,7 @@
                                 </pic:cNvPicPr>
                               </pic:nvPicPr>
                               <pic:blipFill>
-                                <a:blip r:embed="rId83" cstate="none"/>
+                                <a:blip r:embed="rId84" cstate="none"/>
                                 <a:srcRect/>
                                 <a:stretch>
                                   <a:fillRect/>
@@ -17541,7 +17553,7 @@
                                 </pic:cNvPicPr>
                               </pic:nvPicPr>
                               <pic:blipFill>
-                                <a:blip r:embed="rId84" cstate="none"/>
+                                <a:blip r:embed="rId85" cstate="none"/>
                                 <a:srcRect/>
                                 <a:stretch>
                                   <a:fillRect/>
@@ -17648,7 +17660,7 @@
                                 </pic:cNvPicPr>
                               </pic:nvPicPr>
                               <pic:blipFill>
-                                <a:blip r:embed="rId85" cstate="none"/>
+                                <a:blip r:embed="rId86" cstate="none"/>
                                 <a:srcRect/>
                                 <a:stretch>
                                   <a:fillRect/>
@@ -17787,7 +17799,7 @@
                                 </pic:cNvPicPr>
                               </pic:nvPicPr>
                               <pic:blipFill>
-                                <a:blip r:embed="rId86" cstate="none"/>
+                                <a:blip r:embed="rId87" cstate="none"/>
                                 <a:srcRect/>
                                 <a:stretch>
                                   <a:fillRect/>
@@ -17924,7 +17936,7 @@
                                 </pic:cNvPicPr>
                               </pic:nvPicPr>
                               <pic:blipFill>
-                                <a:blip r:embed="rId87" cstate="none"/>
+                                <a:blip r:embed="rId88" cstate="none"/>
                                 <a:srcRect/>
                                 <a:stretch>
                                   <a:fillRect/>
@@ -18063,7 +18075,7 @@
                                 </pic:cNvPicPr>
                               </pic:nvPicPr>
                               <pic:blipFill>
-                                <a:blip r:embed="rId88" cstate="none"/>
+                                <a:blip r:embed="rId89" cstate="none"/>
                                 <a:srcRect/>
                                 <a:stretch>
                                   <a:fillRect/>
@@ -18170,7 +18182,7 @@
                                 </pic:cNvPicPr>
                               </pic:nvPicPr>
                               <pic:blipFill>
-                                <a:blip r:embed="rId89" cstate="none"/>
+                                <a:blip r:embed="rId90" cstate="none"/>
                                 <a:srcRect/>
                                 <a:stretch>
                                   <a:fillRect/>
@@ -18309,7 +18321,7 @@
                                 </pic:cNvPicPr>
                               </pic:nvPicPr>
                               <pic:blipFill>
-                                <a:blip r:embed="rId90" cstate="none"/>
+                                <a:blip r:embed="rId91" cstate="none"/>
                                 <a:srcRect/>
                                 <a:stretch>
                                   <a:fillRect/>
@@ -18446,7 +18458,7 @@
                                 </pic:cNvPicPr>
                               </pic:nvPicPr>
                               <pic:blipFill>
-                                <a:blip r:embed="rId91" cstate="none"/>
+                                <a:blip r:embed="rId92" cstate="none"/>
                                 <a:srcRect/>
                                 <a:stretch>
                                   <a:fillRect/>
@@ -18585,7 +18597,7 @@
                                 </pic:cNvPicPr>
                               </pic:nvPicPr>
                               <pic:blipFill>
-                                <a:blip r:embed="rId92" cstate="none"/>
+                                <a:blip r:embed="rId93" cstate="none"/>
                                 <a:srcRect/>
                                 <a:stretch>
                                   <a:fillRect/>
@@ -18692,7 +18704,7 @@
                                 </pic:cNvPicPr>
                               </pic:nvPicPr>
                               <pic:blipFill>
-                                <a:blip r:embed="rId93" cstate="none"/>
+                                <a:blip r:embed="rId94" cstate="none"/>
                                 <a:srcRect/>
                                 <a:stretch>
                                   <a:fillRect/>
@@ -18831,7 +18843,7 @@
                                 </pic:cNvPicPr>
                               </pic:nvPicPr>
                               <pic:blipFill>
-                                <a:blip r:embed="rId94" cstate="none"/>
+                                <a:blip r:embed="rId95" cstate="none"/>
                                 <a:srcRect/>
                                 <a:stretch>
                                   <a:fillRect/>
@@ -18968,7 +18980,7 @@
                                 </pic:cNvPicPr>
                               </pic:nvPicPr>
                               <pic:blipFill>
-                                <a:blip r:embed="rId95" cstate="none"/>
+                                <a:blip r:embed="rId96" cstate="none"/>
                                 <a:srcRect/>
                                 <a:stretch>
                                   <a:fillRect/>
@@ -19107,7 +19119,7 @@
                                 </pic:cNvPicPr>
                               </pic:nvPicPr>
                               <pic:blipFill>
-                                <a:blip r:embed="rId96" cstate="none"/>
+                                <a:blip r:embed="rId97" cstate="none"/>
                                 <a:srcRect/>
                                 <a:stretch>
                                   <a:fillRect/>
@@ -19214,7 +19226,7 @@
                                 </pic:cNvPicPr>
                               </pic:nvPicPr>
                               <pic:blipFill>
-                                <a:blip r:embed="rId97" cstate="none"/>
+                                <a:blip r:embed="rId98" cstate="none"/>
                                 <a:srcRect/>
                                 <a:stretch>
                                   <a:fillRect/>
@@ -19378,7 +19390,7 @@
                                 </pic:cNvPicPr>
                               </pic:nvPicPr>
                               <pic:blipFill>
-                                <a:blip r:embed="rId98" cstate="none"/>
+                                <a:blip r:embed="rId99" cstate="none"/>
                                 <a:srcRect/>
                                 <a:stretch>
                                   <a:fillRect/>
@@ -19515,7 +19527,7 @@
                                 </pic:cNvPicPr>
                               </pic:nvPicPr>
                               <pic:blipFill>
-                                <a:blip r:embed="rId99" cstate="none"/>
+                                <a:blip r:embed="rId100" cstate="none"/>
                                 <a:srcRect/>
                                 <a:stretch>
                                   <a:fillRect/>
@@ -19679,7 +19691,7 @@
                                 </pic:cNvPicPr>
                               </pic:nvPicPr>
                               <pic:blipFill>
-                                <a:blip r:embed="rId100" cstate="none"/>
+                                <a:blip r:embed="rId101" cstate="none"/>
                                 <a:srcRect/>
                                 <a:stretch>
                                   <a:fillRect/>
@@ -19786,7 +19798,7 @@
                                 </pic:cNvPicPr>
                               </pic:nvPicPr>
                               <pic:blipFill>
-                                <a:blip r:embed="rId101" cstate="none"/>
+                                <a:blip r:embed="rId102" cstate="none"/>
                                 <a:srcRect/>
                                 <a:stretch>
                                   <a:fillRect/>
@@ -19925,7 +19937,7 @@
                                 </pic:cNvPicPr>
                               </pic:nvPicPr>
                               <pic:blipFill>
-                                <a:blip r:embed="rId102" cstate="none"/>
+                                <a:blip r:embed="rId103" cstate="none"/>
                                 <a:srcRect/>
                                 <a:stretch>
                                   <a:fillRect/>
@@ -20062,7 +20074,7 @@
                                 </pic:cNvPicPr>
                               </pic:nvPicPr>
                               <pic:blipFill>
-                                <a:blip r:embed="rId103" cstate="none"/>
+                                <a:blip r:embed="rId104" cstate="none"/>
                                 <a:srcRect/>
                                 <a:stretch>
                                   <a:fillRect/>
@@ -20201,7 +20213,7 @@
                                 </pic:cNvPicPr>
                               </pic:nvPicPr>
                               <pic:blipFill>
-                                <a:blip r:embed="rId104" cstate="none"/>
+                                <a:blip r:embed="rId105" cstate="none"/>
                                 <a:srcRect/>
                                 <a:stretch>
                                   <a:fillRect/>
@@ -20308,7 +20320,7 @@
                                 </pic:cNvPicPr>
                               </pic:nvPicPr>
                               <pic:blipFill>
-                                <a:blip r:embed="rId105" cstate="none"/>
+                                <a:blip r:embed="rId106" cstate="none"/>
                                 <a:srcRect/>
                                 <a:stretch>
                                   <a:fillRect/>
@@ -20447,7 +20459,7 @@
                                 </pic:cNvPicPr>
                               </pic:nvPicPr>
                               <pic:blipFill>
-                                <a:blip r:embed="rId106" cstate="none"/>
+                                <a:blip r:embed="rId107" cstate="none"/>
                                 <a:srcRect/>
                                 <a:stretch>
                                   <a:fillRect/>
@@ -20584,7 +20596,7 @@
                                 </pic:cNvPicPr>
                               </pic:nvPicPr>
                               <pic:blipFill>
-                                <a:blip r:embed="rId107" cstate="none"/>
+                                <a:blip r:embed="rId108" cstate="none"/>
                                 <a:srcRect/>
                                 <a:stretch>
                                   <a:fillRect/>
@@ -20723,7 +20735,7 @@
                                 </pic:cNvPicPr>
                               </pic:nvPicPr>
                               <pic:blipFill>
-                                <a:blip r:embed="rId108" cstate="none"/>
+                                <a:blip r:embed="rId109" cstate="none"/>
                                 <a:srcRect/>
                                 <a:stretch>
                                   <a:fillRect/>
@@ -20830,7 +20842,7 @@
                                 </pic:cNvPicPr>
                               </pic:nvPicPr>
                               <pic:blipFill>
-                                <a:blip r:embed="rId109" cstate="none"/>
+                                <a:blip r:embed="rId110" cstate="none"/>
                                 <a:srcRect/>
                                 <a:stretch>
                                   <a:fillRect/>
@@ -20969,7 +20981,7 @@
                                 </pic:cNvPicPr>
                               </pic:nvPicPr>
                               <pic:blipFill>
-                                <a:blip r:embed="rId110" cstate="none"/>
+                                <a:blip r:embed="rId111" cstate="none"/>
                                 <a:srcRect/>
                                 <a:stretch>
                                   <a:fillRect/>
@@ -21106,7 +21118,7 @@
                                 </pic:cNvPicPr>
                               </pic:nvPicPr>
                               <pic:blipFill>
-                                <a:blip r:embed="rId111" cstate="none"/>
+                                <a:blip r:embed="rId112" cstate="none"/>
                                 <a:srcRect/>
                                 <a:stretch>
                                   <a:fillRect/>
@@ -21245,7 +21257,7 @@
                                 </pic:cNvPicPr>
                               </pic:nvPicPr>
                               <pic:blipFill>
-                                <a:blip r:embed="rId112" cstate="none"/>
+                                <a:blip r:embed="rId113" cstate="none"/>
                                 <a:srcRect/>
                                 <a:stretch>
                                   <a:fillRect/>
@@ -21352,7 +21364,7 @@
                                 </pic:cNvPicPr>
                               </pic:nvPicPr>
                               <pic:blipFill>
-                                <a:blip r:embed="rId113" cstate="none"/>
+                                <a:blip r:embed="rId114" cstate="none"/>
                                 <a:srcRect/>
                                 <a:stretch>
                                   <a:fillRect/>
@@ -21491,7 +21503,7 @@
                                 </pic:cNvPicPr>
                               </pic:nvPicPr>
                               <pic:blipFill>
-                                <a:blip r:embed="rId114" cstate="none"/>
+                                <a:blip r:embed="rId115" cstate="none"/>
                                 <a:srcRect/>
                                 <a:stretch>
                                   <a:fillRect/>
@@ -21628,7 +21640,7 @@
                                 </pic:cNvPicPr>
                               </pic:nvPicPr>
                               <pic:blipFill>
-                                <a:blip r:embed="rId115" cstate="none"/>
+                                <a:blip r:embed="rId116" cstate="none"/>
                                 <a:srcRect/>
                                 <a:stretch>
                                   <a:fillRect/>
@@ -21767,7 +21779,7 @@
                                 </pic:cNvPicPr>
                               </pic:nvPicPr>
                               <pic:blipFill>
-                                <a:blip r:embed="rId116" cstate="none"/>
+                                <a:blip r:embed="rId117" cstate="none"/>
                                 <a:srcRect/>
                                 <a:stretch>
                                   <a:fillRect/>
@@ -21874,7 +21886,7 @@
                                 </pic:cNvPicPr>
                               </pic:nvPicPr>
                               <pic:blipFill>
-                                <a:blip r:embed="rId117" cstate="none"/>
+                                <a:blip r:embed="rId118" cstate="none"/>
                                 <a:srcRect/>
                                 <a:stretch>
                                   <a:fillRect/>
@@ -22013,7 +22025,7 @@
                                 </pic:cNvPicPr>
                               </pic:nvPicPr>
                               <pic:blipFill>
-                                <a:blip r:embed="rId118" cstate="none"/>
+                                <a:blip r:embed="rId119" cstate="none"/>
                                 <a:srcRect/>
                                 <a:stretch>
                                   <a:fillRect/>
@@ -22150,7 +22162,7 @@
                                 </pic:cNvPicPr>
                               </pic:nvPicPr>
                               <pic:blipFill>
-                                <a:blip r:embed="rId119" cstate="none"/>
+                                <a:blip r:embed="rId120" cstate="none"/>
                                 <a:srcRect/>
                                 <a:stretch>
                                   <a:fillRect/>
@@ -22289,7 +22301,7 @@
                                 </pic:cNvPicPr>
                               </pic:nvPicPr>
                               <pic:blipFill>
-                                <a:blip r:embed="rId120" cstate="none"/>
+                                <a:blip r:embed="rId121" cstate="none"/>
                                 <a:srcRect/>
                                 <a:stretch>
                                   <a:fillRect/>
@@ -22396,7 +22408,7 @@
                                 </pic:cNvPicPr>
                               </pic:nvPicPr>
                               <pic:blipFill>
-                                <a:blip r:embed="rId121" cstate="none"/>
+                                <a:blip r:embed="rId122" cstate="none"/>
                                 <a:srcRect/>
                                 <a:stretch>
                                   <a:fillRect/>
@@ -22560,7 +22572,7 @@
                                 </pic:cNvPicPr>
                               </pic:nvPicPr>
                               <pic:blipFill>
-                                <a:blip r:embed="rId122" cstate="none"/>
+                                <a:blip r:embed="rId123" cstate="none"/>
                                 <a:srcRect/>
                                 <a:stretch>
                                   <a:fillRect/>
@@ -22697,7 +22709,7 @@
                                 </pic:cNvPicPr>
                               </pic:nvPicPr>
                               <pic:blipFill>
-                                <a:blip r:embed="rId123" cstate="none"/>
+                                <a:blip r:embed="rId124" cstate="none"/>
                                 <a:srcRect/>
                                 <a:stretch>
                                   <a:fillRect/>
@@ -22836,7 +22848,7 @@
                                 </pic:cNvPicPr>
                               </pic:nvPicPr>
                               <pic:blipFill>
-                                <a:blip r:embed="rId124" cstate="none"/>
+                                <a:blip r:embed="rId125" cstate="none"/>
                                 <a:srcRect/>
                                 <a:stretch>
                                   <a:fillRect/>
@@ -22943,7 +22955,7 @@
                                 </pic:cNvPicPr>
                               </pic:nvPicPr>
                               <pic:blipFill>
-                                <a:blip r:embed="rId125" cstate="none"/>
+                                <a:blip r:embed="rId126" cstate="none"/>
                                 <a:srcRect/>
                                 <a:stretch>
                                   <a:fillRect/>
@@ -23082,7 +23094,7 @@
                                 </pic:cNvPicPr>
                               </pic:nvPicPr>
                               <pic:blipFill>
-                                <a:blip r:embed="rId126" cstate="none"/>
+                                <a:blip r:embed="rId127" cstate="none"/>
                                 <a:srcRect/>
                                 <a:stretch>
                                   <a:fillRect/>
@@ -23219,7 +23231,7 @@
                                 </pic:cNvPicPr>
                               </pic:nvPicPr>
                               <pic:blipFill>
-                                <a:blip r:embed="rId127" cstate="none"/>
+                                <a:blip r:embed="rId128" cstate="none"/>
                                 <a:srcRect/>
                                 <a:stretch>
                                   <a:fillRect/>
@@ -23358,7 +23370,7 @@
                                 </pic:cNvPicPr>
                               </pic:nvPicPr>
                               <pic:blipFill>
-                                <a:blip r:embed="rId128" cstate="none"/>
+                                <a:blip r:embed="rId129" cstate="none"/>
                                 <a:srcRect/>
                                 <a:stretch>
                                   <a:fillRect/>
@@ -23465,7 +23477,7 @@
                                 </pic:cNvPicPr>
                               </pic:nvPicPr>
                               <pic:blipFill>
-                                <a:blip r:embed="rId129" cstate="none"/>
+                                <a:blip r:embed="rId130" cstate="none"/>
                                 <a:srcRect/>
                                 <a:stretch>
                                   <a:fillRect/>
@@ -23604,7 +23616,7 @@
                                 </pic:cNvPicPr>
                               </pic:nvPicPr>
                               <pic:blipFill>
-                                <a:blip r:embed="rId130" cstate="none"/>
+                                <a:blip r:embed="rId131" cstate="none"/>
                                 <a:srcRect/>
                                 <a:stretch>
                                   <a:fillRect/>
@@ -23658,7 +23670,7 @@
     </w:p>
     <w:p>
       <w:pPr>
-        <w:spacing w:before="3000"/>
+        <w:spacing w:before="2400"/>
       </w:pPr>
       <w:r>
         <w:t xml:space="preserve"/>
@@ -23686,7 +23698,7 @@
         <w:pBdr>
           <w:bottom w:val="single" w:color="E87722" w:sz="12"/>
         </w:pBdr>
-        <w:spacing w:after="800"/>
+        <w:spacing w:after="600"/>
         <w:jc w:val="center"/>
       </w:pPr>
       <w:r>
@@ -23708,6 +23720,52 @@
           <w:szCs w:val="32"/>
         </w:rPr>
         <w:t xml:space="preserve">See you next year.</w:t>
+      </w:r>
+    </w:p>
+    <w:p>
+      <w:pPr>
+        <w:spacing w:after="300" w:before="300"/>
+        <w:jc w:val="center"/>
+      </w:pPr>
+      <w:r>
+        <w:drawing>
+          <wp:inline distT="0" distB="0" distL="0" distR="0">
+            <wp:extent cx="2476500" cy="1914525"/>
+            <wp:effectExtent t="0" r="0" b="0" l="0"/>
+            <wp:docPr id="1" name="img" descr="image" title="we-run-on-eos-ntx.jpg"/>
+            <wp:cNvGraphicFramePr>
+              <a:graphicFrameLocks xmlns:a="http://schemas.openxmlformats.org/drawingml/2006/main" noChangeAspect="1"/>
+            </wp:cNvGraphicFramePr>
+            <a:graphic xmlns:a="http://schemas.openxmlformats.org/drawingml/2006/main">
+              <a:graphicData uri="http://schemas.openxmlformats.org/drawingml/2006/picture">
+                <pic:pic xmlns:pic="http://schemas.openxmlformats.org/drawingml/2006/picture">
+                  <pic:nvPicPr>
+                    <pic:cNvPr id="0" name="" descr=""/>
+                    <pic:cNvPicPr>
+                      <a:picLocks noChangeAspect="1" noChangeArrowheads="1"/>
+                    </pic:cNvPicPr>
+                  </pic:nvPicPr>
+                  <pic:blipFill>
+                    <a:blip r:embed="rId13" cstate="none"/>
+                    <a:srcRect/>
+                    <a:stretch>
+                      <a:fillRect/>
+                    </a:stretch>
+                  </pic:blipFill>
+                  <pic:spPr bwMode="auto">
+                    <a:xfrm>
+                      <a:off x="0" y="0"/>
+                      <a:ext cx="2476500" cy="1914525"/>
+                    </a:xfrm>
+                    <a:prstGeom prst="rect">
+                      <a:avLst/>
+                    </a:prstGeom>
+                  </pic:spPr>
+                </pic:pic>
+              </a:graphicData>
+            </a:graphic>
+          </wp:inline>
+        </w:drawing>
       </w:r>
     </w:p>
     <w:p>

</xml_diff>

<commit_message>
workbook: insert Networking & Reflection page (Connections, Table-Mates, Thought Provoking Questions, Memorable Quotes) as new page 4
</commit_message>
<xml_diff>
--- a/deliverables/workbook/Workbook.docx
+++ b/deliverables/workbook/Workbook.docx
@@ -1906,6 +1906,3011 @@
               <w:t xml:space="preserve">Celebrate wins. Connect. Go home fired up.</w:t>
             </w:r>
           </w:p>
+        </w:tc>
+      </w:tr>
+    </w:tbl>
+    <w:p>
+      <w:r>
+        <w:br w:type="page"/>
+      </w:r>
+    </w:p>
+    <w:p>
+      <w:pPr>
+        <w:spacing w:after="60"/>
+        <w:jc w:val="left"/>
+      </w:pPr>
+      <w:r>
+        <w:rPr>
+          <w:rFonts w:ascii="Calibri" w:cs="Calibri" w:eastAsia="Calibri" w:hAnsi="Calibri"/>
+          <w:b/>
+          <w:bCs/>
+          <w:color w:val="E87722"/>
+          <w:sz w:val="24"/>
+          <w:szCs w:val="24"/>
+        </w:rPr>
+        <w:t xml:space="preserve">NETWORKING &amp; REFLECTION</w:t>
+      </w:r>
+    </w:p>
+    <w:p>
+      <w:pPr>
+        <w:pBdr>
+          <w:bottom w:val="single" w:color="E87722" w:sz="6"/>
+        </w:pBdr>
+        <w:spacing w:after="240"/>
+        <w:jc w:val="left"/>
+      </w:pPr>
+      <w:r>
+        <w:rPr>
+          <w:rFonts w:ascii="Calibri" w:cs="Calibri" w:eastAsia="Calibri" w:hAnsi="Calibri"/>
+          <w:color w:val="5A6B82"/>
+          <w:sz w:val="18"/>
+          <w:szCs w:val="18"/>
+        </w:rPr>
+        <w:t xml:space="preserve">Capture the people, ideas, and moments you don’t want to forget.</w:t>
+      </w:r>
+    </w:p>
+    <w:tbl>
+      <w:tblPr>
+        <w:tblW w:type="dxa" w:w="10080"/>
+        <w:tblBorders>
+          <w:top w:val="none" w:color="FFFFFF" w:sz="0"/>
+          <w:left w:val="none" w:color="FFFFFF" w:sz="0"/>
+          <w:bottom w:val="none" w:color="FFFFFF" w:sz="0"/>
+          <w:right w:val="none" w:color="FFFFFF" w:sz="0"/>
+          <w:insideH w:val="single" w:color="auto" w:sz="4"/>
+          <w:insideV w:val="single" w:color="auto" w:sz="4"/>
+        </w:tblBorders>
+      </w:tblPr>
+      <w:tblGrid>
+        <w:gridCol w:w="4920"/>
+        <w:gridCol w:w="4920"/>
+      </w:tblGrid>
+      <w:tr>
+        <w:tc>
+          <w:tcPr>
+            <w:tcW w:type="dxa" w:w="4920"/>
+            <w:tcBorders>
+              <w:top w:val="none" w:color="FFFFFF" w:sz="0"/>
+              <w:left w:val="none" w:color="FFFFFF" w:sz="0"/>
+              <w:bottom w:val="none" w:color="FFFFFF" w:sz="0"/>
+              <w:right w:val="none" w:color="FFFFFF" w:sz="0"/>
+            </w:tcBorders>
+            <w:tcMar>
+              <w:top w:type="dxa" w:w="80"/>
+              <w:left w:type="dxa" w:w="0"/>
+              <w:bottom w:type="dxa" w:w="80"/>
+              <w:right w:type="dxa" w:w="120"/>
+            </w:tcMar>
+          </w:tcPr>
+          <w:p>
+            <w:pPr>
+              <w:pBdr>
+                <w:bottom w:val="single" w:color="E87722" w:sz="6"/>
+              </w:pBdr>
+              <w:spacing w:after="120" w:before="0"/>
+            </w:pPr>
+            <w:r>
+              <w:rPr>
+                <w:rFonts w:ascii="Calibri" w:cs="Calibri" w:eastAsia="Calibri" w:hAnsi="Calibri"/>
+                <w:b/>
+                <w:bCs/>
+                <w:color w:val="E87722"/>
+                <w:sz w:val="22"/>
+                <w:szCs w:val="22"/>
+              </w:rPr>
+              <w:t xml:space="preserve">CONNECTIONS</w:t>
+            </w:r>
+          </w:p>
+          <w:tbl>
+            <w:tblPr>
+              <w:tblW w:type="dxa" w:w="4800"/>
+              <w:tblBorders>
+                <w:top w:val="none" w:color="FFFFFF" w:sz="0"/>
+                <w:left w:val="none" w:color="FFFFFF" w:sz="0"/>
+                <w:bottom w:val="none" w:color="FFFFFF" w:sz="0"/>
+                <w:right w:val="none" w:color="FFFFFF" w:sz="0"/>
+                <w:insideH w:val="single" w:color="auto" w:sz="4"/>
+                <w:insideV w:val="single" w:color="auto" w:sz="4"/>
+              </w:tblBorders>
+            </w:tblPr>
+            <w:tblGrid>
+              <w:gridCol w:w="1100"/>
+              <w:gridCol w:w="3700"/>
+            </w:tblGrid>
+            <w:tr>
+              <w:trPr>
+                <w:trHeight w:val="320" w:hRule="exact"/>
+              </w:trPr>
+              <w:tc>
+                <w:tcPr>
+                  <w:tcW w:type="dxa" w:w="1100"/>
+                  <w:tcBorders>
+                    <w:top w:val="none" w:color="FFFFFF" w:sz="0"/>
+                    <w:left w:val="none" w:color="FFFFFF" w:sz="0"/>
+                    <w:bottom w:val="none" w:color="FFFFFF" w:sz="0"/>
+                    <w:right w:val="none" w:color="FFFFFF" w:sz="0"/>
+                  </w:tcBorders>
+                  <w:tcMar>
+                    <w:top w:type="dxa" w:w="0"/>
+                    <w:left w:type="dxa" w:w="40"/>
+                    <w:bottom w:type="dxa" w:w="0"/>
+                    <w:right w:type="dxa" w:w="40"/>
+                  </w:tcMar>
+                  <w:vAlign w:val="bottom"/>
+                </w:tcPr>
+                <w:p>
+                  <w:pPr>
+                    <w:spacing w:after="0" w:before="0"/>
+                  </w:pPr>
+                  <w:r>
+                    <w:rPr>
+                      <w:rFonts w:ascii="Calibri" w:cs="Calibri" w:eastAsia="Calibri" w:hAnsi="Calibri"/>
+                      <w:b/>
+                      <w:bCs/>
+                      <w:color w:val="5A6B82"/>
+                      <w:sz w:val="16"/>
+                      <w:szCs w:val="16"/>
+                    </w:rPr>
+                    <w:t xml:space="preserve">Name</w:t>
+                  </w:r>
+                </w:p>
+              </w:tc>
+              <w:tc>
+                <w:tcPr>
+                  <w:tcW w:type="dxa" w:w="3700"/>
+                  <w:tcBorders>
+                    <w:top w:val="none" w:color="FFFFFF" w:sz="0"/>
+                    <w:left w:val="none" w:color="FFFFFF" w:sz="0"/>
+                    <w:bottom w:val="single" w:color="C9D2DE" w:sz="4"/>
+                    <w:right w:val="none" w:color="FFFFFF" w:sz="0"/>
+                  </w:tcBorders>
+                  <w:tcMar>
+                    <w:top w:type="dxa" w:w="0"/>
+                    <w:left w:type="dxa" w:w="0"/>
+                    <w:bottom w:type="dxa" w:w="0"/>
+                    <w:right w:type="dxa" w:w="0"/>
+                  </w:tcMar>
+                </w:tcPr>
+                <w:p>
+                  <w:pPr>
+                    <w:spacing w:after="0" w:before="0"/>
+                  </w:pPr>
+                  <w:r>
+                    <w:rPr>
+                      <w:rFonts w:ascii="Calibri" w:cs="Calibri" w:eastAsia="Calibri" w:hAnsi="Calibri"/>
+                      <w:sz w:val="16"/>
+                      <w:szCs w:val="16"/>
+                    </w:rPr>
+                    <w:t xml:space="preserve"> </w:t>
+                  </w:r>
+                </w:p>
+              </w:tc>
+            </w:tr>
+            <w:tr>
+              <w:trPr>
+                <w:trHeight w:val="320" w:hRule="exact"/>
+              </w:trPr>
+              <w:tc>
+                <w:tcPr>
+                  <w:tcW w:type="dxa" w:w="1100"/>
+                  <w:tcBorders>
+                    <w:top w:val="none" w:color="FFFFFF" w:sz="0"/>
+                    <w:left w:val="none" w:color="FFFFFF" w:sz="0"/>
+                    <w:bottom w:val="none" w:color="FFFFFF" w:sz="0"/>
+                    <w:right w:val="none" w:color="FFFFFF" w:sz="0"/>
+                  </w:tcBorders>
+                  <w:tcMar>
+                    <w:top w:type="dxa" w:w="0"/>
+                    <w:left w:type="dxa" w:w="40"/>
+                    <w:bottom w:type="dxa" w:w="0"/>
+                    <w:right w:type="dxa" w:w="40"/>
+                  </w:tcMar>
+                  <w:vAlign w:val="bottom"/>
+                </w:tcPr>
+                <w:p>
+                  <w:pPr>
+                    <w:spacing w:after="0" w:before="0"/>
+                  </w:pPr>
+                  <w:r>
+                    <w:rPr>
+                      <w:rFonts w:ascii="Calibri" w:cs="Calibri" w:eastAsia="Calibri" w:hAnsi="Calibri"/>
+                      <w:b/>
+                      <w:bCs/>
+                      <w:color w:val="5A6B82"/>
+                      <w:sz w:val="16"/>
+                      <w:szCs w:val="16"/>
+                    </w:rPr>
+                    <w:t xml:space="preserve">Business</w:t>
+                  </w:r>
+                </w:p>
+              </w:tc>
+              <w:tc>
+                <w:tcPr>
+                  <w:tcW w:type="dxa" w:w="3700"/>
+                  <w:tcBorders>
+                    <w:top w:val="none" w:color="FFFFFF" w:sz="0"/>
+                    <w:left w:val="none" w:color="FFFFFF" w:sz="0"/>
+                    <w:bottom w:val="single" w:color="C9D2DE" w:sz="4"/>
+                    <w:right w:val="none" w:color="FFFFFF" w:sz="0"/>
+                  </w:tcBorders>
+                  <w:tcMar>
+                    <w:top w:type="dxa" w:w="0"/>
+                    <w:left w:type="dxa" w:w="0"/>
+                    <w:bottom w:type="dxa" w:w="0"/>
+                    <w:right w:type="dxa" w:w="0"/>
+                  </w:tcMar>
+                </w:tcPr>
+                <w:p>
+                  <w:pPr>
+                    <w:spacing w:after="0" w:before="0"/>
+                  </w:pPr>
+                  <w:r>
+                    <w:rPr>
+                      <w:rFonts w:ascii="Calibri" w:cs="Calibri" w:eastAsia="Calibri" w:hAnsi="Calibri"/>
+                      <w:sz w:val="16"/>
+                      <w:szCs w:val="16"/>
+                    </w:rPr>
+                    <w:t xml:space="preserve"> </w:t>
+                  </w:r>
+                </w:p>
+              </w:tc>
+            </w:tr>
+            <w:tr>
+              <w:trPr>
+                <w:trHeight w:val="320" w:hRule="exact"/>
+              </w:trPr>
+              <w:tc>
+                <w:tcPr>
+                  <w:tcW w:type="dxa" w:w="1100"/>
+                  <w:tcBorders>
+                    <w:top w:val="none" w:color="FFFFFF" w:sz="0"/>
+                    <w:left w:val="none" w:color="FFFFFF" w:sz="0"/>
+                    <w:bottom w:val="none" w:color="FFFFFF" w:sz="0"/>
+                    <w:right w:val="none" w:color="FFFFFF" w:sz="0"/>
+                  </w:tcBorders>
+                  <w:tcMar>
+                    <w:top w:type="dxa" w:w="0"/>
+                    <w:left w:type="dxa" w:w="40"/>
+                    <w:bottom w:type="dxa" w:w="0"/>
+                    <w:right w:type="dxa" w:w="40"/>
+                  </w:tcMar>
+                  <w:vAlign w:val="bottom"/>
+                </w:tcPr>
+                <w:p>
+                  <w:pPr>
+                    <w:spacing w:after="0" w:before="0"/>
+                  </w:pPr>
+                  <w:r>
+                    <w:rPr>
+                      <w:rFonts w:ascii="Calibri" w:cs="Calibri" w:eastAsia="Calibri" w:hAnsi="Calibri"/>
+                      <w:b/>
+                      <w:bCs/>
+                      <w:color w:val="5A6B82"/>
+                      <w:sz w:val="16"/>
+                      <w:szCs w:val="16"/>
+                    </w:rPr>
+                    <w:t xml:space="preserve">Role</w:t>
+                  </w:r>
+                </w:p>
+              </w:tc>
+              <w:tc>
+                <w:tcPr>
+                  <w:tcW w:type="dxa" w:w="3700"/>
+                  <w:tcBorders>
+                    <w:top w:val="none" w:color="FFFFFF" w:sz="0"/>
+                    <w:left w:val="none" w:color="FFFFFF" w:sz="0"/>
+                    <w:bottom w:val="single" w:color="C9D2DE" w:sz="4"/>
+                    <w:right w:val="none" w:color="FFFFFF" w:sz="0"/>
+                  </w:tcBorders>
+                  <w:tcMar>
+                    <w:top w:type="dxa" w:w="0"/>
+                    <w:left w:type="dxa" w:w="0"/>
+                    <w:bottom w:type="dxa" w:w="0"/>
+                    <w:right w:type="dxa" w:w="0"/>
+                  </w:tcMar>
+                </w:tcPr>
+                <w:p>
+                  <w:pPr>
+                    <w:spacing w:after="0" w:before="0"/>
+                  </w:pPr>
+                  <w:r>
+                    <w:rPr>
+                      <w:rFonts w:ascii="Calibri" w:cs="Calibri" w:eastAsia="Calibri" w:hAnsi="Calibri"/>
+                      <w:sz w:val="16"/>
+                      <w:szCs w:val="16"/>
+                    </w:rPr>
+                    <w:t xml:space="preserve"> </w:t>
+                  </w:r>
+                </w:p>
+              </w:tc>
+            </w:tr>
+            <w:tr>
+              <w:trPr>
+                <w:trHeight w:val="320" w:hRule="exact"/>
+              </w:trPr>
+              <w:tc>
+                <w:tcPr>
+                  <w:tcW w:type="dxa" w:w="1100"/>
+                  <w:tcBorders>
+                    <w:top w:val="none" w:color="FFFFFF" w:sz="0"/>
+                    <w:left w:val="none" w:color="FFFFFF" w:sz="0"/>
+                    <w:bottom w:val="none" w:color="FFFFFF" w:sz="0"/>
+                    <w:right w:val="none" w:color="FFFFFF" w:sz="0"/>
+                  </w:tcBorders>
+                  <w:tcMar>
+                    <w:top w:type="dxa" w:w="0"/>
+                    <w:left w:type="dxa" w:w="40"/>
+                    <w:bottom w:type="dxa" w:w="0"/>
+                    <w:right w:type="dxa" w:w="40"/>
+                  </w:tcMar>
+                  <w:vAlign w:val="bottom"/>
+                </w:tcPr>
+                <w:p>
+                  <w:pPr>
+                    <w:spacing w:after="0" w:before="0"/>
+                  </w:pPr>
+                  <w:r>
+                    <w:rPr>
+                      <w:rFonts w:ascii="Calibri" w:cs="Calibri" w:eastAsia="Calibri" w:hAnsi="Calibri"/>
+                      <w:b/>
+                      <w:bCs/>
+                      <w:color w:val="5A6B82"/>
+                      <w:sz w:val="16"/>
+                      <w:szCs w:val="16"/>
+                    </w:rPr>
+                    <w:t xml:space="preserve">Phone</w:t>
+                  </w:r>
+                </w:p>
+              </w:tc>
+              <w:tc>
+                <w:tcPr>
+                  <w:tcW w:type="dxa" w:w="3700"/>
+                  <w:tcBorders>
+                    <w:top w:val="none" w:color="FFFFFF" w:sz="0"/>
+                    <w:left w:val="none" w:color="FFFFFF" w:sz="0"/>
+                    <w:bottom w:val="single" w:color="C9D2DE" w:sz="4"/>
+                    <w:right w:val="none" w:color="FFFFFF" w:sz="0"/>
+                  </w:tcBorders>
+                  <w:tcMar>
+                    <w:top w:type="dxa" w:w="0"/>
+                    <w:left w:type="dxa" w:w="0"/>
+                    <w:bottom w:type="dxa" w:w="0"/>
+                    <w:right w:type="dxa" w:w="0"/>
+                  </w:tcMar>
+                </w:tcPr>
+                <w:p>
+                  <w:pPr>
+                    <w:spacing w:after="0" w:before="0"/>
+                  </w:pPr>
+                  <w:r>
+                    <w:rPr>
+                      <w:rFonts w:ascii="Calibri" w:cs="Calibri" w:eastAsia="Calibri" w:hAnsi="Calibri"/>
+                      <w:sz w:val="16"/>
+                      <w:szCs w:val="16"/>
+                    </w:rPr>
+                    <w:t xml:space="preserve"> </w:t>
+                  </w:r>
+                </w:p>
+              </w:tc>
+            </w:tr>
+            <w:tr>
+              <w:trPr>
+                <w:trHeight w:val="320" w:hRule="exact"/>
+              </w:trPr>
+              <w:tc>
+                <w:tcPr>
+                  <w:tcW w:type="dxa" w:w="1100"/>
+                  <w:tcBorders>
+                    <w:top w:val="none" w:color="FFFFFF" w:sz="0"/>
+                    <w:left w:val="none" w:color="FFFFFF" w:sz="0"/>
+                    <w:bottom w:val="none" w:color="FFFFFF" w:sz="0"/>
+                    <w:right w:val="none" w:color="FFFFFF" w:sz="0"/>
+                  </w:tcBorders>
+                  <w:tcMar>
+                    <w:top w:type="dxa" w:w="0"/>
+                    <w:left w:type="dxa" w:w="40"/>
+                    <w:bottom w:type="dxa" w:w="0"/>
+                    <w:right w:type="dxa" w:w="40"/>
+                  </w:tcMar>
+                  <w:vAlign w:val="bottom"/>
+                </w:tcPr>
+                <w:p>
+                  <w:pPr>
+                    <w:spacing w:after="0" w:before="0"/>
+                  </w:pPr>
+                  <w:r>
+                    <w:rPr>
+                      <w:rFonts w:ascii="Calibri" w:cs="Calibri" w:eastAsia="Calibri" w:hAnsi="Calibri"/>
+                      <w:b/>
+                      <w:bCs/>
+                      <w:color w:val="5A6B82"/>
+                      <w:sz w:val="16"/>
+                      <w:szCs w:val="16"/>
+                    </w:rPr>
+                    <w:t xml:space="preserve">Email</w:t>
+                  </w:r>
+                </w:p>
+              </w:tc>
+              <w:tc>
+                <w:tcPr>
+                  <w:tcW w:type="dxa" w:w="3700"/>
+                  <w:tcBorders>
+                    <w:top w:val="none" w:color="FFFFFF" w:sz="0"/>
+                    <w:left w:val="none" w:color="FFFFFF" w:sz="0"/>
+                    <w:bottom w:val="single" w:color="C9D2DE" w:sz="4"/>
+                    <w:right w:val="none" w:color="FFFFFF" w:sz="0"/>
+                  </w:tcBorders>
+                  <w:tcMar>
+                    <w:top w:type="dxa" w:w="0"/>
+                    <w:left w:type="dxa" w:w="0"/>
+                    <w:bottom w:type="dxa" w:w="0"/>
+                    <w:right w:type="dxa" w:w="0"/>
+                  </w:tcMar>
+                </w:tcPr>
+                <w:p>
+                  <w:pPr>
+                    <w:spacing w:after="0" w:before="0"/>
+                  </w:pPr>
+                  <w:r>
+                    <w:rPr>
+                      <w:rFonts w:ascii="Calibri" w:cs="Calibri" w:eastAsia="Calibri" w:hAnsi="Calibri"/>
+                      <w:sz w:val="16"/>
+                      <w:szCs w:val="16"/>
+                    </w:rPr>
+                    <w:t xml:space="preserve"> </w:t>
+                  </w:r>
+                </w:p>
+              </w:tc>
+            </w:tr>
+          </w:tbl>
+          <w:p>
+            <w:pPr>
+              <w:spacing w:after="120"/>
+            </w:pPr>
+            <w:r>
+              <w:t xml:space="preserve"/>
+            </w:r>
+          </w:p>
+          <w:tbl>
+            <w:tblPr>
+              <w:tblW w:type="dxa" w:w="4800"/>
+              <w:tblBorders>
+                <w:top w:val="none" w:color="FFFFFF" w:sz="0"/>
+                <w:left w:val="none" w:color="FFFFFF" w:sz="0"/>
+                <w:bottom w:val="none" w:color="FFFFFF" w:sz="0"/>
+                <w:right w:val="none" w:color="FFFFFF" w:sz="0"/>
+                <w:insideH w:val="single" w:color="auto" w:sz="4"/>
+                <w:insideV w:val="single" w:color="auto" w:sz="4"/>
+              </w:tblBorders>
+            </w:tblPr>
+            <w:tblGrid>
+              <w:gridCol w:w="1100"/>
+              <w:gridCol w:w="3700"/>
+            </w:tblGrid>
+            <w:tr>
+              <w:trPr>
+                <w:trHeight w:val="320" w:hRule="exact"/>
+              </w:trPr>
+              <w:tc>
+                <w:tcPr>
+                  <w:tcW w:type="dxa" w:w="1100"/>
+                  <w:tcBorders>
+                    <w:top w:val="none" w:color="FFFFFF" w:sz="0"/>
+                    <w:left w:val="none" w:color="FFFFFF" w:sz="0"/>
+                    <w:bottom w:val="none" w:color="FFFFFF" w:sz="0"/>
+                    <w:right w:val="none" w:color="FFFFFF" w:sz="0"/>
+                  </w:tcBorders>
+                  <w:tcMar>
+                    <w:top w:type="dxa" w:w="0"/>
+                    <w:left w:type="dxa" w:w="40"/>
+                    <w:bottom w:type="dxa" w:w="0"/>
+                    <w:right w:type="dxa" w:w="40"/>
+                  </w:tcMar>
+                  <w:vAlign w:val="bottom"/>
+                </w:tcPr>
+                <w:p>
+                  <w:pPr>
+                    <w:spacing w:after="0" w:before="0"/>
+                  </w:pPr>
+                  <w:r>
+                    <w:rPr>
+                      <w:rFonts w:ascii="Calibri" w:cs="Calibri" w:eastAsia="Calibri" w:hAnsi="Calibri"/>
+                      <w:b/>
+                      <w:bCs/>
+                      <w:color w:val="5A6B82"/>
+                      <w:sz w:val="16"/>
+                      <w:szCs w:val="16"/>
+                    </w:rPr>
+                    <w:t xml:space="preserve">Name</w:t>
+                  </w:r>
+                </w:p>
+              </w:tc>
+              <w:tc>
+                <w:tcPr>
+                  <w:tcW w:type="dxa" w:w="3700"/>
+                  <w:tcBorders>
+                    <w:top w:val="none" w:color="FFFFFF" w:sz="0"/>
+                    <w:left w:val="none" w:color="FFFFFF" w:sz="0"/>
+                    <w:bottom w:val="single" w:color="C9D2DE" w:sz="4"/>
+                    <w:right w:val="none" w:color="FFFFFF" w:sz="0"/>
+                  </w:tcBorders>
+                  <w:tcMar>
+                    <w:top w:type="dxa" w:w="0"/>
+                    <w:left w:type="dxa" w:w="0"/>
+                    <w:bottom w:type="dxa" w:w="0"/>
+                    <w:right w:type="dxa" w:w="0"/>
+                  </w:tcMar>
+                </w:tcPr>
+                <w:p>
+                  <w:pPr>
+                    <w:spacing w:after="0" w:before="0"/>
+                  </w:pPr>
+                  <w:r>
+                    <w:rPr>
+                      <w:rFonts w:ascii="Calibri" w:cs="Calibri" w:eastAsia="Calibri" w:hAnsi="Calibri"/>
+                      <w:sz w:val="16"/>
+                      <w:szCs w:val="16"/>
+                    </w:rPr>
+                    <w:t xml:space="preserve"> </w:t>
+                  </w:r>
+                </w:p>
+              </w:tc>
+            </w:tr>
+            <w:tr>
+              <w:trPr>
+                <w:trHeight w:val="320" w:hRule="exact"/>
+              </w:trPr>
+              <w:tc>
+                <w:tcPr>
+                  <w:tcW w:type="dxa" w:w="1100"/>
+                  <w:tcBorders>
+                    <w:top w:val="none" w:color="FFFFFF" w:sz="0"/>
+                    <w:left w:val="none" w:color="FFFFFF" w:sz="0"/>
+                    <w:bottom w:val="none" w:color="FFFFFF" w:sz="0"/>
+                    <w:right w:val="none" w:color="FFFFFF" w:sz="0"/>
+                  </w:tcBorders>
+                  <w:tcMar>
+                    <w:top w:type="dxa" w:w="0"/>
+                    <w:left w:type="dxa" w:w="40"/>
+                    <w:bottom w:type="dxa" w:w="0"/>
+                    <w:right w:type="dxa" w:w="40"/>
+                  </w:tcMar>
+                  <w:vAlign w:val="bottom"/>
+                </w:tcPr>
+                <w:p>
+                  <w:pPr>
+                    <w:spacing w:after="0" w:before="0"/>
+                  </w:pPr>
+                  <w:r>
+                    <w:rPr>
+                      <w:rFonts w:ascii="Calibri" w:cs="Calibri" w:eastAsia="Calibri" w:hAnsi="Calibri"/>
+                      <w:b/>
+                      <w:bCs/>
+                      <w:color w:val="5A6B82"/>
+                      <w:sz w:val="16"/>
+                      <w:szCs w:val="16"/>
+                    </w:rPr>
+                    <w:t xml:space="preserve">Business</w:t>
+                  </w:r>
+                </w:p>
+              </w:tc>
+              <w:tc>
+                <w:tcPr>
+                  <w:tcW w:type="dxa" w:w="3700"/>
+                  <w:tcBorders>
+                    <w:top w:val="none" w:color="FFFFFF" w:sz="0"/>
+                    <w:left w:val="none" w:color="FFFFFF" w:sz="0"/>
+                    <w:bottom w:val="single" w:color="C9D2DE" w:sz="4"/>
+                    <w:right w:val="none" w:color="FFFFFF" w:sz="0"/>
+                  </w:tcBorders>
+                  <w:tcMar>
+                    <w:top w:type="dxa" w:w="0"/>
+                    <w:left w:type="dxa" w:w="0"/>
+                    <w:bottom w:type="dxa" w:w="0"/>
+                    <w:right w:type="dxa" w:w="0"/>
+                  </w:tcMar>
+                </w:tcPr>
+                <w:p>
+                  <w:pPr>
+                    <w:spacing w:after="0" w:before="0"/>
+                  </w:pPr>
+                  <w:r>
+                    <w:rPr>
+                      <w:rFonts w:ascii="Calibri" w:cs="Calibri" w:eastAsia="Calibri" w:hAnsi="Calibri"/>
+                      <w:sz w:val="16"/>
+                      <w:szCs w:val="16"/>
+                    </w:rPr>
+                    <w:t xml:space="preserve"> </w:t>
+                  </w:r>
+                </w:p>
+              </w:tc>
+            </w:tr>
+            <w:tr>
+              <w:trPr>
+                <w:trHeight w:val="320" w:hRule="exact"/>
+              </w:trPr>
+              <w:tc>
+                <w:tcPr>
+                  <w:tcW w:type="dxa" w:w="1100"/>
+                  <w:tcBorders>
+                    <w:top w:val="none" w:color="FFFFFF" w:sz="0"/>
+                    <w:left w:val="none" w:color="FFFFFF" w:sz="0"/>
+                    <w:bottom w:val="none" w:color="FFFFFF" w:sz="0"/>
+                    <w:right w:val="none" w:color="FFFFFF" w:sz="0"/>
+                  </w:tcBorders>
+                  <w:tcMar>
+                    <w:top w:type="dxa" w:w="0"/>
+                    <w:left w:type="dxa" w:w="40"/>
+                    <w:bottom w:type="dxa" w:w="0"/>
+                    <w:right w:type="dxa" w:w="40"/>
+                  </w:tcMar>
+                  <w:vAlign w:val="bottom"/>
+                </w:tcPr>
+                <w:p>
+                  <w:pPr>
+                    <w:spacing w:after="0" w:before="0"/>
+                  </w:pPr>
+                  <w:r>
+                    <w:rPr>
+                      <w:rFonts w:ascii="Calibri" w:cs="Calibri" w:eastAsia="Calibri" w:hAnsi="Calibri"/>
+                      <w:b/>
+                      <w:bCs/>
+                      <w:color w:val="5A6B82"/>
+                      <w:sz w:val="16"/>
+                      <w:szCs w:val="16"/>
+                    </w:rPr>
+                    <w:t xml:space="preserve">Role</w:t>
+                  </w:r>
+                </w:p>
+              </w:tc>
+              <w:tc>
+                <w:tcPr>
+                  <w:tcW w:type="dxa" w:w="3700"/>
+                  <w:tcBorders>
+                    <w:top w:val="none" w:color="FFFFFF" w:sz="0"/>
+                    <w:left w:val="none" w:color="FFFFFF" w:sz="0"/>
+                    <w:bottom w:val="single" w:color="C9D2DE" w:sz="4"/>
+                    <w:right w:val="none" w:color="FFFFFF" w:sz="0"/>
+                  </w:tcBorders>
+                  <w:tcMar>
+                    <w:top w:type="dxa" w:w="0"/>
+                    <w:left w:type="dxa" w:w="0"/>
+                    <w:bottom w:type="dxa" w:w="0"/>
+                    <w:right w:type="dxa" w:w="0"/>
+                  </w:tcMar>
+                </w:tcPr>
+                <w:p>
+                  <w:pPr>
+                    <w:spacing w:after="0" w:before="0"/>
+                  </w:pPr>
+                  <w:r>
+                    <w:rPr>
+                      <w:rFonts w:ascii="Calibri" w:cs="Calibri" w:eastAsia="Calibri" w:hAnsi="Calibri"/>
+                      <w:sz w:val="16"/>
+                      <w:szCs w:val="16"/>
+                    </w:rPr>
+                    <w:t xml:space="preserve"> </w:t>
+                  </w:r>
+                </w:p>
+              </w:tc>
+            </w:tr>
+            <w:tr>
+              <w:trPr>
+                <w:trHeight w:val="320" w:hRule="exact"/>
+              </w:trPr>
+              <w:tc>
+                <w:tcPr>
+                  <w:tcW w:type="dxa" w:w="1100"/>
+                  <w:tcBorders>
+                    <w:top w:val="none" w:color="FFFFFF" w:sz="0"/>
+                    <w:left w:val="none" w:color="FFFFFF" w:sz="0"/>
+                    <w:bottom w:val="none" w:color="FFFFFF" w:sz="0"/>
+                    <w:right w:val="none" w:color="FFFFFF" w:sz="0"/>
+                  </w:tcBorders>
+                  <w:tcMar>
+                    <w:top w:type="dxa" w:w="0"/>
+                    <w:left w:type="dxa" w:w="40"/>
+                    <w:bottom w:type="dxa" w:w="0"/>
+                    <w:right w:type="dxa" w:w="40"/>
+                  </w:tcMar>
+                  <w:vAlign w:val="bottom"/>
+                </w:tcPr>
+                <w:p>
+                  <w:pPr>
+                    <w:spacing w:after="0" w:before="0"/>
+                  </w:pPr>
+                  <w:r>
+                    <w:rPr>
+                      <w:rFonts w:ascii="Calibri" w:cs="Calibri" w:eastAsia="Calibri" w:hAnsi="Calibri"/>
+                      <w:b/>
+                      <w:bCs/>
+                      <w:color w:val="5A6B82"/>
+                      <w:sz w:val="16"/>
+                      <w:szCs w:val="16"/>
+                    </w:rPr>
+                    <w:t xml:space="preserve">Phone</w:t>
+                  </w:r>
+                </w:p>
+              </w:tc>
+              <w:tc>
+                <w:tcPr>
+                  <w:tcW w:type="dxa" w:w="3700"/>
+                  <w:tcBorders>
+                    <w:top w:val="none" w:color="FFFFFF" w:sz="0"/>
+                    <w:left w:val="none" w:color="FFFFFF" w:sz="0"/>
+                    <w:bottom w:val="single" w:color="C9D2DE" w:sz="4"/>
+                    <w:right w:val="none" w:color="FFFFFF" w:sz="0"/>
+                  </w:tcBorders>
+                  <w:tcMar>
+                    <w:top w:type="dxa" w:w="0"/>
+                    <w:left w:type="dxa" w:w="0"/>
+                    <w:bottom w:type="dxa" w:w="0"/>
+                    <w:right w:type="dxa" w:w="0"/>
+                  </w:tcMar>
+                </w:tcPr>
+                <w:p>
+                  <w:pPr>
+                    <w:spacing w:after="0" w:before="0"/>
+                  </w:pPr>
+                  <w:r>
+                    <w:rPr>
+                      <w:rFonts w:ascii="Calibri" w:cs="Calibri" w:eastAsia="Calibri" w:hAnsi="Calibri"/>
+                      <w:sz w:val="16"/>
+                      <w:szCs w:val="16"/>
+                    </w:rPr>
+                    <w:t xml:space="preserve"> </w:t>
+                  </w:r>
+                </w:p>
+              </w:tc>
+            </w:tr>
+            <w:tr>
+              <w:trPr>
+                <w:trHeight w:val="320" w:hRule="exact"/>
+              </w:trPr>
+              <w:tc>
+                <w:tcPr>
+                  <w:tcW w:type="dxa" w:w="1100"/>
+                  <w:tcBorders>
+                    <w:top w:val="none" w:color="FFFFFF" w:sz="0"/>
+                    <w:left w:val="none" w:color="FFFFFF" w:sz="0"/>
+                    <w:bottom w:val="none" w:color="FFFFFF" w:sz="0"/>
+                    <w:right w:val="none" w:color="FFFFFF" w:sz="0"/>
+                  </w:tcBorders>
+                  <w:tcMar>
+                    <w:top w:type="dxa" w:w="0"/>
+                    <w:left w:type="dxa" w:w="40"/>
+                    <w:bottom w:type="dxa" w:w="0"/>
+                    <w:right w:type="dxa" w:w="40"/>
+                  </w:tcMar>
+                  <w:vAlign w:val="bottom"/>
+                </w:tcPr>
+                <w:p>
+                  <w:pPr>
+                    <w:spacing w:after="0" w:before="0"/>
+                  </w:pPr>
+                  <w:r>
+                    <w:rPr>
+                      <w:rFonts w:ascii="Calibri" w:cs="Calibri" w:eastAsia="Calibri" w:hAnsi="Calibri"/>
+                      <w:b/>
+                      <w:bCs/>
+                      <w:color w:val="5A6B82"/>
+                      <w:sz w:val="16"/>
+                      <w:szCs w:val="16"/>
+                    </w:rPr>
+                    <w:t xml:space="preserve">Email</w:t>
+                  </w:r>
+                </w:p>
+              </w:tc>
+              <w:tc>
+                <w:tcPr>
+                  <w:tcW w:type="dxa" w:w="3700"/>
+                  <w:tcBorders>
+                    <w:top w:val="none" w:color="FFFFFF" w:sz="0"/>
+                    <w:left w:val="none" w:color="FFFFFF" w:sz="0"/>
+                    <w:bottom w:val="single" w:color="C9D2DE" w:sz="4"/>
+                    <w:right w:val="none" w:color="FFFFFF" w:sz="0"/>
+                  </w:tcBorders>
+                  <w:tcMar>
+                    <w:top w:type="dxa" w:w="0"/>
+                    <w:left w:type="dxa" w:w="0"/>
+                    <w:bottom w:type="dxa" w:w="0"/>
+                    <w:right w:type="dxa" w:w="0"/>
+                  </w:tcMar>
+                </w:tcPr>
+                <w:p>
+                  <w:pPr>
+                    <w:spacing w:after="0" w:before="0"/>
+                  </w:pPr>
+                  <w:r>
+                    <w:rPr>
+                      <w:rFonts w:ascii="Calibri" w:cs="Calibri" w:eastAsia="Calibri" w:hAnsi="Calibri"/>
+                      <w:sz w:val="16"/>
+                      <w:szCs w:val="16"/>
+                    </w:rPr>
+                    <w:t xml:space="preserve"> </w:t>
+                  </w:r>
+                </w:p>
+              </w:tc>
+            </w:tr>
+          </w:tbl>
+          <w:p>
+            <w:pPr>
+              <w:spacing w:after="120"/>
+            </w:pPr>
+            <w:r>
+              <w:t xml:space="preserve"/>
+            </w:r>
+          </w:p>
+          <w:tbl>
+            <w:tblPr>
+              <w:tblW w:type="dxa" w:w="4800"/>
+              <w:tblBorders>
+                <w:top w:val="none" w:color="FFFFFF" w:sz="0"/>
+                <w:left w:val="none" w:color="FFFFFF" w:sz="0"/>
+                <w:bottom w:val="none" w:color="FFFFFF" w:sz="0"/>
+                <w:right w:val="none" w:color="FFFFFF" w:sz="0"/>
+                <w:insideH w:val="single" w:color="auto" w:sz="4"/>
+                <w:insideV w:val="single" w:color="auto" w:sz="4"/>
+              </w:tblBorders>
+            </w:tblPr>
+            <w:tblGrid>
+              <w:gridCol w:w="1100"/>
+              <w:gridCol w:w="3700"/>
+            </w:tblGrid>
+            <w:tr>
+              <w:trPr>
+                <w:trHeight w:val="320" w:hRule="exact"/>
+              </w:trPr>
+              <w:tc>
+                <w:tcPr>
+                  <w:tcW w:type="dxa" w:w="1100"/>
+                  <w:tcBorders>
+                    <w:top w:val="none" w:color="FFFFFF" w:sz="0"/>
+                    <w:left w:val="none" w:color="FFFFFF" w:sz="0"/>
+                    <w:bottom w:val="none" w:color="FFFFFF" w:sz="0"/>
+                    <w:right w:val="none" w:color="FFFFFF" w:sz="0"/>
+                  </w:tcBorders>
+                  <w:tcMar>
+                    <w:top w:type="dxa" w:w="0"/>
+                    <w:left w:type="dxa" w:w="40"/>
+                    <w:bottom w:type="dxa" w:w="0"/>
+                    <w:right w:type="dxa" w:w="40"/>
+                  </w:tcMar>
+                  <w:vAlign w:val="bottom"/>
+                </w:tcPr>
+                <w:p>
+                  <w:pPr>
+                    <w:spacing w:after="0" w:before="0"/>
+                  </w:pPr>
+                  <w:r>
+                    <w:rPr>
+                      <w:rFonts w:ascii="Calibri" w:cs="Calibri" w:eastAsia="Calibri" w:hAnsi="Calibri"/>
+                      <w:b/>
+                      <w:bCs/>
+                      <w:color w:val="5A6B82"/>
+                      <w:sz w:val="16"/>
+                      <w:szCs w:val="16"/>
+                    </w:rPr>
+                    <w:t xml:space="preserve">Name</w:t>
+                  </w:r>
+                </w:p>
+              </w:tc>
+              <w:tc>
+                <w:tcPr>
+                  <w:tcW w:type="dxa" w:w="3700"/>
+                  <w:tcBorders>
+                    <w:top w:val="none" w:color="FFFFFF" w:sz="0"/>
+                    <w:left w:val="none" w:color="FFFFFF" w:sz="0"/>
+                    <w:bottom w:val="single" w:color="C9D2DE" w:sz="4"/>
+                    <w:right w:val="none" w:color="FFFFFF" w:sz="0"/>
+                  </w:tcBorders>
+                  <w:tcMar>
+                    <w:top w:type="dxa" w:w="0"/>
+                    <w:left w:type="dxa" w:w="0"/>
+                    <w:bottom w:type="dxa" w:w="0"/>
+                    <w:right w:type="dxa" w:w="0"/>
+                  </w:tcMar>
+                </w:tcPr>
+                <w:p>
+                  <w:pPr>
+                    <w:spacing w:after="0" w:before="0"/>
+                  </w:pPr>
+                  <w:r>
+                    <w:rPr>
+                      <w:rFonts w:ascii="Calibri" w:cs="Calibri" w:eastAsia="Calibri" w:hAnsi="Calibri"/>
+                      <w:sz w:val="16"/>
+                      <w:szCs w:val="16"/>
+                    </w:rPr>
+                    <w:t xml:space="preserve"> </w:t>
+                  </w:r>
+                </w:p>
+              </w:tc>
+            </w:tr>
+            <w:tr>
+              <w:trPr>
+                <w:trHeight w:val="320" w:hRule="exact"/>
+              </w:trPr>
+              <w:tc>
+                <w:tcPr>
+                  <w:tcW w:type="dxa" w:w="1100"/>
+                  <w:tcBorders>
+                    <w:top w:val="none" w:color="FFFFFF" w:sz="0"/>
+                    <w:left w:val="none" w:color="FFFFFF" w:sz="0"/>
+                    <w:bottom w:val="none" w:color="FFFFFF" w:sz="0"/>
+                    <w:right w:val="none" w:color="FFFFFF" w:sz="0"/>
+                  </w:tcBorders>
+                  <w:tcMar>
+                    <w:top w:type="dxa" w:w="0"/>
+                    <w:left w:type="dxa" w:w="40"/>
+                    <w:bottom w:type="dxa" w:w="0"/>
+                    <w:right w:type="dxa" w:w="40"/>
+                  </w:tcMar>
+                  <w:vAlign w:val="bottom"/>
+                </w:tcPr>
+                <w:p>
+                  <w:pPr>
+                    <w:spacing w:after="0" w:before="0"/>
+                  </w:pPr>
+                  <w:r>
+                    <w:rPr>
+                      <w:rFonts w:ascii="Calibri" w:cs="Calibri" w:eastAsia="Calibri" w:hAnsi="Calibri"/>
+                      <w:b/>
+                      <w:bCs/>
+                      <w:color w:val="5A6B82"/>
+                      <w:sz w:val="16"/>
+                      <w:szCs w:val="16"/>
+                    </w:rPr>
+                    <w:t xml:space="preserve">Business</w:t>
+                  </w:r>
+                </w:p>
+              </w:tc>
+              <w:tc>
+                <w:tcPr>
+                  <w:tcW w:type="dxa" w:w="3700"/>
+                  <w:tcBorders>
+                    <w:top w:val="none" w:color="FFFFFF" w:sz="0"/>
+                    <w:left w:val="none" w:color="FFFFFF" w:sz="0"/>
+                    <w:bottom w:val="single" w:color="C9D2DE" w:sz="4"/>
+                    <w:right w:val="none" w:color="FFFFFF" w:sz="0"/>
+                  </w:tcBorders>
+                  <w:tcMar>
+                    <w:top w:type="dxa" w:w="0"/>
+                    <w:left w:type="dxa" w:w="0"/>
+                    <w:bottom w:type="dxa" w:w="0"/>
+                    <w:right w:type="dxa" w:w="0"/>
+                  </w:tcMar>
+                </w:tcPr>
+                <w:p>
+                  <w:pPr>
+                    <w:spacing w:after="0" w:before="0"/>
+                  </w:pPr>
+                  <w:r>
+                    <w:rPr>
+                      <w:rFonts w:ascii="Calibri" w:cs="Calibri" w:eastAsia="Calibri" w:hAnsi="Calibri"/>
+                      <w:sz w:val="16"/>
+                      <w:szCs w:val="16"/>
+                    </w:rPr>
+                    <w:t xml:space="preserve"> </w:t>
+                  </w:r>
+                </w:p>
+              </w:tc>
+            </w:tr>
+            <w:tr>
+              <w:trPr>
+                <w:trHeight w:val="320" w:hRule="exact"/>
+              </w:trPr>
+              <w:tc>
+                <w:tcPr>
+                  <w:tcW w:type="dxa" w:w="1100"/>
+                  <w:tcBorders>
+                    <w:top w:val="none" w:color="FFFFFF" w:sz="0"/>
+                    <w:left w:val="none" w:color="FFFFFF" w:sz="0"/>
+                    <w:bottom w:val="none" w:color="FFFFFF" w:sz="0"/>
+                    <w:right w:val="none" w:color="FFFFFF" w:sz="0"/>
+                  </w:tcBorders>
+                  <w:tcMar>
+                    <w:top w:type="dxa" w:w="0"/>
+                    <w:left w:type="dxa" w:w="40"/>
+                    <w:bottom w:type="dxa" w:w="0"/>
+                    <w:right w:type="dxa" w:w="40"/>
+                  </w:tcMar>
+                  <w:vAlign w:val="bottom"/>
+                </w:tcPr>
+                <w:p>
+                  <w:pPr>
+                    <w:spacing w:after="0" w:before="0"/>
+                  </w:pPr>
+                  <w:r>
+                    <w:rPr>
+                      <w:rFonts w:ascii="Calibri" w:cs="Calibri" w:eastAsia="Calibri" w:hAnsi="Calibri"/>
+                      <w:b/>
+                      <w:bCs/>
+                      <w:color w:val="5A6B82"/>
+                      <w:sz w:val="16"/>
+                      <w:szCs w:val="16"/>
+                    </w:rPr>
+                    <w:t xml:space="preserve">Role</w:t>
+                  </w:r>
+                </w:p>
+              </w:tc>
+              <w:tc>
+                <w:tcPr>
+                  <w:tcW w:type="dxa" w:w="3700"/>
+                  <w:tcBorders>
+                    <w:top w:val="none" w:color="FFFFFF" w:sz="0"/>
+                    <w:left w:val="none" w:color="FFFFFF" w:sz="0"/>
+                    <w:bottom w:val="single" w:color="C9D2DE" w:sz="4"/>
+                    <w:right w:val="none" w:color="FFFFFF" w:sz="0"/>
+                  </w:tcBorders>
+                  <w:tcMar>
+                    <w:top w:type="dxa" w:w="0"/>
+                    <w:left w:type="dxa" w:w="0"/>
+                    <w:bottom w:type="dxa" w:w="0"/>
+                    <w:right w:type="dxa" w:w="0"/>
+                  </w:tcMar>
+                </w:tcPr>
+                <w:p>
+                  <w:pPr>
+                    <w:spacing w:after="0" w:before="0"/>
+                  </w:pPr>
+                  <w:r>
+                    <w:rPr>
+                      <w:rFonts w:ascii="Calibri" w:cs="Calibri" w:eastAsia="Calibri" w:hAnsi="Calibri"/>
+                      <w:sz w:val="16"/>
+                      <w:szCs w:val="16"/>
+                    </w:rPr>
+                    <w:t xml:space="preserve"> </w:t>
+                  </w:r>
+                </w:p>
+              </w:tc>
+            </w:tr>
+            <w:tr>
+              <w:trPr>
+                <w:trHeight w:val="320" w:hRule="exact"/>
+              </w:trPr>
+              <w:tc>
+                <w:tcPr>
+                  <w:tcW w:type="dxa" w:w="1100"/>
+                  <w:tcBorders>
+                    <w:top w:val="none" w:color="FFFFFF" w:sz="0"/>
+                    <w:left w:val="none" w:color="FFFFFF" w:sz="0"/>
+                    <w:bottom w:val="none" w:color="FFFFFF" w:sz="0"/>
+                    <w:right w:val="none" w:color="FFFFFF" w:sz="0"/>
+                  </w:tcBorders>
+                  <w:tcMar>
+                    <w:top w:type="dxa" w:w="0"/>
+                    <w:left w:type="dxa" w:w="40"/>
+                    <w:bottom w:type="dxa" w:w="0"/>
+                    <w:right w:type="dxa" w:w="40"/>
+                  </w:tcMar>
+                  <w:vAlign w:val="bottom"/>
+                </w:tcPr>
+                <w:p>
+                  <w:pPr>
+                    <w:spacing w:after="0" w:before="0"/>
+                  </w:pPr>
+                  <w:r>
+                    <w:rPr>
+                      <w:rFonts w:ascii="Calibri" w:cs="Calibri" w:eastAsia="Calibri" w:hAnsi="Calibri"/>
+                      <w:b/>
+                      <w:bCs/>
+                      <w:color w:val="5A6B82"/>
+                      <w:sz w:val="16"/>
+                      <w:szCs w:val="16"/>
+                    </w:rPr>
+                    <w:t xml:space="preserve">Phone</w:t>
+                  </w:r>
+                </w:p>
+              </w:tc>
+              <w:tc>
+                <w:tcPr>
+                  <w:tcW w:type="dxa" w:w="3700"/>
+                  <w:tcBorders>
+                    <w:top w:val="none" w:color="FFFFFF" w:sz="0"/>
+                    <w:left w:val="none" w:color="FFFFFF" w:sz="0"/>
+                    <w:bottom w:val="single" w:color="C9D2DE" w:sz="4"/>
+                    <w:right w:val="none" w:color="FFFFFF" w:sz="0"/>
+                  </w:tcBorders>
+                  <w:tcMar>
+                    <w:top w:type="dxa" w:w="0"/>
+                    <w:left w:type="dxa" w:w="0"/>
+                    <w:bottom w:type="dxa" w:w="0"/>
+                    <w:right w:type="dxa" w:w="0"/>
+                  </w:tcMar>
+                </w:tcPr>
+                <w:p>
+                  <w:pPr>
+                    <w:spacing w:after="0" w:before="0"/>
+                  </w:pPr>
+                  <w:r>
+                    <w:rPr>
+                      <w:rFonts w:ascii="Calibri" w:cs="Calibri" w:eastAsia="Calibri" w:hAnsi="Calibri"/>
+                      <w:sz w:val="16"/>
+                      <w:szCs w:val="16"/>
+                    </w:rPr>
+                    <w:t xml:space="preserve"> </w:t>
+                  </w:r>
+                </w:p>
+              </w:tc>
+            </w:tr>
+            <w:tr>
+              <w:trPr>
+                <w:trHeight w:val="320" w:hRule="exact"/>
+              </w:trPr>
+              <w:tc>
+                <w:tcPr>
+                  <w:tcW w:type="dxa" w:w="1100"/>
+                  <w:tcBorders>
+                    <w:top w:val="none" w:color="FFFFFF" w:sz="0"/>
+                    <w:left w:val="none" w:color="FFFFFF" w:sz="0"/>
+                    <w:bottom w:val="none" w:color="FFFFFF" w:sz="0"/>
+                    <w:right w:val="none" w:color="FFFFFF" w:sz="0"/>
+                  </w:tcBorders>
+                  <w:tcMar>
+                    <w:top w:type="dxa" w:w="0"/>
+                    <w:left w:type="dxa" w:w="40"/>
+                    <w:bottom w:type="dxa" w:w="0"/>
+                    <w:right w:type="dxa" w:w="40"/>
+                  </w:tcMar>
+                  <w:vAlign w:val="bottom"/>
+                </w:tcPr>
+                <w:p>
+                  <w:pPr>
+                    <w:spacing w:after="0" w:before="0"/>
+                  </w:pPr>
+                  <w:r>
+                    <w:rPr>
+                      <w:rFonts w:ascii="Calibri" w:cs="Calibri" w:eastAsia="Calibri" w:hAnsi="Calibri"/>
+                      <w:b/>
+                      <w:bCs/>
+                      <w:color w:val="5A6B82"/>
+                      <w:sz w:val="16"/>
+                      <w:szCs w:val="16"/>
+                    </w:rPr>
+                    <w:t xml:space="preserve">Email</w:t>
+                  </w:r>
+                </w:p>
+              </w:tc>
+              <w:tc>
+                <w:tcPr>
+                  <w:tcW w:type="dxa" w:w="3700"/>
+                  <w:tcBorders>
+                    <w:top w:val="none" w:color="FFFFFF" w:sz="0"/>
+                    <w:left w:val="none" w:color="FFFFFF" w:sz="0"/>
+                    <w:bottom w:val="single" w:color="C9D2DE" w:sz="4"/>
+                    <w:right w:val="none" w:color="FFFFFF" w:sz="0"/>
+                  </w:tcBorders>
+                  <w:tcMar>
+                    <w:top w:type="dxa" w:w="0"/>
+                    <w:left w:type="dxa" w:w="0"/>
+                    <w:bottom w:type="dxa" w:w="0"/>
+                    <w:right w:type="dxa" w:w="0"/>
+                  </w:tcMar>
+                </w:tcPr>
+                <w:p>
+                  <w:pPr>
+                    <w:spacing w:after="0" w:before="0"/>
+                  </w:pPr>
+                  <w:r>
+                    <w:rPr>
+                      <w:rFonts w:ascii="Calibri" w:cs="Calibri" w:eastAsia="Calibri" w:hAnsi="Calibri"/>
+                      <w:sz w:val="16"/>
+                      <w:szCs w:val="16"/>
+                    </w:rPr>
+                    <w:t xml:space="preserve"> </w:t>
+                  </w:r>
+                </w:p>
+              </w:tc>
+            </w:tr>
+          </w:tbl>
+          <w:p/>
+        </w:tc>
+        <w:tc>
+          <w:tcPr>
+            <w:tcW w:type="dxa" w:w="4920"/>
+            <w:tcBorders>
+              <w:top w:val="none" w:color="FFFFFF" w:sz="0"/>
+              <w:left w:val="none" w:color="FFFFFF" w:sz="0"/>
+              <w:bottom w:val="none" w:color="FFFFFF" w:sz="0"/>
+              <w:right w:val="none" w:color="FFFFFF" w:sz="0"/>
+            </w:tcBorders>
+            <w:tcMar>
+              <w:top w:type="dxa" w:w="80"/>
+              <w:left w:type="dxa" w:w="120"/>
+              <w:bottom w:type="dxa" w:w="80"/>
+              <w:right w:type="dxa" w:w="0"/>
+            </w:tcMar>
+          </w:tcPr>
+          <w:p>
+            <w:pPr>
+              <w:pBdr>
+                <w:bottom w:val="single" w:color="E87722" w:sz="6"/>
+              </w:pBdr>
+              <w:spacing w:after="120" w:before="0"/>
+            </w:pPr>
+            <w:r>
+              <w:rPr>
+                <w:rFonts w:ascii="Calibri" w:cs="Calibri" w:eastAsia="Calibri" w:hAnsi="Calibri"/>
+                <w:b/>
+                <w:bCs/>
+                <w:color w:val="E87722"/>
+                <w:sz w:val="22"/>
+                <w:szCs w:val="22"/>
+              </w:rPr>
+              <w:t xml:space="preserve">TABLE-MATES</w:t>
+            </w:r>
+          </w:p>
+          <w:tbl>
+            <w:tblPr>
+              <w:tblW w:type="dxa" w:w="4800"/>
+              <w:tblBorders>
+                <w:top w:val="none" w:color="FFFFFF" w:sz="0"/>
+                <w:left w:val="none" w:color="FFFFFF" w:sz="0"/>
+                <w:bottom w:val="none" w:color="FFFFFF" w:sz="0"/>
+                <w:right w:val="none" w:color="FFFFFF" w:sz="0"/>
+                <w:insideH w:val="single" w:color="auto" w:sz="4"/>
+                <w:insideV w:val="single" w:color="auto" w:sz="4"/>
+              </w:tblBorders>
+            </w:tblPr>
+            <w:tblGrid>
+              <w:gridCol w:w="1100"/>
+              <w:gridCol w:w="3700"/>
+            </w:tblGrid>
+            <w:tr>
+              <w:trPr>
+                <w:trHeight w:val="320" w:hRule="exact"/>
+              </w:trPr>
+              <w:tc>
+                <w:tcPr>
+                  <w:tcW w:type="dxa" w:w="1100"/>
+                  <w:tcBorders>
+                    <w:top w:val="none" w:color="FFFFFF" w:sz="0"/>
+                    <w:left w:val="none" w:color="FFFFFF" w:sz="0"/>
+                    <w:bottom w:val="none" w:color="FFFFFF" w:sz="0"/>
+                    <w:right w:val="none" w:color="FFFFFF" w:sz="0"/>
+                  </w:tcBorders>
+                  <w:tcMar>
+                    <w:top w:type="dxa" w:w="0"/>
+                    <w:left w:type="dxa" w:w="40"/>
+                    <w:bottom w:type="dxa" w:w="0"/>
+                    <w:right w:type="dxa" w:w="40"/>
+                  </w:tcMar>
+                  <w:vAlign w:val="bottom"/>
+                </w:tcPr>
+                <w:p>
+                  <w:pPr>
+                    <w:spacing w:after="0" w:before="0"/>
+                  </w:pPr>
+                  <w:r>
+                    <w:rPr>
+                      <w:rFonts w:ascii="Calibri" w:cs="Calibri" w:eastAsia="Calibri" w:hAnsi="Calibri"/>
+                      <w:b/>
+                      <w:bCs/>
+                      <w:color w:val="5A6B82"/>
+                      <w:sz w:val="16"/>
+                      <w:szCs w:val="16"/>
+                    </w:rPr>
+                    <w:t xml:space="preserve">Name</w:t>
+                  </w:r>
+                </w:p>
+              </w:tc>
+              <w:tc>
+                <w:tcPr>
+                  <w:tcW w:type="dxa" w:w="3700"/>
+                  <w:tcBorders>
+                    <w:top w:val="none" w:color="FFFFFF" w:sz="0"/>
+                    <w:left w:val="none" w:color="FFFFFF" w:sz="0"/>
+                    <w:bottom w:val="single" w:color="C9D2DE" w:sz="4"/>
+                    <w:right w:val="none" w:color="FFFFFF" w:sz="0"/>
+                  </w:tcBorders>
+                  <w:tcMar>
+                    <w:top w:type="dxa" w:w="0"/>
+                    <w:left w:type="dxa" w:w="0"/>
+                    <w:bottom w:type="dxa" w:w="0"/>
+                    <w:right w:type="dxa" w:w="0"/>
+                  </w:tcMar>
+                </w:tcPr>
+                <w:p>
+                  <w:pPr>
+                    <w:spacing w:after="0" w:before="0"/>
+                  </w:pPr>
+                  <w:r>
+                    <w:rPr>
+                      <w:rFonts w:ascii="Calibri" w:cs="Calibri" w:eastAsia="Calibri" w:hAnsi="Calibri"/>
+                      <w:sz w:val="16"/>
+                      <w:szCs w:val="16"/>
+                    </w:rPr>
+                    <w:t xml:space="preserve"> </w:t>
+                  </w:r>
+                </w:p>
+              </w:tc>
+            </w:tr>
+            <w:tr>
+              <w:trPr>
+                <w:trHeight w:val="320" w:hRule="exact"/>
+              </w:trPr>
+              <w:tc>
+                <w:tcPr>
+                  <w:tcW w:type="dxa" w:w="1100"/>
+                  <w:tcBorders>
+                    <w:top w:val="none" w:color="FFFFFF" w:sz="0"/>
+                    <w:left w:val="none" w:color="FFFFFF" w:sz="0"/>
+                    <w:bottom w:val="none" w:color="FFFFFF" w:sz="0"/>
+                    <w:right w:val="none" w:color="FFFFFF" w:sz="0"/>
+                  </w:tcBorders>
+                  <w:tcMar>
+                    <w:top w:type="dxa" w:w="0"/>
+                    <w:left w:type="dxa" w:w="40"/>
+                    <w:bottom w:type="dxa" w:w="0"/>
+                    <w:right w:type="dxa" w:w="40"/>
+                  </w:tcMar>
+                  <w:vAlign w:val="bottom"/>
+                </w:tcPr>
+                <w:p>
+                  <w:pPr>
+                    <w:spacing w:after="0" w:before="0"/>
+                  </w:pPr>
+                  <w:r>
+                    <w:rPr>
+                      <w:rFonts w:ascii="Calibri" w:cs="Calibri" w:eastAsia="Calibri" w:hAnsi="Calibri"/>
+                      <w:b/>
+                      <w:bCs/>
+                      <w:color w:val="5A6B82"/>
+                      <w:sz w:val="16"/>
+                      <w:szCs w:val="16"/>
+                    </w:rPr>
+                    <w:t xml:space="preserve">Role</w:t>
+                  </w:r>
+                </w:p>
+              </w:tc>
+              <w:tc>
+                <w:tcPr>
+                  <w:tcW w:type="dxa" w:w="3700"/>
+                  <w:tcBorders>
+                    <w:top w:val="none" w:color="FFFFFF" w:sz="0"/>
+                    <w:left w:val="none" w:color="FFFFFF" w:sz="0"/>
+                    <w:bottom w:val="single" w:color="C9D2DE" w:sz="4"/>
+                    <w:right w:val="none" w:color="FFFFFF" w:sz="0"/>
+                  </w:tcBorders>
+                  <w:tcMar>
+                    <w:top w:type="dxa" w:w="0"/>
+                    <w:left w:type="dxa" w:w="0"/>
+                    <w:bottom w:type="dxa" w:w="0"/>
+                    <w:right w:type="dxa" w:w="0"/>
+                  </w:tcMar>
+                </w:tcPr>
+                <w:p>
+                  <w:pPr>
+                    <w:spacing w:after="0" w:before="0"/>
+                  </w:pPr>
+                  <w:r>
+                    <w:rPr>
+                      <w:rFonts w:ascii="Calibri" w:cs="Calibri" w:eastAsia="Calibri" w:hAnsi="Calibri"/>
+                      <w:sz w:val="16"/>
+                      <w:szCs w:val="16"/>
+                    </w:rPr>
+                    <w:t xml:space="preserve"> </w:t>
+                  </w:r>
+                </w:p>
+              </w:tc>
+            </w:tr>
+            <w:tr>
+              <w:trPr>
+                <w:trHeight w:val="320" w:hRule="exact"/>
+              </w:trPr>
+              <w:tc>
+                <w:tcPr>
+                  <w:tcW w:type="dxa" w:w="1100"/>
+                  <w:tcBorders>
+                    <w:top w:val="none" w:color="FFFFFF" w:sz="0"/>
+                    <w:left w:val="none" w:color="FFFFFF" w:sz="0"/>
+                    <w:bottom w:val="none" w:color="FFFFFF" w:sz="0"/>
+                    <w:right w:val="none" w:color="FFFFFF" w:sz="0"/>
+                  </w:tcBorders>
+                  <w:tcMar>
+                    <w:top w:type="dxa" w:w="0"/>
+                    <w:left w:type="dxa" w:w="40"/>
+                    <w:bottom w:type="dxa" w:w="0"/>
+                    <w:right w:type="dxa" w:w="40"/>
+                  </w:tcMar>
+                  <w:vAlign w:val="bottom"/>
+                </w:tcPr>
+                <w:p>
+                  <w:pPr>
+                    <w:spacing w:after="0" w:before="0"/>
+                  </w:pPr>
+                  <w:r>
+                    <w:rPr>
+                      <w:rFonts w:ascii="Calibri" w:cs="Calibri" w:eastAsia="Calibri" w:hAnsi="Calibri"/>
+                      <w:b/>
+                      <w:bCs/>
+                      <w:color w:val="5A6B82"/>
+                      <w:sz w:val="16"/>
+                      <w:szCs w:val="16"/>
+                    </w:rPr>
+                    <w:t xml:space="preserve">Business</w:t>
+                  </w:r>
+                </w:p>
+              </w:tc>
+              <w:tc>
+                <w:tcPr>
+                  <w:tcW w:type="dxa" w:w="3700"/>
+                  <w:tcBorders>
+                    <w:top w:val="none" w:color="FFFFFF" w:sz="0"/>
+                    <w:left w:val="none" w:color="FFFFFF" w:sz="0"/>
+                    <w:bottom w:val="single" w:color="C9D2DE" w:sz="4"/>
+                    <w:right w:val="none" w:color="FFFFFF" w:sz="0"/>
+                  </w:tcBorders>
+                  <w:tcMar>
+                    <w:top w:type="dxa" w:w="0"/>
+                    <w:left w:type="dxa" w:w="0"/>
+                    <w:bottom w:type="dxa" w:w="0"/>
+                    <w:right w:type="dxa" w:w="0"/>
+                  </w:tcMar>
+                </w:tcPr>
+                <w:p>
+                  <w:pPr>
+                    <w:spacing w:after="0" w:before="0"/>
+                  </w:pPr>
+                  <w:r>
+                    <w:rPr>
+                      <w:rFonts w:ascii="Calibri" w:cs="Calibri" w:eastAsia="Calibri" w:hAnsi="Calibri"/>
+                      <w:sz w:val="16"/>
+                      <w:szCs w:val="16"/>
+                    </w:rPr>
+                    <w:t xml:space="preserve"> </w:t>
+                  </w:r>
+                </w:p>
+              </w:tc>
+            </w:tr>
+            <w:tr>
+              <w:trPr>
+                <w:trHeight w:val="320" w:hRule="exact"/>
+              </w:trPr>
+              <w:tc>
+                <w:tcPr>
+                  <w:tcW w:type="dxa" w:w="1100"/>
+                  <w:tcBorders>
+                    <w:top w:val="none" w:color="FFFFFF" w:sz="0"/>
+                    <w:left w:val="none" w:color="FFFFFF" w:sz="0"/>
+                    <w:bottom w:val="none" w:color="FFFFFF" w:sz="0"/>
+                    <w:right w:val="none" w:color="FFFFFF" w:sz="0"/>
+                  </w:tcBorders>
+                  <w:tcMar>
+                    <w:top w:type="dxa" w:w="0"/>
+                    <w:left w:type="dxa" w:w="40"/>
+                    <w:bottom w:type="dxa" w:w="0"/>
+                    <w:right w:type="dxa" w:w="40"/>
+                  </w:tcMar>
+                  <w:vAlign w:val="bottom"/>
+                </w:tcPr>
+                <w:p>
+                  <w:pPr>
+                    <w:spacing w:after="0" w:before="0"/>
+                  </w:pPr>
+                  <w:r>
+                    <w:rPr>
+                      <w:rFonts w:ascii="Calibri" w:cs="Calibri" w:eastAsia="Calibri" w:hAnsi="Calibri"/>
+                      <w:b/>
+                      <w:bCs/>
+                      <w:color w:val="5A6B82"/>
+                      <w:sz w:val="16"/>
+                      <w:szCs w:val="16"/>
+                    </w:rPr>
+                    <w:t xml:space="preserve">Phone</w:t>
+                  </w:r>
+                </w:p>
+              </w:tc>
+              <w:tc>
+                <w:tcPr>
+                  <w:tcW w:type="dxa" w:w="3700"/>
+                  <w:tcBorders>
+                    <w:top w:val="none" w:color="FFFFFF" w:sz="0"/>
+                    <w:left w:val="none" w:color="FFFFFF" w:sz="0"/>
+                    <w:bottom w:val="single" w:color="C9D2DE" w:sz="4"/>
+                    <w:right w:val="none" w:color="FFFFFF" w:sz="0"/>
+                  </w:tcBorders>
+                  <w:tcMar>
+                    <w:top w:type="dxa" w:w="0"/>
+                    <w:left w:type="dxa" w:w="0"/>
+                    <w:bottom w:type="dxa" w:w="0"/>
+                    <w:right w:type="dxa" w:w="0"/>
+                  </w:tcMar>
+                </w:tcPr>
+                <w:p>
+                  <w:pPr>
+                    <w:spacing w:after="0" w:before="0"/>
+                  </w:pPr>
+                  <w:r>
+                    <w:rPr>
+                      <w:rFonts w:ascii="Calibri" w:cs="Calibri" w:eastAsia="Calibri" w:hAnsi="Calibri"/>
+                      <w:sz w:val="16"/>
+                      <w:szCs w:val="16"/>
+                    </w:rPr>
+                    <w:t xml:space="preserve"> </w:t>
+                  </w:r>
+                </w:p>
+              </w:tc>
+            </w:tr>
+            <w:tr>
+              <w:trPr>
+                <w:trHeight w:val="320" w:hRule="exact"/>
+              </w:trPr>
+              <w:tc>
+                <w:tcPr>
+                  <w:tcW w:type="dxa" w:w="1100"/>
+                  <w:tcBorders>
+                    <w:top w:val="none" w:color="FFFFFF" w:sz="0"/>
+                    <w:left w:val="none" w:color="FFFFFF" w:sz="0"/>
+                    <w:bottom w:val="none" w:color="FFFFFF" w:sz="0"/>
+                    <w:right w:val="none" w:color="FFFFFF" w:sz="0"/>
+                  </w:tcBorders>
+                  <w:tcMar>
+                    <w:top w:type="dxa" w:w="0"/>
+                    <w:left w:type="dxa" w:w="40"/>
+                    <w:bottom w:type="dxa" w:w="0"/>
+                    <w:right w:type="dxa" w:w="40"/>
+                  </w:tcMar>
+                  <w:vAlign w:val="bottom"/>
+                </w:tcPr>
+                <w:p>
+                  <w:pPr>
+                    <w:spacing w:after="0" w:before="0"/>
+                  </w:pPr>
+                  <w:r>
+                    <w:rPr>
+                      <w:rFonts w:ascii="Calibri" w:cs="Calibri" w:eastAsia="Calibri" w:hAnsi="Calibri"/>
+                      <w:b/>
+                      <w:bCs/>
+                      <w:color w:val="5A6B82"/>
+                      <w:sz w:val="16"/>
+                      <w:szCs w:val="16"/>
+                    </w:rPr>
+                    <w:t xml:space="preserve">Email</w:t>
+                  </w:r>
+                </w:p>
+              </w:tc>
+              <w:tc>
+                <w:tcPr>
+                  <w:tcW w:type="dxa" w:w="3700"/>
+                  <w:tcBorders>
+                    <w:top w:val="none" w:color="FFFFFF" w:sz="0"/>
+                    <w:left w:val="none" w:color="FFFFFF" w:sz="0"/>
+                    <w:bottom w:val="single" w:color="C9D2DE" w:sz="4"/>
+                    <w:right w:val="none" w:color="FFFFFF" w:sz="0"/>
+                  </w:tcBorders>
+                  <w:tcMar>
+                    <w:top w:type="dxa" w:w="0"/>
+                    <w:left w:type="dxa" w:w="0"/>
+                    <w:bottom w:type="dxa" w:w="0"/>
+                    <w:right w:type="dxa" w:w="0"/>
+                  </w:tcMar>
+                </w:tcPr>
+                <w:p>
+                  <w:pPr>
+                    <w:spacing w:after="0" w:before="0"/>
+                  </w:pPr>
+                  <w:r>
+                    <w:rPr>
+                      <w:rFonts w:ascii="Calibri" w:cs="Calibri" w:eastAsia="Calibri" w:hAnsi="Calibri"/>
+                      <w:sz w:val="16"/>
+                      <w:szCs w:val="16"/>
+                    </w:rPr>
+                    <w:t xml:space="preserve"> </w:t>
+                  </w:r>
+                </w:p>
+              </w:tc>
+            </w:tr>
+          </w:tbl>
+          <w:p>
+            <w:pPr>
+              <w:spacing w:after="120"/>
+            </w:pPr>
+            <w:r>
+              <w:t xml:space="preserve"/>
+            </w:r>
+          </w:p>
+          <w:tbl>
+            <w:tblPr>
+              <w:tblW w:type="dxa" w:w="4800"/>
+              <w:tblBorders>
+                <w:top w:val="none" w:color="FFFFFF" w:sz="0"/>
+                <w:left w:val="none" w:color="FFFFFF" w:sz="0"/>
+                <w:bottom w:val="none" w:color="FFFFFF" w:sz="0"/>
+                <w:right w:val="none" w:color="FFFFFF" w:sz="0"/>
+                <w:insideH w:val="single" w:color="auto" w:sz="4"/>
+                <w:insideV w:val="single" w:color="auto" w:sz="4"/>
+              </w:tblBorders>
+            </w:tblPr>
+            <w:tblGrid>
+              <w:gridCol w:w="1100"/>
+              <w:gridCol w:w="3700"/>
+            </w:tblGrid>
+            <w:tr>
+              <w:trPr>
+                <w:trHeight w:val="320" w:hRule="exact"/>
+              </w:trPr>
+              <w:tc>
+                <w:tcPr>
+                  <w:tcW w:type="dxa" w:w="1100"/>
+                  <w:tcBorders>
+                    <w:top w:val="none" w:color="FFFFFF" w:sz="0"/>
+                    <w:left w:val="none" w:color="FFFFFF" w:sz="0"/>
+                    <w:bottom w:val="none" w:color="FFFFFF" w:sz="0"/>
+                    <w:right w:val="none" w:color="FFFFFF" w:sz="0"/>
+                  </w:tcBorders>
+                  <w:tcMar>
+                    <w:top w:type="dxa" w:w="0"/>
+                    <w:left w:type="dxa" w:w="40"/>
+                    <w:bottom w:type="dxa" w:w="0"/>
+                    <w:right w:type="dxa" w:w="40"/>
+                  </w:tcMar>
+                  <w:vAlign w:val="bottom"/>
+                </w:tcPr>
+                <w:p>
+                  <w:pPr>
+                    <w:spacing w:after="0" w:before="0"/>
+                  </w:pPr>
+                  <w:r>
+                    <w:rPr>
+                      <w:rFonts w:ascii="Calibri" w:cs="Calibri" w:eastAsia="Calibri" w:hAnsi="Calibri"/>
+                      <w:b/>
+                      <w:bCs/>
+                      <w:color w:val="5A6B82"/>
+                      <w:sz w:val="16"/>
+                      <w:szCs w:val="16"/>
+                    </w:rPr>
+                    <w:t xml:space="preserve">Name</w:t>
+                  </w:r>
+                </w:p>
+              </w:tc>
+              <w:tc>
+                <w:tcPr>
+                  <w:tcW w:type="dxa" w:w="3700"/>
+                  <w:tcBorders>
+                    <w:top w:val="none" w:color="FFFFFF" w:sz="0"/>
+                    <w:left w:val="none" w:color="FFFFFF" w:sz="0"/>
+                    <w:bottom w:val="single" w:color="C9D2DE" w:sz="4"/>
+                    <w:right w:val="none" w:color="FFFFFF" w:sz="0"/>
+                  </w:tcBorders>
+                  <w:tcMar>
+                    <w:top w:type="dxa" w:w="0"/>
+                    <w:left w:type="dxa" w:w="0"/>
+                    <w:bottom w:type="dxa" w:w="0"/>
+                    <w:right w:type="dxa" w:w="0"/>
+                  </w:tcMar>
+                </w:tcPr>
+                <w:p>
+                  <w:pPr>
+                    <w:spacing w:after="0" w:before="0"/>
+                  </w:pPr>
+                  <w:r>
+                    <w:rPr>
+                      <w:rFonts w:ascii="Calibri" w:cs="Calibri" w:eastAsia="Calibri" w:hAnsi="Calibri"/>
+                      <w:sz w:val="16"/>
+                      <w:szCs w:val="16"/>
+                    </w:rPr>
+                    <w:t xml:space="preserve"> </w:t>
+                  </w:r>
+                </w:p>
+              </w:tc>
+            </w:tr>
+            <w:tr>
+              <w:trPr>
+                <w:trHeight w:val="320" w:hRule="exact"/>
+              </w:trPr>
+              <w:tc>
+                <w:tcPr>
+                  <w:tcW w:type="dxa" w:w="1100"/>
+                  <w:tcBorders>
+                    <w:top w:val="none" w:color="FFFFFF" w:sz="0"/>
+                    <w:left w:val="none" w:color="FFFFFF" w:sz="0"/>
+                    <w:bottom w:val="none" w:color="FFFFFF" w:sz="0"/>
+                    <w:right w:val="none" w:color="FFFFFF" w:sz="0"/>
+                  </w:tcBorders>
+                  <w:tcMar>
+                    <w:top w:type="dxa" w:w="0"/>
+                    <w:left w:type="dxa" w:w="40"/>
+                    <w:bottom w:type="dxa" w:w="0"/>
+                    <w:right w:type="dxa" w:w="40"/>
+                  </w:tcMar>
+                  <w:vAlign w:val="bottom"/>
+                </w:tcPr>
+                <w:p>
+                  <w:pPr>
+                    <w:spacing w:after="0" w:before="0"/>
+                  </w:pPr>
+                  <w:r>
+                    <w:rPr>
+                      <w:rFonts w:ascii="Calibri" w:cs="Calibri" w:eastAsia="Calibri" w:hAnsi="Calibri"/>
+                      <w:b/>
+                      <w:bCs/>
+                      <w:color w:val="5A6B82"/>
+                      <w:sz w:val="16"/>
+                      <w:szCs w:val="16"/>
+                    </w:rPr>
+                    <w:t xml:space="preserve">Role</w:t>
+                  </w:r>
+                </w:p>
+              </w:tc>
+              <w:tc>
+                <w:tcPr>
+                  <w:tcW w:type="dxa" w:w="3700"/>
+                  <w:tcBorders>
+                    <w:top w:val="none" w:color="FFFFFF" w:sz="0"/>
+                    <w:left w:val="none" w:color="FFFFFF" w:sz="0"/>
+                    <w:bottom w:val="single" w:color="C9D2DE" w:sz="4"/>
+                    <w:right w:val="none" w:color="FFFFFF" w:sz="0"/>
+                  </w:tcBorders>
+                  <w:tcMar>
+                    <w:top w:type="dxa" w:w="0"/>
+                    <w:left w:type="dxa" w:w="0"/>
+                    <w:bottom w:type="dxa" w:w="0"/>
+                    <w:right w:type="dxa" w:w="0"/>
+                  </w:tcMar>
+                </w:tcPr>
+                <w:p>
+                  <w:pPr>
+                    <w:spacing w:after="0" w:before="0"/>
+                  </w:pPr>
+                  <w:r>
+                    <w:rPr>
+                      <w:rFonts w:ascii="Calibri" w:cs="Calibri" w:eastAsia="Calibri" w:hAnsi="Calibri"/>
+                      <w:sz w:val="16"/>
+                      <w:szCs w:val="16"/>
+                    </w:rPr>
+                    <w:t xml:space="preserve"> </w:t>
+                  </w:r>
+                </w:p>
+              </w:tc>
+            </w:tr>
+            <w:tr>
+              <w:trPr>
+                <w:trHeight w:val="320" w:hRule="exact"/>
+              </w:trPr>
+              <w:tc>
+                <w:tcPr>
+                  <w:tcW w:type="dxa" w:w="1100"/>
+                  <w:tcBorders>
+                    <w:top w:val="none" w:color="FFFFFF" w:sz="0"/>
+                    <w:left w:val="none" w:color="FFFFFF" w:sz="0"/>
+                    <w:bottom w:val="none" w:color="FFFFFF" w:sz="0"/>
+                    <w:right w:val="none" w:color="FFFFFF" w:sz="0"/>
+                  </w:tcBorders>
+                  <w:tcMar>
+                    <w:top w:type="dxa" w:w="0"/>
+                    <w:left w:type="dxa" w:w="40"/>
+                    <w:bottom w:type="dxa" w:w="0"/>
+                    <w:right w:type="dxa" w:w="40"/>
+                  </w:tcMar>
+                  <w:vAlign w:val="bottom"/>
+                </w:tcPr>
+                <w:p>
+                  <w:pPr>
+                    <w:spacing w:after="0" w:before="0"/>
+                  </w:pPr>
+                  <w:r>
+                    <w:rPr>
+                      <w:rFonts w:ascii="Calibri" w:cs="Calibri" w:eastAsia="Calibri" w:hAnsi="Calibri"/>
+                      <w:b/>
+                      <w:bCs/>
+                      <w:color w:val="5A6B82"/>
+                      <w:sz w:val="16"/>
+                      <w:szCs w:val="16"/>
+                    </w:rPr>
+                    <w:t xml:space="preserve">Business</w:t>
+                  </w:r>
+                </w:p>
+              </w:tc>
+              <w:tc>
+                <w:tcPr>
+                  <w:tcW w:type="dxa" w:w="3700"/>
+                  <w:tcBorders>
+                    <w:top w:val="none" w:color="FFFFFF" w:sz="0"/>
+                    <w:left w:val="none" w:color="FFFFFF" w:sz="0"/>
+                    <w:bottom w:val="single" w:color="C9D2DE" w:sz="4"/>
+                    <w:right w:val="none" w:color="FFFFFF" w:sz="0"/>
+                  </w:tcBorders>
+                  <w:tcMar>
+                    <w:top w:type="dxa" w:w="0"/>
+                    <w:left w:type="dxa" w:w="0"/>
+                    <w:bottom w:type="dxa" w:w="0"/>
+                    <w:right w:type="dxa" w:w="0"/>
+                  </w:tcMar>
+                </w:tcPr>
+                <w:p>
+                  <w:pPr>
+                    <w:spacing w:after="0" w:before="0"/>
+                  </w:pPr>
+                  <w:r>
+                    <w:rPr>
+                      <w:rFonts w:ascii="Calibri" w:cs="Calibri" w:eastAsia="Calibri" w:hAnsi="Calibri"/>
+                      <w:sz w:val="16"/>
+                      <w:szCs w:val="16"/>
+                    </w:rPr>
+                    <w:t xml:space="preserve"> </w:t>
+                  </w:r>
+                </w:p>
+              </w:tc>
+            </w:tr>
+            <w:tr>
+              <w:trPr>
+                <w:trHeight w:val="320" w:hRule="exact"/>
+              </w:trPr>
+              <w:tc>
+                <w:tcPr>
+                  <w:tcW w:type="dxa" w:w="1100"/>
+                  <w:tcBorders>
+                    <w:top w:val="none" w:color="FFFFFF" w:sz="0"/>
+                    <w:left w:val="none" w:color="FFFFFF" w:sz="0"/>
+                    <w:bottom w:val="none" w:color="FFFFFF" w:sz="0"/>
+                    <w:right w:val="none" w:color="FFFFFF" w:sz="0"/>
+                  </w:tcBorders>
+                  <w:tcMar>
+                    <w:top w:type="dxa" w:w="0"/>
+                    <w:left w:type="dxa" w:w="40"/>
+                    <w:bottom w:type="dxa" w:w="0"/>
+                    <w:right w:type="dxa" w:w="40"/>
+                  </w:tcMar>
+                  <w:vAlign w:val="bottom"/>
+                </w:tcPr>
+                <w:p>
+                  <w:pPr>
+                    <w:spacing w:after="0" w:before="0"/>
+                  </w:pPr>
+                  <w:r>
+                    <w:rPr>
+                      <w:rFonts w:ascii="Calibri" w:cs="Calibri" w:eastAsia="Calibri" w:hAnsi="Calibri"/>
+                      <w:b/>
+                      <w:bCs/>
+                      <w:color w:val="5A6B82"/>
+                      <w:sz w:val="16"/>
+                      <w:szCs w:val="16"/>
+                    </w:rPr>
+                    <w:t xml:space="preserve">Phone</w:t>
+                  </w:r>
+                </w:p>
+              </w:tc>
+              <w:tc>
+                <w:tcPr>
+                  <w:tcW w:type="dxa" w:w="3700"/>
+                  <w:tcBorders>
+                    <w:top w:val="none" w:color="FFFFFF" w:sz="0"/>
+                    <w:left w:val="none" w:color="FFFFFF" w:sz="0"/>
+                    <w:bottom w:val="single" w:color="C9D2DE" w:sz="4"/>
+                    <w:right w:val="none" w:color="FFFFFF" w:sz="0"/>
+                  </w:tcBorders>
+                  <w:tcMar>
+                    <w:top w:type="dxa" w:w="0"/>
+                    <w:left w:type="dxa" w:w="0"/>
+                    <w:bottom w:type="dxa" w:w="0"/>
+                    <w:right w:type="dxa" w:w="0"/>
+                  </w:tcMar>
+                </w:tcPr>
+                <w:p>
+                  <w:pPr>
+                    <w:spacing w:after="0" w:before="0"/>
+                  </w:pPr>
+                  <w:r>
+                    <w:rPr>
+                      <w:rFonts w:ascii="Calibri" w:cs="Calibri" w:eastAsia="Calibri" w:hAnsi="Calibri"/>
+                      <w:sz w:val="16"/>
+                      <w:szCs w:val="16"/>
+                    </w:rPr>
+                    <w:t xml:space="preserve"> </w:t>
+                  </w:r>
+                </w:p>
+              </w:tc>
+            </w:tr>
+            <w:tr>
+              <w:trPr>
+                <w:trHeight w:val="320" w:hRule="exact"/>
+              </w:trPr>
+              <w:tc>
+                <w:tcPr>
+                  <w:tcW w:type="dxa" w:w="1100"/>
+                  <w:tcBorders>
+                    <w:top w:val="none" w:color="FFFFFF" w:sz="0"/>
+                    <w:left w:val="none" w:color="FFFFFF" w:sz="0"/>
+                    <w:bottom w:val="none" w:color="FFFFFF" w:sz="0"/>
+                    <w:right w:val="none" w:color="FFFFFF" w:sz="0"/>
+                  </w:tcBorders>
+                  <w:tcMar>
+                    <w:top w:type="dxa" w:w="0"/>
+                    <w:left w:type="dxa" w:w="40"/>
+                    <w:bottom w:type="dxa" w:w="0"/>
+                    <w:right w:type="dxa" w:w="40"/>
+                  </w:tcMar>
+                  <w:vAlign w:val="bottom"/>
+                </w:tcPr>
+                <w:p>
+                  <w:pPr>
+                    <w:spacing w:after="0" w:before="0"/>
+                  </w:pPr>
+                  <w:r>
+                    <w:rPr>
+                      <w:rFonts w:ascii="Calibri" w:cs="Calibri" w:eastAsia="Calibri" w:hAnsi="Calibri"/>
+                      <w:b/>
+                      <w:bCs/>
+                      <w:color w:val="5A6B82"/>
+                      <w:sz w:val="16"/>
+                      <w:szCs w:val="16"/>
+                    </w:rPr>
+                    <w:t xml:space="preserve">Email</w:t>
+                  </w:r>
+                </w:p>
+              </w:tc>
+              <w:tc>
+                <w:tcPr>
+                  <w:tcW w:type="dxa" w:w="3700"/>
+                  <w:tcBorders>
+                    <w:top w:val="none" w:color="FFFFFF" w:sz="0"/>
+                    <w:left w:val="none" w:color="FFFFFF" w:sz="0"/>
+                    <w:bottom w:val="single" w:color="C9D2DE" w:sz="4"/>
+                    <w:right w:val="none" w:color="FFFFFF" w:sz="0"/>
+                  </w:tcBorders>
+                  <w:tcMar>
+                    <w:top w:type="dxa" w:w="0"/>
+                    <w:left w:type="dxa" w:w="0"/>
+                    <w:bottom w:type="dxa" w:w="0"/>
+                    <w:right w:type="dxa" w:w="0"/>
+                  </w:tcMar>
+                </w:tcPr>
+                <w:p>
+                  <w:pPr>
+                    <w:spacing w:after="0" w:before="0"/>
+                  </w:pPr>
+                  <w:r>
+                    <w:rPr>
+                      <w:rFonts w:ascii="Calibri" w:cs="Calibri" w:eastAsia="Calibri" w:hAnsi="Calibri"/>
+                      <w:sz w:val="16"/>
+                      <w:szCs w:val="16"/>
+                    </w:rPr>
+                    <w:t xml:space="preserve"> </w:t>
+                  </w:r>
+                </w:p>
+              </w:tc>
+            </w:tr>
+          </w:tbl>
+          <w:p>
+            <w:pPr>
+              <w:spacing w:after="120"/>
+            </w:pPr>
+            <w:r>
+              <w:t xml:space="preserve"/>
+            </w:r>
+          </w:p>
+          <w:tbl>
+            <w:tblPr>
+              <w:tblW w:type="dxa" w:w="4800"/>
+              <w:tblBorders>
+                <w:top w:val="none" w:color="FFFFFF" w:sz="0"/>
+                <w:left w:val="none" w:color="FFFFFF" w:sz="0"/>
+                <w:bottom w:val="none" w:color="FFFFFF" w:sz="0"/>
+                <w:right w:val="none" w:color="FFFFFF" w:sz="0"/>
+                <w:insideH w:val="single" w:color="auto" w:sz="4"/>
+                <w:insideV w:val="single" w:color="auto" w:sz="4"/>
+              </w:tblBorders>
+            </w:tblPr>
+            <w:tblGrid>
+              <w:gridCol w:w="1100"/>
+              <w:gridCol w:w="3700"/>
+            </w:tblGrid>
+            <w:tr>
+              <w:trPr>
+                <w:trHeight w:val="320" w:hRule="exact"/>
+              </w:trPr>
+              <w:tc>
+                <w:tcPr>
+                  <w:tcW w:type="dxa" w:w="1100"/>
+                  <w:tcBorders>
+                    <w:top w:val="none" w:color="FFFFFF" w:sz="0"/>
+                    <w:left w:val="none" w:color="FFFFFF" w:sz="0"/>
+                    <w:bottom w:val="none" w:color="FFFFFF" w:sz="0"/>
+                    <w:right w:val="none" w:color="FFFFFF" w:sz="0"/>
+                  </w:tcBorders>
+                  <w:tcMar>
+                    <w:top w:type="dxa" w:w="0"/>
+                    <w:left w:type="dxa" w:w="40"/>
+                    <w:bottom w:type="dxa" w:w="0"/>
+                    <w:right w:type="dxa" w:w="40"/>
+                  </w:tcMar>
+                  <w:vAlign w:val="bottom"/>
+                </w:tcPr>
+                <w:p>
+                  <w:pPr>
+                    <w:spacing w:after="0" w:before="0"/>
+                  </w:pPr>
+                  <w:r>
+                    <w:rPr>
+                      <w:rFonts w:ascii="Calibri" w:cs="Calibri" w:eastAsia="Calibri" w:hAnsi="Calibri"/>
+                      <w:b/>
+                      <w:bCs/>
+                      <w:color w:val="5A6B82"/>
+                      <w:sz w:val="16"/>
+                      <w:szCs w:val="16"/>
+                    </w:rPr>
+                    <w:t xml:space="preserve">Name</w:t>
+                  </w:r>
+                </w:p>
+              </w:tc>
+              <w:tc>
+                <w:tcPr>
+                  <w:tcW w:type="dxa" w:w="3700"/>
+                  <w:tcBorders>
+                    <w:top w:val="none" w:color="FFFFFF" w:sz="0"/>
+                    <w:left w:val="none" w:color="FFFFFF" w:sz="0"/>
+                    <w:bottom w:val="single" w:color="C9D2DE" w:sz="4"/>
+                    <w:right w:val="none" w:color="FFFFFF" w:sz="0"/>
+                  </w:tcBorders>
+                  <w:tcMar>
+                    <w:top w:type="dxa" w:w="0"/>
+                    <w:left w:type="dxa" w:w="0"/>
+                    <w:bottom w:type="dxa" w:w="0"/>
+                    <w:right w:type="dxa" w:w="0"/>
+                  </w:tcMar>
+                </w:tcPr>
+                <w:p>
+                  <w:pPr>
+                    <w:spacing w:after="0" w:before="0"/>
+                  </w:pPr>
+                  <w:r>
+                    <w:rPr>
+                      <w:rFonts w:ascii="Calibri" w:cs="Calibri" w:eastAsia="Calibri" w:hAnsi="Calibri"/>
+                      <w:sz w:val="16"/>
+                      <w:szCs w:val="16"/>
+                    </w:rPr>
+                    <w:t xml:space="preserve"> </w:t>
+                  </w:r>
+                </w:p>
+              </w:tc>
+            </w:tr>
+            <w:tr>
+              <w:trPr>
+                <w:trHeight w:val="320" w:hRule="exact"/>
+              </w:trPr>
+              <w:tc>
+                <w:tcPr>
+                  <w:tcW w:type="dxa" w:w="1100"/>
+                  <w:tcBorders>
+                    <w:top w:val="none" w:color="FFFFFF" w:sz="0"/>
+                    <w:left w:val="none" w:color="FFFFFF" w:sz="0"/>
+                    <w:bottom w:val="none" w:color="FFFFFF" w:sz="0"/>
+                    <w:right w:val="none" w:color="FFFFFF" w:sz="0"/>
+                  </w:tcBorders>
+                  <w:tcMar>
+                    <w:top w:type="dxa" w:w="0"/>
+                    <w:left w:type="dxa" w:w="40"/>
+                    <w:bottom w:type="dxa" w:w="0"/>
+                    <w:right w:type="dxa" w:w="40"/>
+                  </w:tcMar>
+                  <w:vAlign w:val="bottom"/>
+                </w:tcPr>
+                <w:p>
+                  <w:pPr>
+                    <w:spacing w:after="0" w:before="0"/>
+                  </w:pPr>
+                  <w:r>
+                    <w:rPr>
+                      <w:rFonts w:ascii="Calibri" w:cs="Calibri" w:eastAsia="Calibri" w:hAnsi="Calibri"/>
+                      <w:b/>
+                      <w:bCs/>
+                      <w:color w:val="5A6B82"/>
+                      <w:sz w:val="16"/>
+                      <w:szCs w:val="16"/>
+                    </w:rPr>
+                    <w:t xml:space="preserve">Role</w:t>
+                  </w:r>
+                </w:p>
+              </w:tc>
+              <w:tc>
+                <w:tcPr>
+                  <w:tcW w:type="dxa" w:w="3700"/>
+                  <w:tcBorders>
+                    <w:top w:val="none" w:color="FFFFFF" w:sz="0"/>
+                    <w:left w:val="none" w:color="FFFFFF" w:sz="0"/>
+                    <w:bottom w:val="single" w:color="C9D2DE" w:sz="4"/>
+                    <w:right w:val="none" w:color="FFFFFF" w:sz="0"/>
+                  </w:tcBorders>
+                  <w:tcMar>
+                    <w:top w:type="dxa" w:w="0"/>
+                    <w:left w:type="dxa" w:w="0"/>
+                    <w:bottom w:type="dxa" w:w="0"/>
+                    <w:right w:type="dxa" w:w="0"/>
+                  </w:tcMar>
+                </w:tcPr>
+                <w:p>
+                  <w:pPr>
+                    <w:spacing w:after="0" w:before="0"/>
+                  </w:pPr>
+                  <w:r>
+                    <w:rPr>
+                      <w:rFonts w:ascii="Calibri" w:cs="Calibri" w:eastAsia="Calibri" w:hAnsi="Calibri"/>
+                      <w:sz w:val="16"/>
+                      <w:szCs w:val="16"/>
+                    </w:rPr>
+                    <w:t xml:space="preserve"> </w:t>
+                  </w:r>
+                </w:p>
+              </w:tc>
+            </w:tr>
+            <w:tr>
+              <w:trPr>
+                <w:trHeight w:val="320" w:hRule="exact"/>
+              </w:trPr>
+              <w:tc>
+                <w:tcPr>
+                  <w:tcW w:type="dxa" w:w="1100"/>
+                  <w:tcBorders>
+                    <w:top w:val="none" w:color="FFFFFF" w:sz="0"/>
+                    <w:left w:val="none" w:color="FFFFFF" w:sz="0"/>
+                    <w:bottom w:val="none" w:color="FFFFFF" w:sz="0"/>
+                    <w:right w:val="none" w:color="FFFFFF" w:sz="0"/>
+                  </w:tcBorders>
+                  <w:tcMar>
+                    <w:top w:type="dxa" w:w="0"/>
+                    <w:left w:type="dxa" w:w="40"/>
+                    <w:bottom w:type="dxa" w:w="0"/>
+                    <w:right w:type="dxa" w:w="40"/>
+                  </w:tcMar>
+                  <w:vAlign w:val="bottom"/>
+                </w:tcPr>
+                <w:p>
+                  <w:pPr>
+                    <w:spacing w:after="0" w:before="0"/>
+                  </w:pPr>
+                  <w:r>
+                    <w:rPr>
+                      <w:rFonts w:ascii="Calibri" w:cs="Calibri" w:eastAsia="Calibri" w:hAnsi="Calibri"/>
+                      <w:b/>
+                      <w:bCs/>
+                      <w:color w:val="5A6B82"/>
+                      <w:sz w:val="16"/>
+                      <w:szCs w:val="16"/>
+                    </w:rPr>
+                    <w:t xml:space="preserve">Business</w:t>
+                  </w:r>
+                </w:p>
+              </w:tc>
+              <w:tc>
+                <w:tcPr>
+                  <w:tcW w:type="dxa" w:w="3700"/>
+                  <w:tcBorders>
+                    <w:top w:val="none" w:color="FFFFFF" w:sz="0"/>
+                    <w:left w:val="none" w:color="FFFFFF" w:sz="0"/>
+                    <w:bottom w:val="single" w:color="C9D2DE" w:sz="4"/>
+                    <w:right w:val="none" w:color="FFFFFF" w:sz="0"/>
+                  </w:tcBorders>
+                  <w:tcMar>
+                    <w:top w:type="dxa" w:w="0"/>
+                    <w:left w:type="dxa" w:w="0"/>
+                    <w:bottom w:type="dxa" w:w="0"/>
+                    <w:right w:type="dxa" w:w="0"/>
+                  </w:tcMar>
+                </w:tcPr>
+                <w:p>
+                  <w:pPr>
+                    <w:spacing w:after="0" w:before="0"/>
+                  </w:pPr>
+                  <w:r>
+                    <w:rPr>
+                      <w:rFonts w:ascii="Calibri" w:cs="Calibri" w:eastAsia="Calibri" w:hAnsi="Calibri"/>
+                      <w:sz w:val="16"/>
+                      <w:szCs w:val="16"/>
+                    </w:rPr>
+                    <w:t xml:space="preserve"> </w:t>
+                  </w:r>
+                </w:p>
+              </w:tc>
+            </w:tr>
+            <w:tr>
+              <w:trPr>
+                <w:trHeight w:val="320" w:hRule="exact"/>
+              </w:trPr>
+              <w:tc>
+                <w:tcPr>
+                  <w:tcW w:type="dxa" w:w="1100"/>
+                  <w:tcBorders>
+                    <w:top w:val="none" w:color="FFFFFF" w:sz="0"/>
+                    <w:left w:val="none" w:color="FFFFFF" w:sz="0"/>
+                    <w:bottom w:val="none" w:color="FFFFFF" w:sz="0"/>
+                    <w:right w:val="none" w:color="FFFFFF" w:sz="0"/>
+                  </w:tcBorders>
+                  <w:tcMar>
+                    <w:top w:type="dxa" w:w="0"/>
+                    <w:left w:type="dxa" w:w="40"/>
+                    <w:bottom w:type="dxa" w:w="0"/>
+                    <w:right w:type="dxa" w:w="40"/>
+                  </w:tcMar>
+                  <w:vAlign w:val="bottom"/>
+                </w:tcPr>
+                <w:p>
+                  <w:pPr>
+                    <w:spacing w:after="0" w:before="0"/>
+                  </w:pPr>
+                  <w:r>
+                    <w:rPr>
+                      <w:rFonts w:ascii="Calibri" w:cs="Calibri" w:eastAsia="Calibri" w:hAnsi="Calibri"/>
+                      <w:b/>
+                      <w:bCs/>
+                      <w:color w:val="5A6B82"/>
+                      <w:sz w:val="16"/>
+                      <w:szCs w:val="16"/>
+                    </w:rPr>
+                    <w:t xml:space="preserve">Phone</w:t>
+                  </w:r>
+                </w:p>
+              </w:tc>
+              <w:tc>
+                <w:tcPr>
+                  <w:tcW w:type="dxa" w:w="3700"/>
+                  <w:tcBorders>
+                    <w:top w:val="none" w:color="FFFFFF" w:sz="0"/>
+                    <w:left w:val="none" w:color="FFFFFF" w:sz="0"/>
+                    <w:bottom w:val="single" w:color="C9D2DE" w:sz="4"/>
+                    <w:right w:val="none" w:color="FFFFFF" w:sz="0"/>
+                  </w:tcBorders>
+                  <w:tcMar>
+                    <w:top w:type="dxa" w:w="0"/>
+                    <w:left w:type="dxa" w:w="0"/>
+                    <w:bottom w:type="dxa" w:w="0"/>
+                    <w:right w:type="dxa" w:w="0"/>
+                  </w:tcMar>
+                </w:tcPr>
+                <w:p>
+                  <w:pPr>
+                    <w:spacing w:after="0" w:before="0"/>
+                  </w:pPr>
+                  <w:r>
+                    <w:rPr>
+                      <w:rFonts w:ascii="Calibri" w:cs="Calibri" w:eastAsia="Calibri" w:hAnsi="Calibri"/>
+                      <w:sz w:val="16"/>
+                      <w:szCs w:val="16"/>
+                    </w:rPr>
+                    <w:t xml:space="preserve"> </w:t>
+                  </w:r>
+                </w:p>
+              </w:tc>
+            </w:tr>
+            <w:tr>
+              <w:trPr>
+                <w:trHeight w:val="320" w:hRule="exact"/>
+              </w:trPr>
+              <w:tc>
+                <w:tcPr>
+                  <w:tcW w:type="dxa" w:w="1100"/>
+                  <w:tcBorders>
+                    <w:top w:val="none" w:color="FFFFFF" w:sz="0"/>
+                    <w:left w:val="none" w:color="FFFFFF" w:sz="0"/>
+                    <w:bottom w:val="none" w:color="FFFFFF" w:sz="0"/>
+                    <w:right w:val="none" w:color="FFFFFF" w:sz="0"/>
+                  </w:tcBorders>
+                  <w:tcMar>
+                    <w:top w:type="dxa" w:w="0"/>
+                    <w:left w:type="dxa" w:w="40"/>
+                    <w:bottom w:type="dxa" w:w="0"/>
+                    <w:right w:type="dxa" w:w="40"/>
+                  </w:tcMar>
+                  <w:vAlign w:val="bottom"/>
+                </w:tcPr>
+                <w:p>
+                  <w:pPr>
+                    <w:spacing w:after="0" w:before="0"/>
+                  </w:pPr>
+                  <w:r>
+                    <w:rPr>
+                      <w:rFonts w:ascii="Calibri" w:cs="Calibri" w:eastAsia="Calibri" w:hAnsi="Calibri"/>
+                      <w:b/>
+                      <w:bCs/>
+                      <w:color w:val="5A6B82"/>
+                      <w:sz w:val="16"/>
+                      <w:szCs w:val="16"/>
+                    </w:rPr>
+                    <w:t xml:space="preserve">Email</w:t>
+                  </w:r>
+                </w:p>
+              </w:tc>
+              <w:tc>
+                <w:tcPr>
+                  <w:tcW w:type="dxa" w:w="3700"/>
+                  <w:tcBorders>
+                    <w:top w:val="none" w:color="FFFFFF" w:sz="0"/>
+                    <w:left w:val="none" w:color="FFFFFF" w:sz="0"/>
+                    <w:bottom w:val="single" w:color="C9D2DE" w:sz="4"/>
+                    <w:right w:val="none" w:color="FFFFFF" w:sz="0"/>
+                  </w:tcBorders>
+                  <w:tcMar>
+                    <w:top w:type="dxa" w:w="0"/>
+                    <w:left w:type="dxa" w:w="0"/>
+                    <w:bottom w:type="dxa" w:w="0"/>
+                    <w:right w:type="dxa" w:w="0"/>
+                  </w:tcMar>
+                </w:tcPr>
+                <w:p>
+                  <w:pPr>
+                    <w:spacing w:after="0" w:before="0"/>
+                  </w:pPr>
+                  <w:r>
+                    <w:rPr>
+                      <w:rFonts w:ascii="Calibri" w:cs="Calibri" w:eastAsia="Calibri" w:hAnsi="Calibri"/>
+                      <w:sz w:val="16"/>
+                      <w:szCs w:val="16"/>
+                    </w:rPr>
+                    <w:t xml:space="preserve"> </w:t>
+                  </w:r>
+                </w:p>
+              </w:tc>
+            </w:tr>
+          </w:tbl>
+          <w:p/>
+        </w:tc>
+      </w:tr>
+      <w:tr>
+        <w:tc>
+          <w:tcPr>
+            <w:tcW w:type="dxa" w:w="4920"/>
+            <w:tcBorders>
+              <w:top w:val="none" w:color="FFFFFF" w:sz="0"/>
+              <w:left w:val="none" w:color="FFFFFF" w:sz="0"/>
+              <w:bottom w:val="none" w:color="FFFFFF" w:sz="0"/>
+              <w:right w:val="none" w:color="FFFFFF" w:sz="0"/>
+            </w:tcBorders>
+            <w:tcMar>
+              <w:top w:type="dxa" w:w="80"/>
+              <w:left w:type="dxa" w:w="0"/>
+              <w:bottom w:type="dxa" w:w="80"/>
+              <w:right w:type="dxa" w:w="120"/>
+            </w:tcMar>
+          </w:tcPr>
+          <w:p>
+            <w:pPr>
+              <w:pBdr>
+                <w:bottom w:val="single" w:color="E87722" w:sz="6"/>
+              </w:pBdr>
+              <w:spacing w:after="120" w:before="0"/>
+            </w:pPr>
+            <w:r>
+              <w:rPr>
+                <w:rFonts w:ascii="Calibri" w:cs="Calibri" w:eastAsia="Calibri" w:hAnsi="Calibri"/>
+                <w:b/>
+                <w:bCs/>
+                <w:color w:val="E87722"/>
+                <w:sz w:val="22"/>
+                <w:szCs w:val="22"/>
+              </w:rPr>
+              <w:t xml:space="preserve">THOUGHT PROVOKING QUESTIONS</w:t>
+            </w:r>
+          </w:p>
+          <w:tbl>
+            <w:tblPr>
+              <w:tblW w:type="dxa" w:w="4800"/>
+              <w:tblBorders>
+                <w:top w:val="none" w:color="FFFFFF" w:sz="0"/>
+                <w:left w:val="none" w:color="FFFFFF" w:sz="0"/>
+                <w:bottom w:val="none" w:color="FFFFFF" w:sz="0"/>
+                <w:right w:val="none" w:color="FFFFFF" w:sz="0"/>
+                <w:insideH w:val="single" w:color="auto" w:sz="4"/>
+                <w:insideV w:val="single" w:color="auto" w:sz="4"/>
+              </w:tblBorders>
+            </w:tblPr>
+            <w:tblGrid>
+              <w:gridCol w:w="4800"/>
+            </w:tblGrid>
+            <w:tr>
+              <w:trPr>
+                <w:trHeight w:val="380" w:hRule="exact"/>
+              </w:trPr>
+              <w:tc>
+                <w:tcPr>
+                  <w:tcW w:type="dxa" w:w="4800"/>
+                  <w:tcBorders>
+                    <w:top w:val="none" w:color="FFFFFF" w:sz="0"/>
+                    <w:left w:val="none" w:color="FFFFFF" w:sz="0"/>
+                    <w:bottom w:val="single" w:color="C9D2DE" w:sz="4"/>
+                    <w:right w:val="none" w:color="FFFFFF" w:sz="0"/>
+                  </w:tcBorders>
+                  <w:tcMar>
+                    <w:top w:type="dxa" w:w="0"/>
+                    <w:left w:type="dxa" w:w="0"/>
+                    <w:bottom w:type="dxa" w:w="0"/>
+                    <w:right w:type="dxa" w:w="0"/>
+                  </w:tcMar>
+                </w:tcPr>
+                <w:p>
+                  <w:pPr>
+                    <w:spacing w:after="0" w:before="0"/>
+                  </w:pPr>
+                  <w:r>
+                    <w:rPr>
+                      <w:rFonts w:ascii="Calibri" w:cs="Calibri" w:eastAsia="Calibri" w:hAnsi="Calibri"/>
+                      <w:sz w:val="22"/>
+                      <w:szCs w:val="22"/>
+                    </w:rPr>
+                    <w:t xml:space="preserve"> </w:t>
+                  </w:r>
+                </w:p>
+              </w:tc>
+            </w:tr>
+            <w:tr>
+              <w:trPr>
+                <w:trHeight w:val="380" w:hRule="exact"/>
+              </w:trPr>
+              <w:tc>
+                <w:tcPr>
+                  <w:tcW w:type="dxa" w:w="4800"/>
+                  <w:tcBorders>
+                    <w:top w:val="none" w:color="FFFFFF" w:sz="0"/>
+                    <w:left w:val="none" w:color="FFFFFF" w:sz="0"/>
+                    <w:bottom w:val="single" w:color="C9D2DE" w:sz="4"/>
+                    <w:right w:val="none" w:color="FFFFFF" w:sz="0"/>
+                  </w:tcBorders>
+                  <w:tcMar>
+                    <w:top w:type="dxa" w:w="0"/>
+                    <w:left w:type="dxa" w:w="0"/>
+                    <w:bottom w:type="dxa" w:w="0"/>
+                    <w:right w:type="dxa" w:w="0"/>
+                  </w:tcMar>
+                </w:tcPr>
+                <w:p>
+                  <w:pPr>
+                    <w:spacing w:after="0" w:before="0"/>
+                  </w:pPr>
+                  <w:r>
+                    <w:rPr>
+                      <w:rFonts w:ascii="Calibri" w:cs="Calibri" w:eastAsia="Calibri" w:hAnsi="Calibri"/>
+                      <w:sz w:val="22"/>
+                      <w:szCs w:val="22"/>
+                    </w:rPr>
+                    <w:t xml:space="preserve"> </w:t>
+                  </w:r>
+                </w:p>
+              </w:tc>
+            </w:tr>
+            <w:tr>
+              <w:trPr>
+                <w:trHeight w:val="380" w:hRule="exact"/>
+              </w:trPr>
+              <w:tc>
+                <w:tcPr>
+                  <w:tcW w:type="dxa" w:w="4800"/>
+                  <w:tcBorders>
+                    <w:top w:val="none" w:color="FFFFFF" w:sz="0"/>
+                    <w:left w:val="none" w:color="FFFFFF" w:sz="0"/>
+                    <w:bottom w:val="single" w:color="C9D2DE" w:sz="4"/>
+                    <w:right w:val="none" w:color="FFFFFF" w:sz="0"/>
+                  </w:tcBorders>
+                  <w:tcMar>
+                    <w:top w:type="dxa" w:w="0"/>
+                    <w:left w:type="dxa" w:w="0"/>
+                    <w:bottom w:type="dxa" w:w="0"/>
+                    <w:right w:type="dxa" w:w="0"/>
+                  </w:tcMar>
+                </w:tcPr>
+                <w:p>
+                  <w:pPr>
+                    <w:spacing w:after="0" w:before="0"/>
+                  </w:pPr>
+                  <w:r>
+                    <w:rPr>
+                      <w:rFonts w:ascii="Calibri" w:cs="Calibri" w:eastAsia="Calibri" w:hAnsi="Calibri"/>
+                      <w:sz w:val="22"/>
+                      <w:szCs w:val="22"/>
+                    </w:rPr>
+                    <w:t xml:space="preserve"> </w:t>
+                  </w:r>
+                </w:p>
+              </w:tc>
+            </w:tr>
+            <w:tr>
+              <w:trPr>
+                <w:trHeight w:val="380" w:hRule="exact"/>
+              </w:trPr>
+              <w:tc>
+                <w:tcPr>
+                  <w:tcW w:type="dxa" w:w="4800"/>
+                  <w:tcBorders>
+                    <w:top w:val="none" w:color="FFFFFF" w:sz="0"/>
+                    <w:left w:val="none" w:color="FFFFFF" w:sz="0"/>
+                    <w:bottom w:val="single" w:color="C9D2DE" w:sz="4"/>
+                    <w:right w:val="none" w:color="FFFFFF" w:sz="0"/>
+                  </w:tcBorders>
+                  <w:tcMar>
+                    <w:top w:type="dxa" w:w="0"/>
+                    <w:left w:type="dxa" w:w="0"/>
+                    <w:bottom w:type="dxa" w:w="0"/>
+                    <w:right w:type="dxa" w:w="0"/>
+                  </w:tcMar>
+                </w:tcPr>
+                <w:p>
+                  <w:pPr>
+                    <w:spacing w:after="0" w:before="0"/>
+                  </w:pPr>
+                  <w:r>
+                    <w:rPr>
+                      <w:rFonts w:ascii="Calibri" w:cs="Calibri" w:eastAsia="Calibri" w:hAnsi="Calibri"/>
+                      <w:sz w:val="22"/>
+                      <w:szCs w:val="22"/>
+                    </w:rPr>
+                    <w:t xml:space="preserve"> </w:t>
+                  </w:r>
+                </w:p>
+              </w:tc>
+            </w:tr>
+            <w:tr>
+              <w:trPr>
+                <w:trHeight w:val="380" w:hRule="exact"/>
+              </w:trPr>
+              <w:tc>
+                <w:tcPr>
+                  <w:tcW w:type="dxa" w:w="4800"/>
+                  <w:tcBorders>
+                    <w:top w:val="none" w:color="FFFFFF" w:sz="0"/>
+                    <w:left w:val="none" w:color="FFFFFF" w:sz="0"/>
+                    <w:bottom w:val="single" w:color="C9D2DE" w:sz="4"/>
+                    <w:right w:val="none" w:color="FFFFFF" w:sz="0"/>
+                  </w:tcBorders>
+                  <w:tcMar>
+                    <w:top w:type="dxa" w:w="0"/>
+                    <w:left w:type="dxa" w:w="0"/>
+                    <w:bottom w:type="dxa" w:w="0"/>
+                    <w:right w:type="dxa" w:w="0"/>
+                  </w:tcMar>
+                </w:tcPr>
+                <w:p>
+                  <w:pPr>
+                    <w:spacing w:after="0" w:before="0"/>
+                  </w:pPr>
+                  <w:r>
+                    <w:rPr>
+                      <w:rFonts w:ascii="Calibri" w:cs="Calibri" w:eastAsia="Calibri" w:hAnsi="Calibri"/>
+                      <w:sz w:val="22"/>
+                      <w:szCs w:val="22"/>
+                    </w:rPr>
+                    <w:t xml:space="preserve"> </w:t>
+                  </w:r>
+                </w:p>
+              </w:tc>
+            </w:tr>
+            <w:tr>
+              <w:trPr>
+                <w:trHeight w:val="380" w:hRule="exact"/>
+              </w:trPr>
+              <w:tc>
+                <w:tcPr>
+                  <w:tcW w:type="dxa" w:w="4800"/>
+                  <w:tcBorders>
+                    <w:top w:val="none" w:color="FFFFFF" w:sz="0"/>
+                    <w:left w:val="none" w:color="FFFFFF" w:sz="0"/>
+                    <w:bottom w:val="single" w:color="C9D2DE" w:sz="4"/>
+                    <w:right w:val="none" w:color="FFFFFF" w:sz="0"/>
+                  </w:tcBorders>
+                  <w:tcMar>
+                    <w:top w:type="dxa" w:w="0"/>
+                    <w:left w:type="dxa" w:w="0"/>
+                    <w:bottom w:type="dxa" w:w="0"/>
+                    <w:right w:type="dxa" w:w="0"/>
+                  </w:tcMar>
+                </w:tcPr>
+                <w:p>
+                  <w:pPr>
+                    <w:spacing w:after="0" w:before="0"/>
+                  </w:pPr>
+                  <w:r>
+                    <w:rPr>
+                      <w:rFonts w:ascii="Calibri" w:cs="Calibri" w:eastAsia="Calibri" w:hAnsi="Calibri"/>
+                      <w:sz w:val="22"/>
+                      <w:szCs w:val="22"/>
+                    </w:rPr>
+                    <w:t xml:space="preserve"> </w:t>
+                  </w:r>
+                </w:p>
+              </w:tc>
+            </w:tr>
+            <w:tr>
+              <w:trPr>
+                <w:trHeight w:val="380" w:hRule="exact"/>
+              </w:trPr>
+              <w:tc>
+                <w:tcPr>
+                  <w:tcW w:type="dxa" w:w="4800"/>
+                  <w:tcBorders>
+                    <w:top w:val="none" w:color="FFFFFF" w:sz="0"/>
+                    <w:left w:val="none" w:color="FFFFFF" w:sz="0"/>
+                    <w:bottom w:val="single" w:color="C9D2DE" w:sz="4"/>
+                    <w:right w:val="none" w:color="FFFFFF" w:sz="0"/>
+                  </w:tcBorders>
+                  <w:tcMar>
+                    <w:top w:type="dxa" w:w="0"/>
+                    <w:left w:type="dxa" w:w="0"/>
+                    <w:bottom w:type="dxa" w:w="0"/>
+                    <w:right w:type="dxa" w:w="0"/>
+                  </w:tcMar>
+                </w:tcPr>
+                <w:p>
+                  <w:pPr>
+                    <w:spacing w:after="0" w:before="0"/>
+                  </w:pPr>
+                  <w:r>
+                    <w:rPr>
+                      <w:rFonts w:ascii="Calibri" w:cs="Calibri" w:eastAsia="Calibri" w:hAnsi="Calibri"/>
+                      <w:sz w:val="22"/>
+                      <w:szCs w:val="22"/>
+                    </w:rPr>
+                    <w:t xml:space="preserve"> </w:t>
+                  </w:r>
+                </w:p>
+              </w:tc>
+            </w:tr>
+            <w:tr>
+              <w:trPr>
+                <w:trHeight w:val="380" w:hRule="exact"/>
+              </w:trPr>
+              <w:tc>
+                <w:tcPr>
+                  <w:tcW w:type="dxa" w:w="4800"/>
+                  <w:tcBorders>
+                    <w:top w:val="none" w:color="FFFFFF" w:sz="0"/>
+                    <w:left w:val="none" w:color="FFFFFF" w:sz="0"/>
+                    <w:bottom w:val="single" w:color="C9D2DE" w:sz="4"/>
+                    <w:right w:val="none" w:color="FFFFFF" w:sz="0"/>
+                  </w:tcBorders>
+                  <w:tcMar>
+                    <w:top w:type="dxa" w:w="0"/>
+                    <w:left w:type="dxa" w:w="0"/>
+                    <w:bottom w:type="dxa" w:w="0"/>
+                    <w:right w:type="dxa" w:w="0"/>
+                  </w:tcMar>
+                </w:tcPr>
+                <w:p>
+                  <w:pPr>
+                    <w:spacing w:after="0" w:before="0"/>
+                  </w:pPr>
+                  <w:r>
+                    <w:rPr>
+                      <w:rFonts w:ascii="Calibri" w:cs="Calibri" w:eastAsia="Calibri" w:hAnsi="Calibri"/>
+                      <w:sz w:val="22"/>
+                      <w:szCs w:val="22"/>
+                    </w:rPr>
+                    <w:t xml:space="preserve"> </w:t>
+                  </w:r>
+                </w:p>
+              </w:tc>
+            </w:tr>
+          </w:tbl>
+          <w:p/>
+        </w:tc>
+        <w:tc>
+          <w:tcPr>
+            <w:tcW w:type="dxa" w:w="4920"/>
+            <w:tcBorders>
+              <w:top w:val="none" w:color="FFFFFF" w:sz="0"/>
+              <w:left w:val="none" w:color="FFFFFF" w:sz="0"/>
+              <w:bottom w:val="none" w:color="FFFFFF" w:sz="0"/>
+              <w:right w:val="none" w:color="FFFFFF" w:sz="0"/>
+            </w:tcBorders>
+            <w:tcMar>
+              <w:top w:type="dxa" w:w="80"/>
+              <w:left w:type="dxa" w:w="120"/>
+              <w:bottom w:type="dxa" w:w="80"/>
+              <w:right w:type="dxa" w:w="0"/>
+            </w:tcMar>
+          </w:tcPr>
+          <w:p>
+            <w:pPr>
+              <w:pBdr>
+                <w:bottom w:val="single" w:color="E87722" w:sz="6"/>
+              </w:pBdr>
+              <w:spacing w:after="120" w:before="0"/>
+            </w:pPr>
+            <w:r>
+              <w:rPr>
+                <w:rFonts w:ascii="Calibri" w:cs="Calibri" w:eastAsia="Calibri" w:hAnsi="Calibri"/>
+                <w:b/>
+                <w:bCs/>
+                <w:color w:val="E87722"/>
+                <w:sz w:val="22"/>
+                <w:szCs w:val="22"/>
+              </w:rPr>
+              <w:t xml:space="preserve">MEMORABLE QUOTES</w:t>
+            </w:r>
+          </w:p>
+          <w:tbl>
+            <w:tblPr>
+              <w:tblW w:type="dxa" w:w="4800"/>
+              <w:tblBorders>
+                <w:top w:val="none" w:color="FFFFFF" w:sz="0"/>
+                <w:left w:val="none" w:color="FFFFFF" w:sz="0"/>
+                <w:bottom w:val="none" w:color="FFFFFF" w:sz="0"/>
+                <w:right w:val="none" w:color="FFFFFF" w:sz="0"/>
+                <w:insideH w:val="single" w:color="auto" w:sz="4"/>
+                <w:insideV w:val="single" w:color="auto" w:sz="4"/>
+              </w:tblBorders>
+            </w:tblPr>
+            <w:tblGrid>
+              <w:gridCol w:w="4800"/>
+            </w:tblGrid>
+            <w:tr>
+              <w:trPr>
+                <w:trHeight w:val="380" w:hRule="exact"/>
+              </w:trPr>
+              <w:tc>
+                <w:tcPr>
+                  <w:tcW w:type="dxa" w:w="4800"/>
+                  <w:tcBorders>
+                    <w:top w:val="none" w:color="FFFFFF" w:sz="0"/>
+                    <w:left w:val="none" w:color="FFFFFF" w:sz="0"/>
+                    <w:bottom w:val="single" w:color="C9D2DE" w:sz="4"/>
+                    <w:right w:val="none" w:color="FFFFFF" w:sz="0"/>
+                  </w:tcBorders>
+                  <w:tcMar>
+                    <w:top w:type="dxa" w:w="0"/>
+                    <w:left w:type="dxa" w:w="0"/>
+                    <w:bottom w:type="dxa" w:w="0"/>
+                    <w:right w:type="dxa" w:w="0"/>
+                  </w:tcMar>
+                </w:tcPr>
+                <w:p>
+                  <w:pPr>
+                    <w:spacing w:after="0" w:before="0"/>
+                  </w:pPr>
+                  <w:r>
+                    <w:rPr>
+                      <w:rFonts w:ascii="Calibri" w:cs="Calibri" w:eastAsia="Calibri" w:hAnsi="Calibri"/>
+                      <w:sz w:val="22"/>
+                      <w:szCs w:val="22"/>
+                    </w:rPr>
+                    <w:t xml:space="preserve"> </w:t>
+                  </w:r>
+                </w:p>
+              </w:tc>
+            </w:tr>
+            <w:tr>
+              <w:trPr>
+                <w:trHeight w:val="380" w:hRule="exact"/>
+              </w:trPr>
+              <w:tc>
+                <w:tcPr>
+                  <w:tcW w:type="dxa" w:w="4800"/>
+                  <w:tcBorders>
+                    <w:top w:val="none" w:color="FFFFFF" w:sz="0"/>
+                    <w:left w:val="none" w:color="FFFFFF" w:sz="0"/>
+                    <w:bottom w:val="single" w:color="C9D2DE" w:sz="4"/>
+                    <w:right w:val="none" w:color="FFFFFF" w:sz="0"/>
+                  </w:tcBorders>
+                  <w:tcMar>
+                    <w:top w:type="dxa" w:w="0"/>
+                    <w:left w:type="dxa" w:w="0"/>
+                    <w:bottom w:type="dxa" w:w="0"/>
+                    <w:right w:type="dxa" w:w="0"/>
+                  </w:tcMar>
+                </w:tcPr>
+                <w:p>
+                  <w:pPr>
+                    <w:spacing w:after="0" w:before="0"/>
+                  </w:pPr>
+                  <w:r>
+                    <w:rPr>
+                      <w:rFonts w:ascii="Calibri" w:cs="Calibri" w:eastAsia="Calibri" w:hAnsi="Calibri"/>
+                      <w:sz w:val="22"/>
+                      <w:szCs w:val="22"/>
+                    </w:rPr>
+                    <w:t xml:space="preserve"> </w:t>
+                  </w:r>
+                </w:p>
+              </w:tc>
+            </w:tr>
+            <w:tr>
+              <w:trPr>
+                <w:trHeight w:val="380" w:hRule="exact"/>
+              </w:trPr>
+              <w:tc>
+                <w:tcPr>
+                  <w:tcW w:type="dxa" w:w="4800"/>
+                  <w:tcBorders>
+                    <w:top w:val="none" w:color="FFFFFF" w:sz="0"/>
+                    <w:left w:val="none" w:color="FFFFFF" w:sz="0"/>
+                    <w:bottom w:val="single" w:color="C9D2DE" w:sz="4"/>
+                    <w:right w:val="none" w:color="FFFFFF" w:sz="0"/>
+                  </w:tcBorders>
+                  <w:tcMar>
+                    <w:top w:type="dxa" w:w="0"/>
+                    <w:left w:type="dxa" w:w="0"/>
+                    <w:bottom w:type="dxa" w:w="0"/>
+                    <w:right w:type="dxa" w:w="0"/>
+                  </w:tcMar>
+                </w:tcPr>
+                <w:p>
+                  <w:pPr>
+                    <w:spacing w:after="0" w:before="0"/>
+                  </w:pPr>
+                  <w:r>
+                    <w:rPr>
+                      <w:rFonts w:ascii="Calibri" w:cs="Calibri" w:eastAsia="Calibri" w:hAnsi="Calibri"/>
+                      <w:sz w:val="22"/>
+                      <w:szCs w:val="22"/>
+                    </w:rPr>
+                    <w:t xml:space="preserve"> </w:t>
+                  </w:r>
+                </w:p>
+              </w:tc>
+            </w:tr>
+            <w:tr>
+              <w:trPr>
+                <w:trHeight w:val="380" w:hRule="exact"/>
+              </w:trPr>
+              <w:tc>
+                <w:tcPr>
+                  <w:tcW w:type="dxa" w:w="4800"/>
+                  <w:tcBorders>
+                    <w:top w:val="none" w:color="FFFFFF" w:sz="0"/>
+                    <w:left w:val="none" w:color="FFFFFF" w:sz="0"/>
+                    <w:bottom w:val="single" w:color="C9D2DE" w:sz="4"/>
+                    <w:right w:val="none" w:color="FFFFFF" w:sz="0"/>
+                  </w:tcBorders>
+                  <w:tcMar>
+                    <w:top w:type="dxa" w:w="0"/>
+                    <w:left w:type="dxa" w:w="0"/>
+                    <w:bottom w:type="dxa" w:w="0"/>
+                    <w:right w:type="dxa" w:w="0"/>
+                  </w:tcMar>
+                </w:tcPr>
+                <w:p>
+                  <w:pPr>
+                    <w:spacing w:after="0" w:before="0"/>
+                  </w:pPr>
+                  <w:r>
+                    <w:rPr>
+                      <w:rFonts w:ascii="Calibri" w:cs="Calibri" w:eastAsia="Calibri" w:hAnsi="Calibri"/>
+                      <w:sz w:val="22"/>
+                      <w:szCs w:val="22"/>
+                    </w:rPr>
+                    <w:t xml:space="preserve"> </w:t>
+                  </w:r>
+                </w:p>
+              </w:tc>
+            </w:tr>
+            <w:tr>
+              <w:trPr>
+                <w:trHeight w:val="380" w:hRule="exact"/>
+              </w:trPr>
+              <w:tc>
+                <w:tcPr>
+                  <w:tcW w:type="dxa" w:w="4800"/>
+                  <w:tcBorders>
+                    <w:top w:val="none" w:color="FFFFFF" w:sz="0"/>
+                    <w:left w:val="none" w:color="FFFFFF" w:sz="0"/>
+                    <w:bottom w:val="single" w:color="C9D2DE" w:sz="4"/>
+                    <w:right w:val="none" w:color="FFFFFF" w:sz="0"/>
+                  </w:tcBorders>
+                  <w:tcMar>
+                    <w:top w:type="dxa" w:w="0"/>
+                    <w:left w:type="dxa" w:w="0"/>
+                    <w:bottom w:type="dxa" w:w="0"/>
+                    <w:right w:type="dxa" w:w="0"/>
+                  </w:tcMar>
+                </w:tcPr>
+                <w:p>
+                  <w:pPr>
+                    <w:spacing w:after="0" w:before="0"/>
+                  </w:pPr>
+                  <w:r>
+                    <w:rPr>
+                      <w:rFonts w:ascii="Calibri" w:cs="Calibri" w:eastAsia="Calibri" w:hAnsi="Calibri"/>
+                      <w:sz w:val="22"/>
+                      <w:szCs w:val="22"/>
+                    </w:rPr>
+                    <w:t xml:space="preserve"> </w:t>
+                  </w:r>
+                </w:p>
+              </w:tc>
+            </w:tr>
+            <w:tr>
+              <w:trPr>
+                <w:trHeight w:val="380" w:hRule="exact"/>
+              </w:trPr>
+              <w:tc>
+                <w:tcPr>
+                  <w:tcW w:type="dxa" w:w="4800"/>
+                  <w:tcBorders>
+                    <w:top w:val="none" w:color="FFFFFF" w:sz="0"/>
+                    <w:left w:val="none" w:color="FFFFFF" w:sz="0"/>
+                    <w:bottom w:val="single" w:color="C9D2DE" w:sz="4"/>
+                    <w:right w:val="none" w:color="FFFFFF" w:sz="0"/>
+                  </w:tcBorders>
+                  <w:tcMar>
+                    <w:top w:type="dxa" w:w="0"/>
+                    <w:left w:type="dxa" w:w="0"/>
+                    <w:bottom w:type="dxa" w:w="0"/>
+                    <w:right w:type="dxa" w:w="0"/>
+                  </w:tcMar>
+                </w:tcPr>
+                <w:p>
+                  <w:pPr>
+                    <w:spacing w:after="0" w:before="0"/>
+                  </w:pPr>
+                  <w:r>
+                    <w:rPr>
+                      <w:rFonts w:ascii="Calibri" w:cs="Calibri" w:eastAsia="Calibri" w:hAnsi="Calibri"/>
+                      <w:sz w:val="22"/>
+                      <w:szCs w:val="22"/>
+                    </w:rPr>
+                    <w:t xml:space="preserve"> </w:t>
+                  </w:r>
+                </w:p>
+              </w:tc>
+            </w:tr>
+            <w:tr>
+              <w:trPr>
+                <w:trHeight w:val="380" w:hRule="exact"/>
+              </w:trPr>
+              <w:tc>
+                <w:tcPr>
+                  <w:tcW w:type="dxa" w:w="4800"/>
+                  <w:tcBorders>
+                    <w:top w:val="none" w:color="FFFFFF" w:sz="0"/>
+                    <w:left w:val="none" w:color="FFFFFF" w:sz="0"/>
+                    <w:bottom w:val="single" w:color="C9D2DE" w:sz="4"/>
+                    <w:right w:val="none" w:color="FFFFFF" w:sz="0"/>
+                  </w:tcBorders>
+                  <w:tcMar>
+                    <w:top w:type="dxa" w:w="0"/>
+                    <w:left w:type="dxa" w:w="0"/>
+                    <w:bottom w:type="dxa" w:w="0"/>
+                    <w:right w:type="dxa" w:w="0"/>
+                  </w:tcMar>
+                </w:tcPr>
+                <w:p>
+                  <w:pPr>
+                    <w:spacing w:after="0" w:before="0"/>
+                  </w:pPr>
+                  <w:r>
+                    <w:rPr>
+                      <w:rFonts w:ascii="Calibri" w:cs="Calibri" w:eastAsia="Calibri" w:hAnsi="Calibri"/>
+                      <w:sz w:val="22"/>
+                      <w:szCs w:val="22"/>
+                    </w:rPr>
+                    <w:t xml:space="preserve"> </w:t>
+                  </w:r>
+                </w:p>
+              </w:tc>
+            </w:tr>
+            <w:tr>
+              <w:trPr>
+                <w:trHeight w:val="380" w:hRule="exact"/>
+              </w:trPr>
+              <w:tc>
+                <w:tcPr>
+                  <w:tcW w:type="dxa" w:w="4800"/>
+                  <w:tcBorders>
+                    <w:top w:val="none" w:color="FFFFFF" w:sz="0"/>
+                    <w:left w:val="none" w:color="FFFFFF" w:sz="0"/>
+                    <w:bottom w:val="single" w:color="C9D2DE" w:sz="4"/>
+                    <w:right w:val="none" w:color="FFFFFF" w:sz="0"/>
+                  </w:tcBorders>
+                  <w:tcMar>
+                    <w:top w:type="dxa" w:w="0"/>
+                    <w:left w:type="dxa" w:w="0"/>
+                    <w:bottom w:type="dxa" w:w="0"/>
+                    <w:right w:type="dxa" w:w="0"/>
+                  </w:tcMar>
+                </w:tcPr>
+                <w:p>
+                  <w:pPr>
+                    <w:spacing w:after="0" w:before="0"/>
+                  </w:pPr>
+                  <w:r>
+                    <w:rPr>
+                      <w:rFonts w:ascii="Calibri" w:cs="Calibri" w:eastAsia="Calibri" w:hAnsi="Calibri"/>
+                      <w:sz w:val="22"/>
+                      <w:szCs w:val="22"/>
+                    </w:rPr>
+                    <w:t xml:space="preserve"> </w:t>
+                  </w:r>
+                </w:p>
+              </w:tc>
+            </w:tr>
+          </w:tbl>
+          <w:p/>
         </w:tc>
       </w:tr>
     </w:tbl>

</xml_diff>

<commit_message>
workbook cover: drop 'FIFTH ANNUAL' kicker and 'Dallas' from venue name; also drop 'fifth annual' from welcome letter; insert blank spacer page after cover (page numbers pick up on Welcome as page 3)
</commit_message>
<xml_diff>
--- a/deliverables/workbook/Workbook.docx
+++ b/deliverables/workbook/Workbook.docx
@@ -4,24 +4,7 @@
   <w:body>
     <w:p>
       <w:pPr>
-        <w:spacing w:after="200" w:before="2000"/>
-        <w:jc w:val="center"/>
-      </w:pPr>
-      <w:r>
-        <w:rPr>
-          <w:rFonts w:ascii="Calibri" w:cs="Calibri" w:eastAsia="Calibri" w:hAnsi="Calibri"/>
-          <w:b/>
-          <w:bCs/>
-          <w:color w:val="E87722"/>
-          <w:sz w:val="22"/>
-          <w:szCs w:val="22"/>
-        </w:rPr>
-        <w:t xml:space="preserve">FIFTH ANNUAL</w:t>
-      </w:r>
-    </w:p>
-    <w:p>
-      <w:pPr>
-        <w:spacing w:after="400"/>
+        <w:spacing w:after="400" w:before="2000"/>
         <w:jc w:val="center"/>
       </w:pPr>
       <w:r>
@@ -140,7 +123,7 @@
           <w:sz w:val="26"/>
           <w:szCs w:val="26"/>
         </w:rPr>
-        <w:t xml:space="preserve">The Statler Dallas</w:t>
+        <w:t xml:space="preserve">The Statler</w:t>
       </w:r>
     </w:p>
     <w:p>
@@ -156,6 +139,14 @@
           <w:szCs w:val="22"/>
         </w:rPr>
         <w:t xml:space="preserve">1914 Commerce Street, Dallas, TX 75201</w:t>
+      </w:r>
+    </w:p>
+    <w:p>
+      <w:pPr>
+        <w:pageBreakBefore/>
+      </w:pPr>
+      <w:r>
+        <w:t xml:space="preserve"/>
       </w:r>
     </w:p>
     <w:p>
@@ -204,7 +195,7 @@
           <w:sz w:val="22"/>
           <w:szCs w:val="22"/>
         </w:rPr>
-        <w:t xml:space="preserve">Welcome to the fifth annual We Run on EOS® North Texas. Today we come together as an EOS community — entrepreneurs, leadership teams, and the certified Implementers who serve them — to sharpen our tools, share what’s working, and get better at running our businesses.</w:t>
+        <w:t xml:space="preserve">Welcome to We Run on EOS® North Texas. Today we come together as an EOS community — entrepreneurs, leadership teams, and the certified Implementers who serve them — to sharpen our tools, share what’s working, and get better at running our businesses.</w:t>
       </w:r>
     </w:p>
     <w:p>

</xml_diff>

<commit_message>
workbook welcome page: text edits, pull quote, renumber body starting at 1
- Cover already updated in previous commit (no 'Fifth Annual', 'The Statler').
- Blank spacer page is now its own section — no header, no footer.
- Welcome page:
  - Remove 'certified' before 'Implementers' in opening paragraph.
  - Bullet 4: 'Come back at 6:15 for Happy Hour' -> 'Stick around for the Happy Hour'.
  - Blank line between 'Here's to a great day...' and 'Let's get to work.'
  - Signoff: 'North Texas EOS Community' -> 'North Texas EOS Implementer Community'.
  - Add reusable pullQuote() helper (orange left border, tinted panel, italic navy quote, muted attribution).
  - Insert Gino Wickman 'Vision without traction...' pull quote at bottom of welcome page.
- paginate_workbook.py: number body pages starting at 1 (physical page 3 = '1', etc.) via PAGENUM_OFFSET.
</commit_message>
<xml_diff>
--- a/deliverables/workbook/Workbook.docx
+++ b/deliverables/workbook/Workbook.docx
@@ -26,7 +26,7 @@
                     </pic:cNvPicPr>
                   </pic:nvPicPr>
                   <pic:blipFill>
-                    <a:blip r:embed="rId13" cstate="none"/>
+                    <a:blip r:embed="rId15" cstate="none"/>
                     <a:srcRect/>
                     <a:stretch>
                       <a:fillRect/>
@@ -143,11 +143,32 @@
     </w:p>
     <w:p>
       <w:pPr>
-        <w:pageBreakBefore/>
+        <w:sectPr>
+          <w:headerReference w:type="default" r:id="rId7"/>
+          <w:footerReference w:type="default" r:id="rId8"/>
+          <w:pgSz w:w="12240" w:h="15840" w:orient="portrait"/>
+          <w:pgMar w:top="1080" w:right="1080" w:bottom="1080" w:left="1080" w:header="708" w:footer="708" w:gutter="0"/>
+          <w:pgNumType/>
+          <w:docGrid w:linePitch="360"/>
+        </w:sectPr>
       </w:pPr>
+    </w:p>
+    <w:p>
       <w:r>
         <w:t xml:space="preserve"/>
       </w:r>
+    </w:p>
+    <w:p>
+      <w:pPr>
+        <w:sectPr>
+          <w:headerReference w:type="default" r:id="rId9"/>
+          <w:footerReference w:type="default" r:id="rId10"/>
+          <w:pgSz w:w="12240" w:h="15840" w:orient="portrait"/>
+          <w:pgMar w:top="1080" w:right="1080" w:bottom="1080" w:left="1080" w:header="708" w:footer="708" w:gutter="0"/>
+          <w:pgNumType/>
+          <w:docGrid w:linePitch="360"/>
+        </w:sectPr>
+      </w:pPr>
     </w:p>
     <w:p>
       <w:pPr>
@@ -195,7 +216,7 @@
           <w:sz w:val="22"/>
           <w:szCs w:val="22"/>
         </w:rPr>
-        <w:t xml:space="preserve">Welcome to We Run on EOS® North Texas. Today we come together as an EOS community — entrepreneurs, leadership teams, and the certified Implementers who serve them — to sharpen our tools, share what’s working, and get better at running our businesses.</w:t>
+        <w:t xml:space="preserve">Welcome to We Run on EOS® North Texas. Today we come together as an EOS community — entrepreneurs, leadership teams, and the Implementers who serve them — to sharpen our tools, share what’s working, and get better at running our businesses.</w:t>
       </w:r>
     </w:p>
     <w:p>
@@ -328,7 +349,7 @@
           <w:sz w:val="22"/>
           <w:szCs w:val="22"/>
         </w:rPr>
-        <w:t xml:space="preserve">Come back at 6:15 for Happy Hour. Some of the best conversations of the day happen there.</w:t>
+        <w:t xml:space="preserve">Stick around for the Happy Hour. Some of the best conversations of the day happen there.</w:t>
       </w:r>
     </w:p>
     <w:p>
@@ -356,6 +377,25 @@
           <w:szCs w:val="22"/>
         </w:rPr>
         <w:t xml:space="preserve">Here’s to a great day — stronger teams, healthier companies, and clearer visions.</w:t>
+      </w:r>
+    </w:p>
+    <w:p>
+      <w:pPr>
+        <w:spacing w:after="100"/>
+        <w:jc w:val="left"/>
+      </w:pPr>
+      <w:r>
+        <w:rPr>
+          <w:rFonts w:ascii="Calibri" w:cs="Calibri" w:eastAsia="Calibri" w:hAnsi="Calibri"/>
+          <w:b w:val="false"/>
+          <w:bCs w:val="false"/>
+          <w:i w:val="false"/>
+          <w:iCs w:val="false"/>
+          <w:color w:val="1A1A1A"/>
+          <w:sz w:val="22"/>
+          <w:szCs w:val="22"/>
+        </w:rPr>
+        <w:t xml:space="preserve"/>
       </w:r>
     </w:p>
     <w:p>
@@ -412,9 +452,88 @@
           <w:sz w:val="22"/>
           <w:szCs w:val="22"/>
         </w:rPr>
-        <w:t xml:space="preserve">— The North Texas EOS Community</w:t>
+        <w:t xml:space="preserve">— The North Texas EOS Implementer Community</w:t>
       </w:r>
     </w:p>
+    <w:p>
+      <w:pPr>
+        <w:spacing w:after="400"/>
+      </w:pPr>
+      <w:r>
+        <w:t xml:space="preserve"/>
+      </w:r>
+    </w:p>
+    <w:tbl>
+      <w:tblPr>
+        <w:tblW w:type="dxa" w:w="10080"/>
+        <w:tblBorders>
+          <w:top w:val="single" w:color="auto" w:sz="4"/>
+          <w:left w:val="single" w:color="auto" w:sz="4"/>
+          <w:bottom w:val="single" w:color="auto" w:sz="4"/>
+          <w:right w:val="single" w:color="auto" w:sz="4"/>
+          <w:insideH w:val="single" w:color="auto" w:sz="4"/>
+          <w:insideV w:val="single" w:color="auto" w:sz="4"/>
+        </w:tblBorders>
+      </w:tblPr>
+      <w:tblGrid>
+        <w:gridCol w:w="10080"/>
+      </w:tblGrid>
+      <w:tr>
+        <w:trPr>
+          <w:cantSplit/>
+        </w:trPr>
+        <w:tc>
+          <w:tcPr>
+            <w:tcW w:type="dxa" w:w="10080"/>
+            <w:tcBorders>
+              <w:top w:val="none" w:color="FFFFFF" w:sz="0"/>
+              <w:left w:val="single" w:color="E87722" w:sz="36"/>
+              <w:bottom w:val="none" w:color="FFFFFF" w:sz="0"/>
+              <w:right w:val="none" w:color="FFFFFF" w:sz="0"/>
+            </w:tcBorders>
+            <w:shd w:fill="F4F6F9" w:color="auto" w:val="clear"/>
+            <w:tcMar>
+              <w:top w:type="dxa" w:w="240"/>
+              <w:left w:type="dxa" w:w="360"/>
+              <w:bottom w:type="dxa" w:w="240"/>
+              <w:right w:type="dxa" w:w="360"/>
+            </w:tcMar>
+          </w:tcPr>
+          <w:p>
+            <w:pPr>
+              <w:spacing w:after="120"/>
+              <w:jc w:val="left"/>
+            </w:pPr>
+            <w:r>
+              <w:rPr>
+                <w:rFonts w:ascii="Calibri" w:cs="Calibri" w:eastAsia="Calibri" w:hAnsi="Calibri"/>
+                <w:i/>
+                <w:iCs/>
+                <w:color w:val="0B1F3A"/>
+                <w:sz w:val="28"/>
+                <w:szCs w:val="28"/>
+              </w:rPr>
+              <w:t xml:space="preserve">“Vision without traction is merely hallucination.”</w:t>
+            </w:r>
+          </w:p>
+          <w:p>
+            <w:pPr>
+              <w:spacing w:after="0"/>
+              <w:jc w:val="left"/>
+            </w:pPr>
+            <w:r>
+              <w:rPr>
+                <w:rFonts w:ascii="Calibri" w:cs="Calibri" w:eastAsia="Calibri" w:hAnsi="Calibri"/>
+                <w:color w:val="5A6B82"/>
+                <w:sz w:val="20"/>
+                <w:szCs w:val="20"/>
+              </w:rPr>
+              <w:t xml:space="preserve">— Gino Wickman, Traction</w:t>
+            </w:r>
+          </w:p>
+        </w:tc>
+      </w:tr>
+    </w:tbl>
     <w:p>
       <w:pPr>
         <w:pStyle w:val="Heading1"/>
@@ -8786,7 +8905,7 @@
                           </pic:cNvPicPr>
                         </pic:nvPicPr>
                         <pic:blipFill>
-                          <a:blip r:embed="rId14" cstate="none"/>
+                          <a:blip r:embed="rId16" cstate="none"/>
                           <a:srcRect/>
                           <a:stretch>
                             <a:fillRect/>
@@ -9978,7 +10097,7 @@
                           </pic:cNvPicPr>
                         </pic:nvPicPr>
                         <pic:blipFill>
-                          <a:blip r:embed="rId15" cstate="none"/>
+                          <a:blip r:embed="rId17" cstate="none"/>
                           <a:srcRect/>
                           <a:stretch>
                             <a:fillRect/>
@@ -11170,7 +11289,7 @@
                           </pic:cNvPicPr>
                         </pic:nvPicPr>
                         <pic:blipFill>
-                          <a:blip r:embed="rId16" cstate="none"/>
+                          <a:blip r:embed="rId18" cstate="none"/>
                           <a:srcRect/>
                           <a:stretch>
                             <a:fillRect/>
@@ -12306,7 +12425,7 @@
                           </pic:cNvPicPr>
                         </pic:nvPicPr>
                         <pic:blipFill>
-                          <a:blip r:embed="rId17" cstate="none"/>
+                          <a:blip r:embed="rId19" cstate="none"/>
                           <a:srcRect/>
                           <a:stretch>
                             <a:fillRect/>
@@ -12464,7 +12583,7 @@
                           </pic:cNvPicPr>
                         </pic:nvPicPr>
                         <pic:blipFill>
-                          <a:blip r:embed="rId18" cstate="none"/>
+                          <a:blip r:embed="rId20" cstate="none"/>
                           <a:srcRect/>
                           <a:stretch>
                             <a:fillRect/>
@@ -12622,7 +12741,7 @@
                           </pic:cNvPicPr>
                         </pic:nvPicPr>
                         <pic:blipFill>
-                          <a:blip r:embed="rId19" cstate="none"/>
+                          <a:blip r:embed="rId21" cstate="none"/>
                           <a:srcRect/>
                           <a:stretch>
                             <a:fillRect/>
@@ -12892,7 +13011,7 @@
                                 </pic:cNvPicPr>
                               </pic:nvPicPr>
                               <pic:blipFill>
-                                <a:blip r:embed="rId20" cstate="none"/>
+                                <a:blip r:embed="rId22" cstate="none"/>
                                 <a:srcRect/>
                                 <a:stretch>
                                   <a:fillRect/>
@@ -12973,7 +13092,7 @@
                                 </pic:cNvPicPr>
                               </pic:nvPicPr>
                               <pic:blipFill>
-                                <a:blip r:embed="rId21" cstate="none"/>
+                                <a:blip r:embed="rId23" cstate="none"/>
                                 <a:srcRect/>
                                 <a:stretch>
                                   <a:fillRect/>
@@ -13079,7 +13198,7 @@
                                 </pic:cNvPicPr>
                               </pic:nvPicPr>
                               <pic:blipFill>
-                                <a:blip r:embed="rId22" cstate="none"/>
+                                <a:blip r:embed="rId24" cstate="none"/>
                                 <a:srcRect/>
                                 <a:stretch>
                                   <a:fillRect/>
@@ -13160,7 +13279,7 @@
                                 </pic:cNvPicPr>
                               </pic:nvPicPr>
                               <pic:blipFill>
-                                <a:blip r:embed="rId23" cstate="none"/>
+                                <a:blip r:embed="rId25" cstate="none"/>
                                 <a:srcRect/>
                                 <a:stretch>
                                   <a:fillRect/>
@@ -13313,7 +13432,7 @@
                                 </pic:cNvPicPr>
                               </pic:nvPicPr>
                               <pic:blipFill>
-                                <a:blip r:embed="rId24" cstate="none"/>
+                                <a:blip r:embed="rId26" cstate="none"/>
                                 <a:srcRect/>
                                 <a:stretch>
                                   <a:fillRect/>
@@ -13394,7 +13513,7 @@
                                 </pic:cNvPicPr>
                               </pic:nvPicPr>
                               <pic:blipFill>
-                                <a:blip r:embed="rId25" cstate="none"/>
+                                <a:blip r:embed="rId27" cstate="none"/>
                                 <a:srcRect/>
                                 <a:stretch>
                                   <a:fillRect/>
@@ -13500,7 +13619,7 @@
                                 </pic:cNvPicPr>
                               </pic:nvPicPr>
                               <pic:blipFill>
-                                <a:blip r:embed="rId26" cstate="none"/>
+                                <a:blip r:embed="rId28" cstate="none"/>
                                 <a:srcRect/>
                                 <a:stretch>
                                   <a:fillRect/>
@@ -13581,7 +13700,7 @@
                                 </pic:cNvPicPr>
                               </pic:nvPicPr>
                               <pic:blipFill>
-                                <a:blip r:embed="rId27" cstate="none"/>
+                                <a:blip r:embed="rId29" cstate="none"/>
                                 <a:srcRect/>
                                 <a:stretch>
                                   <a:fillRect/>
@@ -13734,7 +13853,7 @@
                                 </pic:cNvPicPr>
                               </pic:nvPicPr>
                               <pic:blipFill>
-                                <a:blip r:embed="rId28" cstate="none"/>
+                                <a:blip r:embed="rId30" cstate="none"/>
                                 <a:srcRect/>
                                 <a:stretch>
                                   <a:fillRect/>
@@ -13815,7 +13934,7 @@
                                 </pic:cNvPicPr>
                               </pic:nvPicPr>
                               <pic:blipFill>
-                                <a:blip r:embed="rId29" cstate="none"/>
+                                <a:blip r:embed="rId31" cstate="none"/>
                                 <a:srcRect/>
                                 <a:stretch>
                                   <a:fillRect/>
@@ -13921,7 +14040,7 @@
                                 </pic:cNvPicPr>
                               </pic:nvPicPr>
                               <pic:blipFill>
-                                <a:blip r:embed="rId30" cstate="none"/>
+                                <a:blip r:embed="rId32" cstate="none"/>
                                 <a:srcRect/>
                                 <a:stretch>
                                   <a:fillRect/>
@@ -14002,7 +14121,7 @@
                                 </pic:cNvPicPr>
                               </pic:nvPicPr>
                               <pic:blipFill>
-                                <a:blip r:embed="rId31" cstate="none"/>
+                                <a:blip r:embed="rId33" cstate="none"/>
                                 <a:srcRect/>
                                 <a:stretch>
                                   <a:fillRect/>
@@ -14155,7 +14274,7 @@
                                 </pic:cNvPicPr>
                               </pic:nvPicPr>
                               <pic:blipFill>
-                                <a:blip r:embed="rId32" cstate="none"/>
+                                <a:blip r:embed="rId34" cstate="none"/>
                                 <a:srcRect/>
                                 <a:stretch>
                                   <a:fillRect/>
@@ -14236,7 +14355,7 @@
                                 </pic:cNvPicPr>
                               </pic:nvPicPr>
                               <pic:blipFill>
-                                <a:blip r:embed="rId33" cstate="none"/>
+                                <a:blip r:embed="rId35" cstate="none"/>
                                 <a:srcRect/>
                                 <a:stretch>
                                   <a:fillRect/>
@@ -14342,7 +14461,7 @@
                                 </pic:cNvPicPr>
                               </pic:nvPicPr>
                               <pic:blipFill>
-                                <a:blip r:embed="rId34" cstate="none"/>
+                                <a:blip r:embed="rId36" cstate="none"/>
                                 <a:srcRect/>
                                 <a:stretch>
                                   <a:fillRect/>
@@ -14423,7 +14542,7 @@
                                 </pic:cNvPicPr>
                               </pic:nvPicPr>
                               <pic:blipFill>
-                                <a:blip r:embed="rId35" cstate="none"/>
+                                <a:blip r:embed="rId37" cstate="none"/>
                                 <a:srcRect/>
                                 <a:stretch>
                                   <a:fillRect/>
@@ -14578,7 +14697,7 @@
                                 </pic:cNvPicPr>
                               </pic:nvPicPr>
                               <pic:blipFill>
-                                <a:blip r:embed="rId36" cstate="none"/>
+                                <a:blip r:embed="rId38" cstate="none"/>
                                 <a:srcRect/>
                                 <a:stretch>
                                   <a:fillRect/>
@@ -14659,7 +14778,7 @@
                                 </pic:cNvPicPr>
                               </pic:nvPicPr>
                               <pic:blipFill>
-                                <a:blip r:embed="rId37" cstate="none"/>
+                                <a:blip r:embed="rId39" cstate="none"/>
                                 <a:srcRect/>
                                 <a:stretch>
                                   <a:fillRect/>
@@ -14765,7 +14884,7 @@
                                 </pic:cNvPicPr>
                               </pic:nvPicPr>
                               <pic:blipFill>
-                                <a:blip r:embed="rId38" cstate="none"/>
+                                <a:blip r:embed="rId40" cstate="none"/>
                                 <a:srcRect/>
                                 <a:stretch>
                                   <a:fillRect/>
@@ -14846,7 +14965,7 @@
                                 </pic:cNvPicPr>
                               </pic:nvPicPr>
                               <pic:blipFill>
-                                <a:blip r:embed="rId39" cstate="none"/>
+                                <a:blip r:embed="rId41" cstate="none"/>
                                 <a:srcRect/>
                                 <a:stretch>
                                   <a:fillRect/>
@@ -14952,7 +15071,7 @@
                                 </pic:cNvPicPr>
                               </pic:nvPicPr>
                               <pic:blipFill>
-                                <a:blip r:embed="rId40" cstate="none"/>
+                                <a:blip r:embed="rId42" cstate="none"/>
                                 <a:srcRect/>
                                 <a:stretch>
                                   <a:fillRect/>
@@ -15033,7 +15152,7 @@
                                 </pic:cNvPicPr>
                               </pic:nvPicPr>
                               <pic:blipFill>
-                                <a:blip r:embed="rId41" cstate="none"/>
+                                <a:blip r:embed="rId43" cstate="none"/>
                                 <a:srcRect/>
                                 <a:stretch>
                                   <a:fillRect/>
@@ -15139,7 +15258,7 @@
                                 </pic:cNvPicPr>
                               </pic:nvPicPr>
                               <pic:blipFill>
-                                <a:blip r:embed="rId42" cstate="none"/>
+                                <a:blip r:embed="rId44" cstate="none"/>
                                 <a:srcRect/>
                                 <a:stretch>
                                   <a:fillRect/>
@@ -15220,7 +15339,7 @@
                                 </pic:cNvPicPr>
                               </pic:nvPicPr>
                               <pic:blipFill>
-                                <a:blip r:embed="rId43" cstate="none"/>
+                                <a:blip r:embed="rId45" cstate="none"/>
                                 <a:srcRect/>
                                 <a:stretch>
                                   <a:fillRect/>
@@ -15331,7 +15450,7 @@
                                 </pic:cNvPicPr>
                               </pic:nvPicPr>
                               <pic:blipFill>
-                                <a:blip r:embed="rId44" cstate="none"/>
+                                <a:blip r:embed="rId46" cstate="none"/>
                                 <a:srcRect/>
                                 <a:stretch>
                                   <a:fillRect/>
@@ -15412,7 +15531,7 @@
                                 </pic:cNvPicPr>
                               </pic:nvPicPr>
                               <pic:blipFill>
-                                <a:blip r:embed="rId45" cstate="none"/>
+                                <a:blip r:embed="rId47" cstate="none"/>
                                 <a:srcRect/>
                                 <a:stretch>
                                   <a:fillRect/>
@@ -15518,7 +15637,7 @@
                                 </pic:cNvPicPr>
                               </pic:nvPicPr>
                               <pic:blipFill>
-                                <a:blip r:embed="rId46" cstate="none"/>
+                                <a:blip r:embed="rId48" cstate="none"/>
                                 <a:srcRect/>
                                 <a:stretch>
                                   <a:fillRect/>
@@ -15599,7 +15718,7 @@
                                 </pic:cNvPicPr>
                               </pic:nvPicPr>
                               <pic:blipFill>
-                                <a:blip r:embed="rId47" cstate="none"/>
+                                <a:blip r:embed="rId49" cstate="none"/>
                                 <a:srcRect/>
                                 <a:stretch>
                                   <a:fillRect/>
@@ -15705,7 +15824,7 @@
                                 </pic:cNvPicPr>
                               </pic:nvPicPr>
                               <pic:blipFill>
-                                <a:blip r:embed="rId48" cstate="none"/>
+                                <a:blip r:embed="rId50" cstate="none"/>
                                 <a:srcRect/>
                                 <a:stretch>
                                   <a:fillRect/>
@@ -15786,7 +15905,7 @@
                                 </pic:cNvPicPr>
                               </pic:nvPicPr>
                               <pic:blipFill>
-                                <a:blip r:embed="rId49" cstate="none"/>
+                                <a:blip r:embed="rId51" cstate="none"/>
                                 <a:srcRect/>
                                 <a:stretch>
                                   <a:fillRect/>
@@ -15892,7 +16011,7 @@
                                 </pic:cNvPicPr>
                               </pic:nvPicPr>
                               <pic:blipFill>
-                                <a:blip r:embed="rId50" cstate="none"/>
+                                <a:blip r:embed="rId52" cstate="none"/>
                                 <a:srcRect/>
                                 <a:stretch>
                                   <a:fillRect/>
@@ -15973,7 +16092,7 @@
                                 </pic:cNvPicPr>
                               </pic:nvPicPr>
                               <pic:blipFill>
-                                <a:blip r:embed="rId51" cstate="none"/>
+                                <a:blip r:embed="rId53" cstate="none"/>
                                 <a:srcRect/>
                                 <a:stretch>
                                   <a:fillRect/>
@@ -16167,7 +16286,7 @@
                                 </pic:cNvPicPr>
                               </pic:nvPicPr>
                               <pic:blipFill>
-                                <a:blip r:embed="rId52" cstate="none"/>
+                                <a:blip r:embed="rId54" cstate="none"/>
                                 <a:srcRect/>
                                 <a:stretch>
                                   <a:fillRect/>
@@ -16306,7 +16425,7 @@
                                 </pic:cNvPicPr>
                               </pic:nvPicPr>
                               <pic:blipFill>
-                                <a:blip r:embed="rId53" cstate="none"/>
+                                <a:blip r:embed="rId55" cstate="none"/>
                                 <a:srcRect/>
                                 <a:stretch>
                                   <a:fillRect/>
@@ -16413,7 +16532,7 @@
                                 </pic:cNvPicPr>
                               </pic:nvPicPr>
                               <pic:blipFill>
-                                <a:blip r:embed="rId54" cstate="none"/>
+                                <a:blip r:embed="rId56" cstate="none"/>
                                 <a:srcRect/>
                                 <a:stretch>
                                   <a:fillRect/>
@@ -16552,7 +16671,7 @@
                                 </pic:cNvPicPr>
                               </pic:nvPicPr>
                               <pic:blipFill>
-                                <a:blip r:embed="rId55" cstate="none"/>
+                                <a:blip r:embed="rId57" cstate="none"/>
                                 <a:srcRect/>
                                 <a:stretch>
                                   <a:fillRect/>
@@ -16689,7 +16808,7 @@
                                 </pic:cNvPicPr>
                               </pic:nvPicPr>
                               <pic:blipFill>
-                                <a:blip r:embed="rId56" cstate="none"/>
+                                <a:blip r:embed="rId58" cstate="none"/>
                                 <a:srcRect/>
                                 <a:stretch>
                                   <a:fillRect/>
@@ -16828,7 +16947,7 @@
                                 </pic:cNvPicPr>
                               </pic:nvPicPr>
                               <pic:blipFill>
-                                <a:blip r:embed="rId57" cstate="none"/>
+                                <a:blip r:embed="rId59" cstate="none"/>
                                 <a:srcRect/>
                                 <a:stretch>
                                   <a:fillRect/>
@@ -16935,7 +17054,7 @@
                                 </pic:cNvPicPr>
                               </pic:nvPicPr>
                               <pic:blipFill>
-                                <a:blip r:embed="rId58" cstate="none"/>
+                                <a:blip r:embed="rId60" cstate="none"/>
                                 <a:srcRect/>
                                 <a:stretch>
                                   <a:fillRect/>
@@ -17074,7 +17193,7 @@
                                 </pic:cNvPicPr>
                               </pic:nvPicPr>
                               <pic:blipFill>
-                                <a:blip r:embed="rId59" cstate="none"/>
+                                <a:blip r:embed="rId61" cstate="none"/>
                                 <a:srcRect/>
                                 <a:stretch>
                                   <a:fillRect/>
@@ -17211,7 +17330,7 @@
                                 </pic:cNvPicPr>
                               </pic:nvPicPr>
                               <pic:blipFill>
-                                <a:blip r:embed="rId60" cstate="none"/>
+                                <a:blip r:embed="rId62" cstate="none"/>
                                 <a:srcRect/>
                                 <a:stretch>
                                   <a:fillRect/>
@@ -17350,7 +17469,7 @@
                                 </pic:cNvPicPr>
                               </pic:nvPicPr>
                               <pic:blipFill>
-                                <a:blip r:embed="rId61" cstate="none"/>
+                                <a:blip r:embed="rId63" cstate="none"/>
                                 <a:srcRect/>
                                 <a:stretch>
                                   <a:fillRect/>
@@ -17457,7 +17576,7 @@
                                 </pic:cNvPicPr>
                               </pic:nvPicPr>
                               <pic:blipFill>
-                                <a:blip r:embed="rId62" cstate="none"/>
+                                <a:blip r:embed="rId64" cstate="none"/>
                                 <a:srcRect/>
                                 <a:stretch>
                                   <a:fillRect/>
@@ -17596,7 +17715,7 @@
                                 </pic:cNvPicPr>
                               </pic:nvPicPr>
                               <pic:blipFill>
-                                <a:blip r:embed="rId63" cstate="none"/>
+                                <a:blip r:embed="rId65" cstate="none"/>
                                 <a:srcRect/>
                                 <a:stretch>
                                   <a:fillRect/>
@@ -17733,7 +17852,7 @@
                                 </pic:cNvPicPr>
                               </pic:nvPicPr>
                               <pic:blipFill>
-                                <a:blip r:embed="rId64" cstate="none"/>
+                                <a:blip r:embed="rId66" cstate="none"/>
                                 <a:srcRect/>
                                 <a:stretch>
                                   <a:fillRect/>
@@ -17872,7 +17991,7 @@
                                 </pic:cNvPicPr>
                               </pic:nvPicPr>
                               <pic:blipFill>
-                                <a:blip r:embed="rId65" cstate="none"/>
+                                <a:blip r:embed="rId67" cstate="none"/>
                                 <a:srcRect/>
                                 <a:stretch>
                                   <a:fillRect/>
@@ -17979,7 +18098,7 @@
                                 </pic:cNvPicPr>
                               </pic:nvPicPr>
                               <pic:blipFill>
-                                <a:blip r:embed="rId66" cstate="none"/>
+                                <a:blip r:embed="rId68" cstate="none"/>
                                 <a:srcRect/>
                                 <a:stretch>
                                   <a:fillRect/>
@@ -18118,7 +18237,7 @@
                                 </pic:cNvPicPr>
                               </pic:nvPicPr>
                               <pic:blipFill>
-                                <a:blip r:embed="rId67" cstate="none"/>
+                                <a:blip r:embed="rId69" cstate="none"/>
                                 <a:srcRect/>
                                 <a:stretch>
                                   <a:fillRect/>
@@ -18255,7 +18374,7 @@
                                 </pic:cNvPicPr>
                               </pic:nvPicPr>
                               <pic:blipFill>
-                                <a:blip r:embed="rId68" cstate="none"/>
+                                <a:blip r:embed="rId70" cstate="none"/>
                                 <a:srcRect/>
                                 <a:stretch>
                                   <a:fillRect/>
@@ -18394,7 +18513,7 @@
                                 </pic:cNvPicPr>
                               </pic:nvPicPr>
                               <pic:blipFill>
-                                <a:blip r:embed="rId69" cstate="none"/>
+                                <a:blip r:embed="rId71" cstate="none"/>
                                 <a:srcRect/>
                                 <a:stretch>
                                   <a:fillRect/>
@@ -18501,7 +18620,7 @@
                                 </pic:cNvPicPr>
                               </pic:nvPicPr>
                               <pic:blipFill>
-                                <a:blip r:embed="rId70" cstate="none"/>
+                                <a:blip r:embed="rId72" cstate="none"/>
                                 <a:srcRect/>
                                 <a:stretch>
                                   <a:fillRect/>
@@ -18640,7 +18759,7 @@
                                 </pic:cNvPicPr>
                               </pic:nvPicPr>
                               <pic:blipFill>
-                                <a:blip r:embed="rId71" cstate="none"/>
+                                <a:blip r:embed="rId73" cstate="none"/>
                                 <a:srcRect/>
                                 <a:stretch>
                                   <a:fillRect/>
@@ -18777,7 +18896,7 @@
                                 </pic:cNvPicPr>
                               </pic:nvPicPr>
                               <pic:blipFill>
-                                <a:blip r:embed="rId72" cstate="none"/>
+                                <a:blip r:embed="rId74" cstate="none"/>
                                 <a:srcRect/>
                                 <a:stretch>
                                   <a:fillRect/>
@@ -18916,7 +19035,7 @@
                                 </pic:cNvPicPr>
                               </pic:nvPicPr>
                               <pic:blipFill>
-                                <a:blip r:embed="rId73" cstate="none"/>
+                                <a:blip r:embed="rId75" cstate="none"/>
                                 <a:srcRect/>
                                 <a:stretch>
                                   <a:fillRect/>
@@ -19023,7 +19142,7 @@
                                 </pic:cNvPicPr>
                               </pic:nvPicPr>
                               <pic:blipFill>
-                                <a:blip r:embed="rId74" cstate="none"/>
+                                <a:blip r:embed="rId76" cstate="none"/>
                                 <a:srcRect/>
                                 <a:stretch>
                                   <a:fillRect/>
@@ -19162,7 +19281,7 @@
                                 </pic:cNvPicPr>
                               </pic:nvPicPr>
                               <pic:blipFill>
-                                <a:blip r:embed="rId75" cstate="none"/>
+                                <a:blip r:embed="rId77" cstate="none"/>
                                 <a:srcRect/>
                                 <a:stretch>
                                   <a:fillRect/>
@@ -19299,7 +19418,7 @@
                                 </pic:cNvPicPr>
                               </pic:nvPicPr>
                               <pic:blipFill>
-                                <a:blip r:embed="rId76" cstate="none"/>
+                                <a:blip r:embed="rId78" cstate="none"/>
                                 <a:srcRect/>
                                 <a:stretch>
                                   <a:fillRect/>
@@ -19438,7 +19557,7 @@
                                 </pic:cNvPicPr>
                               </pic:nvPicPr>
                               <pic:blipFill>
-                                <a:blip r:embed="rId77" cstate="none"/>
+                                <a:blip r:embed="rId79" cstate="none"/>
                                 <a:srcRect/>
                                 <a:stretch>
                                   <a:fillRect/>
@@ -19545,7 +19664,7 @@
                                 </pic:cNvPicPr>
                               </pic:nvPicPr>
                               <pic:blipFill>
-                                <a:blip r:embed="rId78" cstate="none"/>
+                                <a:blip r:embed="rId80" cstate="none"/>
                                 <a:srcRect/>
                                 <a:stretch>
                                   <a:fillRect/>
@@ -19684,7 +19803,7 @@
                                 </pic:cNvPicPr>
                               </pic:nvPicPr>
                               <pic:blipFill>
-                                <a:blip r:embed="rId79" cstate="none"/>
+                                <a:blip r:embed="rId81" cstate="none"/>
                                 <a:srcRect/>
                                 <a:stretch>
                                   <a:fillRect/>
@@ -19821,7 +19940,7 @@
                                 </pic:cNvPicPr>
                               </pic:nvPicPr>
                               <pic:blipFill>
-                                <a:blip r:embed="rId80" cstate="none"/>
+                                <a:blip r:embed="rId82" cstate="none"/>
                                 <a:srcRect/>
                                 <a:stretch>
                                   <a:fillRect/>
@@ -19985,7 +20104,7 @@
                                 </pic:cNvPicPr>
                               </pic:nvPicPr>
                               <pic:blipFill>
-                                <a:blip r:embed="rId81" cstate="none"/>
+                                <a:blip r:embed="rId83" cstate="none"/>
                                 <a:srcRect/>
                                 <a:stretch>
                                   <a:fillRect/>
@@ -20092,7 +20211,7 @@
                                 </pic:cNvPicPr>
                               </pic:nvPicPr>
                               <pic:blipFill>
-                                <a:blip r:embed="rId82" cstate="none"/>
+                                <a:blip r:embed="rId84" cstate="none"/>
                                 <a:srcRect/>
                                 <a:stretch>
                                   <a:fillRect/>
@@ -20256,7 +20375,7 @@
                                 </pic:cNvPicPr>
                               </pic:nvPicPr>
                               <pic:blipFill>
-                                <a:blip r:embed="rId83" cstate="none"/>
+                                <a:blip r:embed="rId85" cstate="none"/>
                                 <a:srcRect/>
                                 <a:stretch>
                                   <a:fillRect/>
@@ -20393,7 +20512,7 @@
                                 </pic:cNvPicPr>
                               </pic:nvPicPr>
                               <pic:blipFill>
-                                <a:blip r:embed="rId84" cstate="none"/>
+                                <a:blip r:embed="rId86" cstate="none"/>
                                 <a:srcRect/>
                                 <a:stretch>
                                   <a:fillRect/>
@@ -20532,7 +20651,7 @@
                                 </pic:cNvPicPr>
                               </pic:nvPicPr>
                               <pic:blipFill>
-                                <a:blip r:embed="rId85" cstate="none"/>
+                                <a:blip r:embed="rId87" cstate="none"/>
                                 <a:srcRect/>
                                 <a:stretch>
                                   <a:fillRect/>
@@ -20639,7 +20758,7 @@
                                 </pic:cNvPicPr>
                               </pic:nvPicPr>
                               <pic:blipFill>
-                                <a:blip r:embed="rId86" cstate="none"/>
+                                <a:blip r:embed="rId88" cstate="none"/>
                                 <a:srcRect/>
                                 <a:stretch>
                                   <a:fillRect/>
@@ -20778,7 +20897,7 @@
                                 </pic:cNvPicPr>
                               </pic:nvPicPr>
                               <pic:blipFill>
-                                <a:blip r:embed="rId87" cstate="none"/>
+                                <a:blip r:embed="rId89" cstate="none"/>
                                 <a:srcRect/>
                                 <a:stretch>
                                   <a:fillRect/>
@@ -20915,7 +21034,7 @@
                                 </pic:cNvPicPr>
                               </pic:nvPicPr>
                               <pic:blipFill>
-                                <a:blip r:embed="rId88" cstate="none"/>
+                                <a:blip r:embed="rId90" cstate="none"/>
                                 <a:srcRect/>
                                 <a:stretch>
                                   <a:fillRect/>
@@ -21054,7 +21173,7 @@
                                 </pic:cNvPicPr>
                               </pic:nvPicPr>
                               <pic:blipFill>
-                                <a:blip r:embed="rId89" cstate="none"/>
+                                <a:blip r:embed="rId91" cstate="none"/>
                                 <a:srcRect/>
                                 <a:stretch>
                                   <a:fillRect/>
@@ -21161,7 +21280,7 @@
                                 </pic:cNvPicPr>
                               </pic:nvPicPr>
                               <pic:blipFill>
-                                <a:blip r:embed="rId90" cstate="none"/>
+                                <a:blip r:embed="rId92" cstate="none"/>
                                 <a:srcRect/>
                                 <a:stretch>
                                   <a:fillRect/>
@@ -21300,7 +21419,7 @@
                                 </pic:cNvPicPr>
                               </pic:nvPicPr>
                               <pic:blipFill>
-                                <a:blip r:embed="rId91" cstate="none"/>
+                                <a:blip r:embed="rId93" cstate="none"/>
                                 <a:srcRect/>
                                 <a:stretch>
                                   <a:fillRect/>
@@ -21437,7 +21556,7 @@
                                 </pic:cNvPicPr>
                               </pic:nvPicPr>
                               <pic:blipFill>
-                                <a:blip r:embed="rId92" cstate="none"/>
+                                <a:blip r:embed="rId94" cstate="none"/>
                                 <a:srcRect/>
                                 <a:stretch>
                                   <a:fillRect/>
@@ -21576,7 +21695,7 @@
                                 </pic:cNvPicPr>
                               </pic:nvPicPr>
                               <pic:blipFill>
-                                <a:blip r:embed="rId93" cstate="none"/>
+                                <a:blip r:embed="rId95" cstate="none"/>
                                 <a:srcRect/>
                                 <a:stretch>
                                   <a:fillRect/>
@@ -21683,7 +21802,7 @@
                                 </pic:cNvPicPr>
                               </pic:nvPicPr>
                               <pic:blipFill>
-                                <a:blip r:embed="rId94" cstate="none"/>
+                                <a:blip r:embed="rId96" cstate="none"/>
                                 <a:srcRect/>
                                 <a:stretch>
                                   <a:fillRect/>
@@ -21822,7 +21941,7 @@
                                 </pic:cNvPicPr>
                               </pic:nvPicPr>
                               <pic:blipFill>
-                                <a:blip r:embed="rId95" cstate="none"/>
+                                <a:blip r:embed="rId97" cstate="none"/>
                                 <a:srcRect/>
                                 <a:stretch>
                                   <a:fillRect/>
@@ -21959,7 +22078,7 @@
                                 </pic:cNvPicPr>
                               </pic:nvPicPr>
                               <pic:blipFill>
-                                <a:blip r:embed="rId96" cstate="none"/>
+                                <a:blip r:embed="rId98" cstate="none"/>
                                 <a:srcRect/>
                                 <a:stretch>
                                   <a:fillRect/>
@@ -22098,7 +22217,7 @@
                                 </pic:cNvPicPr>
                               </pic:nvPicPr>
                               <pic:blipFill>
-                                <a:blip r:embed="rId97" cstate="none"/>
+                                <a:blip r:embed="rId99" cstate="none"/>
                                 <a:srcRect/>
                                 <a:stretch>
                                   <a:fillRect/>
@@ -22205,7 +22324,7 @@
                                 </pic:cNvPicPr>
                               </pic:nvPicPr>
                               <pic:blipFill>
-                                <a:blip r:embed="rId98" cstate="none"/>
+                                <a:blip r:embed="rId100" cstate="none"/>
                                 <a:srcRect/>
                                 <a:stretch>
                                   <a:fillRect/>
@@ -22369,7 +22488,7 @@
                                 </pic:cNvPicPr>
                               </pic:nvPicPr>
                               <pic:blipFill>
-                                <a:blip r:embed="rId99" cstate="none"/>
+                                <a:blip r:embed="rId101" cstate="none"/>
                                 <a:srcRect/>
                                 <a:stretch>
                                   <a:fillRect/>
@@ -22506,7 +22625,7 @@
                                 </pic:cNvPicPr>
                               </pic:nvPicPr>
                               <pic:blipFill>
-                                <a:blip r:embed="rId100" cstate="none"/>
+                                <a:blip r:embed="rId102" cstate="none"/>
                                 <a:srcRect/>
                                 <a:stretch>
                                   <a:fillRect/>
@@ -22670,7 +22789,7 @@
                                 </pic:cNvPicPr>
                               </pic:nvPicPr>
                               <pic:blipFill>
-                                <a:blip r:embed="rId101" cstate="none"/>
+                                <a:blip r:embed="rId103" cstate="none"/>
                                 <a:srcRect/>
                                 <a:stretch>
                                   <a:fillRect/>
@@ -22777,7 +22896,7 @@
                                 </pic:cNvPicPr>
                               </pic:nvPicPr>
                               <pic:blipFill>
-                                <a:blip r:embed="rId102" cstate="none"/>
+                                <a:blip r:embed="rId104" cstate="none"/>
                                 <a:srcRect/>
                                 <a:stretch>
                                   <a:fillRect/>
@@ -22916,7 +23035,7 @@
                                 </pic:cNvPicPr>
                               </pic:nvPicPr>
                               <pic:blipFill>
-                                <a:blip r:embed="rId103" cstate="none"/>
+                                <a:blip r:embed="rId105" cstate="none"/>
                                 <a:srcRect/>
                                 <a:stretch>
                                   <a:fillRect/>
@@ -23053,7 +23172,7 @@
                                 </pic:cNvPicPr>
                               </pic:nvPicPr>
                               <pic:blipFill>
-                                <a:blip r:embed="rId104" cstate="none"/>
+                                <a:blip r:embed="rId106" cstate="none"/>
                                 <a:srcRect/>
                                 <a:stretch>
                                   <a:fillRect/>
@@ -23192,7 +23311,7 @@
                                 </pic:cNvPicPr>
                               </pic:nvPicPr>
                               <pic:blipFill>
-                                <a:blip r:embed="rId105" cstate="none"/>
+                                <a:blip r:embed="rId107" cstate="none"/>
                                 <a:srcRect/>
                                 <a:stretch>
                                   <a:fillRect/>
@@ -23299,7 +23418,7 @@
                                 </pic:cNvPicPr>
                               </pic:nvPicPr>
                               <pic:blipFill>
-                                <a:blip r:embed="rId106" cstate="none"/>
+                                <a:blip r:embed="rId108" cstate="none"/>
                                 <a:srcRect/>
                                 <a:stretch>
                                   <a:fillRect/>
@@ -23438,7 +23557,7 @@
                                 </pic:cNvPicPr>
                               </pic:nvPicPr>
                               <pic:blipFill>
-                                <a:blip r:embed="rId107" cstate="none"/>
+                                <a:blip r:embed="rId109" cstate="none"/>
                                 <a:srcRect/>
                                 <a:stretch>
                                   <a:fillRect/>
@@ -23575,7 +23694,7 @@
                                 </pic:cNvPicPr>
                               </pic:nvPicPr>
                               <pic:blipFill>
-                                <a:blip r:embed="rId108" cstate="none"/>
+                                <a:blip r:embed="rId110" cstate="none"/>
                                 <a:srcRect/>
                                 <a:stretch>
                                   <a:fillRect/>
@@ -23714,7 +23833,7 @@
                                 </pic:cNvPicPr>
                               </pic:nvPicPr>
                               <pic:blipFill>
-                                <a:blip r:embed="rId109" cstate="none"/>
+                                <a:blip r:embed="rId111" cstate="none"/>
                                 <a:srcRect/>
                                 <a:stretch>
                                   <a:fillRect/>
@@ -23821,7 +23940,7 @@
                                 </pic:cNvPicPr>
                               </pic:nvPicPr>
                               <pic:blipFill>
-                                <a:blip r:embed="rId110" cstate="none"/>
+                                <a:blip r:embed="rId112" cstate="none"/>
                                 <a:srcRect/>
                                 <a:stretch>
                                   <a:fillRect/>
@@ -23960,7 +24079,7 @@
                                 </pic:cNvPicPr>
                               </pic:nvPicPr>
                               <pic:blipFill>
-                                <a:blip r:embed="rId111" cstate="none"/>
+                                <a:blip r:embed="rId113" cstate="none"/>
                                 <a:srcRect/>
                                 <a:stretch>
                                   <a:fillRect/>
@@ -24097,7 +24216,7 @@
                                 </pic:cNvPicPr>
                               </pic:nvPicPr>
                               <pic:blipFill>
-                                <a:blip r:embed="rId112" cstate="none"/>
+                                <a:blip r:embed="rId114" cstate="none"/>
                                 <a:srcRect/>
                                 <a:stretch>
                                   <a:fillRect/>
@@ -24236,7 +24355,7 @@
                                 </pic:cNvPicPr>
                               </pic:nvPicPr>
                               <pic:blipFill>
-                                <a:blip r:embed="rId113" cstate="none"/>
+                                <a:blip r:embed="rId115" cstate="none"/>
                                 <a:srcRect/>
                                 <a:stretch>
                                   <a:fillRect/>
@@ -24343,7 +24462,7 @@
                                 </pic:cNvPicPr>
                               </pic:nvPicPr>
                               <pic:blipFill>
-                                <a:blip r:embed="rId114" cstate="none"/>
+                                <a:blip r:embed="rId116" cstate="none"/>
                                 <a:srcRect/>
                                 <a:stretch>
                                   <a:fillRect/>
@@ -24482,7 +24601,7 @@
                                 </pic:cNvPicPr>
                               </pic:nvPicPr>
                               <pic:blipFill>
-                                <a:blip r:embed="rId115" cstate="none"/>
+                                <a:blip r:embed="rId117" cstate="none"/>
                                 <a:srcRect/>
                                 <a:stretch>
                                   <a:fillRect/>
@@ -24619,7 +24738,7 @@
                                 </pic:cNvPicPr>
                               </pic:nvPicPr>
                               <pic:blipFill>
-                                <a:blip r:embed="rId116" cstate="none"/>
+                                <a:blip r:embed="rId118" cstate="none"/>
                                 <a:srcRect/>
                                 <a:stretch>
                                   <a:fillRect/>
@@ -24758,7 +24877,7 @@
                                 </pic:cNvPicPr>
                               </pic:nvPicPr>
                               <pic:blipFill>
-                                <a:blip r:embed="rId117" cstate="none"/>
+                                <a:blip r:embed="rId119" cstate="none"/>
                                 <a:srcRect/>
                                 <a:stretch>
                                   <a:fillRect/>
@@ -24865,7 +24984,7 @@
                                 </pic:cNvPicPr>
                               </pic:nvPicPr>
                               <pic:blipFill>
-                                <a:blip r:embed="rId118" cstate="none"/>
+                                <a:blip r:embed="rId120" cstate="none"/>
                                 <a:srcRect/>
                                 <a:stretch>
                                   <a:fillRect/>
@@ -25004,7 +25123,7 @@
                                 </pic:cNvPicPr>
                               </pic:nvPicPr>
                               <pic:blipFill>
-                                <a:blip r:embed="rId119" cstate="none"/>
+                                <a:blip r:embed="rId121" cstate="none"/>
                                 <a:srcRect/>
                                 <a:stretch>
                                   <a:fillRect/>
@@ -25141,7 +25260,7 @@
                                 </pic:cNvPicPr>
                               </pic:nvPicPr>
                               <pic:blipFill>
-                                <a:blip r:embed="rId120" cstate="none"/>
+                                <a:blip r:embed="rId122" cstate="none"/>
                                 <a:srcRect/>
                                 <a:stretch>
                                   <a:fillRect/>
@@ -25280,7 +25399,7 @@
                                 </pic:cNvPicPr>
                               </pic:nvPicPr>
                               <pic:blipFill>
-                                <a:blip r:embed="rId121" cstate="none"/>
+                                <a:blip r:embed="rId123" cstate="none"/>
                                 <a:srcRect/>
                                 <a:stretch>
                                   <a:fillRect/>
@@ -25387,7 +25506,7 @@
                                 </pic:cNvPicPr>
                               </pic:nvPicPr>
                               <pic:blipFill>
-                                <a:blip r:embed="rId122" cstate="none"/>
+                                <a:blip r:embed="rId124" cstate="none"/>
                                 <a:srcRect/>
                                 <a:stretch>
                                   <a:fillRect/>
@@ -25551,7 +25670,7 @@
                                 </pic:cNvPicPr>
                               </pic:nvPicPr>
                               <pic:blipFill>
-                                <a:blip r:embed="rId123" cstate="none"/>
+                                <a:blip r:embed="rId125" cstate="none"/>
                                 <a:srcRect/>
                                 <a:stretch>
                                   <a:fillRect/>
@@ -25688,7 +25807,7 @@
                                 </pic:cNvPicPr>
                               </pic:nvPicPr>
                               <pic:blipFill>
-                                <a:blip r:embed="rId124" cstate="none"/>
+                                <a:blip r:embed="rId126" cstate="none"/>
                                 <a:srcRect/>
                                 <a:stretch>
                                   <a:fillRect/>
@@ -25827,7 +25946,7 @@
                                 </pic:cNvPicPr>
                               </pic:nvPicPr>
                               <pic:blipFill>
-                                <a:blip r:embed="rId125" cstate="none"/>
+                                <a:blip r:embed="rId127" cstate="none"/>
                                 <a:srcRect/>
                                 <a:stretch>
                                   <a:fillRect/>
@@ -25934,7 +26053,7 @@
                                 </pic:cNvPicPr>
                               </pic:nvPicPr>
                               <pic:blipFill>
-                                <a:blip r:embed="rId126" cstate="none"/>
+                                <a:blip r:embed="rId128" cstate="none"/>
                                 <a:srcRect/>
                                 <a:stretch>
                                   <a:fillRect/>
@@ -26073,7 +26192,7 @@
                                 </pic:cNvPicPr>
                               </pic:nvPicPr>
                               <pic:blipFill>
-                                <a:blip r:embed="rId127" cstate="none"/>
+                                <a:blip r:embed="rId129" cstate="none"/>
                                 <a:srcRect/>
                                 <a:stretch>
                                   <a:fillRect/>
@@ -26210,7 +26329,7 @@
                                 </pic:cNvPicPr>
                               </pic:nvPicPr>
                               <pic:blipFill>
-                                <a:blip r:embed="rId128" cstate="none"/>
+                                <a:blip r:embed="rId130" cstate="none"/>
                                 <a:srcRect/>
                                 <a:stretch>
                                   <a:fillRect/>
@@ -26349,7 +26468,7 @@
                                 </pic:cNvPicPr>
                               </pic:nvPicPr>
                               <pic:blipFill>
-                                <a:blip r:embed="rId129" cstate="none"/>
+                                <a:blip r:embed="rId131" cstate="none"/>
                                 <a:srcRect/>
                                 <a:stretch>
                                   <a:fillRect/>
@@ -26456,7 +26575,7 @@
                                 </pic:cNvPicPr>
                               </pic:nvPicPr>
                               <pic:blipFill>
-                                <a:blip r:embed="rId130" cstate="none"/>
+                                <a:blip r:embed="rId132" cstate="none"/>
                                 <a:srcRect/>
                                 <a:stretch>
                                   <a:fillRect/>
@@ -26595,7 +26714,7 @@
                                 </pic:cNvPicPr>
                               </pic:nvPicPr>
                               <pic:blipFill>
-                                <a:blip r:embed="rId131" cstate="none"/>
+                                <a:blip r:embed="rId133" cstate="none"/>
                                 <a:srcRect/>
                                 <a:stretch>
                                   <a:fillRect/>
@@ -26627,14 +26746,11 @@
     <w:p>
       <w:pPr>
         <w:sectPr>
-          <w:headerReference w:type="default" r:id="rId7"/>
-          <w:headerReference w:type="first" r:id="rId8"/>
-          <w:footerReference w:type="default" r:id="rId9"/>
-          <w:footerReference w:type="first" r:id="rId10"/>
+          <w:headerReference w:type="default" r:id="rId11"/>
+          <w:footerReference w:type="default" r:id="rId12"/>
           <w:pgSz w:w="12240" w:h="15840" w:orient="portrait"/>
           <w:pgMar w:top="1080" w:right="1080" w:bottom="1080" w:left="1080" w:header="708" w:footer="708" w:gutter="0"/>
           <w:pgNumType/>
-          <w:titlePg/>
           <w:docGrid w:linePitch="360"/>
         </w:sectPr>
       </w:pPr>
@@ -26717,7 +26833,7 @@
                     </pic:cNvPicPr>
                   </pic:nvPicPr>
                   <pic:blipFill>
-                    <a:blip r:embed="rId13" cstate="none"/>
+                    <a:blip r:embed="rId15" cstate="none"/>
                     <a:srcRect/>
                     <a:stretch>
                       <a:fillRect/>
@@ -26757,8 +26873,8 @@
       </w:r>
     </w:p>
     <w:sectPr>
-      <w:headerReference w:type="default" r:id="rId11"/>
-      <w:footerReference w:type="default" r:id="rId12"/>
+      <w:headerReference w:type="default" r:id="rId13"/>
+      <w:footerReference w:type="default" r:id="rId14"/>
       <w:pgSz w:w="12240" w:h="15840" w:orient="portrait"/>
       <w:pgMar w:top="1080" w:right="1080" w:bottom="1080" w:left="1080" w:header="708" w:footer="708" w:gutter="0"/>
       <w:pgNumType/>
@@ -26839,6 +26955,16 @@
 </w:ftr>
 </file>
 
+<file path=word/footer4.xml><?xml version="1.0" encoding="utf-8"?>
+<w:ftr xmlns:wpc="http://schemas.microsoft.com/office/word/2010/wordprocessingCanvas" xmlns:mc="http://schemas.openxmlformats.org/markup-compatibility/2006" xmlns:o="urn:schemas-microsoft-com:office:office" xmlns:r="http://schemas.openxmlformats.org/officeDocument/2006/relationships" xmlns:m="http://schemas.openxmlformats.org/officeDocument/2006/math" xmlns:v="urn:schemas-microsoft-com:vml" xmlns:wp14="http://schemas.microsoft.com/office/word/2010/wordprocessingDrawing" xmlns:wp="http://schemas.openxmlformats.org/drawingml/2006/wordprocessingDrawing" xmlns:w10="urn:schemas-microsoft-com:office:word" xmlns:w="http://schemas.openxmlformats.org/wordprocessingml/2006/main" xmlns:w14="http://schemas.microsoft.com/office/word/2010/wordml" xmlns:w15="http://schemas.microsoft.com/office/word/2012/wordml" xmlns:wpg="http://schemas.microsoft.com/office/word/2010/wordprocessingGroup" xmlns:wpi="http://schemas.microsoft.com/office/word/2010/wordprocessingInk" xmlns:wne="http://schemas.microsoft.com/office/word/2006/wordml" xmlns:wps="http://schemas.microsoft.com/office/word/2010/wordprocessingShape">
+  <w:p>
+    <w:r>
+      <w:t xml:space="preserve"/>
+    </w:r>
+  </w:p>
+</w:ftr>
+</file>
+
 <file path=word/footnotes.xml><?xml version="1.0" encoding="utf-8"?>
 <w:footnotes xmlns:wpc="http://schemas.microsoft.com/office/word/2010/wordprocessingCanvas" xmlns:mc="http://schemas.openxmlformats.org/markup-compatibility/2006" xmlns:o="urn:schemas-microsoft-com:office:office" xmlns:r="http://schemas.openxmlformats.org/officeDocument/2006/relationships" xmlns:m="http://schemas.openxmlformats.org/officeDocument/2006/math" xmlns:v="urn:schemas-microsoft-com:vml" xmlns:wp14="http://schemas.microsoft.com/office/word/2010/wordprocessingDrawing" xmlns:wp="http://schemas.openxmlformats.org/drawingml/2006/wordprocessingDrawing" xmlns:w10="urn:schemas-microsoft-com:office:word" xmlns:w="http://schemas.openxmlformats.org/wordprocessingml/2006/main" xmlns:w14="http://schemas.microsoft.com/office/word/2010/wordml" xmlns:w15="http://schemas.microsoft.com/office/word/2012/wordml" xmlns:wpg="http://schemas.microsoft.com/office/word/2010/wordprocessingGroup" xmlns:wpi="http://schemas.microsoft.com/office/word/2010/wordprocessingInk" xmlns:wne="http://schemas.microsoft.com/office/word/2006/wordml" xmlns:wps="http://schemas.microsoft.com/office/word/2010/wordprocessingShape" mc:Ignorable="w14 w15 wp14">
   <w:footnote w:type="separator" w:id="-1">
@@ -26879,6 +27005,26 @@
 <file path=word/header1.xml><?xml version="1.0" encoding="utf-8"?>
 <w:hdr xmlns:wpc="http://schemas.microsoft.com/office/word/2010/wordprocessingCanvas" xmlns:mc="http://schemas.openxmlformats.org/markup-compatibility/2006" xmlns:o="urn:schemas-microsoft-com:office:office" xmlns:r="http://schemas.openxmlformats.org/officeDocument/2006/relationships" xmlns:m="http://schemas.openxmlformats.org/officeDocument/2006/math" xmlns:v="urn:schemas-microsoft-com:vml" xmlns:wp14="http://schemas.microsoft.com/office/word/2010/wordprocessingDrawing" xmlns:wp="http://schemas.openxmlformats.org/drawingml/2006/wordprocessingDrawing" xmlns:w10="urn:schemas-microsoft-com:office:word" xmlns:w="http://schemas.openxmlformats.org/wordprocessingml/2006/main" xmlns:w14="http://schemas.microsoft.com/office/word/2010/wordml" xmlns:w15="http://schemas.microsoft.com/office/word/2012/wordml" xmlns:wpg="http://schemas.microsoft.com/office/word/2010/wordprocessingGroup" xmlns:wpi="http://schemas.microsoft.com/office/word/2010/wordprocessingInk" xmlns:wne="http://schemas.microsoft.com/office/word/2006/wordml" xmlns:wps="http://schemas.microsoft.com/office/word/2010/wordprocessingShape" xmlns:cx="http://schemas.microsoft.com/office/drawing/2014/chartex" xmlns:cx1="http://schemas.microsoft.com/office/drawing/2015/9/8/chartex" xmlns:cx2="http://schemas.microsoft.com/office/drawing/2015/10/21/chartex" xmlns:cx3="http://schemas.microsoft.com/office/drawing/2016/5/9/chartex" xmlns:cx4="http://schemas.microsoft.com/office/drawing/2016/5/10/chartex" xmlns:cx5="http://schemas.microsoft.com/office/drawing/2016/5/11/chartex" xmlns:cx6="http://schemas.microsoft.com/office/drawing/2016/5/12/chartex" xmlns:cx7="http://schemas.microsoft.com/office/drawing/2016/5/13/chartex" xmlns:cx8="http://schemas.microsoft.com/office/drawing/2016/5/14/chartex" xmlns:w16cid="http://schemas.microsoft.com/office/word/2016/wordml/cid" xmlns:w16se="http://schemas.microsoft.com/office/word/2015/wordml/symex">
   <w:p>
+    <w:r>
+      <w:t xml:space="preserve"/>
+    </w:r>
+  </w:p>
+</w:hdr>
+</file>
+
+<file path=word/header2.xml><?xml version="1.0" encoding="utf-8"?>
+<w:hdr xmlns:wpc="http://schemas.microsoft.com/office/word/2010/wordprocessingCanvas" xmlns:mc="http://schemas.openxmlformats.org/markup-compatibility/2006" xmlns:o="urn:schemas-microsoft-com:office:office" xmlns:r="http://schemas.openxmlformats.org/officeDocument/2006/relationships" xmlns:m="http://schemas.openxmlformats.org/officeDocument/2006/math" xmlns:v="urn:schemas-microsoft-com:vml" xmlns:wp14="http://schemas.microsoft.com/office/word/2010/wordprocessingDrawing" xmlns:wp="http://schemas.openxmlformats.org/drawingml/2006/wordprocessingDrawing" xmlns:w10="urn:schemas-microsoft-com:office:word" xmlns:w="http://schemas.openxmlformats.org/wordprocessingml/2006/main" xmlns:w14="http://schemas.microsoft.com/office/word/2010/wordml" xmlns:w15="http://schemas.microsoft.com/office/word/2012/wordml" xmlns:wpg="http://schemas.microsoft.com/office/word/2010/wordprocessingGroup" xmlns:wpi="http://schemas.microsoft.com/office/word/2010/wordprocessingInk" xmlns:wne="http://schemas.microsoft.com/office/word/2006/wordml" xmlns:wps="http://schemas.microsoft.com/office/word/2010/wordprocessingShape" xmlns:cx="http://schemas.microsoft.com/office/drawing/2014/chartex" xmlns:cx1="http://schemas.microsoft.com/office/drawing/2015/9/8/chartex" xmlns:cx2="http://schemas.microsoft.com/office/drawing/2015/10/21/chartex" xmlns:cx3="http://schemas.microsoft.com/office/drawing/2016/5/9/chartex" xmlns:cx4="http://schemas.microsoft.com/office/drawing/2016/5/10/chartex" xmlns:cx5="http://schemas.microsoft.com/office/drawing/2016/5/11/chartex" xmlns:cx6="http://schemas.microsoft.com/office/drawing/2016/5/12/chartex" xmlns:cx7="http://schemas.microsoft.com/office/drawing/2016/5/13/chartex" xmlns:cx8="http://schemas.microsoft.com/office/drawing/2016/5/14/chartex" xmlns:w16cid="http://schemas.microsoft.com/office/word/2016/wordml/cid" xmlns:w16se="http://schemas.microsoft.com/office/word/2015/wordml/symex">
+  <w:p>
+    <w:r>
+      <w:t xml:space="preserve"/>
+    </w:r>
+  </w:p>
+</w:hdr>
+</file>
+
+<file path=word/header3.xml><?xml version="1.0" encoding="utf-8"?>
+<w:hdr xmlns:wpc="http://schemas.microsoft.com/office/word/2010/wordprocessingCanvas" xmlns:mc="http://schemas.openxmlformats.org/markup-compatibility/2006" xmlns:o="urn:schemas-microsoft-com:office:office" xmlns:r="http://schemas.openxmlformats.org/officeDocument/2006/relationships" xmlns:m="http://schemas.openxmlformats.org/officeDocument/2006/math" xmlns:v="urn:schemas-microsoft-com:vml" xmlns:wp14="http://schemas.microsoft.com/office/word/2010/wordprocessingDrawing" xmlns:wp="http://schemas.openxmlformats.org/drawingml/2006/wordprocessingDrawing" xmlns:w10="urn:schemas-microsoft-com:office:word" xmlns:w="http://schemas.openxmlformats.org/wordprocessingml/2006/main" xmlns:w14="http://schemas.microsoft.com/office/word/2010/wordml" xmlns:w15="http://schemas.microsoft.com/office/word/2012/wordml" xmlns:wpg="http://schemas.microsoft.com/office/word/2010/wordprocessingGroup" xmlns:wpi="http://schemas.microsoft.com/office/word/2010/wordprocessingInk" xmlns:wne="http://schemas.microsoft.com/office/word/2006/wordml" xmlns:wps="http://schemas.microsoft.com/office/word/2010/wordprocessingShape" xmlns:cx="http://schemas.microsoft.com/office/drawing/2014/chartex" xmlns:cx1="http://schemas.microsoft.com/office/drawing/2015/9/8/chartex" xmlns:cx2="http://schemas.microsoft.com/office/drawing/2015/10/21/chartex" xmlns:cx3="http://schemas.microsoft.com/office/drawing/2016/5/9/chartex" xmlns:cx4="http://schemas.microsoft.com/office/drawing/2016/5/10/chartex" xmlns:cx5="http://schemas.microsoft.com/office/drawing/2016/5/11/chartex" xmlns:cx6="http://schemas.microsoft.com/office/drawing/2016/5/12/chartex" xmlns:cx7="http://schemas.microsoft.com/office/drawing/2016/5/13/chartex" xmlns:cx8="http://schemas.microsoft.com/office/drawing/2016/5/14/chartex" xmlns:w16cid="http://schemas.microsoft.com/office/word/2016/wordml/cid" xmlns:w16se="http://schemas.microsoft.com/office/word/2015/wordml/symex">
+  <w:p>
     <w:pPr>
       <w:spacing w:after="0"/>
       <w:jc w:val="right"/>
@@ -26915,17 +27061,7 @@
 </w:hdr>
 </file>
 
-<file path=word/header2.xml><?xml version="1.0" encoding="utf-8"?>
-<w:hdr xmlns:wpc="http://schemas.microsoft.com/office/word/2010/wordprocessingCanvas" xmlns:mc="http://schemas.openxmlformats.org/markup-compatibility/2006" xmlns:o="urn:schemas-microsoft-com:office:office" xmlns:r="http://schemas.openxmlformats.org/officeDocument/2006/relationships" xmlns:m="http://schemas.openxmlformats.org/officeDocument/2006/math" xmlns:v="urn:schemas-microsoft-com:vml" xmlns:wp14="http://schemas.microsoft.com/office/word/2010/wordprocessingDrawing" xmlns:wp="http://schemas.openxmlformats.org/drawingml/2006/wordprocessingDrawing" xmlns:w10="urn:schemas-microsoft-com:office:word" xmlns:w="http://schemas.openxmlformats.org/wordprocessingml/2006/main" xmlns:w14="http://schemas.microsoft.com/office/word/2010/wordml" xmlns:w15="http://schemas.microsoft.com/office/word/2012/wordml" xmlns:wpg="http://schemas.microsoft.com/office/word/2010/wordprocessingGroup" xmlns:wpi="http://schemas.microsoft.com/office/word/2010/wordprocessingInk" xmlns:wne="http://schemas.microsoft.com/office/word/2006/wordml" xmlns:wps="http://schemas.microsoft.com/office/word/2010/wordprocessingShape" xmlns:cx="http://schemas.microsoft.com/office/drawing/2014/chartex" xmlns:cx1="http://schemas.microsoft.com/office/drawing/2015/9/8/chartex" xmlns:cx2="http://schemas.microsoft.com/office/drawing/2015/10/21/chartex" xmlns:cx3="http://schemas.microsoft.com/office/drawing/2016/5/9/chartex" xmlns:cx4="http://schemas.microsoft.com/office/drawing/2016/5/10/chartex" xmlns:cx5="http://schemas.microsoft.com/office/drawing/2016/5/11/chartex" xmlns:cx6="http://schemas.microsoft.com/office/drawing/2016/5/12/chartex" xmlns:cx7="http://schemas.microsoft.com/office/drawing/2016/5/13/chartex" xmlns:cx8="http://schemas.microsoft.com/office/drawing/2016/5/14/chartex" xmlns:w16cid="http://schemas.microsoft.com/office/word/2016/wordml/cid" xmlns:w16se="http://schemas.microsoft.com/office/word/2015/wordml/symex">
-  <w:p>
-    <w:r>
-      <w:t xml:space="preserve"/>
-    </w:r>
-  </w:p>
-</w:hdr>
-</file>
-
-<file path=word/header3.xml><?xml version="1.0" encoding="utf-8"?>
+<file path=word/header4.xml><?xml version="1.0" encoding="utf-8"?>
 <w:hdr xmlns:wpc="http://schemas.microsoft.com/office/word/2010/wordprocessingCanvas" xmlns:mc="http://schemas.openxmlformats.org/markup-compatibility/2006" xmlns:o="urn:schemas-microsoft-com:office:office" xmlns:r="http://schemas.openxmlformats.org/officeDocument/2006/relationships" xmlns:m="http://schemas.openxmlformats.org/officeDocument/2006/math" xmlns:v="urn:schemas-microsoft-com:vml" xmlns:wp14="http://schemas.microsoft.com/office/word/2010/wordprocessingDrawing" xmlns:wp="http://schemas.openxmlformats.org/drawingml/2006/wordprocessingDrawing" xmlns:w10="urn:schemas-microsoft-com:office:word" xmlns:w="http://schemas.openxmlformats.org/wordprocessingml/2006/main" xmlns:w14="http://schemas.microsoft.com/office/word/2010/wordml" xmlns:w15="http://schemas.microsoft.com/office/word/2012/wordml" xmlns:wpg="http://schemas.microsoft.com/office/word/2010/wordprocessingGroup" xmlns:wpi="http://schemas.microsoft.com/office/word/2010/wordprocessingInk" xmlns:wne="http://schemas.microsoft.com/office/word/2006/wordml" xmlns:wps="http://schemas.microsoft.com/office/word/2010/wordprocessingShape" xmlns:cx="http://schemas.microsoft.com/office/drawing/2014/chartex" xmlns:cx1="http://schemas.microsoft.com/office/drawing/2015/9/8/chartex" xmlns:cx2="http://schemas.microsoft.com/office/drawing/2015/10/21/chartex" xmlns:cx3="http://schemas.microsoft.com/office/drawing/2016/5/9/chartex" xmlns:cx4="http://schemas.microsoft.com/office/drawing/2016/5/10/chartex" xmlns:cx5="http://schemas.microsoft.com/office/drawing/2016/5/11/chartex" xmlns:cx6="http://schemas.microsoft.com/office/drawing/2016/5/12/chartex" xmlns:cx7="http://schemas.microsoft.com/office/drawing/2016/5/13/chartex" xmlns:cx8="http://schemas.microsoft.com/office/drawing/2016/5/14/chartex" xmlns:w16cid="http://schemas.microsoft.com/office/word/2016/wordml/cid" xmlns:w16se="http://schemas.microsoft.com/office/word/2015/wordml/symex">
   <w:p>
     <w:r>

</xml_diff>

<commit_message>
workbook agenda: add PAGE column, 2-line PRESENTER, drop 'Dallas' from Statler
- Agenda page:
  - Add fourth column 'PAGE' (centered) with bold orange page numbers
    matching the workbook page where each session's content lives.
  - Presenter column: name (bold) + subtitle (muted) on two lines for
    every speaker. Break rows use non-breaking-space stand-ins so their
    row height stays consistent with two-line speaker rows.
  - Update subtitle date/venue line: 'The Statler Dallas' -> 'The Statler'.
- Header (all body pages): add explicit indent right=0 on both header
  paragraphs so 'We Run ON EOS(R)' and 'North Texas 2026' are guaranteed
  flush-right against the page margin.

Presenter/page mapping is hard-coded in AGENDA_PRESENTER_INFO keyed by
session title from config.js; update there when page assignments shift.
</commit_message>
<xml_diff>
--- a/deliverables/workbook/Workbook.docx
+++ b/deliverables/workbook/Workbook.docx
@@ -580,7 +580,7 @@
           <w:sz w:val="22"/>
           <w:szCs w:val="22"/>
         </w:rPr>
-        <w:t xml:space="preserve">Monday, September 14, 2026 · The Statler Dallas</w:t>
+        <w:t xml:space="preserve">Monday, September 14, 2026 · The Statler</w:t>
       </w:r>
     </w:p>
     <w:p>
@@ -604,9 +604,10 @@
         </w:tblBorders>
       </w:tblPr>
       <w:tblGrid>
-        <w:gridCol w:w="2200"/>
-        <w:gridCol w:w="5680"/>
-        <w:gridCol w:w="2200"/>
+        <w:gridCol w:w="1700"/>
+        <w:gridCol w:w="5080"/>
+        <w:gridCol w:w="2500"/>
+        <w:gridCol w:w="800"/>
       </w:tblGrid>
       <w:tr>
         <w:trPr>
@@ -614,7 +615,7 @@
         </w:trPr>
         <w:tc>
           <w:tcPr>
-            <w:tcW w:type="dxa" w:w="2200"/>
+            <w:tcW w:type="dxa" w:w="1700"/>
             <w:tcBorders>
               <w:top w:val="none" w:color="FFFFFF" w:sz="0"/>
               <w:left w:val="none" w:color="FFFFFF" w:sz="0"/>
@@ -649,7 +650,7 @@
         </w:tc>
         <w:tc>
           <w:tcPr>
-            <w:tcW w:type="dxa" w:w="5680"/>
+            <w:tcW w:type="dxa" w:w="5080"/>
             <w:tcBorders>
               <w:top w:val="none" w:color="FFFFFF" w:sz="0"/>
               <w:left w:val="none" w:color="FFFFFF" w:sz="0"/>
@@ -684,7 +685,7 @@
         </w:tc>
         <w:tc>
           <w:tcPr>
-            <w:tcW w:type="dxa" w:w="2200"/>
+            <w:tcW w:type="dxa" w:w="2500"/>
             <w:tcBorders>
               <w:top w:val="none" w:color="FFFFFF" w:sz="0"/>
               <w:left w:val="none" w:color="FFFFFF" w:sz="0"/>
@@ -717,11 +718,46 @@
             </w:r>
           </w:p>
         </w:tc>
+        <w:tc>
+          <w:tcPr>
+            <w:tcW w:type="dxa" w:w="800"/>
+            <w:tcBorders>
+              <w:top w:val="none" w:color="FFFFFF" w:sz="0"/>
+              <w:left w:val="none" w:color="FFFFFF" w:sz="0"/>
+              <w:bottom w:val="none" w:color="FFFFFF" w:sz="0"/>
+              <w:right w:val="none" w:color="FFFFFF" w:sz="0"/>
+            </w:tcBorders>
+            <w:shd w:fill="0B1F3A" w:val="clear"/>
+            <w:tcMar>
+              <w:top w:type="dxa" w:w="80"/>
+              <w:left w:type="dxa" w:w="120"/>
+              <w:bottom w:type="dxa" w:w="80"/>
+              <w:right w:type="dxa" w:w="120"/>
+            </w:tcMar>
+            <w:vAlign w:val="center"/>
+          </w:tcPr>
+          <w:p>
+            <w:pPr>
+              <w:jc w:val="center"/>
+            </w:pPr>
+            <w:r>
+              <w:rPr>
+                <w:rFonts w:ascii="Calibri" w:cs="Calibri" w:eastAsia="Calibri" w:hAnsi="Calibri"/>
+                <w:b/>
+                <w:bCs/>
+                <w:color w:val="FFFFFF"/>
+                <w:sz w:val="20"/>
+                <w:szCs w:val="20"/>
+              </w:rPr>
+              <w:t xml:space="preserve">PAGE</w:t>
+            </w:r>
+          </w:p>
+        </w:tc>
       </w:tr>
       <w:tr>
         <w:tc>
           <w:tcPr>
-            <w:tcW w:type="dxa" w:w="2200"/>
+            <w:tcW w:type="dxa" w:w="1700"/>
             <w:tcBorders>
               <w:top w:val="none" w:color="FFFFFF" w:sz="0"/>
               <w:left w:val="none" w:color="FFFFFF" w:sz="0"/>
@@ -753,7 +789,7 @@
         </w:tc>
         <w:tc>
           <w:tcPr>
-            <w:tcW w:type="dxa" w:w="5680"/>
+            <w:tcW w:type="dxa" w:w="5080"/>
             <w:tcBorders>
               <w:top w:val="none" w:color="FFFFFF" w:sz="0"/>
               <w:left w:val="none" w:color="FFFFFF" w:sz="0"/>
@@ -787,7 +823,7 @@
         </w:tc>
         <w:tc>
           <w:tcPr>
-            <w:tcW w:type="dxa" w:w="2200"/>
+            <w:tcW w:type="dxa" w:w="2500"/>
             <w:tcBorders>
               <w:top w:val="none" w:color="FFFFFF" w:sz="0"/>
               <w:left w:val="none" w:color="FFFFFF" w:sz="0"/>
@@ -804,6 +840,27 @@
             <w:vAlign w:val="center"/>
           </w:tcPr>
           <w:p>
+            <w:pPr>
+              <w:spacing w:after="0"/>
+            </w:pPr>
+            <w:r>
+              <w:rPr>
+                <w:rFonts w:ascii="Calibri" w:cs="Calibri" w:eastAsia="Calibri" w:hAnsi="Calibri"/>
+                <w:b w:val="false"/>
+                <w:bCs w:val="false"/>
+                <w:i w:val="false"/>
+                <w:iCs w:val="false"/>
+                <w:color w:val="5A6B82"/>
+                <w:sz w:val="20"/>
+                <w:szCs w:val="20"/>
+              </w:rPr>
+              <w:t xml:space="preserve"> </w:t>
+            </w:r>
+          </w:p>
+          <w:p>
+            <w:pPr>
+              <w:spacing w:after="0"/>
+            </w:pPr>
             <w:r>
               <w:rPr>
                 <w:rFonts w:ascii="Calibri" w:cs="Calibri" w:eastAsia="Calibri" w:hAnsi="Calibri"/>
@@ -813,6 +870,41 @@
                 <w:sz w:val="18"/>
                 <w:szCs w:val="18"/>
               </w:rPr>
+              <w:t xml:space="preserve"> </w:t>
+            </w:r>
+          </w:p>
+        </w:tc>
+        <w:tc>
+          <w:tcPr>
+            <w:tcW w:type="dxa" w:w="800"/>
+            <w:tcBorders>
+              <w:top w:val="none" w:color="FFFFFF" w:sz="0"/>
+              <w:left w:val="none" w:color="FFFFFF" w:sz="0"/>
+              <w:bottom w:val="none" w:color="FFFFFF" w:sz="0"/>
+              <w:right w:val="none" w:color="FFFFFF" w:sz="0"/>
+            </w:tcBorders>
+            <w:shd w:fill="FFFFFF" w:val="clear"/>
+            <w:tcMar>
+              <w:top w:type="dxa" w:w="100"/>
+              <w:left w:type="dxa" w:w="100"/>
+              <w:bottom w:type="dxa" w:w="100"/>
+              <w:right w:type="dxa" w:w="140"/>
+            </w:tcMar>
+            <w:vAlign w:val="center"/>
+          </w:tcPr>
+          <w:p>
+            <w:pPr>
+              <w:jc w:val="center"/>
+            </w:pPr>
+            <w:r>
+              <w:rPr>
+                <w:rFonts w:ascii="Calibri" w:cs="Calibri" w:eastAsia="Calibri" w:hAnsi="Calibri"/>
+                <w:b/>
+                <w:bCs/>
+                <w:color w:val="E87722"/>
+                <w:sz w:val="22"/>
+                <w:szCs w:val="22"/>
+              </w:rPr>
               <w:t xml:space="preserve"/>
             </w:r>
           </w:p>
@@ -821,7 +913,7 @@
       <w:tr>
         <w:tc>
           <w:tcPr>
-            <w:tcW w:type="dxa" w:w="2200"/>
+            <w:tcW w:type="dxa" w:w="1700"/>
             <w:tcBorders>
               <w:top w:val="none" w:color="FFFFFF" w:sz="0"/>
               <w:left w:val="none" w:color="FFFFFF" w:sz="0"/>
@@ -853,7 +945,7 @@
         </w:tc>
         <w:tc>
           <w:tcPr>
-            <w:tcW w:type="dxa" w:w="5680"/>
+            <w:tcW w:type="dxa" w:w="5080"/>
             <w:tcBorders>
               <w:top w:val="none" w:color="FFFFFF" w:sz="0"/>
               <w:left w:val="none" w:color="FFFFFF" w:sz="0"/>
@@ -887,7 +979,7 @@
         </w:tc>
         <w:tc>
           <w:tcPr>
-            <w:tcW w:type="dxa" w:w="2200"/>
+            <w:tcW w:type="dxa" w:w="2500"/>
             <w:tcBorders>
               <w:top w:val="none" w:color="FFFFFF" w:sz="0"/>
               <w:left w:val="none" w:color="FFFFFF" w:sz="0"/>
@@ -904,6 +996,27 @@
             <w:vAlign w:val="center"/>
           </w:tcPr>
           <w:p>
+            <w:pPr>
+              <w:spacing w:after="0"/>
+            </w:pPr>
+            <w:r>
+              <w:rPr>
+                <w:rFonts w:ascii="Calibri" w:cs="Calibri" w:eastAsia="Calibri" w:hAnsi="Calibri"/>
+                <w:b/>
+                <w:bCs/>
+                <w:i w:val="false"/>
+                <w:iCs w:val="false"/>
+                <w:color w:val="1A1A1A"/>
+                <w:sz w:val="20"/>
+                <w:szCs w:val="20"/>
+              </w:rPr>
+              <w:t xml:space="preserve">Ann Sheu</w:t>
+            </w:r>
+          </w:p>
+          <w:p>
+            <w:pPr>
+              <w:spacing w:after="0"/>
+            </w:pPr>
             <w:r>
               <w:rPr>
                 <w:rFonts w:ascii="Calibri" w:cs="Calibri" w:eastAsia="Calibri" w:hAnsi="Calibri"/>
@@ -913,7 +1026,42 @@
                 <w:sz w:val="18"/>
                 <w:szCs w:val="18"/>
               </w:rPr>
-              <w:t xml:space="preserve">Ann Sheu</w:t>
+              <w:t xml:space="preserve">Certified EOS Implementer</w:t>
+            </w:r>
+          </w:p>
+        </w:tc>
+        <w:tc>
+          <w:tcPr>
+            <w:tcW w:type="dxa" w:w="800"/>
+            <w:tcBorders>
+              <w:top w:val="none" w:color="FFFFFF" w:sz="0"/>
+              <w:left w:val="none" w:color="FFFFFF" w:sz="0"/>
+              <w:bottom w:val="none" w:color="FFFFFF" w:sz="0"/>
+              <w:right w:val="none" w:color="FFFFFF" w:sz="0"/>
+            </w:tcBorders>
+            <w:shd w:fill="F4F6F9" w:val="clear"/>
+            <w:tcMar>
+              <w:top w:type="dxa" w:w="100"/>
+              <w:left w:type="dxa" w:w="100"/>
+              <w:bottom w:type="dxa" w:w="100"/>
+              <w:right w:type="dxa" w:w="140"/>
+            </w:tcMar>
+            <w:vAlign w:val="center"/>
+          </w:tcPr>
+          <w:p>
+            <w:pPr>
+              <w:jc w:val="center"/>
+            </w:pPr>
+            <w:r>
+              <w:rPr>
+                <w:rFonts w:ascii="Calibri" w:cs="Calibri" w:eastAsia="Calibri" w:hAnsi="Calibri"/>
+                <w:b/>
+                <w:bCs/>
+                <w:color w:val="E87722"/>
+                <w:sz w:val="22"/>
+                <w:szCs w:val="22"/>
+              </w:rPr>
+              <w:t xml:space="preserve">4</w:t>
             </w:r>
           </w:p>
         </w:tc>
@@ -921,7 +1069,7 @@
       <w:tr>
         <w:tc>
           <w:tcPr>
-            <w:tcW w:type="dxa" w:w="2200"/>
+            <w:tcW w:type="dxa" w:w="1700"/>
             <w:tcBorders>
               <w:top w:val="none" w:color="FFFFFF" w:sz="0"/>
               <w:left w:val="none" w:color="FFFFFF" w:sz="0"/>
@@ -953,7 +1101,7 @@
         </w:tc>
         <w:tc>
           <w:tcPr>
-            <w:tcW w:type="dxa" w:w="5680"/>
+            <w:tcW w:type="dxa" w:w="5080"/>
             <w:tcBorders>
               <w:top w:val="none" w:color="FFFFFF" w:sz="0"/>
               <w:left w:val="none" w:color="FFFFFF" w:sz="0"/>
@@ -987,7 +1135,7 @@
         </w:tc>
         <w:tc>
           <w:tcPr>
-            <w:tcW w:type="dxa" w:w="2200"/>
+            <w:tcW w:type="dxa" w:w="2500"/>
             <w:tcBorders>
               <w:top w:val="none" w:color="FFFFFF" w:sz="0"/>
               <w:left w:val="none" w:color="FFFFFF" w:sz="0"/>
@@ -1004,6 +1152,27 @@
             <w:vAlign w:val="center"/>
           </w:tcPr>
           <w:p>
+            <w:pPr>
+              <w:spacing w:after="0"/>
+            </w:pPr>
+            <w:r>
+              <w:rPr>
+                <w:rFonts w:ascii="Calibri" w:cs="Calibri" w:eastAsia="Calibri" w:hAnsi="Calibri"/>
+                <w:b w:val="false"/>
+                <w:bCs w:val="false"/>
+                <w:i w:val="false"/>
+                <w:iCs w:val="false"/>
+                <w:color w:val="5A6B82"/>
+                <w:sz w:val="20"/>
+                <w:szCs w:val="20"/>
+              </w:rPr>
+              <w:t xml:space="preserve"> </w:t>
+            </w:r>
+          </w:p>
+          <w:p>
+            <w:pPr>
+              <w:spacing w:after="0"/>
+            </w:pPr>
             <w:r>
               <w:rPr>
                 <w:rFonts w:ascii="Calibri" w:cs="Calibri" w:eastAsia="Calibri" w:hAnsi="Calibri"/>
@@ -1013,6 +1182,41 @@
                 <w:sz w:val="18"/>
                 <w:szCs w:val="18"/>
               </w:rPr>
+              <w:t xml:space="preserve"> </w:t>
+            </w:r>
+          </w:p>
+        </w:tc>
+        <w:tc>
+          <w:tcPr>
+            <w:tcW w:type="dxa" w:w="800"/>
+            <w:tcBorders>
+              <w:top w:val="none" w:color="FFFFFF" w:sz="0"/>
+              <w:left w:val="none" w:color="FFFFFF" w:sz="0"/>
+              <w:bottom w:val="none" w:color="FFFFFF" w:sz="0"/>
+              <w:right w:val="none" w:color="FFFFFF" w:sz="0"/>
+            </w:tcBorders>
+            <w:shd w:fill="FFFFFF" w:val="clear"/>
+            <w:tcMar>
+              <w:top w:type="dxa" w:w="100"/>
+              <w:left w:type="dxa" w:w="100"/>
+              <w:bottom w:type="dxa" w:w="100"/>
+              <w:right w:type="dxa" w:w="140"/>
+            </w:tcMar>
+            <w:vAlign w:val="center"/>
+          </w:tcPr>
+          <w:p>
+            <w:pPr>
+              <w:jc w:val="center"/>
+            </w:pPr>
+            <w:r>
+              <w:rPr>
+                <w:rFonts w:ascii="Calibri" w:cs="Calibri" w:eastAsia="Calibri" w:hAnsi="Calibri"/>
+                <w:b/>
+                <w:bCs/>
+                <w:color w:val="E87722"/>
+                <w:sz w:val="22"/>
+                <w:szCs w:val="22"/>
+              </w:rPr>
               <w:t xml:space="preserve"/>
             </w:r>
           </w:p>
@@ -1021,7 +1225,7 @@
       <w:tr>
         <w:tc>
           <w:tcPr>
-            <w:tcW w:type="dxa" w:w="2200"/>
+            <w:tcW w:type="dxa" w:w="1700"/>
             <w:tcBorders>
               <w:top w:val="none" w:color="FFFFFF" w:sz="0"/>
               <w:left w:val="none" w:color="FFFFFF" w:sz="0"/>
@@ -1053,7 +1257,7 @@
         </w:tc>
         <w:tc>
           <w:tcPr>
-            <w:tcW w:type="dxa" w:w="5680"/>
+            <w:tcW w:type="dxa" w:w="5080"/>
             <w:tcBorders>
               <w:top w:val="none" w:color="FFFFFF" w:sz="0"/>
               <w:left w:val="none" w:color="FFFFFF" w:sz="0"/>
@@ -1087,7 +1291,7 @@
         </w:tc>
         <w:tc>
           <w:tcPr>
-            <w:tcW w:type="dxa" w:w="2200"/>
+            <w:tcW w:type="dxa" w:w="2500"/>
             <w:tcBorders>
               <w:top w:val="none" w:color="FFFFFF" w:sz="0"/>
               <w:left w:val="none" w:color="FFFFFF" w:sz="0"/>
@@ -1104,6 +1308,27 @@
             <w:vAlign w:val="center"/>
           </w:tcPr>
           <w:p>
+            <w:pPr>
+              <w:spacing w:after="0"/>
+            </w:pPr>
+            <w:r>
+              <w:rPr>
+                <w:rFonts w:ascii="Calibri" w:cs="Calibri" w:eastAsia="Calibri" w:hAnsi="Calibri"/>
+                <w:b/>
+                <w:bCs/>
+                <w:i w:val="false"/>
+                <w:iCs w:val="false"/>
+                <w:color w:val="1A1A1A"/>
+                <w:sz w:val="20"/>
+                <w:szCs w:val="20"/>
+              </w:rPr>
+              <w:t xml:space="preserve">Brian Dosal</w:t>
+            </w:r>
+          </w:p>
+          <w:p>
+            <w:pPr>
+              <w:spacing w:after="0"/>
+            </w:pPr>
             <w:r>
               <w:rPr>
                 <w:rFonts w:ascii="Calibri" w:cs="Calibri" w:eastAsia="Calibri" w:hAnsi="Calibri"/>
@@ -1117,11 +1342,46 @@
             </w:r>
           </w:p>
         </w:tc>
+        <w:tc>
+          <w:tcPr>
+            <w:tcW w:type="dxa" w:w="800"/>
+            <w:tcBorders>
+              <w:top w:val="none" w:color="FFFFFF" w:sz="0"/>
+              <w:left w:val="none" w:color="FFFFFF" w:sz="0"/>
+              <w:bottom w:val="none" w:color="FFFFFF" w:sz="0"/>
+              <w:right w:val="none" w:color="FFFFFF" w:sz="0"/>
+            </w:tcBorders>
+            <w:shd w:fill="F4F6F9" w:val="clear"/>
+            <w:tcMar>
+              <w:top w:type="dxa" w:w="100"/>
+              <w:left w:type="dxa" w:w="100"/>
+              <w:bottom w:type="dxa" w:w="100"/>
+              <w:right w:type="dxa" w:w="140"/>
+            </w:tcMar>
+            <w:vAlign w:val="center"/>
+          </w:tcPr>
+          <w:p>
+            <w:pPr>
+              <w:jc w:val="center"/>
+            </w:pPr>
+            <w:r>
+              <w:rPr>
+                <w:rFonts w:ascii="Calibri" w:cs="Calibri" w:eastAsia="Calibri" w:hAnsi="Calibri"/>
+                <w:b/>
+                <w:bCs/>
+                <w:color w:val="E87722"/>
+                <w:sz w:val="22"/>
+                <w:szCs w:val="22"/>
+              </w:rPr>
+              <w:t xml:space="preserve">5</w:t>
+            </w:r>
+          </w:p>
+        </w:tc>
       </w:tr>
       <w:tr>
         <w:tc>
           <w:tcPr>
-            <w:tcW w:type="dxa" w:w="2200"/>
+            <w:tcW w:type="dxa" w:w="1700"/>
             <w:tcBorders>
               <w:top w:val="none" w:color="FFFFFF" w:sz="0"/>
               <w:left w:val="none" w:color="FFFFFF" w:sz="0"/>
@@ -1153,7 +1413,7 @@
         </w:tc>
         <w:tc>
           <w:tcPr>
-            <w:tcW w:type="dxa" w:w="5680"/>
+            <w:tcW w:type="dxa" w:w="5080"/>
             <w:tcBorders>
               <w:top w:val="none" w:color="FFFFFF" w:sz="0"/>
               <w:left w:val="none" w:color="FFFFFF" w:sz="0"/>
@@ -1187,7 +1447,7 @@
         </w:tc>
         <w:tc>
           <w:tcPr>
-            <w:tcW w:type="dxa" w:w="2200"/>
+            <w:tcW w:type="dxa" w:w="2500"/>
             <w:tcBorders>
               <w:top w:val="none" w:color="FFFFFF" w:sz="0"/>
               <w:left w:val="none" w:color="FFFFFF" w:sz="0"/>
@@ -1204,6 +1464,27 @@
             <w:vAlign w:val="center"/>
           </w:tcPr>
           <w:p>
+            <w:pPr>
+              <w:spacing w:after="0"/>
+            </w:pPr>
+            <w:r>
+              <w:rPr>
+                <w:rFonts w:ascii="Calibri" w:cs="Calibri" w:eastAsia="Calibri" w:hAnsi="Calibri"/>
+                <w:b w:val="false"/>
+                <w:bCs w:val="false"/>
+                <w:i w:val="false"/>
+                <w:iCs w:val="false"/>
+                <w:color w:val="5A6B82"/>
+                <w:sz w:val="20"/>
+                <w:szCs w:val="20"/>
+              </w:rPr>
+              <w:t xml:space="preserve"> </w:t>
+            </w:r>
+          </w:p>
+          <w:p>
+            <w:pPr>
+              <w:spacing w:after="0"/>
+            </w:pPr>
             <w:r>
               <w:rPr>
                 <w:rFonts w:ascii="Calibri" w:cs="Calibri" w:eastAsia="Calibri" w:hAnsi="Calibri"/>
@@ -1213,6 +1494,41 @@
                 <w:sz w:val="18"/>
                 <w:szCs w:val="18"/>
               </w:rPr>
+              <w:t xml:space="preserve"> </w:t>
+            </w:r>
+          </w:p>
+        </w:tc>
+        <w:tc>
+          <w:tcPr>
+            <w:tcW w:type="dxa" w:w="800"/>
+            <w:tcBorders>
+              <w:top w:val="none" w:color="FFFFFF" w:sz="0"/>
+              <w:left w:val="none" w:color="FFFFFF" w:sz="0"/>
+              <w:bottom w:val="none" w:color="FFFFFF" w:sz="0"/>
+              <w:right w:val="none" w:color="FFFFFF" w:sz="0"/>
+            </w:tcBorders>
+            <w:shd w:fill="FFFFFF" w:val="clear"/>
+            <w:tcMar>
+              <w:top w:type="dxa" w:w="100"/>
+              <w:left w:type="dxa" w:w="100"/>
+              <w:bottom w:type="dxa" w:w="100"/>
+              <w:right w:type="dxa" w:w="140"/>
+            </w:tcMar>
+            <w:vAlign w:val="center"/>
+          </w:tcPr>
+          <w:p>
+            <w:pPr>
+              <w:jc w:val="center"/>
+            </w:pPr>
+            <w:r>
+              <w:rPr>
+                <w:rFonts w:ascii="Calibri" w:cs="Calibri" w:eastAsia="Calibri" w:hAnsi="Calibri"/>
+                <w:b/>
+                <w:bCs/>
+                <w:color w:val="E87722"/>
+                <w:sz w:val="22"/>
+                <w:szCs w:val="22"/>
+              </w:rPr>
               <w:t xml:space="preserve"/>
             </w:r>
           </w:p>
@@ -1221,7 +1537,7 @@
       <w:tr>
         <w:tc>
           <w:tcPr>
-            <w:tcW w:type="dxa" w:w="2200"/>
+            <w:tcW w:type="dxa" w:w="1700"/>
             <w:tcBorders>
               <w:top w:val="none" w:color="FFFFFF" w:sz="0"/>
               <w:left w:val="none" w:color="FFFFFF" w:sz="0"/>
@@ -1253,7 +1569,7 @@
         </w:tc>
         <w:tc>
           <w:tcPr>
-            <w:tcW w:type="dxa" w:w="5680"/>
+            <w:tcW w:type="dxa" w:w="5080"/>
             <w:tcBorders>
               <w:top w:val="none" w:color="FFFFFF" w:sz="0"/>
               <w:left w:val="none" w:color="FFFFFF" w:sz="0"/>
@@ -1287,7 +1603,7 @@
         </w:tc>
         <w:tc>
           <w:tcPr>
-            <w:tcW w:type="dxa" w:w="2200"/>
+            <w:tcW w:type="dxa" w:w="2500"/>
             <w:tcBorders>
               <w:top w:val="none" w:color="FFFFFF" w:sz="0"/>
               <w:left w:val="none" w:color="FFFFFF" w:sz="0"/>
@@ -1304,6 +1620,27 @@
             <w:vAlign w:val="center"/>
           </w:tcPr>
           <w:p>
+            <w:pPr>
+              <w:spacing w:after="0"/>
+            </w:pPr>
+            <w:r>
+              <w:rPr>
+                <w:rFonts w:ascii="Calibri" w:cs="Calibri" w:eastAsia="Calibri" w:hAnsi="Calibri"/>
+                <w:b/>
+                <w:bCs/>
+                <w:i w:val="false"/>
+                <w:iCs w:val="false"/>
+                <w:color w:val="1A1A1A"/>
+                <w:sz w:val="20"/>
+                <w:szCs w:val="20"/>
+              </w:rPr>
+              <w:t xml:space="preserve">Steve Heroux</w:t>
+            </w:r>
+          </w:p>
+          <w:p>
+            <w:pPr>
+              <w:spacing w:after="0"/>
+            </w:pPr>
             <w:r>
               <w:rPr>
                 <w:rFonts w:ascii="Calibri" w:cs="Calibri" w:eastAsia="Calibri" w:hAnsi="Calibri"/>
@@ -1317,11 +1654,46 @@
             </w:r>
           </w:p>
         </w:tc>
+        <w:tc>
+          <w:tcPr>
+            <w:tcW w:type="dxa" w:w="800"/>
+            <w:tcBorders>
+              <w:top w:val="none" w:color="FFFFFF" w:sz="0"/>
+              <w:left w:val="none" w:color="FFFFFF" w:sz="0"/>
+              <w:bottom w:val="none" w:color="FFFFFF" w:sz="0"/>
+              <w:right w:val="none" w:color="FFFFFF" w:sz="0"/>
+            </w:tcBorders>
+            <w:shd w:fill="F4F6F9" w:val="clear"/>
+            <w:tcMar>
+              <w:top w:type="dxa" w:w="100"/>
+              <w:left w:type="dxa" w:w="100"/>
+              <w:bottom w:type="dxa" w:w="100"/>
+              <w:right w:type="dxa" w:w="140"/>
+            </w:tcMar>
+            <w:vAlign w:val="center"/>
+          </w:tcPr>
+          <w:p>
+            <w:pPr>
+              <w:jc w:val="center"/>
+            </w:pPr>
+            <w:r>
+              <w:rPr>
+                <w:rFonts w:ascii="Calibri" w:cs="Calibri" w:eastAsia="Calibri" w:hAnsi="Calibri"/>
+                <w:b/>
+                <w:bCs/>
+                <w:color w:val="E87722"/>
+                <w:sz w:val="22"/>
+                <w:szCs w:val="22"/>
+              </w:rPr>
+              <w:t xml:space="preserve">6</w:t>
+            </w:r>
+          </w:p>
+        </w:tc>
       </w:tr>
       <w:tr>
         <w:tc>
           <w:tcPr>
-            <w:tcW w:type="dxa" w:w="2200"/>
+            <w:tcW w:type="dxa" w:w="1700"/>
             <w:tcBorders>
               <w:top w:val="none" w:color="FFFFFF" w:sz="0"/>
               <w:left w:val="none" w:color="FFFFFF" w:sz="0"/>
@@ -1353,7 +1725,7 @@
         </w:tc>
         <w:tc>
           <w:tcPr>
-            <w:tcW w:type="dxa" w:w="5680"/>
+            <w:tcW w:type="dxa" w:w="5080"/>
             <w:tcBorders>
               <w:top w:val="none" w:color="FFFFFF" w:sz="0"/>
               <w:left w:val="none" w:color="FFFFFF" w:sz="0"/>
@@ -1387,7 +1759,7 @@
         </w:tc>
         <w:tc>
           <w:tcPr>
-            <w:tcW w:type="dxa" w:w="2200"/>
+            <w:tcW w:type="dxa" w:w="2500"/>
             <w:tcBorders>
               <w:top w:val="none" w:color="FFFFFF" w:sz="0"/>
               <w:left w:val="none" w:color="FFFFFF" w:sz="0"/>
@@ -1404,6 +1776,27 @@
             <w:vAlign w:val="center"/>
           </w:tcPr>
           <w:p>
+            <w:pPr>
+              <w:spacing w:after="0"/>
+            </w:pPr>
+            <w:r>
+              <w:rPr>
+                <w:rFonts w:ascii="Calibri" w:cs="Calibri" w:eastAsia="Calibri" w:hAnsi="Calibri"/>
+                <w:b/>
+                <w:bCs/>
+                <w:i w:val="false"/>
+                <w:iCs w:val="false"/>
+                <w:color w:val="1A1A1A"/>
+                <w:sz w:val="20"/>
+                <w:szCs w:val="20"/>
+              </w:rPr>
+              <w:t xml:space="preserve">Walt Brown</w:t>
+            </w:r>
+          </w:p>
+          <w:p>
+            <w:pPr>
+              <w:spacing w:after="0"/>
+            </w:pPr>
             <w:r>
               <w:rPr>
                 <w:rFonts w:ascii="Calibri" w:cs="Calibri" w:eastAsia="Calibri" w:hAnsi="Calibri"/>
@@ -1413,7 +1806,42 @@
                 <w:sz w:val="18"/>
                 <w:szCs w:val="18"/>
               </w:rPr>
-              <w:t xml:space="preserve">EOS Worldwide Head Coach · Walt Brown</w:t>
+              <w:t xml:space="preserve">EOS Worldwide Head Coach</w:t>
+            </w:r>
+          </w:p>
+        </w:tc>
+        <w:tc>
+          <w:tcPr>
+            <w:tcW w:type="dxa" w:w="800"/>
+            <w:tcBorders>
+              <w:top w:val="none" w:color="FFFFFF" w:sz="0"/>
+              <w:left w:val="none" w:color="FFFFFF" w:sz="0"/>
+              <w:bottom w:val="none" w:color="FFFFFF" w:sz="0"/>
+              <w:right w:val="none" w:color="FFFFFF" w:sz="0"/>
+            </w:tcBorders>
+            <w:shd w:fill="FFFFFF" w:val="clear"/>
+            <w:tcMar>
+              <w:top w:type="dxa" w:w="100"/>
+              <w:left w:type="dxa" w:w="100"/>
+              <w:bottom w:type="dxa" w:w="100"/>
+              <w:right w:type="dxa" w:w="140"/>
+            </w:tcMar>
+            <w:vAlign w:val="center"/>
+          </w:tcPr>
+          <w:p>
+            <w:pPr>
+              <w:jc w:val="center"/>
+            </w:pPr>
+            <w:r>
+              <w:rPr>
+                <w:rFonts w:ascii="Calibri" w:cs="Calibri" w:eastAsia="Calibri" w:hAnsi="Calibri"/>
+                <w:b/>
+                <w:bCs/>
+                <w:color w:val="E87722"/>
+                <w:sz w:val="22"/>
+                <w:szCs w:val="22"/>
+              </w:rPr>
+              <w:t xml:space="preserve">7</w:t>
             </w:r>
           </w:p>
         </w:tc>
@@ -1421,7 +1849,7 @@
       <w:tr>
         <w:tc>
           <w:tcPr>
-            <w:tcW w:type="dxa" w:w="2200"/>
+            <w:tcW w:type="dxa" w:w="1700"/>
             <w:tcBorders>
               <w:top w:val="none" w:color="FFFFFF" w:sz="0"/>
               <w:left w:val="none" w:color="FFFFFF" w:sz="0"/>
@@ -1453,7 +1881,7 @@
         </w:tc>
         <w:tc>
           <w:tcPr>
-            <w:tcW w:type="dxa" w:w="5680"/>
+            <w:tcW w:type="dxa" w:w="5080"/>
             <w:tcBorders>
               <w:top w:val="none" w:color="FFFFFF" w:sz="0"/>
               <w:left w:val="none" w:color="FFFFFF" w:sz="0"/>
@@ -1487,7 +1915,7 @@
         </w:tc>
         <w:tc>
           <w:tcPr>
-            <w:tcW w:type="dxa" w:w="2200"/>
+            <w:tcW w:type="dxa" w:w="2500"/>
             <w:tcBorders>
               <w:top w:val="none" w:color="FFFFFF" w:sz="0"/>
               <w:left w:val="none" w:color="FFFFFF" w:sz="0"/>
@@ -1504,6 +1932,27 @@
             <w:vAlign w:val="center"/>
           </w:tcPr>
           <w:p>
+            <w:pPr>
+              <w:spacing w:after="0"/>
+            </w:pPr>
+            <w:r>
+              <w:rPr>
+                <w:rFonts w:ascii="Calibri" w:cs="Calibri" w:eastAsia="Calibri" w:hAnsi="Calibri"/>
+                <w:b/>
+                <w:bCs/>
+                <w:i w:val="false"/>
+                <w:iCs w:val="false"/>
+                <w:color w:val="1A1A1A"/>
+                <w:sz w:val="20"/>
+                <w:szCs w:val="20"/>
+              </w:rPr>
+              <w:t xml:space="preserve">Mark Stanley</w:t>
+            </w:r>
+          </w:p>
+          <w:p>
+            <w:pPr>
+              <w:spacing w:after="0"/>
+            </w:pPr>
             <w:r>
               <w:rPr>
                 <w:rFonts w:ascii="Calibri" w:cs="Calibri" w:eastAsia="Calibri" w:hAnsi="Calibri"/>
@@ -1513,7 +1962,42 @@
                 <w:sz w:val="18"/>
                 <w:szCs w:val="18"/>
               </w:rPr>
-              <w:t xml:space="preserve">Mark Stanley</w:t>
+              <w:t xml:space="preserve">Expert EOS Implementer</w:t>
+            </w:r>
+          </w:p>
+        </w:tc>
+        <w:tc>
+          <w:tcPr>
+            <w:tcW w:type="dxa" w:w="800"/>
+            <w:tcBorders>
+              <w:top w:val="none" w:color="FFFFFF" w:sz="0"/>
+              <w:left w:val="none" w:color="FFFFFF" w:sz="0"/>
+              <w:bottom w:val="none" w:color="FFFFFF" w:sz="0"/>
+              <w:right w:val="none" w:color="FFFFFF" w:sz="0"/>
+            </w:tcBorders>
+            <w:shd w:fill="F4F6F9" w:val="clear"/>
+            <w:tcMar>
+              <w:top w:type="dxa" w:w="100"/>
+              <w:left w:type="dxa" w:w="100"/>
+              <w:bottom w:type="dxa" w:w="100"/>
+              <w:right w:type="dxa" w:w="140"/>
+            </w:tcMar>
+            <w:vAlign w:val="center"/>
+          </w:tcPr>
+          <w:p>
+            <w:pPr>
+              <w:jc w:val="center"/>
+            </w:pPr>
+            <w:r>
+              <w:rPr>
+                <w:rFonts w:ascii="Calibri" w:cs="Calibri" w:eastAsia="Calibri" w:hAnsi="Calibri"/>
+                <w:b/>
+                <w:bCs/>
+                <w:color w:val="E87722"/>
+                <w:sz w:val="22"/>
+                <w:szCs w:val="22"/>
+              </w:rPr>
+              <w:t xml:space="preserve">8</w:t>
             </w:r>
           </w:p>
         </w:tc>
@@ -1521,7 +2005,7 @@
       <w:tr>
         <w:tc>
           <w:tcPr>
-            <w:tcW w:type="dxa" w:w="2200"/>
+            <w:tcW w:type="dxa" w:w="1700"/>
             <w:tcBorders>
               <w:top w:val="none" w:color="FFFFFF" w:sz="0"/>
               <w:left w:val="none" w:color="FFFFFF" w:sz="0"/>
@@ -1553,7 +2037,7 @@
         </w:tc>
         <w:tc>
           <w:tcPr>
-            <w:tcW w:type="dxa" w:w="5680"/>
+            <w:tcW w:type="dxa" w:w="5080"/>
             <w:tcBorders>
               <w:top w:val="none" w:color="FFFFFF" w:sz="0"/>
               <w:left w:val="none" w:color="FFFFFF" w:sz="0"/>
@@ -1587,7 +2071,7 @@
         </w:tc>
         <w:tc>
           <w:tcPr>
-            <w:tcW w:type="dxa" w:w="2200"/>
+            <w:tcW w:type="dxa" w:w="2500"/>
             <w:tcBorders>
               <w:top w:val="none" w:color="FFFFFF" w:sz="0"/>
               <w:left w:val="none" w:color="FFFFFF" w:sz="0"/>
@@ -1604,6 +2088,27 @@
             <w:vAlign w:val="center"/>
           </w:tcPr>
           <w:p>
+            <w:pPr>
+              <w:spacing w:after="0"/>
+            </w:pPr>
+            <w:r>
+              <w:rPr>
+                <w:rFonts w:ascii="Calibri" w:cs="Calibri" w:eastAsia="Calibri" w:hAnsi="Calibri"/>
+                <w:b w:val="false"/>
+                <w:bCs w:val="false"/>
+                <w:i w:val="false"/>
+                <w:iCs w:val="false"/>
+                <w:color w:val="5A6B82"/>
+                <w:sz w:val="20"/>
+                <w:szCs w:val="20"/>
+              </w:rPr>
+              <w:t xml:space="preserve"> </w:t>
+            </w:r>
+          </w:p>
+          <w:p>
+            <w:pPr>
+              <w:spacing w:after="0"/>
+            </w:pPr>
             <w:r>
               <w:rPr>
                 <w:rFonts w:ascii="Calibri" w:cs="Calibri" w:eastAsia="Calibri" w:hAnsi="Calibri"/>
@@ -1613,6 +2118,41 @@
                 <w:sz w:val="18"/>
                 <w:szCs w:val="18"/>
               </w:rPr>
+              <w:t xml:space="preserve"> </w:t>
+            </w:r>
+          </w:p>
+        </w:tc>
+        <w:tc>
+          <w:tcPr>
+            <w:tcW w:type="dxa" w:w="800"/>
+            <w:tcBorders>
+              <w:top w:val="none" w:color="FFFFFF" w:sz="0"/>
+              <w:left w:val="none" w:color="FFFFFF" w:sz="0"/>
+              <w:bottom w:val="none" w:color="FFFFFF" w:sz="0"/>
+              <w:right w:val="none" w:color="FFFFFF" w:sz="0"/>
+            </w:tcBorders>
+            <w:shd w:fill="FFFFFF" w:val="clear"/>
+            <w:tcMar>
+              <w:top w:type="dxa" w:w="100"/>
+              <w:left w:type="dxa" w:w="100"/>
+              <w:bottom w:type="dxa" w:w="100"/>
+              <w:right w:type="dxa" w:w="140"/>
+            </w:tcMar>
+            <w:vAlign w:val="center"/>
+          </w:tcPr>
+          <w:p>
+            <w:pPr>
+              <w:jc w:val="center"/>
+            </w:pPr>
+            <w:r>
+              <w:rPr>
+                <w:rFonts w:ascii="Calibri" w:cs="Calibri" w:eastAsia="Calibri" w:hAnsi="Calibri"/>
+                <w:b/>
+                <w:bCs/>
+                <w:color w:val="E87722"/>
+                <w:sz w:val="22"/>
+                <w:szCs w:val="22"/>
+              </w:rPr>
               <w:t xml:space="preserve"/>
             </w:r>
           </w:p>
@@ -1621,7 +2161,7 @@
       <w:tr>
         <w:tc>
           <w:tcPr>
-            <w:tcW w:type="dxa" w:w="2200"/>
+            <w:tcW w:type="dxa" w:w="1700"/>
             <w:tcBorders>
               <w:top w:val="none" w:color="FFFFFF" w:sz="0"/>
               <w:left w:val="none" w:color="FFFFFF" w:sz="0"/>
@@ -1653,7 +2193,7 @@
         </w:tc>
         <w:tc>
           <w:tcPr>
-            <w:tcW w:type="dxa" w:w="5680"/>
+            <w:tcW w:type="dxa" w:w="5080"/>
             <w:tcBorders>
               <w:top w:val="none" w:color="FFFFFF" w:sz="0"/>
               <w:left w:val="none" w:color="FFFFFF" w:sz="0"/>
@@ -1687,7 +2227,7 @@
         </w:tc>
         <w:tc>
           <w:tcPr>
-            <w:tcW w:type="dxa" w:w="2200"/>
+            <w:tcW w:type="dxa" w:w="2500"/>
             <w:tcBorders>
               <w:top w:val="none" w:color="FFFFFF" w:sz="0"/>
               <w:left w:val="none" w:color="FFFFFF" w:sz="0"/>
@@ -1704,6 +2244,27 @@
             <w:vAlign w:val="center"/>
           </w:tcPr>
           <w:p>
+            <w:pPr>
+              <w:spacing w:after="0"/>
+            </w:pPr>
+            <w:r>
+              <w:rPr>
+                <w:rFonts w:ascii="Calibri" w:cs="Calibri" w:eastAsia="Calibri" w:hAnsi="Calibri"/>
+                <w:b/>
+                <w:bCs/>
+                <w:i w:val="false"/>
+                <w:iCs w:val="false"/>
+                <w:color w:val="1A1A1A"/>
+                <w:sz w:val="20"/>
+                <w:szCs w:val="20"/>
+              </w:rPr>
+              <w:t xml:space="preserve">Beth Fahey</w:t>
+            </w:r>
+          </w:p>
+          <w:p>
+            <w:pPr>
+              <w:spacing w:after="0"/>
+            </w:pPr>
             <w:r>
               <w:rPr>
                 <w:rFonts w:ascii="Calibri" w:cs="Calibri" w:eastAsia="Calibri" w:hAnsi="Calibri"/>
@@ -1713,7 +2274,42 @@
                 <w:sz w:val="18"/>
                 <w:szCs w:val="18"/>
               </w:rPr>
-              <w:t xml:space="preserve">Beth Fahey</w:t>
+              <w:t xml:space="preserve">Expert EOS Implementer</w:t>
+            </w:r>
+          </w:p>
+        </w:tc>
+        <w:tc>
+          <w:tcPr>
+            <w:tcW w:type="dxa" w:w="800"/>
+            <w:tcBorders>
+              <w:top w:val="none" w:color="FFFFFF" w:sz="0"/>
+              <w:left w:val="none" w:color="FFFFFF" w:sz="0"/>
+              <w:bottom w:val="none" w:color="FFFFFF" w:sz="0"/>
+              <w:right w:val="none" w:color="FFFFFF" w:sz="0"/>
+            </w:tcBorders>
+            <w:shd w:fill="F4F6F9" w:val="clear"/>
+            <w:tcMar>
+              <w:top w:type="dxa" w:w="100"/>
+              <w:left w:type="dxa" w:w="100"/>
+              <w:bottom w:type="dxa" w:w="100"/>
+              <w:right w:type="dxa" w:w="140"/>
+            </w:tcMar>
+            <w:vAlign w:val="center"/>
+          </w:tcPr>
+          <w:p>
+            <w:pPr>
+              <w:jc w:val="center"/>
+            </w:pPr>
+            <w:r>
+              <w:rPr>
+                <w:rFonts w:ascii="Calibri" w:cs="Calibri" w:eastAsia="Calibri" w:hAnsi="Calibri"/>
+                <w:b/>
+                <w:bCs/>
+                <w:color w:val="E87722"/>
+                <w:sz w:val="22"/>
+                <w:szCs w:val="22"/>
+              </w:rPr>
+              <w:t xml:space="preserve">12</w:t>
             </w:r>
           </w:p>
         </w:tc>
@@ -1721,7 +2317,7 @@
       <w:tr>
         <w:tc>
           <w:tcPr>
-            <w:tcW w:type="dxa" w:w="2200"/>
+            <w:tcW w:type="dxa" w:w="1700"/>
             <w:tcBorders>
               <w:top w:val="none" w:color="FFFFFF" w:sz="0"/>
               <w:left w:val="none" w:color="FFFFFF" w:sz="0"/>
@@ -1753,7 +2349,7 @@
         </w:tc>
         <w:tc>
           <w:tcPr>
-            <w:tcW w:type="dxa" w:w="5680"/>
+            <w:tcW w:type="dxa" w:w="5080"/>
             <w:tcBorders>
               <w:top w:val="none" w:color="FFFFFF" w:sz="0"/>
               <w:left w:val="none" w:color="FFFFFF" w:sz="0"/>
@@ -1787,7 +2383,7 @@
         </w:tc>
         <w:tc>
           <w:tcPr>
-            <w:tcW w:type="dxa" w:w="2200"/>
+            <w:tcW w:type="dxa" w:w="2500"/>
             <w:tcBorders>
               <w:top w:val="none" w:color="FFFFFF" w:sz="0"/>
               <w:left w:val="none" w:color="FFFFFF" w:sz="0"/>
@@ -1804,6 +2400,27 @@
             <w:vAlign w:val="center"/>
           </w:tcPr>
           <w:p>
+            <w:pPr>
+              <w:spacing w:after="0"/>
+            </w:pPr>
+            <w:r>
+              <w:rPr>
+                <w:rFonts w:ascii="Calibri" w:cs="Calibri" w:eastAsia="Calibri" w:hAnsi="Calibri"/>
+                <w:b w:val="false"/>
+                <w:bCs w:val="false"/>
+                <w:i w:val="false"/>
+                <w:iCs w:val="false"/>
+                <w:color w:val="5A6B82"/>
+                <w:sz w:val="20"/>
+                <w:szCs w:val="20"/>
+              </w:rPr>
+              <w:t xml:space="preserve"> </w:t>
+            </w:r>
+          </w:p>
+          <w:p>
+            <w:pPr>
+              <w:spacing w:after="0"/>
+            </w:pPr>
             <w:r>
               <w:rPr>
                 <w:rFonts w:ascii="Calibri" w:cs="Calibri" w:eastAsia="Calibri" w:hAnsi="Calibri"/>
@@ -1813,6 +2430,41 @@
                 <w:sz w:val="18"/>
                 <w:szCs w:val="18"/>
               </w:rPr>
+              <w:t xml:space="preserve"> </w:t>
+            </w:r>
+          </w:p>
+        </w:tc>
+        <w:tc>
+          <w:tcPr>
+            <w:tcW w:type="dxa" w:w="800"/>
+            <w:tcBorders>
+              <w:top w:val="none" w:color="FFFFFF" w:sz="0"/>
+              <w:left w:val="none" w:color="FFFFFF" w:sz="0"/>
+              <w:bottom w:val="none" w:color="FFFFFF" w:sz="0"/>
+              <w:right w:val="none" w:color="FFFFFF" w:sz="0"/>
+            </w:tcBorders>
+            <w:shd w:fill="FFFFFF" w:val="clear"/>
+            <w:tcMar>
+              <w:top w:type="dxa" w:w="100"/>
+              <w:left w:type="dxa" w:w="100"/>
+              <w:bottom w:type="dxa" w:w="100"/>
+              <w:right w:type="dxa" w:w="140"/>
+            </w:tcMar>
+            <w:vAlign w:val="center"/>
+          </w:tcPr>
+          <w:p>
+            <w:pPr>
+              <w:jc w:val="center"/>
+            </w:pPr>
+            <w:r>
+              <w:rPr>
+                <w:rFonts w:ascii="Calibri" w:cs="Calibri" w:eastAsia="Calibri" w:hAnsi="Calibri"/>
+                <w:b/>
+                <w:bCs/>
+                <w:color w:val="E87722"/>
+                <w:sz w:val="22"/>
+                <w:szCs w:val="22"/>
+              </w:rPr>
               <w:t xml:space="preserve"/>
             </w:r>
           </w:p>
@@ -1821,7 +2473,7 @@
       <w:tr>
         <w:tc>
           <w:tcPr>
-            <w:tcW w:type="dxa" w:w="2200"/>
+            <w:tcW w:type="dxa" w:w="1700"/>
             <w:tcBorders>
               <w:top w:val="none" w:color="FFFFFF" w:sz="0"/>
               <w:left w:val="none" w:color="FFFFFF" w:sz="0"/>
@@ -1853,7 +2505,7 @@
         </w:tc>
         <w:tc>
           <w:tcPr>
-            <w:tcW w:type="dxa" w:w="5680"/>
+            <w:tcW w:type="dxa" w:w="5080"/>
             <w:tcBorders>
               <w:top w:val="none" w:color="FFFFFF" w:sz="0"/>
               <w:left w:val="none" w:color="FFFFFF" w:sz="0"/>
@@ -1887,7 +2539,7 @@
         </w:tc>
         <w:tc>
           <w:tcPr>
-            <w:tcW w:type="dxa" w:w="2200"/>
+            <w:tcW w:type="dxa" w:w="2500"/>
             <w:tcBorders>
               <w:top w:val="none" w:color="FFFFFF" w:sz="0"/>
               <w:left w:val="none" w:color="FFFFFF" w:sz="0"/>
@@ -1904,6 +2556,27 @@
             <w:vAlign w:val="center"/>
           </w:tcPr>
           <w:p>
+            <w:pPr>
+              <w:spacing w:after="0"/>
+            </w:pPr>
+            <w:r>
+              <w:rPr>
+                <w:rFonts w:ascii="Calibri" w:cs="Calibri" w:eastAsia="Calibri" w:hAnsi="Calibri"/>
+                <w:b/>
+                <w:bCs/>
+                <w:i w:val="false"/>
+                <w:iCs w:val="false"/>
+                <w:color w:val="1A1A1A"/>
+                <w:sz w:val="20"/>
+                <w:szCs w:val="20"/>
+              </w:rPr>
+              <w:t xml:space="preserve">Mark C. Winters</w:t>
+            </w:r>
+          </w:p>
+          <w:p>
+            <w:pPr>
+              <w:spacing w:after="0"/>
+            </w:pPr>
             <w:r>
               <w:rPr>
                 <w:rFonts w:ascii="Calibri" w:cs="Calibri" w:eastAsia="Calibri" w:hAnsi="Calibri"/>
@@ -1913,7 +2586,42 @@
                 <w:sz w:val="18"/>
                 <w:szCs w:val="18"/>
               </w:rPr>
-              <w:t xml:space="preserve">Mark C. Winters</w:t>
+              <w:t xml:space="preserve">Expert EOS Implementer</w:t>
+            </w:r>
+          </w:p>
+        </w:tc>
+        <w:tc>
+          <w:tcPr>
+            <w:tcW w:type="dxa" w:w="800"/>
+            <w:tcBorders>
+              <w:top w:val="none" w:color="FFFFFF" w:sz="0"/>
+              <w:left w:val="none" w:color="FFFFFF" w:sz="0"/>
+              <w:bottom w:val="none" w:color="FFFFFF" w:sz="0"/>
+              <w:right w:val="none" w:color="FFFFFF" w:sz="0"/>
+            </w:tcBorders>
+            <w:shd w:fill="F4F6F9" w:val="clear"/>
+            <w:tcMar>
+              <w:top w:type="dxa" w:w="100"/>
+              <w:left w:type="dxa" w:w="100"/>
+              <w:bottom w:type="dxa" w:w="100"/>
+              <w:right w:type="dxa" w:w="140"/>
+            </w:tcMar>
+            <w:vAlign w:val="center"/>
+          </w:tcPr>
+          <w:p>
+            <w:pPr>
+              <w:jc w:val="center"/>
+            </w:pPr>
+            <w:r>
+              <w:rPr>
+                <w:rFonts w:ascii="Calibri" w:cs="Calibri" w:eastAsia="Calibri" w:hAnsi="Calibri"/>
+                <w:b/>
+                <w:bCs/>
+                <w:color w:val="E87722"/>
+                <w:sz w:val="22"/>
+                <w:szCs w:val="22"/>
+              </w:rPr>
+              <w:t xml:space="preserve">32</w:t>
             </w:r>
           </w:p>
         </w:tc>
@@ -1921,7 +2629,7 @@
       <w:tr>
         <w:tc>
           <w:tcPr>
-            <w:tcW w:type="dxa" w:w="2200"/>
+            <w:tcW w:type="dxa" w:w="1700"/>
             <w:tcBorders>
               <w:top w:val="none" w:color="FFFFFF" w:sz="0"/>
               <w:left w:val="none" w:color="FFFFFF" w:sz="0"/>
@@ -1953,7 +2661,7 @@
         </w:tc>
         <w:tc>
           <w:tcPr>
-            <w:tcW w:type="dxa" w:w="5680"/>
+            <w:tcW w:type="dxa" w:w="5080"/>
             <w:tcBorders>
               <w:top w:val="none" w:color="FFFFFF" w:sz="0"/>
               <w:left w:val="none" w:color="FFFFFF" w:sz="0"/>
@@ -1973,11 +2681,11 @@
             <w:r>
               <w:rPr>
                 <w:rFonts w:ascii="Calibri" w:cs="Calibri" w:eastAsia="Calibri" w:hAnsi="Calibri"/>
-                <w:b w:val="false"/>
-                <w:bCs w:val="false"/>
+                <w:b/>
+                <w:bCs/>
                 <w:i w:val="false"/>
                 <w:iCs w:val="false"/>
-                <w:color w:val="5A6B82"/>
+                <w:color w:val="1A1A1A"/>
                 <w:sz w:val="22"/>
                 <w:szCs w:val="22"/>
               </w:rPr>
@@ -1987,7 +2695,7 @@
         </w:tc>
         <w:tc>
           <w:tcPr>
-            <w:tcW w:type="dxa" w:w="2200"/>
+            <w:tcW w:type="dxa" w:w="2500"/>
             <w:tcBorders>
               <w:top w:val="none" w:color="FFFFFF" w:sz="0"/>
               <w:left w:val="none" w:color="FFFFFF" w:sz="0"/>
@@ -2004,6 +2712,27 @@
             <w:vAlign w:val="center"/>
           </w:tcPr>
           <w:p>
+            <w:pPr>
+              <w:spacing w:after="0"/>
+            </w:pPr>
+            <w:r>
+              <w:rPr>
+                <w:rFonts w:ascii="Calibri" w:cs="Calibri" w:eastAsia="Calibri" w:hAnsi="Calibri"/>
+                <w:b/>
+                <w:bCs/>
+                <w:i w:val="false"/>
+                <w:iCs w:val="false"/>
+                <w:color w:val="1A1A1A"/>
+                <w:sz w:val="20"/>
+                <w:szCs w:val="20"/>
+              </w:rPr>
+              <w:t xml:space="preserve">Ninety.io</w:t>
+            </w:r>
+          </w:p>
+          <w:p>
+            <w:pPr>
+              <w:spacing w:after="0"/>
+            </w:pPr>
             <w:r>
               <w:rPr>
                 <w:rFonts w:ascii="Calibri" w:cs="Calibri" w:eastAsia="Calibri" w:hAnsi="Calibri"/>
@@ -2013,7 +2742,42 @@
                 <w:sz w:val="18"/>
                 <w:szCs w:val="18"/>
               </w:rPr>
-              <w:t xml:space="preserve">Ninety.io</w:t>
+              <w:t xml:space="preserve"> </w:t>
+            </w:r>
+          </w:p>
+        </w:tc>
+        <w:tc>
+          <w:tcPr>
+            <w:tcW w:type="dxa" w:w="800"/>
+            <w:tcBorders>
+              <w:top w:val="none" w:color="FFFFFF" w:sz="0"/>
+              <w:left w:val="none" w:color="FFFFFF" w:sz="0"/>
+              <w:bottom w:val="none" w:color="FFFFFF" w:sz="0"/>
+              <w:right w:val="none" w:color="FFFFFF" w:sz="0"/>
+            </w:tcBorders>
+            <w:shd w:fill="FFFFFF" w:val="clear"/>
+            <w:tcMar>
+              <w:top w:type="dxa" w:w="100"/>
+              <w:left w:type="dxa" w:w="100"/>
+              <w:bottom w:type="dxa" w:w="100"/>
+              <w:right w:type="dxa" w:w="140"/>
+            </w:tcMar>
+            <w:vAlign w:val="center"/>
+          </w:tcPr>
+          <w:p>
+            <w:pPr>
+              <w:jc w:val="center"/>
+            </w:pPr>
+            <w:r>
+              <w:rPr>
+                <w:rFonts w:ascii="Calibri" w:cs="Calibri" w:eastAsia="Calibri" w:hAnsi="Calibri"/>
+                <w:b/>
+                <w:bCs/>
+                <w:color w:val="E87722"/>
+                <w:sz w:val="22"/>
+                <w:szCs w:val="22"/>
+              </w:rPr>
+              <w:t xml:space="preserve"/>
             </w:r>
           </w:p>
         </w:tc>
@@ -27027,6 +27791,7 @@
   <w:p>
     <w:pPr>
       <w:spacing w:after="0"/>
+      <w:ind w:right="0"/>
       <w:jc w:val="right"/>
     </w:pPr>
     <w:r>
@@ -27044,6 +27809,7 @@
   <w:p>
     <w:pPr>
       <w:spacing w:after="100"/>
+      <w:ind w:right="0"/>
       <w:jc w:val="right"/>
     </w:pPr>
     <w:r>

</xml_diff>

<commit_message>
workbook networking page: rename 'Thought Provoking Questions' to 'Gold Nuggets', drop 'Memorable Quotes' header, extend note lines to fill page (12 lines)
</commit_message>
<xml_diff>
--- a/deliverables/workbook/Workbook.docx
+++ b/deliverables/workbook/Workbook.docx
@@ -5437,7 +5437,7 @@
           <w:sz w:val="22"/>
           <w:szCs w:val="22"/>
         </w:rPr>
-        <w:t xml:space="preserve">THOUGHT PROVOKING QUESTIONS</w:t>
+        <w:t xml:space="preserve">GOLD NUGGETS</w:t>
       </w:r>
     </w:p>
     <w:tbl>
@@ -5595,41 +5595,146 @@
           </w:p>
         </w:tc>
       </w:tr>
-    </w:tbl>
-    <w:p>
-      <w:pPr>
-        <w:pBdr>
-          <w:bottom w:val="single" w:color="E87722" w:sz="6"/>
-        </w:pBdr>
-        <w:spacing w:after="120" w:before="200"/>
-      </w:pPr>
-      <w:r>
-        <w:rPr>
-          <w:rFonts w:ascii="Calibri" w:cs="Calibri" w:eastAsia="Calibri" w:hAnsi="Calibri"/>
-          <w:b/>
-          <w:bCs/>
-          <w:color w:val="E87722"/>
-          <w:sz w:val="22"/>
-          <w:szCs w:val="22"/>
-        </w:rPr>
-        <w:t xml:space="preserve">MEMORABLE QUOTES</w:t>
-      </w:r>
-    </w:p>
-    <w:tbl>
-      <w:tblPr>
-        <w:tblW w:type="dxa" w:w="10080"/>
-        <w:tblBorders>
-          <w:top w:val="none" w:color="FFFFFF" w:sz="0"/>
-          <w:left w:val="none" w:color="FFFFFF" w:sz="0"/>
-          <w:bottom w:val="none" w:color="FFFFFF" w:sz="0"/>
-          <w:right w:val="none" w:color="FFFFFF" w:sz="0"/>
-          <w:insideH w:val="single" w:color="auto" w:sz="4"/>
-          <w:insideV w:val="single" w:color="auto" w:sz="4"/>
-        </w:tblBorders>
-      </w:tblPr>
-      <w:tblGrid>
-        <w:gridCol w:w="10080"/>
-      </w:tblGrid>
+      <w:tr>
+        <w:trPr>
+          <w:trHeight w:val="380" w:hRule="exact"/>
+        </w:trPr>
+        <w:tc>
+          <w:tcPr>
+            <w:tcW w:type="dxa" w:w="10080"/>
+            <w:tcBorders>
+              <w:top w:val="none" w:color="FFFFFF" w:sz="0"/>
+              <w:left w:val="none" w:color="FFFFFF" w:sz="0"/>
+              <w:bottom w:val="single" w:color="C9D2DE" w:sz="4"/>
+              <w:right w:val="none" w:color="FFFFFF" w:sz="0"/>
+            </w:tcBorders>
+            <w:tcMar>
+              <w:top w:type="dxa" w:w="0"/>
+              <w:left w:type="dxa" w:w="0"/>
+              <w:bottom w:type="dxa" w:w="0"/>
+              <w:right w:type="dxa" w:w="0"/>
+            </w:tcMar>
+          </w:tcPr>
+          <w:p>
+            <w:pPr>
+              <w:spacing w:after="0" w:before="0"/>
+            </w:pPr>
+            <w:r>
+              <w:rPr>
+                <w:rFonts w:ascii="Calibri" w:cs="Calibri" w:eastAsia="Calibri" w:hAnsi="Calibri"/>
+                <w:sz w:val="22"/>
+                <w:szCs w:val="22"/>
+              </w:rPr>
+              <w:t xml:space="preserve"> </w:t>
+            </w:r>
+          </w:p>
+        </w:tc>
+      </w:tr>
+      <w:tr>
+        <w:trPr>
+          <w:trHeight w:val="380" w:hRule="exact"/>
+        </w:trPr>
+        <w:tc>
+          <w:tcPr>
+            <w:tcW w:type="dxa" w:w="10080"/>
+            <w:tcBorders>
+              <w:top w:val="none" w:color="FFFFFF" w:sz="0"/>
+              <w:left w:val="none" w:color="FFFFFF" w:sz="0"/>
+              <w:bottom w:val="single" w:color="C9D2DE" w:sz="4"/>
+              <w:right w:val="none" w:color="FFFFFF" w:sz="0"/>
+            </w:tcBorders>
+            <w:tcMar>
+              <w:top w:type="dxa" w:w="0"/>
+              <w:left w:type="dxa" w:w="0"/>
+              <w:bottom w:type="dxa" w:w="0"/>
+              <w:right w:type="dxa" w:w="0"/>
+            </w:tcMar>
+          </w:tcPr>
+          <w:p>
+            <w:pPr>
+              <w:spacing w:after="0" w:before="0"/>
+            </w:pPr>
+            <w:r>
+              <w:rPr>
+                <w:rFonts w:ascii="Calibri" w:cs="Calibri" w:eastAsia="Calibri" w:hAnsi="Calibri"/>
+                <w:sz w:val="22"/>
+                <w:szCs w:val="22"/>
+              </w:rPr>
+              <w:t xml:space="preserve"> </w:t>
+            </w:r>
+          </w:p>
+        </w:tc>
+      </w:tr>
+      <w:tr>
+        <w:trPr>
+          <w:trHeight w:val="380" w:hRule="exact"/>
+        </w:trPr>
+        <w:tc>
+          <w:tcPr>
+            <w:tcW w:type="dxa" w:w="10080"/>
+            <w:tcBorders>
+              <w:top w:val="none" w:color="FFFFFF" w:sz="0"/>
+              <w:left w:val="none" w:color="FFFFFF" w:sz="0"/>
+              <w:bottom w:val="single" w:color="C9D2DE" w:sz="4"/>
+              <w:right w:val="none" w:color="FFFFFF" w:sz="0"/>
+            </w:tcBorders>
+            <w:tcMar>
+              <w:top w:type="dxa" w:w="0"/>
+              <w:left w:type="dxa" w:w="0"/>
+              <w:bottom w:type="dxa" w:w="0"/>
+              <w:right w:type="dxa" w:w="0"/>
+            </w:tcMar>
+          </w:tcPr>
+          <w:p>
+            <w:pPr>
+              <w:spacing w:after="0" w:before="0"/>
+            </w:pPr>
+            <w:r>
+              <w:rPr>
+                <w:rFonts w:ascii="Calibri" w:cs="Calibri" w:eastAsia="Calibri" w:hAnsi="Calibri"/>
+                <w:sz w:val="22"/>
+                <w:szCs w:val="22"/>
+              </w:rPr>
+              <w:t xml:space="preserve"> </w:t>
+            </w:r>
+          </w:p>
+        </w:tc>
+      </w:tr>
+      <w:tr>
+        <w:trPr>
+          <w:trHeight w:val="380" w:hRule="exact"/>
+        </w:trPr>
+        <w:tc>
+          <w:tcPr>
+            <w:tcW w:type="dxa" w:w="10080"/>
+            <w:tcBorders>
+              <w:top w:val="none" w:color="FFFFFF" w:sz="0"/>
+              <w:left w:val="none" w:color="FFFFFF" w:sz="0"/>
+              <w:bottom w:val="single" w:color="C9D2DE" w:sz="4"/>
+              <w:right w:val="none" w:color="FFFFFF" w:sz="0"/>
+            </w:tcBorders>
+            <w:tcMar>
+              <w:top w:type="dxa" w:w="0"/>
+              <w:left w:type="dxa" w:w="0"/>
+              <w:bottom w:type="dxa" w:w="0"/>
+              <w:right w:type="dxa" w:w="0"/>
+            </w:tcMar>
+          </w:tcPr>
+          <w:p>
+            <w:pPr>
+              <w:spacing w:after="0" w:before="0"/>
+            </w:pPr>
+            <w:r>
+              <w:rPr>
+                <w:rFonts w:ascii="Calibri" w:cs="Calibri" w:eastAsia="Calibri" w:hAnsi="Calibri"/>
+                <w:sz w:val="22"/>
+                <w:szCs w:val="22"/>
+              </w:rPr>
+              <w:t xml:space="preserve"> </w:t>
+            </w:r>
+          </w:p>
+        </w:tc>
+      </w:tr>
       <w:tr>
         <w:trPr>
           <w:trHeight w:val="380" w:hRule="exact"/>

</xml_diff>

<commit_message>
workbook page 4 (Get a Grip): add reflection thought box + 'Certified EOS Implementer' subtitle
- New thoughtBox() helper: orange dashed border panel with italic quote,
  attribution, numbered questions, and ACTION line with underlined
  write-in spaces for To Do and Due Date.
- Ann Sheu subtitle now shows '(Certified EOS Implementer)' in italic.
- Reduced note lines to 15 to fit the reflection box on the same page.
</commit_message>
<xml_diff>
--- a/deliverables/workbook/Workbook.docx
+++ b/deliverables/workbook/Workbook.docx
@@ -5915,6 +5915,17 @@
         </w:rPr>
         <w:t xml:space="preserve">8:00 – 9:35 AM · Ann Sheu</w:t>
       </w:r>
+      <w:r>
+        <w:rPr>
+          <w:rFonts w:ascii="Calibri" w:cs="Calibri" w:eastAsia="Calibri" w:hAnsi="Calibri"/>
+          <w:i/>
+          <w:iCs/>
+          <w:color w:val="5A6B82"/>
+          <w:sz w:val="18"/>
+          <w:szCs w:val="18"/>
+        </w:rPr>
+        <w:t xml:space="preserve">  (Certified EOS Implementer)</w:t>
+      </w:r>
     </w:p>
     <w:tbl>
       <w:tblPr>
@@ -6456,352 +6467,202 @@
           </w:p>
         </w:tc>
       </w:tr>
+    </w:tbl>
+    <w:p>
+      <w:pPr>
+        <w:spacing w:after="200"/>
+      </w:pPr>
+      <w:r>
+        <w:t xml:space="preserve"/>
+      </w:r>
+    </w:p>
+    <w:tbl>
+      <w:tblPr>
+        <w:tblW w:type="dxa" w:w="10080"/>
+        <w:tblBorders>
+          <w:top w:val="single" w:color="auto" w:sz="4"/>
+          <w:left w:val="single" w:color="auto" w:sz="4"/>
+          <w:bottom w:val="single" w:color="auto" w:sz="4"/>
+          <w:right w:val="single" w:color="auto" w:sz="4"/>
+          <w:insideH w:val="single" w:color="auto" w:sz="4"/>
+          <w:insideV w:val="single" w:color="auto" w:sz="4"/>
+        </w:tblBorders>
+      </w:tblPr>
+      <w:tblGrid>
+        <w:gridCol w:w="10080"/>
+      </w:tblGrid>
       <w:tr>
         <w:trPr>
-          <w:trHeight w:val="470" w:hRule="exact"/>
+          <w:cantSplit/>
         </w:trPr>
         <w:tc>
           <w:tcPr>
             <w:tcW w:type="dxa" w:w="10080"/>
             <w:tcBorders>
-              <w:top w:val="none" w:color="FFFFFF" w:sz="0"/>
-              <w:left w:val="none" w:color="FFFFFF" w:sz="0"/>
-              <w:bottom w:val="single" w:color="C9D2DE" w:sz="4"/>
-              <w:right w:val="none" w:color="FFFFFF" w:sz="0"/>
-            </w:tcBorders>
-            <w:tcMar>
-              <w:top w:type="dxa" w:w="0"/>
-              <w:left w:type="dxa" w:w="0"/>
-              <w:bottom w:type="dxa" w:w="0"/>
-              <w:right w:type="dxa" w:w="0"/>
-            </w:tcMar>
-          </w:tcPr>
-          <w:p>
-            <w:pPr>
-              <w:spacing w:after="0" w:before="0"/>
-            </w:pPr>
-            <w:r>
-              <w:rPr>
-                <w:rFonts w:ascii="Calibri" w:cs="Calibri" w:eastAsia="Calibri" w:hAnsi="Calibri"/>
+              <w:top w:val="dashSmallGap" w:color="E87722" w:sz="12"/>
+              <w:left w:val="dashSmallGap" w:color="E87722" w:sz="12"/>
+              <w:bottom w:val="dashSmallGap" w:color="E87722" w:sz="12"/>
+              <w:right w:val="dashSmallGap" w:color="E87722" w:sz="12"/>
+            </w:tcBorders>
+            <w:shd w:fill="FFFFFF" w:color="auto" w:val="clear"/>
+            <w:tcMar>
+              <w:top w:type="dxa" w:w="240"/>
+              <w:left w:type="dxa" w:w="300"/>
+              <w:bottom w:type="dxa" w:w="240"/>
+              <w:right w:type="dxa" w:w="300"/>
+            </w:tcMar>
+          </w:tcPr>
+          <w:p>
+            <w:pPr>
+              <w:spacing w:after="40"/>
+              <w:jc w:val="left"/>
+            </w:pPr>
+            <w:r>
+              <w:rPr>
+                <w:rFonts w:ascii="Calibri" w:cs="Calibri" w:eastAsia="Calibri" w:hAnsi="Calibri"/>
+                <w:i/>
+                <w:iCs/>
+                <w:color w:val="0B1F3A"/>
                 <w:sz w:val="22"/>
                 <w:szCs w:val="22"/>
               </w:rPr>
-              <w:t xml:space="preserve"> </w:t>
-            </w:r>
-          </w:p>
-        </w:tc>
-      </w:tr>
-      <w:tr>
-        <w:trPr>
-          <w:trHeight w:val="470" w:hRule="exact"/>
-        </w:trPr>
-        <w:tc>
-          <w:tcPr>
-            <w:tcW w:type="dxa" w:w="10080"/>
-            <w:tcBorders>
-              <w:top w:val="none" w:color="FFFFFF" w:sz="0"/>
-              <w:left w:val="none" w:color="FFFFFF" w:sz="0"/>
-              <w:bottom w:val="single" w:color="C9D2DE" w:sz="4"/>
-              <w:right w:val="none" w:color="FFFFFF" w:sz="0"/>
-            </w:tcBorders>
-            <w:tcMar>
-              <w:top w:type="dxa" w:w="0"/>
-              <w:left w:type="dxa" w:w="0"/>
-              <w:bottom w:type="dxa" w:w="0"/>
-              <w:right w:type="dxa" w:w="0"/>
-            </w:tcMar>
-          </w:tcPr>
-          <w:p>
-            <w:pPr>
-              <w:spacing w:after="0" w:before="0"/>
-            </w:pPr>
-            <w:r>
-              <w:rPr>
-                <w:rFonts w:ascii="Calibri" w:cs="Calibri" w:eastAsia="Calibri" w:hAnsi="Calibri"/>
-                <w:sz w:val="22"/>
-                <w:szCs w:val="22"/>
-              </w:rPr>
-              <w:t xml:space="preserve"> </w:t>
-            </w:r>
-          </w:p>
-        </w:tc>
-      </w:tr>
-      <w:tr>
-        <w:trPr>
-          <w:trHeight w:val="470" w:hRule="exact"/>
-        </w:trPr>
-        <w:tc>
-          <w:tcPr>
-            <w:tcW w:type="dxa" w:w="10080"/>
-            <w:tcBorders>
-              <w:top w:val="none" w:color="FFFFFF" w:sz="0"/>
-              <w:left w:val="none" w:color="FFFFFF" w:sz="0"/>
-              <w:bottom w:val="single" w:color="C9D2DE" w:sz="4"/>
-              <w:right w:val="none" w:color="FFFFFF" w:sz="0"/>
-            </w:tcBorders>
-            <w:tcMar>
-              <w:top w:type="dxa" w:w="0"/>
-              <w:left w:type="dxa" w:w="0"/>
-              <w:bottom w:type="dxa" w:w="0"/>
-              <w:right w:type="dxa" w:w="0"/>
-            </w:tcMar>
-          </w:tcPr>
-          <w:p>
-            <w:pPr>
-              <w:spacing w:after="0" w:before="0"/>
-            </w:pPr>
-            <w:r>
-              <w:rPr>
-                <w:rFonts w:ascii="Calibri" w:cs="Calibri" w:eastAsia="Calibri" w:hAnsi="Calibri"/>
-                <w:sz w:val="22"/>
-                <w:szCs w:val="22"/>
-              </w:rPr>
-              <w:t xml:space="preserve"> </w:t>
-            </w:r>
-          </w:p>
-        </w:tc>
-      </w:tr>
-      <w:tr>
-        <w:trPr>
-          <w:trHeight w:val="470" w:hRule="exact"/>
-        </w:trPr>
-        <w:tc>
-          <w:tcPr>
-            <w:tcW w:type="dxa" w:w="10080"/>
-            <w:tcBorders>
-              <w:top w:val="none" w:color="FFFFFF" w:sz="0"/>
-              <w:left w:val="none" w:color="FFFFFF" w:sz="0"/>
-              <w:bottom w:val="single" w:color="C9D2DE" w:sz="4"/>
-              <w:right w:val="none" w:color="FFFFFF" w:sz="0"/>
-            </w:tcBorders>
-            <w:tcMar>
-              <w:top w:type="dxa" w:w="0"/>
-              <w:left w:type="dxa" w:w="0"/>
-              <w:bottom w:type="dxa" w:w="0"/>
-              <w:right w:type="dxa" w:w="0"/>
-            </w:tcMar>
-          </w:tcPr>
-          <w:p>
-            <w:pPr>
-              <w:spacing w:after="0" w:before="0"/>
-            </w:pPr>
-            <w:r>
-              <w:rPr>
-                <w:rFonts w:ascii="Calibri" w:cs="Calibri" w:eastAsia="Calibri" w:hAnsi="Calibri"/>
-                <w:sz w:val="22"/>
-                <w:szCs w:val="22"/>
-              </w:rPr>
-              <w:t xml:space="preserve"> </w:t>
-            </w:r>
-          </w:p>
-        </w:tc>
-      </w:tr>
-      <w:tr>
-        <w:trPr>
-          <w:trHeight w:val="470" w:hRule="exact"/>
-        </w:trPr>
-        <w:tc>
-          <w:tcPr>
-            <w:tcW w:type="dxa" w:w="10080"/>
-            <w:tcBorders>
-              <w:top w:val="none" w:color="FFFFFF" w:sz="0"/>
-              <w:left w:val="none" w:color="FFFFFF" w:sz="0"/>
-              <w:bottom w:val="single" w:color="C9D2DE" w:sz="4"/>
-              <w:right w:val="none" w:color="FFFFFF" w:sz="0"/>
-            </w:tcBorders>
-            <w:tcMar>
-              <w:top w:type="dxa" w:w="0"/>
-              <w:left w:type="dxa" w:w="0"/>
-              <w:bottom w:type="dxa" w:w="0"/>
-              <w:right w:type="dxa" w:w="0"/>
-            </w:tcMar>
-          </w:tcPr>
-          <w:p>
-            <w:pPr>
-              <w:spacing w:after="0" w:before="0"/>
-            </w:pPr>
-            <w:r>
-              <w:rPr>
-                <w:rFonts w:ascii="Calibri" w:cs="Calibri" w:eastAsia="Calibri" w:hAnsi="Calibri"/>
-                <w:sz w:val="22"/>
-                <w:szCs w:val="22"/>
-              </w:rPr>
-              <w:t xml:space="preserve"> </w:t>
-            </w:r>
-          </w:p>
-        </w:tc>
-      </w:tr>
-      <w:tr>
-        <w:trPr>
-          <w:trHeight w:val="470" w:hRule="exact"/>
-        </w:trPr>
-        <w:tc>
-          <w:tcPr>
-            <w:tcW w:type="dxa" w:w="10080"/>
-            <w:tcBorders>
-              <w:top w:val="none" w:color="FFFFFF" w:sz="0"/>
-              <w:left w:val="none" w:color="FFFFFF" w:sz="0"/>
-              <w:bottom w:val="single" w:color="C9D2DE" w:sz="4"/>
-              <w:right w:val="none" w:color="FFFFFF" w:sz="0"/>
-            </w:tcBorders>
-            <w:tcMar>
-              <w:top w:type="dxa" w:w="0"/>
-              <w:left w:type="dxa" w:w="0"/>
-              <w:bottom w:type="dxa" w:w="0"/>
-              <w:right w:type="dxa" w:w="0"/>
-            </w:tcMar>
-          </w:tcPr>
-          <w:p>
-            <w:pPr>
-              <w:spacing w:after="0" w:before="0"/>
-            </w:pPr>
-            <w:r>
-              <w:rPr>
-                <w:rFonts w:ascii="Calibri" w:cs="Calibri" w:eastAsia="Calibri" w:hAnsi="Calibri"/>
-                <w:sz w:val="22"/>
-                <w:szCs w:val="22"/>
-              </w:rPr>
-              <w:t xml:space="preserve"> </w:t>
-            </w:r>
-          </w:p>
-        </w:tc>
-      </w:tr>
-      <w:tr>
-        <w:trPr>
-          <w:trHeight w:val="470" w:hRule="exact"/>
-        </w:trPr>
-        <w:tc>
-          <w:tcPr>
-            <w:tcW w:type="dxa" w:w="10080"/>
-            <w:tcBorders>
-              <w:top w:val="none" w:color="FFFFFF" w:sz="0"/>
-              <w:left w:val="none" w:color="FFFFFF" w:sz="0"/>
-              <w:bottom w:val="single" w:color="C9D2DE" w:sz="4"/>
-              <w:right w:val="none" w:color="FFFFFF" w:sz="0"/>
-            </w:tcBorders>
-            <w:tcMar>
-              <w:top w:type="dxa" w:w="0"/>
-              <w:left w:type="dxa" w:w="0"/>
-              <w:bottom w:type="dxa" w:w="0"/>
-              <w:right w:type="dxa" w:w="0"/>
-            </w:tcMar>
-          </w:tcPr>
-          <w:p>
-            <w:pPr>
-              <w:spacing w:after="0" w:before="0"/>
-            </w:pPr>
-            <w:r>
-              <w:rPr>
-                <w:rFonts w:ascii="Calibri" w:cs="Calibri" w:eastAsia="Calibri" w:hAnsi="Calibri"/>
-                <w:sz w:val="22"/>
-                <w:szCs w:val="22"/>
-              </w:rPr>
-              <w:t xml:space="preserve"> </w:t>
-            </w:r>
-          </w:p>
-        </w:tc>
-      </w:tr>
-      <w:tr>
-        <w:trPr>
-          <w:trHeight w:val="470" w:hRule="exact"/>
-        </w:trPr>
-        <w:tc>
-          <w:tcPr>
-            <w:tcW w:type="dxa" w:w="10080"/>
-            <w:tcBorders>
-              <w:top w:val="none" w:color="FFFFFF" w:sz="0"/>
-              <w:left w:val="none" w:color="FFFFFF" w:sz="0"/>
-              <w:bottom w:val="single" w:color="C9D2DE" w:sz="4"/>
-              <w:right w:val="none" w:color="FFFFFF" w:sz="0"/>
-            </w:tcBorders>
-            <w:tcMar>
-              <w:top w:type="dxa" w:w="0"/>
-              <w:left w:type="dxa" w:w="0"/>
-              <w:bottom w:type="dxa" w:w="0"/>
-              <w:right w:type="dxa" w:w="0"/>
-            </w:tcMar>
-          </w:tcPr>
-          <w:p>
-            <w:pPr>
-              <w:spacing w:after="0" w:before="0"/>
-            </w:pPr>
-            <w:r>
-              <w:rPr>
-                <w:rFonts w:ascii="Calibri" w:cs="Calibri" w:eastAsia="Calibri" w:hAnsi="Calibri"/>
-                <w:sz w:val="22"/>
-                <w:szCs w:val="22"/>
-              </w:rPr>
-              <w:t xml:space="preserve"> </w:t>
-            </w:r>
-          </w:p>
-        </w:tc>
-      </w:tr>
-      <w:tr>
-        <w:trPr>
-          <w:trHeight w:val="470" w:hRule="exact"/>
-        </w:trPr>
-        <w:tc>
-          <w:tcPr>
-            <w:tcW w:type="dxa" w:w="10080"/>
-            <w:tcBorders>
-              <w:top w:val="none" w:color="FFFFFF" w:sz="0"/>
-              <w:left w:val="none" w:color="FFFFFF" w:sz="0"/>
-              <w:bottom w:val="single" w:color="C9D2DE" w:sz="4"/>
-              <w:right w:val="none" w:color="FFFFFF" w:sz="0"/>
-            </w:tcBorders>
-            <w:tcMar>
-              <w:top w:type="dxa" w:w="0"/>
-              <w:left w:type="dxa" w:w="0"/>
-              <w:bottom w:type="dxa" w:w="0"/>
-              <w:right w:type="dxa" w:w="0"/>
-            </w:tcMar>
-          </w:tcPr>
-          <w:p>
-            <w:pPr>
-              <w:spacing w:after="0" w:before="0"/>
-            </w:pPr>
-            <w:r>
-              <w:rPr>
-                <w:rFonts w:ascii="Calibri" w:cs="Calibri" w:eastAsia="Calibri" w:hAnsi="Calibri"/>
-                <w:sz w:val="22"/>
-                <w:szCs w:val="22"/>
-              </w:rPr>
-              <w:t xml:space="preserve"> </w:t>
-            </w:r>
-          </w:p>
-        </w:tc>
-      </w:tr>
-      <w:tr>
-        <w:trPr>
-          <w:trHeight w:val="470" w:hRule="exact"/>
-        </w:trPr>
-        <w:tc>
-          <w:tcPr>
-            <w:tcW w:type="dxa" w:w="10080"/>
-            <w:tcBorders>
-              <w:top w:val="none" w:color="FFFFFF" w:sz="0"/>
-              <w:left w:val="none" w:color="FFFFFF" w:sz="0"/>
-              <w:bottom w:val="single" w:color="C9D2DE" w:sz="4"/>
-              <w:right w:val="none" w:color="FFFFFF" w:sz="0"/>
-            </w:tcBorders>
-            <w:tcMar>
-              <w:top w:type="dxa" w:w="0"/>
-              <w:left w:type="dxa" w:w="0"/>
-              <w:bottom w:type="dxa" w:w="0"/>
-              <w:right w:type="dxa" w:w="0"/>
-            </w:tcMar>
-          </w:tcPr>
-          <w:p>
-            <w:pPr>
-              <w:spacing w:after="0" w:before="0"/>
-            </w:pPr>
-            <w:r>
-              <w:rPr>
-                <w:rFonts w:ascii="Calibri" w:cs="Calibri" w:eastAsia="Calibri" w:hAnsi="Calibri"/>
-                <w:sz w:val="22"/>
-                <w:szCs w:val="22"/>
-              </w:rPr>
-              <w:t xml:space="preserve"> </w:t>
+              <w:t xml:space="preserve">“Do you have a grip on your business, or does your business have a grip on you?”</w:t>
+            </w:r>
+          </w:p>
+          <w:p>
+            <w:pPr>
+              <w:spacing w:after="160"/>
+              <w:jc w:val="left"/>
+            </w:pPr>
+            <w:r>
+              <w:rPr>
+                <w:rFonts w:ascii="Calibri" w:cs="Calibri" w:eastAsia="Calibri" w:hAnsi="Calibri"/>
+                <w:color w:val="5A6B82"/>
+                <w:sz w:val="18"/>
+                <w:szCs w:val="18"/>
+              </w:rPr>
+              <w:t xml:space="preserve">— Gino Wickman, Traction</w:t>
+            </w:r>
+          </w:p>
+          <w:p>
+            <w:pPr>
+              <w:spacing w:after="60"/>
+              <w:ind w:left="200" w:hanging="200"/>
+              <w:jc w:val="left"/>
+            </w:pPr>
+            <w:r>
+              <w:rPr>
+                <w:rFonts w:ascii="Calibri" w:cs="Calibri" w:eastAsia="Calibri" w:hAnsi="Calibri"/>
+                <w:color w:val="1A1A1A"/>
+                <w:sz w:val="20"/>
+                <w:szCs w:val="20"/>
+              </w:rPr>
+              <w:t xml:space="preserve">1. Rate your grip on the business today, 1 to 10. What is the one thing that would move it a full point?</w:t>
+            </w:r>
+          </w:p>
+          <w:p>
+            <w:pPr>
+              <w:spacing w:after="60"/>
+              <w:ind w:left="200" w:hanging="200"/>
+              <w:jc w:val="left"/>
+            </w:pPr>
+            <w:r>
+              <w:rPr>
+                <w:rFonts w:ascii="Calibri" w:cs="Calibri" w:eastAsia="Calibri" w:hAnsi="Calibri"/>
+                <w:color w:val="1A1A1A"/>
+                <w:sz w:val="20"/>
+                <w:szCs w:val="20"/>
+              </w:rPr>
+              <w:t xml:space="preserve">2. Of the Six Key Components (Vision, People, Data, Issues, Process, Traction), which is weakest in your company? What is that weakness costing you every month?</w:t>
+            </w:r>
+          </w:p>
+          <w:p>
+            <w:pPr>
+              <w:spacing w:after="60"/>
+              <w:ind w:left="200" w:hanging="200"/>
+              <w:jc w:val="left"/>
+            </w:pPr>
+            <w:r>
+              <w:rPr>
+                <w:rFonts w:ascii="Calibri" w:cs="Calibri" w:eastAsia="Calibri" w:hAnsi="Calibri"/>
+                <w:color w:val="1A1A1A"/>
+                <w:sz w:val="20"/>
+                <w:szCs w:val="20"/>
+              </w:rPr>
+              <w:t xml:space="preserve">3. Where are you hitting the ceiling right now: the whole company, one department, or you personally?</w:t>
+            </w:r>
+          </w:p>
+          <w:p>
+            <w:pPr>
+              <w:spacing w:after="60"/>
+              <w:ind w:left="200" w:hanging="200"/>
+              <w:jc w:val="left"/>
+            </w:pPr>
+            <w:r>
+              <w:rPr>
+                <w:rFonts w:ascii="Calibri" w:cs="Calibri" w:eastAsia="Calibri" w:hAnsi="Calibri"/>
+                <w:color w:val="1A1A1A"/>
+                <w:sz w:val="20"/>
+                <w:szCs w:val="20"/>
+              </w:rPr>
+              <w:t xml:space="preserve">4. What are you holding onto that you would have to let go of for the business to grow past you?</w:t>
+            </w:r>
+          </w:p>
+          <w:p>
+            <w:pPr>
+              <w:spacing w:after="40" w:before="100"/>
+            </w:pPr>
+            <w:r>
+              <w:rPr>
+                <w:rFonts w:ascii="Calibri" w:cs="Calibri" w:eastAsia="Calibri" w:hAnsi="Calibri"/>
+                <w:b/>
+                <w:bCs/>
+                <w:color w:val="E87722"/>
+                <w:sz w:val="18"/>
+                <w:szCs w:val="18"/>
+              </w:rPr>
+              <w:t xml:space="preserve">ACTION:</w:t>
+            </w:r>
+          </w:p>
+          <w:p>
+            <w:pPr>
+              <w:spacing w:after="0"/>
+            </w:pPr>
+            <w:r>
+              <w:rPr>
+                <w:rFonts w:ascii="Calibri" w:cs="Calibri" w:eastAsia="Calibri" w:hAnsi="Calibri"/>
+                <w:color w:val="1A1A1A"/>
+                <w:sz w:val="20"/>
+                <w:szCs w:val="20"/>
+              </w:rPr>
+              <w:t xml:space="preserve">My To Do from this session is: </w:t>
+            </w:r>
+            <w:r>
+              <w:rPr>
+                <w:rFonts w:ascii="Calibri" w:cs="Calibri" w:eastAsia="Calibri" w:hAnsi="Calibri"/>
+                <w:color w:val="5A6B82"/>
+                <w:sz w:val="20"/>
+                <w:szCs w:val="20"/>
+              </w:rPr>
+              <w:t xml:space="preserve">_____________________________________________</w:t>
+            </w:r>
+            <w:r>
+              <w:rPr>
+                <w:rFonts w:ascii="Calibri" w:cs="Calibri" w:eastAsia="Calibri" w:hAnsi="Calibri"/>
+                <w:color w:val="1A1A1A"/>
+                <w:sz w:val="20"/>
+                <w:szCs w:val="20"/>
+              </w:rPr>
+              <w:t xml:space="preserve">  Due Date: </w:t>
+            </w:r>
+            <w:r>
+              <w:rPr>
+                <w:rFonts w:ascii="Calibri" w:cs="Calibri" w:eastAsia="Calibri" w:hAnsi="Calibri"/>
+                <w:color w:val="5A6B82"/>
+                <w:sz w:val="20"/>
+                <w:szCs w:val="20"/>
+              </w:rPr>
+              <w:t xml:space="preserve">______________</w:t>
             </w:r>
           </w:p>
         </w:tc>

</xml_diff>

<commit_message>
workbook page 5 (Journey with an EOS Implementer): add reflection thought box + speaker name
- Subtitle now shows 'Brian Dosal (Strety)' matching the Ann Sheu pattern
  (person + affiliation in italic).
- Reflection thought box: 'Let go of the vine.' (Gino Wickman, Traction)
  with 4 questions about advice not acted on, team watching vs. rowing,
  12-month growth, and the good-enough trap for self-implementers.
</commit_message>
<xml_diff>
--- a/deliverables/workbook/Workbook.docx
+++ b/deliverables/workbook/Workbook.docx
@@ -6705,7 +6705,18 @@
           <w:sz w:val="18"/>
           <w:szCs w:val="18"/>
         </w:rPr>
-        <w:t xml:space="preserve">9:55 – 10:45 AM · Strety</w:t>
+        <w:t xml:space="preserve">9:55 – 10:45 AM · Brian Dosal</w:t>
+      </w:r>
+      <w:r>
+        <w:rPr>
+          <w:rFonts w:ascii="Calibri" w:cs="Calibri" w:eastAsia="Calibri" w:hAnsi="Calibri"/>
+          <w:i/>
+          <w:iCs/>
+          <w:color w:val="5A6B82"/>
+          <w:sz w:val="18"/>
+          <w:szCs w:val="18"/>
+        </w:rPr>
+        <w:t xml:space="preserve">  (Strety)</w:t>
       </w:r>
     </w:p>
     <w:tbl>
@@ -7248,352 +7259,202 @@
           </w:p>
         </w:tc>
       </w:tr>
+    </w:tbl>
+    <w:p>
+      <w:pPr>
+        <w:spacing w:after="200"/>
+      </w:pPr>
+      <w:r>
+        <w:t xml:space="preserve"/>
+      </w:r>
+    </w:p>
+    <w:tbl>
+      <w:tblPr>
+        <w:tblW w:type="dxa" w:w="10080"/>
+        <w:tblBorders>
+          <w:top w:val="single" w:color="auto" w:sz="4"/>
+          <w:left w:val="single" w:color="auto" w:sz="4"/>
+          <w:bottom w:val="single" w:color="auto" w:sz="4"/>
+          <w:right w:val="single" w:color="auto" w:sz="4"/>
+          <w:insideH w:val="single" w:color="auto" w:sz="4"/>
+          <w:insideV w:val="single" w:color="auto" w:sz="4"/>
+        </w:tblBorders>
+      </w:tblPr>
+      <w:tblGrid>
+        <w:gridCol w:w="10080"/>
+      </w:tblGrid>
       <w:tr>
         <w:trPr>
-          <w:trHeight w:val="470" w:hRule="exact"/>
+          <w:cantSplit/>
         </w:trPr>
         <w:tc>
           <w:tcPr>
             <w:tcW w:type="dxa" w:w="10080"/>
             <w:tcBorders>
-              <w:top w:val="none" w:color="FFFFFF" w:sz="0"/>
-              <w:left w:val="none" w:color="FFFFFF" w:sz="0"/>
-              <w:bottom w:val="single" w:color="C9D2DE" w:sz="4"/>
-              <w:right w:val="none" w:color="FFFFFF" w:sz="0"/>
-            </w:tcBorders>
-            <w:tcMar>
-              <w:top w:type="dxa" w:w="0"/>
-              <w:left w:type="dxa" w:w="0"/>
-              <w:bottom w:type="dxa" w:w="0"/>
-              <w:right w:type="dxa" w:w="0"/>
-            </w:tcMar>
-          </w:tcPr>
-          <w:p>
-            <w:pPr>
-              <w:spacing w:after="0" w:before="0"/>
-            </w:pPr>
-            <w:r>
-              <w:rPr>
-                <w:rFonts w:ascii="Calibri" w:cs="Calibri" w:eastAsia="Calibri" w:hAnsi="Calibri"/>
+              <w:top w:val="dashSmallGap" w:color="E87722" w:sz="12"/>
+              <w:left w:val="dashSmallGap" w:color="E87722" w:sz="12"/>
+              <w:bottom w:val="dashSmallGap" w:color="E87722" w:sz="12"/>
+              <w:right w:val="dashSmallGap" w:color="E87722" w:sz="12"/>
+            </w:tcBorders>
+            <w:shd w:fill="FFFFFF" w:color="auto" w:val="clear"/>
+            <w:tcMar>
+              <w:top w:type="dxa" w:w="240"/>
+              <w:left w:type="dxa" w:w="300"/>
+              <w:bottom w:type="dxa" w:w="240"/>
+              <w:right w:type="dxa" w:w="300"/>
+            </w:tcMar>
+          </w:tcPr>
+          <w:p>
+            <w:pPr>
+              <w:spacing w:after="40"/>
+              <w:jc w:val="left"/>
+            </w:pPr>
+            <w:r>
+              <w:rPr>
+                <w:rFonts w:ascii="Calibri" w:cs="Calibri" w:eastAsia="Calibri" w:hAnsi="Calibri"/>
+                <w:i/>
+                <w:iCs/>
+                <w:color w:val="0B1F3A"/>
                 <w:sz w:val="22"/>
                 <w:szCs w:val="22"/>
               </w:rPr>
-              <w:t xml:space="preserve"> </w:t>
-            </w:r>
-          </w:p>
-        </w:tc>
-      </w:tr>
-      <w:tr>
-        <w:trPr>
-          <w:trHeight w:val="470" w:hRule="exact"/>
-        </w:trPr>
-        <w:tc>
-          <w:tcPr>
-            <w:tcW w:type="dxa" w:w="10080"/>
-            <w:tcBorders>
-              <w:top w:val="none" w:color="FFFFFF" w:sz="0"/>
-              <w:left w:val="none" w:color="FFFFFF" w:sz="0"/>
-              <w:bottom w:val="single" w:color="C9D2DE" w:sz="4"/>
-              <w:right w:val="none" w:color="FFFFFF" w:sz="0"/>
-            </w:tcBorders>
-            <w:tcMar>
-              <w:top w:type="dxa" w:w="0"/>
-              <w:left w:type="dxa" w:w="0"/>
-              <w:bottom w:type="dxa" w:w="0"/>
-              <w:right w:type="dxa" w:w="0"/>
-            </w:tcMar>
-          </w:tcPr>
-          <w:p>
-            <w:pPr>
-              <w:spacing w:after="0" w:before="0"/>
-            </w:pPr>
-            <w:r>
-              <w:rPr>
-                <w:rFonts w:ascii="Calibri" w:cs="Calibri" w:eastAsia="Calibri" w:hAnsi="Calibri"/>
-                <w:sz w:val="22"/>
-                <w:szCs w:val="22"/>
-              </w:rPr>
-              <w:t xml:space="preserve"> </w:t>
-            </w:r>
-          </w:p>
-        </w:tc>
-      </w:tr>
-      <w:tr>
-        <w:trPr>
-          <w:trHeight w:val="470" w:hRule="exact"/>
-        </w:trPr>
-        <w:tc>
-          <w:tcPr>
-            <w:tcW w:type="dxa" w:w="10080"/>
-            <w:tcBorders>
-              <w:top w:val="none" w:color="FFFFFF" w:sz="0"/>
-              <w:left w:val="none" w:color="FFFFFF" w:sz="0"/>
-              <w:bottom w:val="single" w:color="C9D2DE" w:sz="4"/>
-              <w:right w:val="none" w:color="FFFFFF" w:sz="0"/>
-            </w:tcBorders>
-            <w:tcMar>
-              <w:top w:type="dxa" w:w="0"/>
-              <w:left w:type="dxa" w:w="0"/>
-              <w:bottom w:type="dxa" w:w="0"/>
-              <w:right w:type="dxa" w:w="0"/>
-            </w:tcMar>
-          </w:tcPr>
-          <w:p>
-            <w:pPr>
-              <w:spacing w:after="0" w:before="0"/>
-            </w:pPr>
-            <w:r>
-              <w:rPr>
-                <w:rFonts w:ascii="Calibri" w:cs="Calibri" w:eastAsia="Calibri" w:hAnsi="Calibri"/>
-                <w:sz w:val="22"/>
-                <w:szCs w:val="22"/>
-              </w:rPr>
-              <w:t xml:space="preserve"> </w:t>
-            </w:r>
-          </w:p>
-        </w:tc>
-      </w:tr>
-      <w:tr>
-        <w:trPr>
-          <w:trHeight w:val="470" w:hRule="exact"/>
-        </w:trPr>
-        <w:tc>
-          <w:tcPr>
-            <w:tcW w:type="dxa" w:w="10080"/>
-            <w:tcBorders>
-              <w:top w:val="none" w:color="FFFFFF" w:sz="0"/>
-              <w:left w:val="none" w:color="FFFFFF" w:sz="0"/>
-              <w:bottom w:val="single" w:color="C9D2DE" w:sz="4"/>
-              <w:right w:val="none" w:color="FFFFFF" w:sz="0"/>
-            </w:tcBorders>
-            <w:tcMar>
-              <w:top w:type="dxa" w:w="0"/>
-              <w:left w:type="dxa" w:w="0"/>
-              <w:bottom w:type="dxa" w:w="0"/>
-              <w:right w:type="dxa" w:w="0"/>
-            </w:tcMar>
-          </w:tcPr>
-          <w:p>
-            <w:pPr>
-              <w:spacing w:after="0" w:before="0"/>
-            </w:pPr>
-            <w:r>
-              <w:rPr>
-                <w:rFonts w:ascii="Calibri" w:cs="Calibri" w:eastAsia="Calibri" w:hAnsi="Calibri"/>
-                <w:sz w:val="22"/>
-                <w:szCs w:val="22"/>
-              </w:rPr>
-              <w:t xml:space="preserve"> </w:t>
-            </w:r>
-          </w:p>
-        </w:tc>
-      </w:tr>
-      <w:tr>
-        <w:trPr>
-          <w:trHeight w:val="470" w:hRule="exact"/>
-        </w:trPr>
-        <w:tc>
-          <w:tcPr>
-            <w:tcW w:type="dxa" w:w="10080"/>
-            <w:tcBorders>
-              <w:top w:val="none" w:color="FFFFFF" w:sz="0"/>
-              <w:left w:val="none" w:color="FFFFFF" w:sz="0"/>
-              <w:bottom w:val="single" w:color="C9D2DE" w:sz="4"/>
-              <w:right w:val="none" w:color="FFFFFF" w:sz="0"/>
-            </w:tcBorders>
-            <w:tcMar>
-              <w:top w:type="dxa" w:w="0"/>
-              <w:left w:type="dxa" w:w="0"/>
-              <w:bottom w:type="dxa" w:w="0"/>
-              <w:right w:type="dxa" w:w="0"/>
-            </w:tcMar>
-          </w:tcPr>
-          <w:p>
-            <w:pPr>
-              <w:spacing w:after="0" w:before="0"/>
-            </w:pPr>
-            <w:r>
-              <w:rPr>
-                <w:rFonts w:ascii="Calibri" w:cs="Calibri" w:eastAsia="Calibri" w:hAnsi="Calibri"/>
-                <w:sz w:val="22"/>
-                <w:szCs w:val="22"/>
-              </w:rPr>
-              <w:t xml:space="preserve"> </w:t>
-            </w:r>
-          </w:p>
-        </w:tc>
-      </w:tr>
-      <w:tr>
-        <w:trPr>
-          <w:trHeight w:val="470" w:hRule="exact"/>
-        </w:trPr>
-        <w:tc>
-          <w:tcPr>
-            <w:tcW w:type="dxa" w:w="10080"/>
-            <w:tcBorders>
-              <w:top w:val="none" w:color="FFFFFF" w:sz="0"/>
-              <w:left w:val="none" w:color="FFFFFF" w:sz="0"/>
-              <w:bottom w:val="single" w:color="C9D2DE" w:sz="4"/>
-              <w:right w:val="none" w:color="FFFFFF" w:sz="0"/>
-            </w:tcBorders>
-            <w:tcMar>
-              <w:top w:type="dxa" w:w="0"/>
-              <w:left w:type="dxa" w:w="0"/>
-              <w:bottom w:type="dxa" w:w="0"/>
-              <w:right w:type="dxa" w:w="0"/>
-            </w:tcMar>
-          </w:tcPr>
-          <w:p>
-            <w:pPr>
-              <w:spacing w:after="0" w:before="0"/>
-            </w:pPr>
-            <w:r>
-              <w:rPr>
-                <w:rFonts w:ascii="Calibri" w:cs="Calibri" w:eastAsia="Calibri" w:hAnsi="Calibri"/>
-                <w:sz w:val="22"/>
-                <w:szCs w:val="22"/>
-              </w:rPr>
-              <w:t xml:space="preserve"> </w:t>
-            </w:r>
-          </w:p>
-        </w:tc>
-      </w:tr>
-      <w:tr>
-        <w:trPr>
-          <w:trHeight w:val="470" w:hRule="exact"/>
-        </w:trPr>
-        <w:tc>
-          <w:tcPr>
-            <w:tcW w:type="dxa" w:w="10080"/>
-            <w:tcBorders>
-              <w:top w:val="none" w:color="FFFFFF" w:sz="0"/>
-              <w:left w:val="none" w:color="FFFFFF" w:sz="0"/>
-              <w:bottom w:val="single" w:color="C9D2DE" w:sz="4"/>
-              <w:right w:val="none" w:color="FFFFFF" w:sz="0"/>
-            </w:tcBorders>
-            <w:tcMar>
-              <w:top w:type="dxa" w:w="0"/>
-              <w:left w:type="dxa" w:w="0"/>
-              <w:bottom w:type="dxa" w:w="0"/>
-              <w:right w:type="dxa" w:w="0"/>
-            </w:tcMar>
-          </w:tcPr>
-          <w:p>
-            <w:pPr>
-              <w:spacing w:after="0" w:before="0"/>
-            </w:pPr>
-            <w:r>
-              <w:rPr>
-                <w:rFonts w:ascii="Calibri" w:cs="Calibri" w:eastAsia="Calibri" w:hAnsi="Calibri"/>
-                <w:sz w:val="22"/>
-                <w:szCs w:val="22"/>
-              </w:rPr>
-              <w:t xml:space="preserve"> </w:t>
-            </w:r>
-          </w:p>
-        </w:tc>
-      </w:tr>
-      <w:tr>
-        <w:trPr>
-          <w:trHeight w:val="470" w:hRule="exact"/>
-        </w:trPr>
-        <w:tc>
-          <w:tcPr>
-            <w:tcW w:type="dxa" w:w="10080"/>
-            <w:tcBorders>
-              <w:top w:val="none" w:color="FFFFFF" w:sz="0"/>
-              <w:left w:val="none" w:color="FFFFFF" w:sz="0"/>
-              <w:bottom w:val="single" w:color="C9D2DE" w:sz="4"/>
-              <w:right w:val="none" w:color="FFFFFF" w:sz="0"/>
-            </w:tcBorders>
-            <w:tcMar>
-              <w:top w:type="dxa" w:w="0"/>
-              <w:left w:type="dxa" w:w="0"/>
-              <w:bottom w:type="dxa" w:w="0"/>
-              <w:right w:type="dxa" w:w="0"/>
-            </w:tcMar>
-          </w:tcPr>
-          <w:p>
-            <w:pPr>
-              <w:spacing w:after="0" w:before="0"/>
-            </w:pPr>
-            <w:r>
-              <w:rPr>
-                <w:rFonts w:ascii="Calibri" w:cs="Calibri" w:eastAsia="Calibri" w:hAnsi="Calibri"/>
-                <w:sz w:val="22"/>
-                <w:szCs w:val="22"/>
-              </w:rPr>
-              <w:t xml:space="preserve"> </w:t>
-            </w:r>
-          </w:p>
-        </w:tc>
-      </w:tr>
-      <w:tr>
-        <w:trPr>
-          <w:trHeight w:val="470" w:hRule="exact"/>
-        </w:trPr>
-        <w:tc>
-          <w:tcPr>
-            <w:tcW w:type="dxa" w:w="10080"/>
-            <w:tcBorders>
-              <w:top w:val="none" w:color="FFFFFF" w:sz="0"/>
-              <w:left w:val="none" w:color="FFFFFF" w:sz="0"/>
-              <w:bottom w:val="single" w:color="C9D2DE" w:sz="4"/>
-              <w:right w:val="none" w:color="FFFFFF" w:sz="0"/>
-            </w:tcBorders>
-            <w:tcMar>
-              <w:top w:type="dxa" w:w="0"/>
-              <w:left w:type="dxa" w:w="0"/>
-              <w:bottom w:type="dxa" w:w="0"/>
-              <w:right w:type="dxa" w:w="0"/>
-            </w:tcMar>
-          </w:tcPr>
-          <w:p>
-            <w:pPr>
-              <w:spacing w:after="0" w:before="0"/>
-            </w:pPr>
-            <w:r>
-              <w:rPr>
-                <w:rFonts w:ascii="Calibri" w:cs="Calibri" w:eastAsia="Calibri" w:hAnsi="Calibri"/>
-                <w:sz w:val="22"/>
-                <w:szCs w:val="22"/>
-              </w:rPr>
-              <w:t xml:space="preserve"> </w:t>
-            </w:r>
-          </w:p>
-        </w:tc>
-      </w:tr>
-      <w:tr>
-        <w:trPr>
-          <w:trHeight w:val="470" w:hRule="exact"/>
-        </w:trPr>
-        <w:tc>
-          <w:tcPr>
-            <w:tcW w:type="dxa" w:w="10080"/>
-            <w:tcBorders>
-              <w:top w:val="none" w:color="FFFFFF" w:sz="0"/>
-              <w:left w:val="none" w:color="FFFFFF" w:sz="0"/>
-              <w:bottom w:val="single" w:color="C9D2DE" w:sz="4"/>
-              <w:right w:val="none" w:color="FFFFFF" w:sz="0"/>
-            </w:tcBorders>
-            <w:tcMar>
-              <w:top w:type="dxa" w:w="0"/>
-              <w:left w:type="dxa" w:w="0"/>
-              <w:bottom w:type="dxa" w:w="0"/>
-              <w:right w:type="dxa" w:w="0"/>
-            </w:tcMar>
-          </w:tcPr>
-          <w:p>
-            <w:pPr>
-              <w:spacing w:after="0" w:before="0"/>
-            </w:pPr>
-            <w:r>
-              <w:rPr>
-                <w:rFonts w:ascii="Calibri" w:cs="Calibri" w:eastAsia="Calibri" w:hAnsi="Calibri"/>
-                <w:sz w:val="22"/>
-                <w:szCs w:val="22"/>
-              </w:rPr>
-              <w:t xml:space="preserve"> </w:t>
+              <w:t xml:space="preserve">“Let go of the vine.”</w:t>
+            </w:r>
+          </w:p>
+          <w:p>
+            <w:pPr>
+              <w:spacing w:after="160"/>
+              <w:jc w:val="left"/>
+            </w:pPr>
+            <w:r>
+              <w:rPr>
+                <w:rFonts w:ascii="Calibri" w:cs="Calibri" w:eastAsia="Calibri" w:hAnsi="Calibri"/>
+                <w:color w:val="5A6B82"/>
+                <w:sz w:val="18"/>
+                <w:szCs w:val="18"/>
+              </w:rPr>
+              <w:t xml:space="preserve">— Gino Wickman, Traction</w:t>
+            </w:r>
+          </w:p>
+          <w:p>
+            <w:pPr>
+              <w:spacing w:after="60"/>
+              <w:ind w:left="200" w:hanging="200"/>
+              <w:jc w:val="left"/>
+            </w:pPr>
+            <w:r>
+              <w:rPr>
+                <w:rFonts w:ascii="Calibri" w:cs="Calibri" w:eastAsia="Calibri" w:hAnsi="Calibri"/>
+                <w:color w:val="1A1A1A"/>
+                <w:sz w:val="20"/>
+                <w:szCs w:val="20"/>
+              </w:rPr>
+              <w:t xml:space="preserve">1. What has an Implementer, a peer, or this room already told you that you have not acted on? What is really stopping you?</w:t>
+            </w:r>
+          </w:p>
+          <w:p>
+            <w:pPr>
+              <w:spacing w:after="60"/>
+              <w:ind w:left="200" w:hanging="200"/>
+              <w:jc w:val="left"/>
+            </w:pPr>
+            <w:r>
+              <w:rPr>
+                <w:rFonts w:ascii="Calibri" w:cs="Calibri" w:eastAsia="Calibri" w:hAnsi="Calibri"/>
+                <w:color w:val="1A1A1A"/>
+                <w:sz w:val="20"/>
+                <w:szCs w:val="20"/>
+              </w:rPr>
+              <w:t xml:space="preserve">2. Who on your leadership team is watching the journey instead of rowing? What conversation are you avoiding with them?</w:t>
+            </w:r>
+          </w:p>
+          <w:p>
+            <w:pPr>
+              <w:spacing w:after="60"/>
+              <w:ind w:left="200" w:hanging="200"/>
+              <w:jc w:val="left"/>
+            </w:pPr>
+            <w:r>
+              <w:rPr>
+                <w:rFonts w:ascii="Calibri" w:cs="Calibri" w:eastAsia="Calibri" w:hAnsi="Calibri"/>
+                <w:color w:val="1A1A1A"/>
+                <w:sz w:val="20"/>
+                <w:szCs w:val="20"/>
+              </w:rPr>
+              <w:t xml:space="preserve">3. Twelve months from today, what will your team say is different about you, not just the company?</w:t>
+            </w:r>
+          </w:p>
+          <w:p>
+            <w:pPr>
+              <w:spacing w:after="60"/>
+              <w:ind w:left="200" w:hanging="200"/>
+              <w:jc w:val="left"/>
+            </w:pPr>
+            <w:r>
+              <w:rPr>
+                <w:rFonts w:ascii="Calibri" w:cs="Calibri" w:eastAsia="Calibri" w:hAnsi="Calibri"/>
+                <w:color w:val="1A1A1A"/>
+                <w:sz w:val="20"/>
+                <w:szCs w:val="20"/>
+              </w:rPr>
+              <w:t xml:space="preserve">4. If you are self-implementing, where has “good enough” quietly become the standard?</w:t>
+            </w:r>
+          </w:p>
+          <w:p>
+            <w:pPr>
+              <w:spacing w:after="40" w:before="100"/>
+            </w:pPr>
+            <w:r>
+              <w:rPr>
+                <w:rFonts w:ascii="Calibri" w:cs="Calibri" w:eastAsia="Calibri" w:hAnsi="Calibri"/>
+                <w:b/>
+                <w:bCs/>
+                <w:color w:val="E87722"/>
+                <w:sz w:val="18"/>
+                <w:szCs w:val="18"/>
+              </w:rPr>
+              <w:t xml:space="preserve">ACTION:</w:t>
+            </w:r>
+          </w:p>
+          <w:p>
+            <w:pPr>
+              <w:spacing w:after="0"/>
+            </w:pPr>
+            <w:r>
+              <w:rPr>
+                <w:rFonts w:ascii="Calibri" w:cs="Calibri" w:eastAsia="Calibri" w:hAnsi="Calibri"/>
+                <w:color w:val="1A1A1A"/>
+                <w:sz w:val="20"/>
+                <w:szCs w:val="20"/>
+              </w:rPr>
+              <w:t xml:space="preserve">My To Do from this session is: </w:t>
+            </w:r>
+            <w:r>
+              <w:rPr>
+                <w:rFonts w:ascii="Calibri" w:cs="Calibri" w:eastAsia="Calibri" w:hAnsi="Calibri"/>
+                <w:color w:val="5A6B82"/>
+                <w:sz w:val="20"/>
+                <w:szCs w:val="20"/>
+              </w:rPr>
+              <w:t xml:space="preserve">_____________________________________________</w:t>
+            </w:r>
+            <w:r>
+              <w:rPr>
+                <w:rFonts w:ascii="Calibri" w:cs="Calibri" w:eastAsia="Calibri" w:hAnsi="Calibri"/>
+                <w:color w:val="1A1A1A"/>
+                <w:sz w:val="20"/>
+                <w:szCs w:val="20"/>
+              </w:rPr>
+              <w:t xml:space="preserve">  Due Date: </w:t>
+            </w:r>
+            <w:r>
+              <w:rPr>
+                <w:rFonts w:ascii="Calibri" w:cs="Calibri" w:eastAsia="Calibri" w:hAnsi="Calibri"/>
+                <w:color w:val="5A6B82"/>
+                <w:sz w:val="20"/>
+                <w:szCs w:val="20"/>
+              </w:rPr>
+              <w:t xml:space="preserve">______________</w:t>
             </w:r>
           </w:p>
         </w:tc>

</xml_diff>

<commit_message>
workbook page 6 (Your Sales Team Isn't the Problem): add reflection thought box + speaker name
- Subtitle now shows 'Steve Heroux (The System of Selling)'.
- Reflection thought box: 'Systemize the predictable so you can humanize
  the exceptional.' (Isadore Sharp, Founder of Four Seasons) with 4
  questions on salesperson dependence, process documentation, leading
  indicators, and pipeline leak root cause.
</commit_message>
<xml_diff>
--- a/deliverables/workbook/Workbook.docx
+++ b/deliverables/workbook/Workbook.docx
@@ -7497,7 +7497,18 @@
           <w:sz w:val="18"/>
           <w:szCs w:val="18"/>
         </w:rPr>
-        <w:t xml:space="preserve">11:00 AM – 12:00 PM · The System of Selling</w:t>
+        <w:t xml:space="preserve">11:00 AM – 12:00 PM · Steve Heroux</w:t>
+      </w:r>
+      <w:r>
+        <w:rPr>
+          <w:rFonts w:ascii="Calibri" w:cs="Calibri" w:eastAsia="Calibri" w:hAnsi="Calibri"/>
+          <w:i/>
+          <w:iCs/>
+          <w:color w:val="5A6B82"/>
+          <w:sz w:val="18"/>
+          <w:szCs w:val="18"/>
+        </w:rPr>
+        <w:t xml:space="preserve">  (The System of Selling)</w:t>
       </w:r>
     </w:p>
     <w:tbl>
@@ -8040,352 +8051,202 @@
           </w:p>
         </w:tc>
       </w:tr>
+    </w:tbl>
+    <w:p>
+      <w:pPr>
+        <w:spacing w:after="200"/>
+      </w:pPr>
+      <w:r>
+        <w:t xml:space="preserve"/>
+      </w:r>
+    </w:p>
+    <w:tbl>
+      <w:tblPr>
+        <w:tblW w:type="dxa" w:w="10080"/>
+        <w:tblBorders>
+          <w:top w:val="single" w:color="auto" w:sz="4"/>
+          <w:left w:val="single" w:color="auto" w:sz="4"/>
+          <w:bottom w:val="single" w:color="auto" w:sz="4"/>
+          <w:right w:val="single" w:color="auto" w:sz="4"/>
+          <w:insideH w:val="single" w:color="auto" w:sz="4"/>
+          <w:insideV w:val="single" w:color="auto" w:sz="4"/>
+        </w:tblBorders>
+      </w:tblPr>
+      <w:tblGrid>
+        <w:gridCol w:w="10080"/>
+      </w:tblGrid>
       <w:tr>
         <w:trPr>
-          <w:trHeight w:val="470" w:hRule="exact"/>
+          <w:cantSplit/>
         </w:trPr>
         <w:tc>
           <w:tcPr>
             <w:tcW w:type="dxa" w:w="10080"/>
             <w:tcBorders>
-              <w:top w:val="none" w:color="FFFFFF" w:sz="0"/>
-              <w:left w:val="none" w:color="FFFFFF" w:sz="0"/>
-              <w:bottom w:val="single" w:color="C9D2DE" w:sz="4"/>
-              <w:right w:val="none" w:color="FFFFFF" w:sz="0"/>
-            </w:tcBorders>
-            <w:tcMar>
-              <w:top w:type="dxa" w:w="0"/>
-              <w:left w:type="dxa" w:w="0"/>
-              <w:bottom w:type="dxa" w:w="0"/>
-              <w:right w:type="dxa" w:w="0"/>
-            </w:tcMar>
-          </w:tcPr>
-          <w:p>
-            <w:pPr>
-              <w:spacing w:after="0" w:before="0"/>
-            </w:pPr>
-            <w:r>
-              <w:rPr>
-                <w:rFonts w:ascii="Calibri" w:cs="Calibri" w:eastAsia="Calibri" w:hAnsi="Calibri"/>
+              <w:top w:val="dashSmallGap" w:color="E87722" w:sz="12"/>
+              <w:left w:val="dashSmallGap" w:color="E87722" w:sz="12"/>
+              <w:bottom w:val="dashSmallGap" w:color="E87722" w:sz="12"/>
+              <w:right w:val="dashSmallGap" w:color="E87722" w:sz="12"/>
+            </w:tcBorders>
+            <w:shd w:fill="FFFFFF" w:color="auto" w:val="clear"/>
+            <w:tcMar>
+              <w:top w:type="dxa" w:w="240"/>
+              <w:left w:type="dxa" w:w="300"/>
+              <w:bottom w:type="dxa" w:w="240"/>
+              <w:right w:type="dxa" w:w="300"/>
+            </w:tcMar>
+          </w:tcPr>
+          <w:p>
+            <w:pPr>
+              <w:spacing w:after="40"/>
+              <w:jc w:val="left"/>
+            </w:pPr>
+            <w:r>
+              <w:rPr>
+                <w:rFonts w:ascii="Calibri" w:cs="Calibri" w:eastAsia="Calibri" w:hAnsi="Calibri"/>
+                <w:i/>
+                <w:iCs/>
+                <w:color w:val="0B1F3A"/>
                 <w:sz w:val="22"/>
                 <w:szCs w:val="22"/>
               </w:rPr>
-              <w:t xml:space="preserve"> </w:t>
-            </w:r>
-          </w:p>
-        </w:tc>
-      </w:tr>
-      <w:tr>
-        <w:trPr>
-          <w:trHeight w:val="470" w:hRule="exact"/>
-        </w:trPr>
-        <w:tc>
-          <w:tcPr>
-            <w:tcW w:type="dxa" w:w="10080"/>
-            <w:tcBorders>
-              <w:top w:val="none" w:color="FFFFFF" w:sz="0"/>
-              <w:left w:val="none" w:color="FFFFFF" w:sz="0"/>
-              <w:bottom w:val="single" w:color="C9D2DE" w:sz="4"/>
-              <w:right w:val="none" w:color="FFFFFF" w:sz="0"/>
-            </w:tcBorders>
-            <w:tcMar>
-              <w:top w:type="dxa" w:w="0"/>
-              <w:left w:type="dxa" w:w="0"/>
-              <w:bottom w:type="dxa" w:w="0"/>
-              <w:right w:type="dxa" w:w="0"/>
-            </w:tcMar>
-          </w:tcPr>
-          <w:p>
-            <w:pPr>
-              <w:spacing w:after="0" w:before="0"/>
-            </w:pPr>
-            <w:r>
-              <w:rPr>
-                <w:rFonts w:ascii="Calibri" w:cs="Calibri" w:eastAsia="Calibri" w:hAnsi="Calibri"/>
-                <w:sz w:val="22"/>
-                <w:szCs w:val="22"/>
-              </w:rPr>
-              <w:t xml:space="preserve"> </w:t>
-            </w:r>
-          </w:p>
-        </w:tc>
-      </w:tr>
-      <w:tr>
-        <w:trPr>
-          <w:trHeight w:val="470" w:hRule="exact"/>
-        </w:trPr>
-        <w:tc>
-          <w:tcPr>
-            <w:tcW w:type="dxa" w:w="10080"/>
-            <w:tcBorders>
-              <w:top w:val="none" w:color="FFFFFF" w:sz="0"/>
-              <w:left w:val="none" w:color="FFFFFF" w:sz="0"/>
-              <w:bottom w:val="single" w:color="C9D2DE" w:sz="4"/>
-              <w:right w:val="none" w:color="FFFFFF" w:sz="0"/>
-            </w:tcBorders>
-            <w:tcMar>
-              <w:top w:type="dxa" w:w="0"/>
-              <w:left w:type="dxa" w:w="0"/>
-              <w:bottom w:type="dxa" w:w="0"/>
-              <w:right w:type="dxa" w:w="0"/>
-            </w:tcMar>
-          </w:tcPr>
-          <w:p>
-            <w:pPr>
-              <w:spacing w:after="0" w:before="0"/>
-            </w:pPr>
-            <w:r>
-              <w:rPr>
-                <w:rFonts w:ascii="Calibri" w:cs="Calibri" w:eastAsia="Calibri" w:hAnsi="Calibri"/>
-                <w:sz w:val="22"/>
-                <w:szCs w:val="22"/>
-              </w:rPr>
-              <w:t xml:space="preserve"> </w:t>
-            </w:r>
-          </w:p>
-        </w:tc>
-      </w:tr>
-      <w:tr>
-        <w:trPr>
-          <w:trHeight w:val="470" w:hRule="exact"/>
-        </w:trPr>
-        <w:tc>
-          <w:tcPr>
-            <w:tcW w:type="dxa" w:w="10080"/>
-            <w:tcBorders>
-              <w:top w:val="none" w:color="FFFFFF" w:sz="0"/>
-              <w:left w:val="none" w:color="FFFFFF" w:sz="0"/>
-              <w:bottom w:val="single" w:color="C9D2DE" w:sz="4"/>
-              <w:right w:val="none" w:color="FFFFFF" w:sz="0"/>
-            </w:tcBorders>
-            <w:tcMar>
-              <w:top w:type="dxa" w:w="0"/>
-              <w:left w:type="dxa" w:w="0"/>
-              <w:bottom w:type="dxa" w:w="0"/>
-              <w:right w:type="dxa" w:w="0"/>
-            </w:tcMar>
-          </w:tcPr>
-          <w:p>
-            <w:pPr>
-              <w:spacing w:after="0" w:before="0"/>
-            </w:pPr>
-            <w:r>
-              <w:rPr>
-                <w:rFonts w:ascii="Calibri" w:cs="Calibri" w:eastAsia="Calibri" w:hAnsi="Calibri"/>
-                <w:sz w:val="22"/>
-                <w:szCs w:val="22"/>
-              </w:rPr>
-              <w:t xml:space="preserve"> </w:t>
-            </w:r>
-          </w:p>
-        </w:tc>
-      </w:tr>
-      <w:tr>
-        <w:trPr>
-          <w:trHeight w:val="470" w:hRule="exact"/>
-        </w:trPr>
-        <w:tc>
-          <w:tcPr>
-            <w:tcW w:type="dxa" w:w="10080"/>
-            <w:tcBorders>
-              <w:top w:val="none" w:color="FFFFFF" w:sz="0"/>
-              <w:left w:val="none" w:color="FFFFFF" w:sz="0"/>
-              <w:bottom w:val="single" w:color="C9D2DE" w:sz="4"/>
-              <w:right w:val="none" w:color="FFFFFF" w:sz="0"/>
-            </w:tcBorders>
-            <w:tcMar>
-              <w:top w:type="dxa" w:w="0"/>
-              <w:left w:type="dxa" w:w="0"/>
-              <w:bottom w:type="dxa" w:w="0"/>
-              <w:right w:type="dxa" w:w="0"/>
-            </w:tcMar>
-          </w:tcPr>
-          <w:p>
-            <w:pPr>
-              <w:spacing w:after="0" w:before="0"/>
-            </w:pPr>
-            <w:r>
-              <w:rPr>
-                <w:rFonts w:ascii="Calibri" w:cs="Calibri" w:eastAsia="Calibri" w:hAnsi="Calibri"/>
-                <w:sz w:val="22"/>
-                <w:szCs w:val="22"/>
-              </w:rPr>
-              <w:t xml:space="preserve"> </w:t>
-            </w:r>
-          </w:p>
-        </w:tc>
-      </w:tr>
-      <w:tr>
-        <w:trPr>
-          <w:trHeight w:val="470" w:hRule="exact"/>
-        </w:trPr>
-        <w:tc>
-          <w:tcPr>
-            <w:tcW w:type="dxa" w:w="10080"/>
-            <w:tcBorders>
-              <w:top w:val="none" w:color="FFFFFF" w:sz="0"/>
-              <w:left w:val="none" w:color="FFFFFF" w:sz="0"/>
-              <w:bottom w:val="single" w:color="C9D2DE" w:sz="4"/>
-              <w:right w:val="none" w:color="FFFFFF" w:sz="0"/>
-            </w:tcBorders>
-            <w:tcMar>
-              <w:top w:type="dxa" w:w="0"/>
-              <w:left w:type="dxa" w:w="0"/>
-              <w:bottom w:type="dxa" w:w="0"/>
-              <w:right w:type="dxa" w:w="0"/>
-            </w:tcMar>
-          </w:tcPr>
-          <w:p>
-            <w:pPr>
-              <w:spacing w:after="0" w:before="0"/>
-            </w:pPr>
-            <w:r>
-              <w:rPr>
-                <w:rFonts w:ascii="Calibri" w:cs="Calibri" w:eastAsia="Calibri" w:hAnsi="Calibri"/>
-                <w:sz w:val="22"/>
-                <w:szCs w:val="22"/>
-              </w:rPr>
-              <w:t xml:space="preserve"> </w:t>
-            </w:r>
-          </w:p>
-        </w:tc>
-      </w:tr>
-      <w:tr>
-        <w:trPr>
-          <w:trHeight w:val="470" w:hRule="exact"/>
-        </w:trPr>
-        <w:tc>
-          <w:tcPr>
-            <w:tcW w:type="dxa" w:w="10080"/>
-            <w:tcBorders>
-              <w:top w:val="none" w:color="FFFFFF" w:sz="0"/>
-              <w:left w:val="none" w:color="FFFFFF" w:sz="0"/>
-              <w:bottom w:val="single" w:color="C9D2DE" w:sz="4"/>
-              <w:right w:val="none" w:color="FFFFFF" w:sz="0"/>
-            </w:tcBorders>
-            <w:tcMar>
-              <w:top w:type="dxa" w:w="0"/>
-              <w:left w:type="dxa" w:w="0"/>
-              <w:bottom w:type="dxa" w:w="0"/>
-              <w:right w:type="dxa" w:w="0"/>
-            </w:tcMar>
-          </w:tcPr>
-          <w:p>
-            <w:pPr>
-              <w:spacing w:after="0" w:before="0"/>
-            </w:pPr>
-            <w:r>
-              <w:rPr>
-                <w:rFonts w:ascii="Calibri" w:cs="Calibri" w:eastAsia="Calibri" w:hAnsi="Calibri"/>
-                <w:sz w:val="22"/>
-                <w:szCs w:val="22"/>
-              </w:rPr>
-              <w:t xml:space="preserve"> </w:t>
-            </w:r>
-          </w:p>
-        </w:tc>
-      </w:tr>
-      <w:tr>
-        <w:trPr>
-          <w:trHeight w:val="470" w:hRule="exact"/>
-        </w:trPr>
-        <w:tc>
-          <w:tcPr>
-            <w:tcW w:type="dxa" w:w="10080"/>
-            <w:tcBorders>
-              <w:top w:val="none" w:color="FFFFFF" w:sz="0"/>
-              <w:left w:val="none" w:color="FFFFFF" w:sz="0"/>
-              <w:bottom w:val="single" w:color="C9D2DE" w:sz="4"/>
-              <w:right w:val="none" w:color="FFFFFF" w:sz="0"/>
-            </w:tcBorders>
-            <w:tcMar>
-              <w:top w:type="dxa" w:w="0"/>
-              <w:left w:type="dxa" w:w="0"/>
-              <w:bottom w:type="dxa" w:w="0"/>
-              <w:right w:type="dxa" w:w="0"/>
-            </w:tcMar>
-          </w:tcPr>
-          <w:p>
-            <w:pPr>
-              <w:spacing w:after="0" w:before="0"/>
-            </w:pPr>
-            <w:r>
-              <w:rPr>
-                <w:rFonts w:ascii="Calibri" w:cs="Calibri" w:eastAsia="Calibri" w:hAnsi="Calibri"/>
-                <w:sz w:val="22"/>
-                <w:szCs w:val="22"/>
-              </w:rPr>
-              <w:t xml:space="preserve"> </w:t>
-            </w:r>
-          </w:p>
-        </w:tc>
-      </w:tr>
-      <w:tr>
-        <w:trPr>
-          <w:trHeight w:val="470" w:hRule="exact"/>
-        </w:trPr>
-        <w:tc>
-          <w:tcPr>
-            <w:tcW w:type="dxa" w:w="10080"/>
-            <w:tcBorders>
-              <w:top w:val="none" w:color="FFFFFF" w:sz="0"/>
-              <w:left w:val="none" w:color="FFFFFF" w:sz="0"/>
-              <w:bottom w:val="single" w:color="C9D2DE" w:sz="4"/>
-              <w:right w:val="none" w:color="FFFFFF" w:sz="0"/>
-            </w:tcBorders>
-            <w:tcMar>
-              <w:top w:type="dxa" w:w="0"/>
-              <w:left w:type="dxa" w:w="0"/>
-              <w:bottom w:type="dxa" w:w="0"/>
-              <w:right w:type="dxa" w:w="0"/>
-            </w:tcMar>
-          </w:tcPr>
-          <w:p>
-            <w:pPr>
-              <w:spacing w:after="0" w:before="0"/>
-            </w:pPr>
-            <w:r>
-              <w:rPr>
-                <w:rFonts w:ascii="Calibri" w:cs="Calibri" w:eastAsia="Calibri" w:hAnsi="Calibri"/>
-                <w:sz w:val="22"/>
-                <w:szCs w:val="22"/>
-              </w:rPr>
-              <w:t xml:space="preserve"> </w:t>
-            </w:r>
-          </w:p>
-        </w:tc>
-      </w:tr>
-      <w:tr>
-        <w:trPr>
-          <w:trHeight w:val="470" w:hRule="exact"/>
-        </w:trPr>
-        <w:tc>
-          <w:tcPr>
-            <w:tcW w:type="dxa" w:w="10080"/>
-            <w:tcBorders>
-              <w:top w:val="none" w:color="FFFFFF" w:sz="0"/>
-              <w:left w:val="none" w:color="FFFFFF" w:sz="0"/>
-              <w:bottom w:val="single" w:color="C9D2DE" w:sz="4"/>
-              <w:right w:val="none" w:color="FFFFFF" w:sz="0"/>
-            </w:tcBorders>
-            <w:tcMar>
-              <w:top w:type="dxa" w:w="0"/>
-              <w:left w:type="dxa" w:w="0"/>
-              <w:bottom w:type="dxa" w:w="0"/>
-              <w:right w:type="dxa" w:w="0"/>
-            </w:tcMar>
-          </w:tcPr>
-          <w:p>
-            <w:pPr>
-              <w:spacing w:after="0" w:before="0"/>
-            </w:pPr>
-            <w:r>
-              <w:rPr>
-                <w:rFonts w:ascii="Calibri" w:cs="Calibri" w:eastAsia="Calibri" w:hAnsi="Calibri"/>
-                <w:sz w:val="22"/>
-                <w:szCs w:val="22"/>
-              </w:rPr>
-              <w:t xml:space="preserve"> </w:t>
+              <w:t xml:space="preserve">“Systemize the predictable so you can humanize the exceptional.”</w:t>
+            </w:r>
+          </w:p>
+          <w:p>
+            <w:pPr>
+              <w:spacing w:after="160"/>
+              <w:jc w:val="left"/>
+            </w:pPr>
+            <w:r>
+              <w:rPr>
+                <w:rFonts w:ascii="Calibri" w:cs="Calibri" w:eastAsia="Calibri" w:hAnsi="Calibri"/>
+                <w:color w:val="5A6B82"/>
+                <w:sz w:val="18"/>
+                <w:szCs w:val="18"/>
+              </w:rPr>
+              <w:t xml:space="preserve">— Isadore Sharp, Founder of Four Seasons</w:t>
+            </w:r>
+          </w:p>
+          <w:p>
+            <w:pPr>
+              <w:spacing w:after="60"/>
+              <w:ind w:left="200" w:hanging="200"/>
+              <w:jc w:val="left"/>
+            </w:pPr>
+            <w:r>
+              <w:rPr>
+                <w:rFonts w:ascii="Calibri" w:cs="Calibri" w:eastAsia="Calibri" w:hAnsi="Calibri"/>
+                <w:color w:val="1A1A1A"/>
+                <w:sz w:val="20"/>
+                <w:szCs w:val="20"/>
+              </w:rPr>
+              <w:t xml:space="preserve">1. If your top salesperson walked out today, how much of your sales process walks out with them?</w:t>
+            </w:r>
+          </w:p>
+          <w:p>
+            <w:pPr>
+              <w:spacing w:after="60"/>
+              <w:ind w:left="200" w:hanging="200"/>
+              <w:jc w:val="left"/>
+            </w:pPr>
+            <w:r>
+              <w:rPr>
+                <w:rFonts w:ascii="Calibri" w:cs="Calibri" w:eastAsia="Calibri" w:hAnsi="Calibri"/>
+                <w:color w:val="1A1A1A"/>
+                <w:sz w:val="20"/>
+                <w:szCs w:val="20"/>
+              </w:rPr>
+              <w:t xml:space="preserve">2. Is your sales process documented, simplified, and followed by all? Or do you have as many sales processes as you have reps?</w:t>
+            </w:r>
+          </w:p>
+          <w:p>
+            <w:pPr>
+              <w:spacing w:after="60"/>
+              <w:ind w:left="200" w:hanging="200"/>
+              <w:jc w:val="left"/>
+            </w:pPr>
+            <w:r>
+              <w:rPr>
+                <w:rFonts w:ascii="Calibri" w:cs="Calibri" w:eastAsia="Calibri" w:hAnsi="Calibri"/>
+                <w:color w:val="1A1A1A"/>
+                <w:sz w:val="20"/>
+                <w:szCs w:val="20"/>
+              </w:rPr>
+              <w:t xml:space="preserve">3. Which leading indicators sit on your sales Scorecard? Would they have warned you a quarter ago about this quarter’s number?</w:t>
+            </w:r>
+          </w:p>
+          <w:p>
+            <w:pPr>
+              <w:spacing w:after="60"/>
+              <w:ind w:left="200" w:hanging="200"/>
+              <w:jc w:val="left"/>
+            </w:pPr>
+            <w:r>
+              <w:rPr>
+                <w:rFonts w:ascii="Calibri" w:cs="Calibri" w:eastAsia="Calibri" w:hAnsi="Calibri"/>
+                <w:color w:val="1A1A1A"/>
+                <w:sz w:val="20"/>
+                <w:szCs w:val="20"/>
+              </w:rPr>
+              <w:t xml:space="preserve">4. Where does your pipeline leak: lead generation, qualifying, proposal, close, or the handoff to operations? Name the root cause, not the symptom.</w:t>
+            </w:r>
+          </w:p>
+          <w:p>
+            <w:pPr>
+              <w:spacing w:after="40" w:before="100"/>
+            </w:pPr>
+            <w:r>
+              <w:rPr>
+                <w:rFonts w:ascii="Calibri" w:cs="Calibri" w:eastAsia="Calibri" w:hAnsi="Calibri"/>
+                <w:b/>
+                <w:bCs/>
+                <w:color w:val="E87722"/>
+                <w:sz w:val="18"/>
+                <w:szCs w:val="18"/>
+              </w:rPr>
+              <w:t xml:space="preserve">ACTION:</w:t>
+            </w:r>
+          </w:p>
+          <w:p>
+            <w:pPr>
+              <w:spacing w:after="0"/>
+            </w:pPr>
+            <w:r>
+              <w:rPr>
+                <w:rFonts w:ascii="Calibri" w:cs="Calibri" w:eastAsia="Calibri" w:hAnsi="Calibri"/>
+                <w:color w:val="1A1A1A"/>
+                <w:sz w:val="20"/>
+                <w:szCs w:val="20"/>
+              </w:rPr>
+              <w:t xml:space="preserve">My To Do from this session is: </w:t>
+            </w:r>
+            <w:r>
+              <w:rPr>
+                <w:rFonts w:ascii="Calibri" w:cs="Calibri" w:eastAsia="Calibri" w:hAnsi="Calibri"/>
+                <w:color w:val="5A6B82"/>
+                <w:sz w:val="20"/>
+                <w:szCs w:val="20"/>
+              </w:rPr>
+              <w:t xml:space="preserve">_____________________________________________</w:t>
+            </w:r>
+            <w:r>
+              <w:rPr>
+                <w:rFonts w:ascii="Calibri" w:cs="Calibri" w:eastAsia="Calibri" w:hAnsi="Calibri"/>
+                <w:color w:val="1A1A1A"/>
+                <w:sz w:val="20"/>
+                <w:szCs w:val="20"/>
+              </w:rPr>
+              <w:t xml:space="preserve">  Due Date: </w:t>
+            </w:r>
+            <w:r>
+              <w:rPr>
+                <w:rFonts w:ascii="Calibri" w:cs="Calibri" w:eastAsia="Calibri" w:hAnsi="Calibri"/>
+                <w:color w:val="5A6B82"/>
+                <w:sz w:val="20"/>
+                <w:szCs w:val="20"/>
+              </w:rPr>
+              <w:t xml:space="preserve">______________</w:t>
             </w:r>
           </w:p>
         </w:tc>

</xml_diff>

<commit_message>
workbook page 7 (Lunch with Walt Brown: Healthy Matters): add reflection thought box + speaker affiliation
- Subtitle now shows 'Walt Brown (EOS Worldwide Head Coach)'.
- Reflection thought box: 'The single greatest advantage any company can
  achieve is organizational health.' (Patrick Lencioni, The Advantage)
  with 4 questions on Walt's seven questions, leadership team health,
  running EOS for vs. to people, and aligned futures.
</commit_message>
<xml_diff>
--- a/deliverables/workbook/Workbook.docx
+++ b/deliverables/workbook/Workbook.docx
@@ -8291,6 +8291,17 @@
         </w:rPr>
         <w:t xml:space="preserve">12:00 – 1:00 PM · Walt Brown</w:t>
       </w:r>
+      <w:r>
+        <w:rPr>
+          <w:rFonts w:ascii="Calibri" w:cs="Calibri" w:eastAsia="Calibri" w:hAnsi="Calibri"/>
+          <w:i/>
+          <w:iCs/>
+          <w:color w:val="5A6B82"/>
+          <w:sz w:val="18"/>
+          <w:szCs w:val="18"/>
+        </w:rPr>
+        <w:t xml:space="preserve">  (EOS Worldwide Head Coach)</w:t>
+      </w:r>
     </w:p>
     <w:tbl>
       <w:tblPr>
@@ -8832,352 +8843,202 @@
           </w:p>
         </w:tc>
       </w:tr>
+    </w:tbl>
+    <w:p>
+      <w:pPr>
+        <w:spacing w:after="200"/>
+      </w:pPr>
+      <w:r>
+        <w:t xml:space="preserve"/>
+      </w:r>
+    </w:p>
+    <w:tbl>
+      <w:tblPr>
+        <w:tblW w:type="dxa" w:w="10080"/>
+        <w:tblBorders>
+          <w:top w:val="single" w:color="auto" w:sz="4"/>
+          <w:left w:val="single" w:color="auto" w:sz="4"/>
+          <w:bottom w:val="single" w:color="auto" w:sz="4"/>
+          <w:right w:val="single" w:color="auto" w:sz="4"/>
+          <w:insideH w:val="single" w:color="auto" w:sz="4"/>
+          <w:insideV w:val="single" w:color="auto" w:sz="4"/>
+        </w:tblBorders>
+      </w:tblPr>
+      <w:tblGrid>
+        <w:gridCol w:w="10080"/>
+      </w:tblGrid>
       <w:tr>
         <w:trPr>
-          <w:trHeight w:val="470" w:hRule="exact"/>
+          <w:cantSplit/>
         </w:trPr>
         <w:tc>
           <w:tcPr>
             <w:tcW w:type="dxa" w:w="10080"/>
             <w:tcBorders>
-              <w:top w:val="none" w:color="FFFFFF" w:sz="0"/>
-              <w:left w:val="none" w:color="FFFFFF" w:sz="0"/>
-              <w:bottom w:val="single" w:color="C9D2DE" w:sz="4"/>
-              <w:right w:val="none" w:color="FFFFFF" w:sz="0"/>
-            </w:tcBorders>
-            <w:tcMar>
-              <w:top w:type="dxa" w:w="0"/>
-              <w:left w:type="dxa" w:w="0"/>
-              <w:bottom w:type="dxa" w:w="0"/>
-              <w:right w:type="dxa" w:w="0"/>
-            </w:tcMar>
-          </w:tcPr>
-          <w:p>
-            <w:pPr>
-              <w:spacing w:after="0" w:before="0"/>
-            </w:pPr>
-            <w:r>
-              <w:rPr>
-                <w:rFonts w:ascii="Calibri" w:cs="Calibri" w:eastAsia="Calibri" w:hAnsi="Calibri"/>
+              <w:top w:val="dashSmallGap" w:color="E87722" w:sz="12"/>
+              <w:left w:val="dashSmallGap" w:color="E87722" w:sz="12"/>
+              <w:bottom w:val="dashSmallGap" w:color="E87722" w:sz="12"/>
+              <w:right w:val="dashSmallGap" w:color="E87722" w:sz="12"/>
+            </w:tcBorders>
+            <w:shd w:fill="FFFFFF" w:color="auto" w:val="clear"/>
+            <w:tcMar>
+              <w:top w:type="dxa" w:w="240"/>
+              <w:left w:type="dxa" w:w="300"/>
+              <w:bottom w:type="dxa" w:w="240"/>
+              <w:right w:type="dxa" w:w="300"/>
+            </w:tcMar>
+          </w:tcPr>
+          <w:p>
+            <w:pPr>
+              <w:spacing w:after="40"/>
+              <w:jc w:val="left"/>
+            </w:pPr>
+            <w:r>
+              <w:rPr>
+                <w:rFonts w:ascii="Calibri" w:cs="Calibri" w:eastAsia="Calibri" w:hAnsi="Calibri"/>
+                <w:i/>
+                <w:iCs/>
+                <w:color w:val="0B1F3A"/>
                 <w:sz w:val="22"/>
                 <w:szCs w:val="22"/>
               </w:rPr>
-              <w:t xml:space="preserve"> </w:t>
-            </w:r>
-          </w:p>
-        </w:tc>
-      </w:tr>
-      <w:tr>
-        <w:trPr>
-          <w:trHeight w:val="470" w:hRule="exact"/>
-        </w:trPr>
-        <w:tc>
-          <w:tcPr>
-            <w:tcW w:type="dxa" w:w="10080"/>
-            <w:tcBorders>
-              <w:top w:val="none" w:color="FFFFFF" w:sz="0"/>
-              <w:left w:val="none" w:color="FFFFFF" w:sz="0"/>
-              <w:bottom w:val="single" w:color="C9D2DE" w:sz="4"/>
-              <w:right w:val="none" w:color="FFFFFF" w:sz="0"/>
-            </w:tcBorders>
-            <w:tcMar>
-              <w:top w:type="dxa" w:w="0"/>
-              <w:left w:type="dxa" w:w="0"/>
-              <w:bottom w:type="dxa" w:w="0"/>
-              <w:right w:type="dxa" w:w="0"/>
-            </w:tcMar>
-          </w:tcPr>
-          <w:p>
-            <w:pPr>
-              <w:spacing w:after="0" w:before="0"/>
-            </w:pPr>
-            <w:r>
-              <w:rPr>
-                <w:rFonts w:ascii="Calibri" w:cs="Calibri" w:eastAsia="Calibri" w:hAnsi="Calibri"/>
-                <w:sz w:val="22"/>
-                <w:szCs w:val="22"/>
-              </w:rPr>
-              <w:t xml:space="preserve"> </w:t>
-            </w:r>
-          </w:p>
-        </w:tc>
-      </w:tr>
-      <w:tr>
-        <w:trPr>
-          <w:trHeight w:val="470" w:hRule="exact"/>
-        </w:trPr>
-        <w:tc>
-          <w:tcPr>
-            <w:tcW w:type="dxa" w:w="10080"/>
-            <w:tcBorders>
-              <w:top w:val="none" w:color="FFFFFF" w:sz="0"/>
-              <w:left w:val="none" w:color="FFFFFF" w:sz="0"/>
-              <w:bottom w:val="single" w:color="C9D2DE" w:sz="4"/>
-              <w:right w:val="none" w:color="FFFFFF" w:sz="0"/>
-            </w:tcBorders>
-            <w:tcMar>
-              <w:top w:type="dxa" w:w="0"/>
-              <w:left w:type="dxa" w:w="0"/>
-              <w:bottom w:type="dxa" w:w="0"/>
-              <w:right w:type="dxa" w:w="0"/>
-            </w:tcMar>
-          </w:tcPr>
-          <w:p>
-            <w:pPr>
-              <w:spacing w:after="0" w:before="0"/>
-            </w:pPr>
-            <w:r>
-              <w:rPr>
-                <w:rFonts w:ascii="Calibri" w:cs="Calibri" w:eastAsia="Calibri" w:hAnsi="Calibri"/>
-                <w:sz w:val="22"/>
-                <w:szCs w:val="22"/>
-              </w:rPr>
-              <w:t xml:space="preserve"> </w:t>
-            </w:r>
-          </w:p>
-        </w:tc>
-      </w:tr>
-      <w:tr>
-        <w:trPr>
-          <w:trHeight w:val="470" w:hRule="exact"/>
-        </w:trPr>
-        <w:tc>
-          <w:tcPr>
-            <w:tcW w:type="dxa" w:w="10080"/>
-            <w:tcBorders>
-              <w:top w:val="none" w:color="FFFFFF" w:sz="0"/>
-              <w:left w:val="none" w:color="FFFFFF" w:sz="0"/>
-              <w:bottom w:val="single" w:color="C9D2DE" w:sz="4"/>
-              <w:right w:val="none" w:color="FFFFFF" w:sz="0"/>
-            </w:tcBorders>
-            <w:tcMar>
-              <w:top w:type="dxa" w:w="0"/>
-              <w:left w:type="dxa" w:w="0"/>
-              <w:bottom w:type="dxa" w:w="0"/>
-              <w:right w:type="dxa" w:w="0"/>
-            </w:tcMar>
-          </w:tcPr>
-          <w:p>
-            <w:pPr>
-              <w:spacing w:after="0" w:before="0"/>
-            </w:pPr>
-            <w:r>
-              <w:rPr>
-                <w:rFonts w:ascii="Calibri" w:cs="Calibri" w:eastAsia="Calibri" w:hAnsi="Calibri"/>
-                <w:sz w:val="22"/>
-                <w:szCs w:val="22"/>
-              </w:rPr>
-              <w:t xml:space="preserve"> </w:t>
-            </w:r>
-          </w:p>
-        </w:tc>
-      </w:tr>
-      <w:tr>
-        <w:trPr>
-          <w:trHeight w:val="470" w:hRule="exact"/>
-        </w:trPr>
-        <w:tc>
-          <w:tcPr>
-            <w:tcW w:type="dxa" w:w="10080"/>
-            <w:tcBorders>
-              <w:top w:val="none" w:color="FFFFFF" w:sz="0"/>
-              <w:left w:val="none" w:color="FFFFFF" w:sz="0"/>
-              <w:bottom w:val="single" w:color="C9D2DE" w:sz="4"/>
-              <w:right w:val="none" w:color="FFFFFF" w:sz="0"/>
-            </w:tcBorders>
-            <w:tcMar>
-              <w:top w:type="dxa" w:w="0"/>
-              <w:left w:type="dxa" w:w="0"/>
-              <w:bottom w:type="dxa" w:w="0"/>
-              <w:right w:type="dxa" w:w="0"/>
-            </w:tcMar>
-          </w:tcPr>
-          <w:p>
-            <w:pPr>
-              <w:spacing w:after="0" w:before="0"/>
-            </w:pPr>
-            <w:r>
-              <w:rPr>
-                <w:rFonts w:ascii="Calibri" w:cs="Calibri" w:eastAsia="Calibri" w:hAnsi="Calibri"/>
-                <w:sz w:val="22"/>
-                <w:szCs w:val="22"/>
-              </w:rPr>
-              <w:t xml:space="preserve"> </w:t>
-            </w:r>
-          </w:p>
-        </w:tc>
-      </w:tr>
-      <w:tr>
-        <w:trPr>
-          <w:trHeight w:val="470" w:hRule="exact"/>
-        </w:trPr>
-        <w:tc>
-          <w:tcPr>
-            <w:tcW w:type="dxa" w:w="10080"/>
-            <w:tcBorders>
-              <w:top w:val="none" w:color="FFFFFF" w:sz="0"/>
-              <w:left w:val="none" w:color="FFFFFF" w:sz="0"/>
-              <w:bottom w:val="single" w:color="C9D2DE" w:sz="4"/>
-              <w:right w:val="none" w:color="FFFFFF" w:sz="0"/>
-            </w:tcBorders>
-            <w:tcMar>
-              <w:top w:type="dxa" w:w="0"/>
-              <w:left w:type="dxa" w:w="0"/>
-              <w:bottom w:type="dxa" w:w="0"/>
-              <w:right w:type="dxa" w:w="0"/>
-            </w:tcMar>
-          </w:tcPr>
-          <w:p>
-            <w:pPr>
-              <w:spacing w:after="0" w:before="0"/>
-            </w:pPr>
-            <w:r>
-              <w:rPr>
-                <w:rFonts w:ascii="Calibri" w:cs="Calibri" w:eastAsia="Calibri" w:hAnsi="Calibri"/>
-                <w:sz w:val="22"/>
-                <w:szCs w:val="22"/>
-              </w:rPr>
-              <w:t xml:space="preserve"> </w:t>
-            </w:r>
-          </w:p>
-        </w:tc>
-      </w:tr>
-      <w:tr>
-        <w:trPr>
-          <w:trHeight w:val="470" w:hRule="exact"/>
-        </w:trPr>
-        <w:tc>
-          <w:tcPr>
-            <w:tcW w:type="dxa" w:w="10080"/>
-            <w:tcBorders>
-              <w:top w:val="none" w:color="FFFFFF" w:sz="0"/>
-              <w:left w:val="none" w:color="FFFFFF" w:sz="0"/>
-              <w:bottom w:val="single" w:color="C9D2DE" w:sz="4"/>
-              <w:right w:val="none" w:color="FFFFFF" w:sz="0"/>
-            </w:tcBorders>
-            <w:tcMar>
-              <w:top w:type="dxa" w:w="0"/>
-              <w:left w:type="dxa" w:w="0"/>
-              <w:bottom w:type="dxa" w:w="0"/>
-              <w:right w:type="dxa" w:w="0"/>
-            </w:tcMar>
-          </w:tcPr>
-          <w:p>
-            <w:pPr>
-              <w:spacing w:after="0" w:before="0"/>
-            </w:pPr>
-            <w:r>
-              <w:rPr>
-                <w:rFonts w:ascii="Calibri" w:cs="Calibri" w:eastAsia="Calibri" w:hAnsi="Calibri"/>
-                <w:sz w:val="22"/>
-                <w:szCs w:val="22"/>
-              </w:rPr>
-              <w:t xml:space="preserve"> </w:t>
-            </w:r>
-          </w:p>
-        </w:tc>
-      </w:tr>
-      <w:tr>
-        <w:trPr>
-          <w:trHeight w:val="470" w:hRule="exact"/>
-        </w:trPr>
-        <w:tc>
-          <w:tcPr>
-            <w:tcW w:type="dxa" w:w="10080"/>
-            <w:tcBorders>
-              <w:top w:val="none" w:color="FFFFFF" w:sz="0"/>
-              <w:left w:val="none" w:color="FFFFFF" w:sz="0"/>
-              <w:bottom w:val="single" w:color="C9D2DE" w:sz="4"/>
-              <w:right w:val="none" w:color="FFFFFF" w:sz="0"/>
-            </w:tcBorders>
-            <w:tcMar>
-              <w:top w:type="dxa" w:w="0"/>
-              <w:left w:type="dxa" w:w="0"/>
-              <w:bottom w:type="dxa" w:w="0"/>
-              <w:right w:type="dxa" w:w="0"/>
-            </w:tcMar>
-          </w:tcPr>
-          <w:p>
-            <w:pPr>
-              <w:spacing w:after="0" w:before="0"/>
-            </w:pPr>
-            <w:r>
-              <w:rPr>
-                <w:rFonts w:ascii="Calibri" w:cs="Calibri" w:eastAsia="Calibri" w:hAnsi="Calibri"/>
-                <w:sz w:val="22"/>
-                <w:szCs w:val="22"/>
-              </w:rPr>
-              <w:t xml:space="preserve"> </w:t>
-            </w:r>
-          </w:p>
-        </w:tc>
-      </w:tr>
-      <w:tr>
-        <w:trPr>
-          <w:trHeight w:val="470" w:hRule="exact"/>
-        </w:trPr>
-        <w:tc>
-          <w:tcPr>
-            <w:tcW w:type="dxa" w:w="10080"/>
-            <w:tcBorders>
-              <w:top w:val="none" w:color="FFFFFF" w:sz="0"/>
-              <w:left w:val="none" w:color="FFFFFF" w:sz="0"/>
-              <w:bottom w:val="single" w:color="C9D2DE" w:sz="4"/>
-              <w:right w:val="none" w:color="FFFFFF" w:sz="0"/>
-            </w:tcBorders>
-            <w:tcMar>
-              <w:top w:type="dxa" w:w="0"/>
-              <w:left w:type="dxa" w:w="0"/>
-              <w:bottom w:type="dxa" w:w="0"/>
-              <w:right w:type="dxa" w:w="0"/>
-            </w:tcMar>
-          </w:tcPr>
-          <w:p>
-            <w:pPr>
-              <w:spacing w:after="0" w:before="0"/>
-            </w:pPr>
-            <w:r>
-              <w:rPr>
-                <w:rFonts w:ascii="Calibri" w:cs="Calibri" w:eastAsia="Calibri" w:hAnsi="Calibri"/>
-                <w:sz w:val="22"/>
-                <w:szCs w:val="22"/>
-              </w:rPr>
-              <w:t xml:space="preserve"> </w:t>
-            </w:r>
-          </w:p>
-        </w:tc>
-      </w:tr>
-      <w:tr>
-        <w:trPr>
-          <w:trHeight w:val="470" w:hRule="exact"/>
-        </w:trPr>
-        <w:tc>
-          <w:tcPr>
-            <w:tcW w:type="dxa" w:w="10080"/>
-            <w:tcBorders>
-              <w:top w:val="none" w:color="FFFFFF" w:sz="0"/>
-              <w:left w:val="none" w:color="FFFFFF" w:sz="0"/>
-              <w:bottom w:val="single" w:color="C9D2DE" w:sz="4"/>
-              <w:right w:val="none" w:color="FFFFFF" w:sz="0"/>
-            </w:tcBorders>
-            <w:tcMar>
-              <w:top w:type="dxa" w:w="0"/>
-              <w:left w:type="dxa" w:w="0"/>
-              <w:bottom w:type="dxa" w:w="0"/>
-              <w:right w:type="dxa" w:w="0"/>
-            </w:tcMar>
-          </w:tcPr>
-          <w:p>
-            <w:pPr>
-              <w:spacing w:after="0" w:before="0"/>
-            </w:pPr>
-            <w:r>
-              <w:rPr>
-                <w:rFonts w:ascii="Calibri" w:cs="Calibri" w:eastAsia="Calibri" w:hAnsi="Calibri"/>
-                <w:sz w:val="22"/>
-                <w:szCs w:val="22"/>
-              </w:rPr>
-              <w:t xml:space="preserve"> </w:t>
+              <w:t xml:space="preserve">“The single greatest advantage any company can achieve is organizational health.”</w:t>
+            </w:r>
+          </w:p>
+          <w:p>
+            <w:pPr>
+              <w:spacing w:after="160"/>
+              <w:jc w:val="left"/>
+            </w:pPr>
+            <w:r>
+              <w:rPr>
+                <w:rFonts w:ascii="Calibri" w:cs="Calibri" w:eastAsia="Calibri" w:hAnsi="Calibri"/>
+                <w:color w:val="5A6B82"/>
+                <w:sz w:val="18"/>
+                <w:szCs w:val="18"/>
+              </w:rPr>
+              <w:t xml:space="preserve">— Patrick Lencioni, The Advantage</w:t>
+            </w:r>
+          </w:p>
+          <w:p>
+            <w:pPr>
+              <w:spacing w:after="60"/>
+              <w:ind w:left="200" w:hanging="200"/>
+              <w:jc w:val="left"/>
+            </w:pPr>
+            <w:r>
+              <w:rPr>
+                <w:rFonts w:ascii="Calibri" w:cs="Calibri" w:eastAsia="Calibri" w:hAnsi="Calibri"/>
+                <w:color w:val="1A1A1A"/>
+                <w:sz w:val="20"/>
+                <w:szCs w:val="20"/>
+              </w:rPr>
+              <w:t xml:space="preserve">1. Walt’s seven questions: Do I belong? Do I believe? Am I accountable? Am I measured? Am I heard? Am I developed? Am I balanced? Which one gets the weakest yes from your people today?</w:t>
+            </w:r>
+          </w:p>
+          <w:p>
+            <w:pPr>
+              <w:spacing w:after="60"/>
+              <w:ind w:left="200" w:hanging="200"/>
+              <w:jc w:val="left"/>
+            </w:pPr>
+            <w:r>
+              <w:rPr>
+                <w:rFonts w:ascii="Calibri" w:cs="Calibri" w:eastAsia="Calibri" w:hAnsi="Calibri"/>
+                <w:color w:val="1A1A1A"/>
+                <w:sz w:val="20"/>
+                <w:szCs w:val="20"/>
+              </w:rPr>
+              <w:t xml:space="preserve">2. Is your leadership team healthy, or just polite? What Issue has been sitting on the list because nobody wants to enter the danger?</w:t>
+            </w:r>
+          </w:p>
+          <w:p>
+            <w:pPr>
+              <w:spacing w:after="60"/>
+              <w:ind w:left="200" w:hanging="200"/>
+              <w:jc w:val="left"/>
+            </w:pPr>
+            <w:r>
+              <w:rPr>
+                <w:rFonts w:ascii="Calibri" w:cs="Calibri" w:eastAsia="Calibri" w:hAnsi="Calibri"/>
+                <w:color w:val="1A1A1A"/>
+                <w:sz w:val="20"/>
+                <w:szCs w:val="20"/>
+              </w:rPr>
+              <w:t xml:space="preserve">3. Are you running EOS for your people or to your people? How would they answer that?</w:t>
+            </w:r>
+          </w:p>
+          <w:p>
+            <w:pPr>
+              <w:spacing w:after="60"/>
+              <w:ind w:left="200" w:hanging="200"/>
+              <w:jc w:val="left"/>
+            </w:pPr>
+            <w:r>
+              <w:rPr>
+                <w:rFonts w:ascii="Calibri" w:cs="Calibri" w:eastAsia="Calibri" w:hAnsi="Calibri"/>
+                <w:color w:val="1A1A1A"/>
+                <w:sz w:val="20"/>
+                <w:szCs w:val="20"/>
+              </w:rPr>
+              <w:t xml:space="preserve">4. Whose future is aligned with yours? Who on your team would you struggle to say that about?</w:t>
+            </w:r>
+          </w:p>
+          <w:p>
+            <w:pPr>
+              <w:spacing w:after="40" w:before="100"/>
+            </w:pPr>
+            <w:r>
+              <w:rPr>
+                <w:rFonts w:ascii="Calibri" w:cs="Calibri" w:eastAsia="Calibri" w:hAnsi="Calibri"/>
+                <w:b/>
+                <w:bCs/>
+                <w:color w:val="E87722"/>
+                <w:sz w:val="18"/>
+                <w:szCs w:val="18"/>
+              </w:rPr>
+              <w:t xml:space="preserve">ACTION:</w:t>
+            </w:r>
+          </w:p>
+          <w:p>
+            <w:pPr>
+              <w:spacing w:after="0"/>
+            </w:pPr>
+            <w:r>
+              <w:rPr>
+                <w:rFonts w:ascii="Calibri" w:cs="Calibri" w:eastAsia="Calibri" w:hAnsi="Calibri"/>
+                <w:color w:val="1A1A1A"/>
+                <w:sz w:val="20"/>
+                <w:szCs w:val="20"/>
+              </w:rPr>
+              <w:t xml:space="preserve">My To Do from this session is: </w:t>
+            </w:r>
+            <w:r>
+              <w:rPr>
+                <w:rFonts w:ascii="Calibri" w:cs="Calibri" w:eastAsia="Calibri" w:hAnsi="Calibri"/>
+                <w:color w:val="5A6B82"/>
+                <w:sz w:val="20"/>
+                <w:szCs w:val="20"/>
+              </w:rPr>
+              <w:t xml:space="preserve">_____________________________________________</w:t>
+            </w:r>
+            <w:r>
+              <w:rPr>
+                <w:rFonts w:ascii="Calibri" w:cs="Calibri" w:eastAsia="Calibri" w:hAnsi="Calibri"/>
+                <w:color w:val="1A1A1A"/>
+                <w:sz w:val="20"/>
+                <w:szCs w:val="20"/>
+              </w:rPr>
+              <w:t xml:space="preserve">  Due Date: </w:t>
+            </w:r>
+            <w:r>
+              <w:rPr>
+                <w:rFonts w:ascii="Calibri" w:cs="Calibri" w:eastAsia="Calibri" w:hAnsi="Calibri"/>
+                <w:color w:val="5A6B82"/>
+                <w:sz w:val="20"/>
+                <w:szCs w:val="20"/>
+              </w:rPr>
+              <w:t xml:space="preserve">______________</w:t>
             </w:r>
           </w:p>
         </w:tc>

</xml_diff>

<commit_message>
workbook: splice Walt Brown Healthy Matters handout (4 pages) after his notes page
- Added appendix/Walt-Brown-Healthy-Matters-Handout.pdf (Cliff Notes,
  Tools Map, 7-Question Survey, 21-Question Survey).
- splice_handouts.py: new anchor 'MY NOTES - LUNCH WITH WALT BROWN' so
  the handout inserts right after Walt's notes page (he has no session
  cover page like the paid-track presenters).
- paginate_workbook.py: switched from physical-offset numbering to a
  running counter so display numbers stay continuous across spliced
  handout pages regardless of handout length. Also added a HANDOUT-marker
  exclusion so the Walt Brown handout (which shares the workbook header)
  is not paginated.
- Agenda page numbers corrected: Fahey 12->10, Winters 32->12 (the old
  paginator was over-counting because it inadvertently stamped some
  handout pages too).
</commit_message>
<xml_diff>
--- a/deliverables/workbook/Workbook.docx
+++ b/deliverables/workbook/Workbook.docx
@@ -2309,7 +2309,7 @@
                 <w:sz w:val="22"/>
                 <w:szCs w:val="22"/>
               </w:rPr>
-              <w:t xml:space="preserve">12</w:t>
+              <w:t xml:space="preserve">10</w:t>
             </w:r>
           </w:p>
         </w:tc>
@@ -2621,7 +2621,7 @@
                 <w:sz w:val="22"/>
                 <w:szCs w:val="22"/>
               </w:rPr>
-              <w:t xml:space="preserve">32</w:t>
+              <w:t xml:space="preserve">12</w:t>
             </w:r>
           </w:p>
         </w:tc>

</xml_diff>

<commit_message>
workbook page 9 (Profit Power: Stronger or Just Bigger?): add reflection thought box to Mark Stanley notes page
- Extended SPEAKER_SESSIONS schema with optional reflection block
  (quote, attribution, 4 questions, ACTION row) and optional notes_lines
  override.
- speakerCoverPage() now caps note lines at notes_lines (default 15)
  and appends thoughtBox() when reflection is defined; other paid
  sessions keep the full 26 lines.
- Stanley reflection uses 'Everyone has a number.' - Gino Wickman,
  Traction, with the 4 questions from Ray's redlined workbook.
</commit_message>
<xml_diff>
--- a/deliverables/workbook/Workbook.docx
+++ b/deliverables/workbook/Workbook.docx
@@ -9850,387 +9850,202 @@
           </w:p>
         </w:tc>
       </w:tr>
+    </w:tbl>
+    <w:p>
+      <w:pPr>
+        <w:spacing w:after="200"/>
+      </w:pPr>
+      <w:r>
+        <w:t xml:space="preserve"/>
+      </w:r>
+    </w:p>
+    <w:tbl>
+      <w:tblPr>
+        <w:tblW w:type="dxa" w:w="10080"/>
+        <w:tblBorders>
+          <w:top w:val="single" w:color="auto" w:sz="4"/>
+          <w:left w:val="single" w:color="auto" w:sz="4"/>
+          <w:bottom w:val="single" w:color="auto" w:sz="4"/>
+          <w:right w:val="single" w:color="auto" w:sz="4"/>
+          <w:insideH w:val="single" w:color="auto" w:sz="4"/>
+          <w:insideV w:val="single" w:color="auto" w:sz="4"/>
+        </w:tblBorders>
+      </w:tblPr>
+      <w:tblGrid>
+        <w:gridCol w:w="10080"/>
+      </w:tblGrid>
       <w:tr>
         <w:trPr>
-          <w:trHeight w:val="470" w:hRule="exact"/>
+          <w:cantSplit/>
         </w:trPr>
         <w:tc>
           <w:tcPr>
             <w:tcW w:type="dxa" w:w="10080"/>
             <w:tcBorders>
-              <w:top w:val="none" w:color="FFFFFF" w:sz="0"/>
-              <w:left w:val="none" w:color="FFFFFF" w:sz="0"/>
-              <w:bottom w:val="single" w:color="C9D2DE" w:sz="4"/>
-              <w:right w:val="none" w:color="FFFFFF" w:sz="0"/>
-            </w:tcBorders>
-            <w:tcMar>
-              <w:top w:type="dxa" w:w="0"/>
-              <w:left w:type="dxa" w:w="0"/>
-              <w:bottom w:type="dxa" w:w="0"/>
-              <w:right w:type="dxa" w:w="0"/>
-            </w:tcMar>
-          </w:tcPr>
-          <w:p>
-            <w:pPr>
-              <w:spacing w:after="0" w:before="0"/>
-            </w:pPr>
-            <w:r>
-              <w:rPr>
-                <w:rFonts w:ascii="Calibri" w:cs="Calibri" w:eastAsia="Calibri" w:hAnsi="Calibri"/>
+              <w:top w:val="dashSmallGap" w:color="E87722" w:sz="12"/>
+              <w:left w:val="dashSmallGap" w:color="E87722" w:sz="12"/>
+              <w:bottom w:val="dashSmallGap" w:color="E87722" w:sz="12"/>
+              <w:right w:val="dashSmallGap" w:color="E87722" w:sz="12"/>
+            </w:tcBorders>
+            <w:shd w:fill="FFFFFF" w:color="auto" w:val="clear"/>
+            <w:tcMar>
+              <w:top w:type="dxa" w:w="240"/>
+              <w:left w:type="dxa" w:w="300"/>
+              <w:bottom w:type="dxa" w:w="240"/>
+              <w:right w:type="dxa" w:w="300"/>
+            </w:tcMar>
+          </w:tcPr>
+          <w:p>
+            <w:pPr>
+              <w:spacing w:after="40"/>
+              <w:jc w:val="left"/>
+            </w:pPr>
+            <w:r>
+              <w:rPr>
+                <w:rFonts w:ascii="Calibri" w:cs="Calibri" w:eastAsia="Calibri" w:hAnsi="Calibri"/>
+                <w:i/>
+                <w:iCs/>
+                <w:color w:val="0B1F3A"/>
                 <w:sz w:val="22"/>
                 <w:szCs w:val="22"/>
               </w:rPr>
-              <w:t xml:space="preserve"> </w:t>
-            </w:r>
-          </w:p>
-        </w:tc>
-      </w:tr>
-      <w:tr>
-        <w:trPr>
-          <w:trHeight w:val="470" w:hRule="exact"/>
-        </w:trPr>
-        <w:tc>
-          <w:tcPr>
-            <w:tcW w:type="dxa" w:w="10080"/>
-            <w:tcBorders>
-              <w:top w:val="none" w:color="FFFFFF" w:sz="0"/>
-              <w:left w:val="none" w:color="FFFFFF" w:sz="0"/>
-              <w:bottom w:val="single" w:color="C9D2DE" w:sz="4"/>
-              <w:right w:val="none" w:color="FFFFFF" w:sz="0"/>
-            </w:tcBorders>
-            <w:tcMar>
-              <w:top w:type="dxa" w:w="0"/>
-              <w:left w:type="dxa" w:w="0"/>
-              <w:bottom w:type="dxa" w:w="0"/>
-              <w:right w:type="dxa" w:w="0"/>
-            </w:tcMar>
-          </w:tcPr>
-          <w:p>
-            <w:pPr>
-              <w:spacing w:after="0" w:before="0"/>
-            </w:pPr>
-            <w:r>
-              <w:rPr>
-                <w:rFonts w:ascii="Calibri" w:cs="Calibri" w:eastAsia="Calibri" w:hAnsi="Calibri"/>
-                <w:sz w:val="22"/>
-                <w:szCs w:val="22"/>
-              </w:rPr>
-              <w:t xml:space="preserve"> </w:t>
-            </w:r>
-          </w:p>
-        </w:tc>
-      </w:tr>
-      <w:tr>
-        <w:trPr>
-          <w:trHeight w:val="470" w:hRule="exact"/>
-        </w:trPr>
-        <w:tc>
-          <w:tcPr>
-            <w:tcW w:type="dxa" w:w="10080"/>
-            <w:tcBorders>
-              <w:top w:val="none" w:color="FFFFFF" w:sz="0"/>
-              <w:left w:val="none" w:color="FFFFFF" w:sz="0"/>
-              <w:bottom w:val="single" w:color="C9D2DE" w:sz="4"/>
-              <w:right w:val="none" w:color="FFFFFF" w:sz="0"/>
-            </w:tcBorders>
-            <w:tcMar>
-              <w:top w:type="dxa" w:w="0"/>
-              <w:left w:type="dxa" w:w="0"/>
-              <w:bottom w:type="dxa" w:w="0"/>
-              <w:right w:type="dxa" w:w="0"/>
-            </w:tcMar>
-          </w:tcPr>
-          <w:p>
-            <w:pPr>
-              <w:spacing w:after="0" w:before="0"/>
-            </w:pPr>
-            <w:r>
-              <w:rPr>
-                <w:rFonts w:ascii="Calibri" w:cs="Calibri" w:eastAsia="Calibri" w:hAnsi="Calibri"/>
-                <w:sz w:val="22"/>
-                <w:szCs w:val="22"/>
-              </w:rPr>
-              <w:t xml:space="preserve"> </w:t>
-            </w:r>
-          </w:p>
-        </w:tc>
-      </w:tr>
-      <w:tr>
-        <w:trPr>
-          <w:trHeight w:val="470" w:hRule="exact"/>
-        </w:trPr>
-        <w:tc>
-          <w:tcPr>
-            <w:tcW w:type="dxa" w:w="10080"/>
-            <w:tcBorders>
-              <w:top w:val="none" w:color="FFFFFF" w:sz="0"/>
-              <w:left w:val="none" w:color="FFFFFF" w:sz="0"/>
-              <w:bottom w:val="single" w:color="C9D2DE" w:sz="4"/>
-              <w:right w:val="none" w:color="FFFFFF" w:sz="0"/>
-            </w:tcBorders>
-            <w:tcMar>
-              <w:top w:type="dxa" w:w="0"/>
-              <w:left w:type="dxa" w:w="0"/>
-              <w:bottom w:type="dxa" w:w="0"/>
-              <w:right w:type="dxa" w:w="0"/>
-            </w:tcMar>
-          </w:tcPr>
-          <w:p>
-            <w:pPr>
-              <w:spacing w:after="0" w:before="0"/>
-            </w:pPr>
-            <w:r>
-              <w:rPr>
-                <w:rFonts w:ascii="Calibri" w:cs="Calibri" w:eastAsia="Calibri" w:hAnsi="Calibri"/>
-                <w:sz w:val="22"/>
-                <w:szCs w:val="22"/>
-              </w:rPr>
-              <w:t xml:space="preserve"> </w:t>
-            </w:r>
-          </w:p>
-        </w:tc>
-      </w:tr>
-      <w:tr>
-        <w:trPr>
-          <w:trHeight w:val="470" w:hRule="exact"/>
-        </w:trPr>
-        <w:tc>
-          <w:tcPr>
-            <w:tcW w:type="dxa" w:w="10080"/>
-            <w:tcBorders>
-              <w:top w:val="none" w:color="FFFFFF" w:sz="0"/>
-              <w:left w:val="none" w:color="FFFFFF" w:sz="0"/>
-              <w:bottom w:val="single" w:color="C9D2DE" w:sz="4"/>
-              <w:right w:val="none" w:color="FFFFFF" w:sz="0"/>
-            </w:tcBorders>
-            <w:tcMar>
-              <w:top w:type="dxa" w:w="0"/>
-              <w:left w:type="dxa" w:w="0"/>
-              <w:bottom w:type="dxa" w:w="0"/>
-              <w:right w:type="dxa" w:w="0"/>
-            </w:tcMar>
-          </w:tcPr>
-          <w:p>
-            <w:pPr>
-              <w:spacing w:after="0" w:before="0"/>
-            </w:pPr>
-            <w:r>
-              <w:rPr>
-                <w:rFonts w:ascii="Calibri" w:cs="Calibri" w:eastAsia="Calibri" w:hAnsi="Calibri"/>
-                <w:sz w:val="22"/>
-                <w:szCs w:val="22"/>
-              </w:rPr>
-              <w:t xml:space="preserve"> </w:t>
-            </w:r>
-          </w:p>
-        </w:tc>
-      </w:tr>
-      <w:tr>
-        <w:trPr>
-          <w:trHeight w:val="470" w:hRule="exact"/>
-        </w:trPr>
-        <w:tc>
-          <w:tcPr>
-            <w:tcW w:type="dxa" w:w="10080"/>
-            <w:tcBorders>
-              <w:top w:val="none" w:color="FFFFFF" w:sz="0"/>
-              <w:left w:val="none" w:color="FFFFFF" w:sz="0"/>
-              <w:bottom w:val="single" w:color="C9D2DE" w:sz="4"/>
-              <w:right w:val="none" w:color="FFFFFF" w:sz="0"/>
-            </w:tcBorders>
-            <w:tcMar>
-              <w:top w:type="dxa" w:w="0"/>
-              <w:left w:type="dxa" w:w="0"/>
-              <w:bottom w:type="dxa" w:w="0"/>
-              <w:right w:type="dxa" w:w="0"/>
-            </w:tcMar>
-          </w:tcPr>
-          <w:p>
-            <w:pPr>
-              <w:spacing w:after="0" w:before="0"/>
-            </w:pPr>
-            <w:r>
-              <w:rPr>
-                <w:rFonts w:ascii="Calibri" w:cs="Calibri" w:eastAsia="Calibri" w:hAnsi="Calibri"/>
-                <w:sz w:val="22"/>
-                <w:szCs w:val="22"/>
-              </w:rPr>
-              <w:t xml:space="preserve"> </w:t>
-            </w:r>
-          </w:p>
-        </w:tc>
-      </w:tr>
-      <w:tr>
-        <w:trPr>
-          <w:trHeight w:val="470" w:hRule="exact"/>
-        </w:trPr>
-        <w:tc>
-          <w:tcPr>
-            <w:tcW w:type="dxa" w:w="10080"/>
-            <w:tcBorders>
-              <w:top w:val="none" w:color="FFFFFF" w:sz="0"/>
-              <w:left w:val="none" w:color="FFFFFF" w:sz="0"/>
-              <w:bottom w:val="single" w:color="C9D2DE" w:sz="4"/>
-              <w:right w:val="none" w:color="FFFFFF" w:sz="0"/>
-            </w:tcBorders>
-            <w:tcMar>
-              <w:top w:type="dxa" w:w="0"/>
-              <w:left w:type="dxa" w:w="0"/>
-              <w:bottom w:type="dxa" w:w="0"/>
-              <w:right w:type="dxa" w:w="0"/>
-            </w:tcMar>
-          </w:tcPr>
-          <w:p>
-            <w:pPr>
-              <w:spacing w:after="0" w:before="0"/>
-            </w:pPr>
-            <w:r>
-              <w:rPr>
-                <w:rFonts w:ascii="Calibri" w:cs="Calibri" w:eastAsia="Calibri" w:hAnsi="Calibri"/>
-                <w:sz w:val="22"/>
-                <w:szCs w:val="22"/>
-              </w:rPr>
-              <w:t xml:space="preserve"> </w:t>
-            </w:r>
-          </w:p>
-        </w:tc>
-      </w:tr>
-      <w:tr>
-        <w:trPr>
-          <w:trHeight w:val="470" w:hRule="exact"/>
-        </w:trPr>
-        <w:tc>
-          <w:tcPr>
-            <w:tcW w:type="dxa" w:w="10080"/>
-            <w:tcBorders>
-              <w:top w:val="none" w:color="FFFFFF" w:sz="0"/>
-              <w:left w:val="none" w:color="FFFFFF" w:sz="0"/>
-              <w:bottom w:val="single" w:color="C9D2DE" w:sz="4"/>
-              <w:right w:val="none" w:color="FFFFFF" w:sz="0"/>
-            </w:tcBorders>
-            <w:tcMar>
-              <w:top w:type="dxa" w:w="0"/>
-              <w:left w:type="dxa" w:w="0"/>
-              <w:bottom w:type="dxa" w:w="0"/>
-              <w:right w:type="dxa" w:w="0"/>
-            </w:tcMar>
-          </w:tcPr>
-          <w:p>
-            <w:pPr>
-              <w:spacing w:after="0" w:before="0"/>
-            </w:pPr>
-            <w:r>
-              <w:rPr>
-                <w:rFonts w:ascii="Calibri" w:cs="Calibri" w:eastAsia="Calibri" w:hAnsi="Calibri"/>
-                <w:sz w:val="22"/>
-                <w:szCs w:val="22"/>
-              </w:rPr>
-              <w:t xml:space="preserve"> </w:t>
-            </w:r>
-          </w:p>
-        </w:tc>
-      </w:tr>
-      <w:tr>
-        <w:trPr>
-          <w:trHeight w:val="470" w:hRule="exact"/>
-        </w:trPr>
-        <w:tc>
-          <w:tcPr>
-            <w:tcW w:type="dxa" w:w="10080"/>
-            <w:tcBorders>
-              <w:top w:val="none" w:color="FFFFFF" w:sz="0"/>
-              <w:left w:val="none" w:color="FFFFFF" w:sz="0"/>
-              <w:bottom w:val="single" w:color="C9D2DE" w:sz="4"/>
-              <w:right w:val="none" w:color="FFFFFF" w:sz="0"/>
-            </w:tcBorders>
-            <w:tcMar>
-              <w:top w:type="dxa" w:w="0"/>
-              <w:left w:type="dxa" w:w="0"/>
-              <w:bottom w:type="dxa" w:w="0"/>
-              <w:right w:type="dxa" w:w="0"/>
-            </w:tcMar>
-          </w:tcPr>
-          <w:p>
-            <w:pPr>
-              <w:spacing w:after="0" w:before="0"/>
-            </w:pPr>
-            <w:r>
-              <w:rPr>
-                <w:rFonts w:ascii="Calibri" w:cs="Calibri" w:eastAsia="Calibri" w:hAnsi="Calibri"/>
-                <w:sz w:val="22"/>
-                <w:szCs w:val="22"/>
-              </w:rPr>
-              <w:t xml:space="preserve"> </w:t>
-            </w:r>
-          </w:p>
-        </w:tc>
-      </w:tr>
-      <w:tr>
-        <w:trPr>
-          <w:trHeight w:val="470" w:hRule="exact"/>
-        </w:trPr>
-        <w:tc>
-          <w:tcPr>
-            <w:tcW w:type="dxa" w:w="10080"/>
-            <w:tcBorders>
-              <w:top w:val="none" w:color="FFFFFF" w:sz="0"/>
-              <w:left w:val="none" w:color="FFFFFF" w:sz="0"/>
-              <w:bottom w:val="single" w:color="C9D2DE" w:sz="4"/>
-              <w:right w:val="none" w:color="FFFFFF" w:sz="0"/>
-            </w:tcBorders>
-            <w:tcMar>
-              <w:top w:type="dxa" w:w="0"/>
-              <w:left w:type="dxa" w:w="0"/>
-              <w:bottom w:type="dxa" w:w="0"/>
-              <w:right w:type="dxa" w:w="0"/>
-            </w:tcMar>
-          </w:tcPr>
-          <w:p>
-            <w:pPr>
-              <w:spacing w:after="0" w:before="0"/>
-            </w:pPr>
-            <w:r>
-              <w:rPr>
-                <w:rFonts w:ascii="Calibri" w:cs="Calibri" w:eastAsia="Calibri" w:hAnsi="Calibri"/>
-                <w:sz w:val="22"/>
-                <w:szCs w:val="22"/>
-              </w:rPr>
-              <w:t xml:space="preserve"> </w:t>
-            </w:r>
-          </w:p>
-        </w:tc>
-      </w:tr>
-      <w:tr>
-        <w:trPr>
-          <w:trHeight w:val="470" w:hRule="exact"/>
-        </w:trPr>
-        <w:tc>
-          <w:tcPr>
-            <w:tcW w:type="dxa" w:w="10080"/>
-            <w:tcBorders>
-              <w:top w:val="none" w:color="FFFFFF" w:sz="0"/>
-              <w:left w:val="none" w:color="FFFFFF" w:sz="0"/>
-              <w:bottom w:val="single" w:color="C9D2DE" w:sz="4"/>
-              <w:right w:val="none" w:color="FFFFFF" w:sz="0"/>
-            </w:tcBorders>
-            <w:tcMar>
-              <w:top w:type="dxa" w:w="0"/>
-              <w:left w:type="dxa" w:w="0"/>
-              <w:bottom w:type="dxa" w:w="0"/>
-              <w:right w:type="dxa" w:w="0"/>
-            </w:tcMar>
-          </w:tcPr>
-          <w:p>
-            <w:pPr>
-              <w:spacing w:after="0" w:before="0"/>
-            </w:pPr>
-            <w:r>
-              <w:rPr>
-                <w:rFonts w:ascii="Calibri" w:cs="Calibri" w:eastAsia="Calibri" w:hAnsi="Calibri"/>
-                <w:sz w:val="22"/>
-                <w:szCs w:val="22"/>
-              </w:rPr>
-              <w:t xml:space="preserve"> </w:t>
+              <w:t xml:space="preserve">“Everyone has a number.”</w:t>
+            </w:r>
+          </w:p>
+          <w:p>
+            <w:pPr>
+              <w:spacing w:after="160"/>
+              <w:jc w:val="left"/>
+            </w:pPr>
+            <w:r>
+              <w:rPr>
+                <w:rFonts w:ascii="Calibri" w:cs="Calibri" w:eastAsia="Calibri" w:hAnsi="Calibri"/>
+                <w:color w:val="5A6B82"/>
+                <w:sz w:val="18"/>
+                <w:szCs w:val="18"/>
+              </w:rPr>
+              <w:t xml:space="preserve">— Gino Wickman, Traction</w:t>
+            </w:r>
+          </w:p>
+          <w:p>
+            <w:pPr>
+              <w:spacing w:after="60"/>
+              <w:ind w:left="200" w:hanging="200"/>
+              <w:jc w:val="left"/>
+            </w:pPr>
+            <w:r>
+              <w:rPr>
+                <w:rFonts w:ascii="Calibri" w:cs="Calibri" w:eastAsia="Calibri" w:hAnsi="Calibri"/>
+                <w:color w:val="1A1A1A"/>
+                <w:sz w:val="20"/>
+                <w:szCs w:val="20"/>
+              </w:rPr>
+              <w:t xml:space="preserve">1. Without looking, write your five numbers: Revenue, Directly Variable Costs, Gross Profit, OPEX, Net Profit. Which one did you have to guess?</w:t>
+            </w:r>
+          </w:p>
+          <w:p>
+            <w:pPr>
+              <w:spacing w:after="60"/>
+              <w:ind w:left="200" w:hanging="200"/>
+              <w:jc w:val="left"/>
+            </w:pPr>
+            <w:r>
+              <w:rPr>
+                <w:rFonts w:ascii="Calibri" w:cs="Calibri" w:eastAsia="Calibri" w:hAnsi="Calibri"/>
+                <w:color w:val="1A1A1A"/>
+                <w:sz w:val="20"/>
+                <w:szCs w:val="20"/>
+              </w:rPr>
+              <w:t xml:space="preserve">2. Of the 7 Power Moves, which one would your team call impossible? Is it impossible, or just uncomfortable?</w:t>
+            </w:r>
+          </w:p>
+          <w:p>
+            <w:pPr>
+              <w:spacing w:after="60"/>
+              <w:ind w:left="200" w:hanging="200"/>
+              <w:jc w:val="left"/>
+            </w:pPr>
+            <w:r>
+              <w:rPr>
+                <w:rFonts w:ascii="Calibri" w:cs="Calibri" w:eastAsia="Calibri" w:hAnsi="Calibri"/>
+                <w:color w:val="1A1A1A"/>
+                <w:sz w:val="20"/>
+                <w:szCs w:val="20"/>
+              </w:rPr>
+              <w:t xml:space="preserve">3. If you raised prices 1% tomorrow, who would actually notice? What would it add to gross profit?</w:t>
+            </w:r>
+          </w:p>
+          <w:p>
+            <w:pPr>
+              <w:spacing w:after="60"/>
+              <w:ind w:left="200" w:hanging="200"/>
+              <w:jc w:val="left"/>
+            </w:pPr>
+            <w:r>
+              <w:rPr>
+                <w:rFonts w:ascii="Calibri" w:cs="Calibri" w:eastAsia="Calibri" w:hAnsi="Calibri"/>
+                <w:color w:val="1A1A1A"/>
+                <w:sz w:val="20"/>
+                <w:szCs w:val="20"/>
+              </w:rPr>
+              <w:t xml:space="preserve">4. What is your First Move Monday, who owns it, and which Scorecard number turns red if it stalls?</w:t>
+            </w:r>
+          </w:p>
+          <w:p>
+            <w:pPr>
+              <w:spacing w:after="40" w:before="100"/>
+            </w:pPr>
+            <w:r>
+              <w:rPr>
+                <w:rFonts w:ascii="Calibri" w:cs="Calibri" w:eastAsia="Calibri" w:hAnsi="Calibri"/>
+                <w:b/>
+                <w:bCs/>
+                <w:color w:val="E87722"/>
+                <w:sz w:val="18"/>
+                <w:szCs w:val="18"/>
+              </w:rPr>
+              <w:t xml:space="preserve">ACTION:</w:t>
+            </w:r>
+          </w:p>
+          <w:p>
+            <w:pPr>
+              <w:spacing w:after="0"/>
+            </w:pPr>
+            <w:r>
+              <w:rPr>
+                <w:rFonts w:ascii="Calibri" w:cs="Calibri" w:eastAsia="Calibri" w:hAnsi="Calibri"/>
+                <w:color w:val="1A1A1A"/>
+                <w:sz w:val="20"/>
+                <w:szCs w:val="20"/>
+              </w:rPr>
+              <w:t xml:space="preserve">My To Do from this session is: </w:t>
+            </w:r>
+            <w:r>
+              <w:rPr>
+                <w:rFonts w:ascii="Calibri" w:cs="Calibri" w:eastAsia="Calibri" w:hAnsi="Calibri"/>
+                <w:color w:val="5A6B82"/>
+                <w:sz w:val="20"/>
+                <w:szCs w:val="20"/>
+              </w:rPr>
+              <w:t xml:space="preserve">_____________________________________________</w:t>
+            </w:r>
+            <w:r>
+              <w:rPr>
+                <w:rFonts w:ascii="Calibri" w:cs="Calibri" w:eastAsia="Calibri" w:hAnsi="Calibri"/>
+                <w:color w:val="1A1A1A"/>
+                <w:sz w:val="20"/>
+                <w:szCs w:val="20"/>
+              </w:rPr>
+              <w:t xml:space="preserve">  Due Date: </w:t>
+            </w:r>
+            <w:r>
+              <w:rPr>
+                <w:rFonts w:ascii="Calibri" w:cs="Calibri" w:eastAsia="Calibri" w:hAnsi="Calibri"/>
+                <w:color w:val="5A6B82"/>
+                <w:sz w:val="20"/>
+                <w:szCs w:val="20"/>
+              </w:rPr>
+              <w:t xml:space="preserve">______________</w:t>
             </w:r>
           </w:p>
         </w:tc>

</xml_diff>

<commit_message>
workbook page 11 (Rollout, Reworked): add reflection thought box to Beth Fahey notes-continued page
Quote: 'People copy what they see, not what they hear.'
       - Rollout Troubleshooting Guide, Marisa Smith and Beth Fahey

Four questions verbatim from Ray's redlined workbook (Core Values recall,
Rollout stage/tracker, 10 troubleshooting issues root cause, EOS being
'done to' managers). notes_lines set to 15 to make room for the box.
</commit_message>
<xml_diff>
--- a/deliverables/workbook/Workbook.docx
+++ b/deliverables/workbook/Workbook.docx
@@ -11647,387 +11647,202 @@
           </w:p>
         </w:tc>
       </w:tr>
+    </w:tbl>
+    <w:p>
+      <w:pPr>
+        <w:spacing w:after="200"/>
+      </w:pPr>
+      <w:r>
+        <w:t xml:space="preserve"/>
+      </w:r>
+    </w:p>
+    <w:tbl>
+      <w:tblPr>
+        <w:tblW w:type="dxa" w:w="10080"/>
+        <w:tblBorders>
+          <w:top w:val="single" w:color="auto" w:sz="4"/>
+          <w:left w:val="single" w:color="auto" w:sz="4"/>
+          <w:bottom w:val="single" w:color="auto" w:sz="4"/>
+          <w:right w:val="single" w:color="auto" w:sz="4"/>
+          <w:insideH w:val="single" w:color="auto" w:sz="4"/>
+          <w:insideV w:val="single" w:color="auto" w:sz="4"/>
+        </w:tblBorders>
+      </w:tblPr>
+      <w:tblGrid>
+        <w:gridCol w:w="10080"/>
+      </w:tblGrid>
       <w:tr>
         <w:trPr>
-          <w:trHeight w:val="470" w:hRule="exact"/>
+          <w:cantSplit/>
         </w:trPr>
         <w:tc>
           <w:tcPr>
             <w:tcW w:type="dxa" w:w="10080"/>
             <w:tcBorders>
-              <w:top w:val="none" w:color="FFFFFF" w:sz="0"/>
-              <w:left w:val="none" w:color="FFFFFF" w:sz="0"/>
-              <w:bottom w:val="single" w:color="C9D2DE" w:sz="4"/>
-              <w:right w:val="none" w:color="FFFFFF" w:sz="0"/>
-            </w:tcBorders>
-            <w:tcMar>
-              <w:top w:type="dxa" w:w="0"/>
-              <w:left w:type="dxa" w:w="0"/>
-              <w:bottom w:type="dxa" w:w="0"/>
-              <w:right w:type="dxa" w:w="0"/>
-            </w:tcMar>
-          </w:tcPr>
-          <w:p>
-            <w:pPr>
-              <w:spacing w:after="0" w:before="0"/>
-            </w:pPr>
-            <w:r>
-              <w:rPr>
-                <w:rFonts w:ascii="Calibri" w:cs="Calibri" w:eastAsia="Calibri" w:hAnsi="Calibri"/>
+              <w:top w:val="dashSmallGap" w:color="E87722" w:sz="12"/>
+              <w:left w:val="dashSmallGap" w:color="E87722" w:sz="12"/>
+              <w:bottom w:val="dashSmallGap" w:color="E87722" w:sz="12"/>
+              <w:right w:val="dashSmallGap" w:color="E87722" w:sz="12"/>
+            </w:tcBorders>
+            <w:shd w:fill="FFFFFF" w:color="auto" w:val="clear"/>
+            <w:tcMar>
+              <w:top w:type="dxa" w:w="240"/>
+              <w:left w:type="dxa" w:w="300"/>
+              <w:bottom w:type="dxa" w:w="240"/>
+              <w:right w:type="dxa" w:w="300"/>
+            </w:tcMar>
+          </w:tcPr>
+          <w:p>
+            <w:pPr>
+              <w:spacing w:after="40"/>
+              <w:jc w:val="left"/>
+            </w:pPr>
+            <w:r>
+              <w:rPr>
+                <w:rFonts w:ascii="Calibri" w:cs="Calibri" w:eastAsia="Calibri" w:hAnsi="Calibri"/>
+                <w:i/>
+                <w:iCs/>
+                <w:color w:val="0B1F3A"/>
                 <w:sz w:val="22"/>
                 <w:szCs w:val="22"/>
               </w:rPr>
-              <w:t xml:space="preserve"> </w:t>
-            </w:r>
-          </w:p>
-        </w:tc>
-      </w:tr>
-      <w:tr>
-        <w:trPr>
-          <w:trHeight w:val="470" w:hRule="exact"/>
-        </w:trPr>
-        <w:tc>
-          <w:tcPr>
-            <w:tcW w:type="dxa" w:w="10080"/>
-            <w:tcBorders>
-              <w:top w:val="none" w:color="FFFFFF" w:sz="0"/>
-              <w:left w:val="none" w:color="FFFFFF" w:sz="0"/>
-              <w:bottom w:val="single" w:color="C9D2DE" w:sz="4"/>
-              <w:right w:val="none" w:color="FFFFFF" w:sz="0"/>
-            </w:tcBorders>
-            <w:tcMar>
-              <w:top w:type="dxa" w:w="0"/>
-              <w:left w:type="dxa" w:w="0"/>
-              <w:bottom w:type="dxa" w:w="0"/>
-              <w:right w:type="dxa" w:w="0"/>
-            </w:tcMar>
-          </w:tcPr>
-          <w:p>
-            <w:pPr>
-              <w:spacing w:after="0" w:before="0"/>
-            </w:pPr>
-            <w:r>
-              <w:rPr>
-                <w:rFonts w:ascii="Calibri" w:cs="Calibri" w:eastAsia="Calibri" w:hAnsi="Calibri"/>
-                <w:sz w:val="22"/>
-                <w:szCs w:val="22"/>
-              </w:rPr>
-              <w:t xml:space="preserve"> </w:t>
-            </w:r>
-          </w:p>
-        </w:tc>
-      </w:tr>
-      <w:tr>
-        <w:trPr>
-          <w:trHeight w:val="470" w:hRule="exact"/>
-        </w:trPr>
-        <w:tc>
-          <w:tcPr>
-            <w:tcW w:type="dxa" w:w="10080"/>
-            <w:tcBorders>
-              <w:top w:val="none" w:color="FFFFFF" w:sz="0"/>
-              <w:left w:val="none" w:color="FFFFFF" w:sz="0"/>
-              <w:bottom w:val="single" w:color="C9D2DE" w:sz="4"/>
-              <w:right w:val="none" w:color="FFFFFF" w:sz="0"/>
-            </w:tcBorders>
-            <w:tcMar>
-              <w:top w:type="dxa" w:w="0"/>
-              <w:left w:type="dxa" w:w="0"/>
-              <w:bottom w:type="dxa" w:w="0"/>
-              <w:right w:type="dxa" w:w="0"/>
-            </w:tcMar>
-          </w:tcPr>
-          <w:p>
-            <w:pPr>
-              <w:spacing w:after="0" w:before="0"/>
-            </w:pPr>
-            <w:r>
-              <w:rPr>
-                <w:rFonts w:ascii="Calibri" w:cs="Calibri" w:eastAsia="Calibri" w:hAnsi="Calibri"/>
-                <w:sz w:val="22"/>
-                <w:szCs w:val="22"/>
-              </w:rPr>
-              <w:t xml:space="preserve"> </w:t>
-            </w:r>
-          </w:p>
-        </w:tc>
-      </w:tr>
-      <w:tr>
-        <w:trPr>
-          <w:trHeight w:val="470" w:hRule="exact"/>
-        </w:trPr>
-        <w:tc>
-          <w:tcPr>
-            <w:tcW w:type="dxa" w:w="10080"/>
-            <w:tcBorders>
-              <w:top w:val="none" w:color="FFFFFF" w:sz="0"/>
-              <w:left w:val="none" w:color="FFFFFF" w:sz="0"/>
-              <w:bottom w:val="single" w:color="C9D2DE" w:sz="4"/>
-              <w:right w:val="none" w:color="FFFFFF" w:sz="0"/>
-            </w:tcBorders>
-            <w:tcMar>
-              <w:top w:type="dxa" w:w="0"/>
-              <w:left w:type="dxa" w:w="0"/>
-              <w:bottom w:type="dxa" w:w="0"/>
-              <w:right w:type="dxa" w:w="0"/>
-            </w:tcMar>
-          </w:tcPr>
-          <w:p>
-            <w:pPr>
-              <w:spacing w:after="0" w:before="0"/>
-            </w:pPr>
-            <w:r>
-              <w:rPr>
-                <w:rFonts w:ascii="Calibri" w:cs="Calibri" w:eastAsia="Calibri" w:hAnsi="Calibri"/>
-                <w:sz w:val="22"/>
-                <w:szCs w:val="22"/>
-              </w:rPr>
-              <w:t xml:space="preserve"> </w:t>
-            </w:r>
-          </w:p>
-        </w:tc>
-      </w:tr>
-      <w:tr>
-        <w:trPr>
-          <w:trHeight w:val="470" w:hRule="exact"/>
-        </w:trPr>
-        <w:tc>
-          <w:tcPr>
-            <w:tcW w:type="dxa" w:w="10080"/>
-            <w:tcBorders>
-              <w:top w:val="none" w:color="FFFFFF" w:sz="0"/>
-              <w:left w:val="none" w:color="FFFFFF" w:sz="0"/>
-              <w:bottom w:val="single" w:color="C9D2DE" w:sz="4"/>
-              <w:right w:val="none" w:color="FFFFFF" w:sz="0"/>
-            </w:tcBorders>
-            <w:tcMar>
-              <w:top w:type="dxa" w:w="0"/>
-              <w:left w:type="dxa" w:w="0"/>
-              <w:bottom w:type="dxa" w:w="0"/>
-              <w:right w:type="dxa" w:w="0"/>
-            </w:tcMar>
-          </w:tcPr>
-          <w:p>
-            <w:pPr>
-              <w:spacing w:after="0" w:before="0"/>
-            </w:pPr>
-            <w:r>
-              <w:rPr>
-                <w:rFonts w:ascii="Calibri" w:cs="Calibri" w:eastAsia="Calibri" w:hAnsi="Calibri"/>
-                <w:sz w:val="22"/>
-                <w:szCs w:val="22"/>
-              </w:rPr>
-              <w:t xml:space="preserve"> </w:t>
-            </w:r>
-          </w:p>
-        </w:tc>
-      </w:tr>
-      <w:tr>
-        <w:trPr>
-          <w:trHeight w:val="470" w:hRule="exact"/>
-        </w:trPr>
-        <w:tc>
-          <w:tcPr>
-            <w:tcW w:type="dxa" w:w="10080"/>
-            <w:tcBorders>
-              <w:top w:val="none" w:color="FFFFFF" w:sz="0"/>
-              <w:left w:val="none" w:color="FFFFFF" w:sz="0"/>
-              <w:bottom w:val="single" w:color="C9D2DE" w:sz="4"/>
-              <w:right w:val="none" w:color="FFFFFF" w:sz="0"/>
-            </w:tcBorders>
-            <w:tcMar>
-              <w:top w:type="dxa" w:w="0"/>
-              <w:left w:type="dxa" w:w="0"/>
-              <w:bottom w:type="dxa" w:w="0"/>
-              <w:right w:type="dxa" w:w="0"/>
-            </w:tcMar>
-          </w:tcPr>
-          <w:p>
-            <w:pPr>
-              <w:spacing w:after="0" w:before="0"/>
-            </w:pPr>
-            <w:r>
-              <w:rPr>
-                <w:rFonts w:ascii="Calibri" w:cs="Calibri" w:eastAsia="Calibri" w:hAnsi="Calibri"/>
-                <w:sz w:val="22"/>
-                <w:szCs w:val="22"/>
-              </w:rPr>
-              <w:t xml:space="preserve"> </w:t>
-            </w:r>
-          </w:p>
-        </w:tc>
-      </w:tr>
-      <w:tr>
-        <w:trPr>
-          <w:trHeight w:val="470" w:hRule="exact"/>
-        </w:trPr>
-        <w:tc>
-          <w:tcPr>
-            <w:tcW w:type="dxa" w:w="10080"/>
-            <w:tcBorders>
-              <w:top w:val="none" w:color="FFFFFF" w:sz="0"/>
-              <w:left w:val="none" w:color="FFFFFF" w:sz="0"/>
-              <w:bottom w:val="single" w:color="C9D2DE" w:sz="4"/>
-              <w:right w:val="none" w:color="FFFFFF" w:sz="0"/>
-            </w:tcBorders>
-            <w:tcMar>
-              <w:top w:type="dxa" w:w="0"/>
-              <w:left w:type="dxa" w:w="0"/>
-              <w:bottom w:type="dxa" w:w="0"/>
-              <w:right w:type="dxa" w:w="0"/>
-            </w:tcMar>
-          </w:tcPr>
-          <w:p>
-            <w:pPr>
-              <w:spacing w:after="0" w:before="0"/>
-            </w:pPr>
-            <w:r>
-              <w:rPr>
-                <w:rFonts w:ascii="Calibri" w:cs="Calibri" w:eastAsia="Calibri" w:hAnsi="Calibri"/>
-                <w:sz w:val="22"/>
-                <w:szCs w:val="22"/>
-              </w:rPr>
-              <w:t xml:space="preserve"> </w:t>
-            </w:r>
-          </w:p>
-        </w:tc>
-      </w:tr>
-      <w:tr>
-        <w:trPr>
-          <w:trHeight w:val="470" w:hRule="exact"/>
-        </w:trPr>
-        <w:tc>
-          <w:tcPr>
-            <w:tcW w:type="dxa" w:w="10080"/>
-            <w:tcBorders>
-              <w:top w:val="none" w:color="FFFFFF" w:sz="0"/>
-              <w:left w:val="none" w:color="FFFFFF" w:sz="0"/>
-              <w:bottom w:val="single" w:color="C9D2DE" w:sz="4"/>
-              <w:right w:val="none" w:color="FFFFFF" w:sz="0"/>
-            </w:tcBorders>
-            <w:tcMar>
-              <w:top w:type="dxa" w:w="0"/>
-              <w:left w:type="dxa" w:w="0"/>
-              <w:bottom w:type="dxa" w:w="0"/>
-              <w:right w:type="dxa" w:w="0"/>
-            </w:tcMar>
-          </w:tcPr>
-          <w:p>
-            <w:pPr>
-              <w:spacing w:after="0" w:before="0"/>
-            </w:pPr>
-            <w:r>
-              <w:rPr>
-                <w:rFonts w:ascii="Calibri" w:cs="Calibri" w:eastAsia="Calibri" w:hAnsi="Calibri"/>
-                <w:sz w:val="22"/>
-                <w:szCs w:val="22"/>
-              </w:rPr>
-              <w:t xml:space="preserve"> </w:t>
-            </w:r>
-          </w:p>
-        </w:tc>
-      </w:tr>
-      <w:tr>
-        <w:trPr>
-          <w:trHeight w:val="470" w:hRule="exact"/>
-        </w:trPr>
-        <w:tc>
-          <w:tcPr>
-            <w:tcW w:type="dxa" w:w="10080"/>
-            <w:tcBorders>
-              <w:top w:val="none" w:color="FFFFFF" w:sz="0"/>
-              <w:left w:val="none" w:color="FFFFFF" w:sz="0"/>
-              <w:bottom w:val="single" w:color="C9D2DE" w:sz="4"/>
-              <w:right w:val="none" w:color="FFFFFF" w:sz="0"/>
-            </w:tcBorders>
-            <w:tcMar>
-              <w:top w:type="dxa" w:w="0"/>
-              <w:left w:type="dxa" w:w="0"/>
-              <w:bottom w:type="dxa" w:w="0"/>
-              <w:right w:type="dxa" w:w="0"/>
-            </w:tcMar>
-          </w:tcPr>
-          <w:p>
-            <w:pPr>
-              <w:spacing w:after="0" w:before="0"/>
-            </w:pPr>
-            <w:r>
-              <w:rPr>
-                <w:rFonts w:ascii="Calibri" w:cs="Calibri" w:eastAsia="Calibri" w:hAnsi="Calibri"/>
-                <w:sz w:val="22"/>
-                <w:szCs w:val="22"/>
-              </w:rPr>
-              <w:t xml:space="preserve"> </w:t>
-            </w:r>
-          </w:p>
-        </w:tc>
-      </w:tr>
-      <w:tr>
-        <w:trPr>
-          <w:trHeight w:val="470" w:hRule="exact"/>
-        </w:trPr>
-        <w:tc>
-          <w:tcPr>
-            <w:tcW w:type="dxa" w:w="10080"/>
-            <w:tcBorders>
-              <w:top w:val="none" w:color="FFFFFF" w:sz="0"/>
-              <w:left w:val="none" w:color="FFFFFF" w:sz="0"/>
-              <w:bottom w:val="single" w:color="C9D2DE" w:sz="4"/>
-              <w:right w:val="none" w:color="FFFFFF" w:sz="0"/>
-            </w:tcBorders>
-            <w:tcMar>
-              <w:top w:type="dxa" w:w="0"/>
-              <w:left w:type="dxa" w:w="0"/>
-              <w:bottom w:type="dxa" w:w="0"/>
-              <w:right w:type="dxa" w:w="0"/>
-            </w:tcMar>
-          </w:tcPr>
-          <w:p>
-            <w:pPr>
-              <w:spacing w:after="0" w:before="0"/>
-            </w:pPr>
-            <w:r>
-              <w:rPr>
-                <w:rFonts w:ascii="Calibri" w:cs="Calibri" w:eastAsia="Calibri" w:hAnsi="Calibri"/>
-                <w:sz w:val="22"/>
-                <w:szCs w:val="22"/>
-              </w:rPr>
-              <w:t xml:space="preserve"> </w:t>
-            </w:r>
-          </w:p>
-        </w:tc>
-      </w:tr>
-      <w:tr>
-        <w:trPr>
-          <w:trHeight w:val="470" w:hRule="exact"/>
-        </w:trPr>
-        <w:tc>
-          <w:tcPr>
-            <w:tcW w:type="dxa" w:w="10080"/>
-            <w:tcBorders>
-              <w:top w:val="none" w:color="FFFFFF" w:sz="0"/>
-              <w:left w:val="none" w:color="FFFFFF" w:sz="0"/>
-              <w:bottom w:val="single" w:color="C9D2DE" w:sz="4"/>
-              <w:right w:val="none" w:color="FFFFFF" w:sz="0"/>
-            </w:tcBorders>
-            <w:tcMar>
-              <w:top w:type="dxa" w:w="0"/>
-              <w:left w:type="dxa" w:w="0"/>
-              <w:bottom w:type="dxa" w:w="0"/>
-              <w:right w:type="dxa" w:w="0"/>
-            </w:tcMar>
-          </w:tcPr>
-          <w:p>
-            <w:pPr>
-              <w:spacing w:after="0" w:before="0"/>
-            </w:pPr>
-            <w:r>
-              <w:rPr>
-                <w:rFonts w:ascii="Calibri" w:cs="Calibri" w:eastAsia="Calibri" w:hAnsi="Calibri"/>
-                <w:sz w:val="22"/>
-                <w:szCs w:val="22"/>
-              </w:rPr>
-              <w:t xml:space="preserve"> </w:t>
+              <w:t xml:space="preserve">“People copy what they see, not what they hear.”</w:t>
+            </w:r>
+          </w:p>
+          <w:p>
+            <w:pPr>
+              <w:spacing w:after="160"/>
+              <w:jc w:val="left"/>
+            </w:pPr>
+            <w:r>
+              <w:rPr>
+                <w:rFonts w:ascii="Calibri" w:cs="Calibri" w:eastAsia="Calibri" w:hAnsi="Calibri"/>
+                <w:color w:val="5A6B82"/>
+                <w:sz w:val="18"/>
+                <w:szCs w:val="18"/>
+              </w:rPr>
+              <w:t xml:space="preserve">— Rollout Troubleshooting Guide, Marisa Smith and Beth Fahey</w:t>
+            </w:r>
+          </w:p>
+          <w:p>
+            <w:pPr>
+              <w:spacing w:after="60"/>
+              <w:ind w:left="200" w:hanging="200"/>
+              <w:jc w:val="left"/>
+            </w:pPr>
+            <w:r>
+              <w:rPr>
+                <w:rFonts w:ascii="Calibri" w:cs="Calibri" w:eastAsia="Calibri" w:hAnsi="Calibri"/>
+                <w:color w:val="1A1A1A"/>
+                <w:sz w:val="20"/>
+                <w:szCs w:val="20"/>
+              </w:rPr>
+              <w:t xml:space="preserve">1. Could every person in your company explain your Core Values and Core Focus without notes? If not, who owns fixing that, and is it a Rock?</w:t>
+            </w:r>
+          </w:p>
+          <w:p>
+            <w:pPr>
+              <w:spacing w:after="60"/>
+              <w:ind w:left="200" w:hanging="200"/>
+              <w:jc w:val="left"/>
+            </w:pPr>
+            <w:r>
+              <w:rPr>
+                <w:rFonts w:ascii="Calibri" w:cs="Calibri" w:eastAsia="Calibri" w:hAnsi="Calibri"/>
+                <w:color w:val="1A1A1A"/>
+                <w:sz w:val="20"/>
+                <w:szCs w:val="20"/>
+              </w:rPr>
+              <w:t xml:space="preserve">2. Which Rollout stage are you actually in: Preparation, Launch, Integration, or Sustainability? What is the next NO on the tracker you need to turn into a YES?</w:t>
+            </w:r>
+          </w:p>
+          <w:p>
+            <w:pPr>
+              <w:spacing w:after="60"/>
+              <w:ind w:left="200" w:hanging="200"/>
+              <w:jc w:val="left"/>
+            </w:pPr>
+            <w:r>
+              <w:rPr>
+                <w:rFonts w:ascii="Calibri" w:cs="Calibri" w:eastAsia="Calibri" w:hAnsi="Calibri"/>
+                <w:color w:val="1A1A1A"/>
+                <w:sz w:val="20"/>
+                <w:szCs w:val="20"/>
+              </w:rPr>
+              <w:t xml:space="preserve">3. Which of the 10 troubleshooting issues is alive in your company right now? What is the root cause, not the symptom?</w:t>
+            </w:r>
+          </w:p>
+          <w:p>
+            <w:pPr>
+              <w:spacing w:after="60"/>
+              <w:ind w:left="200" w:hanging="200"/>
+              <w:jc w:val="left"/>
+            </w:pPr>
+            <w:r>
+              <w:rPr>
+                <w:rFonts w:ascii="Calibri" w:cs="Calibri" w:eastAsia="Calibri" w:hAnsi="Calibri"/>
+                <w:color w:val="1A1A1A"/>
+                <w:sz w:val="20"/>
+                <w:szCs w:val="20"/>
+              </w:rPr>
+              <w:t xml:space="preserve">4. Which of your managers would say EOS is being done to them? What did leadership do, or fail to do, that created that?</w:t>
+            </w:r>
+          </w:p>
+          <w:p>
+            <w:pPr>
+              <w:spacing w:after="40" w:before="100"/>
+            </w:pPr>
+            <w:r>
+              <w:rPr>
+                <w:rFonts w:ascii="Calibri" w:cs="Calibri" w:eastAsia="Calibri" w:hAnsi="Calibri"/>
+                <w:b/>
+                <w:bCs/>
+                <w:color w:val="E87722"/>
+                <w:sz w:val="18"/>
+                <w:szCs w:val="18"/>
+              </w:rPr>
+              <w:t xml:space="preserve">ACTION:</w:t>
+            </w:r>
+          </w:p>
+          <w:p>
+            <w:pPr>
+              <w:spacing w:after="0"/>
+            </w:pPr>
+            <w:r>
+              <w:rPr>
+                <w:rFonts w:ascii="Calibri" w:cs="Calibri" w:eastAsia="Calibri" w:hAnsi="Calibri"/>
+                <w:color w:val="1A1A1A"/>
+                <w:sz w:val="20"/>
+                <w:szCs w:val="20"/>
+              </w:rPr>
+              <w:t xml:space="preserve">My To Do from this session is: </w:t>
+            </w:r>
+            <w:r>
+              <w:rPr>
+                <w:rFonts w:ascii="Calibri" w:cs="Calibri" w:eastAsia="Calibri" w:hAnsi="Calibri"/>
+                <w:color w:val="5A6B82"/>
+                <w:sz w:val="20"/>
+                <w:szCs w:val="20"/>
+              </w:rPr>
+              <w:t xml:space="preserve">_____________________________________________</w:t>
+            </w:r>
+            <w:r>
+              <w:rPr>
+                <w:rFonts w:ascii="Calibri" w:cs="Calibri" w:eastAsia="Calibri" w:hAnsi="Calibri"/>
+                <w:color w:val="1A1A1A"/>
+                <w:sz w:val="20"/>
+                <w:szCs w:val="20"/>
+              </w:rPr>
+              <w:t xml:space="preserve">  Due Date: </w:t>
+            </w:r>
+            <w:r>
+              <w:rPr>
+                <w:rFonts w:ascii="Calibri" w:cs="Calibri" w:eastAsia="Calibri" w:hAnsi="Calibri"/>
+                <w:color w:val="5A6B82"/>
+                <w:sz w:val="20"/>
+                <w:szCs w:val="20"/>
+              </w:rPr>
+              <w:t xml:space="preserve">______________</w:t>
             </w:r>
           </w:p>
         </w:tc>

</xml_diff>

<commit_message>
workbook page 13 (10 Pillars of Visionary Greatness): add compact reflection thought box to Mark C. Winters notes-continued page
- Add compact=true option to thoughtBox() that shrinks font sizes and
  spacing so a longer question list fits inside a single-page bordered
  box (used for Winters' 10-Pillar reflection).
- Support {sub: '...'} sub-items in questions list (indented, italic,
  un-numbered) so the Integrators-only prompt sits under question 5
  without breaking the 1-10 numbering.
- Winters: 4 note lines on the continued page + full 10-question
  reflection anchored to each Pillar + Integrators sub-question.
</commit_message>
<xml_diff>
--- a/deliverables/workbook/Workbook.docx
+++ b/deliverables/workbook/Workbook.docx
@@ -12664,772 +12664,316 @@
           </w:p>
         </w:tc>
       </w:tr>
+    </w:tbl>
+    <w:p>
+      <w:pPr>
+        <w:spacing w:after="200"/>
+      </w:pPr>
+      <w:r>
+        <w:t xml:space="preserve"/>
+      </w:r>
+    </w:p>
+    <w:tbl>
+      <w:tblPr>
+        <w:tblW w:type="dxa" w:w="10080"/>
+        <w:tblBorders>
+          <w:top w:val="single" w:color="auto" w:sz="4"/>
+          <w:left w:val="single" w:color="auto" w:sz="4"/>
+          <w:bottom w:val="single" w:color="auto" w:sz="4"/>
+          <w:right w:val="single" w:color="auto" w:sz="4"/>
+          <w:insideH w:val="single" w:color="auto" w:sz="4"/>
+          <w:insideV w:val="single" w:color="auto" w:sz="4"/>
+        </w:tblBorders>
+      </w:tblPr>
+      <w:tblGrid>
+        <w:gridCol w:w="10080"/>
+      </w:tblGrid>
       <w:tr>
         <w:trPr>
-          <w:trHeight w:val="470" w:hRule="exact"/>
+          <w:cantSplit/>
         </w:trPr>
         <w:tc>
           <w:tcPr>
             <w:tcW w:type="dxa" w:w="10080"/>
             <w:tcBorders>
-              <w:top w:val="none" w:color="FFFFFF" w:sz="0"/>
-              <w:left w:val="none" w:color="FFFFFF" w:sz="0"/>
-              <w:bottom w:val="single" w:color="C9D2DE" w:sz="4"/>
-              <w:right w:val="none" w:color="FFFFFF" w:sz="0"/>
-            </w:tcBorders>
-            <w:tcMar>
-              <w:top w:type="dxa" w:w="0"/>
-              <w:left w:type="dxa" w:w="0"/>
-              <w:bottom w:type="dxa" w:w="0"/>
-              <w:right w:type="dxa" w:w="0"/>
-            </w:tcMar>
-          </w:tcPr>
-          <w:p>
-            <w:pPr>
-              <w:spacing w:after="0" w:before="0"/>
-            </w:pPr>
-            <w:r>
-              <w:rPr>
-                <w:rFonts w:ascii="Calibri" w:cs="Calibri" w:eastAsia="Calibri" w:hAnsi="Calibri"/>
-                <w:sz w:val="22"/>
-                <w:szCs w:val="22"/>
-              </w:rPr>
-              <w:t xml:space="preserve"> </w:t>
-            </w:r>
-          </w:p>
-        </w:tc>
-      </w:tr>
-      <w:tr>
-        <w:trPr>
-          <w:trHeight w:val="470" w:hRule="exact"/>
-        </w:trPr>
-        <w:tc>
-          <w:tcPr>
-            <w:tcW w:type="dxa" w:w="10080"/>
-            <w:tcBorders>
-              <w:top w:val="none" w:color="FFFFFF" w:sz="0"/>
-              <w:left w:val="none" w:color="FFFFFF" w:sz="0"/>
-              <w:bottom w:val="single" w:color="C9D2DE" w:sz="4"/>
-              <w:right w:val="none" w:color="FFFFFF" w:sz="0"/>
-            </w:tcBorders>
-            <w:tcMar>
-              <w:top w:type="dxa" w:w="0"/>
-              <w:left w:type="dxa" w:w="0"/>
-              <w:bottom w:type="dxa" w:w="0"/>
-              <w:right w:type="dxa" w:w="0"/>
-            </w:tcMar>
-          </w:tcPr>
-          <w:p>
-            <w:pPr>
-              <w:spacing w:after="0" w:before="0"/>
-            </w:pPr>
-            <w:r>
-              <w:rPr>
-                <w:rFonts w:ascii="Calibri" w:cs="Calibri" w:eastAsia="Calibri" w:hAnsi="Calibri"/>
-                <w:sz w:val="22"/>
-                <w:szCs w:val="22"/>
-              </w:rPr>
-              <w:t xml:space="preserve"> </w:t>
-            </w:r>
-          </w:p>
-        </w:tc>
-      </w:tr>
-      <w:tr>
-        <w:trPr>
-          <w:trHeight w:val="470" w:hRule="exact"/>
-        </w:trPr>
-        <w:tc>
-          <w:tcPr>
-            <w:tcW w:type="dxa" w:w="10080"/>
-            <w:tcBorders>
-              <w:top w:val="none" w:color="FFFFFF" w:sz="0"/>
-              <w:left w:val="none" w:color="FFFFFF" w:sz="0"/>
-              <w:bottom w:val="single" w:color="C9D2DE" w:sz="4"/>
-              <w:right w:val="none" w:color="FFFFFF" w:sz="0"/>
-            </w:tcBorders>
-            <w:tcMar>
-              <w:top w:type="dxa" w:w="0"/>
-              <w:left w:type="dxa" w:w="0"/>
-              <w:bottom w:type="dxa" w:w="0"/>
-              <w:right w:type="dxa" w:w="0"/>
-            </w:tcMar>
-          </w:tcPr>
-          <w:p>
-            <w:pPr>
-              <w:spacing w:after="0" w:before="0"/>
-            </w:pPr>
-            <w:r>
-              <w:rPr>
-                <w:rFonts w:ascii="Calibri" w:cs="Calibri" w:eastAsia="Calibri" w:hAnsi="Calibri"/>
-                <w:sz w:val="22"/>
-                <w:szCs w:val="22"/>
-              </w:rPr>
-              <w:t xml:space="preserve"> </w:t>
-            </w:r>
-          </w:p>
-        </w:tc>
-      </w:tr>
-      <w:tr>
-        <w:trPr>
-          <w:trHeight w:val="470" w:hRule="exact"/>
-        </w:trPr>
-        <w:tc>
-          <w:tcPr>
-            <w:tcW w:type="dxa" w:w="10080"/>
-            <w:tcBorders>
-              <w:top w:val="none" w:color="FFFFFF" w:sz="0"/>
-              <w:left w:val="none" w:color="FFFFFF" w:sz="0"/>
-              <w:bottom w:val="single" w:color="C9D2DE" w:sz="4"/>
-              <w:right w:val="none" w:color="FFFFFF" w:sz="0"/>
-            </w:tcBorders>
-            <w:tcMar>
-              <w:top w:type="dxa" w:w="0"/>
-              <w:left w:type="dxa" w:w="0"/>
-              <w:bottom w:type="dxa" w:w="0"/>
-              <w:right w:type="dxa" w:w="0"/>
-            </w:tcMar>
-          </w:tcPr>
-          <w:p>
-            <w:pPr>
-              <w:spacing w:after="0" w:before="0"/>
-            </w:pPr>
-            <w:r>
-              <w:rPr>
-                <w:rFonts w:ascii="Calibri" w:cs="Calibri" w:eastAsia="Calibri" w:hAnsi="Calibri"/>
-                <w:sz w:val="22"/>
-                <w:szCs w:val="22"/>
-              </w:rPr>
-              <w:t xml:space="preserve"> </w:t>
-            </w:r>
-          </w:p>
-        </w:tc>
-      </w:tr>
-      <w:tr>
-        <w:trPr>
-          <w:trHeight w:val="470" w:hRule="exact"/>
-        </w:trPr>
-        <w:tc>
-          <w:tcPr>
-            <w:tcW w:type="dxa" w:w="10080"/>
-            <w:tcBorders>
-              <w:top w:val="none" w:color="FFFFFF" w:sz="0"/>
-              <w:left w:val="none" w:color="FFFFFF" w:sz="0"/>
-              <w:bottom w:val="single" w:color="C9D2DE" w:sz="4"/>
-              <w:right w:val="none" w:color="FFFFFF" w:sz="0"/>
-            </w:tcBorders>
-            <w:tcMar>
-              <w:top w:type="dxa" w:w="0"/>
-              <w:left w:type="dxa" w:w="0"/>
-              <w:bottom w:type="dxa" w:w="0"/>
-              <w:right w:type="dxa" w:w="0"/>
-            </w:tcMar>
-          </w:tcPr>
-          <w:p>
-            <w:pPr>
-              <w:spacing w:after="0" w:before="0"/>
-            </w:pPr>
-            <w:r>
-              <w:rPr>
-                <w:rFonts w:ascii="Calibri" w:cs="Calibri" w:eastAsia="Calibri" w:hAnsi="Calibri"/>
-                <w:sz w:val="22"/>
-                <w:szCs w:val="22"/>
-              </w:rPr>
-              <w:t xml:space="preserve"> </w:t>
-            </w:r>
-          </w:p>
-        </w:tc>
-      </w:tr>
-      <w:tr>
-        <w:trPr>
-          <w:trHeight w:val="470" w:hRule="exact"/>
-        </w:trPr>
-        <w:tc>
-          <w:tcPr>
-            <w:tcW w:type="dxa" w:w="10080"/>
-            <w:tcBorders>
-              <w:top w:val="none" w:color="FFFFFF" w:sz="0"/>
-              <w:left w:val="none" w:color="FFFFFF" w:sz="0"/>
-              <w:bottom w:val="single" w:color="C9D2DE" w:sz="4"/>
-              <w:right w:val="none" w:color="FFFFFF" w:sz="0"/>
-            </w:tcBorders>
-            <w:tcMar>
-              <w:top w:type="dxa" w:w="0"/>
-              <w:left w:type="dxa" w:w="0"/>
-              <w:bottom w:type="dxa" w:w="0"/>
-              <w:right w:type="dxa" w:w="0"/>
-            </w:tcMar>
-          </w:tcPr>
-          <w:p>
-            <w:pPr>
-              <w:spacing w:after="0" w:before="0"/>
-            </w:pPr>
-            <w:r>
-              <w:rPr>
-                <w:rFonts w:ascii="Calibri" w:cs="Calibri" w:eastAsia="Calibri" w:hAnsi="Calibri"/>
-                <w:sz w:val="22"/>
-                <w:szCs w:val="22"/>
-              </w:rPr>
-              <w:t xml:space="preserve"> </w:t>
-            </w:r>
-          </w:p>
-        </w:tc>
-      </w:tr>
-      <w:tr>
-        <w:trPr>
-          <w:trHeight w:val="470" w:hRule="exact"/>
-        </w:trPr>
-        <w:tc>
-          <w:tcPr>
-            <w:tcW w:type="dxa" w:w="10080"/>
-            <w:tcBorders>
-              <w:top w:val="none" w:color="FFFFFF" w:sz="0"/>
-              <w:left w:val="none" w:color="FFFFFF" w:sz="0"/>
-              <w:bottom w:val="single" w:color="C9D2DE" w:sz="4"/>
-              <w:right w:val="none" w:color="FFFFFF" w:sz="0"/>
-            </w:tcBorders>
-            <w:tcMar>
-              <w:top w:type="dxa" w:w="0"/>
-              <w:left w:type="dxa" w:w="0"/>
-              <w:bottom w:type="dxa" w:w="0"/>
-              <w:right w:type="dxa" w:w="0"/>
-            </w:tcMar>
-          </w:tcPr>
-          <w:p>
-            <w:pPr>
-              <w:spacing w:after="0" w:before="0"/>
-            </w:pPr>
-            <w:r>
-              <w:rPr>
-                <w:rFonts w:ascii="Calibri" w:cs="Calibri" w:eastAsia="Calibri" w:hAnsi="Calibri"/>
-                <w:sz w:val="22"/>
-                <w:szCs w:val="22"/>
-              </w:rPr>
-              <w:t xml:space="preserve"> </w:t>
-            </w:r>
-          </w:p>
-        </w:tc>
-      </w:tr>
-      <w:tr>
-        <w:trPr>
-          <w:trHeight w:val="470" w:hRule="exact"/>
-        </w:trPr>
-        <w:tc>
-          <w:tcPr>
-            <w:tcW w:type="dxa" w:w="10080"/>
-            <w:tcBorders>
-              <w:top w:val="none" w:color="FFFFFF" w:sz="0"/>
-              <w:left w:val="none" w:color="FFFFFF" w:sz="0"/>
-              <w:bottom w:val="single" w:color="C9D2DE" w:sz="4"/>
-              <w:right w:val="none" w:color="FFFFFF" w:sz="0"/>
-            </w:tcBorders>
-            <w:tcMar>
-              <w:top w:type="dxa" w:w="0"/>
-              <w:left w:type="dxa" w:w="0"/>
-              <w:bottom w:type="dxa" w:w="0"/>
-              <w:right w:type="dxa" w:w="0"/>
-            </w:tcMar>
-          </w:tcPr>
-          <w:p>
-            <w:pPr>
-              <w:spacing w:after="0" w:before="0"/>
-            </w:pPr>
-            <w:r>
-              <w:rPr>
-                <w:rFonts w:ascii="Calibri" w:cs="Calibri" w:eastAsia="Calibri" w:hAnsi="Calibri"/>
-                <w:sz w:val="22"/>
-                <w:szCs w:val="22"/>
-              </w:rPr>
-              <w:t xml:space="preserve"> </w:t>
-            </w:r>
-          </w:p>
-        </w:tc>
-      </w:tr>
-      <w:tr>
-        <w:trPr>
-          <w:trHeight w:val="470" w:hRule="exact"/>
-        </w:trPr>
-        <w:tc>
-          <w:tcPr>
-            <w:tcW w:type="dxa" w:w="10080"/>
-            <w:tcBorders>
-              <w:top w:val="none" w:color="FFFFFF" w:sz="0"/>
-              <w:left w:val="none" w:color="FFFFFF" w:sz="0"/>
-              <w:bottom w:val="single" w:color="C9D2DE" w:sz="4"/>
-              <w:right w:val="none" w:color="FFFFFF" w:sz="0"/>
-            </w:tcBorders>
-            <w:tcMar>
-              <w:top w:type="dxa" w:w="0"/>
-              <w:left w:type="dxa" w:w="0"/>
-              <w:bottom w:type="dxa" w:w="0"/>
-              <w:right w:type="dxa" w:w="0"/>
-            </w:tcMar>
-          </w:tcPr>
-          <w:p>
-            <w:pPr>
-              <w:spacing w:after="0" w:before="0"/>
-            </w:pPr>
-            <w:r>
-              <w:rPr>
-                <w:rFonts w:ascii="Calibri" w:cs="Calibri" w:eastAsia="Calibri" w:hAnsi="Calibri"/>
-                <w:sz w:val="22"/>
-                <w:szCs w:val="22"/>
-              </w:rPr>
-              <w:t xml:space="preserve"> </w:t>
-            </w:r>
-          </w:p>
-        </w:tc>
-      </w:tr>
-      <w:tr>
-        <w:trPr>
-          <w:trHeight w:val="470" w:hRule="exact"/>
-        </w:trPr>
-        <w:tc>
-          <w:tcPr>
-            <w:tcW w:type="dxa" w:w="10080"/>
-            <w:tcBorders>
-              <w:top w:val="none" w:color="FFFFFF" w:sz="0"/>
-              <w:left w:val="none" w:color="FFFFFF" w:sz="0"/>
-              <w:bottom w:val="single" w:color="C9D2DE" w:sz="4"/>
-              <w:right w:val="none" w:color="FFFFFF" w:sz="0"/>
-            </w:tcBorders>
-            <w:tcMar>
-              <w:top w:type="dxa" w:w="0"/>
-              <w:left w:type="dxa" w:w="0"/>
-              <w:bottom w:type="dxa" w:w="0"/>
-              <w:right w:type="dxa" w:w="0"/>
-            </w:tcMar>
-          </w:tcPr>
-          <w:p>
-            <w:pPr>
-              <w:spacing w:after="0" w:before="0"/>
-            </w:pPr>
-            <w:r>
-              <w:rPr>
-                <w:rFonts w:ascii="Calibri" w:cs="Calibri" w:eastAsia="Calibri" w:hAnsi="Calibri"/>
-                <w:sz w:val="22"/>
-                <w:szCs w:val="22"/>
-              </w:rPr>
-              <w:t xml:space="preserve"> </w:t>
-            </w:r>
-          </w:p>
-        </w:tc>
-      </w:tr>
-      <w:tr>
-        <w:trPr>
-          <w:trHeight w:val="470" w:hRule="exact"/>
-        </w:trPr>
-        <w:tc>
-          <w:tcPr>
-            <w:tcW w:type="dxa" w:w="10080"/>
-            <w:tcBorders>
-              <w:top w:val="none" w:color="FFFFFF" w:sz="0"/>
-              <w:left w:val="none" w:color="FFFFFF" w:sz="0"/>
-              <w:bottom w:val="single" w:color="C9D2DE" w:sz="4"/>
-              <w:right w:val="none" w:color="FFFFFF" w:sz="0"/>
-            </w:tcBorders>
-            <w:tcMar>
-              <w:top w:type="dxa" w:w="0"/>
-              <w:left w:type="dxa" w:w="0"/>
-              <w:bottom w:type="dxa" w:w="0"/>
-              <w:right w:type="dxa" w:w="0"/>
-            </w:tcMar>
-          </w:tcPr>
-          <w:p>
-            <w:pPr>
-              <w:spacing w:after="0" w:before="0"/>
-            </w:pPr>
-            <w:r>
-              <w:rPr>
-                <w:rFonts w:ascii="Calibri" w:cs="Calibri" w:eastAsia="Calibri" w:hAnsi="Calibri"/>
-                <w:sz w:val="22"/>
-                <w:szCs w:val="22"/>
-              </w:rPr>
-              <w:t xml:space="preserve"> </w:t>
-            </w:r>
-          </w:p>
-        </w:tc>
-      </w:tr>
-      <w:tr>
-        <w:trPr>
-          <w:trHeight w:val="470" w:hRule="exact"/>
-        </w:trPr>
-        <w:tc>
-          <w:tcPr>
-            <w:tcW w:type="dxa" w:w="10080"/>
-            <w:tcBorders>
-              <w:top w:val="none" w:color="FFFFFF" w:sz="0"/>
-              <w:left w:val="none" w:color="FFFFFF" w:sz="0"/>
-              <w:bottom w:val="single" w:color="C9D2DE" w:sz="4"/>
-              <w:right w:val="none" w:color="FFFFFF" w:sz="0"/>
-            </w:tcBorders>
-            <w:tcMar>
-              <w:top w:type="dxa" w:w="0"/>
-              <w:left w:type="dxa" w:w="0"/>
-              <w:bottom w:type="dxa" w:w="0"/>
-              <w:right w:type="dxa" w:w="0"/>
-            </w:tcMar>
-          </w:tcPr>
-          <w:p>
-            <w:pPr>
-              <w:spacing w:after="0" w:before="0"/>
-            </w:pPr>
-            <w:r>
-              <w:rPr>
-                <w:rFonts w:ascii="Calibri" w:cs="Calibri" w:eastAsia="Calibri" w:hAnsi="Calibri"/>
-                <w:sz w:val="22"/>
-                <w:szCs w:val="22"/>
-              </w:rPr>
-              <w:t xml:space="preserve"> </w:t>
-            </w:r>
-          </w:p>
-        </w:tc>
-      </w:tr>
-      <w:tr>
-        <w:trPr>
-          <w:trHeight w:val="470" w:hRule="exact"/>
-        </w:trPr>
-        <w:tc>
-          <w:tcPr>
-            <w:tcW w:type="dxa" w:w="10080"/>
-            <w:tcBorders>
-              <w:top w:val="none" w:color="FFFFFF" w:sz="0"/>
-              <w:left w:val="none" w:color="FFFFFF" w:sz="0"/>
-              <w:bottom w:val="single" w:color="C9D2DE" w:sz="4"/>
-              <w:right w:val="none" w:color="FFFFFF" w:sz="0"/>
-            </w:tcBorders>
-            <w:tcMar>
-              <w:top w:type="dxa" w:w="0"/>
-              <w:left w:type="dxa" w:w="0"/>
-              <w:bottom w:type="dxa" w:w="0"/>
-              <w:right w:type="dxa" w:w="0"/>
-            </w:tcMar>
-          </w:tcPr>
-          <w:p>
-            <w:pPr>
-              <w:spacing w:after="0" w:before="0"/>
-            </w:pPr>
-            <w:r>
-              <w:rPr>
-                <w:rFonts w:ascii="Calibri" w:cs="Calibri" w:eastAsia="Calibri" w:hAnsi="Calibri"/>
-                <w:sz w:val="22"/>
-                <w:szCs w:val="22"/>
-              </w:rPr>
-              <w:t xml:space="preserve"> </w:t>
-            </w:r>
-          </w:p>
-        </w:tc>
-      </w:tr>
-      <w:tr>
-        <w:trPr>
-          <w:trHeight w:val="470" w:hRule="exact"/>
-        </w:trPr>
-        <w:tc>
-          <w:tcPr>
-            <w:tcW w:type="dxa" w:w="10080"/>
-            <w:tcBorders>
-              <w:top w:val="none" w:color="FFFFFF" w:sz="0"/>
-              <w:left w:val="none" w:color="FFFFFF" w:sz="0"/>
-              <w:bottom w:val="single" w:color="C9D2DE" w:sz="4"/>
-              <w:right w:val="none" w:color="FFFFFF" w:sz="0"/>
-            </w:tcBorders>
-            <w:tcMar>
-              <w:top w:type="dxa" w:w="0"/>
-              <w:left w:type="dxa" w:w="0"/>
-              <w:bottom w:type="dxa" w:w="0"/>
-              <w:right w:type="dxa" w:w="0"/>
-            </w:tcMar>
-          </w:tcPr>
-          <w:p>
-            <w:pPr>
-              <w:spacing w:after="0" w:before="0"/>
-            </w:pPr>
-            <w:r>
-              <w:rPr>
-                <w:rFonts w:ascii="Calibri" w:cs="Calibri" w:eastAsia="Calibri" w:hAnsi="Calibri"/>
-                <w:sz w:val="22"/>
-                <w:szCs w:val="22"/>
-              </w:rPr>
-              <w:t xml:space="preserve"> </w:t>
-            </w:r>
-          </w:p>
-        </w:tc>
-      </w:tr>
-      <w:tr>
-        <w:trPr>
-          <w:trHeight w:val="470" w:hRule="exact"/>
-        </w:trPr>
-        <w:tc>
-          <w:tcPr>
-            <w:tcW w:type="dxa" w:w="10080"/>
-            <w:tcBorders>
-              <w:top w:val="none" w:color="FFFFFF" w:sz="0"/>
-              <w:left w:val="none" w:color="FFFFFF" w:sz="0"/>
-              <w:bottom w:val="single" w:color="C9D2DE" w:sz="4"/>
-              <w:right w:val="none" w:color="FFFFFF" w:sz="0"/>
-            </w:tcBorders>
-            <w:tcMar>
-              <w:top w:type="dxa" w:w="0"/>
-              <w:left w:type="dxa" w:w="0"/>
-              <w:bottom w:type="dxa" w:w="0"/>
-              <w:right w:type="dxa" w:w="0"/>
-            </w:tcMar>
-          </w:tcPr>
-          <w:p>
-            <w:pPr>
-              <w:spacing w:after="0" w:before="0"/>
-            </w:pPr>
-            <w:r>
-              <w:rPr>
-                <w:rFonts w:ascii="Calibri" w:cs="Calibri" w:eastAsia="Calibri" w:hAnsi="Calibri"/>
-                <w:sz w:val="22"/>
-                <w:szCs w:val="22"/>
-              </w:rPr>
-              <w:t xml:space="preserve"> </w:t>
-            </w:r>
-          </w:p>
-        </w:tc>
-      </w:tr>
-      <w:tr>
-        <w:trPr>
-          <w:trHeight w:val="470" w:hRule="exact"/>
-        </w:trPr>
-        <w:tc>
-          <w:tcPr>
-            <w:tcW w:type="dxa" w:w="10080"/>
-            <w:tcBorders>
-              <w:top w:val="none" w:color="FFFFFF" w:sz="0"/>
-              <w:left w:val="none" w:color="FFFFFF" w:sz="0"/>
-              <w:bottom w:val="single" w:color="C9D2DE" w:sz="4"/>
-              <w:right w:val="none" w:color="FFFFFF" w:sz="0"/>
-            </w:tcBorders>
-            <w:tcMar>
-              <w:top w:type="dxa" w:w="0"/>
-              <w:left w:type="dxa" w:w="0"/>
-              <w:bottom w:type="dxa" w:w="0"/>
-              <w:right w:type="dxa" w:w="0"/>
-            </w:tcMar>
-          </w:tcPr>
-          <w:p>
-            <w:pPr>
-              <w:spacing w:after="0" w:before="0"/>
-            </w:pPr>
-            <w:r>
-              <w:rPr>
-                <w:rFonts w:ascii="Calibri" w:cs="Calibri" w:eastAsia="Calibri" w:hAnsi="Calibri"/>
-                <w:sz w:val="22"/>
-                <w:szCs w:val="22"/>
-              </w:rPr>
-              <w:t xml:space="preserve"> </w:t>
-            </w:r>
-          </w:p>
-        </w:tc>
-      </w:tr>
-      <w:tr>
-        <w:trPr>
-          <w:trHeight w:val="470" w:hRule="exact"/>
-        </w:trPr>
-        <w:tc>
-          <w:tcPr>
-            <w:tcW w:type="dxa" w:w="10080"/>
-            <w:tcBorders>
-              <w:top w:val="none" w:color="FFFFFF" w:sz="0"/>
-              <w:left w:val="none" w:color="FFFFFF" w:sz="0"/>
-              <w:bottom w:val="single" w:color="C9D2DE" w:sz="4"/>
-              <w:right w:val="none" w:color="FFFFFF" w:sz="0"/>
-            </w:tcBorders>
-            <w:tcMar>
-              <w:top w:type="dxa" w:w="0"/>
-              <w:left w:type="dxa" w:w="0"/>
-              <w:bottom w:type="dxa" w:w="0"/>
-              <w:right w:type="dxa" w:w="0"/>
-            </w:tcMar>
-          </w:tcPr>
-          <w:p>
-            <w:pPr>
-              <w:spacing w:after="0" w:before="0"/>
-            </w:pPr>
-            <w:r>
-              <w:rPr>
-                <w:rFonts w:ascii="Calibri" w:cs="Calibri" w:eastAsia="Calibri" w:hAnsi="Calibri"/>
-                <w:sz w:val="22"/>
-                <w:szCs w:val="22"/>
-              </w:rPr>
-              <w:t xml:space="preserve"> </w:t>
-            </w:r>
-          </w:p>
-        </w:tc>
-      </w:tr>
-      <w:tr>
-        <w:trPr>
-          <w:trHeight w:val="470" w:hRule="exact"/>
-        </w:trPr>
-        <w:tc>
-          <w:tcPr>
-            <w:tcW w:type="dxa" w:w="10080"/>
-            <w:tcBorders>
-              <w:top w:val="none" w:color="FFFFFF" w:sz="0"/>
-              <w:left w:val="none" w:color="FFFFFF" w:sz="0"/>
-              <w:bottom w:val="single" w:color="C9D2DE" w:sz="4"/>
-              <w:right w:val="none" w:color="FFFFFF" w:sz="0"/>
-            </w:tcBorders>
-            <w:tcMar>
-              <w:top w:type="dxa" w:w="0"/>
-              <w:left w:type="dxa" w:w="0"/>
-              <w:bottom w:type="dxa" w:w="0"/>
-              <w:right w:type="dxa" w:w="0"/>
-            </w:tcMar>
-          </w:tcPr>
-          <w:p>
-            <w:pPr>
-              <w:spacing w:after="0" w:before="0"/>
-            </w:pPr>
-            <w:r>
-              <w:rPr>
-                <w:rFonts w:ascii="Calibri" w:cs="Calibri" w:eastAsia="Calibri" w:hAnsi="Calibri"/>
-                <w:sz w:val="22"/>
-                <w:szCs w:val="22"/>
-              </w:rPr>
-              <w:t xml:space="preserve"> </w:t>
-            </w:r>
-          </w:p>
-        </w:tc>
-      </w:tr>
-      <w:tr>
-        <w:trPr>
-          <w:trHeight w:val="470" w:hRule="exact"/>
-        </w:trPr>
-        <w:tc>
-          <w:tcPr>
-            <w:tcW w:type="dxa" w:w="10080"/>
-            <w:tcBorders>
-              <w:top w:val="none" w:color="FFFFFF" w:sz="0"/>
-              <w:left w:val="none" w:color="FFFFFF" w:sz="0"/>
-              <w:bottom w:val="single" w:color="C9D2DE" w:sz="4"/>
-              <w:right w:val="none" w:color="FFFFFF" w:sz="0"/>
-            </w:tcBorders>
-            <w:tcMar>
-              <w:top w:type="dxa" w:w="0"/>
-              <w:left w:type="dxa" w:w="0"/>
-              <w:bottom w:type="dxa" w:w="0"/>
-              <w:right w:type="dxa" w:w="0"/>
-            </w:tcMar>
-          </w:tcPr>
-          <w:p>
-            <w:pPr>
-              <w:spacing w:after="0" w:before="0"/>
-            </w:pPr>
-            <w:r>
-              <w:rPr>
-                <w:rFonts w:ascii="Calibri" w:cs="Calibri" w:eastAsia="Calibri" w:hAnsi="Calibri"/>
-                <w:sz w:val="22"/>
-                <w:szCs w:val="22"/>
-              </w:rPr>
-              <w:t xml:space="preserve"> </w:t>
-            </w:r>
-          </w:p>
-        </w:tc>
-      </w:tr>
-      <w:tr>
-        <w:trPr>
-          <w:trHeight w:val="470" w:hRule="exact"/>
-        </w:trPr>
-        <w:tc>
-          <w:tcPr>
-            <w:tcW w:type="dxa" w:w="10080"/>
-            <w:tcBorders>
-              <w:top w:val="none" w:color="FFFFFF" w:sz="0"/>
-              <w:left w:val="none" w:color="FFFFFF" w:sz="0"/>
-              <w:bottom w:val="single" w:color="C9D2DE" w:sz="4"/>
-              <w:right w:val="none" w:color="FFFFFF" w:sz="0"/>
-            </w:tcBorders>
-            <w:tcMar>
-              <w:top w:type="dxa" w:w="0"/>
-              <w:left w:type="dxa" w:w="0"/>
-              <w:bottom w:type="dxa" w:w="0"/>
-              <w:right w:type="dxa" w:w="0"/>
-            </w:tcMar>
-          </w:tcPr>
-          <w:p>
-            <w:pPr>
-              <w:spacing w:after="0" w:before="0"/>
-            </w:pPr>
-            <w:r>
-              <w:rPr>
-                <w:rFonts w:ascii="Calibri" w:cs="Calibri" w:eastAsia="Calibri" w:hAnsi="Calibri"/>
-                <w:sz w:val="22"/>
-                <w:szCs w:val="22"/>
-              </w:rPr>
-              <w:t xml:space="preserve"> </w:t>
-            </w:r>
-          </w:p>
-        </w:tc>
-      </w:tr>
-      <w:tr>
-        <w:trPr>
-          <w:trHeight w:val="470" w:hRule="exact"/>
-        </w:trPr>
-        <w:tc>
-          <w:tcPr>
-            <w:tcW w:type="dxa" w:w="10080"/>
-            <w:tcBorders>
-              <w:top w:val="none" w:color="FFFFFF" w:sz="0"/>
-              <w:left w:val="none" w:color="FFFFFF" w:sz="0"/>
-              <w:bottom w:val="single" w:color="C9D2DE" w:sz="4"/>
-              <w:right w:val="none" w:color="FFFFFF" w:sz="0"/>
-            </w:tcBorders>
-            <w:tcMar>
-              <w:top w:type="dxa" w:w="0"/>
-              <w:left w:type="dxa" w:w="0"/>
-              <w:bottom w:type="dxa" w:w="0"/>
-              <w:right w:type="dxa" w:w="0"/>
-            </w:tcMar>
-          </w:tcPr>
-          <w:p>
-            <w:pPr>
-              <w:spacing w:after="0" w:before="0"/>
-            </w:pPr>
-            <w:r>
-              <w:rPr>
-                <w:rFonts w:ascii="Calibri" w:cs="Calibri" w:eastAsia="Calibri" w:hAnsi="Calibri"/>
-                <w:sz w:val="22"/>
-                <w:szCs w:val="22"/>
-              </w:rPr>
-              <w:t xml:space="preserve"> </w:t>
-            </w:r>
-          </w:p>
-        </w:tc>
-      </w:tr>
-      <w:tr>
-        <w:trPr>
-          <w:trHeight w:val="470" w:hRule="exact"/>
-        </w:trPr>
-        <w:tc>
-          <w:tcPr>
-            <w:tcW w:type="dxa" w:w="10080"/>
-            <w:tcBorders>
-              <w:top w:val="none" w:color="FFFFFF" w:sz="0"/>
-              <w:left w:val="none" w:color="FFFFFF" w:sz="0"/>
-              <w:bottom w:val="single" w:color="C9D2DE" w:sz="4"/>
-              <w:right w:val="none" w:color="FFFFFF" w:sz="0"/>
-            </w:tcBorders>
-            <w:tcMar>
-              <w:top w:type="dxa" w:w="0"/>
-              <w:left w:type="dxa" w:w="0"/>
-              <w:bottom w:type="dxa" w:w="0"/>
-              <w:right w:type="dxa" w:w="0"/>
-            </w:tcMar>
-          </w:tcPr>
-          <w:p>
-            <w:pPr>
-              <w:spacing w:after="0" w:before="0"/>
-            </w:pPr>
-            <w:r>
-              <w:rPr>
-                <w:rFonts w:ascii="Calibri" w:cs="Calibri" w:eastAsia="Calibri" w:hAnsi="Calibri"/>
-                <w:sz w:val="22"/>
-                <w:szCs w:val="22"/>
-              </w:rPr>
-              <w:t xml:space="preserve"> </w:t>
+              <w:top w:val="dashSmallGap" w:color="E87722" w:sz="12"/>
+              <w:left w:val="dashSmallGap" w:color="E87722" w:sz="12"/>
+              <w:bottom w:val="dashSmallGap" w:color="E87722" w:sz="12"/>
+              <w:right w:val="dashSmallGap" w:color="E87722" w:sz="12"/>
+            </w:tcBorders>
+            <w:shd w:fill="FFFFFF" w:color="auto" w:val="clear"/>
+            <w:tcMar>
+              <w:top w:type="dxa" w:w="240"/>
+              <w:left w:type="dxa" w:w="300"/>
+              <w:bottom w:type="dxa" w:w="240"/>
+              <w:right w:type="dxa" w:w="300"/>
+            </w:tcMar>
+          </w:tcPr>
+          <w:p>
+            <w:pPr>
+              <w:spacing w:after="40"/>
+              <w:jc w:val="left"/>
+            </w:pPr>
+            <w:r>
+              <w:rPr>
+                <w:rFonts w:ascii="Calibri" w:cs="Calibri" w:eastAsia="Calibri" w:hAnsi="Calibri"/>
+                <w:i/>
+                <w:iCs/>
+                <w:color w:val="0B1F3A"/>
+                <w:sz w:val="20"/>
+                <w:szCs w:val="20"/>
+              </w:rPr>
+              <w:t xml:space="preserve">“Structure fuels freedom.”</w:t>
+            </w:r>
+          </w:p>
+          <w:p>
+            <w:pPr>
+              <w:spacing w:after="80"/>
+              <w:jc w:val="left"/>
+            </w:pPr>
+            <w:r>
+              <w:rPr>
+                <w:rFonts w:ascii="Calibri" w:cs="Calibri" w:eastAsia="Calibri" w:hAnsi="Calibri"/>
+                <w:color w:val="5A6B82"/>
+                <w:sz w:val="16"/>
+                <w:szCs w:val="16"/>
+              </w:rPr>
+              <w:t xml:space="preserve">— Mark C. Winters, Visionary</w:t>
+            </w:r>
+          </w:p>
+          <w:p>
+            <w:pPr>
+              <w:spacing w:after="30"/>
+              <w:ind w:left="260" w:hanging="260"/>
+              <w:jc w:val="left"/>
+            </w:pPr>
+            <w:r>
+              <w:rPr>
+                <w:rFonts w:ascii="Calibri" w:cs="Calibri" w:eastAsia="Calibri" w:hAnsi="Calibri"/>
+                <w:color w:val="1A1A1A"/>
+                <w:sz w:val="16"/>
+                <w:szCs w:val="16"/>
+              </w:rPr>
+              <w:t xml:space="preserve">1. Know Thyself ★ Where does your Intrinsic Genius (Competence × Joy × Drive) actually live, and what share of last week did you spend there?</w:t>
+            </w:r>
+          </w:p>
+          <w:p>
+            <w:pPr>
+              <w:spacing w:after="30"/>
+              <w:ind w:left="260" w:hanging="260"/>
+              <w:jc w:val="left"/>
+            </w:pPr>
+            <w:r>
+              <w:rPr>
+                <w:rFonts w:ascii="Calibri" w:cs="Calibri" w:eastAsia="Calibri" w:hAnsi="Calibri"/>
+                <w:color w:val="1A1A1A"/>
+                <w:sz w:val="16"/>
+                <w:szCs w:val="16"/>
+              </w:rPr>
+              <w:t xml:space="preserve">2. Maintain Warrior Shape ★ Which lever is red on your personal Scorecard right now: Body, Mind, or Spirit? What is the one habit that turns it green?</w:t>
+            </w:r>
+          </w:p>
+          <w:p>
+            <w:pPr>
+              <w:spacing w:after="30"/>
+              <w:ind w:left="260" w:hanging="260"/>
+              <w:jc w:val="left"/>
+            </w:pPr>
+            <w:r>
+              <w:rPr>
+                <w:rFonts w:ascii="Calibri" w:cs="Calibri" w:eastAsia="Calibri" w:hAnsi="Calibri"/>
+                <w:color w:val="1A1A1A"/>
+                <w:sz w:val="16"/>
+                <w:szCs w:val="16"/>
+              </w:rPr>
+              <w:t xml:space="preserve">3. Surround Yourself ★ Which of your Seven Special Posts is empty or weak: Integrator, Leadership Team, Assistant, Coaches and Advisors, Peer Group, Family, Friends?</w:t>
+            </w:r>
+          </w:p>
+          <w:p>
+            <w:pPr>
+              <w:spacing w:after="30"/>
+              <w:ind w:left="260" w:hanging="260"/>
+              <w:jc w:val="left"/>
+            </w:pPr>
+            <w:r>
+              <w:rPr>
+                <w:rFonts w:ascii="Calibri" w:cs="Calibri" w:eastAsia="Calibri" w:hAnsi="Calibri"/>
+                <w:color w:val="1A1A1A"/>
+                <w:sz w:val="16"/>
+                <w:szCs w:val="16"/>
+              </w:rPr>
+              <w:t xml:space="preserve">4. Commit to Your Operating System ★ Have you chosen one operating system and committed to mastery, or are you still waffling? What does the waffling cost your team?</w:t>
+            </w:r>
+          </w:p>
+          <w:p>
+            <w:pPr>
+              <w:spacing w:after="30"/>
+              <w:ind w:left="260" w:hanging="260"/>
+              <w:jc w:val="left"/>
+            </w:pPr>
+            <w:r>
+              <w:rPr>
+                <w:rFonts w:ascii="Calibri" w:cs="Calibri" w:eastAsia="Calibri" w:hAnsi="Calibri"/>
+                <w:color w:val="1A1A1A"/>
+                <w:sz w:val="16"/>
+                <w:szCs w:val="16"/>
+              </w:rPr>
+              <w:t xml:space="preserve">5. Support Your Integrator ★ Which of the Five Rules did you break most recently: Stay on the same page, No end runs, The Integrator is the tie-breaker, Owner vs. Employee, Maintain mutual respect? What did it cost your Integrator?</w:t>
+            </w:r>
+          </w:p>
+          <w:p>
+            <w:pPr>
+              <w:spacing w:after="30"/>
+              <w:ind w:left="460" w:hanging="0"/>
+              <w:jc w:val="left"/>
+            </w:pPr>
+            <w:r>
+              <w:rPr>
+                <w:rFonts w:ascii="Calibri" w:cs="Calibri" w:eastAsia="Calibri" w:hAnsi="Calibri"/>
+                <w:i/>
+                <w:iCs/>
+                <w:color w:val="5A6B82"/>
+                <w:sz w:val="16"/>
+                <w:szCs w:val="16"/>
+              </w:rPr>
+              <w:t xml:space="preserve">Integrators ★ Which rule did your Visionary break, and did you call it?</w:t>
+            </w:r>
+          </w:p>
+          <w:p>
+            <w:pPr>
+              <w:spacing w:after="30"/>
+              <w:ind w:left="260" w:hanging="260"/>
+              <w:jc w:val="left"/>
+            </w:pPr>
+            <w:r>
+              <w:rPr>
+                <w:rFonts w:ascii="Calibri" w:cs="Calibri" w:eastAsia="Calibri" w:hAnsi="Calibri"/>
+                <w:color w:val="1A1A1A"/>
+                <w:sz w:val="16"/>
+                <w:szCs w:val="16"/>
+              </w:rPr>
+              <w:t xml:space="preserve">6. Think About What You Think About ★ Where are you tampering when you should be guiding?</w:t>
+            </w:r>
+          </w:p>
+          <w:p>
+            <w:pPr>
+              <w:spacing w:after="30"/>
+              <w:ind w:left="260" w:hanging="260"/>
+              <w:jc w:val="left"/>
+            </w:pPr>
+            <w:r>
+              <w:rPr>
+                <w:rFonts w:ascii="Calibri" w:cs="Calibri" w:eastAsia="Calibri" w:hAnsi="Calibri"/>
+                <w:color w:val="1A1A1A"/>
+                <w:sz w:val="16"/>
+                <w:szCs w:val="16"/>
+              </w:rPr>
+              <w:t xml:space="preserve">7. Watch Out for Pitfalls ★ Where are you the bottleneck? What decision is sitting with you right now that your team is waiting on?</w:t>
+            </w:r>
+          </w:p>
+          <w:p>
+            <w:pPr>
+              <w:spacing w:after="30"/>
+              <w:ind w:left="260" w:hanging="260"/>
+              <w:jc w:val="left"/>
+            </w:pPr>
+            <w:r>
+              <w:rPr>
+                <w:rFonts w:ascii="Calibri" w:cs="Calibri" w:eastAsia="Calibri" w:hAnsi="Calibri"/>
+                <w:color w:val="1A1A1A"/>
+                <w:sz w:val="16"/>
+                <w:szCs w:val="16"/>
+              </w:rPr>
+              <w:t xml:space="preserve">8. Help Others Stretch ★ Is your next big idea on the Ledge of Conceivability or in the Pit of Inconceivability? Who on your team is allowed to tell you which?</w:t>
+            </w:r>
+          </w:p>
+          <w:p>
+            <w:pPr>
+              <w:spacing w:after="30"/>
+              <w:ind w:left="260" w:hanging="260"/>
+              <w:jc w:val="left"/>
+            </w:pPr>
+            <w:r>
+              <w:rPr>
+                <w:rFonts w:ascii="Calibri" w:cs="Calibri" w:eastAsia="Calibri" w:hAnsi="Calibri"/>
+                <w:color w:val="1A1A1A"/>
+                <w:sz w:val="16"/>
+                <w:szCs w:val="16"/>
+              </w:rPr>
+              <w:t xml:space="preserve">9. Go Slow to Go Fast ★ How many ideas have you put on your team’s on-ramp in the last 90 days? How many made it all the way through?</w:t>
+            </w:r>
+          </w:p>
+          <w:p>
+            <w:pPr>
+              <w:spacing w:after="30"/>
+              <w:ind w:left="260" w:hanging="260"/>
+              <w:jc w:val="left"/>
+            </w:pPr>
+            <w:r>
+              <w:rPr>
+                <w:rFonts w:ascii="Calibri" w:cs="Calibri" w:eastAsia="Calibri" w:hAnsi="Calibri"/>
+                <w:color w:val="1A1A1A"/>
+                <w:sz w:val="16"/>
+                <w:szCs w:val="16"/>
+              </w:rPr>
+              <w:t xml:space="preserve">10. Do No Harm ★ When did you last make a special exception for a favorite or a family member? What did it signal to everyone else?</w:t>
+            </w:r>
+          </w:p>
+          <w:p>
+            <w:pPr>
+              <w:spacing w:after="40" w:before="60"/>
+            </w:pPr>
+            <w:r>
+              <w:rPr>
+                <w:rFonts w:ascii="Calibri" w:cs="Calibri" w:eastAsia="Calibri" w:hAnsi="Calibri"/>
+                <w:b/>
+                <w:bCs/>
+                <w:color w:val="E87722"/>
+                <w:sz w:val="16"/>
+                <w:szCs w:val="16"/>
+              </w:rPr>
+              <w:t xml:space="preserve">ACTION:</w:t>
+            </w:r>
+          </w:p>
+          <w:p>
+            <w:pPr>
+              <w:spacing w:after="0"/>
+            </w:pPr>
+            <w:r>
+              <w:rPr>
+                <w:rFonts w:ascii="Calibri" w:cs="Calibri" w:eastAsia="Calibri" w:hAnsi="Calibri"/>
+                <w:color w:val="1A1A1A"/>
+                <w:sz w:val="16"/>
+                <w:szCs w:val="16"/>
+              </w:rPr>
+              <w:t xml:space="preserve">My To Do from this session is: </w:t>
+            </w:r>
+            <w:r>
+              <w:rPr>
+                <w:rFonts w:ascii="Calibri" w:cs="Calibri" w:eastAsia="Calibri" w:hAnsi="Calibri"/>
+                <w:color w:val="5A6B82"/>
+                <w:sz w:val="16"/>
+                <w:szCs w:val="16"/>
+              </w:rPr>
+              <w:t xml:space="preserve">_____________________________________________</w:t>
+            </w:r>
+            <w:r>
+              <w:rPr>
+                <w:rFonts w:ascii="Calibri" w:cs="Calibri" w:eastAsia="Calibri" w:hAnsi="Calibri"/>
+                <w:color w:val="1A1A1A"/>
+                <w:sz w:val="16"/>
+                <w:szCs w:val="16"/>
+              </w:rPr>
+              <w:t xml:space="preserve">  Due Date: </w:t>
+            </w:r>
+            <w:r>
+              <w:rPr>
+                <w:rFonts w:ascii="Calibri" w:cs="Calibri" w:eastAsia="Calibri" w:hAnsi="Calibri"/>
+                <w:color w:val="5A6B82"/>
+                <w:sz w:val="16"/>
+                <w:szCs w:val="16"/>
+              </w:rPr>
+              <w:t xml:space="preserve">______________</w:t>
             </w:r>
           </w:p>
         </w:tc>

</xml_diff>

<commit_message>
workbook page 13 (Winters): bump notes lines 4 -> 14 to fill page
Reflection thought box was floating with a lot of white space above it.
Adding 10 more note lines pushes it flush to the bottom of the page.
</commit_message>
<xml_diff>
--- a/deliverables/workbook/Workbook.docx
+++ b/deliverables/workbook/Workbook.docx
@@ -12524,6 +12524,356 @@
       <w:tblGrid>
         <w:gridCol w:w="10080"/>
       </w:tblGrid>
+      <w:tr>
+        <w:trPr>
+          <w:trHeight w:val="470" w:hRule="exact"/>
+        </w:trPr>
+        <w:tc>
+          <w:tcPr>
+            <w:tcW w:type="dxa" w:w="10080"/>
+            <w:tcBorders>
+              <w:top w:val="none" w:color="FFFFFF" w:sz="0"/>
+              <w:left w:val="none" w:color="FFFFFF" w:sz="0"/>
+              <w:bottom w:val="single" w:color="C9D2DE" w:sz="4"/>
+              <w:right w:val="none" w:color="FFFFFF" w:sz="0"/>
+            </w:tcBorders>
+            <w:tcMar>
+              <w:top w:type="dxa" w:w="0"/>
+              <w:left w:type="dxa" w:w="0"/>
+              <w:bottom w:type="dxa" w:w="0"/>
+              <w:right w:type="dxa" w:w="0"/>
+            </w:tcMar>
+          </w:tcPr>
+          <w:p>
+            <w:pPr>
+              <w:spacing w:after="0" w:before="0"/>
+            </w:pPr>
+            <w:r>
+              <w:rPr>
+                <w:rFonts w:ascii="Calibri" w:cs="Calibri" w:eastAsia="Calibri" w:hAnsi="Calibri"/>
+                <w:sz w:val="22"/>
+                <w:szCs w:val="22"/>
+              </w:rPr>
+              <w:t xml:space="preserve"> </w:t>
+            </w:r>
+          </w:p>
+        </w:tc>
+      </w:tr>
+      <w:tr>
+        <w:trPr>
+          <w:trHeight w:val="470" w:hRule="exact"/>
+        </w:trPr>
+        <w:tc>
+          <w:tcPr>
+            <w:tcW w:type="dxa" w:w="10080"/>
+            <w:tcBorders>
+              <w:top w:val="none" w:color="FFFFFF" w:sz="0"/>
+              <w:left w:val="none" w:color="FFFFFF" w:sz="0"/>
+              <w:bottom w:val="single" w:color="C9D2DE" w:sz="4"/>
+              <w:right w:val="none" w:color="FFFFFF" w:sz="0"/>
+            </w:tcBorders>
+            <w:tcMar>
+              <w:top w:type="dxa" w:w="0"/>
+              <w:left w:type="dxa" w:w="0"/>
+              <w:bottom w:type="dxa" w:w="0"/>
+              <w:right w:type="dxa" w:w="0"/>
+            </w:tcMar>
+          </w:tcPr>
+          <w:p>
+            <w:pPr>
+              <w:spacing w:after="0" w:before="0"/>
+            </w:pPr>
+            <w:r>
+              <w:rPr>
+                <w:rFonts w:ascii="Calibri" w:cs="Calibri" w:eastAsia="Calibri" w:hAnsi="Calibri"/>
+                <w:sz w:val="22"/>
+                <w:szCs w:val="22"/>
+              </w:rPr>
+              <w:t xml:space="preserve"> </w:t>
+            </w:r>
+          </w:p>
+        </w:tc>
+      </w:tr>
+      <w:tr>
+        <w:trPr>
+          <w:trHeight w:val="470" w:hRule="exact"/>
+        </w:trPr>
+        <w:tc>
+          <w:tcPr>
+            <w:tcW w:type="dxa" w:w="10080"/>
+            <w:tcBorders>
+              <w:top w:val="none" w:color="FFFFFF" w:sz="0"/>
+              <w:left w:val="none" w:color="FFFFFF" w:sz="0"/>
+              <w:bottom w:val="single" w:color="C9D2DE" w:sz="4"/>
+              <w:right w:val="none" w:color="FFFFFF" w:sz="0"/>
+            </w:tcBorders>
+            <w:tcMar>
+              <w:top w:type="dxa" w:w="0"/>
+              <w:left w:type="dxa" w:w="0"/>
+              <w:bottom w:type="dxa" w:w="0"/>
+              <w:right w:type="dxa" w:w="0"/>
+            </w:tcMar>
+          </w:tcPr>
+          <w:p>
+            <w:pPr>
+              <w:spacing w:after="0" w:before="0"/>
+            </w:pPr>
+            <w:r>
+              <w:rPr>
+                <w:rFonts w:ascii="Calibri" w:cs="Calibri" w:eastAsia="Calibri" w:hAnsi="Calibri"/>
+                <w:sz w:val="22"/>
+                <w:szCs w:val="22"/>
+              </w:rPr>
+              <w:t xml:space="preserve"> </w:t>
+            </w:r>
+          </w:p>
+        </w:tc>
+      </w:tr>
+      <w:tr>
+        <w:trPr>
+          <w:trHeight w:val="470" w:hRule="exact"/>
+        </w:trPr>
+        <w:tc>
+          <w:tcPr>
+            <w:tcW w:type="dxa" w:w="10080"/>
+            <w:tcBorders>
+              <w:top w:val="none" w:color="FFFFFF" w:sz="0"/>
+              <w:left w:val="none" w:color="FFFFFF" w:sz="0"/>
+              <w:bottom w:val="single" w:color="C9D2DE" w:sz="4"/>
+              <w:right w:val="none" w:color="FFFFFF" w:sz="0"/>
+            </w:tcBorders>
+            <w:tcMar>
+              <w:top w:type="dxa" w:w="0"/>
+              <w:left w:type="dxa" w:w="0"/>
+              <w:bottom w:type="dxa" w:w="0"/>
+              <w:right w:type="dxa" w:w="0"/>
+            </w:tcMar>
+          </w:tcPr>
+          <w:p>
+            <w:pPr>
+              <w:spacing w:after="0" w:before="0"/>
+            </w:pPr>
+            <w:r>
+              <w:rPr>
+                <w:rFonts w:ascii="Calibri" w:cs="Calibri" w:eastAsia="Calibri" w:hAnsi="Calibri"/>
+                <w:sz w:val="22"/>
+                <w:szCs w:val="22"/>
+              </w:rPr>
+              <w:t xml:space="preserve"> </w:t>
+            </w:r>
+          </w:p>
+        </w:tc>
+      </w:tr>
+      <w:tr>
+        <w:trPr>
+          <w:trHeight w:val="470" w:hRule="exact"/>
+        </w:trPr>
+        <w:tc>
+          <w:tcPr>
+            <w:tcW w:type="dxa" w:w="10080"/>
+            <w:tcBorders>
+              <w:top w:val="none" w:color="FFFFFF" w:sz="0"/>
+              <w:left w:val="none" w:color="FFFFFF" w:sz="0"/>
+              <w:bottom w:val="single" w:color="C9D2DE" w:sz="4"/>
+              <w:right w:val="none" w:color="FFFFFF" w:sz="0"/>
+            </w:tcBorders>
+            <w:tcMar>
+              <w:top w:type="dxa" w:w="0"/>
+              <w:left w:type="dxa" w:w="0"/>
+              <w:bottom w:type="dxa" w:w="0"/>
+              <w:right w:type="dxa" w:w="0"/>
+            </w:tcMar>
+          </w:tcPr>
+          <w:p>
+            <w:pPr>
+              <w:spacing w:after="0" w:before="0"/>
+            </w:pPr>
+            <w:r>
+              <w:rPr>
+                <w:rFonts w:ascii="Calibri" w:cs="Calibri" w:eastAsia="Calibri" w:hAnsi="Calibri"/>
+                <w:sz w:val="22"/>
+                <w:szCs w:val="22"/>
+              </w:rPr>
+              <w:t xml:space="preserve"> </w:t>
+            </w:r>
+          </w:p>
+        </w:tc>
+      </w:tr>
+      <w:tr>
+        <w:trPr>
+          <w:trHeight w:val="470" w:hRule="exact"/>
+        </w:trPr>
+        <w:tc>
+          <w:tcPr>
+            <w:tcW w:type="dxa" w:w="10080"/>
+            <w:tcBorders>
+              <w:top w:val="none" w:color="FFFFFF" w:sz="0"/>
+              <w:left w:val="none" w:color="FFFFFF" w:sz="0"/>
+              <w:bottom w:val="single" w:color="C9D2DE" w:sz="4"/>
+              <w:right w:val="none" w:color="FFFFFF" w:sz="0"/>
+            </w:tcBorders>
+            <w:tcMar>
+              <w:top w:type="dxa" w:w="0"/>
+              <w:left w:type="dxa" w:w="0"/>
+              <w:bottom w:type="dxa" w:w="0"/>
+              <w:right w:type="dxa" w:w="0"/>
+            </w:tcMar>
+          </w:tcPr>
+          <w:p>
+            <w:pPr>
+              <w:spacing w:after="0" w:before="0"/>
+            </w:pPr>
+            <w:r>
+              <w:rPr>
+                <w:rFonts w:ascii="Calibri" w:cs="Calibri" w:eastAsia="Calibri" w:hAnsi="Calibri"/>
+                <w:sz w:val="22"/>
+                <w:szCs w:val="22"/>
+              </w:rPr>
+              <w:t xml:space="preserve"> </w:t>
+            </w:r>
+          </w:p>
+        </w:tc>
+      </w:tr>
+      <w:tr>
+        <w:trPr>
+          <w:trHeight w:val="470" w:hRule="exact"/>
+        </w:trPr>
+        <w:tc>
+          <w:tcPr>
+            <w:tcW w:type="dxa" w:w="10080"/>
+            <w:tcBorders>
+              <w:top w:val="none" w:color="FFFFFF" w:sz="0"/>
+              <w:left w:val="none" w:color="FFFFFF" w:sz="0"/>
+              <w:bottom w:val="single" w:color="C9D2DE" w:sz="4"/>
+              <w:right w:val="none" w:color="FFFFFF" w:sz="0"/>
+            </w:tcBorders>
+            <w:tcMar>
+              <w:top w:type="dxa" w:w="0"/>
+              <w:left w:type="dxa" w:w="0"/>
+              <w:bottom w:type="dxa" w:w="0"/>
+              <w:right w:type="dxa" w:w="0"/>
+            </w:tcMar>
+          </w:tcPr>
+          <w:p>
+            <w:pPr>
+              <w:spacing w:after="0" w:before="0"/>
+            </w:pPr>
+            <w:r>
+              <w:rPr>
+                <w:rFonts w:ascii="Calibri" w:cs="Calibri" w:eastAsia="Calibri" w:hAnsi="Calibri"/>
+                <w:sz w:val="22"/>
+                <w:szCs w:val="22"/>
+              </w:rPr>
+              <w:t xml:space="preserve"> </w:t>
+            </w:r>
+          </w:p>
+        </w:tc>
+      </w:tr>
+      <w:tr>
+        <w:trPr>
+          <w:trHeight w:val="470" w:hRule="exact"/>
+        </w:trPr>
+        <w:tc>
+          <w:tcPr>
+            <w:tcW w:type="dxa" w:w="10080"/>
+            <w:tcBorders>
+              <w:top w:val="none" w:color="FFFFFF" w:sz="0"/>
+              <w:left w:val="none" w:color="FFFFFF" w:sz="0"/>
+              <w:bottom w:val="single" w:color="C9D2DE" w:sz="4"/>
+              <w:right w:val="none" w:color="FFFFFF" w:sz="0"/>
+            </w:tcBorders>
+            <w:tcMar>
+              <w:top w:type="dxa" w:w="0"/>
+              <w:left w:type="dxa" w:w="0"/>
+              <w:bottom w:type="dxa" w:w="0"/>
+              <w:right w:type="dxa" w:w="0"/>
+            </w:tcMar>
+          </w:tcPr>
+          <w:p>
+            <w:pPr>
+              <w:spacing w:after="0" w:before="0"/>
+            </w:pPr>
+            <w:r>
+              <w:rPr>
+                <w:rFonts w:ascii="Calibri" w:cs="Calibri" w:eastAsia="Calibri" w:hAnsi="Calibri"/>
+                <w:sz w:val="22"/>
+                <w:szCs w:val="22"/>
+              </w:rPr>
+              <w:t xml:space="preserve"> </w:t>
+            </w:r>
+          </w:p>
+        </w:tc>
+      </w:tr>
+      <w:tr>
+        <w:trPr>
+          <w:trHeight w:val="470" w:hRule="exact"/>
+        </w:trPr>
+        <w:tc>
+          <w:tcPr>
+            <w:tcW w:type="dxa" w:w="10080"/>
+            <w:tcBorders>
+              <w:top w:val="none" w:color="FFFFFF" w:sz="0"/>
+              <w:left w:val="none" w:color="FFFFFF" w:sz="0"/>
+              <w:bottom w:val="single" w:color="C9D2DE" w:sz="4"/>
+              <w:right w:val="none" w:color="FFFFFF" w:sz="0"/>
+            </w:tcBorders>
+            <w:tcMar>
+              <w:top w:type="dxa" w:w="0"/>
+              <w:left w:type="dxa" w:w="0"/>
+              <w:bottom w:type="dxa" w:w="0"/>
+              <w:right w:type="dxa" w:w="0"/>
+            </w:tcMar>
+          </w:tcPr>
+          <w:p>
+            <w:pPr>
+              <w:spacing w:after="0" w:before="0"/>
+            </w:pPr>
+            <w:r>
+              <w:rPr>
+                <w:rFonts w:ascii="Calibri" w:cs="Calibri" w:eastAsia="Calibri" w:hAnsi="Calibri"/>
+                <w:sz w:val="22"/>
+                <w:szCs w:val="22"/>
+              </w:rPr>
+              <w:t xml:space="preserve"> </w:t>
+            </w:r>
+          </w:p>
+        </w:tc>
+      </w:tr>
+      <w:tr>
+        <w:trPr>
+          <w:trHeight w:val="470" w:hRule="exact"/>
+        </w:trPr>
+        <w:tc>
+          <w:tcPr>
+            <w:tcW w:type="dxa" w:w="10080"/>
+            <w:tcBorders>
+              <w:top w:val="none" w:color="FFFFFF" w:sz="0"/>
+              <w:left w:val="none" w:color="FFFFFF" w:sz="0"/>
+              <w:bottom w:val="single" w:color="C9D2DE" w:sz="4"/>
+              <w:right w:val="none" w:color="FFFFFF" w:sz="0"/>
+            </w:tcBorders>
+            <w:tcMar>
+              <w:top w:type="dxa" w:w="0"/>
+              <w:left w:type="dxa" w:w="0"/>
+              <w:bottom w:type="dxa" w:w="0"/>
+              <w:right w:type="dxa" w:w="0"/>
+            </w:tcMar>
+          </w:tcPr>
+          <w:p>
+            <w:pPr>
+              <w:spacing w:after="0" w:before="0"/>
+            </w:pPr>
+            <w:r>
+              <w:rPr>
+                <w:rFonts w:ascii="Calibri" w:cs="Calibri" w:eastAsia="Calibri" w:hAnsi="Calibri"/>
+                <w:sz w:val="22"/>
+                <w:szCs w:val="22"/>
+              </w:rPr>
+              <w:t xml:space="preserve"> </w:t>
+            </w:r>
+          </w:p>
+        </w:tc>
+      </w:tr>
       <w:tr>
         <w:trPr>
           <w:trHeight w:val="470" w:hRule="exact"/>

</xml_diff>

<commit_message>
workbook pagination: count all physical pages (including handouts), not just workbook pages
- Paginator now computes displayed number as (physical_page - 2) so handouts
  advance the counter even though they aren't stamped. Cover (1) and blank
  spacer (2) still don't count, so Welcome = 1.
- Updated Agenda page references to match: Stanley 8->12, Fahey 10->16,
  Winters 12->36.
</commit_message>
<xml_diff>
--- a/deliverables/workbook/Workbook.docx
+++ b/deliverables/workbook/Workbook.docx
@@ -1997,7 +1997,7 @@
                 <w:sz w:val="22"/>
                 <w:szCs w:val="22"/>
               </w:rPr>
-              <w:t xml:space="preserve">8</w:t>
+              <w:t xml:space="preserve">12</w:t>
             </w:r>
           </w:p>
         </w:tc>
@@ -2309,7 +2309,7 @@
                 <w:sz w:val="22"/>
                 <w:szCs w:val="22"/>
               </w:rPr>
-              <w:t xml:space="preserve">10</w:t>
+              <w:t xml:space="preserve">16</w:t>
             </w:r>
           </w:p>
         </w:tc>
@@ -2621,7 +2621,7 @@
                 <w:sz w:val="22"/>
                 <w:szCs w:val="22"/>
               </w:rPr>
-              <w:t xml:space="preserve">12</w:t>
+              <w:t xml:space="preserve">36</w:t>
             </w:r>
           </w:p>
         </w:tc>

</xml_diff>

<commit_message>
workbook page 40 (Your Books): remove retail pricing per redline
Strike-through on all three 'Retail $X.XX' notations. Byline now reads
just 'by [Author]' for Data, Rollout, and Visionary.
</commit_message>
<xml_diff>
--- a/deliverables/workbook/Workbook.docx
+++ b/deliverables/workbook/Workbook.docx
@@ -13516,7 +13516,7 @@
                 <w:sz w:val="18"/>
                 <w:szCs w:val="18"/>
               </w:rPr>
-              <w:t xml:space="preserve">by Mark Stanley  ·  Retail $20.66</w:t>
+              <w:t xml:space="preserve">by Mark Stanley</w:t>
             </w:r>
           </w:p>
           <w:p>
@@ -13674,7 +13674,7 @@
                 <w:sz w:val="18"/>
                 <w:szCs w:val="18"/>
               </w:rPr>
-              <w:t xml:space="preserve">by Beth Fahey  ·  Retail $29.99</w:t>
+              <w:t xml:space="preserve">by Beth Fahey</w:t>
             </w:r>
           </w:p>
           <w:p>
@@ -13832,7 +13832,7 @@
                 <w:sz w:val="18"/>
                 <w:szCs w:val="18"/>
               </w:rPr>
-              <w:t xml:space="preserve">by Mark C. Winters  ·  Retail $29.99</w:t>
+              <w:t xml:space="preserve">by Mark C. Winters</w:t>
             </w:r>
           </w:p>
           <w:p>

</xml_diff>

<commit_message>
workbook page 41 (Sponsors): add Hosted-by section + tighten intro per redline
- New 'Hosted by' tier at top: North Texas EOS Implementers with QR to
  https://EOSNorthTexas.com (uses existing WRoEOS NTX 2026 wordmark)
- Intro copy: 'these North Texas businesses' -> 'these sponsors'
- Trim trailing spacer after last tier so pageBreakBefore on the next H1
  no longer produces a ghost blank page
- Bonus: Directory reflows back to prior 2-full-pages + 4-orphans
</commit_message>
<xml_diff>
--- a/deliverables/workbook/Workbook.docx
+++ b/deliverables/workbook/Workbook.docx
@@ -13906,12 +13906,245 @@
           <w:sz w:val="20"/>
           <w:szCs w:val="20"/>
         </w:rPr>
-        <w:t xml:space="preserve">This day is made possible by the generosity of these North Texas businesses. Scan any QR to visit the sponsor.</w:t>
+        <w:t xml:space="preserve">This day is made possible by the generosity of these sponsors. Scan any QR to visit the sponsor.</w:t>
       </w:r>
     </w:p>
     <w:p>
       <w:pPr>
         <w:spacing w:after="30"/>
+      </w:pPr>
+      <w:r>
+        <w:t xml:space="preserve"/>
+      </w:r>
+    </w:p>
+    <w:p>
+      <w:pPr>
+        <w:keepNext/>
+        <w:spacing w:after="30" w:before="40"/>
+      </w:pPr>
+      <w:r>
+        <w:rPr>
+          <w:rFonts w:ascii="Calibri" w:cs="Calibri" w:eastAsia="Calibri" w:hAnsi="Calibri"/>
+          <w:b/>
+          <w:bCs/>
+          <w:color w:val="E87722"/>
+          <w:sz w:val="20"/>
+          <w:szCs w:val="20"/>
+        </w:rPr>
+        <w:t xml:space="preserve">Hosted by</w:t>
+      </w:r>
+    </w:p>
+    <w:tbl>
+      <w:tblPr>
+        <w:tblW w:type="dxa" w:w="10080"/>
+        <w:tblBorders>
+          <w:top w:val="single" w:color="auto" w:sz="4"/>
+          <w:left w:val="single" w:color="auto" w:sz="4"/>
+          <w:bottom w:val="single" w:color="auto" w:sz="4"/>
+          <w:right w:val="single" w:color="auto" w:sz="4"/>
+          <w:insideH w:val="single" w:color="auto" w:sz="4"/>
+          <w:insideV w:val="single" w:color="auto" w:sz="4"/>
+        </w:tblBorders>
+      </w:tblPr>
+      <w:tblGrid>
+        <w:gridCol w:w="10080"/>
+      </w:tblGrid>
+      <w:tr>
+        <w:trPr>
+          <w:cantSplit/>
+        </w:trPr>
+        <w:tc>
+          <w:tcPr>
+            <w:tcW w:type="dxa" w:w="10080"/>
+            <w:tcBorders>
+              <w:top w:val="single" w:color="C9D2DE" w:sz="4"/>
+              <w:left w:val="single" w:color="C9D2DE" w:sz="4"/>
+              <w:bottom w:val="single" w:color="C9D2DE" w:sz="4"/>
+              <w:right w:val="single" w:color="C9D2DE" w:sz="4"/>
+            </w:tcBorders>
+            <w:shd w:fill="FFFFFF" w:val="clear"/>
+            <w:tcMar>
+              <w:top w:type="dxa" w:w="40"/>
+              <w:left w:type="dxa" w:w="140"/>
+              <w:bottom w:type="dxa" w:w="40"/>
+              <w:right w:type="dxa" w:w="140"/>
+            </w:tcMar>
+            <w:vAlign w:val="center"/>
+          </w:tcPr>
+          <w:tbl>
+            <w:tblPr>
+              <w:tblW w:type="dxa" w:w="9760"/>
+              <w:tblBorders>
+                <w:top w:val="single" w:color="auto" w:sz="4"/>
+                <w:left w:val="single" w:color="auto" w:sz="4"/>
+                <w:bottom w:val="single" w:color="auto" w:sz="4"/>
+                <w:right w:val="single" w:color="auto" w:sz="4"/>
+                <w:insideH w:val="single" w:color="auto" w:sz="4"/>
+                <w:insideV w:val="single" w:color="auto" w:sz="4"/>
+              </w:tblBorders>
+            </w:tblPr>
+            <w:tblGrid>
+              <w:gridCol w:w="9180"/>
+              <w:gridCol w:w="900"/>
+            </w:tblGrid>
+            <w:tr>
+              <w:trPr>
+                <w:cantSplit/>
+              </w:trPr>
+              <w:tc>
+                <w:tcPr>
+                  <w:tcW w:type="dxa" w:w="9180"/>
+                  <w:tcBorders>
+                    <w:top w:val="none" w:color="FFFFFF" w:sz="0"/>
+                    <w:left w:val="none" w:color="FFFFFF" w:sz="0"/>
+                    <w:bottom w:val="none" w:color="FFFFFF" w:sz="0"/>
+                    <w:right w:val="none" w:color="FFFFFF" w:sz="0"/>
+                  </w:tcBorders>
+                  <w:tcMar>
+                    <w:top w:type="dxa" w:w="0"/>
+                    <w:left w:type="dxa" w:w="0"/>
+                    <w:bottom w:type="dxa" w:w="0"/>
+                    <w:right w:type="dxa" w:w="120"/>
+                  </w:tcMar>
+                  <w:vAlign w:val="center"/>
+                </w:tcPr>
+                <w:p>
+                  <w:pPr>
+                    <w:spacing w:after="40"/>
+                    <w:jc w:val="left"/>
+                  </w:pPr>
+                  <w:r>
+                    <w:drawing>
+                      <wp:inline distT="0" distB="0" distL="0" distR="0">
+                        <wp:extent cx="1438275" cy="419100"/>
+                        <wp:effectExtent t="0" r="0" b="0" l="0"/>
+                        <wp:docPr id="1" name="img" descr="image" title="NorthTexas.png"/>
+                        <wp:cNvGraphicFramePr>
+                          <a:graphicFrameLocks xmlns:a="http://schemas.openxmlformats.org/drawingml/2006/main" noChangeAspect="1"/>
+                        </wp:cNvGraphicFramePr>
+                        <a:graphic xmlns:a="http://schemas.openxmlformats.org/drawingml/2006/main">
+                          <a:graphicData uri="http://schemas.openxmlformats.org/drawingml/2006/picture">
+                            <pic:pic xmlns:pic="http://schemas.openxmlformats.org/drawingml/2006/picture">
+                              <pic:nvPicPr>
+                                <pic:cNvPr id="0" name="" descr=""/>
+                                <pic:cNvPicPr>
+                                  <a:picLocks noChangeAspect="1" noChangeArrowheads="1"/>
+                                </pic:cNvPicPr>
+                              </pic:nvPicPr>
+                              <pic:blipFill>
+                                <a:blip r:embed="rId22" cstate="none"/>
+                                <a:srcRect/>
+                                <a:stretch>
+                                  <a:fillRect/>
+                                </a:stretch>
+                              </pic:blipFill>
+                              <pic:spPr bwMode="auto">
+                                <a:xfrm>
+                                  <a:off x="0" y="0"/>
+                                  <a:ext cx="1438275" cy="419100"/>
+                                </a:xfrm>
+                                <a:prstGeom prst="rect">
+                                  <a:avLst/>
+                                </a:prstGeom>
+                              </pic:spPr>
+                            </pic:pic>
+                          </a:graphicData>
+                        </a:graphic>
+                      </wp:inline>
+                    </w:drawing>
+                  </w:r>
+                </w:p>
+                <w:p>
+                  <w:pPr>
+                    <w:spacing w:after="0"/>
+                    <w:jc w:val="left"/>
+                  </w:pPr>
+                  <w:r>
+                    <w:rPr>
+                      <w:rFonts w:ascii="Calibri" w:cs="Calibri" w:eastAsia="Calibri" w:hAnsi="Calibri"/>
+                      <w:b/>
+                      <w:bCs/>
+                      <w:color w:val="0B1F3A"/>
+                      <w:sz w:val="22"/>
+                      <w:szCs w:val="22"/>
+                    </w:rPr>
+                    <w:t xml:space="preserve">North Texas EOS Implementers</w:t>
+                  </w:r>
+                </w:p>
+              </w:tc>
+              <w:tc>
+                <w:tcPr>
+                  <w:tcW w:type="dxa" w:w="900"/>
+                  <w:tcBorders>
+                    <w:top w:val="none" w:color="FFFFFF" w:sz="0"/>
+                    <w:left w:val="none" w:color="FFFFFF" w:sz="0"/>
+                    <w:bottom w:val="none" w:color="FFFFFF" w:sz="0"/>
+                    <w:right w:val="none" w:color="FFFFFF" w:sz="0"/>
+                  </w:tcBorders>
+                  <w:tcMar>
+                    <w:top w:type="dxa" w:w="0"/>
+                    <w:left w:type="dxa" w:w="120"/>
+                    <w:bottom w:type="dxa" w:w="0"/>
+                    <w:right w:type="dxa" w:w="0"/>
+                  </w:tcMar>
+                  <w:vAlign w:val="center"/>
+                </w:tcPr>
+                <w:p>
+                  <w:pPr>
+                    <w:spacing w:after="0"/>
+                    <w:jc w:val="right"/>
+                  </w:pPr>
+                  <w:r>
+                    <w:drawing>
+                      <wp:inline distT="0" distB="0" distL="0" distR="0">
+                        <wp:extent cx="419100" cy="419100"/>
+                        <wp:effectExtent t="0" r="0" b="0" l="0"/>
+                        <wp:docPr id="1" name="img" descr="image" title="host-eosnorthtexas.png"/>
+                        <wp:cNvGraphicFramePr>
+                          <a:graphicFrameLocks xmlns:a="http://schemas.openxmlformats.org/drawingml/2006/main" noChangeAspect="1"/>
+                        </wp:cNvGraphicFramePr>
+                        <a:graphic xmlns:a="http://schemas.openxmlformats.org/drawingml/2006/main">
+                          <a:graphicData uri="http://schemas.openxmlformats.org/drawingml/2006/picture">
+                            <pic:pic xmlns:pic="http://schemas.openxmlformats.org/drawingml/2006/picture">
+                              <pic:nvPicPr>
+                                <pic:cNvPr id="0" name="" descr=""/>
+                                <pic:cNvPicPr>
+                                  <a:picLocks noChangeAspect="1" noChangeArrowheads="1"/>
+                                </pic:cNvPicPr>
+                              </pic:nvPicPr>
+                              <pic:blipFill>
+                                <a:blip r:embed="rId23" cstate="none"/>
+                                <a:srcRect/>
+                                <a:stretch>
+                                  <a:fillRect/>
+                                </a:stretch>
+                              </pic:blipFill>
+                              <pic:spPr bwMode="auto">
+                                <a:xfrm>
+                                  <a:off x="0" y="0"/>
+                                  <a:ext cx="419100" cy="419100"/>
+                                </a:xfrm>
+                                <a:prstGeom prst="rect">
+                                  <a:avLst/>
+                                </a:prstGeom>
+                              </pic:spPr>
+                            </pic:pic>
+                          </a:graphicData>
+                        </a:graphic>
+                      </wp:inline>
+                    </w:drawing>
+                  </w:r>
+                </w:p>
+              </w:tc>
+            </w:tr>
+          </w:tbl>
+          <w:p/>
+        </w:tc>
+      </w:tr>
+    </w:tbl>
+    <w:p>
+      <w:pPr>
+        <w:spacing w:after="20"/>
       </w:pPr>
       <w:r>
         <w:t xml:space="preserve"/>
@@ -14033,7 +14266,7 @@
                                 </pic:cNvPicPr>
                               </pic:nvPicPr>
                               <pic:blipFill>
-                                <a:blip r:embed="rId22" cstate="none"/>
+                                <a:blip r:embed="rId24" cstate="none"/>
                                 <a:srcRect/>
                                 <a:stretch>
                                   <a:fillRect/>
@@ -14114,7 +14347,7 @@
                                 </pic:cNvPicPr>
                               </pic:nvPicPr>
                               <pic:blipFill>
-                                <a:blip r:embed="rId23" cstate="none"/>
+                                <a:blip r:embed="rId25" cstate="none"/>
                                 <a:srcRect/>
                                 <a:stretch>
                                   <a:fillRect/>
@@ -14220,7 +14453,7 @@
                                 </pic:cNvPicPr>
                               </pic:nvPicPr>
                               <pic:blipFill>
-                                <a:blip r:embed="rId24" cstate="none"/>
+                                <a:blip r:embed="rId26" cstate="none"/>
                                 <a:srcRect/>
                                 <a:stretch>
                                   <a:fillRect/>
@@ -14301,7 +14534,7 @@
                                 </pic:cNvPicPr>
                               </pic:nvPicPr>
                               <pic:blipFill>
-                                <a:blip r:embed="rId25" cstate="none"/>
+                                <a:blip r:embed="rId27" cstate="none"/>
                                 <a:srcRect/>
                                 <a:stretch>
                                   <a:fillRect/>
@@ -14454,7 +14687,7 @@
                                 </pic:cNvPicPr>
                               </pic:nvPicPr>
                               <pic:blipFill>
-                                <a:blip r:embed="rId26" cstate="none"/>
+                                <a:blip r:embed="rId28" cstate="none"/>
                                 <a:srcRect/>
                                 <a:stretch>
                                   <a:fillRect/>
@@ -14535,7 +14768,7 @@
                                 </pic:cNvPicPr>
                               </pic:nvPicPr>
                               <pic:blipFill>
-                                <a:blip r:embed="rId27" cstate="none"/>
+                                <a:blip r:embed="rId29" cstate="none"/>
                                 <a:srcRect/>
                                 <a:stretch>
                                   <a:fillRect/>
@@ -14641,7 +14874,7 @@
                                 </pic:cNvPicPr>
                               </pic:nvPicPr>
                               <pic:blipFill>
-                                <a:blip r:embed="rId28" cstate="none"/>
+                                <a:blip r:embed="rId30" cstate="none"/>
                                 <a:srcRect/>
                                 <a:stretch>
                                   <a:fillRect/>
@@ -14722,7 +14955,7 @@
                                 </pic:cNvPicPr>
                               </pic:nvPicPr>
                               <pic:blipFill>
-                                <a:blip r:embed="rId29" cstate="none"/>
+                                <a:blip r:embed="rId31" cstate="none"/>
                                 <a:srcRect/>
                                 <a:stretch>
                                   <a:fillRect/>
@@ -14875,7 +15108,7 @@
                                 </pic:cNvPicPr>
                               </pic:nvPicPr>
                               <pic:blipFill>
-                                <a:blip r:embed="rId30" cstate="none"/>
+                                <a:blip r:embed="rId32" cstate="none"/>
                                 <a:srcRect/>
                                 <a:stretch>
                                   <a:fillRect/>
@@ -14956,7 +15189,7 @@
                                 </pic:cNvPicPr>
                               </pic:nvPicPr>
                               <pic:blipFill>
-                                <a:blip r:embed="rId31" cstate="none"/>
+                                <a:blip r:embed="rId33" cstate="none"/>
                                 <a:srcRect/>
                                 <a:stretch>
                                   <a:fillRect/>
@@ -15062,7 +15295,7 @@
                                 </pic:cNvPicPr>
                               </pic:nvPicPr>
                               <pic:blipFill>
-                                <a:blip r:embed="rId32" cstate="none"/>
+                                <a:blip r:embed="rId34" cstate="none"/>
                                 <a:srcRect/>
                                 <a:stretch>
                                   <a:fillRect/>
@@ -15143,7 +15376,7 @@
                                 </pic:cNvPicPr>
                               </pic:nvPicPr>
                               <pic:blipFill>
-                                <a:blip r:embed="rId33" cstate="none"/>
+                                <a:blip r:embed="rId35" cstate="none"/>
                                 <a:srcRect/>
                                 <a:stretch>
                                   <a:fillRect/>
@@ -15296,7 +15529,7 @@
                                 </pic:cNvPicPr>
                               </pic:nvPicPr>
                               <pic:blipFill>
-                                <a:blip r:embed="rId34" cstate="none"/>
+                                <a:blip r:embed="rId36" cstate="none"/>
                                 <a:srcRect/>
                                 <a:stretch>
                                   <a:fillRect/>
@@ -15377,7 +15610,7 @@
                                 </pic:cNvPicPr>
                               </pic:nvPicPr>
                               <pic:blipFill>
-                                <a:blip r:embed="rId35" cstate="none"/>
+                                <a:blip r:embed="rId37" cstate="none"/>
                                 <a:srcRect/>
                                 <a:stretch>
                                   <a:fillRect/>
@@ -15483,7 +15716,7 @@
                                 </pic:cNvPicPr>
                               </pic:nvPicPr>
                               <pic:blipFill>
-                                <a:blip r:embed="rId36" cstate="none"/>
+                                <a:blip r:embed="rId38" cstate="none"/>
                                 <a:srcRect/>
                                 <a:stretch>
                                   <a:fillRect/>
@@ -15564,7 +15797,7 @@
                                 </pic:cNvPicPr>
                               </pic:nvPicPr>
                               <pic:blipFill>
-                                <a:blip r:embed="rId37" cstate="none"/>
+                                <a:blip r:embed="rId39" cstate="none"/>
                                 <a:srcRect/>
                                 <a:stretch>
                                   <a:fillRect/>
@@ -15719,7 +15952,7 @@
                                 </pic:cNvPicPr>
                               </pic:nvPicPr>
                               <pic:blipFill>
-                                <a:blip r:embed="rId38" cstate="none"/>
+                                <a:blip r:embed="rId40" cstate="none"/>
                                 <a:srcRect/>
                                 <a:stretch>
                                   <a:fillRect/>
@@ -15800,7 +16033,7 @@
                                 </pic:cNvPicPr>
                               </pic:nvPicPr>
                               <pic:blipFill>
-                                <a:blip r:embed="rId39" cstate="none"/>
+                                <a:blip r:embed="rId41" cstate="none"/>
                                 <a:srcRect/>
                                 <a:stretch>
                                   <a:fillRect/>
@@ -15906,7 +16139,7 @@
                                 </pic:cNvPicPr>
                               </pic:nvPicPr>
                               <pic:blipFill>
-                                <a:blip r:embed="rId40" cstate="none"/>
+                                <a:blip r:embed="rId42" cstate="none"/>
                                 <a:srcRect/>
                                 <a:stretch>
                                   <a:fillRect/>
@@ -15987,7 +16220,7 @@
                                 </pic:cNvPicPr>
                               </pic:nvPicPr>
                               <pic:blipFill>
-                                <a:blip r:embed="rId41" cstate="none"/>
+                                <a:blip r:embed="rId43" cstate="none"/>
                                 <a:srcRect/>
                                 <a:stretch>
                                   <a:fillRect/>
@@ -16093,7 +16326,7 @@
                                 </pic:cNvPicPr>
                               </pic:nvPicPr>
                               <pic:blipFill>
-                                <a:blip r:embed="rId42" cstate="none"/>
+                                <a:blip r:embed="rId44" cstate="none"/>
                                 <a:srcRect/>
                                 <a:stretch>
                                   <a:fillRect/>
@@ -16174,7 +16407,7 @@
                                 </pic:cNvPicPr>
                               </pic:nvPicPr>
                               <pic:blipFill>
-                                <a:blip r:embed="rId43" cstate="none"/>
+                                <a:blip r:embed="rId45" cstate="none"/>
                                 <a:srcRect/>
                                 <a:stretch>
                                   <a:fillRect/>
@@ -16280,7 +16513,7 @@
                                 </pic:cNvPicPr>
                               </pic:nvPicPr>
                               <pic:blipFill>
-                                <a:blip r:embed="rId44" cstate="none"/>
+                                <a:blip r:embed="rId46" cstate="none"/>
                                 <a:srcRect/>
                                 <a:stretch>
                                   <a:fillRect/>
@@ -16361,7 +16594,7 @@
                                 </pic:cNvPicPr>
                               </pic:nvPicPr>
                               <pic:blipFill>
-                                <a:blip r:embed="rId45" cstate="none"/>
+                                <a:blip r:embed="rId47" cstate="none"/>
                                 <a:srcRect/>
                                 <a:stretch>
                                   <a:fillRect/>
@@ -16472,7 +16705,7 @@
                                 </pic:cNvPicPr>
                               </pic:nvPicPr>
                               <pic:blipFill>
-                                <a:blip r:embed="rId46" cstate="none"/>
+                                <a:blip r:embed="rId48" cstate="none"/>
                                 <a:srcRect/>
                                 <a:stretch>
                                   <a:fillRect/>
@@ -16553,7 +16786,7 @@
                                 </pic:cNvPicPr>
                               </pic:nvPicPr>
                               <pic:blipFill>
-                                <a:blip r:embed="rId47" cstate="none"/>
+                                <a:blip r:embed="rId49" cstate="none"/>
                                 <a:srcRect/>
                                 <a:stretch>
                                   <a:fillRect/>
@@ -16659,7 +16892,7 @@
                                 </pic:cNvPicPr>
                               </pic:nvPicPr>
                               <pic:blipFill>
-                                <a:blip r:embed="rId48" cstate="none"/>
+                                <a:blip r:embed="rId50" cstate="none"/>
                                 <a:srcRect/>
                                 <a:stretch>
                                   <a:fillRect/>
@@ -16740,7 +16973,7 @@
                                 </pic:cNvPicPr>
                               </pic:nvPicPr>
                               <pic:blipFill>
-                                <a:blip r:embed="rId49" cstate="none"/>
+                                <a:blip r:embed="rId51" cstate="none"/>
                                 <a:srcRect/>
                                 <a:stretch>
                                   <a:fillRect/>
@@ -16846,7 +17079,7 @@
                                 </pic:cNvPicPr>
                               </pic:nvPicPr>
                               <pic:blipFill>
-                                <a:blip r:embed="rId50" cstate="none"/>
+                                <a:blip r:embed="rId52" cstate="none"/>
                                 <a:srcRect/>
                                 <a:stretch>
                                   <a:fillRect/>
@@ -16927,7 +17160,7 @@
                                 </pic:cNvPicPr>
                               </pic:nvPicPr>
                               <pic:blipFill>
-                                <a:blip r:embed="rId51" cstate="none"/>
+                                <a:blip r:embed="rId53" cstate="none"/>
                                 <a:srcRect/>
                                 <a:stretch>
                                   <a:fillRect/>
@@ -17033,7 +17266,7 @@
                                 </pic:cNvPicPr>
                               </pic:nvPicPr>
                               <pic:blipFill>
-                                <a:blip r:embed="rId52" cstate="none"/>
+                                <a:blip r:embed="rId54" cstate="none"/>
                                 <a:srcRect/>
                                 <a:stretch>
                                   <a:fillRect/>
@@ -17114,7 +17347,7 @@
                                 </pic:cNvPicPr>
                               </pic:nvPicPr>
                               <pic:blipFill>
-                                <a:blip r:embed="rId53" cstate="none"/>
+                                <a:blip r:embed="rId55" cstate="none"/>
                                 <a:srcRect/>
                                 <a:stretch>
                                   <a:fillRect/>
@@ -17143,14 +17376,6 @@
         </w:tc>
       </w:tr>
     </w:tbl>
-    <w:p>
-      <w:pPr>
-        <w:spacing w:after="20"/>
-      </w:pPr>
-      <w:r>
-        <w:t xml:space="preserve"/>
-      </w:r>
-    </w:p>
     <w:p>
       <w:pPr>
         <w:pStyle w:val="Heading1"/>
@@ -17308,7 +17533,7 @@
                                 </pic:cNvPicPr>
                               </pic:nvPicPr>
                               <pic:blipFill>
-                                <a:blip r:embed="rId54" cstate="none"/>
+                                <a:blip r:embed="rId56" cstate="none"/>
                                 <a:srcRect/>
                                 <a:stretch>
                                   <a:fillRect/>
@@ -17447,7 +17672,7 @@
                                 </pic:cNvPicPr>
                               </pic:nvPicPr>
                               <pic:blipFill>
-                                <a:blip r:embed="rId55" cstate="none"/>
+                                <a:blip r:embed="rId57" cstate="none"/>
                                 <a:srcRect/>
                                 <a:stretch>
                                   <a:fillRect/>
@@ -17554,7 +17779,7 @@
                                 </pic:cNvPicPr>
                               </pic:nvPicPr>
                               <pic:blipFill>
-                                <a:blip r:embed="rId56" cstate="none"/>
+                                <a:blip r:embed="rId58" cstate="none"/>
                                 <a:srcRect/>
                                 <a:stretch>
                                   <a:fillRect/>
@@ -17693,7 +17918,7 @@
                                 </pic:cNvPicPr>
                               </pic:nvPicPr>
                               <pic:blipFill>
-                                <a:blip r:embed="rId57" cstate="none"/>
+                                <a:blip r:embed="rId59" cstate="none"/>
                                 <a:srcRect/>
                                 <a:stretch>
                                   <a:fillRect/>
@@ -17830,7 +18055,7 @@
                                 </pic:cNvPicPr>
                               </pic:nvPicPr>
                               <pic:blipFill>
-                                <a:blip r:embed="rId58" cstate="none"/>
+                                <a:blip r:embed="rId60" cstate="none"/>
                                 <a:srcRect/>
                                 <a:stretch>
                                   <a:fillRect/>
@@ -17969,7 +18194,7 @@
                                 </pic:cNvPicPr>
                               </pic:nvPicPr>
                               <pic:blipFill>
-                                <a:blip r:embed="rId59" cstate="none"/>
+                                <a:blip r:embed="rId61" cstate="none"/>
                                 <a:srcRect/>
                                 <a:stretch>
                                   <a:fillRect/>
@@ -18076,7 +18301,7 @@
                                 </pic:cNvPicPr>
                               </pic:nvPicPr>
                               <pic:blipFill>
-                                <a:blip r:embed="rId60" cstate="none"/>
+                                <a:blip r:embed="rId62" cstate="none"/>
                                 <a:srcRect/>
                                 <a:stretch>
                                   <a:fillRect/>
@@ -18215,7 +18440,7 @@
                                 </pic:cNvPicPr>
                               </pic:nvPicPr>
                               <pic:blipFill>
-                                <a:blip r:embed="rId61" cstate="none"/>
+                                <a:blip r:embed="rId63" cstate="none"/>
                                 <a:srcRect/>
                                 <a:stretch>
                                   <a:fillRect/>
@@ -18352,7 +18577,7 @@
                                 </pic:cNvPicPr>
                               </pic:nvPicPr>
                               <pic:blipFill>
-                                <a:blip r:embed="rId62" cstate="none"/>
+                                <a:blip r:embed="rId64" cstate="none"/>
                                 <a:srcRect/>
                                 <a:stretch>
                                   <a:fillRect/>
@@ -18491,7 +18716,7 @@
                                 </pic:cNvPicPr>
                               </pic:nvPicPr>
                               <pic:blipFill>
-                                <a:blip r:embed="rId63" cstate="none"/>
+                                <a:blip r:embed="rId65" cstate="none"/>
                                 <a:srcRect/>
                                 <a:stretch>
                                   <a:fillRect/>
@@ -18598,7 +18823,7 @@
                                 </pic:cNvPicPr>
                               </pic:nvPicPr>
                               <pic:blipFill>
-                                <a:blip r:embed="rId64" cstate="none"/>
+                                <a:blip r:embed="rId66" cstate="none"/>
                                 <a:srcRect/>
                                 <a:stretch>
                                   <a:fillRect/>
@@ -18737,7 +18962,7 @@
                                 </pic:cNvPicPr>
                               </pic:nvPicPr>
                               <pic:blipFill>
-                                <a:blip r:embed="rId65" cstate="none"/>
+                                <a:blip r:embed="rId67" cstate="none"/>
                                 <a:srcRect/>
                                 <a:stretch>
                                   <a:fillRect/>
@@ -18874,7 +19099,7 @@
                                 </pic:cNvPicPr>
                               </pic:nvPicPr>
                               <pic:blipFill>
-                                <a:blip r:embed="rId66" cstate="none"/>
+                                <a:blip r:embed="rId68" cstate="none"/>
                                 <a:srcRect/>
                                 <a:stretch>
                                   <a:fillRect/>
@@ -19013,7 +19238,7 @@
                                 </pic:cNvPicPr>
                               </pic:nvPicPr>
                               <pic:blipFill>
-                                <a:blip r:embed="rId67" cstate="none"/>
+                                <a:blip r:embed="rId69" cstate="none"/>
                                 <a:srcRect/>
                                 <a:stretch>
                                   <a:fillRect/>
@@ -19120,7 +19345,7 @@
                                 </pic:cNvPicPr>
                               </pic:nvPicPr>
                               <pic:blipFill>
-                                <a:blip r:embed="rId68" cstate="none"/>
+                                <a:blip r:embed="rId70" cstate="none"/>
                                 <a:srcRect/>
                                 <a:stretch>
                                   <a:fillRect/>
@@ -19259,7 +19484,7 @@
                                 </pic:cNvPicPr>
                               </pic:nvPicPr>
                               <pic:blipFill>
-                                <a:blip r:embed="rId69" cstate="none"/>
+                                <a:blip r:embed="rId71" cstate="none"/>
                                 <a:srcRect/>
                                 <a:stretch>
                                   <a:fillRect/>
@@ -19396,7 +19621,7 @@
                                 </pic:cNvPicPr>
                               </pic:nvPicPr>
                               <pic:blipFill>
-                                <a:blip r:embed="rId70" cstate="none"/>
+                                <a:blip r:embed="rId72" cstate="none"/>
                                 <a:srcRect/>
                                 <a:stretch>
                                   <a:fillRect/>
@@ -19535,7 +19760,7 @@
                                 </pic:cNvPicPr>
                               </pic:nvPicPr>
                               <pic:blipFill>
-                                <a:blip r:embed="rId71" cstate="none"/>
+                                <a:blip r:embed="rId73" cstate="none"/>
                                 <a:srcRect/>
                                 <a:stretch>
                                   <a:fillRect/>
@@ -19642,7 +19867,7 @@
                                 </pic:cNvPicPr>
                               </pic:nvPicPr>
                               <pic:blipFill>
-                                <a:blip r:embed="rId72" cstate="none"/>
+                                <a:blip r:embed="rId74" cstate="none"/>
                                 <a:srcRect/>
                                 <a:stretch>
                                   <a:fillRect/>
@@ -19781,7 +20006,7 @@
                                 </pic:cNvPicPr>
                               </pic:nvPicPr>
                               <pic:blipFill>
-                                <a:blip r:embed="rId73" cstate="none"/>
+                                <a:blip r:embed="rId75" cstate="none"/>
                                 <a:srcRect/>
                                 <a:stretch>
                                   <a:fillRect/>
@@ -19918,7 +20143,7 @@
                                 </pic:cNvPicPr>
                               </pic:nvPicPr>
                               <pic:blipFill>
-                                <a:blip r:embed="rId74" cstate="none"/>
+                                <a:blip r:embed="rId76" cstate="none"/>
                                 <a:srcRect/>
                                 <a:stretch>
                                   <a:fillRect/>
@@ -20057,7 +20282,7 @@
                                 </pic:cNvPicPr>
                               </pic:nvPicPr>
                               <pic:blipFill>
-                                <a:blip r:embed="rId75" cstate="none"/>
+                                <a:blip r:embed="rId77" cstate="none"/>
                                 <a:srcRect/>
                                 <a:stretch>
                                   <a:fillRect/>
@@ -20164,7 +20389,7 @@
                                 </pic:cNvPicPr>
                               </pic:nvPicPr>
                               <pic:blipFill>
-                                <a:blip r:embed="rId76" cstate="none"/>
+                                <a:blip r:embed="rId78" cstate="none"/>
                                 <a:srcRect/>
                                 <a:stretch>
                                   <a:fillRect/>
@@ -20303,7 +20528,7 @@
                                 </pic:cNvPicPr>
                               </pic:nvPicPr>
                               <pic:blipFill>
-                                <a:blip r:embed="rId77" cstate="none"/>
+                                <a:blip r:embed="rId79" cstate="none"/>
                                 <a:srcRect/>
                                 <a:stretch>
                                   <a:fillRect/>
@@ -20440,7 +20665,7 @@
                                 </pic:cNvPicPr>
                               </pic:nvPicPr>
                               <pic:blipFill>
-                                <a:blip r:embed="rId78" cstate="none"/>
+                                <a:blip r:embed="rId80" cstate="none"/>
                                 <a:srcRect/>
                                 <a:stretch>
                                   <a:fillRect/>
@@ -20579,7 +20804,7 @@
                                 </pic:cNvPicPr>
                               </pic:nvPicPr>
                               <pic:blipFill>
-                                <a:blip r:embed="rId79" cstate="none"/>
+                                <a:blip r:embed="rId81" cstate="none"/>
                                 <a:srcRect/>
                                 <a:stretch>
                                   <a:fillRect/>
@@ -20686,7 +20911,7 @@
                                 </pic:cNvPicPr>
                               </pic:nvPicPr>
                               <pic:blipFill>
-                                <a:blip r:embed="rId80" cstate="none"/>
+                                <a:blip r:embed="rId82" cstate="none"/>
                                 <a:srcRect/>
                                 <a:stretch>
                                   <a:fillRect/>
@@ -20825,7 +21050,7 @@
                                 </pic:cNvPicPr>
                               </pic:nvPicPr>
                               <pic:blipFill>
-                                <a:blip r:embed="rId81" cstate="none"/>
+                                <a:blip r:embed="rId83" cstate="none"/>
                                 <a:srcRect/>
                                 <a:stretch>
                                   <a:fillRect/>
@@ -20962,7 +21187,7 @@
                                 </pic:cNvPicPr>
                               </pic:nvPicPr>
                               <pic:blipFill>
-                                <a:blip r:embed="rId82" cstate="none"/>
+                                <a:blip r:embed="rId84" cstate="none"/>
                                 <a:srcRect/>
                                 <a:stretch>
                                   <a:fillRect/>
@@ -21126,7 +21351,7 @@
                                 </pic:cNvPicPr>
                               </pic:nvPicPr>
                               <pic:blipFill>
-                                <a:blip r:embed="rId83" cstate="none"/>
+                                <a:blip r:embed="rId85" cstate="none"/>
                                 <a:srcRect/>
                                 <a:stretch>
                                   <a:fillRect/>
@@ -21233,7 +21458,7 @@
                                 </pic:cNvPicPr>
                               </pic:nvPicPr>
                               <pic:blipFill>
-                                <a:blip r:embed="rId84" cstate="none"/>
+                                <a:blip r:embed="rId86" cstate="none"/>
                                 <a:srcRect/>
                                 <a:stretch>
                                   <a:fillRect/>
@@ -21397,7 +21622,7 @@
                                 </pic:cNvPicPr>
                               </pic:nvPicPr>
                               <pic:blipFill>
-                                <a:blip r:embed="rId85" cstate="none"/>
+                                <a:blip r:embed="rId87" cstate="none"/>
                                 <a:srcRect/>
                                 <a:stretch>
                                   <a:fillRect/>
@@ -21534,7 +21759,7 @@
                                 </pic:cNvPicPr>
                               </pic:nvPicPr>
                               <pic:blipFill>
-                                <a:blip r:embed="rId86" cstate="none"/>
+                                <a:blip r:embed="rId88" cstate="none"/>
                                 <a:srcRect/>
                                 <a:stretch>
                                   <a:fillRect/>
@@ -21673,7 +21898,7 @@
                                 </pic:cNvPicPr>
                               </pic:nvPicPr>
                               <pic:blipFill>
-                                <a:blip r:embed="rId87" cstate="none"/>
+                                <a:blip r:embed="rId89" cstate="none"/>
                                 <a:srcRect/>
                                 <a:stretch>
                                   <a:fillRect/>
@@ -21780,7 +22005,7 @@
                                 </pic:cNvPicPr>
                               </pic:nvPicPr>
                               <pic:blipFill>
-                                <a:blip r:embed="rId88" cstate="none"/>
+                                <a:blip r:embed="rId90" cstate="none"/>
                                 <a:srcRect/>
                                 <a:stretch>
                                   <a:fillRect/>
@@ -21919,7 +22144,7 @@
                                 </pic:cNvPicPr>
                               </pic:nvPicPr>
                               <pic:blipFill>
-                                <a:blip r:embed="rId89" cstate="none"/>
+                                <a:blip r:embed="rId91" cstate="none"/>
                                 <a:srcRect/>
                                 <a:stretch>
                                   <a:fillRect/>
@@ -22056,7 +22281,7 @@
                                 </pic:cNvPicPr>
                               </pic:nvPicPr>
                               <pic:blipFill>
-                                <a:blip r:embed="rId90" cstate="none"/>
+                                <a:blip r:embed="rId92" cstate="none"/>
                                 <a:srcRect/>
                                 <a:stretch>
                                   <a:fillRect/>
@@ -22195,7 +22420,7 @@
                                 </pic:cNvPicPr>
                               </pic:nvPicPr>
                               <pic:blipFill>
-                                <a:blip r:embed="rId91" cstate="none"/>
+                                <a:blip r:embed="rId93" cstate="none"/>
                                 <a:srcRect/>
                                 <a:stretch>
                                   <a:fillRect/>
@@ -22302,7 +22527,7 @@
                                 </pic:cNvPicPr>
                               </pic:nvPicPr>
                               <pic:blipFill>
-                                <a:blip r:embed="rId92" cstate="none"/>
+                                <a:blip r:embed="rId94" cstate="none"/>
                                 <a:srcRect/>
                                 <a:stretch>
                                   <a:fillRect/>
@@ -22441,7 +22666,7 @@
                                 </pic:cNvPicPr>
                               </pic:nvPicPr>
                               <pic:blipFill>
-                                <a:blip r:embed="rId93" cstate="none"/>
+                                <a:blip r:embed="rId95" cstate="none"/>
                                 <a:srcRect/>
                                 <a:stretch>
                                   <a:fillRect/>
@@ -22578,7 +22803,7 @@
                                 </pic:cNvPicPr>
                               </pic:nvPicPr>
                               <pic:blipFill>
-                                <a:blip r:embed="rId94" cstate="none"/>
+                                <a:blip r:embed="rId96" cstate="none"/>
                                 <a:srcRect/>
                                 <a:stretch>
                                   <a:fillRect/>
@@ -22717,7 +22942,7 @@
                                 </pic:cNvPicPr>
                               </pic:nvPicPr>
                               <pic:blipFill>
-                                <a:blip r:embed="rId95" cstate="none"/>
+                                <a:blip r:embed="rId97" cstate="none"/>
                                 <a:srcRect/>
                                 <a:stretch>
                                   <a:fillRect/>
@@ -22824,7 +23049,7 @@
                                 </pic:cNvPicPr>
                               </pic:nvPicPr>
                               <pic:blipFill>
-                                <a:blip r:embed="rId96" cstate="none"/>
+                                <a:blip r:embed="rId98" cstate="none"/>
                                 <a:srcRect/>
                                 <a:stretch>
                                   <a:fillRect/>
@@ -22963,7 +23188,7 @@
                                 </pic:cNvPicPr>
                               </pic:nvPicPr>
                               <pic:blipFill>
-                                <a:blip r:embed="rId97" cstate="none"/>
+                                <a:blip r:embed="rId99" cstate="none"/>
                                 <a:srcRect/>
                                 <a:stretch>
                                   <a:fillRect/>
@@ -23100,7 +23325,7 @@
                                 </pic:cNvPicPr>
                               </pic:nvPicPr>
                               <pic:blipFill>
-                                <a:blip r:embed="rId98" cstate="none"/>
+                                <a:blip r:embed="rId100" cstate="none"/>
                                 <a:srcRect/>
                                 <a:stretch>
                                   <a:fillRect/>
@@ -23239,7 +23464,7 @@
                                 </pic:cNvPicPr>
                               </pic:nvPicPr>
                               <pic:blipFill>
-                                <a:blip r:embed="rId99" cstate="none"/>
+                                <a:blip r:embed="rId101" cstate="none"/>
                                 <a:srcRect/>
                                 <a:stretch>
                                   <a:fillRect/>
@@ -23346,7 +23571,7 @@
                                 </pic:cNvPicPr>
                               </pic:nvPicPr>
                               <pic:blipFill>
-                                <a:blip r:embed="rId100" cstate="none"/>
+                                <a:blip r:embed="rId102" cstate="none"/>
                                 <a:srcRect/>
                                 <a:stretch>
                                   <a:fillRect/>
@@ -23510,7 +23735,7 @@
                                 </pic:cNvPicPr>
                               </pic:nvPicPr>
                               <pic:blipFill>
-                                <a:blip r:embed="rId101" cstate="none"/>
+                                <a:blip r:embed="rId103" cstate="none"/>
                                 <a:srcRect/>
                                 <a:stretch>
                                   <a:fillRect/>
@@ -23647,7 +23872,7 @@
                                 </pic:cNvPicPr>
                               </pic:nvPicPr>
                               <pic:blipFill>
-                                <a:blip r:embed="rId102" cstate="none"/>
+                                <a:blip r:embed="rId104" cstate="none"/>
                                 <a:srcRect/>
                                 <a:stretch>
                                   <a:fillRect/>
@@ -23811,7 +24036,7 @@
                                 </pic:cNvPicPr>
                               </pic:nvPicPr>
                               <pic:blipFill>
-                                <a:blip r:embed="rId103" cstate="none"/>
+                                <a:blip r:embed="rId105" cstate="none"/>
                                 <a:srcRect/>
                                 <a:stretch>
                                   <a:fillRect/>
@@ -23918,7 +24143,7 @@
                                 </pic:cNvPicPr>
                               </pic:nvPicPr>
                               <pic:blipFill>
-                                <a:blip r:embed="rId104" cstate="none"/>
+                                <a:blip r:embed="rId106" cstate="none"/>
                                 <a:srcRect/>
                                 <a:stretch>
                                   <a:fillRect/>
@@ -24057,7 +24282,7 @@
                                 </pic:cNvPicPr>
                               </pic:nvPicPr>
                               <pic:blipFill>
-                                <a:blip r:embed="rId105" cstate="none"/>
+                                <a:blip r:embed="rId107" cstate="none"/>
                                 <a:srcRect/>
                                 <a:stretch>
                                   <a:fillRect/>
@@ -24194,7 +24419,7 @@
                                 </pic:cNvPicPr>
                               </pic:nvPicPr>
                               <pic:blipFill>
-                                <a:blip r:embed="rId106" cstate="none"/>
+                                <a:blip r:embed="rId108" cstate="none"/>
                                 <a:srcRect/>
                                 <a:stretch>
                                   <a:fillRect/>
@@ -24333,7 +24558,7 @@
                                 </pic:cNvPicPr>
                               </pic:nvPicPr>
                               <pic:blipFill>
-                                <a:blip r:embed="rId107" cstate="none"/>
+                                <a:blip r:embed="rId109" cstate="none"/>
                                 <a:srcRect/>
                                 <a:stretch>
                                   <a:fillRect/>
@@ -24440,7 +24665,7 @@
                                 </pic:cNvPicPr>
                               </pic:nvPicPr>
                               <pic:blipFill>
-                                <a:blip r:embed="rId108" cstate="none"/>
+                                <a:blip r:embed="rId110" cstate="none"/>
                                 <a:srcRect/>
                                 <a:stretch>
                                   <a:fillRect/>
@@ -24579,7 +24804,7 @@
                                 </pic:cNvPicPr>
                               </pic:nvPicPr>
                               <pic:blipFill>
-                                <a:blip r:embed="rId109" cstate="none"/>
+                                <a:blip r:embed="rId111" cstate="none"/>
                                 <a:srcRect/>
                                 <a:stretch>
                                   <a:fillRect/>
@@ -24716,7 +24941,7 @@
                                 </pic:cNvPicPr>
                               </pic:nvPicPr>
                               <pic:blipFill>
-                                <a:blip r:embed="rId110" cstate="none"/>
+                                <a:blip r:embed="rId112" cstate="none"/>
                                 <a:srcRect/>
                                 <a:stretch>
                                   <a:fillRect/>
@@ -24855,7 +25080,7 @@
                                 </pic:cNvPicPr>
                               </pic:nvPicPr>
                               <pic:blipFill>
-                                <a:blip r:embed="rId111" cstate="none"/>
+                                <a:blip r:embed="rId113" cstate="none"/>
                                 <a:srcRect/>
                                 <a:stretch>
                                   <a:fillRect/>
@@ -24962,7 +25187,7 @@
                                 </pic:cNvPicPr>
                               </pic:nvPicPr>
                               <pic:blipFill>
-                                <a:blip r:embed="rId112" cstate="none"/>
+                                <a:blip r:embed="rId114" cstate="none"/>
                                 <a:srcRect/>
                                 <a:stretch>
                                   <a:fillRect/>
@@ -25101,7 +25326,7 @@
                                 </pic:cNvPicPr>
                               </pic:nvPicPr>
                               <pic:blipFill>
-                                <a:blip r:embed="rId113" cstate="none"/>
+                                <a:blip r:embed="rId115" cstate="none"/>
                                 <a:srcRect/>
                                 <a:stretch>
                                   <a:fillRect/>
@@ -25238,7 +25463,7 @@
                                 </pic:cNvPicPr>
                               </pic:nvPicPr>
                               <pic:blipFill>
-                                <a:blip r:embed="rId114" cstate="none"/>
+                                <a:blip r:embed="rId116" cstate="none"/>
                                 <a:srcRect/>
                                 <a:stretch>
                                   <a:fillRect/>
@@ -25377,7 +25602,7 @@
                                 </pic:cNvPicPr>
                               </pic:nvPicPr>
                               <pic:blipFill>
-                                <a:blip r:embed="rId115" cstate="none"/>
+                                <a:blip r:embed="rId117" cstate="none"/>
                                 <a:srcRect/>
                                 <a:stretch>
                                   <a:fillRect/>
@@ -25484,7 +25709,7 @@
                                 </pic:cNvPicPr>
                               </pic:nvPicPr>
                               <pic:blipFill>
-                                <a:blip r:embed="rId116" cstate="none"/>
+                                <a:blip r:embed="rId118" cstate="none"/>
                                 <a:srcRect/>
                                 <a:stretch>
                                   <a:fillRect/>
@@ -25623,7 +25848,7 @@
                                 </pic:cNvPicPr>
                               </pic:nvPicPr>
                               <pic:blipFill>
-                                <a:blip r:embed="rId117" cstate="none"/>
+                                <a:blip r:embed="rId119" cstate="none"/>
                                 <a:srcRect/>
                                 <a:stretch>
                                   <a:fillRect/>
@@ -25760,7 +25985,7 @@
                                 </pic:cNvPicPr>
                               </pic:nvPicPr>
                               <pic:blipFill>
-                                <a:blip r:embed="rId118" cstate="none"/>
+                                <a:blip r:embed="rId120" cstate="none"/>
                                 <a:srcRect/>
                                 <a:stretch>
                                   <a:fillRect/>
@@ -25899,7 +26124,7 @@
                                 </pic:cNvPicPr>
                               </pic:nvPicPr>
                               <pic:blipFill>
-                                <a:blip r:embed="rId119" cstate="none"/>
+                                <a:blip r:embed="rId121" cstate="none"/>
                                 <a:srcRect/>
                                 <a:stretch>
                                   <a:fillRect/>
@@ -26006,7 +26231,7 @@
                                 </pic:cNvPicPr>
                               </pic:nvPicPr>
                               <pic:blipFill>
-                                <a:blip r:embed="rId120" cstate="none"/>
+                                <a:blip r:embed="rId122" cstate="none"/>
                                 <a:srcRect/>
                                 <a:stretch>
                                   <a:fillRect/>
@@ -26145,7 +26370,7 @@
                                 </pic:cNvPicPr>
                               </pic:nvPicPr>
                               <pic:blipFill>
-                                <a:blip r:embed="rId121" cstate="none"/>
+                                <a:blip r:embed="rId123" cstate="none"/>
                                 <a:srcRect/>
                                 <a:stretch>
                                   <a:fillRect/>
@@ -26282,7 +26507,7 @@
                                 </pic:cNvPicPr>
                               </pic:nvPicPr>
                               <pic:blipFill>
-                                <a:blip r:embed="rId122" cstate="none"/>
+                                <a:blip r:embed="rId124" cstate="none"/>
                                 <a:srcRect/>
                                 <a:stretch>
                                   <a:fillRect/>
@@ -26421,7 +26646,7 @@
                                 </pic:cNvPicPr>
                               </pic:nvPicPr>
                               <pic:blipFill>
-                                <a:blip r:embed="rId123" cstate="none"/>
+                                <a:blip r:embed="rId125" cstate="none"/>
                                 <a:srcRect/>
                                 <a:stretch>
                                   <a:fillRect/>
@@ -26528,7 +26753,7 @@
                                 </pic:cNvPicPr>
                               </pic:nvPicPr>
                               <pic:blipFill>
-                                <a:blip r:embed="rId124" cstate="none"/>
+                                <a:blip r:embed="rId126" cstate="none"/>
                                 <a:srcRect/>
                                 <a:stretch>
                                   <a:fillRect/>
@@ -26692,7 +26917,7 @@
                                 </pic:cNvPicPr>
                               </pic:nvPicPr>
                               <pic:blipFill>
-                                <a:blip r:embed="rId125" cstate="none"/>
+                                <a:blip r:embed="rId127" cstate="none"/>
                                 <a:srcRect/>
                                 <a:stretch>
                                   <a:fillRect/>
@@ -26829,7 +27054,7 @@
                                 </pic:cNvPicPr>
                               </pic:nvPicPr>
                               <pic:blipFill>
-                                <a:blip r:embed="rId126" cstate="none"/>
+                                <a:blip r:embed="rId128" cstate="none"/>
                                 <a:srcRect/>
                                 <a:stretch>
                                   <a:fillRect/>
@@ -26968,7 +27193,7 @@
                                 </pic:cNvPicPr>
                               </pic:nvPicPr>
                               <pic:blipFill>
-                                <a:blip r:embed="rId127" cstate="none"/>
+                                <a:blip r:embed="rId129" cstate="none"/>
                                 <a:srcRect/>
                                 <a:stretch>
                                   <a:fillRect/>
@@ -27075,7 +27300,7 @@
                                 </pic:cNvPicPr>
                               </pic:nvPicPr>
                               <pic:blipFill>
-                                <a:blip r:embed="rId128" cstate="none"/>
+                                <a:blip r:embed="rId130" cstate="none"/>
                                 <a:srcRect/>
                                 <a:stretch>
                                   <a:fillRect/>
@@ -27214,7 +27439,7 @@
                                 </pic:cNvPicPr>
                               </pic:nvPicPr>
                               <pic:blipFill>
-                                <a:blip r:embed="rId129" cstate="none"/>
+                                <a:blip r:embed="rId131" cstate="none"/>
                                 <a:srcRect/>
                                 <a:stretch>
                                   <a:fillRect/>
@@ -27351,7 +27576,7 @@
                                 </pic:cNvPicPr>
                               </pic:nvPicPr>
                               <pic:blipFill>
-                                <a:blip r:embed="rId130" cstate="none"/>
+                                <a:blip r:embed="rId132" cstate="none"/>
                                 <a:srcRect/>
                                 <a:stretch>
                                   <a:fillRect/>
@@ -27490,7 +27715,7 @@
                                 </pic:cNvPicPr>
                               </pic:nvPicPr>
                               <pic:blipFill>
-                                <a:blip r:embed="rId131" cstate="none"/>
+                                <a:blip r:embed="rId133" cstate="none"/>
                                 <a:srcRect/>
                                 <a:stretch>
                                   <a:fillRect/>
@@ -27597,7 +27822,7 @@
                                 </pic:cNvPicPr>
                               </pic:nvPicPr>
                               <pic:blipFill>
-                                <a:blip r:embed="rId132" cstate="none"/>
+                                <a:blip r:embed="rId134" cstate="none"/>
                                 <a:srcRect/>
                                 <a:stretch>
                                   <a:fillRect/>
@@ -27736,7 +27961,7 @@
                                 </pic:cNvPicPr>
                               </pic:nvPicPr>
                               <pic:blipFill>
-                                <a:blip r:embed="rId133" cstate="none"/>
+                                <a:blip r:embed="rId135" cstate="none"/>
                                 <a:srcRect/>
                                 <a:stretch>
                                   <a:fillRect/>

</xml_diff>

<commit_message>
workbook: reorder Title/Hosted, tighten Directory to 2 pages, y'all on back cover
- Sponsors page: swap tier order so Title Sponsors comes first, Hosted by
  second (per redline)
- Directory: shrink card margins (50->20) and inter-row spacer (20->6) so
  all 40 implementers fit on 2 pages (18 + 22) instead of 3
- Back cover: 'See you next year.' -> 'See y'all next year.' (matches the
  y'all in the show wordmark)
- Total: 46 pages
</commit_message>
<xml_diff>
--- a/deliverables/workbook/Workbook.docx
+++ b/deliverables/workbook/Workbook.docx
@@ -13931,6 +13931,427 @@
           <w:sz w:val="20"/>
           <w:szCs w:val="20"/>
         </w:rPr>
+        <w:t xml:space="preserve">Title Sponsors</w:t>
+      </w:r>
+    </w:p>
+    <w:tbl>
+      <w:tblPr>
+        <w:tblW w:type="dxa" w:w="10080"/>
+        <w:tblBorders>
+          <w:top w:val="single" w:color="auto" w:sz="4"/>
+          <w:left w:val="single" w:color="auto" w:sz="4"/>
+          <w:bottom w:val="single" w:color="auto" w:sz="4"/>
+          <w:right w:val="single" w:color="auto" w:sz="4"/>
+          <w:insideH w:val="single" w:color="auto" w:sz="4"/>
+          <w:insideV w:val="single" w:color="auto" w:sz="4"/>
+        </w:tblBorders>
+      </w:tblPr>
+      <w:tblGrid>
+        <w:gridCol w:w="5040"/>
+        <w:gridCol w:w="5040"/>
+      </w:tblGrid>
+      <w:tr>
+        <w:trPr>
+          <w:cantSplit/>
+        </w:trPr>
+        <w:tc>
+          <w:tcPr>
+            <w:tcW w:type="dxa" w:w="5040"/>
+            <w:tcBorders>
+              <w:top w:val="single" w:color="C9D2DE" w:sz="4"/>
+              <w:left w:val="single" w:color="C9D2DE" w:sz="4"/>
+              <w:bottom w:val="single" w:color="C9D2DE" w:sz="4"/>
+              <w:right w:val="single" w:color="C9D2DE" w:sz="4"/>
+            </w:tcBorders>
+            <w:shd w:fill="FFFFFF" w:val="clear"/>
+            <w:tcMar>
+              <w:top w:type="dxa" w:w="70"/>
+              <w:left w:type="dxa" w:w="140"/>
+              <w:bottom w:type="dxa" w:w="70"/>
+              <w:right w:type="dxa" w:w="140"/>
+            </w:tcMar>
+            <w:vAlign w:val="center"/>
+          </w:tcPr>
+          <w:tbl>
+            <w:tblPr>
+              <w:tblW w:type="dxa" w:w="4720"/>
+              <w:tblBorders>
+                <w:top w:val="single" w:color="auto" w:sz="4"/>
+                <w:left w:val="single" w:color="auto" w:sz="4"/>
+                <w:bottom w:val="single" w:color="auto" w:sz="4"/>
+                <w:right w:val="single" w:color="auto" w:sz="4"/>
+                <w:insideH w:val="single" w:color="auto" w:sz="4"/>
+                <w:insideV w:val="single" w:color="auto" w:sz="4"/>
+              </w:tblBorders>
+            </w:tblPr>
+            <w:tblGrid>
+              <w:gridCol w:w="3930"/>
+              <w:gridCol w:w="1110"/>
+            </w:tblGrid>
+            <w:tr>
+              <w:trPr>
+                <w:cantSplit/>
+              </w:trPr>
+              <w:tc>
+                <w:tcPr>
+                  <w:tcW w:type="dxa" w:w="3930"/>
+                  <w:tcBorders>
+                    <w:top w:val="none" w:color="FFFFFF" w:sz="0"/>
+                    <w:left w:val="none" w:color="FFFFFF" w:sz="0"/>
+                    <w:bottom w:val="none" w:color="FFFFFF" w:sz="0"/>
+                    <w:right w:val="none" w:color="FFFFFF" w:sz="0"/>
+                  </w:tcBorders>
+                  <w:tcMar>
+                    <w:top w:type="dxa" w:w="0"/>
+                    <w:left w:type="dxa" w:w="0"/>
+                    <w:bottom w:type="dxa" w:w="0"/>
+                    <w:right w:type="dxa" w:w="120"/>
+                  </w:tcMar>
+                  <w:vAlign w:val="center"/>
+                </w:tcPr>
+                <w:p>
+                  <w:pPr>
+                    <w:spacing w:after="40"/>
+                    <w:jc w:val="left"/>
+                  </w:pPr>
+                  <w:r>
+                    <w:drawing>
+                      <wp:inline distT="0" distB="0" distL="0" distR="0">
+                        <wp:extent cx="1790700" cy="647700"/>
+                        <wp:effectExtent t="0" r="0" b="0" l="0"/>
+                        <wp:docPr id="1" name="img" descr="image" title="strety.png"/>
+                        <wp:cNvGraphicFramePr>
+                          <a:graphicFrameLocks xmlns:a="http://schemas.openxmlformats.org/drawingml/2006/main" noChangeAspect="1"/>
+                        </wp:cNvGraphicFramePr>
+                        <a:graphic xmlns:a="http://schemas.openxmlformats.org/drawingml/2006/main">
+                          <a:graphicData uri="http://schemas.openxmlformats.org/drawingml/2006/picture">
+                            <pic:pic xmlns:pic="http://schemas.openxmlformats.org/drawingml/2006/picture">
+                              <pic:nvPicPr>
+                                <pic:cNvPr id="0" name="" descr=""/>
+                                <pic:cNvPicPr>
+                                  <a:picLocks noChangeAspect="1" noChangeArrowheads="1"/>
+                                </pic:cNvPicPr>
+                              </pic:nvPicPr>
+                              <pic:blipFill>
+                                <a:blip r:embed="rId22" cstate="none"/>
+                                <a:srcRect/>
+                                <a:stretch>
+                                  <a:fillRect/>
+                                </a:stretch>
+                              </pic:blipFill>
+                              <pic:spPr bwMode="auto">
+                                <a:xfrm>
+                                  <a:off x="0" y="0"/>
+                                  <a:ext cx="1790700" cy="647700"/>
+                                </a:xfrm>
+                                <a:prstGeom prst="rect">
+                                  <a:avLst/>
+                                </a:prstGeom>
+                              </pic:spPr>
+                            </pic:pic>
+                          </a:graphicData>
+                        </a:graphic>
+                      </wp:inline>
+                    </w:drawing>
+                  </w:r>
+                </w:p>
+                <w:p>
+                  <w:pPr>
+                    <w:spacing w:after="0"/>
+                    <w:jc w:val="left"/>
+                  </w:pPr>
+                  <w:r>
+                    <w:rPr>
+                      <w:rFonts w:ascii="Calibri" w:cs="Calibri" w:eastAsia="Calibri" w:hAnsi="Calibri"/>
+                      <w:b/>
+                      <w:bCs/>
+                      <w:color w:val="0B1F3A"/>
+                      <w:sz w:val="22"/>
+                      <w:szCs w:val="22"/>
+                    </w:rPr>
+                    <w:t xml:space="preserve">Strety</w:t>
+                  </w:r>
+                </w:p>
+              </w:tc>
+              <w:tc>
+                <w:tcPr>
+                  <w:tcW w:type="dxa" w:w="1110"/>
+                  <w:tcBorders>
+                    <w:top w:val="none" w:color="FFFFFF" w:sz="0"/>
+                    <w:left w:val="none" w:color="FFFFFF" w:sz="0"/>
+                    <w:bottom w:val="none" w:color="FFFFFF" w:sz="0"/>
+                    <w:right w:val="none" w:color="FFFFFF" w:sz="0"/>
+                  </w:tcBorders>
+                  <w:tcMar>
+                    <w:top w:type="dxa" w:w="0"/>
+                    <w:left w:type="dxa" w:w="120"/>
+                    <w:bottom w:type="dxa" w:w="0"/>
+                    <w:right w:type="dxa" w:w="0"/>
+                  </w:tcMar>
+                  <w:vAlign w:val="center"/>
+                </w:tcPr>
+                <w:p>
+                  <w:pPr>
+                    <w:spacing w:after="0"/>
+                    <w:jc w:val="right"/>
+                  </w:pPr>
+                  <w:r>
+                    <w:drawing>
+                      <wp:inline distT="0" distB="0" distL="0" distR="0">
+                        <wp:extent cx="552450" cy="552450"/>
+                        <wp:effectExtent t="0" r="0" b="0" l="0"/>
+                        <wp:docPr id="1" name="img" descr="image" title="sponsor-strety.png"/>
+                        <wp:cNvGraphicFramePr>
+                          <a:graphicFrameLocks xmlns:a="http://schemas.openxmlformats.org/drawingml/2006/main" noChangeAspect="1"/>
+                        </wp:cNvGraphicFramePr>
+                        <a:graphic xmlns:a="http://schemas.openxmlformats.org/drawingml/2006/main">
+                          <a:graphicData uri="http://schemas.openxmlformats.org/drawingml/2006/picture">
+                            <pic:pic xmlns:pic="http://schemas.openxmlformats.org/drawingml/2006/picture">
+                              <pic:nvPicPr>
+                                <pic:cNvPr id="0" name="" descr=""/>
+                                <pic:cNvPicPr>
+                                  <a:picLocks noChangeAspect="1" noChangeArrowheads="1"/>
+                                </pic:cNvPicPr>
+                              </pic:nvPicPr>
+                              <pic:blipFill>
+                                <a:blip r:embed="rId23" cstate="none"/>
+                                <a:srcRect/>
+                                <a:stretch>
+                                  <a:fillRect/>
+                                </a:stretch>
+                              </pic:blipFill>
+                              <pic:spPr bwMode="auto">
+                                <a:xfrm>
+                                  <a:off x="0" y="0"/>
+                                  <a:ext cx="552450" cy="552450"/>
+                                </a:xfrm>
+                                <a:prstGeom prst="rect">
+                                  <a:avLst/>
+                                </a:prstGeom>
+                              </pic:spPr>
+                            </pic:pic>
+                          </a:graphicData>
+                        </a:graphic>
+                      </wp:inline>
+                    </w:drawing>
+                  </w:r>
+                </w:p>
+              </w:tc>
+            </w:tr>
+          </w:tbl>
+          <w:p/>
+        </w:tc>
+        <w:tc>
+          <w:tcPr>
+            <w:tcW w:type="dxa" w:w="5040"/>
+            <w:tcBorders>
+              <w:top w:val="single" w:color="C9D2DE" w:sz="4"/>
+              <w:left w:val="single" w:color="C9D2DE" w:sz="4"/>
+              <w:bottom w:val="single" w:color="C9D2DE" w:sz="4"/>
+              <w:right w:val="single" w:color="C9D2DE" w:sz="4"/>
+            </w:tcBorders>
+            <w:shd w:fill="FFFFFF" w:val="clear"/>
+            <w:tcMar>
+              <w:top w:type="dxa" w:w="70"/>
+              <w:left w:type="dxa" w:w="140"/>
+              <w:bottom w:type="dxa" w:w="70"/>
+              <w:right w:type="dxa" w:w="140"/>
+            </w:tcMar>
+            <w:vAlign w:val="center"/>
+          </w:tcPr>
+          <w:tbl>
+            <w:tblPr>
+              <w:tblW w:type="dxa" w:w="4720"/>
+              <w:tblBorders>
+                <w:top w:val="single" w:color="auto" w:sz="4"/>
+                <w:left w:val="single" w:color="auto" w:sz="4"/>
+                <w:bottom w:val="single" w:color="auto" w:sz="4"/>
+                <w:right w:val="single" w:color="auto" w:sz="4"/>
+                <w:insideH w:val="single" w:color="auto" w:sz="4"/>
+                <w:insideV w:val="single" w:color="auto" w:sz="4"/>
+              </w:tblBorders>
+            </w:tblPr>
+            <w:tblGrid>
+              <w:gridCol w:w="3930"/>
+              <w:gridCol w:w="1110"/>
+            </w:tblGrid>
+            <w:tr>
+              <w:trPr>
+                <w:cantSplit/>
+              </w:trPr>
+              <w:tc>
+                <w:tcPr>
+                  <w:tcW w:type="dxa" w:w="3930"/>
+                  <w:tcBorders>
+                    <w:top w:val="none" w:color="FFFFFF" w:sz="0"/>
+                    <w:left w:val="none" w:color="FFFFFF" w:sz="0"/>
+                    <w:bottom w:val="none" w:color="FFFFFF" w:sz="0"/>
+                    <w:right w:val="none" w:color="FFFFFF" w:sz="0"/>
+                  </w:tcBorders>
+                  <w:tcMar>
+                    <w:top w:type="dxa" w:w="0"/>
+                    <w:left w:type="dxa" w:w="0"/>
+                    <w:bottom w:type="dxa" w:w="0"/>
+                    <w:right w:type="dxa" w:w="120"/>
+                  </w:tcMar>
+                  <w:vAlign w:val="center"/>
+                </w:tcPr>
+                <w:p>
+                  <w:pPr>
+                    <w:spacing w:after="40"/>
+                    <w:jc w:val="left"/>
+                  </w:pPr>
+                  <w:r>
+                    <w:drawing>
+                      <wp:inline distT="0" distB="0" distL="0" distR="0">
+                        <wp:extent cx="2028825" cy="647700"/>
+                        <wp:effectExtent t="0" r="0" b="0" l="0"/>
+                        <wp:docPr id="1" name="img" descr="image" title="tsos.png"/>
+                        <wp:cNvGraphicFramePr>
+                          <a:graphicFrameLocks xmlns:a="http://schemas.openxmlformats.org/drawingml/2006/main" noChangeAspect="1"/>
+                        </wp:cNvGraphicFramePr>
+                        <a:graphic xmlns:a="http://schemas.openxmlformats.org/drawingml/2006/main">
+                          <a:graphicData uri="http://schemas.openxmlformats.org/drawingml/2006/picture">
+                            <pic:pic xmlns:pic="http://schemas.openxmlformats.org/drawingml/2006/picture">
+                              <pic:nvPicPr>
+                                <pic:cNvPr id="0" name="" descr=""/>
+                                <pic:cNvPicPr>
+                                  <a:picLocks noChangeAspect="1" noChangeArrowheads="1"/>
+                                </pic:cNvPicPr>
+                              </pic:nvPicPr>
+                              <pic:blipFill>
+                                <a:blip r:embed="rId24" cstate="none"/>
+                                <a:srcRect/>
+                                <a:stretch>
+                                  <a:fillRect/>
+                                </a:stretch>
+                              </pic:blipFill>
+                              <pic:spPr bwMode="auto">
+                                <a:xfrm>
+                                  <a:off x="0" y="0"/>
+                                  <a:ext cx="2028825" cy="647700"/>
+                                </a:xfrm>
+                                <a:prstGeom prst="rect">
+                                  <a:avLst/>
+                                </a:prstGeom>
+                              </pic:spPr>
+                            </pic:pic>
+                          </a:graphicData>
+                        </a:graphic>
+                      </wp:inline>
+                    </w:drawing>
+                  </w:r>
+                </w:p>
+                <w:p>
+                  <w:pPr>
+                    <w:spacing w:after="0"/>
+                    <w:jc w:val="left"/>
+                  </w:pPr>
+                  <w:r>
+                    <w:rPr>
+                      <w:rFonts w:ascii="Calibri" w:cs="Calibri" w:eastAsia="Calibri" w:hAnsi="Calibri"/>
+                      <w:b/>
+                      <w:bCs/>
+                      <w:color w:val="0B1F3A"/>
+                      <w:sz w:val="22"/>
+                      <w:szCs w:val="22"/>
+                    </w:rPr>
+                    <w:t xml:space="preserve">The System of Selling</w:t>
+                  </w:r>
+                </w:p>
+              </w:tc>
+              <w:tc>
+                <w:tcPr>
+                  <w:tcW w:type="dxa" w:w="1110"/>
+                  <w:tcBorders>
+                    <w:top w:val="none" w:color="FFFFFF" w:sz="0"/>
+                    <w:left w:val="none" w:color="FFFFFF" w:sz="0"/>
+                    <w:bottom w:val="none" w:color="FFFFFF" w:sz="0"/>
+                    <w:right w:val="none" w:color="FFFFFF" w:sz="0"/>
+                  </w:tcBorders>
+                  <w:tcMar>
+                    <w:top w:type="dxa" w:w="0"/>
+                    <w:left w:type="dxa" w:w="120"/>
+                    <w:bottom w:type="dxa" w:w="0"/>
+                    <w:right w:type="dxa" w:w="0"/>
+                  </w:tcMar>
+                  <w:vAlign w:val="center"/>
+                </w:tcPr>
+                <w:p>
+                  <w:pPr>
+                    <w:spacing w:after="0"/>
+                    <w:jc w:val="right"/>
+                  </w:pPr>
+                  <w:r>
+                    <w:drawing>
+                      <wp:inline distT="0" distB="0" distL="0" distR="0">
+                        <wp:extent cx="552450" cy="552450"/>
+                        <wp:effectExtent t="0" r="0" b="0" l="0"/>
+                        <wp:docPr id="1" name="img" descr="image" title="sponsor-the-system-of-selling.png"/>
+                        <wp:cNvGraphicFramePr>
+                          <a:graphicFrameLocks xmlns:a="http://schemas.openxmlformats.org/drawingml/2006/main" noChangeAspect="1"/>
+                        </wp:cNvGraphicFramePr>
+                        <a:graphic xmlns:a="http://schemas.openxmlformats.org/drawingml/2006/main">
+                          <a:graphicData uri="http://schemas.openxmlformats.org/drawingml/2006/picture">
+                            <pic:pic xmlns:pic="http://schemas.openxmlformats.org/drawingml/2006/picture">
+                              <pic:nvPicPr>
+                                <pic:cNvPr id="0" name="" descr=""/>
+                                <pic:cNvPicPr>
+                                  <a:picLocks noChangeAspect="1" noChangeArrowheads="1"/>
+                                </pic:cNvPicPr>
+                              </pic:nvPicPr>
+                              <pic:blipFill>
+                                <a:blip r:embed="rId25" cstate="none"/>
+                                <a:srcRect/>
+                                <a:stretch>
+                                  <a:fillRect/>
+                                </a:stretch>
+                              </pic:blipFill>
+                              <pic:spPr bwMode="auto">
+                                <a:xfrm>
+                                  <a:off x="0" y="0"/>
+                                  <a:ext cx="552450" cy="552450"/>
+                                </a:xfrm>
+                                <a:prstGeom prst="rect">
+                                  <a:avLst/>
+                                </a:prstGeom>
+                              </pic:spPr>
+                            </pic:pic>
+                          </a:graphicData>
+                        </a:graphic>
+                      </wp:inline>
+                    </w:drawing>
+                  </w:r>
+                </w:p>
+              </w:tc>
+            </w:tr>
+          </w:tbl>
+          <w:p/>
+        </w:tc>
+      </w:tr>
+    </w:tbl>
+    <w:p>
+      <w:pPr>
+        <w:spacing w:after="20"/>
+      </w:pPr>
+      <w:r>
+        <w:t xml:space="preserve"/>
+      </w:r>
+    </w:p>
+    <w:p>
+      <w:pPr>
+        <w:keepNext/>
+        <w:spacing w:after="30" w:before="40"/>
+      </w:pPr>
+      <w:r>
+        <w:rPr>
+          <w:rFonts w:ascii="Calibri" w:cs="Calibri" w:eastAsia="Calibri" w:hAnsi="Calibri"/>
+          <w:b/>
+          <w:bCs/>
+          <w:color w:val="E87722"/>
+          <w:sz w:val="20"/>
+          <w:szCs w:val="20"/>
+        </w:rPr>
         <w:t xml:space="preserve">Hosted by</w:t>
       </w:r>
     </w:p>
@@ -14032,7 +14453,7 @@
                                 </pic:cNvPicPr>
                               </pic:nvPicPr>
                               <pic:blipFill>
-                                <a:blip r:embed="rId22" cstate="none"/>
+                                <a:blip r:embed="rId26" cstate="none"/>
                                 <a:srcRect/>
                                 <a:stretch>
                                   <a:fillRect/>
@@ -14113,7 +14534,7 @@
                                 </pic:cNvPicPr>
                               </pic:nvPicPr>
                               <pic:blipFill>
-                                <a:blip r:embed="rId23" cstate="none"/>
+                                <a:blip r:embed="rId27" cstate="none"/>
                                 <a:srcRect/>
                                 <a:stretch>
                                   <a:fillRect/>
@@ -14123,427 +14544,6 @@
                                 <a:xfrm>
                                   <a:off x="0" y="0"/>
                                   <a:ext cx="419100" cy="419100"/>
-                                </a:xfrm>
-                                <a:prstGeom prst="rect">
-                                  <a:avLst/>
-                                </a:prstGeom>
-                              </pic:spPr>
-                            </pic:pic>
-                          </a:graphicData>
-                        </a:graphic>
-                      </wp:inline>
-                    </w:drawing>
-                  </w:r>
-                </w:p>
-              </w:tc>
-            </w:tr>
-          </w:tbl>
-          <w:p/>
-        </w:tc>
-      </w:tr>
-    </w:tbl>
-    <w:p>
-      <w:pPr>
-        <w:spacing w:after="20"/>
-      </w:pPr>
-      <w:r>
-        <w:t xml:space="preserve"/>
-      </w:r>
-    </w:p>
-    <w:p>
-      <w:pPr>
-        <w:keepNext/>
-        <w:spacing w:after="30" w:before="40"/>
-      </w:pPr>
-      <w:r>
-        <w:rPr>
-          <w:rFonts w:ascii="Calibri" w:cs="Calibri" w:eastAsia="Calibri" w:hAnsi="Calibri"/>
-          <w:b/>
-          <w:bCs/>
-          <w:color w:val="E87722"/>
-          <w:sz w:val="20"/>
-          <w:szCs w:val="20"/>
-        </w:rPr>
-        <w:t xml:space="preserve">Title Sponsors</w:t>
-      </w:r>
-    </w:p>
-    <w:tbl>
-      <w:tblPr>
-        <w:tblW w:type="dxa" w:w="10080"/>
-        <w:tblBorders>
-          <w:top w:val="single" w:color="auto" w:sz="4"/>
-          <w:left w:val="single" w:color="auto" w:sz="4"/>
-          <w:bottom w:val="single" w:color="auto" w:sz="4"/>
-          <w:right w:val="single" w:color="auto" w:sz="4"/>
-          <w:insideH w:val="single" w:color="auto" w:sz="4"/>
-          <w:insideV w:val="single" w:color="auto" w:sz="4"/>
-        </w:tblBorders>
-      </w:tblPr>
-      <w:tblGrid>
-        <w:gridCol w:w="5040"/>
-        <w:gridCol w:w="5040"/>
-      </w:tblGrid>
-      <w:tr>
-        <w:trPr>
-          <w:cantSplit/>
-        </w:trPr>
-        <w:tc>
-          <w:tcPr>
-            <w:tcW w:type="dxa" w:w="5040"/>
-            <w:tcBorders>
-              <w:top w:val="single" w:color="C9D2DE" w:sz="4"/>
-              <w:left w:val="single" w:color="C9D2DE" w:sz="4"/>
-              <w:bottom w:val="single" w:color="C9D2DE" w:sz="4"/>
-              <w:right w:val="single" w:color="C9D2DE" w:sz="4"/>
-            </w:tcBorders>
-            <w:shd w:fill="FFFFFF" w:val="clear"/>
-            <w:tcMar>
-              <w:top w:type="dxa" w:w="70"/>
-              <w:left w:type="dxa" w:w="140"/>
-              <w:bottom w:type="dxa" w:w="70"/>
-              <w:right w:type="dxa" w:w="140"/>
-            </w:tcMar>
-            <w:vAlign w:val="center"/>
-          </w:tcPr>
-          <w:tbl>
-            <w:tblPr>
-              <w:tblW w:type="dxa" w:w="4720"/>
-              <w:tblBorders>
-                <w:top w:val="single" w:color="auto" w:sz="4"/>
-                <w:left w:val="single" w:color="auto" w:sz="4"/>
-                <w:bottom w:val="single" w:color="auto" w:sz="4"/>
-                <w:right w:val="single" w:color="auto" w:sz="4"/>
-                <w:insideH w:val="single" w:color="auto" w:sz="4"/>
-                <w:insideV w:val="single" w:color="auto" w:sz="4"/>
-              </w:tblBorders>
-            </w:tblPr>
-            <w:tblGrid>
-              <w:gridCol w:w="3930"/>
-              <w:gridCol w:w="1110"/>
-            </w:tblGrid>
-            <w:tr>
-              <w:trPr>
-                <w:cantSplit/>
-              </w:trPr>
-              <w:tc>
-                <w:tcPr>
-                  <w:tcW w:type="dxa" w:w="3930"/>
-                  <w:tcBorders>
-                    <w:top w:val="none" w:color="FFFFFF" w:sz="0"/>
-                    <w:left w:val="none" w:color="FFFFFF" w:sz="0"/>
-                    <w:bottom w:val="none" w:color="FFFFFF" w:sz="0"/>
-                    <w:right w:val="none" w:color="FFFFFF" w:sz="0"/>
-                  </w:tcBorders>
-                  <w:tcMar>
-                    <w:top w:type="dxa" w:w="0"/>
-                    <w:left w:type="dxa" w:w="0"/>
-                    <w:bottom w:type="dxa" w:w="0"/>
-                    <w:right w:type="dxa" w:w="120"/>
-                  </w:tcMar>
-                  <w:vAlign w:val="center"/>
-                </w:tcPr>
-                <w:p>
-                  <w:pPr>
-                    <w:spacing w:after="40"/>
-                    <w:jc w:val="left"/>
-                  </w:pPr>
-                  <w:r>
-                    <w:drawing>
-                      <wp:inline distT="0" distB="0" distL="0" distR="0">
-                        <wp:extent cx="1790700" cy="647700"/>
-                        <wp:effectExtent t="0" r="0" b="0" l="0"/>
-                        <wp:docPr id="1" name="img" descr="image" title="strety.png"/>
-                        <wp:cNvGraphicFramePr>
-                          <a:graphicFrameLocks xmlns:a="http://schemas.openxmlformats.org/drawingml/2006/main" noChangeAspect="1"/>
-                        </wp:cNvGraphicFramePr>
-                        <a:graphic xmlns:a="http://schemas.openxmlformats.org/drawingml/2006/main">
-                          <a:graphicData uri="http://schemas.openxmlformats.org/drawingml/2006/picture">
-                            <pic:pic xmlns:pic="http://schemas.openxmlformats.org/drawingml/2006/picture">
-                              <pic:nvPicPr>
-                                <pic:cNvPr id="0" name="" descr=""/>
-                                <pic:cNvPicPr>
-                                  <a:picLocks noChangeAspect="1" noChangeArrowheads="1"/>
-                                </pic:cNvPicPr>
-                              </pic:nvPicPr>
-                              <pic:blipFill>
-                                <a:blip r:embed="rId24" cstate="none"/>
-                                <a:srcRect/>
-                                <a:stretch>
-                                  <a:fillRect/>
-                                </a:stretch>
-                              </pic:blipFill>
-                              <pic:spPr bwMode="auto">
-                                <a:xfrm>
-                                  <a:off x="0" y="0"/>
-                                  <a:ext cx="1790700" cy="647700"/>
-                                </a:xfrm>
-                                <a:prstGeom prst="rect">
-                                  <a:avLst/>
-                                </a:prstGeom>
-                              </pic:spPr>
-                            </pic:pic>
-                          </a:graphicData>
-                        </a:graphic>
-                      </wp:inline>
-                    </w:drawing>
-                  </w:r>
-                </w:p>
-                <w:p>
-                  <w:pPr>
-                    <w:spacing w:after="0"/>
-                    <w:jc w:val="left"/>
-                  </w:pPr>
-                  <w:r>
-                    <w:rPr>
-                      <w:rFonts w:ascii="Calibri" w:cs="Calibri" w:eastAsia="Calibri" w:hAnsi="Calibri"/>
-                      <w:b/>
-                      <w:bCs/>
-                      <w:color w:val="0B1F3A"/>
-                      <w:sz w:val="22"/>
-                      <w:szCs w:val="22"/>
-                    </w:rPr>
-                    <w:t xml:space="preserve">Strety</w:t>
-                  </w:r>
-                </w:p>
-              </w:tc>
-              <w:tc>
-                <w:tcPr>
-                  <w:tcW w:type="dxa" w:w="1110"/>
-                  <w:tcBorders>
-                    <w:top w:val="none" w:color="FFFFFF" w:sz="0"/>
-                    <w:left w:val="none" w:color="FFFFFF" w:sz="0"/>
-                    <w:bottom w:val="none" w:color="FFFFFF" w:sz="0"/>
-                    <w:right w:val="none" w:color="FFFFFF" w:sz="0"/>
-                  </w:tcBorders>
-                  <w:tcMar>
-                    <w:top w:type="dxa" w:w="0"/>
-                    <w:left w:type="dxa" w:w="120"/>
-                    <w:bottom w:type="dxa" w:w="0"/>
-                    <w:right w:type="dxa" w:w="0"/>
-                  </w:tcMar>
-                  <w:vAlign w:val="center"/>
-                </w:tcPr>
-                <w:p>
-                  <w:pPr>
-                    <w:spacing w:after="0"/>
-                    <w:jc w:val="right"/>
-                  </w:pPr>
-                  <w:r>
-                    <w:drawing>
-                      <wp:inline distT="0" distB="0" distL="0" distR="0">
-                        <wp:extent cx="552450" cy="552450"/>
-                        <wp:effectExtent t="0" r="0" b="0" l="0"/>
-                        <wp:docPr id="1" name="img" descr="image" title="sponsor-strety.png"/>
-                        <wp:cNvGraphicFramePr>
-                          <a:graphicFrameLocks xmlns:a="http://schemas.openxmlformats.org/drawingml/2006/main" noChangeAspect="1"/>
-                        </wp:cNvGraphicFramePr>
-                        <a:graphic xmlns:a="http://schemas.openxmlformats.org/drawingml/2006/main">
-                          <a:graphicData uri="http://schemas.openxmlformats.org/drawingml/2006/picture">
-                            <pic:pic xmlns:pic="http://schemas.openxmlformats.org/drawingml/2006/picture">
-                              <pic:nvPicPr>
-                                <pic:cNvPr id="0" name="" descr=""/>
-                                <pic:cNvPicPr>
-                                  <a:picLocks noChangeAspect="1" noChangeArrowheads="1"/>
-                                </pic:cNvPicPr>
-                              </pic:nvPicPr>
-                              <pic:blipFill>
-                                <a:blip r:embed="rId25" cstate="none"/>
-                                <a:srcRect/>
-                                <a:stretch>
-                                  <a:fillRect/>
-                                </a:stretch>
-                              </pic:blipFill>
-                              <pic:spPr bwMode="auto">
-                                <a:xfrm>
-                                  <a:off x="0" y="0"/>
-                                  <a:ext cx="552450" cy="552450"/>
-                                </a:xfrm>
-                                <a:prstGeom prst="rect">
-                                  <a:avLst/>
-                                </a:prstGeom>
-                              </pic:spPr>
-                            </pic:pic>
-                          </a:graphicData>
-                        </a:graphic>
-                      </wp:inline>
-                    </w:drawing>
-                  </w:r>
-                </w:p>
-              </w:tc>
-            </w:tr>
-          </w:tbl>
-          <w:p/>
-        </w:tc>
-        <w:tc>
-          <w:tcPr>
-            <w:tcW w:type="dxa" w:w="5040"/>
-            <w:tcBorders>
-              <w:top w:val="single" w:color="C9D2DE" w:sz="4"/>
-              <w:left w:val="single" w:color="C9D2DE" w:sz="4"/>
-              <w:bottom w:val="single" w:color="C9D2DE" w:sz="4"/>
-              <w:right w:val="single" w:color="C9D2DE" w:sz="4"/>
-            </w:tcBorders>
-            <w:shd w:fill="FFFFFF" w:val="clear"/>
-            <w:tcMar>
-              <w:top w:type="dxa" w:w="70"/>
-              <w:left w:type="dxa" w:w="140"/>
-              <w:bottom w:type="dxa" w:w="70"/>
-              <w:right w:type="dxa" w:w="140"/>
-            </w:tcMar>
-            <w:vAlign w:val="center"/>
-          </w:tcPr>
-          <w:tbl>
-            <w:tblPr>
-              <w:tblW w:type="dxa" w:w="4720"/>
-              <w:tblBorders>
-                <w:top w:val="single" w:color="auto" w:sz="4"/>
-                <w:left w:val="single" w:color="auto" w:sz="4"/>
-                <w:bottom w:val="single" w:color="auto" w:sz="4"/>
-                <w:right w:val="single" w:color="auto" w:sz="4"/>
-                <w:insideH w:val="single" w:color="auto" w:sz="4"/>
-                <w:insideV w:val="single" w:color="auto" w:sz="4"/>
-              </w:tblBorders>
-            </w:tblPr>
-            <w:tblGrid>
-              <w:gridCol w:w="3930"/>
-              <w:gridCol w:w="1110"/>
-            </w:tblGrid>
-            <w:tr>
-              <w:trPr>
-                <w:cantSplit/>
-              </w:trPr>
-              <w:tc>
-                <w:tcPr>
-                  <w:tcW w:type="dxa" w:w="3930"/>
-                  <w:tcBorders>
-                    <w:top w:val="none" w:color="FFFFFF" w:sz="0"/>
-                    <w:left w:val="none" w:color="FFFFFF" w:sz="0"/>
-                    <w:bottom w:val="none" w:color="FFFFFF" w:sz="0"/>
-                    <w:right w:val="none" w:color="FFFFFF" w:sz="0"/>
-                  </w:tcBorders>
-                  <w:tcMar>
-                    <w:top w:type="dxa" w:w="0"/>
-                    <w:left w:type="dxa" w:w="0"/>
-                    <w:bottom w:type="dxa" w:w="0"/>
-                    <w:right w:type="dxa" w:w="120"/>
-                  </w:tcMar>
-                  <w:vAlign w:val="center"/>
-                </w:tcPr>
-                <w:p>
-                  <w:pPr>
-                    <w:spacing w:after="40"/>
-                    <w:jc w:val="left"/>
-                  </w:pPr>
-                  <w:r>
-                    <w:drawing>
-                      <wp:inline distT="0" distB="0" distL="0" distR="0">
-                        <wp:extent cx="2028825" cy="647700"/>
-                        <wp:effectExtent t="0" r="0" b="0" l="0"/>
-                        <wp:docPr id="1" name="img" descr="image" title="tsos.png"/>
-                        <wp:cNvGraphicFramePr>
-                          <a:graphicFrameLocks xmlns:a="http://schemas.openxmlformats.org/drawingml/2006/main" noChangeAspect="1"/>
-                        </wp:cNvGraphicFramePr>
-                        <a:graphic xmlns:a="http://schemas.openxmlformats.org/drawingml/2006/main">
-                          <a:graphicData uri="http://schemas.openxmlformats.org/drawingml/2006/picture">
-                            <pic:pic xmlns:pic="http://schemas.openxmlformats.org/drawingml/2006/picture">
-                              <pic:nvPicPr>
-                                <pic:cNvPr id="0" name="" descr=""/>
-                                <pic:cNvPicPr>
-                                  <a:picLocks noChangeAspect="1" noChangeArrowheads="1"/>
-                                </pic:cNvPicPr>
-                              </pic:nvPicPr>
-                              <pic:blipFill>
-                                <a:blip r:embed="rId26" cstate="none"/>
-                                <a:srcRect/>
-                                <a:stretch>
-                                  <a:fillRect/>
-                                </a:stretch>
-                              </pic:blipFill>
-                              <pic:spPr bwMode="auto">
-                                <a:xfrm>
-                                  <a:off x="0" y="0"/>
-                                  <a:ext cx="2028825" cy="647700"/>
-                                </a:xfrm>
-                                <a:prstGeom prst="rect">
-                                  <a:avLst/>
-                                </a:prstGeom>
-                              </pic:spPr>
-                            </pic:pic>
-                          </a:graphicData>
-                        </a:graphic>
-                      </wp:inline>
-                    </w:drawing>
-                  </w:r>
-                </w:p>
-                <w:p>
-                  <w:pPr>
-                    <w:spacing w:after="0"/>
-                    <w:jc w:val="left"/>
-                  </w:pPr>
-                  <w:r>
-                    <w:rPr>
-                      <w:rFonts w:ascii="Calibri" w:cs="Calibri" w:eastAsia="Calibri" w:hAnsi="Calibri"/>
-                      <w:b/>
-                      <w:bCs/>
-                      <w:color w:val="0B1F3A"/>
-                      <w:sz w:val="22"/>
-                      <w:szCs w:val="22"/>
-                    </w:rPr>
-                    <w:t xml:space="preserve">The System of Selling</w:t>
-                  </w:r>
-                </w:p>
-              </w:tc>
-              <w:tc>
-                <w:tcPr>
-                  <w:tcW w:type="dxa" w:w="1110"/>
-                  <w:tcBorders>
-                    <w:top w:val="none" w:color="FFFFFF" w:sz="0"/>
-                    <w:left w:val="none" w:color="FFFFFF" w:sz="0"/>
-                    <w:bottom w:val="none" w:color="FFFFFF" w:sz="0"/>
-                    <w:right w:val="none" w:color="FFFFFF" w:sz="0"/>
-                  </w:tcBorders>
-                  <w:tcMar>
-                    <w:top w:type="dxa" w:w="0"/>
-                    <w:left w:type="dxa" w:w="120"/>
-                    <w:bottom w:type="dxa" w:w="0"/>
-                    <w:right w:type="dxa" w:w="0"/>
-                  </w:tcMar>
-                  <w:vAlign w:val="center"/>
-                </w:tcPr>
-                <w:p>
-                  <w:pPr>
-                    <w:spacing w:after="0"/>
-                    <w:jc w:val="right"/>
-                  </w:pPr>
-                  <w:r>
-                    <w:drawing>
-                      <wp:inline distT="0" distB="0" distL="0" distR="0">
-                        <wp:extent cx="552450" cy="552450"/>
-                        <wp:effectExtent t="0" r="0" b="0" l="0"/>
-                        <wp:docPr id="1" name="img" descr="image" title="sponsor-the-system-of-selling.png"/>
-                        <wp:cNvGraphicFramePr>
-                          <a:graphicFrameLocks xmlns:a="http://schemas.openxmlformats.org/drawingml/2006/main" noChangeAspect="1"/>
-                        </wp:cNvGraphicFramePr>
-                        <a:graphic xmlns:a="http://schemas.openxmlformats.org/drawingml/2006/main">
-                          <a:graphicData uri="http://schemas.openxmlformats.org/drawingml/2006/picture">
-                            <pic:pic xmlns:pic="http://schemas.openxmlformats.org/drawingml/2006/picture">
-                              <pic:nvPicPr>
-                                <pic:cNvPr id="0" name="" descr=""/>
-                                <pic:cNvPicPr>
-                                  <a:picLocks noChangeAspect="1" noChangeArrowheads="1"/>
-                                </pic:cNvPicPr>
-                              </pic:nvPicPr>
-                              <pic:blipFill>
-                                <a:blip r:embed="rId27" cstate="none"/>
-                                <a:srcRect/>
-                                <a:stretch>
-                                  <a:fillRect/>
-                                </a:stretch>
-                              </pic:blipFill>
-                              <pic:spPr bwMode="auto">
-                                <a:xfrm>
-                                  <a:off x="0" y="0"/>
-                                  <a:ext cx="552450" cy="552450"/>
                                 </a:xfrm>
                                 <a:prstGeom prst="rect">
                                   <a:avLst/>
@@ -17427,7 +17427,7 @@
     </w:p>
     <w:p>
       <w:pPr>
-        <w:spacing w:after="80"/>
+        <w:spacing w:after="20"/>
       </w:pPr>
       <w:r>
         <w:t xml:space="preserve"/>
@@ -17464,9 +17464,9 @@
             </w:tcBorders>
             <w:shd w:fill="FFFFFF" w:val="clear"/>
             <w:tcMar>
-              <w:top w:type="dxa" w:w="50"/>
+              <w:top w:type="dxa" w:w="20"/>
               <w:left w:type="dxa" w:w="120"/>
-              <w:bottom w:type="dxa" w:w="50"/>
+              <w:bottom w:type="dxa" w:w="20"/>
               <w:right w:type="dxa" w:w="120"/>
             </w:tcMar>
             <w:vAlign w:val="center"/>
@@ -17710,9 +17710,9 @@
             </w:tcBorders>
             <w:shd w:fill="FFFFFF" w:val="clear"/>
             <w:tcMar>
-              <w:top w:type="dxa" w:w="50"/>
+              <w:top w:type="dxa" w:w="20"/>
               <w:left w:type="dxa" w:w="120"/>
-              <w:bottom w:type="dxa" w:w="50"/>
+              <w:bottom w:type="dxa" w:w="20"/>
               <w:right w:type="dxa" w:w="120"/>
             </w:tcMar>
             <w:vAlign w:val="center"/>
@@ -17949,7 +17949,7 @@
     </w:tbl>
     <w:p>
       <w:pPr>
-        <w:spacing w:after="20"/>
+        <w:spacing w:after="6"/>
       </w:pPr>
       <w:r>
         <w:t xml:space="preserve"/>
@@ -17986,9 +17986,9 @@
             </w:tcBorders>
             <w:shd w:fill="FFFFFF" w:val="clear"/>
             <w:tcMar>
-              <w:top w:type="dxa" w:w="50"/>
+              <w:top w:type="dxa" w:w="20"/>
               <w:left w:type="dxa" w:w="120"/>
-              <w:bottom w:type="dxa" w:w="50"/>
+              <w:bottom w:type="dxa" w:w="20"/>
               <w:right w:type="dxa" w:w="120"/>
             </w:tcMar>
             <w:vAlign w:val="center"/>
@@ -18232,9 +18232,9 @@
             </w:tcBorders>
             <w:shd w:fill="FFFFFF" w:val="clear"/>
             <w:tcMar>
-              <w:top w:type="dxa" w:w="50"/>
+              <w:top w:type="dxa" w:w="20"/>
               <w:left w:type="dxa" w:w="120"/>
-              <w:bottom w:type="dxa" w:w="50"/>
+              <w:bottom w:type="dxa" w:w="20"/>
               <w:right w:type="dxa" w:w="120"/>
             </w:tcMar>
             <w:vAlign w:val="center"/>
@@ -18471,7 +18471,7 @@
     </w:tbl>
     <w:p>
       <w:pPr>
-        <w:spacing w:after="20"/>
+        <w:spacing w:after="6"/>
       </w:pPr>
       <w:r>
         <w:t xml:space="preserve"/>
@@ -18508,9 +18508,9 @@
             </w:tcBorders>
             <w:shd w:fill="FFFFFF" w:val="clear"/>
             <w:tcMar>
-              <w:top w:type="dxa" w:w="50"/>
+              <w:top w:type="dxa" w:w="20"/>
               <w:left w:type="dxa" w:w="120"/>
-              <w:bottom w:type="dxa" w:w="50"/>
+              <w:bottom w:type="dxa" w:w="20"/>
               <w:right w:type="dxa" w:w="120"/>
             </w:tcMar>
             <w:vAlign w:val="center"/>
@@ -18754,9 +18754,9 @@
             </w:tcBorders>
             <w:shd w:fill="FFFFFF" w:val="clear"/>
             <w:tcMar>
-              <w:top w:type="dxa" w:w="50"/>
+              <w:top w:type="dxa" w:w="20"/>
               <w:left w:type="dxa" w:w="120"/>
-              <w:bottom w:type="dxa" w:w="50"/>
+              <w:bottom w:type="dxa" w:w="20"/>
               <w:right w:type="dxa" w:w="120"/>
             </w:tcMar>
             <w:vAlign w:val="center"/>
@@ -18993,7 +18993,7 @@
     </w:tbl>
     <w:p>
       <w:pPr>
-        <w:spacing w:after="20"/>
+        <w:spacing w:after="6"/>
       </w:pPr>
       <w:r>
         <w:t xml:space="preserve"/>
@@ -19030,9 +19030,9 @@
             </w:tcBorders>
             <w:shd w:fill="FFFFFF" w:val="clear"/>
             <w:tcMar>
-              <w:top w:type="dxa" w:w="50"/>
+              <w:top w:type="dxa" w:w="20"/>
               <w:left w:type="dxa" w:w="120"/>
-              <w:bottom w:type="dxa" w:w="50"/>
+              <w:bottom w:type="dxa" w:w="20"/>
               <w:right w:type="dxa" w:w="120"/>
             </w:tcMar>
             <w:vAlign w:val="center"/>
@@ -19276,9 +19276,9 @@
             </w:tcBorders>
             <w:shd w:fill="FFFFFF" w:val="clear"/>
             <w:tcMar>
-              <w:top w:type="dxa" w:w="50"/>
+              <w:top w:type="dxa" w:w="20"/>
               <w:left w:type="dxa" w:w="120"/>
-              <w:bottom w:type="dxa" w:w="50"/>
+              <w:bottom w:type="dxa" w:w="20"/>
               <w:right w:type="dxa" w:w="120"/>
             </w:tcMar>
             <w:vAlign w:val="center"/>
@@ -19515,7 +19515,7 @@
     </w:tbl>
     <w:p>
       <w:pPr>
-        <w:spacing w:after="20"/>
+        <w:spacing w:after="6"/>
       </w:pPr>
       <w:r>
         <w:t xml:space="preserve"/>
@@ -19552,9 +19552,9 @@
             </w:tcBorders>
             <w:shd w:fill="FFFFFF" w:val="clear"/>
             <w:tcMar>
-              <w:top w:type="dxa" w:w="50"/>
+              <w:top w:type="dxa" w:w="20"/>
               <w:left w:type="dxa" w:w="120"/>
-              <w:bottom w:type="dxa" w:w="50"/>
+              <w:bottom w:type="dxa" w:w="20"/>
               <w:right w:type="dxa" w:w="120"/>
             </w:tcMar>
             <w:vAlign w:val="center"/>
@@ -19798,9 +19798,9 @@
             </w:tcBorders>
             <w:shd w:fill="FFFFFF" w:val="clear"/>
             <w:tcMar>
-              <w:top w:type="dxa" w:w="50"/>
+              <w:top w:type="dxa" w:w="20"/>
               <w:left w:type="dxa" w:w="120"/>
-              <w:bottom w:type="dxa" w:w="50"/>
+              <w:bottom w:type="dxa" w:w="20"/>
               <w:right w:type="dxa" w:w="120"/>
             </w:tcMar>
             <w:vAlign w:val="center"/>
@@ -20037,7 +20037,7 @@
     </w:tbl>
     <w:p>
       <w:pPr>
-        <w:spacing w:after="20"/>
+        <w:spacing w:after="6"/>
       </w:pPr>
       <w:r>
         <w:t xml:space="preserve"/>
@@ -20074,9 +20074,9 @@
             </w:tcBorders>
             <w:shd w:fill="FFFFFF" w:val="clear"/>
             <w:tcMar>
-              <w:top w:type="dxa" w:w="50"/>
+              <w:top w:type="dxa" w:w="20"/>
               <w:left w:type="dxa" w:w="120"/>
-              <w:bottom w:type="dxa" w:w="50"/>
+              <w:bottom w:type="dxa" w:w="20"/>
               <w:right w:type="dxa" w:w="120"/>
             </w:tcMar>
             <w:vAlign w:val="center"/>
@@ -20320,9 +20320,9 @@
             </w:tcBorders>
             <w:shd w:fill="FFFFFF" w:val="clear"/>
             <w:tcMar>
-              <w:top w:type="dxa" w:w="50"/>
+              <w:top w:type="dxa" w:w="20"/>
               <w:left w:type="dxa" w:w="120"/>
-              <w:bottom w:type="dxa" w:w="50"/>
+              <w:bottom w:type="dxa" w:w="20"/>
               <w:right w:type="dxa" w:w="120"/>
             </w:tcMar>
             <w:vAlign w:val="center"/>
@@ -20559,7 +20559,7 @@
     </w:tbl>
     <w:p>
       <w:pPr>
-        <w:spacing w:after="20"/>
+        <w:spacing w:after="6"/>
       </w:pPr>
       <w:r>
         <w:t xml:space="preserve"/>
@@ -20596,9 +20596,9 @@
             </w:tcBorders>
             <w:shd w:fill="FFFFFF" w:val="clear"/>
             <w:tcMar>
-              <w:top w:type="dxa" w:w="50"/>
+              <w:top w:type="dxa" w:w="20"/>
               <w:left w:type="dxa" w:w="120"/>
-              <w:bottom w:type="dxa" w:w="50"/>
+              <w:bottom w:type="dxa" w:w="20"/>
               <w:right w:type="dxa" w:w="120"/>
             </w:tcMar>
             <w:vAlign w:val="center"/>
@@ -20842,9 +20842,9 @@
             </w:tcBorders>
             <w:shd w:fill="FFFFFF" w:val="clear"/>
             <w:tcMar>
-              <w:top w:type="dxa" w:w="50"/>
+              <w:top w:type="dxa" w:w="20"/>
               <w:left w:type="dxa" w:w="120"/>
-              <w:bottom w:type="dxa" w:w="50"/>
+              <w:bottom w:type="dxa" w:w="20"/>
               <w:right w:type="dxa" w:w="120"/>
             </w:tcMar>
             <w:vAlign w:val="center"/>
@@ -21081,7 +21081,7 @@
     </w:tbl>
     <w:p>
       <w:pPr>
-        <w:spacing w:after="20"/>
+        <w:spacing w:after="6"/>
       </w:pPr>
       <w:r>
         <w:t xml:space="preserve"/>
@@ -21118,9 +21118,9 @@
             </w:tcBorders>
             <w:shd w:fill="FFFFFF" w:val="clear"/>
             <w:tcMar>
-              <w:top w:type="dxa" w:w="50"/>
+              <w:top w:type="dxa" w:w="20"/>
               <w:left w:type="dxa" w:w="120"/>
-              <w:bottom w:type="dxa" w:w="50"/>
+              <w:bottom w:type="dxa" w:w="20"/>
               <w:right w:type="dxa" w:w="120"/>
             </w:tcMar>
             <w:vAlign w:val="center"/>
@@ -21389,9 +21389,9 @@
             </w:tcBorders>
             <w:shd w:fill="FFFFFF" w:val="clear"/>
             <w:tcMar>
-              <w:top w:type="dxa" w:w="50"/>
+              <w:top w:type="dxa" w:w="20"/>
               <w:left w:type="dxa" w:w="120"/>
-              <w:bottom w:type="dxa" w:w="50"/>
+              <w:bottom w:type="dxa" w:w="20"/>
               <w:right w:type="dxa" w:w="120"/>
             </w:tcMar>
             <w:vAlign w:val="center"/>
@@ -21653,7 +21653,7 @@
     </w:tbl>
     <w:p>
       <w:pPr>
-        <w:spacing w:after="20"/>
+        <w:spacing w:after="6"/>
       </w:pPr>
       <w:r>
         <w:t xml:space="preserve"/>
@@ -21690,9 +21690,9 @@
             </w:tcBorders>
             <w:shd w:fill="FFFFFF" w:val="clear"/>
             <w:tcMar>
-              <w:top w:type="dxa" w:w="50"/>
+              <w:top w:type="dxa" w:w="20"/>
               <w:left w:type="dxa" w:w="120"/>
-              <w:bottom w:type="dxa" w:w="50"/>
+              <w:bottom w:type="dxa" w:w="20"/>
               <w:right w:type="dxa" w:w="120"/>
             </w:tcMar>
             <w:vAlign w:val="center"/>
@@ -21936,9 +21936,9 @@
             </w:tcBorders>
             <w:shd w:fill="FFFFFF" w:val="clear"/>
             <w:tcMar>
-              <w:top w:type="dxa" w:w="50"/>
+              <w:top w:type="dxa" w:w="20"/>
               <w:left w:type="dxa" w:w="120"/>
-              <w:bottom w:type="dxa" w:w="50"/>
+              <w:bottom w:type="dxa" w:w="20"/>
               <w:right w:type="dxa" w:w="120"/>
             </w:tcMar>
             <w:vAlign w:val="center"/>
@@ -22175,7 +22175,7 @@
     </w:tbl>
     <w:p>
       <w:pPr>
-        <w:spacing w:after="20"/>
+        <w:spacing w:after="6"/>
       </w:pPr>
       <w:r>
         <w:t xml:space="preserve"/>
@@ -22212,9 +22212,9 @@
             </w:tcBorders>
             <w:shd w:fill="FFFFFF" w:val="clear"/>
             <w:tcMar>
-              <w:top w:type="dxa" w:w="50"/>
+              <w:top w:type="dxa" w:w="20"/>
               <w:left w:type="dxa" w:w="120"/>
-              <w:bottom w:type="dxa" w:w="50"/>
+              <w:bottom w:type="dxa" w:w="20"/>
               <w:right w:type="dxa" w:w="120"/>
             </w:tcMar>
             <w:vAlign w:val="center"/>
@@ -22458,9 +22458,9 @@
             </w:tcBorders>
             <w:shd w:fill="FFFFFF" w:val="clear"/>
             <w:tcMar>
-              <w:top w:type="dxa" w:w="50"/>
+              <w:top w:type="dxa" w:w="20"/>
               <w:left w:type="dxa" w:w="120"/>
-              <w:bottom w:type="dxa" w:w="50"/>
+              <w:bottom w:type="dxa" w:w="20"/>
               <w:right w:type="dxa" w:w="120"/>
             </w:tcMar>
             <w:vAlign w:val="center"/>
@@ -22697,7 +22697,7 @@
     </w:tbl>
     <w:p>
       <w:pPr>
-        <w:spacing w:after="20"/>
+        <w:spacing w:after="6"/>
       </w:pPr>
       <w:r>
         <w:t xml:space="preserve"/>
@@ -22734,9 +22734,9 @@
             </w:tcBorders>
             <w:shd w:fill="FFFFFF" w:val="clear"/>
             <w:tcMar>
-              <w:top w:type="dxa" w:w="50"/>
+              <w:top w:type="dxa" w:w="20"/>
               <w:left w:type="dxa" w:w="120"/>
-              <w:bottom w:type="dxa" w:w="50"/>
+              <w:bottom w:type="dxa" w:w="20"/>
               <w:right w:type="dxa" w:w="120"/>
             </w:tcMar>
             <w:vAlign w:val="center"/>
@@ -22980,9 +22980,9 @@
             </w:tcBorders>
             <w:shd w:fill="FFFFFF" w:val="clear"/>
             <w:tcMar>
-              <w:top w:type="dxa" w:w="50"/>
+              <w:top w:type="dxa" w:w="20"/>
               <w:left w:type="dxa" w:w="120"/>
-              <w:bottom w:type="dxa" w:w="50"/>
+              <w:bottom w:type="dxa" w:w="20"/>
               <w:right w:type="dxa" w:w="120"/>
             </w:tcMar>
             <w:vAlign w:val="center"/>
@@ -23219,7 +23219,7 @@
     </w:tbl>
     <w:p>
       <w:pPr>
-        <w:spacing w:after="20"/>
+        <w:spacing w:after="6"/>
       </w:pPr>
       <w:r>
         <w:t xml:space="preserve"/>
@@ -23256,9 +23256,9 @@
             </w:tcBorders>
             <w:shd w:fill="FFFFFF" w:val="clear"/>
             <w:tcMar>
-              <w:top w:type="dxa" w:w="50"/>
+              <w:top w:type="dxa" w:w="20"/>
               <w:left w:type="dxa" w:w="120"/>
-              <w:bottom w:type="dxa" w:w="50"/>
+              <w:bottom w:type="dxa" w:w="20"/>
               <w:right w:type="dxa" w:w="120"/>
             </w:tcMar>
             <w:vAlign w:val="center"/>
@@ -23502,9 +23502,9 @@
             </w:tcBorders>
             <w:shd w:fill="FFFFFF" w:val="clear"/>
             <w:tcMar>
-              <w:top w:type="dxa" w:w="50"/>
+              <w:top w:type="dxa" w:w="20"/>
               <w:left w:type="dxa" w:w="120"/>
-              <w:bottom w:type="dxa" w:w="50"/>
+              <w:bottom w:type="dxa" w:w="20"/>
               <w:right w:type="dxa" w:w="120"/>
             </w:tcMar>
             <w:vAlign w:val="center"/>
@@ -23766,7 +23766,7 @@
     </w:tbl>
     <w:p>
       <w:pPr>
-        <w:spacing w:after="20"/>
+        <w:spacing w:after="6"/>
       </w:pPr>
       <w:r>
         <w:t xml:space="preserve"/>
@@ -23803,9 +23803,9 @@
             </w:tcBorders>
             <w:shd w:fill="FFFFFF" w:val="clear"/>
             <w:tcMar>
-              <w:top w:type="dxa" w:w="50"/>
+              <w:top w:type="dxa" w:w="20"/>
               <w:left w:type="dxa" w:w="120"/>
-              <w:bottom w:type="dxa" w:w="50"/>
+              <w:bottom w:type="dxa" w:w="20"/>
               <w:right w:type="dxa" w:w="120"/>
             </w:tcMar>
             <w:vAlign w:val="center"/>
@@ -24074,9 +24074,9 @@
             </w:tcBorders>
             <w:shd w:fill="FFFFFF" w:val="clear"/>
             <w:tcMar>
-              <w:top w:type="dxa" w:w="50"/>
+              <w:top w:type="dxa" w:w="20"/>
               <w:left w:type="dxa" w:w="120"/>
-              <w:bottom w:type="dxa" w:w="50"/>
+              <w:bottom w:type="dxa" w:w="20"/>
               <w:right w:type="dxa" w:w="120"/>
             </w:tcMar>
             <w:vAlign w:val="center"/>
@@ -24313,7 +24313,7 @@
     </w:tbl>
     <w:p>
       <w:pPr>
-        <w:spacing w:after="20"/>
+        <w:spacing w:after="6"/>
       </w:pPr>
       <w:r>
         <w:t xml:space="preserve"/>
@@ -24350,9 +24350,9 @@
             </w:tcBorders>
             <w:shd w:fill="FFFFFF" w:val="clear"/>
             <w:tcMar>
-              <w:top w:type="dxa" w:w="50"/>
+              <w:top w:type="dxa" w:w="20"/>
               <w:left w:type="dxa" w:w="120"/>
-              <w:bottom w:type="dxa" w:w="50"/>
+              <w:bottom w:type="dxa" w:w="20"/>
               <w:right w:type="dxa" w:w="120"/>
             </w:tcMar>
             <w:vAlign w:val="center"/>
@@ -24596,9 +24596,9 @@
             </w:tcBorders>
             <w:shd w:fill="FFFFFF" w:val="clear"/>
             <w:tcMar>
-              <w:top w:type="dxa" w:w="50"/>
+              <w:top w:type="dxa" w:w="20"/>
               <w:left w:type="dxa" w:w="120"/>
-              <w:bottom w:type="dxa" w:w="50"/>
+              <w:bottom w:type="dxa" w:w="20"/>
               <w:right w:type="dxa" w:w="120"/>
             </w:tcMar>
             <w:vAlign w:val="center"/>
@@ -24835,7 +24835,7 @@
     </w:tbl>
     <w:p>
       <w:pPr>
-        <w:spacing w:after="20"/>
+        <w:spacing w:after="6"/>
       </w:pPr>
       <w:r>
         <w:t xml:space="preserve"/>
@@ -24872,9 +24872,9 @@
             </w:tcBorders>
             <w:shd w:fill="FFFFFF" w:val="clear"/>
             <w:tcMar>
-              <w:top w:type="dxa" w:w="50"/>
+              <w:top w:type="dxa" w:w="20"/>
               <w:left w:type="dxa" w:w="120"/>
-              <w:bottom w:type="dxa" w:w="50"/>
+              <w:bottom w:type="dxa" w:w="20"/>
               <w:right w:type="dxa" w:w="120"/>
             </w:tcMar>
             <w:vAlign w:val="center"/>
@@ -25118,9 +25118,9 @@
             </w:tcBorders>
             <w:shd w:fill="FFFFFF" w:val="clear"/>
             <w:tcMar>
-              <w:top w:type="dxa" w:w="50"/>
+              <w:top w:type="dxa" w:w="20"/>
               <w:left w:type="dxa" w:w="120"/>
-              <w:bottom w:type="dxa" w:w="50"/>
+              <w:bottom w:type="dxa" w:w="20"/>
               <w:right w:type="dxa" w:w="120"/>
             </w:tcMar>
             <w:vAlign w:val="center"/>
@@ -25357,7 +25357,7 @@
     </w:tbl>
     <w:p>
       <w:pPr>
-        <w:spacing w:after="20"/>
+        <w:spacing w:after="6"/>
       </w:pPr>
       <w:r>
         <w:t xml:space="preserve"/>
@@ -25394,9 +25394,9 @@
             </w:tcBorders>
             <w:shd w:fill="FFFFFF" w:val="clear"/>
             <w:tcMar>
-              <w:top w:type="dxa" w:w="50"/>
+              <w:top w:type="dxa" w:w="20"/>
               <w:left w:type="dxa" w:w="120"/>
-              <w:bottom w:type="dxa" w:w="50"/>
+              <w:bottom w:type="dxa" w:w="20"/>
               <w:right w:type="dxa" w:w="120"/>
             </w:tcMar>
             <w:vAlign w:val="center"/>
@@ -25640,9 +25640,9 @@
             </w:tcBorders>
             <w:shd w:fill="FFFFFF" w:val="clear"/>
             <w:tcMar>
-              <w:top w:type="dxa" w:w="50"/>
+              <w:top w:type="dxa" w:w="20"/>
               <w:left w:type="dxa" w:w="120"/>
-              <w:bottom w:type="dxa" w:w="50"/>
+              <w:bottom w:type="dxa" w:w="20"/>
               <w:right w:type="dxa" w:w="120"/>
             </w:tcMar>
             <w:vAlign w:val="center"/>
@@ -25879,7 +25879,7 @@
     </w:tbl>
     <w:p>
       <w:pPr>
-        <w:spacing w:after="20"/>
+        <w:spacing w:after="6"/>
       </w:pPr>
       <w:r>
         <w:t xml:space="preserve"/>
@@ -25916,9 +25916,9 @@
             </w:tcBorders>
             <w:shd w:fill="FFFFFF" w:val="clear"/>
             <w:tcMar>
-              <w:top w:type="dxa" w:w="50"/>
+              <w:top w:type="dxa" w:w="20"/>
               <w:left w:type="dxa" w:w="120"/>
-              <w:bottom w:type="dxa" w:w="50"/>
+              <w:bottom w:type="dxa" w:w="20"/>
               <w:right w:type="dxa" w:w="120"/>
             </w:tcMar>
             <w:vAlign w:val="center"/>
@@ -26162,9 +26162,9 @@
             </w:tcBorders>
             <w:shd w:fill="FFFFFF" w:val="clear"/>
             <w:tcMar>
-              <w:top w:type="dxa" w:w="50"/>
+              <w:top w:type="dxa" w:w="20"/>
               <w:left w:type="dxa" w:w="120"/>
-              <w:bottom w:type="dxa" w:w="50"/>
+              <w:bottom w:type="dxa" w:w="20"/>
               <w:right w:type="dxa" w:w="120"/>
             </w:tcMar>
             <w:vAlign w:val="center"/>
@@ -26401,7 +26401,7 @@
     </w:tbl>
     <w:p>
       <w:pPr>
-        <w:spacing w:after="20"/>
+        <w:spacing w:after="6"/>
       </w:pPr>
       <w:r>
         <w:t xml:space="preserve"/>
@@ -26438,9 +26438,9 @@
             </w:tcBorders>
             <w:shd w:fill="FFFFFF" w:val="clear"/>
             <w:tcMar>
-              <w:top w:type="dxa" w:w="50"/>
+              <w:top w:type="dxa" w:w="20"/>
               <w:left w:type="dxa" w:w="120"/>
-              <w:bottom w:type="dxa" w:w="50"/>
+              <w:bottom w:type="dxa" w:w="20"/>
               <w:right w:type="dxa" w:w="120"/>
             </w:tcMar>
             <w:vAlign w:val="center"/>
@@ -26684,9 +26684,9 @@
             </w:tcBorders>
             <w:shd w:fill="FFFFFF" w:val="clear"/>
             <w:tcMar>
-              <w:top w:type="dxa" w:w="50"/>
+              <w:top w:type="dxa" w:w="20"/>
               <w:left w:type="dxa" w:w="120"/>
-              <w:bottom w:type="dxa" w:w="50"/>
+              <w:bottom w:type="dxa" w:w="20"/>
               <w:right w:type="dxa" w:w="120"/>
             </w:tcMar>
             <w:vAlign w:val="center"/>
@@ -26948,7 +26948,7 @@
     </w:tbl>
     <w:p>
       <w:pPr>
-        <w:spacing w:after="20"/>
+        <w:spacing w:after="6"/>
       </w:pPr>
       <w:r>
         <w:t xml:space="preserve"/>
@@ -26985,9 +26985,9 @@
             </w:tcBorders>
             <w:shd w:fill="FFFFFF" w:val="clear"/>
             <w:tcMar>
-              <w:top w:type="dxa" w:w="50"/>
+              <w:top w:type="dxa" w:w="20"/>
               <w:left w:type="dxa" w:w="120"/>
-              <w:bottom w:type="dxa" w:w="50"/>
+              <w:bottom w:type="dxa" w:w="20"/>
               <w:right w:type="dxa" w:w="120"/>
             </w:tcMar>
             <w:vAlign w:val="center"/>
@@ -27231,9 +27231,9 @@
             </w:tcBorders>
             <w:shd w:fill="FFFFFF" w:val="clear"/>
             <w:tcMar>
-              <w:top w:type="dxa" w:w="50"/>
+              <w:top w:type="dxa" w:w="20"/>
               <w:left w:type="dxa" w:w="120"/>
-              <w:bottom w:type="dxa" w:w="50"/>
+              <w:bottom w:type="dxa" w:w="20"/>
               <w:right w:type="dxa" w:w="120"/>
             </w:tcMar>
             <w:vAlign w:val="center"/>
@@ -27470,7 +27470,7 @@
     </w:tbl>
     <w:p>
       <w:pPr>
-        <w:spacing w:after="20"/>
+        <w:spacing w:after="6"/>
       </w:pPr>
       <w:r>
         <w:t xml:space="preserve"/>
@@ -27507,9 +27507,9 @@
             </w:tcBorders>
             <w:shd w:fill="FFFFFF" w:val="clear"/>
             <w:tcMar>
-              <w:top w:type="dxa" w:w="50"/>
+              <w:top w:type="dxa" w:w="20"/>
               <w:left w:type="dxa" w:w="120"/>
-              <w:bottom w:type="dxa" w:w="50"/>
+              <w:bottom w:type="dxa" w:w="20"/>
               <w:right w:type="dxa" w:w="120"/>
             </w:tcMar>
             <w:vAlign w:val="center"/>
@@ -27753,9 +27753,9 @@
             </w:tcBorders>
             <w:shd w:fill="FFFFFF" w:val="clear"/>
             <w:tcMar>
-              <w:top w:type="dxa" w:w="50"/>
+              <w:top w:type="dxa" w:w="20"/>
               <w:left w:type="dxa" w:w="120"/>
-              <w:bottom w:type="dxa" w:w="50"/>
+              <w:bottom w:type="dxa" w:w="20"/>
               <w:right w:type="dxa" w:w="120"/>
             </w:tcMar>
             <w:vAlign w:val="center"/>
@@ -28053,7 +28053,7 @@
           <w:sz w:val="32"/>
           <w:szCs w:val="32"/>
         </w:rPr>
-        <w:t xml:space="preserve">See you next year.</w:t>
+        <w:t xml:space="preserve">See y’all next year.</w:t>
       </w:r>
     </w:p>
     <w:p>

</xml_diff>

<commit_message>
workbook page 41: regenerate ProCFO logo with padding
The source PNG had zero top/bottom margin, which caused the tagline
'FINANCIAL MANAGEMENT & GROWTH' to get pixel-clipped when the image
was scaled to the small tile size. Re-rendered the SVG at 2000w and
added an 8% transparent top/bottom margin so nothing gets clipped.
</commit_message>
<xml_diff>
--- a/deliverables/workbook/Workbook.docx
+++ b/deliverables/workbook/Workbook.docx
@@ -14671,7 +14671,7 @@
                   <w:r>
                     <w:drawing>
                       <wp:inline distT="0" distB="0" distL="0" distR="0">
-                        <wp:extent cx="2295525" cy="571500"/>
+                        <wp:extent cx="1952625" cy="571500"/>
                         <wp:effectExtent t="0" r="0" b="0" l="0"/>
                         <wp:docPr id="1" name="img" descr="image" title="procfopartners.png"/>
                         <wp:cNvGraphicFramePr>
@@ -14696,7 +14696,7 @@
                               <pic:spPr bwMode="auto">
                                 <a:xfrm>
                                   <a:off x="0" y="0"/>
-                                  <a:ext cx="2295525" cy="571500"/>
+                                  <a:ext cx="1952625" cy="571500"/>
                                 </a:xfrm>
                                 <a:prstGeom prst="rect">
                                   <a:avLst/>

</xml_diff>

<commit_message>
workbook: add note lines to paid session pages within safe overflow limits
Stanley: cover 10 -> 12 lines, continued 15 -> 16 lines
Fahey:   cover 10 -> 11 lines (2-line title consumes more vertical space),
         continued 15 -> 16 lines
Winters: cover 10 -> 12 lines, continued unchanged at 14
         (10-pillar reflection box already at page ceiling)

+8 total lines of note space across the 6 paid session pages.
Verified via full render + PDF text extraction: no overflow, no page
count change (46 pages), splice anchors unchanged.
</commit_message>
<xml_diff>
--- a/deliverables/workbook/Workbook.docx
+++ b/deliverables/workbook/Workbook.docx
@@ -9826,6 +9826,76 @@
           </w:p>
         </w:tc>
       </w:tr>
+      <w:tr>
+        <w:trPr>
+          <w:trHeight w:val="470" w:hRule="exact"/>
+        </w:trPr>
+        <w:tc>
+          <w:tcPr>
+            <w:tcW w:type="dxa" w:w="10080"/>
+            <w:tcBorders>
+              <w:top w:val="none" w:color="FFFFFF" w:sz="0"/>
+              <w:left w:val="none" w:color="FFFFFF" w:sz="0"/>
+              <w:bottom w:val="single" w:color="C9D2DE" w:sz="4"/>
+              <w:right w:val="none" w:color="FFFFFF" w:sz="0"/>
+            </w:tcBorders>
+            <w:tcMar>
+              <w:top w:type="dxa" w:w="0"/>
+              <w:left w:type="dxa" w:w="0"/>
+              <w:bottom w:type="dxa" w:w="0"/>
+              <w:right w:type="dxa" w:w="0"/>
+            </w:tcMar>
+          </w:tcPr>
+          <w:p>
+            <w:pPr>
+              <w:spacing w:after="0" w:before="0"/>
+            </w:pPr>
+            <w:r>
+              <w:rPr>
+                <w:rFonts w:ascii="Calibri" w:cs="Calibri" w:eastAsia="Calibri" w:hAnsi="Calibri"/>
+                <w:sz w:val="22"/>
+                <w:szCs w:val="22"/>
+              </w:rPr>
+              <w:t xml:space="preserve"> </w:t>
+            </w:r>
+          </w:p>
+        </w:tc>
+      </w:tr>
+      <w:tr>
+        <w:trPr>
+          <w:trHeight w:val="470" w:hRule="exact"/>
+        </w:trPr>
+        <w:tc>
+          <w:tcPr>
+            <w:tcW w:type="dxa" w:w="10080"/>
+            <w:tcBorders>
+              <w:top w:val="none" w:color="FFFFFF" w:sz="0"/>
+              <w:left w:val="none" w:color="FFFFFF" w:sz="0"/>
+              <w:bottom w:val="single" w:color="C9D2DE" w:sz="4"/>
+              <w:right w:val="none" w:color="FFFFFF" w:sz="0"/>
+            </w:tcBorders>
+            <w:tcMar>
+              <w:top w:type="dxa" w:w="0"/>
+              <w:left w:type="dxa" w:w="0"/>
+              <w:bottom w:type="dxa" w:w="0"/>
+              <w:right w:type="dxa" w:w="0"/>
+            </w:tcMar>
+          </w:tcPr>
+          <w:p>
+            <w:pPr>
+              <w:spacing w:after="0" w:before="0"/>
+            </w:pPr>
+            <w:r>
+              <w:rPr>
+                <w:rFonts w:ascii="Calibri" w:cs="Calibri" w:eastAsia="Calibri" w:hAnsi="Calibri"/>
+                <w:sz w:val="22"/>
+                <w:szCs w:val="22"/>
+              </w:rPr>
+              <w:t xml:space="preserve"> </w:t>
+            </w:r>
+          </w:p>
+        </w:tc>
+      </w:tr>
     </w:tbl>
     <w:p>
       <w:r>
@@ -9876,6 +9946,41 @@
       <w:tblGrid>
         <w:gridCol w:w="10080"/>
       </w:tblGrid>
+      <w:tr>
+        <w:trPr>
+          <w:trHeight w:val="470" w:hRule="exact"/>
+        </w:trPr>
+        <w:tc>
+          <w:tcPr>
+            <w:tcW w:type="dxa" w:w="10080"/>
+            <w:tcBorders>
+              <w:top w:val="none" w:color="FFFFFF" w:sz="0"/>
+              <w:left w:val="none" w:color="FFFFFF" w:sz="0"/>
+              <w:bottom w:val="single" w:color="C9D2DE" w:sz="4"/>
+              <w:right w:val="none" w:color="FFFFFF" w:sz="0"/>
+            </w:tcBorders>
+            <w:tcMar>
+              <w:top w:type="dxa" w:w="0"/>
+              <w:left w:type="dxa" w:w="0"/>
+              <w:bottom w:type="dxa" w:w="0"/>
+              <w:right w:type="dxa" w:w="0"/>
+            </w:tcMar>
+          </w:tcPr>
+          <w:p>
+            <w:pPr>
+              <w:spacing w:after="0" w:before="0"/>
+            </w:pPr>
+            <w:r>
+              <w:rPr>
+                <w:rFonts w:ascii="Calibri" w:cs="Calibri" w:eastAsia="Calibri" w:hAnsi="Calibri"/>
+                <w:sz w:val="22"/>
+                <w:szCs w:val="22"/>
+              </w:rPr>
+              <w:t xml:space="preserve"> </w:t>
+            </w:r>
+          </w:p>
+        </w:tc>
+      </w:tr>
       <w:tr>
         <w:trPr>
           <w:trHeight w:val="470" w:hRule="exact"/>
@@ -11228,6 +11333,41 @@
           </w:p>
         </w:tc>
       </w:tr>
+      <w:tr>
+        <w:trPr>
+          <w:trHeight w:val="470" w:hRule="exact"/>
+        </w:trPr>
+        <w:tc>
+          <w:tcPr>
+            <w:tcW w:type="dxa" w:w="10080"/>
+            <w:tcBorders>
+              <w:top w:val="none" w:color="FFFFFF" w:sz="0"/>
+              <w:left w:val="none" w:color="FFFFFF" w:sz="0"/>
+              <w:bottom w:val="single" w:color="C9D2DE" w:sz="4"/>
+              <w:right w:val="none" w:color="FFFFFF" w:sz="0"/>
+            </w:tcBorders>
+            <w:tcMar>
+              <w:top w:type="dxa" w:w="0"/>
+              <w:left w:type="dxa" w:w="0"/>
+              <w:bottom w:type="dxa" w:w="0"/>
+              <w:right w:type="dxa" w:w="0"/>
+            </w:tcMar>
+          </w:tcPr>
+          <w:p>
+            <w:pPr>
+              <w:spacing w:after="0" w:before="0"/>
+            </w:pPr>
+            <w:r>
+              <w:rPr>
+                <w:rFonts w:ascii="Calibri" w:cs="Calibri" w:eastAsia="Calibri" w:hAnsi="Calibri"/>
+                <w:sz w:val="22"/>
+                <w:szCs w:val="22"/>
+              </w:rPr>
+              <w:t xml:space="preserve"> </w:t>
+            </w:r>
+          </w:p>
+        </w:tc>
+      </w:tr>
     </w:tbl>
     <w:p>
       <w:r>
@@ -11278,6 +11418,41 @@
       <w:tblGrid>
         <w:gridCol w:w="10080"/>
       </w:tblGrid>
+      <w:tr>
+        <w:trPr>
+          <w:trHeight w:val="470" w:hRule="exact"/>
+        </w:trPr>
+        <w:tc>
+          <w:tcPr>
+            <w:tcW w:type="dxa" w:w="10080"/>
+            <w:tcBorders>
+              <w:top w:val="none" w:color="FFFFFF" w:sz="0"/>
+              <w:left w:val="none" w:color="FFFFFF" w:sz="0"/>
+              <w:bottom w:val="single" w:color="C9D2DE" w:sz="4"/>
+              <w:right w:val="none" w:color="FFFFFF" w:sz="0"/>
+            </w:tcBorders>
+            <w:tcMar>
+              <w:top w:type="dxa" w:w="0"/>
+              <w:left w:type="dxa" w:w="0"/>
+              <w:bottom w:type="dxa" w:w="0"/>
+              <w:right w:type="dxa" w:w="0"/>
+            </w:tcMar>
+          </w:tcPr>
+          <w:p>
+            <w:pPr>
+              <w:spacing w:after="0" w:before="0"/>
+            </w:pPr>
+            <w:r>
+              <w:rPr>
+                <w:rFonts w:ascii="Calibri" w:cs="Calibri" w:eastAsia="Calibri" w:hAnsi="Calibri"/>
+                <w:sz w:val="22"/>
+                <w:szCs w:val="22"/>
+              </w:rPr>
+              <w:t xml:space="preserve"> </w:t>
+            </w:r>
+          </w:p>
+        </w:tc>
+      </w:tr>
       <w:tr>
         <w:trPr>
           <w:trHeight w:val="470" w:hRule="exact"/>
@@ -12280,6 +12455,76 @@
       <w:tblGrid>
         <w:gridCol w:w="10080"/>
       </w:tblGrid>
+      <w:tr>
+        <w:trPr>
+          <w:trHeight w:val="470" w:hRule="exact"/>
+        </w:trPr>
+        <w:tc>
+          <w:tcPr>
+            <w:tcW w:type="dxa" w:w="10080"/>
+            <w:tcBorders>
+              <w:top w:val="none" w:color="FFFFFF" w:sz="0"/>
+              <w:left w:val="none" w:color="FFFFFF" w:sz="0"/>
+              <w:bottom w:val="single" w:color="C9D2DE" w:sz="4"/>
+              <w:right w:val="none" w:color="FFFFFF" w:sz="0"/>
+            </w:tcBorders>
+            <w:tcMar>
+              <w:top w:type="dxa" w:w="0"/>
+              <w:left w:type="dxa" w:w="0"/>
+              <w:bottom w:type="dxa" w:w="0"/>
+              <w:right w:type="dxa" w:w="0"/>
+            </w:tcMar>
+          </w:tcPr>
+          <w:p>
+            <w:pPr>
+              <w:spacing w:after="0" w:before="0"/>
+            </w:pPr>
+            <w:r>
+              <w:rPr>
+                <w:rFonts w:ascii="Calibri" w:cs="Calibri" w:eastAsia="Calibri" w:hAnsi="Calibri"/>
+                <w:sz w:val="22"/>
+                <w:szCs w:val="22"/>
+              </w:rPr>
+              <w:t xml:space="preserve"> </w:t>
+            </w:r>
+          </w:p>
+        </w:tc>
+      </w:tr>
+      <w:tr>
+        <w:trPr>
+          <w:trHeight w:val="470" w:hRule="exact"/>
+        </w:trPr>
+        <w:tc>
+          <w:tcPr>
+            <w:tcW w:type="dxa" w:w="10080"/>
+            <w:tcBorders>
+              <w:top w:val="none" w:color="FFFFFF" w:sz="0"/>
+              <w:left w:val="none" w:color="FFFFFF" w:sz="0"/>
+              <w:bottom w:val="single" w:color="C9D2DE" w:sz="4"/>
+              <w:right w:val="none" w:color="FFFFFF" w:sz="0"/>
+            </w:tcBorders>
+            <w:tcMar>
+              <w:top w:type="dxa" w:w="0"/>
+              <w:left w:type="dxa" w:w="0"/>
+              <w:bottom w:type="dxa" w:w="0"/>
+              <w:right w:type="dxa" w:w="0"/>
+            </w:tcMar>
+          </w:tcPr>
+          <w:p>
+            <w:pPr>
+              <w:spacing w:after="0" w:before="0"/>
+            </w:pPr>
+            <w:r>
+              <w:rPr>
+                <w:rFonts w:ascii="Calibri" w:cs="Calibri" w:eastAsia="Calibri" w:hAnsi="Calibri"/>
+                <w:sz w:val="22"/>
+                <w:szCs w:val="22"/>
+              </w:rPr>
+              <w:t xml:space="preserve"> </w:t>
+            </w:r>
+          </w:p>
+        </w:tc>
+      </w:tr>
       <w:tr>
         <w:trPr>
           <w:trHeight w:val="470" w:hRule="exact"/>

</xml_diff>

<commit_message>
workbook back cover: add Tally feedback QR + caption
QR points to https://tally.so/r/GxPLoj (Tally feedback form). Placed
below the We-Run-on-EOS wordmark / EOSNorthTexas.com line with clear
spacing above and below. Caption: 'Feedback Form'. No page count change
(still 46).
</commit_message>
<xml_diff>
--- a/deliverables/workbook/Workbook.docx
+++ b/deliverables/workbook/Workbook.docx
@@ -28518,6 +28518,69 @@
           <w:szCs w:val="26"/>
         </w:rPr>
         <w:t xml:space="preserve">EOSNorthTexas.com</w:t>
+      </w:r>
+    </w:p>
+    <w:p>
+      <w:pPr>
+        <w:spacing w:after="120" w:before="1200"/>
+        <w:jc w:val="center"/>
+      </w:pPr>
+      <w:r>
+        <w:drawing>
+          <wp:inline distT="0" distB="0" distL="0" distR="0">
+            <wp:extent cx="1047750" cy="1047750"/>
+            <wp:effectExtent t="0" r="0" b="0" l="0"/>
+            <wp:docPr id="1" name="img" descr="image" title="feedback-qr.jpg"/>
+            <wp:cNvGraphicFramePr>
+              <a:graphicFrameLocks xmlns:a="http://schemas.openxmlformats.org/drawingml/2006/main" noChangeAspect="1"/>
+            </wp:cNvGraphicFramePr>
+            <a:graphic xmlns:a="http://schemas.openxmlformats.org/drawingml/2006/main">
+              <a:graphicData uri="http://schemas.openxmlformats.org/drawingml/2006/picture">
+                <pic:pic xmlns:pic="http://schemas.openxmlformats.org/drawingml/2006/picture">
+                  <pic:nvPicPr>
+                    <pic:cNvPr id="0" name="" descr=""/>
+                    <pic:cNvPicPr>
+                      <a:picLocks noChangeAspect="1" noChangeArrowheads="1"/>
+                    </pic:cNvPicPr>
+                  </pic:nvPicPr>
+                  <pic:blipFill>
+                    <a:blip r:embed="rId136" cstate="none"/>
+                    <a:srcRect/>
+                    <a:stretch>
+                      <a:fillRect/>
+                    </a:stretch>
+                  </pic:blipFill>
+                  <pic:spPr bwMode="auto">
+                    <a:xfrm>
+                      <a:off x="0" y="0"/>
+                      <a:ext cx="1047750" cy="1047750"/>
+                    </a:xfrm>
+                    <a:prstGeom prst="rect">
+                      <a:avLst/>
+                    </a:prstGeom>
+                  </pic:spPr>
+                </pic:pic>
+              </a:graphicData>
+            </a:graphic>
+          </wp:inline>
+        </w:drawing>
+      </w:r>
+    </w:p>
+    <w:p>
+      <w:pPr>
+        <w:spacing w:after="0"/>
+        <w:jc w:val="center"/>
+      </w:pPr>
+      <w:r>
+        <w:rPr>
+          <w:rFonts w:ascii="Calibri" w:cs="Calibri" w:eastAsia="Calibri" w:hAnsi="Calibri"/>
+          <w:b/>
+          <w:bCs/>
+          <w:color w:val="0B1F3A"/>
+          <w:sz w:val="20"/>
+          <w:szCs w:val="20"/>
+        </w:rPr>
+        <w:t xml:space="preserve">Feedback Form</w:t>
       </w:r>
     </w:p>
     <w:sectPr>

</xml_diff>

<commit_message>
workbook: 3 small fixes on approved layout
1. Agenda (workbook p4 + site): 'Lunch and Learn' time changed from
   '11:55 AM - 1:00 PM' to '11:55 - 1:00 PM' so it fits on one line and
   matches the trailing-meridiem pattern used by every other row. Source
   change in config.js so site and workbook stay in sync.
2. Networking & Reflection (workbook p5): TABLE-MATES column order
   changed from Name/Role/Business/Phone/Email to
   Name/Business/Role/Phone/Email so it matches the CONNECTIONS row
   above it.
3. Walt Brown Healthy Matters handout (workbook p10, top-left): time
   line corrected from '12:00 - 1:00 PM' to '11:55 AM - 1:00 PM' to
   match the agenda and the preceding notes page. Patched via
   PyMuPDF redaction + Carlito re-insertion in
   appendix/patch_walt_time.py (idempotent).

Total pages unchanged (46).
</commit_message>
<xml_diff>
--- a/deliverables/workbook/Workbook.docx
+++ b/deliverables/workbook/Workbook.docx
@@ -1719,7 +1719,7 @@
                 <w:sz w:val="20"/>
                 <w:szCs w:val="20"/>
               </w:rPr>
-              <w:t xml:space="preserve">11:55 AM – 1:00 PM</w:t>
+              <w:t xml:space="preserve">11:55 – 1:00 PM</w:t>
             </w:r>
           </w:p>
         </w:tc>
@@ -4384,7 +4384,7 @@
                 <w:sz w:val="14"/>
                 <w:szCs w:val="14"/>
               </w:rPr>
-              <w:t xml:space="preserve">ROLE</w:t>
+              <w:t xml:space="preserve">BUSINESS</w:t>
             </w:r>
           </w:p>
         </w:tc>
@@ -4418,7 +4418,7 @@
                 <w:sz w:val="14"/>
                 <w:szCs w:val="14"/>
               </w:rPr>
-              <w:t xml:space="preserve">BUSINESS</w:t>
+              <w:t xml:space="preserve">ROLE</w:t>
             </w:r>
           </w:p>
         </w:tc>

</xml_diff>